<commit_message>
reports: Add initial draft for Requirement Specifications and update subsection 1.1 to synchronize with Requirement Specifications
</commit_message>
<xml_diff>
--- a/reports/report.docx
+++ b/reports/report.docx
@@ -1338,20 +1338,2535 @@
       <w:pPr>
         <w:spacing w:before="260" w:after="260" w:line="240" w:lineRule="auto"/>
         <w:rPr>
+          <w:rFonts w:ascii="Arial" w:eastAsia="Times New Roman" w:hAnsi="Arial" w:cs="Arial"/>
+          <w:color w:val="000000"/>
+          <w:kern w:val="0"/>
+          <w14:ligatures w14:val="none"/>
+        </w:rPr>
+      </w:pPr>
+      <w:r>
+        <w:rPr>
+          <w:rFonts w:ascii="Arial" w:eastAsia="Times New Roman" w:hAnsi="Arial" w:cs="Arial"/>
+          <w:color w:val="000000"/>
+          <w:kern w:val="0"/>
+          <w14:ligatures w14:val="none"/>
+        </w:rPr>
+        <w:t>The software improves individual productivity for shop staff by reducing manual paperwork and enhances organizational efficiency through accurate data management and faster customer service.</w:t>
+      </w:r>
+    </w:p>
+    <w:p>
+      <w:pPr>
+        <w:spacing w:before="480" w:after="120" w:line="240" w:lineRule="auto"/>
+        <w:outlineLvl w:val="0"/>
+        <w:rPr>
           <w:rFonts w:ascii="Times New Roman" w:eastAsia="Times New Roman" w:hAnsi="Times New Roman" w:cs="Times New Roman"/>
-          <w:kern w:val="0"/>
-          <w14:ligatures w14:val="none"/>
-        </w:rPr>
-      </w:pPr>
-      <w:r>
-        <w:rPr>
-          <w:rFonts w:ascii="Arial" w:eastAsia="Times New Roman" w:hAnsi="Arial" w:cs="Arial"/>
-          <w:color w:val="000000"/>
-          <w:kern w:val="0"/>
-          <w14:ligatures w14:val="none"/>
-        </w:rPr>
-        <w:t>The software improves individual productivity for shop staff by reducing manual paperwork and enhances organizational efficiency through accurate data management and faster customer service.</w:t>
-      </w:r>
+          <w:b/>
+          <w:bCs/>
+          <w:kern w:val="36"/>
+          <w:sz w:val="48"/>
+          <w:szCs w:val="48"/>
+          <w14:ligatures w14:val="none"/>
+        </w:rPr>
+      </w:pPr>
+      <w:r>
+        <w:rPr>
+          <w:rFonts w:ascii="Arial" w:eastAsia="Times New Roman" w:hAnsi="Arial" w:cs="Arial"/>
+          <w:b/>
+          <w:bCs/>
+          <w:color w:val="000000"/>
+          <w:kern w:val="36"/>
+          <w:sz w:val="46"/>
+          <w:szCs w:val="46"/>
+          <w14:ligatures w14:val="none"/>
+        </w:rPr>
+        <w:t>3. Requirement Specifications</w:t>
+      </w:r>
+    </w:p>
+    <w:p>
+      <w:pPr>
+        <w:spacing w:before="280" w:after="80" w:line="240" w:lineRule="auto"/>
+        <w:outlineLvl w:val="2"/>
+        <w:rPr>
+          <w:rFonts w:ascii="Times New Roman" w:eastAsia="Times New Roman" w:hAnsi="Times New Roman" w:cs="Times New Roman"/>
+          <w:b/>
+          <w:bCs/>
+          <w:kern w:val="0"/>
+          <w:sz w:val="27"/>
+          <w:szCs w:val="27"/>
+          <w14:ligatures w14:val="none"/>
+        </w:rPr>
+      </w:pPr>
+      <w:r>
+        <w:rPr>
+          <w:rFonts w:ascii="Arial" w:eastAsia="Times New Roman" w:hAnsi="Arial" w:cs="Arial"/>
+          <w:b/>
+          <w:bCs/>
+          <w:color w:val="000000"/>
+          <w:kern w:val="0"/>
+          <w:sz w:val="28"/>
+          <w:szCs w:val="28"/>
+          <w14:ligatures w14:val="none"/>
+        </w:rPr>
+        <w:t>3.1. Stakeholders for the system</w:t>
+      </w:r>
+    </w:p>
+    <w:p>
+      <w:pPr>
+        <w:spacing w:before="260" w:after="260" w:line="240" w:lineRule="auto"/>
+        <w:rPr>
+          <w:rFonts w:ascii="Times New Roman" w:eastAsia="Times New Roman" w:hAnsi="Times New Roman" w:cs="Times New Roman"/>
+          <w:kern w:val="0"/>
+          <w14:ligatures w14:val="none"/>
+        </w:rPr>
+      </w:pPr>
+      <w:r>
+        <w:rPr>
+          <w:rFonts w:ascii="Arial" w:eastAsia="Times New Roman" w:hAnsi="Arial" w:cs="Arial"/>
+          <w:color w:val="000000"/>
+          <w:kern w:val="0"/>
+          <w14:ligatures w14:val="none"/>
+        </w:rPr>
+        <w:t>The primary stakeholders involved in the Computer Shop Management System include:</w:t>
+      </w:r>
+    </w:p>
+    <w:p>
+      <w:pPr>
+        <w:numPr>
+          <w:ilvl w:val="0"/>
+          <w:numId w:val="11"/>
+        </w:numPr>
+        <w:spacing w:before="260" w:after="0" w:line="240" w:lineRule="auto"/>
+        <w:textAlignment w:val="baseline"/>
+        <w:rPr>
+          <w:rFonts w:ascii="Arial" w:eastAsia="Times New Roman" w:hAnsi="Arial" w:cs="Arial"/>
+          <w:color w:val="000000"/>
+          <w:kern w:val="0"/>
+          <w14:ligatures w14:val="none"/>
+        </w:rPr>
+      </w:pPr>
+      <w:r>
+        <w:rPr>
+          <w:rFonts w:ascii="Arial" w:eastAsia="Times New Roman" w:hAnsi="Arial" w:cs="Arial"/>
+          <w:b/>
+          <w:bCs/>
+          <w:color w:val="000000"/>
+          <w:kern w:val="0"/>
+          <w14:ligatures w14:val="none"/>
+        </w:rPr>
+        <w:t>Store Owner/Manager</w:t>
+      </w:r>
+      <w:r>
+        <w:rPr>
+          <w:rFonts w:ascii="Arial" w:eastAsia="Times New Roman" w:hAnsi="Arial" w:cs="Arial"/>
+          <w:color w:val="000000"/>
+          <w:kern w:val="0"/>
+          <w14:ligatures w14:val="none"/>
+        </w:rPr>
+        <w:t>: Oversees all operations, manages inventory, and reviews business performance reports.</w:t>
+      </w:r>
+    </w:p>
+    <w:p>
+      <w:pPr>
+        <w:numPr>
+          <w:ilvl w:val="0"/>
+          <w:numId w:val="11"/>
+        </w:numPr>
+        <w:spacing w:after="0" w:line="240" w:lineRule="auto"/>
+        <w:textAlignment w:val="baseline"/>
+        <w:rPr>
+          <w:rFonts w:ascii="Arial" w:eastAsia="Times New Roman" w:hAnsi="Arial" w:cs="Arial"/>
+          <w:color w:val="000000"/>
+          <w:kern w:val="0"/>
+          <w14:ligatures w14:val="none"/>
+        </w:rPr>
+      </w:pPr>
+      <w:r>
+        <w:rPr>
+          <w:rFonts w:ascii="Arial" w:eastAsia="Times New Roman" w:hAnsi="Arial" w:cs="Arial"/>
+          <w:b/>
+          <w:bCs/>
+          <w:color w:val="000000"/>
+          <w:kern w:val="0"/>
+          <w14:ligatures w14:val="none"/>
+        </w:rPr>
+        <w:t>Sales Staff</w:t>
+      </w:r>
+      <w:r>
+        <w:rPr>
+          <w:rFonts w:ascii="Arial" w:eastAsia="Times New Roman" w:hAnsi="Arial" w:cs="Arial"/>
+          <w:color w:val="000000"/>
+          <w:kern w:val="0"/>
+          <w14:ligatures w14:val="none"/>
+        </w:rPr>
+        <w:t>: Handles daily transactions, interacts with customers, and processes invoices.</w:t>
+      </w:r>
+    </w:p>
+    <w:p>
+      <w:pPr>
+        <w:numPr>
+          <w:ilvl w:val="0"/>
+          <w:numId w:val="11"/>
+        </w:numPr>
+        <w:spacing w:after="260" w:line="240" w:lineRule="auto"/>
+        <w:textAlignment w:val="baseline"/>
+        <w:rPr>
+          <w:rFonts w:ascii="Arial" w:eastAsia="Times New Roman" w:hAnsi="Arial" w:cs="Arial"/>
+          <w:color w:val="000000"/>
+          <w:kern w:val="0"/>
+          <w14:ligatures w14:val="none"/>
+        </w:rPr>
+      </w:pPr>
+      <w:r>
+        <w:rPr>
+          <w:rFonts w:ascii="Arial" w:eastAsia="Times New Roman" w:hAnsi="Arial" w:cs="Arial"/>
+          <w:b/>
+          <w:bCs/>
+          <w:color w:val="000000"/>
+          <w:kern w:val="0"/>
+          <w14:ligatures w14:val="none"/>
+        </w:rPr>
+        <w:t>Inventory Staff</w:t>
+      </w:r>
+      <w:r>
+        <w:rPr>
+          <w:rFonts w:ascii="Arial" w:eastAsia="Times New Roman" w:hAnsi="Arial" w:cs="Arial"/>
+          <w:color w:val="000000"/>
+          <w:kern w:val="0"/>
+          <w14:ligatures w14:val="none"/>
+        </w:rPr>
+        <w:t>: Updates stock levels, manages product information, and tracks hardware components.</w:t>
+      </w:r>
+    </w:p>
+    <w:p>
+      <w:pPr>
+        <w:spacing w:before="280" w:after="80" w:line="240" w:lineRule="auto"/>
+        <w:outlineLvl w:val="2"/>
+        <w:rPr>
+          <w:rFonts w:ascii="Times New Roman" w:eastAsia="Times New Roman" w:hAnsi="Times New Roman" w:cs="Times New Roman"/>
+          <w:b/>
+          <w:bCs/>
+          <w:kern w:val="0"/>
+          <w:sz w:val="27"/>
+          <w:szCs w:val="27"/>
+          <w14:ligatures w14:val="none"/>
+        </w:rPr>
+      </w:pPr>
+      <w:r>
+        <w:rPr>
+          <w:rFonts w:ascii="Arial" w:eastAsia="Times New Roman" w:hAnsi="Arial" w:cs="Arial"/>
+          <w:b/>
+          <w:bCs/>
+          <w:color w:val="000000"/>
+          <w:kern w:val="0"/>
+          <w:sz w:val="28"/>
+          <w:szCs w:val="28"/>
+          <w14:ligatures w14:val="none"/>
+        </w:rPr>
+        <w:t>3.2. Use case model</w:t>
+      </w:r>
+    </w:p>
+    <w:p>
+      <w:pPr>
+        <w:spacing w:before="240" w:after="40" w:line="240" w:lineRule="auto"/>
+        <w:outlineLvl w:val="3"/>
+        <w:rPr>
+          <w:rFonts w:ascii="Arial" w:eastAsia="Times New Roman" w:hAnsi="Arial" w:cs="Arial"/>
+          <w:b/>
+          <w:bCs/>
+          <w:color w:val="000000"/>
+          <w:kern w:val="0"/>
+          <w14:ligatures w14:val="none"/>
+        </w:rPr>
+      </w:pPr>
+      <w:r>
+        <w:rPr>
+          <w:rFonts w:ascii="Arial" w:eastAsia="Times New Roman" w:hAnsi="Arial" w:cs="Arial"/>
+          <w:b/>
+          <w:bCs/>
+          <w:color w:val="000000"/>
+          <w:kern w:val="0"/>
+          <w14:ligatures w14:val="none"/>
+        </w:rPr>
+        <w:t>3.2.1. Graphical use case model</w:t>
+      </w:r>
+    </w:p>
+    <w:p>
+      <w:pPr>
+        <w:spacing w:before="240" w:after="40" w:line="240" w:lineRule="auto"/>
+        <w:outlineLvl w:val="3"/>
+        <w:rPr>
+          <w:rFonts w:ascii="Times New Roman" w:eastAsia="Times New Roman" w:hAnsi="Times New Roman" w:cs="Times New Roman"/>
+          <w:b/>
+          <w:bCs/>
+          <w:kern w:val="0"/>
+          <w14:ligatures w14:val="none"/>
+        </w:rPr>
+      </w:pPr>
+    </w:p>
+    <w:p>
+      <w:pPr>
+        <w:spacing w:before="240" w:after="40" w:line="240" w:lineRule="auto"/>
+        <w:outlineLvl w:val="3"/>
+        <w:rPr>
+          <w:rFonts w:ascii="Times New Roman" w:eastAsia="Times New Roman" w:hAnsi="Times New Roman" w:cs="Times New Roman"/>
+          <w:b/>
+          <w:bCs/>
+          <w:kern w:val="0"/>
+          <w14:ligatures w14:val="none"/>
+        </w:rPr>
+      </w:pPr>
+      <w:r>
+        <w:rPr>
+          <w:rFonts w:ascii="Arial" w:eastAsia="Times New Roman" w:hAnsi="Arial" w:cs="Arial"/>
+          <w:b/>
+          <w:bCs/>
+          <w:color w:val="000000"/>
+          <w:kern w:val="0"/>
+          <w14:ligatures w14:val="none"/>
+        </w:rPr>
+        <w:t>3.2.2. Textual Description for each use case</w:t>
+      </w:r>
+    </w:p>
+    <w:p>
+      <w:pPr>
+        <w:spacing w:after="260" w:line="240" w:lineRule="auto"/>
+        <w:rPr>
+          <w:rFonts w:ascii="Times New Roman" w:eastAsia="Times New Roman" w:hAnsi="Times New Roman" w:cs="Times New Roman"/>
+          <w:kern w:val="0"/>
+          <w14:ligatures w14:val="none"/>
+        </w:rPr>
+      </w:pPr>
+      <w:r>
+        <w:rPr>
+          <w:rFonts w:ascii="Arial" w:eastAsia="Times New Roman" w:hAnsi="Arial" w:cs="Arial"/>
+          <w:b/>
+          <w:bCs/>
+          <w:color w:val="000000"/>
+          <w:kern w:val="0"/>
+          <w14:ligatures w14:val="none"/>
+        </w:rPr>
+        <w:t>1. Login / Logout</w:t>
+      </w:r>
+    </w:p>
+    <w:p>
+      <w:pPr>
+        <w:numPr>
+          <w:ilvl w:val="0"/>
+          <w:numId w:val="12"/>
+        </w:numPr>
+        <w:spacing w:after="0" w:line="240" w:lineRule="auto"/>
+        <w:textAlignment w:val="baseline"/>
+        <w:rPr>
+          <w:rFonts w:ascii="Arial" w:eastAsia="Times New Roman" w:hAnsi="Arial" w:cs="Arial"/>
+          <w:color w:val="000000"/>
+          <w:kern w:val="0"/>
+          <w14:ligatures w14:val="none"/>
+        </w:rPr>
+      </w:pPr>
+      <w:r>
+        <w:rPr>
+          <w:rFonts w:ascii="Arial" w:eastAsia="Times New Roman" w:hAnsi="Arial" w:cs="Arial"/>
+          <w:b/>
+          <w:bCs/>
+          <w:color w:val="000000"/>
+          <w:kern w:val="0"/>
+          <w14:ligatures w14:val="none"/>
+        </w:rPr>
+        <w:t>Actor</w:t>
+      </w:r>
+      <w:r>
+        <w:rPr>
+          <w:rFonts w:ascii="Arial" w:eastAsia="Times New Roman" w:hAnsi="Arial" w:cs="Arial"/>
+          <w:color w:val="000000"/>
+          <w:kern w:val="0"/>
+          <w14:ligatures w14:val="none"/>
+        </w:rPr>
+        <w:t>: System User (Inherited by Sales Staff, Store Owner / Manager, and Inventory Staff).</w:t>
+      </w:r>
+    </w:p>
+    <w:p>
+      <w:pPr>
+        <w:numPr>
+          <w:ilvl w:val="0"/>
+          <w:numId w:val="12"/>
+        </w:numPr>
+        <w:spacing w:after="0" w:line="240" w:lineRule="auto"/>
+        <w:textAlignment w:val="baseline"/>
+        <w:rPr>
+          <w:rFonts w:ascii="Arial" w:eastAsia="Times New Roman" w:hAnsi="Arial" w:cs="Arial"/>
+          <w:color w:val="000000"/>
+          <w:kern w:val="0"/>
+          <w14:ligatures w14:val="none"/>
+        </w:rPr>
+      </w:pPr>
+      <w:r>
+        <w:rPr>
+          <w:rFonts w:ascii="Arial" w:eastAsia="Times New Roman" w:hAnsi="Arial" w:cs="Arial"/>
+          <w:b/>
+          <w:bCs/>
+          <w:color w:val="000000"/>
+          <w:kern w:val="0"/>
+          <w14:ligatures w14:val="none"/>
+        </w:rPr>
+        <w:t>Description</w:t>
+      </w:r>
+      <w:r>
+        <w:rPr>
+          <w:rFonts w:ascii="Arial" w:eastAsia="Times New Roman" w:hAnsi="Arial" w:cs="Arial"/>
+          <w:color w:val="000000"/>
+          <w:kern w:val="0"/>
+          <w14:ligatures w14:val="none"/>
+        </w:rPr>
+        <w:t>: Allows users to enter the system or exit safely to protect data security.</w:t>
+      </w:r>
+    </w:p>
+    <w:p>
+      <w:pPr>
+        <w:numPr>
+          <w:ilvl w:val="0"/>
+          <w:numId w:val="12"/>
+        </w:numPr>
+        <w:spacing w:after="0" w:line="240" w:lineRule="auto"/>
+        <w:textAlignment w:val="baseline"/>
+        <w:rPr>
+          <w:rFonts w:ascii="Arial" w:eastAsia="Times New Roman" w:hAnsi="Arial" w:cs="Arial"/>
+          <w:color w:val="000000"/>
+          <w:kern w:val="0"/>
+          <w14:ligatures w14:val="none"/>
+        </w:rPr>
+      </w:pPr>
+      <w:r>
+        <w:rPr>
+          <w:rFonts w:ascii="Arial" w:eastAsia="Times New Roman" w:hAnsi="Arial" w:cs="Arial"/>
+          <w:b/>
+          <w:bCs/>
+          <w:color w:val="000000"/>
+          <w:kern w:val="0"/>
+          <w14:ligatures w14:val="none"/>
+        </w:rPr>
+        <w:t>Main Flow</w:t>
+      </w:r>
+      <w:r>
+        <w:rPr>
+          <w:rFonts w:ascii="Arial" w:eastAsia="Times New Roman" w:hAnsi="Arial" w:cs="Arial"/>
+          <w:color w:val="000000"/>
+          <w:kern w:val="0"/>
+          <w14:ligatures w14:val="none"/>
+        </w:rPr>
+        <w:t>:</w:t>
+      </w:r>
+    </w:p>
+    <w:p>
+      <w:pPr>
+        <w:numPr>
+          <w:ilvl w:val="1"/>
+          <w:numId w:val="12"/>
+        </w:numPr>
+        <w:spacing w:after="0" w:line="240" w:lineRule="auto"/>
+        <w:textAlignment w:val="baseline"/>
+        <w:rPr>
+          <w:rFonts w:ascii="Arial" w:eastAsia="Times New Roman" w:hAnsi="Arial" w:cs="Arial"/>
+          <w:color w:val="000000"/>
+          <w:kern w:val="0"/>
+          <w14:ligatures w14:val="none"/>
+        </w:rPr>
+      </w:pPr>
+      <w:r>
+        <w:rPr>
+          <w:rFonts w:ascii="Arial" w:eastAsia="Times New Roman" w:hAnsi="Arial" w:cs="Arial"/>
+          <w:color w:val="000000"/>
+          <w:kern w:val="0"/>
+          <w14:ligatures w14:val="none"/>
+        </w:rPr>
+        <w:t>The user enters credentials (username and password).</w:t>
+      </w:r>
+    </w:p>
+    <w:p>
+      <w:pPr>
+        <w:numPr>
+          <w:ilvl w:val="1"/>
+          <w:numId w:val="12"/>
+        </w:numPr>
+        <w:spacing w:after="0" w:line="240" w:lineRule="auto"/>
+        <w:textAlignment w:val="baseline"/>
+        <w:rPr>
+          <w:rFonts w:ascii="Arial" w:eastAsia="Times New Roman" w:hAnsi="Arial" w:cs="Arial"/>
+          <w:color w:val="000000"/>
+          <w:kern w:val="0"/>
+          <w14:ligatures w14:val="none"/>
+        </w:rPr>
+      </w:pPr>
+      <w:r>
+        <w:rPr>
+          <w:rFonts w:ascii="Arial" w:eastAsia="Times New Roman" w:hAnsi="Arial" w:cs="Arial"/>
+          <w:color w:val="000000"/>
+          <w:kern w:val="0"/>
+          <w14:ligatures w14:val="none"/>
+        </w:rPr>
+        <w:t>The system validates the information against the database.</w:t>
+      </w:r>
+    </w:p>
+    <w:p>
+      <w:pPr>
+        <w:numPr>
+          <w:ilvl w:val="1"/>
+          <w:numId w:val="12"/>
+        </w:numPr>
+        <w:spacing w:after="260" w:line="240" w:lineRule="auto"/>
+        <w:textAlignment w:val="baseline"/>
+        <w:rPr>
+          <w:rFonts w:ascii="Arial" w:eastAsia="Times New Roman" w:hAnsi="Arial" w:cs="Arial"/>
+          <w:color w:val="000000"/>
+          <w:kern w:val="0"/>
+          <w14:ligatures w14:val="none"/>
+        </w:rPr>
+      </w:pPr>
+      <w:r>
+        <w:rPr>
+          <w:rFonts w:ascii="Arial" w:eastAsia="Times New Roman" w:hAnsi="Arial" w:cs="Arial"/>
+          <w:color w:val="000000"/>
+          <w:kern w:val="0"/>
+          <w14:ligatures w14:val="none"/>
+        </w:rPr>
+        <w:t>The system grants access to the authorized dashboard or terminates the session upon logout.</w:t>
+      </w:r>
+    </w:p>
+    <w:p>
+      <w:pPr>
+        <w:spacing w:after="260" w:line="240" w:lineRule="auto"/>
+        <w:rPr>
+          <w:rFonts w:ascii="Times New Roman" w:eastAsia="Times New Roman" w:hAnsi="Times New Roman" w:cs="Times New Roman"/>
+          <w:kern w:val="0"/>
+          <w14:ligatures w14:val="none"/>
+        </w:rPr>
+      </w:pPr>
+      <w:r>
+        <w:rPr>
+          <w:rFonts w:ascii="Arial" w:eastAsia="Times New Roman" w:hAnsi="Arial" w:cs="Arial"/>
+          <w:b/>
+          <w:bCs/>
+          <w:color w:val="000000"/>
+          <w:kern w:val="0"/>
+          <w14:ligatures w14:val="none"/>
+        </w:rPr>
+        <w:t>2. Generate Sales Invoices</w:t>
+      </w:r>
+    </w:p>
+    <w:p>
+      <w:pPr>
+        <w:numPr>
+          <w:ilvl w:val="0"/>
+          <w:numId w:val="13"/>
+        </w:numPr>
+        <w:spacing w:after="0" w:line="240" w:lineRule="auto"/>
+        <w:textAlignment w:val="baseline"/>
+        <w:rPr>
+          <w:rFonts w:ascii="Arial" w:eastAsia="Times New Roman" w:hAnsi="Arial" w:cs="Arial"/>
+          <w:color w:val="000000"/>
+          <w:kern w:val="0"/>
+          <w14:ligatures w14:val="none"/>
+        </w:rPr>
+      </w:pPr>
+      <w:r>
+        <w:rPr>
+          <w:rFonts w:ascii="Arial" w:eastAsia="Times New Roman" w:hAnsi="Arial" w:cs="Arial"/>
+          <w:b/>
+          <w:bCs/>
+          <w:color w:val="000000"/>
+          <w:kern w:val="0"/>
+          <w14:ligatures w14:val="none"/>
+        </w:rPr>
+        <w:t>Actor</w:t>
+      </w:r>
+      <w:r>
+        <w:rPr>
+          <w:rFonts w:ascii="Arial" w:eastAsia="Times New Roman" w:hAnsi="Arial" w:cs="Arial"/>
+          <w:color w:val="000000"/>
+          <w:kern w:val="0"/>
+          <w14:ligatures w14:val="none"/>
+        </w:rPr>
+        <w:t>: Sales Staff.</w:t>
+      </w:r>
+    </w:p>
+    <w:p>
+      <w:pPr>
+        <w:numPr>
+          <w:ilvl w:val="0"/>
+          <w:numId w:val="13"/>
+        </w:numPr>
+        <w:spacing w:after="0" w:line="240" w:lineRule="auto"/>
+        <w:textAlignment w:val="baseline"/>
+        <w:rPr>
+          <w:rFonts w:ascii="Arial" w:eastAsia="Times New Roman" w:hAnsi="Arial" w:cs="Arial"/>
+          <w:color w:val="000000"/>
+          <w:kern w:val="0"/>
+          <w14:ligatures w14:val="none"/>
+        </w:rPr>
+      </w:pPr>
+      <w:r>
+        <w:rPr>
+          <w:rFonts w:ascii="Arial" w:eastAsia="Times New Roman" w:hAnsi="Arial" w:cs="Arial"/>
+          <w:b/>
+          <w:bCs/>
+          <w:color w:val="000000"/>
+          <w:kern w:val="0"/>
+          <w14:ligatures w14:val="none"/>
+        </w:rPr>
+        <w:t>Description</w:t>
+      </w:r>
+      <w:r>
+        <w:rPr>
+          <w:rFonts w:ascii="Arial" w:eastAsia="Times New Roman" w:hAnsi="Arial" w:cs="Arial"/>
+          <w:color w:val="000000"/>
+          <w:kern w:val="0"/>
+          <w14:ligatures w14:val="none"/>
+        </w:rPr>
+        <w:t>: Processes a customer's order and generates a formal billing document.</w:t>
+      </w:r>
+    </w:p>
+    <w:p>
+      <w:pPr>
+        <w:numPr>
+          <w:ilvl w:val="0"/>
+          <w:numId w:val="13"/>
+        </w:numPr>
+        <w:spacing w:after="0" w:line="240" w:lineRule="auto"/>
+        <w:textAlignment w:val="baseline"/>
+        <w:rPr>
+          <w:rFonts w:ascii="Arial" w:eastAsia="Times New Roman" w:hAnsi="Arial" w:cs="Arial"/>
+          <w:color w:val="000000"/>
+          <w:kern w:val="0"/>
+          <w14:ligatures w14:val="none"/>
+        </w:rPr>
+      </w:pPr>
+      <w:r>
+        <w:rPr>
+          <w:rFonts w:ascii="Arial" w:eastAsia="Times New Roman" w:hAnsi="Arial" w:cs="Arial"/>
+          <w:b/>
+          <w:bCs/>
+          <w:color w:val="000000"/>
+          <w:kern w:val="0"/>
+          <w14:ligatures w14:val="none"/>
+        </w:rPr>
+        <w:t>Main Flow</w:t>
+      </w:r>
+      <w:r>
+        <w:rPr>
+          <w:rFonts w:ascii="Arial" w:eastAsia="Times New Roman" w:hAnsi="Arial" w:cs="Arial"/>
+          <w:color w:val="000000"/>
+          <w:kern w:val="0"/>
+          <w14:ligatures w14:val="none"/>
+        </w:rPr>
+        <w:t>:</w:t>
+      </w:r>
+    </w:p>
+    <w:p>
+      <w:pPr>
+        <w:numPr>
+          <w:ilvl w:val="1"/>
+          <w:numId w:val="13"/>
+        </w:numPr>
+        <w:spacing w:after="0" w:line="240" w:lineRule="auto"/>
+        <w:textAlignment w:val="baseline"/>
+        <w:rPr>
+          <w:rFonts w:ascii="Arial" w:eastAsia="Times New Roman" w:hAnsi="Arial" w:cs="Arial"/>
+          <w:color w:val="000000"/>
+          <w:kern w:val="0"/>
+          <w14:ligatures w14:val="none"/>
+        </w:rPr>
+      </w:pPr>
+      <w:r>
+        <w:rPr>
+          <w:rFonts w:ascii="Arial" w:eastAsia="Times New Roman" w:hAnsi="Arial" w:cs="Arial"/>
+          <w:color w:val="000000"/>
+          <w:kern w:val="0"/>
+          <w14:ligatures w14:val="none"/>
+        </w:rPr>
+        <w:t>Staff selects products for the customer.</w:t>
+      </w:r>
+    </w:p>
+    <w:p>
+      <w:pPr>
+        <w:numPr>
+          <w:ilvl w:val="1"/>
+          <w:numId w:val="13"/>
+        </w:numPr>
+        <w:spacing w:after="0" w:line="240" w:lineRule="auto"/>
+        <w:textAlignment w:val="baseline"/>
+        <w:rPr>
+          <w:rFonts w:ascii="Arial" w:eastAsia="Times New Roman" w:hAnsi="Arial" w:cs="Arial"/>
+          <w:color w:val="000000"/>
+          <w:kern w:val="0"/>
+          <w14:ligatures w14:val="none"/>
+        </w:rPr>
+      </w:pPr>
+      <w:r>
+        <w:rPr>
+          <w:rFonts w:ascii="Arial" w:eastAsia="Times New Roman" w:hAnsi="Arial" w:cs="Arial"/>
+          <w:color w:val="000000"/>
+          <w:kern w:val="0"/>
+          <w14:ligatures w14:val="none"/>
+        </w:rPr>
+        <w:lastRenderedPageBreak/>
+        <w:t>The system calculates total costs and applies any discounts.</w:t>
+      </w:r>
+    </w:p>
+    <w:p>
+      <w:pPr>
+        <w:numPr>
+          <w:ilvl w:val="1"/>
+          <w:numId w:val="13"/>
+        </w:numPr>
+        <w:spacing w:after="0" w:line="240" w:lineRule="auto"/>
+        <w:textAlignment w:val="baseline"/>
+        <w:rPr>
+          <w:rFonts w:ascii="Arial" w:eastAsia="Times New Roman" w:hAnsi="Arial" w:cs="Arial"/>
+          <w:color w:val="000000"/>
+          <w:kern w:val="0"/>
+          <w14:ligatures w14:val="none"/>
+        </w:rPr>
+      </w:pPr>
+      <w:r>
+        <w:rPr>
+          <w:rFonts w:ascii="Arial" w:eastAsia="Times New Roman" w:hAnsi="Arial" w:cs="Arial"/>
+          <w:color w:val="000000"/>
+          <w:kern w:val="0"/>
+          <w14:ligatures w14:val="none"/>
+        </w:rPr>
+        <w:t xml:space="preserve">The system triggers the </w:t>
+      </w:r>
+      <w:r>
+        <w:rPr>
+          <w:rFonts w:ascii="Arial" w:eastAsia="Times New Roman" w:hAnsi="Arial" w:cs="Arial"/>
+          <w:b/>
+          <w:bCs/>
+          <w:color w:val="000000"/>
+          <w:kern w:val="0"/>
+          <w14:ligatures w14:val="none"/>
+        </w:rPr>
+        <w:t>Update Stock Levels</w:t>
+      </w:r>
+      <w:r>
+        <w:rPr>
+          <w:rFonts w:ascii="Arial" w:eastAsia="Times New Roman" w:hAnsi="Arial" w:cs="Arial"/>
+          <w:color w:val="000000"/>
+          <w:kern w:val="0"/>
+          <w14:ligatures w14:val="none"/>
+        </w:rPr>
+        <w:t xml:space="preserve"> use case automatically.</w:t>
+      </w:r>
+    </w:p>
+    <w:p>
+      <w:pPr>
+        <w:numPr>
+          <w:ilvl w:val="1"/>
+          <w:numId w:val="13"/>
+        </w:numPr>
+        <w:spacing w:after="260" w:line="240" w:lineRule="auto"/>
+        <w:textAlignment w:val="baseline"/>
+        <w:rPr>
+          <w:rFonts w:ascii="Arial" w:eastAsia="Times New Roman" w:hAnsi="Arial" w:cs="Arial"/>
+          <w:color w:val="000000"/>
+          <w:kern w:val="0"/>
+          <w14:ligatures w14:val="none"/>
+        </w:rPr>
+      </w:pPr>
+      <w:r>
+        <w:rPr>
+          <w:rFonts w:ascii="Arial" w:eastAsia="Times New Roman" w:hAnsi="Arial" w:cs="Arial"/>
+          <w:color w:val="000000"/>
+          <w:kern w:val="0"/>
+          <w14:ligatures w14:val="none"/>
+        </w:rPr>
+        <w:t>A sales invoice is generated and printed.</w:t>
+      </w:r>
+    </w:p>
+    <w:p>
+      <w:pPr>
+        <w:spacing w:after="260" w:line="240" w:lineRule="auto"/>
+        <w:rPr>
+          <w:rFonts w:ascii="Times New Roman" w:eastAsia="Times New Roman" w:hAnsi="Times New Roman" w:cs="Times New Roman"/>
+          <w:kern w:val="0"/>
+          <w14:ligatures w14:val="none"/>
+        </w:rPr>
+      </w:pPr>
+      <w:r>
+        <w:rPr>
+          <w:rFonts w:ascii="Arial" w:eastAsia="Times New Roman" w:hAnsi="Arial" w:cs="Arial"/>
+          <w:b/>
+          <w:bCs/>
+          <w:color w:val="000000"/>
+          <w:kern w:val="0"/>
+          <w14:ligatures w14:val="none"/>
+        </w:rPr>
+        <w:t>3. Manage Customers</w:t>
+      </w:r>
+    </w:p>
+    <w:p>
+      <w:pPr>
+        <w:numPr>
+          <w:ilvl w:val="0"/>
+          <w:numId w:val="14"/>
+        </w:numPr>
+        <w:spacing w:after="0" w:line="240" w:lineRule="auto"/>
+        <w:textAlignment w:val="baseline"/>
+        <w:rPr>
+          <w:rFonts w:ascii="Arial" w:eastAsia="Times New Roman" w:hAnsi="Arial" w:cs="Arial"/>
+          <w:color w:val="000000"/>
+          <w:kern w:val="0"/>
+          <w14:ligatures w14:val="none"/>
+        </w:rPr>
+      </w:pPr>
+      <w:r>
+        <w:rPr>
+          <w:rFonts w:ascii="Arial" w:eastAsia="Times New Roman" w:hAnsi="Arial" w:cs="Arial"/>
+          <w:b/>
+          <w:bCs/>
+          <w:color w:val="000000"/>
+          <w:kern w:val="0"/>
+          <w14:ligatures w14:val="none"/>
+        </w:rPr>
+        <w:t>Actor</w:t>
+      </w:r>
+      <w:r>
+        <w:rPr>
+          <w:rFonts w:ascii="Arial" w:eastAsia="Times New Roman" w:hAnsi="Arial" w:cs="Arial"/>
+          <w:color w:val="000000"/>
+          <w:kern w:val="0"/>
+          <w14:ligatures w14:val="none"/>
+        </w:rPr>
+        <w:t>: Sales Staff.</w:t>
+      </w:r>
+    </w:p>
+    <w:p>
+      <w:pPr>
+        <w:numPr>
+          <w:ilvl w:val="0"/>
+          <w:numId w:val="14"/>
+        </w:numPr>
+        <w:spacing w:after="0" w:line="240" w:lineRule="auto"/>
+        <w:textAlignment w:val="baseline"/>
+        <w:rPr>
+          <w:rFonts w:ascii="Arial" w:eastAsia="Times New Roman" w:hAnsi="Arial" w:cs="Arial"/>
+          <w:color w:val="000000"/>
+          <w:kern w:val="0"/>
+          <w14:ligatures w14:val="none"/>
+        </w:rPr>
+      </w:pPr>
+      <w:r>
+        <w:rPr>
+          <w:rFonts w:ascii="Arial" w:eastAsia="Times New Roman" w:hAnsi="Arial" w:cs="Arial"/>
+          <w:b/>
+          <w:bCs/>
+          <w:color w:val="000000"/>
+          <w:kern w:val="0"/>
+          <w14:ligatures w14:val="none"/>
+        </w:rPr>
+        <w:t>Description</w:t>
+      </w:r>
+      <w:r>
+        <w:rPr>
+          <w:rFonts w:ascii="Arial" w:eastAsia="Times New Roman" w:hAnsi="Arial" w:cs="Arial"/>
+          <w:color w:val="000000"/>
+          <w:kern w:val="0"/>
+          <w14:ligatures w14:val="none"/>
+        </w:rPr>
+        <w:t>: Maintains a database of customer contact details and purchase history.</w:t>
+      </w:r>
+    </w:p>
+    <w:p>
+      <w:pPr>
+        <w:numPr>
+          <w:ilvl w:val="0"/>
+          <w:numId w:val="14"/>
+        </w:numPr>
+        <w:spacing w:after="0" w:line="240" w:lineRule="auto"/>
+        <w:textAlignment w:val="baseline"/>
+        <w:rPr>
+          <w:rFonts w:ascii="Arial" w:eastAsia="Times New Roman" w:hAnsi="Arial" w:cs="Arial"/>
+          <w:color w:val="000000"/>
+          <w:kern w:val="0"/>
+          <w14:ligatures w14:val="none"/>
+        </w:rPr>
+      </w:pPr>
+      <w:r>
+        <w:rPr>
+          <w:rFonts w:ascii="Arial" w:eastAsia="Times New Roman" w:hAnsi="Arial" w:cs="Arial"/>
+          <w:b/>
+          <w:bCs/>
+          <w:color w:val="000000"/>
+          <w:kern w:val="0"/>
+          <w14:ligatures w14:val="none"/>
+        </w:rPr>
+        <w:t>Main Flow</w:t>
+      </w:r>
+      <w:r>
+        <w:rPr>
+          <w:rFonts w:ascii="Arial" w:eastAsia="Times New Roman" w:hAnsi="Arial" w:cs="Arial"/>
+          <w:color w:val="000000"/>
+          <w:kern w:val="0"/>
+          <w14:ligatures w14:val="none"/>
+        </w:rPr>
+        <w:t>:</w:t>
+      </w:r>
+    </w:p>
+    <w:p>
+      <w:pPr>
+        <w:numPr>
+          <w:ilvl w:val="1"/>
+          <w:numId w:val="14"/>
+        </w:numPr>
+        <w:spacing w:after="0" w:line="240" w:lineRule="auto"/>
+        <w:textAlignment w:val="baseline"/>
+        <w:rPr>
+          <w:rFonts w:ascii="Arial" w:eastAsia="Times New Roman" w:hAnsi="Arial" w:cs="Arial"/>
+          <w:color w:val="000000"/>
+          <w:kern w:val="0"/>
+          <w14:ligatures w14:val="none"/>
+        </w:rPr>
+      </w:pPr>
+      <w:r>
+        <w:rPr>
+          <w:rFonts w:ascii="Arial" w:eastAsia="Times New Roman" w:hAnsi="Arial" w:cs="Arial"/>
+          <w:color w:val="000000"/>
+          <w:kern w:val="0"/>
+          <w14:ligatures w14:val="none"/>
+        </w:rPr>
+        <w:t>Staff accesses the customer management module.</w:t>
+      </w:r>
+    </w:p>
+    <w:p>
+      <w:pPr>
+        <w:numPr>
+          <w:ilvl w:val="1"/>
+          <w:numId w:val="14"/>
+        </w:numPr>
+        <w:spacing w:after="0" w:line="240" w:lineRule="auto"/>
+        <w:textAlignment w:val="baseline"/>
+        <w:rPr>
+          <w:rFonts w:ascii="Arial" w:eastAsia="Times New Roman" w:hAnsi="Arial" w:cs="Arial"/>
+          <w:color w:val="000000"/>
+          <w:kern w:val="0"/>
+          <w14:ligatures w14:val="none"/>
+        </w:rPr>
+      </w:pPr>
+      <w:r>
+        <w:rPr>
+          <w:rFonts w:ascii="Arial" w:eastAsia="Times New Roman" w:hAnsi="Arial" w:cs="Arial"/>
+          <w:color w:val="000000"/>
+          <w:kern w:val="0"/>
+          <w14:ligatures w14:val="none"/>
+        </w:rPr>
+        <w:t>Staff can add new customer profiles or update existing information.</w:t>
+      </w:r>
+    </w:p>
+    <w:p>
+      <w:pPr>
+        <w:numPr>
+          <w:ilvl w:val="1"/>
+          <w:numId w:val="14"/>
+        </w:numPr>
+        <w:spacing w:after="260" w:line="240" w:lineRule="auto"/>
+        <w:textAlignment w:val="baseline"/>
+        <w:rPr>
+          <w:rFonts w:ascii="Arial" w:eastAsia="Times New Roman" w:hAnsi="Arial" w:cs="Arial"/>
+          <w:color w:val="000000"/>
+          <w:kern w:val="0"/>
+          <w14:ligatures w14:val="none"/>
+        </w:rPr>
+      </w:pPr>
+      <w:r>
+        <w:rPr>
+          <w:rFonts w:ascii="Arial" w:eastAsia="Times New Roman" w:hAnsi="Arial" w:cs="Arial"/>
+          <w:color w:val="000000"/>
+          <w:kern w:val="0"/>
+          <w14:ligatures w14:val="none"/>
+        </w:rPr>
+        <w:t>The system saves changes to the customer database.</w:t>
+      </w:r>
+    </w:p>
+    <w:p>
+      <w:pPr>
+        <w:spacing w:after="260" w:line="240" w:lineRule="auto"/>
+        <w:rPr>
+          <w:rFonts w:ascii="Times New Roman" w:eastAsia="Times New Roman" w:hAnsi="Times New Roman" w:cs="Times New Roman"/>
+          <w:kern w:val="0"/>
+          <w14:ligatures w14:val="none"/>
+        </w:rPr>
+      </w:pPr>
+      <w:r>
+        <w:rPr>
+          <w:rFonts w:ascii="Arial" w:eastAsia="Times New Roman" w:hAnsi="Arial" w:cs="Arial"/>
+          <w:b/>
+          <w:bCs/>
+          <w:color w:val="000000"/>
+          <w:kern w:val="0"/>
+          <w14:ligatures w14:val="none"/>
+        </w:rPr>
+        <w:t>4. Manage Employees</w:t>
+      </w:r>
+    </w:p>
+    <w:p>
+      <w:pPr>
+        <w:numPr>
+          <w:ilvl w:val="0"/>
+          <w:numId w:val="15"/>
+        </w:numPr>
+        <w:spacing w:after="0" w:line="240" w:lineRule="auto"/>
+        <w:textAlignment w:val="baseline"/>
+        <w:rPr>
+          <w:rFonts w:ascii="Arial" w:eastAsia="Times New Roman" w:hAnsi="Arial" w:cs="Arial"/>
+          <w:color w:val="000000"/>
+          <w:kern w:val="0"/>
+          <w14:ligatures w14:val="none"/>
+        </w:rPr>
+      </w:pPr>
+      <w:r>
+        <w:rPr>
+          <w:rFonts w:ascii="Arial" w:eastAsia="Times New Roman" w:hAnsi="Arial" w:cs="Arial"/>
+          <w:b/>
+          <w:bCs/>
+          <w:color w:val="000000"/>
+          <w:kern w:val="0"/>
+          <w14:ligatures w14:val="none"/>
+        </w:rPr>
+        <w:t>Actor</w:t>
+      </w:r>
+      <w:r>
+        <w:rPr>
+          <w:rFonts w:ascii="Arial" w:eastAsia="Times New Roman" w:hAnsi="Arial" w:cs="Arial"/>
+          <w:color w:val="000000"/>
+          <w:kern w:val="0"/>
+          <w14:ligatures w14:val="none"/>
+        </w:rPr>
+        <w:t>: Store Owner / Manager.</w:t>
+      </w:r>
+    </w:p>
+    <w:p>
+      <w:pPr>
+        <w:numPr>
+          <w:ilvl w:val="0"/>
+          <w:numId w:val="15"/>
+        </w:numPr>
+        <w:spacing w:after="0" w:line="240" w:lineRule="auto"/>
+        <w:textAlignment w:val="baseline"/>
+        <w:rPr>
+          <w:rFonts w:ascii="Arial" w:eastAsia="Times New Roman" w:hAnsi="Arial" w:cs="Arial"/>
+          <w:color w:val="000000"/>
+          <w:kern w:val="0"/>
+          <w14:ligatures w14:val="none"/>
+        </w:rPr>
+      </w:pPr>
+      <w:r>
+        <w:rPr>
+          <w:rFonts w:ascii="Arial" w:eastAsia="Times New Roman" w:hAnsi="Arial" w:cs="Arial"/>
+          <w:b/>
+          <w:bCs/>
+          <w:color w:val="000000"/>
+          <w:kern w:val="0"/>
+          <w14:ligatures w14:val="none"/>
+        </w:rPr>
+        <w:t>Description</w:t>
+      </w:r>
+      <w:r>
+        <w:rPr>
+          <w:rFonts w:ascii="Arial" w:eastAsia="Times New Roman" w:hAnsi="Arial" w:cs="Arial"/>
+          <w:color w:val="000000"/>
+          <w:kern w:val="0"/>
+          <w14:ligatures w14:val="none"/>
+        </w:rPr>
+        <w:t>: Manages staff accounts, roles, and system permissions.</w:t>
+      </w:r>
+    </w:p>
+    <w:p>
+      <w:pPr>
+        <w:numPr>
+          <w:ilvl w:val="0"/>
+          <w:numId w:val="15"/>
+        </w:numPr>
+        <w:spacing w:after="0" w:line="240" w:lineRule="auto"/>
+        <w:textAlignment w:val="baseline"/>
+        <w:rPr>
+          <w:rFonts w:ascii="Arial" w:eastAsia="Times New Roman" w:hAnsi="Arial" w:cs="Arial"/>
+          <w:color w:val="000000"/>
+          <w:kern w:val="0"/>
+          <w14:ligatures w14:val="none"/>
+        </w:rPr>
+      </w:pPr>
+      <w:r>
+        <w:rPr>
+          <w:rFonts w:ascii="Arial" w:eastAsia="Times New Roman" w:hAnsi="Arial" w:cs="Arial"/>
+          <w:b/>
+          <w:bCs/>
+          <w:color w:val="000000"/>
+          <w:kern w:val="0"/>
+          <w14:ligatures w14:val="none"/>
+        </w:rPr>
+        <w:t>Main Flow</w:t>
+      </w:r>
+      <w:r>
+        <w:rPr>
+          <w:rFonts w:ascii="Arial" w:eastAsia="Times New Roman" w:hAnsi="Arial" w:cs="Arial"/>
+          <w:color w:val="000000"/>
+          <w:kern w:val="0"/>
+          <w14:ligatures w14:val="none"/>
+        </w:rPr>
+        <w:t>:</w:t>
+      </w:r>
+    </w:p>
+    <w:p>
+      <w:pPr>
+        <w:numPr>
+          <w:ilvl w:val="1"/>
+          <w:numId w:val="15"/>
+        </w:numPr>
+        <w:spacing w:after="0" w:line="240" w:lineRule="auto"/>
+        <w:textAlignment w:val="baseline"/>
+        <w:rPr>
+          <w:rFonts w:ascii="Arial" w:eastAsia="Times New Roman" w:hAnsi="Arial" w:cs="Arial"/>
+          <w:color w:val="000000"/>
+          <w:kern w:val="0"/>
+          <w14:ligatures w14:val="none"/>
+        </w:rPr>
+      </w:pPr>
+      <w:r>
+        <w:rPr>
+          <w:rFonts w:ascii="Arial" w:eastAsia="Times New Roman" w:hAnsi="Arial" w:cs="Arial"/>
+          <w:color w:val="000000"/>
+          <w:kern w:val="0"/>
+          <w14:ligatures w14:val="none"/>
+        </w:rPr>
+        <w:t>The manager views the list of all registered employees.</w:t>
+      </w:r>
+    </w:p>
+    <w:p>
+      <w:pPr>
+        <w:numPr>
+          <w:ilvl w:val="1"/>
+          <w:numId w:val="15"/>
+        </w:numPr>
+        <w:spacing w:after="0" w:line="240" w:lineRule="auto"/>
+        <w:textAlignment w:val="baseline"/>
+        <w:rPr>
+          <w:rFonts w:ascii="Arial" w:eastAsia="Times New Roman" w:hAnsi="Arial" w:cs="Arial"/>
+          <w:color w:val="000000"/>
+          <w:kern w:val="0"/>
+          <w14:ligatures w14:val="none"/>
+        </w:rPr>
+      </w:pPr>
+      <w:r>
+        <w:rPr>
+          <w:rFonts w:ascii="Arial" w:eastAsia="Times New Roman" w:hAnsi="Arial" w:cs="Arial"/>
+          <w:color w:val="000000"/>
+          <w:kern w:val="0"/>
+          <w14:ligatures w14:val="none"/>
+        </w:rPr>
+        <w:t>The manager can create, modify, or disable staff accounts.</w:t>
+      </w:r>
+    </w:p>
+    <w:p>
+      <w:pPr>
+        <w:numPr>
+          <w:ilvl w:val="1"/>
+          <w:numId w:val="15"/>
+        </w:numPr>
+        <w:spacing w:after="260" w:line="240" w:lineRule="auto"/>
+        <w:textAlignment w:val="baseline"/>
+        <w:rPr>
+          <w:rFonts w:ascii="Arial" w:eastAsia="Times New Roman" w:hAnsi="Arial" w:cs="Arial"/>
+          <w:color w:val="000000"/>
+          <w:kern w:val="0"/>
+          <w14:ligatures w14:val="none"/>
+        </w:rPr>
+      </w:pPr>
+      <w:r>
+        <w:rPr>
+          <w:rFonts w:ascii="Arial" w:eastAsia="Times New Roman" w:hAnsi="Arial" w:cs="Arial"/>
+          <w:color w:val="000000"/>
+          <w:kern w:val="0"/>
+          <w14:ligatures w14:val="none"/>
+        </w:rPr>
+        <w:t>The system updates the access control list.</w:t>
+      </w:r>
+    </w:p>
+    <w:p>
+      <w:pPr>
+        <w:spacing w:after="260" w:line="240" w:lineRule="auto"/>
+        <w:rPr>
+          <w:rFonts w:ascii="Times New Roman" w:eastAsia="Times New Roman" w:hAnsi="Times New Roman" w:cs="Times New Roman"/>
+          <w:kern w:val="0"/>
+          <w14:ligatures w14:val="none"/>
+        </w:rPr>
+      </w:pPr>
+      <w:r>
+        <w:rPr>
+          <w:rFonts w:ascii="Arial" w:eastAsia="Times New Roman" w:hAnsi="Arial" w:cs="Arial"/>
+          <w:b/>
+          <w:bCs/>
+          <w:color w:val="000000"/>
+          <w:kern w:val="0"/>
+          <w14:ligatures w14:val="none"/>
+        </w:rPr>
+        <w:t>5. View Sales Reports</w:t>
+      </w:r>
+    </w:p>
+    <w:p>
+      <w:pPr>
+        <w:numPr>
+          <w:ilvl w:val="0"/>
+          <w:numId w:val="16"/>
+        </w:numPr>
+        <w:spacing w:after="0" w:line="240" w:lineRule="auto"/>
+        <w:textAlignment w:val="baseline"/>
+        <w:rPr>
+          <w:rFonts w:ascii="Arial" w:eastAsia="Times New Roman" w:hAnsi="Arial" w:cs="Arial"/>
+          <w:color w:val="000000"/>
+          <w:kern w:val="0"/>
+          <w14:ligatures w14:val="none"/>
+        </w:rPr>
+      </w:pPr>
+      <w:r>
+        <w:rPr>
+          <w:rFonts w:ascii="Arial" w:eastAsia="Times New Roman" w:hAnsi="Arial" w:cs="Arial"/>
+          <w:b/>
+          <w:bCs/>
+          <w:color w:val="000000"/>
+          <w:kern w:val="0"/>
+          <w14:ligatures w14:val="none"/>
+        </w:rPr>
+        <w:t>Actor</w:t>
+      </w:r>
+      <w:r>
+        <w:rPr>
+          <w:rFonts w:ascii="Arial" w:eastAsia="Times New Roman" w:hAnsi="Arial" w:cs="Arial"/>
+          <w:color w:val="000000"/>
+          <w:kern w:val="0"/>
+          <w14:ligatures w14:val="none"/>
+        </w:rPr>
+        <w:t>: Store Owner / Manager.</w:t>
+      </w:r>
+    </w:p>
+    <w:p>
+      <w:pPr>
+        <w:numPr>
+          <w:ilvl w:val="0"/>
+          <w:numId w:val="16"/>
+        </w:numPr>
+        <w:spacing w:after="0" w:line="240" w:lineRule="auto"/>
+        <w:textAlignment w:val="baseline"/>
+        <w:rPr>
+          <w:rFonts w:ascii="Arial" w:eastAsia="Times New Roman" w:hAnsi="Arial" w:cs="Arial"/>
+          <w:color w:val="000000"/>
+          <w:kern w:val="0"/>
+          <w14:ligatures w14:val="none"/>
+        </w:rPr>
+      </w:pPr>
+      <w:r>
+        <w:rPr>
+          <w:rFonts w:ascii="Arial" w:eastAsia="Times New Roman" w:hAnsi="Arial" w:cs="Arial"/>
+          <w:b/>
+          <w:bCs/>
+          <w:color w:val="000000"/>
+          <w:kern w:val="0"/>
+          <w14:ligatures w14:val="none"/>
+        </w:rPr>
+        <w:t>Description</w:t>
+      </w:r>
+      <w:r>
+        <w:rPr>
+          <w:rFonts w:ascii="Arial" w:eastAsia="Times New Roman" w:hAnsi="Arial" w:cs="Arial"/>
+          <w:color w:val="000000"/>
+          <w:kern w:val="0"/>
+          <w14:ligatures w14:val="none"/>
+        </w:rPr>
+        <w:t>: Provides visual data and statistics regarding shop revenue and sales performance.</w:t>
+      </w:r>
+    </w:p>
+    <w:p>
+      <w:pPr>
+        <w:numPr>
+          <w:ilvl w:val="0"/>
+          <w:numId w:val="16"/>
+        </w:numPr>
+        <w:spacing w:after="0" w:line="240" w:lineRule="auto"/>
+        <w:textAlignment w:val="baseline"/>
+        <w:rPr>
+          <w:rFonts w:ascii="Arial" w:eastAsia="Times New Roman" w:hAnsi="Arial" w:cs="Arial"/>
+          <w:color w:val="000000"/>
+          <w:kern w:val="0"/>
+          <w14:ligatures w14:val="none"/>
+        </w:rPr>
+      </w:pPr>
+      <w:r>
+        <w:rPr>
+          <w:rFonts w:ascii="Arial" w:eastAsia="Times New Roman" w:hAnsi="Arial" w:cs="Arial"/>
+          <w:b/>
+          <w:bCs/>
+          <w:color w:val="000000"/>
+          <w:kern w:val="0"/>
+          <w14:ligatures w14:val="none"/>
+        </w:rPr>
+        <w:t>Main Flow</w:t>
+      </w:r>
+      <w:r>
+        <w:rPr>
+          <w:rFonts w:ascii="Arial" w:eastAsia="Times New Roman" w:hAnsi="Arial" w:cs="Arial"/>
+          <w:color w:val="000000"/>
+          <w:kern w:val="0"/>
+          <w14:ligatures w14:val="none"/>
+        </w:rPr>
+        <w:t>:</w:t>
+      </w:r>
+    </w:p>
+    <w:p>
+      <w:pPr>
+        <w:numPr>
+          <w:ilvl w:val="1"/>
+          <w:numId w:val="16"/>
+        </w:numPr>
+        <w:spacing w:after="0" w:line="240" w:lineRule="auto"/>
+        <w:textAlignment w:val="baseline"/>
+        <w:rPr>
+          <w:rFonts w:ascii="Arial" w:eastAsia="Times New Roman" w:hAnsi="Arial" w:cs="Arial"/>
+          <w:color w:val="000000"/>
+          <w:kern w:val="0"/>
+          <w14:ligatures w14:val="none"/>
+        </w:rPr>
+      </w:pPr>
+      <w:r>
+        <w:rPr>
+          <w:rFonts w:ascii="Arial" w:eastAsia="Times New Roman" w:hAnsi="Arial" w:cs="Arial"/>
+          <w:color w:val="000000"/>
+          <w:kern w:val="0"/>
+          <w14:ligatures w14:val="none"/>
+        </w:rPr>
+        <w:t>The manager selects the reporting period.</w:t>
+      </w:r>
+    </w:p>
+    <w:p>
+      <w:pPr>
+        <w:numPr>
+          <w:ilvl w:val="1"/>
+          <w:numId w:val="16"/>
+        </w:numPr>
+        <w:spacing w:after="0" w:line="240" w:lineRule="auto"/>
+        <w:textAlignment w:val="baseline"/>
+        <w:rPr>
+          <w:rFonts w:ascii="Arial" w:eastAsia="Times New Roman" w:hAnsi="Arial" w:cs="Arial"/>
+          <w:color w:val="000000"/>
+          <w:kern w:val="0"/>
+          <w14:ligatures w14:val="none"/>
+        </w:rPr>
+      </w:pPr>
+      <w:r>
+        <w:rPr>
+          <w:rFonts w:ascii="Arial" w:eastAsia="Times New Roman" w:hAnsi="Arial" w:cs="Arial"/>
+          <w:color w:val="000000"/>
+          <w:kern w:val="0"/>
+          <w14:ligatures w14:val="none"/>
+        </w:rPr>
+        <w:t>The system retrieves sales records and generates summary charts.</w:t>
+      </w:r>
+    </w:p>
+    <w:p>
+      <w:pPr>
+        <w:numPr>
+          <w:ilvl w:val="1"/>
+          <w:numId w:val="16"/>
+        </w:numPr>
+        <w:spacing w:after="260" w:line="240" w:lineRule="auto"/>
+        <w:textAlignment w:val="baseline"/>
+        <w:rPr>
+          <w:rFonts w:ascii="Arial" w:eastAsia="Times New Roman" w:hAnsi="Arial" w:cs="Arial"/>
+          <w:color w:val="000000"/>
+          <w:kern w:val="0"/>
+          <w14:ligatures w14:val="none"/>
+        </w:rPr>
+      </w:pPr>
+      <w:r>
+        <w:rPr>
+          <w:rFonts w:ascii="Arial" w:eastAsia="Times New Roman" w:hAnsi="Arial" w:cs="Arial"/>
+          <w:color w:val="000000"/>
+          <w:kern w:val="0"/>
+          <w14:ligatures w14:val="none"/>
+        </w:rPr>
+        <w:t>The manager reviews the business performance.</w:t>
+      </w:r>
+    </w:p>
+    <w:p>
+      <w:pPr>
+        <w:spacing w:after="260" w:line="240" w:lineRule="auto"/>
+        <w:rPr>
+          <w:rFonts w:ascii="Times New Roman" w:eastAsia="Times New Roman" w:hAnsi="Times New Roman" w:cs="Times New Roman"/>
+          <w:kern w:val="0"/>
+          <w14:ligatures w14:val="none"/>
+        </w:rPr>
+      </w:pPr>
+      <w:r>
+        <w:rPr>
+          <w:rFonts w:ascii="Arial" w:eastAsia="Times New Roman" w:hAnsi="Arial" w:cs="Arial"/>
+          <w:b/>
+          <w:bCs/>
+          <w:color w:val="000000"/>
+          <w:kern w:val="0"/>
+          <w14:ligatures w14:val="none"/>
+        </w:rPr>
+        <w:t>6. Manage Inventory</w:t>
+      </w:r>
+    </w:p>
+    <w:p>
+      <w:pPr>
+        <w:numPr>
+          <w:ilvl w:val="0"/>
+          <w:numId w:val="17"/>
+        </w:numPr>
+        <w:spacing w:after="0" w:line="240" w:lineRule="auto"/>
+        <w:textAlignment w:val="baseline"/>
+        <w:rPr>
+          <w:rFonts w:ascii="Arial" w:eastAsia="Times New Roman" w:hAnsi="Arial" w:cs="Arial"/>
+          <w:color w:val="000000"/>
+          <w:kern w:val="0"/>
+          <w14:ligatures w14:val="none"/>
+        </w:rPr>
+      </w:pPr>
+      <w:r>
+        <w:rPr>
+          <w:rFonts w:ascii="Arial" w:eastAsia="Times New Roman" w:hAnsi="Arial" w:cs="Arial"/>
+          <w:b/>
+          <w:bCs/>
+          <w:color w:val="000000"/>
+          <w:kern w:val="0"/>
+          <w14:ligatures w14:val="none"/>
+        </w:rPr>
+        <w:t>Actor</w:t>
+      </w:r>
+      <w:r>
+        <w:rPr>
+          <w:rFonts w:ascii="Arial" w:eastAsia="Times New Roman" w:hAnsi="Arial" w:cs="Arial"/>
+          <w:color w:val="000000"/>
+          <w:kern w:val="0"/>
+          <w14:ligatures w14:val="none"/>
+        </w:rPr>
+        <w:t>: Store Owner / Manager.</w:t>
+      </w:r>
+    </w:p>
+    <w:p>
+      <w:pPr>
+        <w:numPr>
+          <w:ilvl w:val="0"/>
+          <w:numId w:val="17"/>
+        </w:numPr>
+        <w:spacing w:after="0" w:line="240" w:lineRule="auto"/>
+        <w:textAlignment w:val="baseline"/>
+        <w:rPr>
+          <w:rFonts w:ascii="Arial" w:eastAsia="Times New Roman" w:hAnsi="Arial" w:cs="Arial"/>
+          <w:color w:val="000000"/>
+          <w:kern w:val="0"/>
+          <w14:ligatures w14:val="none"/>
+        </w:rPr>
+      </w:pPr>
+      <w:r>
+        <w:rPr>
+          <w:rFonts w:ascii="Arial" w:eastAsia="Times New Roman" w:hAnsi="Arial" w:cs="Arial"/>
+          <w:b/>
+          <w:bCs/>
+          <w:color w:val="000000"/>
+          <w:kern w:val="0"/>
+          <w14:ligatures w14:val="none"/>
+        </w:rPr>
+        <w:t>Description</w:t>
+      </w:r>
+      <w:r>
+        <w:rPr>
+          <w:rFonts w:ascii="Arial" w:eastAsia="Times New Roman" w:hAnsi="Arial" w:cs="Arial"/>
+          <w:color w:val="000000"/>
+          <w:kern w:val="0"/>
+          <w14:ligatures w14:val="none"/>
+        </w:rPr>
+        <w:t>: Controls the product catalog, including adding new models or adjusting pricing.</w:t>
+      </w:r>
+    </w:p>
+    <w:p>
+      <w:pPr>
+        <w:numPr>
+          <w:ilvl w:val="0"/>
+          <w:numId w:val="17"/>
+        </w:numPr>
+        <w:spacing w:after="0" w:line="240" w:lineRule="auto"/>
+        <w:textAlignment w:val="baseline"/>
+        <w:rPr>
+          <w:rFonts w:ascii="Arial" w:eastAsia="Times New Roman" w:hAnsi="Arial" w:cs="Arial"/>
+          <w:color w:val="000000"/>
+          <w:kern w:val="0"/>
+          <w14:ligatures w14:val="none"/>
+        </w:rPr>
+      </w:pPr>
+      <w:r>
+        <w:rPr>
+          <w:rFonts w:ascii="Arial" w:eastAsia="Times New Roman" w:hAnsi="Arial" w:cs="Arial"/>
+          <w:b/>
+          <w:bCs/>
+          <w:color w:val="000000"/>
+          <w:kern w:val="0"/>
+          <w14:ligatures w14:val="none"/>
+        </w:rPr>
+        <w:t>Main Flow</w:t>
+      </w:r>
+      <w:r>
+        <w:rPr>
+          <w:rFonts w:ascii="Arial" w:eastAsia="Times New Roman" w:hAnsi="Arial" w:cs="Arial"/>
+          <w:color w:val="000000"/>
+          <w:kern w:val="0"/>
+          <w14:ligatures w14:val="none"/>
+        </w:rPr>
+        <w:t>:</w:t>
+      </w:r>
+    </w:p>
+    <w:p>
+      <w:pPr>
+        <w:numPr>
+          <w:ilvl w:val="1"/>
+          <w:numId w:val="17"/>
+        </w:numPr>
+        <w:spacing w:after="0" w:line="240" w:lineRule="auto"/>
+        <w:textAlignment w:val="baseline"/>
+        <w:rPr>
+          <w:rFonts w:ascii="Arial" w:eastAsia="Times New Roman" w:hAnsi="Arial" w:cs="Arial"/>
+          <w:color w:val="000000"/>
+          <w:kern w:val="0"/>
+          <w14:ligatures w14:val="none"/>
+        </w:rPr>
+      </w:pPr>
+      <w:r>
+        <w:rPr>
+          <w:rFonts w:ascii="Arial" w:eastAsia="Times New Roman" w:hAnsi="Arial" w:cs="Arial"/>
+          <w:color w:val="000000"/>
+          <w:kern w:val="0"/>
+          <w14:ligatures w14:val="none"/>
+        </w:rPr>
+        <w:t>The manager opens the inventory management interface.</w:t>
+      </w:r>
+    </w:p>
+    <w:p>
+      <w:pPr>
+        <w:numPr>
+          <w:ilvl w:val="1"/>
+          <w:numId w:val="17"/>
+        </w:numPr>
+        <w:spacing w:after="0" w:line="240" w:lineRule="auto"/>
+        <w:textAlignment w:val="baseline"/>
+        <w:rPr>
+          <w:rFonts w:ascii="Arial" w:eastAsia="Times New Roman" w:hAnsi="Arial" w:cs="Arial"/>
+          <w:color w:val="000000"/>
+          <w:kern w:val="0"/>
+          <w14:ligatures w14:val="none"/>
+        </w:rPr>
+      </w:pPr>
+      <w:r>
+        <w:rPr>
+          <w:rFonts w:ascii="Arial" w:eastAsia="Times New Roman" w:hAnsi="Arial" w:cs="Arial"/>
+          <w:color w:val="000000"/>
+          <w:kern w:val="0"/>
+          <w14:ligatures w14:val="none"/>
+        </w:rPr>
+        <w:t>The manager updates product descriptions, categories, or base prices.</w:t>
+      </w:r>
+    </w:p>
+    <w:p>
+      <w:pPr>
+        <w:numPr>
+          <w:ilvl w:val="1"/>
+          <w:numId w:val="17"/>
+        </w:numPr>
+        <w:spacing w:after="260" w:line="240" w:lineRule="auto"/>
+        <w:textAlignment w:val="baseline"/>
+        <w:rPr>
+          <w:rFonts w:ascii="Arial" w:eastAsia="Times New Roman" w:hAnsi="Arial" w:cs="Arial"/>
+          <w:color w:val="000000"/>
+          <w:kern w:val="0"/>
+          <w14:ligatures w14:val="none"/>
+        </w:rPr>
+      </w:pPr>
+      <w:r>
+        <w:rPr>
+          <w:rFonts w:ascii="Arial" w:eastAsia="Times New Roman" w:hAnsi="Arial" w:cs="Arial"/>
+          <w:color w:val="000000"/>
+          <w:kern w:val="0"/>
+          <w14:ligatures w14:val="none"/>
+        </w:rPr>
+        <w:t>The system ensures the inventory database is current.</w:t>
+      </w:r>
+    </w:p>
+    <w:p>
+      <w:pPr>
+        <w:spacing w:after="260" w:line="240" w:lineRule="auto"/>
+        <w:rPr>
+          <w:rFonts w:ascii="Times New Roman" w:eastAsia="Times New Roman" w:hAnsi="Times New Roman" w:cs="Times New Roman"/>
+          <w:kern w:val="0"/>
+          <w14:ligatures w14:val="none"/>
+        </w:rPr>
+      </w:pPr>
+      <w:r>
+        <w:rPr>
+          <w:rFonts w:ascii="Arial" w:eastAsia="Times New Roman" w:hAnsi="Arial" w:cs="Arial"/>
+          <w:b/>
+          <w:bCs/>
+          <w:color w:val="000000"/>
+          <w:kern w:val="0"/>
+          <w14:ligatures w14:val="none"/>
+        </w:rPr>
+        <w:t>7. Track Hardware Components</w:t>
+      </w:r>
+    </w:p>
+    <w:p>
+      <w:pPr>
+        <w:numPr>
+          <w:ilvl w:val="0"/>
+          <w:numId w:val="18"/>
+        </w:numPr>
+        <w:spacing w:after="0" w:line="240" w:lineRule="auto"/>
+        <w:textAlignment w:val="baseline"/>
+        <w:rPr>
+          <w:rFonts w:ascii="Arial" w:eastAsia="Times New Roman" w:hAnsi="Arial" w:cs="Arial"/>
+          <w:color w:val="000000"/>
+          <w:kern w:val="0"/>
+          <w14:ligatures w14:val="none"/>
+        </w:rPr>
+      </w:pPr>
+      <w:r>
+        <w:rPr>
+          <w:rFonts w:ascii="Arial" w:eastAsia="Times New Roman" w:hAnsi="Arial" w:cs="Arial"/>
+          <w:b/>
+          <w:bCs/>
+          <w:color w:val="000000"/>
+          <w:kern w:val="0"/>
+          <w14:ligatures w14:val="none"/>
+        </w:rPr>
+        <w:t>Actor</w:t>
+      </w:r>
+      <w:r>
+        <w:rPr>
+          <w:rFonts w:ascii="Arial" w:eastAsia="Times New Roman" w:hAnsi="Arial" w:cs="Arial"/>
+          <w:color w:val="000000"/>
+          <w:kern w:val="0"/>
+          <w14:ligatures w14:val="none"/>
+        </w:rPr>
+        <w:t>: Inventory Staff.</w:t>
+      </w:r>
+    </w:p>
+    <w:p>
+      <w:pPr>
+        <w:numPr>
+          <w:ilvl w:val="0"/>
+          <w:numId w:val="18"/>
+        </w:numPr>
+        <w:spacing w:after="0" w:line="240" w:lineRule="auto"/>
+        <w:textAlignment w:val="baseline"/>
+        <w:rPr>
+          <w:rFonts w:ascii="Arial" w:eastAsia="Times New Roman" w:hAnsi="Arial" w:cs="Arial"/>
+          <w:color w:val="000000"/>
+          <w:kern w:val="0"/>
+          <w14:ligatures w14:val="none"/>
+        </w:rPr>
+      </w:pPr>
+      <w:r>
+        <w:rPr>
+          <w:rFonts w:ascii="Arial" w:eastAsia="Times New Roman" w:hAnsi="Arial" w:cs="Arial"/>
+          <w:b/>
+          <w:bCs/>
+          <w:color w:val="000000"/>
+          <w:kern w:val="0"/>
+          <w14:ligatures w14:val="none"/>
+        </w:rPr>
+        <w:lastRenderedPageBreak/>
+        <w:t>Description</w:t>
+      </w:r>
+      <w:r>
+        <w:rPr>
+          <w:rFonts w:ascii="Arial" w:eastAsia="Times New Roman" w:hAnsi="Arial" w:cs="Arial"/>
+          <w:color w:val="000000"/>
+          <w:kern w:val="0"/>
+          <w14:ligatures w14:val="none"/>
+        </w:rPr>
+        <w:t>: Monitors technical specifications and the physical status of specific hardware items.</w:t>
+      </w:r>
+    </w:p>
+    <w:p>
+      <w:pPr>
+        <w:numPr>
+          <w:ilvl w:val="0"/>
+          <w:numId w:val="18"/>
+        </w:numPr>
+        <w:spacing w:after="0" w:line="240" w:lineRule="auto"/>
+        <w:textAlignment w:val="baseline"/>
+        <w:rPr>
+          <w:rFonts w:ascii="Arial" w:eastAsia="Times New Roman" w:hAnsi="Arial" w:cs="Arial"/>
+          <w:color w:val="000000"/>
+          <w:kern w:val="0"/>
+          <w14:ligatures w14:val="none"/>
+        </w:rPr>
+      </w:pPr>
+      <w:r>
+        <w:rPr>
+          <w:rFonts w:ascii="Arial" w:eastAsia="Times New Roman" w:hAnsi="Arial" w:cs="Arial"/>
+          <w:b/>
+          <w:bCs/>
+          <w:color w:val="000000"/>
+          <w:kern w:val="0"/>
+          <w14:ligatures w14:val="none"/>
+        </w:rPr>
+        <w:t>Main Flow</w:t>
+      </w:r>
+      <w:r>
+        <w:rPr>
+          <w:rFonts w:ascii="Arial" w:eastAsia="Times New Roman" w:hAnsi="Arial" w:cs="Arial"/>
+          <w:color w:val="000000"/>
+          <w:kern w:val="0"/>
+          <w14:ligatures w14:val="none"/>
+        </w:rPr>
+        <w:t>:</w:t>
+      </w:r>
+    </w:p>
+    <w:p>
+      <w:pPr>
+        <w:numPr>
+          <w:ilvl w:val="1"/>
+          <w:numId w:val="18"/>
+        </w:numPr>
+        <w:spacing w:after="0" w:line="240" w:lineRule="auto"/>
+        <w:textAlignment w:val="baseline"/>
+        <w:rPr>
+          <w:rFonts w:ascii="Arial" w:eastAsia="Times New Roman" w:hAnsi="Arial" w:cs="Arial"/>
+          <w:color w:val="000000"/>
+          <w:kern w:val="0"/>
+          <w14:ligatures w14:val="none"/>
+        </w:rPr>
+      </w:pPr>
+      <w:r>
+        <w:rPr>
+          <w:rFonts w:ascii="Arial" w:eastAsia="Times New Roman" w:hAnsi="Arial" w:cs="Arial"/>
+          <w:color w:val="000000"/>
+          <w:kern w:val="0"/>
+          <w14:ligatures w14:val="none"/>
+        </w:rPr>
+        <w:t>Staff identifies a specific hardware component.</w:t>
+      </w:r>
+    </w:p>
+    <w:p>
+      <w:pPr>
+        <w:numPr>
+          <w:ilvl w:val="1"/>
+          <w:numId w:val="18"/>
+        </w:numPr>
+        <w:spacing w:after="0" w:line="240" w:lineRule="auto"/>
+        <w:textAlignment w:val="baseline"/>
+        <w:rPr>
+          <w:rFonts w:ascii="Arial" w:eastAsia="Times New Roman" w:hAnsi="Arial" w:cs="Arial"/>
+          <w:color w:val="000000"/>
+          <w:kern w:val="0"/>
+          <w14:ligatures w14:val="none"/>
+        </w:rPr>
+      </w:pPr>
+      <w:r>
+        <w:rPr>
+          <w:rFonts w:ascii="Arial" w:eastAsia="Times New Roman" w:hAnsi="Arial" w:cs="Arial"/>
+          <w:color w:val="000000"/>
+          <w:kern w:val="0"/>
+          <w14:ligatures w14:val="none"/>
+        </w:rPr>
+        <w:t>Staff updates its condition or technical tracking data.</w:t>
+      </w:r>
+    </w:p>
+    <w:p>
+      <w:pPr>
+        <w:numPr>
+          <w:ilvl w:val="1"/>
+          <w:numId w:val="18"/>
+        </w:numPr>
+        <w:spacing w:after="260" w:line="240" w:lineRule="auto"/>
+        <w:textAlignment w:val="baseline"/>
+        <w:rPr>
+          <w:rFonts w:ascii="Arial" w:eastAsia="Times New Roman" w:hAnsi="Arial" w:cs="Arial"/>
+          <w:color w:val="000000"/>
+          <w:kern w:val="0"/>
+          <w14:ligatures w14:val="none"/>
+        </w:rPr>
+      </w:pPr>
+      <w:r>
+        <w:rPr>
+          <w:rFonts w:ascii="Arial" w:eastAsia="Times New Roman" w:hAnsi="Arial" w:cs="Arial"/>
+          <w:color w:val="000000"/>
+          <w:kern w:val="0"/>
+          <w14:ligatures w14:val="none"/>
+        </w:rPr>
+        <w:t>The system logs the tracking history.</w:t>
+      </w:r>
+    </w:p>
+    <w:p>
+      <w:pPr>
+        <w:spacing w:after="260" w:line="240" w:lineRule="auto"/>
+        <w:rPr>
+          <w:rFonts w:ascii="Times New Roman" w:eastAsia="Times New Roman" w:hAnsi="Times New Roman" w:cs="Times New Roman"/>
+          <w:kern w:val="0"/>
+          <w14:ligatures w14:val="none"/>
+        </w:rPr>
+      </w:pPr>
+      <w:r>
+        <w:rPr>
+          <w:rFonts w:ascii="Arial" w:eastAsia="Times New Roman" w:hAnsi="Arial" w:cs="Arial"/>
+          <w:b/>
+          <w:bCs/>
+          <w:color w:val="000000"/>
+          <w:kern w:val="0"/>
+          <w14:ligatures w14:val="none"/>
+        </w:rPr>
+        <w:t>8. Update Stock Levels</w:t>
+      </w:r>
+    </w:p>
+    <w:p>
+      <w:pPr>
+        <w:numPr>
+          <w:ilvl w:val="0"/>
+          <w:numId w:val="19"/>
+        </w:numPr>
+        <w:spacing w:after="0" w:line="240" w:lineRule="auto"/>
+        <w:textAlignment w:val="baseline"/>
+        <w:rPr>
+          <w:rFonts w:ascii="Arial" w:eastAsia="Times New Roman" w:hAnsi="Arial" w:cs="Arial"/>
+          <w:color w:val="000000"/>
+          <w:kern w:val="0"/>
+          <w14:ligatures w14:val="none"/>
+        </w:rPr>
+      </w:pPr>
+      <w:r>
+        <w:rPr>
+          <w:rFonts w:ascii="Arial" w:eastAsia="Times New Roman" w:hAnsi="Arial" w:cs="Arial"/>
+          <w:b/>
+          <w:bCs/>
+          <w:color w:val="000000"/>
+          <w:kern w:val="0"/>
+          <w14:ligatures w14:val="none"/>
+        </w:rPr>
+        <w:t>Actor</w:t>
+      </w:r>
+      <w:r>
+        <w:rPr>
+          <w:rFonts w:ascii="Arial" w:eastAsia="Times New Roman" w:hAnsi="Arial" w:cs="Arial"/>
+          <w:color w:val="000000"/>
+          <w:kern w:val="0"/>
+          <w14:ligatures w14:val="none"/>
+        </w:rPr>
+        <w:t xml:space="preserve">: Inventory Staff (or triggered by </w:t>
+      </w:r>
+      <w:r>
+        <w:rPr>
+          <w:rFonts w:ascii="Arial" w:eastAsia="Times New Roman" w:hAnsi="Arial" w:cs="Arial"/>
+          <w:b/>
+          <w:bCs/>
+          <w:color w:val="000000"/>
+          <w:kern w:val="0"/>
+          <w14:ligatures w14:val="none"/>
+        </w:rPr>
+        <w:t>Generate Sales Invoices</w:t>
+      </w:r>
+      <w:r>
+        <w:rPr>
+          <w:rFonts w:ascii="Arial" w:eastAsia="Times New Roman" w:hAnsi="Arial" w:cs="Arial"/>
+          <w:color w:val="000000"/>
+          <w:kern w:val="0"/>
+          <w14:ligatures w14:val="none"/>
+        </w:rPr>
+        <w:t>).</w:t>
+      </w:r>
+    </w:p>
+    <w:p>
+      <w:pPr>
+        <w:numPr>
+          <w:ilvl w:val="0"/>
+          <w:numId w:val="19"/>
+        </w:numPr>
+        <w:spacing w:after="0" w:line="240" w:lineRule="auto"/>
+        <w:textAlignment w:val="baseline"/>
+        <w:rPr>
+          <w:rFonts w:ascii="Arial" w:eastAsia="Times New Roman" w:hAnsi="Arial" w:cs="Arial"/>
+          <w:color w:val="000000"/>
+          <w:kern w:val="0"/>
+          <w14:ligatures w14:val="none"/>
+        </w:rPr>
+      </w:pPr>
+      <w:r>
+        <w:rPr>
+          <w:rFonts w:ascii="Arial" w:eastAsia="Times New Roman" w:hAnsi="Arial" w:cs="Arial"/>
+          <w:b/>
+          <w:bCs/>
+          <w:color w:val="000000"/>
+          <w:kern w:val="0"/>
+          <w14:ligatures w14:val="none"/>
+        </w:rPr>
+        <w:t>Description</w:t>
+      </w:r>
+      <w:r>
+        <w:rPr>
+          <w:rFonts w:ascii="Arial" w:eastAsia="Times New Roman" w:hAnsi="Arial" w:cs="Arial"/>
+          <w:color w:val="000000"/>
+          <w:kern w:val="0"/>
+          <w14:ligatures w14:val="none"/>
+        </w:rPr>
+        <w:t>: An included use case that synchronizes physical stock quantities with the digital database.</w:t>
+      </w:r>
+    </w:p>
+    <w:p>
+      <w:pPr>
+        <w:numPr>
+          <w:ilvl w:val="0"/>
+          <w:numId w:val="19"/>
+        </w:numPr>
+        <w:spacing w:after="0" w:line="240" w:lineRule="auto"/>
+        <w:textAlignment w:val="baseline"/>
+        <w:rPr>
+          <w:rFonts w:ascii="Arial" w:eastAsia="Times New Roman" w:hAnsi="Arial" w:cs="Arial"/>
+          <w:color w:val="000000"/>
+          <w:kern w:val="0"/>
+          <w14:ligatures w14:val="none"/>
+        </w:rPr>
+      </w:pPr>
+      <w:r>
+        <w:rPr>
+          <w:rFonts w:ascii="Arial" w:eastAsia="Times New Roman" w:hAnsi="Arial" w:cs="Arial"/>
+          <w:b/>
+          <w:bCs/>
+          <w:color w:val="000000"/>
+          <w:kern w:val="0"/>
+          <w14:ligatures w14:val="none"/>
+        </w:rPr>
+        <w:t>Main Flow</w:t>
+      </w:r>
+      <w:r>
+        <w:rPr>
+          <w:rFonts w:ascii="Arial" w:eastAsia="Times New Roman" w:hAnsi="Arial" w:cs="Arial"/>
+          <w:color w:val="000000"/>
+          <w:kern w:val="0"/>
+          <w14:ligatures w14:val="none"/>
+        </w:rPr>
+        <w:t>:</w:t>
+      </w:r>
+    </w:p>
+    <w:p>
+      <w:pPr>
+        <w:numPr>
+          <w:ilvl w:val="1"/>
+          <w:numId w:val="19"/>
+        </w:numPr>
+        <w:spacing w:after="0" w:line="240" w:lineRule="auto"/>
+        <w:textAlignment w:val="baseline"/>
+        <w:rPr>
+          <w:rFonts w:ascii="Arial" w:eastAsia="Times New Roman" w:hAnsi="Arial" w:cs="Arial"/>
+          <w:color w:val="000000"/>
+          <w:kern w:val="0"/>
+          <w14:ligatures w14:val="none"/>
+        </w:rPr>
+      </w:pPr>
+      <w:r>
+        <w:rPr>
+          <w:rFonts w:ascii="Arial" w:eastAsia="Times New Roman" w:hAnsi="Arial" w:cs="Arial"/>
+          <w:color w:val="000000"/>
+          <w:kern w:val="0"/>
+          <w14:ligatures w14:val="none"/>
+        </w:rPr>
+        <w:t>The system receives an update signal (from a sale or manual stock-in).</w:t>
+      </w:r>
+    </w:p>
+    <w:p>
+      <w:pPr>
+        <w:numPr>
+          <w:ilvl w:val="1"/>
+          <w:numId w:val="19"/>
+        </w:numPr>
+        <w:spacing w:after="0" w:line="240" w:lineRule="auto"/>
+        <w:textAlignment w:val="baseline"/>
+        <w:rPr>
+          <w:rFonts w:ascii="Arial" w:eastAsia="Times New Roman" w:hAnsi="Arial" w:cs="Arial"/>
+          <w:color w:val="000000"/>
+          <w:kern w:val="0"/>
+          <w14:ligatures w14:val="none"/>
+        </w:rPr>
+      </w:pPr>
+      <w:r>
+        <w:rPr>
+          <w:rFonts w:ascii="Arial" w:eastAsia="Times New Roman" w:hAnsi="Arial" w:cs="Arial"/>
+          <w:color w:val="000000"/>
+          <w:kern w:val="0"/>
+          <w14:ligatures w14:val="none"/>
+        </w:rPr>
+        <w:t>The system adjusts the quantity of the specific item.</w:t>
+      </w:r>
+    </w:p>
+    <w:p>
+      <w:pPr>
+        <w:numPr>
+          <w:ilvl w:val="1"/>
+          <w:numId w:val="19"/>
+        </w:numPr>
+        <w:spacing w:after="260" w:line="240" w:lineRule="auto"/>
+        <w:textAlignment w:val="baseline"/>
+        <w:rPr>
+          <w:rFonts w:ascii="Arial" w:eastAsia="Times New Roman" w:hAnsi="Arial" w:cs="Arial"/>
+          <w:color w:val="000000"/>
+          <w:kern w:val="0"/>
+          <w14:ligatures w14:val="none"/>
+        </w:rPr>
+      </w:pPr>
+      <w:r>
+        <w:rPr>
+          <w:rFonts w:ascii="Arial" w:eastAsia="Times New Roman" w:hAnsi="Arial" w:cs="Arial"/>
+          <w:color w:val="000000"/>
+          <w:kern w:val="0"/>
+          <w14:ligatures w14:val="none"/>
+        </w:rPr>
+        <w:t>The system sends a notification if stock levels are critically low.</w:t>
+      </w:r>
+    </w:p>
+    <w:p>
+      <w:pPr>
+        <w:spacing w:after="240" w:line="240" w:lineRule="auto"/>
+        <w:rPr>
+          <w:rFonts w:ascii="Times New Roman" w:eastAsia="Times New Roman" w:hAnsi="Times New Roman" w:cs="Times New Roman"/>
+          <w:kern w:val="0"/>
+          <w14:ligatures w14:val="none"/>
+        </w:rPr>
+      </w:pPr>
+    </w:p>
+    <w:p>
+      <w:pPr>
+        <w:spacing w:before="280" w:after="80" w:line="240" w:lineRule="auto"/>
+        <w:outlineLvl w:val="2"/>
+        <w:rPr>
+          <w:rFonts w:ascii="Times New Roman" w:eastAsia="Times New Roman" w:hAnsi="Times New Roman" w:cs="Times New Roman"/>
+          <w:b/>
+          <w:bCs/>
+          <w:kern w:val="0"/>
+          <w:sz w:val="27"/>
+          <w:szCs w:val="27"/>
+          <w14:ligatures w14:val="none"/>
+        </w:rPr>
+      </w:pPr>
+      <w:r>
+        <w:rPr>
+          <w:rFonts w:ascii="Arial" w:eastAsia="Times New Roman" w:hAnsi="Arial" w:cs="Arial"/>
+          <w:b/>
+          <w:bCs/>
+          <w:color w:val="000000"/>
+          <w:kern w:val="0"/>
+          <w:sz w:val="28"/>
+          <w:szCs w:val="28"/>
+          <w14:ligatures w14:val="none"/>
+        </w:rPr>
+        <w:t>3.3. Functional requirements</w:t>
+      </w:r>
+    </w:p>
+    <w:p>
+      <w:pPr>
+        <w:spacing w:before="260" w:after="260" w:line="240" w:lineRule="auto"/>
+        <w:rPr>
+          <w:rFonts w:ascii="Times New Roman" w:eastAsia="Times New Roman" w:hAnsi="Times New Roman" w:cs="Times New Roman"/>
+          <w:kern w:val="0"/>
+          <w14:ligatures w14:val="none"/>
+        </w:rPr>
+      </w:pPr>
+      <w:r>
+        <w:rPr>
+          <w:rFonts w:ascii="Arial" w:eastAsia="Times New Roman" w:hAnsi="Arial" w:cs="Arial"/>
+          <w:color w:val="000000"/>
+          <w:kern w:val="0"/>
+          <w14:ligatures w14:val="none"/>
+        </w:rPr>
+        <w:t>The system must satisfy the following functional requirements:</w:t>
+      </w:r>
+    </w:p>
+    <w:p>
+      <w:pPr>
+        <w:spacing w:before="260" w:after="260" w:line="240" w:lineRule="auto"/>
+        <w:rPr>
+          <w:rFonts w:ascii="Times New Roman" w:eastAsia="Times New Roman" w:hAnsi="Times New Roman" w:cs="Times New Roman"/>
+          <w:kern w:val="0"/>
+          <w14:ligatures w14:val="none"/>
+        </w:rPr>
+      </w:pPr>
+      <w:r>
+        <w:rPr>
+          <w:rFonts w:ascii="Arial" w:eastAsia="Times New Roman" w:hAnsi="Arial" w:cs="Arial"/>
+          <w:color w:val="000000"/>
+          <w:kern w:val="0"/>
+          <w14:ligatures w14:val="none"/>
+        </w:rPr>
+        <w:t>The system must satisfy the following functional requirements to ensure full operational capability:</w:t>
+      </w:r>
+    </w:p>
+    <w:p>
+      <w:pPr>
+        <w:numPr>
+          <w:ilvl w:val="0"/>
+          <w:numId w:val="20"/>
+        </w:numPr>
+        <w:spacing w:before="260" w:after="0" w:line="240" w:lineRule="auto"/>
+        <w:textAlignment w:val="baseline"/>
+        <w:rPr>
+          <w:rFonts w:ascii="Arial" w:eastAsia="Times New Roman" w:hAnsi="Arial" w:cs="Arial"/>
+          <w:color w:val="000000"/>
+          <w:kern w:val="0"/>
+          <w14:ligatures w14:val="none"/>
+        </w:rPr>
+      </w:pPr>
+      <w:r>
+        <w:rPr>
+          <w:rFonts w:ascii="Arial" w:eastAsia="Times New Roman" w:hAnsi="Arial" w:cs="Arial"/>
+          <w:b/>
+          <w:bCs/>
+          <w:color w:val="000000"/>
+          <w:kern w:val="0"/>
+          <w14:ligatures w14:val="none"/>
+        </w:rPr>
+        <w:t>FR1: Authentication</w:t>
+      </w:r>
+      <w:r>
+        <w:rPr>
+          <w:rFonts w:ascii="Arial" w:eastAsia="Times New Roman" w:hAnsi="Arial" w:cs="Arial"/>
+          <w:color w:val="000000"/>
+          <w:kern w:val="0"/>
+          <w14:ligatures w14:val="none"/>
+        </w:rPr>
+        <w:t xml:space="preserve"> – The system shall provide secure Login and Logout functionalities for authorized users.</w:t>
+      </w:r>
+    </w:p>
+    <w:p>
+      <w:pPr>
+        <w:numPr>
+          <w:ilvl w:val="0"/>
+          <w:numId w:val="20"/>
+        </w:numPr>
+        <w:spacing w:after="0" w:line="240" w:lineRule="auto"/>
+        <w:textAlignment w:val="baseline"/>
+        <w:rPr>
+          <w:rFonts w:ascii="Arial" w:eastAsia="Times New Roman" w:hAnsi="Arial" w:cs="Arial"/>
+          <w:color w:val="000000"/>
+          <w:kern w:val="0"/>
+          <w14:ligatures w14:val="none"/>
+        </w:rPr>
+      </w:pPr>
+      <w:r>
+        <w:rPr>
+          <w:rFonts w:ascii="Arial" w:eastAsia="Times New Roman" w:hAnsi="Arial" w:cs="Arial"/>
+          <w:b/>
+          <w:bCs/>
+          <w:color w:val="000000"/>
+          <w:kern w:val="0"/>
+          <w14:ligatures w14:val="none"/>
+        </w:rPr>
+        <w:t>FR2: Sales Processing</w:t>
+      </w:r>
+      <w:r>
+        <w:rPr>
+          <w:rFonts w:ascii="Arial" w:eastAsia="Times New Roman" w:hAnsi="Arial" w:cs="Arial"/>
+          <w:color w:val="000000"/>
+          <w:kern w:val="0"/>
+          <w14:ligatures w14:val="none"/>
+        </w:rPr>
+        <w:t xml:space="preserve"> – The system shall allow sales staff to generate invoices and process customer orders efficiently.</w:t>
+      </w:r>
+    </w:p>
+    <w:p>
+      <w:pPr>
+        <w:numPr>
+          <w:ilvl w:val="0"/>
+          <w:numId w:val="20"/>
+        </w:numPr>
+        <w:spacing w:after="0" w:line="240" w:lineRule="auto"/>
+        <w:textAlignment w:val="baseline"/>
+        <w:rPr>
+          <w:rFonts w:ascii="Arial" w:eastAsia="Times New Roman" w:hAnsi="Arial" w:cs="Arial"/>
+          <w:color w:val="000000"/>
+          <w:kern w:val="0"/>
+          <w14:ligatures w14:val="none"/>
+        </w:rPr>
+      </w:pPr>
+      <w:r>
+        <w:rPr>
+          <w:rFonts w:ascii="Arial" w:eastAsia="Times New Roman" w:hAnsi="Arial" w:cs="Arial"/>
+          <w:b/>
+          <w:bCs/>
+          <w:color w:val="000000"/>
+          <w:kern w:val="0"/>
+          <w14:ligatures w14:val="none"/>
+        </w:rPr>
+        <w:t>FR3: Inventory Management</w:t>
+      </w:r>
+      <w:r>
+        <w:rPr>
+          <w:rFonts w:ascii="Arial" w:eastAsia="Times New Roman" w:hAnsi="Arial" w:cs="Arial"/>
+          <w:color w:val="000000"/>
+          <w:kern w:val="0"/>
+          <w14:ligatures w14:val="none"/>
+        </w:rPr>
+        <w:t xml:space="preserve"> – The system shall provide tools for managing the product catalog and tracking specific hardware components.</w:t>
+      </w:r>
+    </w:p>
+    <w:p>
+      <w:pPr>
+        <w:numPr>
+          <w:ilvl w:val="0"/>
+          <w:numId w:val="20"/>
+        </w:numPr>
+        <w:spacing w:after="0" w:line="240" w:lineRule="auto"/>
+        <w:textAlignment w:val="baseline"/>
+        <w:rPr>
+          <w:rFonts w:ascii="Arial" w:eastAsia="Times New Roman" w:hAnsi="Arial" w:cs="Arial"/>
+          <w:color w:val="000000"/>
+          <w:kern w:val="0"/>
+          <w14:ligatures w14:val="none"/>
+        </w:rPr>
+      </w:pPr>
+      <w:r>
+        <w:rPr>
+          <w:rFonts w:ascii="Arial" w:eastAsia="Times New Roman" w:hAnsi="Arial" w:cs="Arial"/>
+          <w:b/>
+          <w:bCs/>
+          <w:color w:val="000000"/>
+          <w:kern w:val="0"/>
+          <w14:ligatures w14:val="none"/>
+        </w:rPr>
+        <w:t>FR4: Customer Management</w:t>
+      </w:r>
+      <w:r>
+        <w:rPr>
+          <w:rFonts w:ascii="Arial" w:eastAsia="Times New Roman" w:hAnsi="Arial" w:cs="Arial"/>
+          <w:color w:val="000000"/>
+          <w:kern w:val="0"/>
+          <w14:ligatures w14:val="none"/>
+        </w:rPr>
+        <w:t xml:space="preserve"> – The system shall enable staff to store, search, and update customer contact information and history.</w:t>
+      </w:r>
+    </w:p>
+    <w:p>
+      <w:pPr>
+        <w:numPr>
+          <w:ilvl w:val="0"/>
+          <w:numId w:val="20"/>
+        </w:numPr>
+        <w:spacing w:after="0" w:line="240" w:lineRule="auto"/>
+        <w:textAlignment w:val="baseline"/>
+        <w:rPr>
+          <w:rFonts w:ascii="Arial" w:eastAsia="Times New Roman" w:hAnsi="Arial" w:cs="Arial"/>
+          <w:color w:val="000000"/>
+          <w:kern w:val="0"/>
+          <w14:ligatures w14:val="none"/>
+        </w:rPr>
+      </w:pPr>
+      <w:r>
+        <w:rPr>
+          <w:rFonts w:ascii="Arial" w:eastAsia="Times New Roman" w:hAnsi="Arial" w:cs="Arial"/>
+          <w:b/>
+          <w:bCs/>
+          <w:color w:val="000000"/>
+          <w:kern w:val="0"/>
+          <w14:ligatures w14:val="none"/>
+        </w:rPr>
+        <w:t>FR5: Employee Administration</w:t>
+      </w:r>
+      <w:r>
+        <w:rPr>
+          <w:rFonts w:ascii="Arial" w:eastAsia="Times New Roman" w:hAnsi="Arial" w:cs="Arial"/>
+          <w:color w:val="000000"/>
+          <w:kern w:val="0"/>
+          <w14:ligatures w14:val="none"/>
+        </w:rPr>
+        <w:t xml:space="preserve"> – The system shall allow the manager to create, update, and manage staff accounts and roles.</w:t>
+      </w:r>
+    </w:p>
+    <w:p>
+      <w:pPr>
+        <w:numPr>
+          <w:ilvl w:val="0"/>
+          <w:numId w:val="20"/>
+        </w:numPr>
+        <w:spacing w:after="0" w:line="240" w:lineRule="auto"/>
+        <w:textAlignment w:val="baseline"/>
+        <w:rPr>
+          <w:rFonts w:ascii="Arial" w:eastAsia="Times New Roman" w:hAnsi="Arial" w:cs="Arial"/>
+          <w:color w:val="000000"/>
+          <w:kern w:val="0"/>
+          <w14:ligatures w14:val="none"/>
+        </w:rPr>
+      </w:pPr>
+      <w:r>
+        <w:rPr>
+          <w:rFonts w:ascii="Arial" w:eastAsia="Times New Roman" w:hAnsi="Arial" w:cs="Arial"/>
+          <w:b/>
+          <w:bCs/>
+          <w:color w:val="000000"/>
+          <w:kern w:val="0"/>
+          <w14:ligatures w14:val="none"/>
+        </w:rPr>
+        <w:t>FR6: Automated Synchronization</w:t>
+      </w:r>
+      <w:r>
+        <w:rPr>
+          <w:rFonts w:ascii="Arial" w:eastAsia="Times New Roman" w:hAnsi="Arial" w:cs="Arial"/>
+          <w:color w:val="000000"/>
+          <w:kern w:val="0"/>
+          <w14:ligatures w14:val="none"/>
+        </w:rPr>
+        <w:t xml:space="preserve"> – The system must automatically update (decrease) stock levels in the database immediately after an invoice is generated.</w:t>
+      </w:r>
+    </w:p>
+    <w:p>
+      <w:pPr>
+        <w:numPr>
+          <w:ilvl w:val="0"/>
+          <w:numId w:val="20"/>
+        </w:numPr>
+        <w:spacing w:after="260" w:line="240" w:lineRule="auto"/>
+        <w:textAlignment w:val="baseline"/>
+        <w:rPr>
+          <w:rFonts w:ascii="Arial" w:eastAsia="Times New Roman" w:hAnsi="Arial" w:cs="Arial"/>
+          <w:color w:val="000000"/>
+          <w:kern w:val="0"/>
+          <w14:ligatures w14:val="none"/>
+        </w:rPr>
+      </w:pPr>
+      <w:r>
+        <w:rPr>
+          <w:rFonts w:ascii="Arial" w:eastAsia="Times New Roman" w:hAnsi="Arial" w:cs="Arial"/>
+          <w:b/>
+          <w:bCs/>
+          <w:color w:val="000000"/>
+          <w:kern w:val="0"/>
+          <w14:ligatures w14:val="none"/>
+        </w:rPr>
+        <w:t>FR7: Reporting</w:t>
+      </w:r>
+      <w:r>
+        <w:rPr>
+          <w:rFonts w:ascii="Arial" w:eastAsia="Times New Roman" w:hAnsi="Arial" w:cs="Arial"/>
+          <w:color w:val="000000"/>
+          <w:kern w:val="0"/>
+          <w14:ligatures w14:val="none"/>
+        </w:rPr>
+        <w:t xml:space="preserve"> – The system shall generate visual reports and statistics regarding sales revenue and shop performance.</w:t>
+      </w:r>
+    </w:p>
+    <w:p>
+      <w:pPr>
+        <w:spacing w:before="280" w:after="80" w:line="240" w:lineRule="auto"/>
+        <w:outlineLvl w:val="2"/>
+        <w:rPr>
+          <w:rFonts w:ascii="Times New Roman" w:eastAsia="Times New Roman" w:hAnsi="Times New Roman" w:cs="Times New Roman"/>
+          <w:b/>
+          <w:bCs/>
+          <w:kern w:val="0"/>
+          <w:sz w:val="27"/>
+          <w:szCs w:val="27"/>
+          <w14:ligatures w14:val="none"/>
+        </w:rPr>
+      </w:pPr>
+      <w:r>
+        <w:rPr>
+          <w:rFonts w:ascii="Arial" w:eastAsia="Times New Roman" w:hAnsi="Arial" w:cs="Arial"/>
+          <w:b/>
+          <w:bCs/>
+          <w:color w:val="000000"/>
+          <w:kern w:val="0"/>
+          <w:sz w:val="28"/>
+          <w:szCs w:val="28"/>
+          <w14:ligatures w14:val="none"/>
+        </w:rPr>
+        <w:t>3.4. Non-functional requirements</w:t>
+      </w:r>
+    </w:p>
+    <w:p>
+      <w:pPr>
+        <w:spacing w:before="260" w:after="260" w:line="240" w:lineRule="auto"/>
+        <w:rPr>
+          <w:rFonts w:ascii="Times New Roman" w:eastAsia="Times New Roman" w:hAnsi="Times New Roman" w:cs="Times New Roman"/>
+          <w:kern w:val="0"/>
+          <w14:ligatures w14:val="none"/>
+        </w:rPr>
+      </w:pPr>
+      <w:r>
+        <w:rPr>
+          <w:rFonts w:ascii="Arial" w:eastAsia="Times New Roman" w:hAnsi="Arial" w:cs="Arial"/>
+          <w:color w:val="000000"/>
+          <w:kern w:val="0"/>
+          <w14:ligatures w14:val="none"/>
+        </w:rPr>
+        <w:t>The system must meet these quality and technical standards:</w:t>
+      </w:r>
+    </w:p>
+    <w:p>
+      <w:pPr>
+        <w:numPr>
+          <w:ilvl w:val="0"/>
+          <w:numId w:val="21"/>
+        </w:numPr>
+        <w:spacing w:before="260" w:after="0" w:line="240" w:lineRule="auto"/>
+        <w:textAlignment w:val="baseline"/>
+        <w:rPr>
+          <w:rFonts w:ascii="Arial" w:eastAsia="Times New Roman" w:hAnsi="Arial" w:cs="Arial"/>
+          <w:color w:val="000000"/>
+          <w:kern w:val="0"/>
+          <w:sz w:val="22"/>
+          <w:szCs w:val="22"/>
+          <w14:ligatures w14:val="none"/>
+        </w:rPr>
+      </w:pPr>
+      <w:r>
+        <w:rPr>
+          <w:rFonts w:ascii="Arial" w:eastAsia="Times New Roman" w:hAnsi="Arial" w:cs="Arial"/>
+          <w:b/>
+          <w:bCs/>
+          <w:color w:val="000000"/>
+          <w:kern w:val="0"/>
+          <w14:ligatures w14:val="none"/>
+        </w:rPr>
+        <w:lastRenderedPageBreak/>
+        <w:t>NFR1: Security</w:t>
+      </w:r>
+      <w:r>
+        <w:rPr>
+          <w:rFonts w:ascii="Arial" w:eastAsia="Times New Roman" w:hAnsi="Arial" w:cs="Arial"/>
+          <w:color w:val="000000"/>
+          <w:kern w:val="0"/>
+          <w14:ligatures w14:val="none"/>
+        </w:rPr>
+        <w:t xml:space="preserve"> – All user passwords must be hashed and stored securely to prevent unauthorized access.</w:t>
+      </w:r>
+    </w:p>
+    <w:p>
+      <w:pPr>
+        <w:numPr>
+          <w:ilvl w:val="0"/>
+          <w:numId w:val="21"/>
+        </w:numPr>
+        <w:spacing w:after="0" w:line="240" w:lineRule="auto"/>
+        <w:textAlignment w:val="baseline"/>
+        <w:rPr>
+          <w:rFonts w:ascii="Arial" w:eastAsia="Times New Roman" w:hAnsi="Arial" w:cs="Arial"/>
+          <w:color w:val="000000"/>
+          <w:kern w:val="0"/>
+          <w:sz w:val="22"/>
+          <w:szCs w:val="22"/>
+          <w14:ligatures w14:val="none"/>
+        </w:rPr>
+      </w:pPr>
+      <w:r>
+        <w:rPr>
+          <w:rFonts w:ascii="Arial" w:eastAsia="Times New Roman" w:hAnsi="Arial" w:cs="Arial"/>
+          <w:b/>
+          <w:bCs/>
+          <w:color w:val="000000"/>
+          <w:kern w:val="0"/>
+          <w14:ligatures w14:val="none"/>
+        </w:rPr>
+        <w:t>NFR2: Performance</w:t>
+      </w:r>
+      <w:r>
+        <w:rPr>
+          <w:rFonts w:ascii="Arial" w:eastAsia="Times New Roman" w:hAnsi="Arial" w:cs="Arial"/>
+          <w:color w:val="000000"/>
+          <w:kern w:val="0"/>
+          <w14:ligatures w14:val="none"/>
+        </w:rPr>
+        <w:t xml:space="preserve"> – The system should process standard database queries and transactions in less than 2 seconds.</w:t>
+      </w:r>
+    </w:p>
+    <w:p>
+      <w:pPr>
+        <w:numPr>
+          <w:ilvl w:val="0"/>
+          <w:numId w:val="21"/>
+        </w:numPr>
+        <w:spacing w:after="0" w:line="240" w:lineRule="auto"/>
+        <w:textAlignment w:val="baseline"/>
+        <w:rPr>
+          <w:rFonts w:ascii="Arial" w:eastAsia="Times New Roman" w:hAnsi="Arial" w:cs="Arial"/>
+          <w:color w:val="000000"/>
+          <w:kern w:val="0"/>
+          <w:sz w:val="22"/>
+          <w:szCs w:val="22"/>
+          <w14:ligatures w14:val="none"/>
+        </w:rPr>
+      </w:pPr>
+      <w:r>
+        <w:rPr>
+          <w:rFonts w:ascii="Arial" w:eastAsia="Times New Roman" w:hAnsi="Arial" w:cs="Arial"/>
+          <w:b/>
+          <w:bCs/>
+          <w:color w:val="000000"/>
+          <w:kern w:val="0"/>
+          <w14:ligatures w14:val="none"/>
+        </w:rPr>
+        <w:t>NFR3: Usability</w:t>
+      </w:r>
+      <w:r>
+        <w:rPr>
+          <w:rFonts w:ascii="Arial" w:eastAsia="Times New Roman" w:hAnsi="Arial" w:cs="Arial"/>
+          <w:color w:val="000000"/>
+          <w:kern w:val="0"/>
+          <w14:ligatures w14:val="none"/>
+        </w:rPr>
+        <w:t xml:space="preserve"> – The WinForms interface must be intuitive, consistent, and professional to minimize user training time.</w:t>
+      </w:r>
+    </w:p>
+    <w:p>
+      <w:pPr>
+        <w:numPr>
+          <w:ilvl w:val="0"/>
+          <w:numId w:val="21"/>
+        </w:numPr>
+        <w:spacing w:after="260" w:line="240" w:lineRule="auto"/>
+        <w:textAlignment w:val="baseline"/>
+        <w:rPr>
+          <w:rFonts w:ascii="Arial" w:eastAsia="Times New Roman" w:hAnsi="Arial" w:cs="Arial"/>
+          <w:color w:val="000000"/>
+          <w:kern w:val="0"/>
+          <w:sz w:val="22"/>
+          <w:szCs w:val="22"/>
+          <w14:ligatures w14:val="none"/>
+        </w:rPr>
+      </w:pPr>
+      <w:r>
+        <w:rPr>
+          <w:rFonts w:ascii="Arial" w:eastAsia="Times New Roman" w:hAnsi="Arial" w:cs="Arial"/>
+          <w:b/>
+          <w:bCs/>
+          <w:color w:val="000000"/>
+          <w:kern w:val="0"/>
+          <w14:ligatures w14:val="none"/>
+        </w:rPr>
+        <w:t>NFR4: Data Integrity</w:t>
+      </w:r>
+      <w:r>
+        <w:rPr>
+          <w:rFonts w:ascii="Arial" w:eastAsia="Times New Roman" w:hAnsi="Arial" w:cs="Arial"/>
+          <w:color w:val="000000"/>
+          <w:kern w:val="0"/>
+          <w14:ligatures w14:val="none"/>
+        </w:rPr>
+        <w:t xml:space="preserve"> – The system must ensure absolute consistency between transaction records and the inventory database.</w:t>
+      </w:r>
+    </w:p>
+    <w:p>
+      <w:pPr>
+        <w:spacing w:after="260" w:line="240" w:lineRule="auto"/>
+        <w:textAlignment w:val="baseline"/>
+        <w:rPr>
+          <w:rFonts w:ascii="Arial" w:eastAsia="Times New Roman" w:hAnsi="Arial" w:cs="Arial"/>
+          <w:color w:val="000000"/>
+          <w:kern w:val="0"/>
+          <w:sz w:val="22"/>
+          <w:szCs w:val="22"/>
+          <w14:ligatures w14:val="none"/>
+        </w:rPr>
+      </w:pPr>
     </w:p>
     <w:sectPr>
       <w:pgSz w:w="12240" w:h="15840"/>
@@ -1366,6 +3881,304 @@
 <file path=word/numbering.xml><?xml version="1.0" encoding="utf-8"?>
 <w:numbering xmlns:wpc="http://schemas.microsoft.com/office/word/2010/wordprocessingCanvas" xmlns:cx="http://schemas.microsoft.com/office/drawing/2014/chartex" xmlns:cx1="http://schemas.microsoft.com/office/drawing/2015/9/8/chartex" xmlns:cx2="http://schemas.microsoft.com/office/drawing/2015/10/21/chartex" xmlns:cx3="http://schemas.microsoft.com/office/drawing/2016/5/9/chartex" xmlns:cx4="http://schemas.microsoft.com/office/drawing/2016/5/10/chartex" xmlns:cx5="http://schemas.microsoft.com/office/drawing/2016/5/11/chartex" xmlns:cx6="http://schemas.microsoft.com/office/drawing/2016/5/12/chartex" xmlns:cx7="http://schemas.microsoft.com/office/drawing/2016/5/13/chartex" xmlns:cx8="http://schemas.microsoft.com/office/drawing/2016/5/14/chartex" xmlns:mc="http://schemas.openxmlformats.org/markup-compatibility/2006" xmlns:aink="http://schemas.microsoft.com/office/drawing/2016/ink" xmlns:am3d="http://schemas.microsoft.com/office/drawing/2017/model3d" xmlns:o="urn:schemas-microsoft-com:office:office" xmlns:oel="http://schemas.microsoft.com/office/2019/extlst" xmlns:r="http://schemas.openxmlformats.org/officeDocument/2006/relationships" xmlns:m="http://schemas.openxmlformats.org/officeDocument/2006/math" xmlns:v="urn:schemas-microsoft-com:vml" xmlns:wp14="http://schemas.microsoft.com/office/word/2010/wordprocessingDrawing" xmlns:wp="http://schemas.openxmlformats.org/drawingml/2006/wordprocessingDrawing" xmlns:w10="urn:schemas-microsoft-com:office:word" xmlns:w="http://schemas.openxmlformats.org/wordprocessingml/2006/main" xmlns:w14="http://schemas.microsoft.com/office/word/2010/wordml" xmlns:w15="http://schemas.microsoft.com/office/word/2012/wordml" xmlns:w16cex="http://schemas.microsoft.com/office/word/2018/wordml/cex" xmlns:w16cid="http://schemas.microsoft.com/office/word/2016/wordml/cid" xmlns:w16="http://schemas.microsoft.com/office/word/2018/wordml" xmlns:w16du="http://schemas.microsoft.com/office/word/2023/wordml/word16du" xmlns:w16sdtdh="http://schemas.microsoft.com/office/word/2020/wordml/sdtdatahash" xmlns:w16sdtfl="http://schemas.microsoft.com/office/word/2024/wordml/sdtformatlock" xmlns:w16se="http://schemas.microsoft.com/office/word/2015/wordml/symex" xmlns:wpg="http://schemas.microsoft.com/office/word/2010/wordprocessingGroup" xmlns:wpi="http://schemas.microsoft.com/office/word/2010/wordprocessingInk" xmlns:wne="http://schemas.microsoft.com/office/word/2006/wordml" xmlns:wps="http://schemas.microsoft.com/office/word/2010/wordprocessingShape" mc:Ignorable="w14 w15 w16se w16cid w16 w16cex w16sdtdh w16sdtfl w16du wp14">
   <w:abstractNum w:abstractNumId="0" w15:restartNumberingAfterBreak="0">
+    <w:nsid w:val="01BC4726"/>
+    <w:multiLevelType w:val="multilevel"/>
+    <w:tmpl w:val="873EEBA0"/>
+    <w:lvl w:ilvl="0">
+      <w:start w:val="1"/>
+      <w:numFmt w:val="bullet"/>
+      <w:lvlText w:val=""/>
+      <w:lvlJc w:val="left"/>
+      <w:pPr>
+        <w:tabs>
+          <w:tab w:val="num" w:pos="720"/>
+        </w:tabs>
+        <w:ind w:left="720" w:hanging="360"/>
+      </w:pPr>
+      <w:rPr>
+        <w:rFonts w:ascii="Symbol" w:hAnsi="Symbol" w:hint="default"/>
+        <w:sz w:val="20"/>
+      </w:rPr>
+    </w:lvl>
+    <w:lvl w:ilvl="1" w:tentative="1">
+      <w:start w:val="1"/>
+      <w:numFmt w:val="bullet"/>
+      <w:lvlText w:val="o"/>
+      <w:lvlJc w:val="left"/>
+      <w:pPr>
+        <w:tabs>
+          <w:tab w:val="num" w:pos="1440"/>
+        </w:tabs>
+        <w:ind w:left="1440" w:hanging="360"/>
+      </w:pPr>
+      <w:rPr>
+        <w:rFonts w:ascii="Courier New" w:hAnsi="Courier New" w:hint="default"/>
+        <w:sz w:val="20"/>
+      </w:rPr>
+    </w:lvl>
+    <w:lvl w:ilvl="2" w:tentative="1">
+      <w:start w:val="1"/>
+      <w:numFmt w:val="bullet"/>
+      <w:lvlText w:val=""/>
+      <w:lvlJc w:val="left"/>
+      <w:pPr>
+        <w:tabs>
+          <w:tab w:val="num" w:pos="2160"/>
+        </w:tabs>
+        <w:ind w:left="2160" w:hanging="360"/>
+      </w:pPr>
+      <w:rPr>
+        <w:rFonts w:ascii="Wingdings" w:hAnsi="Wingdings" w:hint="default"/>
+        <w:sz w:val="20"/>
+      </w:rPr>
+    </w:lvl>
+    <w:lvl w:ilvl="3" w:tentative="1">
+      <w:start w:val="1"/>
+      <w:numFmt w:val="bullet"/>
+      <w:lvlText w:val=""/>
+      <w:lvlJc w:val="left"/>
+      <w:pPr>
+        <w:tabs>
+          <w:tab w:val="num" w:pos="2880"/>
+        </w:tabs>
+        <w:ind w:left="2880" w:hanging="360"/>
+      </w:pPr>
+      <w:rPr>
+        <w:rFonts w:ascii="Wingdings" w:hAnsi="Wingdings" w:hint="default"/>
+        <w:sz w:val="20"/>
+      </w:rPr>
+    </w:lvl>
+    <w:lvl w:ilvl="4" w:tentative="1">
+      <w:start w:val="1"/>
+      <w:numFmt w:val="bullet"/>
+      <w:lvlText w:val=""/>
+      <w:lvlJc w:val="left"/>
+      <w:pPr>
+        <w:tabs>
+          <w:tab w:val="num" w:pos="3600"/>
+        </w:tabs>
+        <w:ind w:left="3600" w:hanging="360"/>
+      </w:pPr>
+      <w:rPr>
+        <w:rFonts w:ascii="Wingdings" w:hAnsi="Wingdings" w:hint="default"/>
+        <w:sz w:val="20"/>
+      </w:rPr>
+    </w:lvl>
+    <w:lvl w:ilvl="5" w:tentative="1">
+      <w:start w:val="1"/>
+      <w:numFmt w:val="bullet"/>
+      <w:lvlText w:val=""/>
+      <w:lvlJc w:val="left"/>
+      <w:pPr>
+        <w:tabs>
+          <w:tab w:val="num" w:pos="4320"/>
+        </w:tabs>
+        <w:ind w:left="4320" w:hanging="360"/>
+      </w:pPr>
+      <w:rPr>
+        <w:rFonts w:ascii="Wingdings" w:hAnsi="Wingdings" w:hint="default"/>
+        <w:sz w:val="20"/>
+      </w:rPr>
+    </w:lvl>
+    <w:lvl w:ilvl="6" w:tentative="1">
+      <w:start w:val="1"/>
+      <w:numFmt w:val="bullet"/>
+      <w:lvlText w:val=""/>
+      <w:lvlJc w:val="left"/>
+      <w:pPr>
+        <w:tabs>
+          <w:tab w:val="num" w:pos="5040"/>
+        </w:tabs>
+        <w:ind w:left="5040" w:hanging="360"/>
+      </w:pPr>
+      <w:rPr>
+        <w:rFonts w:ascii="Wingdings" w:hAnsi="Wingdings" w:hint="default"/>
+        <w:sz w:val="20"/>
+      </w:rPr>
+    </w:lvl>
+    <w:lvl w:ilvl="7" w:tentative="1">
+      <w:start w:val="1"/>
+      <w:numFmt w:val="bullet"/>
+      <w:lvlText w:val=""/>
+      <w:lvlJc w:val="left"/>
+      <w:pPr>
+        <w:tabs>
+          <w:tab w:val="num" w:pos="5760"/>
+        </w:tabs>
+        <w:ind w:left="5760" w:hanging="360"/>
+      </w:pPr>
+      <w:rPr>
+        <w:rFonts w:ascii="Wingdings" w:hAnsi="Wingdings" w:hint="default"/>
+        <w:sz w:val="20"/>
+      </w:rPr>
+    </w:lvl>
+    <w:lvl w:ilvl="8" w:tentative="1">
+      <w:start w:val="1"/>
+      <w:numFmt w:val="bullet"/>
+      <w:lvlText w:val=""/>
+      <w:lvlJc w:val="left"/>
+      <w:pPr>
+        <w:tabs>
+          <w:tab w:val="num" w:pos="6480"/>
+        </w:tabs>
+        <w:ind w:left="6480" w:hanging="360"/>
+      </w:pPr>
+      <w:rPr>
+        <w:rFonts w:ascii="Wingdings" w:hAnsi="Wingdings" w:hint="default"/>
+        <w:sz w:val="20"/>
+      </w:rPr>
+    </w:lvl>
+  </w:abstractNum>
+  <w:abstractNum w:abstractNumId="1" w15:restartNumberingAfterBreak="0">
+    <w:nsid w:val="121611FE"/>
+    <w:multiLevelType w:val="multilevel"/>
+    <w:tmpl w:val="C6540CAA"/>
+    <w:lvl w:ilvl="0">
+      <w:start w:val="1"/>
+      <w:numFmt w:val="bullet"/>
+      <w:lvlText w:val=""/>
+      <w:lvlJc w:val="left"/>
+      <w:pPr>
+        <w:tabs>
+          <w:tab w:val="num" w:pos="720"/>
+        </w:tabs>
+        <w:ind w:left="720" w:hanging="360"/>
+      </w:pPr>
+      <w:rPr>
+        <w:rFonts w:ascii="Symbol" w:hAnsi="Symbol" w:hint="default"/>
+        <w:sz w:val="20"/>
+      </w:rPr>
+    </w:lvl>
+    <w:lvl w:ilvl="1" w:tentative="1">
+      <w:start w:val="1"/>
+      <w:numFmt w:val="bullet"/>
+      <w:lvlText w:val="o"/>
+      <w:lvlJc w:val="left"/>
+      <w:pPr>
+        <w:tabs>
+          <w:tab w:val="num" w:pos="1440"/>
+        </w:tabs>
+        <w:ind w:left="1440" w:hanging="360"/>
+      </w:pPr>
+      <w:rPr>
+        <w:rFonts w:ascii="Courier New" w:hAnsi="Courier New" w:hint="default"/>
+        <w:sz w:val="20"/>
+      </w:rPr>
+    </w:lvl>
+    <w:lvl w:ilvl="2" w:tentative="1">
+      <w:start w:val="1"/>
+      <w:numFmt w:val="bullet"/>
+      <w:lvlText w:val=""/>
+      <w:lvlJc w:val="left"/>
+      <w:pPr>
+        <w:tabs>
+          <w:tab w:val="num" w:pos="2160"/>
+        </w:tabs>
+        <w:ind w:left="2160" w:hanging="360"/>
+      </w:pPr>
+      <w:rPr>
+        <w:rFonts w:ascii="Wingdings" w:hAnsi="Wingdings" w:hint="default"/>
+        <w:sz w:val="20"/>
+      </w:rPr>
+    </w:lvl>
+    <w:lvl w:ilvl="3" w:tentative="1">
+      <w:start w:val="1"/>
+      <w:numFmt w:val="bullet"/>
+      <w:lvlText w:val=""/>
+      <w:lvlJc w:val="left"/>
+      <w:pPr>
+        <w:tabs>
+          <w:tab w:val="num" w:pos="2880"/>
+        </w:tabs>
+        <w:ind w:left="2880" w:hanging="360"/>
+      </w:pPr>
+      <w:rPr>
+        <w:rFonts w:ascii="Wingdings" w:hAnsi="Wingdings" w:hint="default"/>
+        <w:sz w:val="20"/>
+      </w:rPr>
+    </w:lvl>
+    <w:lvl w:ilvl="4" w:tentative="1">
+      <w:start w:val="1"/>
+      <w:numFmt w:val="bullet"/>
+      <w:lvlText w:val=""/>
+      <w:lvlJc w:val="left"/>
+      <w:pPr>
+        <w:tabs>
+          <w:tab w:val="num" w:pos="3600"/>
+        </w:tabs>
+        <w:ind w:left="3600" w:hanging="360"/>
+      </w:pPr>
+      <w:rPr>
+        <w:rFonts w:ascii="Wingdings" w:hAnsi="Wingdings" w:hint="default"/>
+        <w:sz w:val="20"/>
+      </w:rPr>
+    </w:lvl>
+    <w:lvl w:ilvl="5" w:tentative="1">
+      <w:start w:val="1"/>
+      <w:numFmt w:val="bullet"/>
+      <w:lvlText w:val=""/>
+      <w:lvlJc w:val="left"/>
+      <w:pPr>
+        <w:tabs>
+          <w:tab w:val="num" w:pos="4320"/>
+        </w:tabs>
+        <w:ind w:left="4320" w:hanging="360"/>
+      </w:pPr>
+      <w:rPr>
+        <w:rFonts w:ascii="Wingdings" w:hAnsi="Wingdings" w:hint="default"/>
+        <w:sz w:val="20"/>
+      </w:rPr>
+    </w:lvl>
+    <w:lvl w:ilvl="6" w:tentative="1">
+      <w:start w:val="1"/>
+      <w:numFmt w:val="bullet"/>
+      <w:lvlText w:val=""/>
+      <w:lvlJc w:val="left"/>
+      <w:pPr>
+        <w:tabs>
+          <w:tab w:val="num" w:pos="5040"/>
+        </w:tabs>
+        <w:ind w:left="5040" w:hanging="360"/>
+      </w:pPr>
+      <w:rPr>
+        <w:rFonts w:ascii="Wingdings" w:hAnsi="Wingdings" w:hint="default"/>
+        <w:sz w:val="20"/>
+      </w:rPr>
+    </w:lvl>
+    <w:lvl w:ilvl="7" w:tentative="1">
+      <w:start w:val="1"/>
+      <w:numFmt w:val="bullet"/>
+      <w:lvlText w:val=""/>
+      <w:lvlJc w:val="left"/>
+      <w:pPr>
+        <w:tabs>
+          <w:tab w:val="num" w:pos="5760"/>
+        </w:tabs>
+        <w:ind w:left="5760" w:hanging="360"/>
+      </w:pPr>
+      <w:rPr>
+        <w:rFonts w:ascii="Wingdings" w:hAnsi="Wingdings" w:hint="default"/>
+        <w:sz w:val="20"/>
+      </w:rPr>
+    </w:lvl>
+    <w:lvl w:ilvl="8" w:tentative="1">
+      <w:start w:val="1"/>
+      <w:numFmt w:val="bullet"/>
+      <w:lvlText w:val=""/>
+      <w:lvlJc w:val="left"/>
+      <w:pPr>
+        <w:tabs>
+          <w:tab w:val="num" w:pos="6480"/>
+        </w:tabs>
+        <w:ind w:left="6480" w:hanging="360"/>
+      </w:pPr>
+      <w:rPr>
+        <w:rFonts w:ascii="Wingdings" w:hAnsi="Wingdings" w:hint="default"/>
+        <w:sz w:val="20"/>
+      </w:rPr>
+    </w:lvl>
+  </w:abstractNum>
+  <w:abstractNum w:abstractNumId="2" w15:restartNumberingAfterBreak="0">
     <w:nsid w:val="1ECF1909"/>
     <w:multiLevelType w:val="multilevel"/>
     <w:tmpl w:val="2864CFAC"/>
@@ -1514,7 +4327,297 @@
       </w:rPr>
     </w:lvl>
   </w:abstractNum>
-  <w:abstractNum w:abstractNumId="1" w15:restartNumberingAfterBreak="0">
+  <w:abstractNum w:abstractNumId="3" w15:restartNumberingAfterBreak="0">
+    <w:nsid w:val="1F9B279A"/>
+    <w:multiLevelType w:val="multilevel"/>
+    <w:tmpl w:val="E7BA563A"/>
+    <w:lvl w:ilvl="0">
+      <w:start w:val="1"/>
+      <w:numFmt w:val="bullet"/>
+      <w:lvlText w:val=""/>
+      <w:lvlJc w:val="left"/>
+      <w:pPr>
+        <w:tabs>
+          <w:tab w:val="num" w:pos="720"/>
+        </w:tabs>
+        <w:ind w:left="720" w:hanging="360"/>
+      </w:pPr>
+      <w:rPr>
+        <w:rFonts w:ascii="Symbol" w:hAnsi="Symbol" w:hint="default"/>
+        <w:sz w:val="20"/>
+      </w:rPr>
+    </w:lvl>
+    <w:lvl w:ilvl="1">
+      <w:start w:val="1"/>
+      <w:numFmt w:val="decimal"/>
+      <w:lvlText w:val="%2."/>
+      <w:lvlJc w:val="left"/>
+      <w:pPr>
+        <w:tabs>
+          <w:tab w:val="num" w:pos="1440"/>
+        </w:tabs>
+        <w:ind w:left="1440" w:hanging="360"/>
+      </w:pPr>
+    </w:lvl>
+    <w:lvl w:ilvl="2" w:tentative="1">
+      <w:start w:val="1"/>
+      <w:numFmt w:val="bullet"/>
+      <w:lvlText w:val=""/>
+      <w:lvlJc w:val="left"/>
+      <w:pPr>
+        <w:tabs>
+          <w:tab w:val="num" w:pos="2160"/>
+        </w:tabs>
+        <w:ind w:left="2160" w:hanging="360"/>
+      </w:pPr>
+      <w:rPr>
+        <w:rFonts w:ascii="Wingdings" w:hAnsi="Wingdings" w:hint="default"/>
+        <w:sz w:val="20"/>
+      </w:rPr>
+    </w:lvl>
+    <w:lvl w:ilvl="3" w:tentative="1">
+      <w:start w:val="1"/>
+      <w:numFmt w:val="bullet"/>
+      <w:lvlText w:val=""/>
+      <w:lvlJc w:val="left"/>
+      <w:pPr>
+        <w:tabs>
+          <w:tab w:val="num" w:pos="2880"/>
+        </w:tabs>
+        <w:ind w:left="2880" w:hanging="360"/>
+      </w:pPr>
+      <w:rPr>
+        <w:rFonts w:ascii="Wingdings" w:hAnsi="Wingdings" w:hint="default"/>
+        <w:sz w:val="20"/>
+      </w:rPr>
+    </w:lvl>
+    <w:lvl w:ilvl="4" w:tentative="1">
+      <w:start w:val="1"/>
+      <w:numFmt w:val="bullet"/>
+      <w:lvlText w:val=""/>
+      <w:lvlJc w:val="left"/>
+      <w:pPr>
+        <w:tabs>
+          <w:tab w:val="num" w:pos="3600"/>
+        </w:tabs>
+        <w:ind w:left="3600" w:hanging="360"/>
+      </w:pPr>
+      <w:rPr>
+        <w:rFonts w:ascii="Wingdings" w:hAnsi="Wingdings" w:hint="default"/>
+        <w:sz w:val="20"/>
+      </w:rPr>
+    </w:lvl>
+    <w:lvl w:ilvl="5" w:tentative="1">
+      <w:start w:val="1"/>
+      <w:numFmt w:val="bullet"/>
+      <w:lvlText w:val=""/>
+      <w:lvlJc w:val="left"/>
+      <w:pPr>
+        <w:tabs>
+          <w:tab w:val="num" w:pos="4320"/>
+        </w:tabs>
+        <w:ind w:left="4320" w:hanging="360"/>
+      </w:pPr>
+      <w:rPr>
+        <w:rFonts w:ascii="Wingdings" w:hAnsi="Wingdings" w:hint="default"/>
+        <w:sz w:val="20"/>
+      </w:rPr>
+    </w:lvl>
+    <w:lvl w:ilvl="6" w:tentative="1">
+      <w:start w:val="1"/>
+      <w:numFmt w:val="bullet"/>
+      <w:lvlText w:val=""/>
+      <w:lvlJc w:val="left"/>
+      <w:pPr>
+        <w:tabs>
+          <w:tab w:val="num" w:pos="5040"/>
+        </w:tabs>
+        <w:ind w:left="5040" w:hanging="360"/>
+      </w:pPr>
+      <w:rPr>
+        <w:rFonts w:ascii="Wingdings" w:hAnsi="Wingdings" w:hint="default"/>
+        <w:sz w:val="20"/>
+      </w:rPr>
+    </w:lvl>
+    <w:lvl w:ilvl="7" w:tentative="1">
+      <w:start w:val="1"/>
+      <w:numFmt w:val="bullet"/>
+      <w:lvlText w:val=""/>
+      <w:lvlJc w:val="left"/>
+      <w:pPr>
+        <w:tabs>
+          <w:tab w:val="num" w:pos="5760"/>
+        </w:tabs>
+        <w:ind w:left="5760" w:hanging="360"/>
+      </w:pPr>
+      <w:rPr>
+        <w:rFonts w:ascii="Wingdings" w:hAnsi="Wingdings" w:hint="default"/>
+        <w:sz w:val="20"/>
+      </w:rPr>
+    </w:lvl>
+    <w:lvl w:ilvl="8" w:tentative="1">
+      <w:start w:val="1"/>
+      <w:numFmt w:val="bullet"/>
+      <w:lvlText w:val=""/>
+      <w:lvlJc w:val="left"/>
+      <w:pPr>
+        <w:tabs>
+          <w:tab w:val="num" w:pos="6480"/>
+        </w:tabs>
+        <w:ind w:left="6480" w:hanging="360"/>
+      </w:pPr>
+      <w:rPr>
+        <w:rFonts w:ascii="Wingdings" w:hAnsi="Wingdings" w:hint="default"/>
+        <w:sz w:val="20"/>
+      </w:rPr>
+    </w:lvl>
+  </w:abstractNum>
+  <w:abstractNum w:abstractNumId="4" w15:restartNumberingAfterBreak="0">
+    <w:nsid w:val="1FB802D9"/>
+    <w:multiLevelType w:val="multilevel"/>
+    <w:tmpl w:val="CE320488"/>
+    <w:lvl w:ilvl="0">
+      <w:start w:val="1"/>
+      <w:numFmt w:val="bullet"/>
+      <w:lvlText w:val=""/>
+      <w:lvlJc w:val="left"/>
+      <w:pPr>
+        <w:tabs>
+          <w:tab w:val="num" w:pos="720"/>
+        </w:tabs>
+        <w:ind w:left="720" w:hanging="360"/>
+      </w:pPr>
+      <w:rPr>
+        <w:rFonts w:ascii="Symbol" w:hAnsi="Symbol" w:hint="default"/>
+        <w:sz w:val="20"/>
+      </w:rPr>
+    </w:lvl>
+    <w:lvl w:ilvl="1">
+      <w:start w:val="1"/>
+      <w:numFmt w:val="decimal"/>
+      <w:lvlText w:val="%2."/>
+      <w:lvlJc w:val="left"/>
+      <w:pPr>
+        <w:tabs>
+          <w:tab w:val="num" w:pos="1440"/>
+        </w:tabs>
+        <w:ind w:left="1440" w:hanging="360"/>
+      </w:pPr>
+    </w:lvl>
+    <w:lvl w:ilvl="2" w:tentative="1">
+      <w:start w:val="1"/>
+      <w:numFmt w:val="bullet"/>
+      <w:lvlText w:val=""/>
+      <w:lvlJc w:val="left"/>
+      <w:pPr>
+        <w:tabs>
+          <w:tab w:val="num" w:pos="2160"/>
+        </w:tabs>
+        <w:ind w:left="2160" w:hanging="360"/>
+      </w:pPr>
+      <w:rPr>
+        <w:rFonts w:ascii="Wingdings" w:hAnsi="Wingdings" w:hint="default"/>
+        <w:sz w:val="20"/>
+      </w:rPr>
+    </w:lvl>
+    <w:lvl w:ilvl="3" w:tentative="1">
+      <w:start w:val="1"/>
+      <w:numFmt w:val="bullet"/>
+      <w:lvlText w:val=""/>
+      <w:lvlJc w:val="left"/>
+      <w:pPr>
+        <w:tabs>
+          <w:tab w:val="num" w:pos="2880"/>
+        </w:tabs>
+        <w:ind w:left="2880" w:hanging="360"/>
+      </w:pPr>
+      <w:rPr>
+        <w:rFonts w:ascii="Wingdings" w:hAnsi="Wingdings" w:hint="default"/>
+        <w:sz w:val="20"/>
+      </w:rPr>
+    </w:lvl>
+    <w:lvl w:ilvl="4" w:tentative="1">
+      <w:start w:val="1"/>
+      <w:numFmt w:val="bullet"/>
+      <w:lvlText w:val=""/>
+      <w:lvlJc w:val="left"/>
+      <w:pPr>
+        <w:tabs>
+          <w:tab w:val="num" w:pos="3600"/>
+        </w:tabs>
+        <w:ind w:left="3600" w:hanging="360"/>
+      </w:pPr>
+      <w:rPr>
+        <w:rFonts w:ascii="Wingdings" w:hAnsi="Wingdings" w:hint="default"/>
+        <w:sz w:val="20"/>
+      </w:rPr>
+    </w:lvl>
+    <w:lvl w:ilvl="5" w:tentative="1">
+      <w:start w:val="1"/>
+      <w:numFmt w:val="bullet"/>
+      <w:lvlText w:val=""/>
+      <w:lvlJc w:val="left"/>
+      <w:pPr>
+        <w:tabs>
+          <w:tab w:val="num" w:pos="4320"/>
+        </w:tabs>
+        <w:ind w:left="4320" w:hanging="360"/>
+      </w:pPr>
+      <w:rPr>
+        <w:rFonts w:ascii="Wingdings" w:hAnsi="Wingdings" w:hint="default"/>
+        <w:sz w:val="20"/>
+      </w:rPr>
+    </w:lvl>
+    <w:lvl w:ilvl="6" w:tentative="1">
+      <w:start w:val="1"/>
+      <w:numFmt w:val="bullet"/>
+      <w:lvlText w:val=""/>
+      <w:lvlJc w:val="left"/>
+      <w:pPr>
+        <w:tabs>
+          <w:tab w:val="num" w:pos="5040"/>
+        </w:tabs>
+        <w:ind w:left="5040" w:hanging="360"/>
+      </w:pPr>
+      <w:rPr>
+        <w:rFonts w:ascii="Wingdings" w:hAnsi="Wingdings" w:hint="default"/>
+        <w:sz w:val="20"/>
+      </w:rPr>
+    </w:lvl>
+    <w:lvl w:ilvl="7" w:tentative="1">
+      <w:start w:val="1"/>
+      <w:numFmt w:val="bullet"/>
+      <w:lvlText w:val=""/>
+      <w:lvlJc w:val="left"/>
+      <w:pPr>
+        <w:tabs>
+          <w:tab w:val="num" w:pos="5760"/>
+        </w:tabs>
+        <w:ind w:left="5760" w:hanging="360"/>
+      </w:pPr>
+      <w:rPr>
+        <w:rFonts w:ascii="Wingdings" w:hAnsi="Wingdings" w:hint="default"/>
+        <w:sz w:val="20"/>
+      </w:rPr>
+    </w:lvl>
+    <w:lvl w:ilvl="8" w:tentative="1">
+      <w:start w:val="1"/>
+      <w:numFmt w:val="bullet"/>
+      <w:lvlText w:val=""/>
+      <w:lvlJc w:val="left"/>
+      <w:pPr>
+        <w:tabs>
+          <w:tab w:val="num" w:pos="6480"/>
+        </w:tabs>
+        <w:ind w:left="6480" w:hanging="360"/>
+      </w:pPr>
+      <w:rPr>
+        <w:rFonts w:ascii="Wingdings" w:hAnsi="Wingdings" w:hint="default"/>
+        <w:sz w:val="20"/>
+      </w:rPr>
+    </w:lvl>
+  </w:abstractNum>
+  <w:abstractNum w:abstractNumId="5" w15:restartNumberingAfterBreak="0">
     <w:nsid w:val="24B9155C"/>
     <w:multiLevelType w:val="multilevel"/>
     <w:tmpl w:val="625257AC"/>
@@ -1663,7 +4766,152 @@
       </w:rPr>
     </w:lvl>
   </w:abstractNum>
-  <w:abstractNum w:abstractNumId="2" w15:restartNumberingAfterBreak="0">
+  <w:abstractNum w:abstractNumId="6" w15:restartNumberingAfterBreak="0">
+    <w:nsid w:val="26425C9D"/>
+    <w:multiLevelType w:val="multilevel"/>
+    <w:tmpl w:val="83DADCBA"/>
+    <w:lvl w:ilvl="0">
+      <w:start w:val="1"/>
+      <w:numFmt w:val="bullet"/>
+      <w:lvlText w:val=""/>
+      <w:lvlJc w:val="left"/>
+      <w:pPr>
+        <w:tabs>
+          <w:tab w:val="num" w:pos="720"/>
+        </w:tabs>
+        <w:ind w:left="720" w:hanging="360"/>
+      </w:pPr>
+      <w:rPr>
+        <w:rFonts w:ascii="Symbol" w:hAnsi="Symbol" w:hint="default"/>
+        <w:sz w:val="20"/>
+      </w:rPr>
+    </w:lvl>
+    <w:lvl w:ilvl="1">
+      <w:start w:val="1"/>
+      <w:numFmt w:val="decimal"/>
+      <w:lvlText w:val="%2."/>
+      <w:lvlJc w:val="left"/>
+      <w:pPr>
+        <w:tabs>
+          <w:tab w:val="num" w:pos="1440"/>
+        </w:tabs>
+        <w:ind w:left="1440" w:hanging="360"/>
+      </w:pPr>
+    </w:lvl>
+    <w:lvl w:ilvl="2" w:tentative="1">
+      <w:start w:val="1"/>
+      <w:numFmt w:val="bullet"/>
+      <w:lvlText w:val=""/>
+      <w:lvlJc w:val="left"/>
+      <w:pPr>
+        <w:tabs>
+          <w:tab w:val="num" w:pos="2160"/>
+        </w:tabs>
+        <w:ind w:left="2160" w:hanging="360"/>
+      </w:pPr>
+      <w:rPr>
+        <w:rFonts w:ascii="Wingdings" w:hAnsi="Wingdings" w:hint="default"/>
+        <w:sz w:val="20"/>
+      </w:rPr>
+    </w:lvl>
+    <w:lvl w:ilvl="3" w:tentative="1">
+      <w:start w:val="1"/>
+      <w:numFmt w:val="bullet"/>
+      <w:lvlText w:val=""/>
+      <w:lvlJc w:val="left"/>
+      <w:pPr>
+        <w:tabs>
+          <w:tab w:val="num" w:pos="2880"/>
+        </w:tabs>
+        <w:ind w:left="2880" w:hanging="360"/>
+      </w:pPr>
+      <w:rPr>
+        <w:rFonts w:ascii="Wingdings" w:hAnsi="Wingdings" w:hint="default"/>
+        <w:sz w:val="20"/>
+      </w:rPr>
+    </w:lvl>
+    <w:lvl w:ilvl="4" w:tentative="1">
+      <w:start w:val="1"/>
+      <w:numFmt w:val="bullet"/>
+      <w:lvlText w:val=""/>
+      <w:lvlJc w:val="left"/>
+      <w:pPr>
+        <w:tabs>
+          <w:tab w:val="num" w:pos="3600"/>
+        </w:tabs>
+        <w:ind w:left="3600" w:hanging="360"/>
+      </w:pPr>
+      <w:rPr>
+        <w:rFonts w:ascii="Wingdings" w:hAnsi="Wingdings" w:hint="default"/>
+        <w:sz w:val="20"/>
+      </w:rPr>
+    </w:lvl>
+    <w:lvl w:ilvl="5" w:tentative="1">
+      <w:start w:val="1"/>
+      <w:numFmt w:val="bullet"/>
+      <w:lvlText w:val=""/>
+      <w:lvlJc w:val="left"/>
+      <w:pPr>
+        <w:tabs>
+          <w:tab w:val="num" w:pos="4320"/>
+        </w:tabs>
+        <w:ind w:left="4320" w:hanging="360"/>
+      </w:pPr>
+      <w:rPr>
+        <w:rFonts w:ascii="Wingdings" w:hAnsi="Wingdings" w:hint="default"/>
+        <w:sz w:val="20"/>
+      </w:rPr>
+    </w:lvl>
+    <w:lvl w:ilvl="6" w:tentative="1">
+      <w:start w:val="1"/>
+      <w:numFmt w:val="bullet"/>
+      <w:lvlText w:val=""/>
+      <w:lvlJc w:val="left"/>
+      <w:pPr>
+        <w:tabs>
+          <w:tab w:val="num" w:pos="5040"/>
+        </w:tabs>
+        <w:ind w:left="5040" w:hanging="360"/>
+      </w:pPr>
+      <w:rPr>
+        <w:rFonts w:ascii="Wingdings" w:hAnsi="Wingdings" w:hint="default"/>
+        <w:sz w:val="20"/>
+      </w:rPr>
+    </w:lvl>
+    <w:lvl w:ilvl="7" w:tentative="1">
+      <w:start w:val="1"/>
+      <w:numFmt w:val="bullet"/>
+      <w:lvlText w:val=""/>
+      <w:lvlJc w:val="left"/>
+      <w:pPr>
+        <w:tabs>
+          <w:tab w:val="num" w:pos="5760"/>
+        </w:tabs>
+        <w:ind w:left="5760" w:hanging="360"/>
+      </w:pPr>
+      <w:rPr>
+        <w:rFonts w:ascii="Wingdings" w:hAnsi="Wingdings" w:hint="default"/>
+        <w:sz w:val="20"/>
+      </w:rPr>
+    </w:lvl>
+    <w:lvl w:ilvl="8" w:tentative="1">
+      <w:start w:val="1"/>
+      <w:numFmt w:val="bullet"/>
+      <w:lvlText w:val=""/>
+      <w:lvlJc w:val="left"/>
+      <w:pPr>
+        <w:tabs>
+          <w:tab w:val="num" w:pos="6480"/>
+        </w:tabs>
+        <w:ind w:left="6480" w:hanging="360"/>
+      </w:pPr>
+      <w:rPr>
+        <w:rFonts w:ascii="Wingdings" w:hAnsi="Wingdings" w:hint="default"/>
+        <w:sz w:val="20"/>
+      </w:rPr>
+    </w:lvl>
+  </w:abstractNum>
+  <w:abstractNum w:abstractNumId="7" w15:restartNumberingAfterBreak="0">
     <w:nsid w:val="2A7035AC"/>
     <w:multiLevelType w:val="multilevel"/>
     <w:tmpl w:val="AB821B04"/>
@@ -1812,7 +5060,7 @@
       </w:rPr>
     </w:lvl>
   </w:abstractNum>
-  <w:abstractNum w:abstractNumId="3" w15:restartNumberingAfterBreak="0">
+  <w:abstractNum w:abstractNumId="8" w15:restartNumberingAfterBreak="0">
     <w:nsid w:val="2FE07389"/>
     <w:multiLevelType w:val="multilevel"/>
     <w:tmpl w:val="37A2D4D8"/>
@@ -1961,7 +5209,152 @@
       </w:rPr>
     </w:lvl>
   </w:abstractNum>
-  <w:abstractNum w:abstractNumId="4" w15:restartNumberingAfterBreak="0">
+  <w:abstractNum w:abstractNumId="9" w15:restartNumberingAfterBreak="0">
+    <w:nsid w:val="306F5E8B"/>
+    <w:multiLevelType w:val="multilevel"/>
+    <w:tmpl w:val="772C5982"/>
+    <w:lvl w:ilvl="0">
+      <w:start w:val="1"/>
+      <w:numFmt w:val="bullet"/>
+      <w:lvlText w:val=""/>
+      <w:lvlJc w:val="left"/>
+      <w:pPr>
+        <w:tabs>
+          <w:tab w:val="num" w:pos="720"/>
+        </w:tabs>
+        <w:ind w:left="720" w:hanging="360"/>
+      </w:pPr>
+      <w:rPr>
+        <w:rFonts w:ascii="Symbol" w:hAnsi="Symbol" w:hint="default"/>
+        <w:sz w:val="20"/>
+      </w:rPr>
+    </w:lvl>
+    <w:lvl w:ilvl="1">
+      <w:start w:val="1"/>
+      <w:numFmt w:val="decimal"/>
+      <w:lvlText w:val="%2."/>
+      <w:lvlJc w:val="left"/>
+      <w:pPr>
+        <w:tabs>
+          <w:tab w:val="num" w:pos="1440"/>
+        </w:tabs>
+        <w:ind w:left="1440" w:hanging="360"/>
+      </w:pPr>
+    </w:lvl>
+    <w:lvl w:ilvl="2" w:tentative="1">
+      <w:start w:val="1"/>
+      <w:numFmt w:val="bullet"/>
+      <w:lvlText w:val=""/>
+      <w:lvlJc w:val="left"/>
+      <w:pPr>
+        <w:tabs>
+          <w:tab w:val="num" w:pos="2160"/>
+        </w:tabs>
+        <w:ind w:left="2160" w:hanging="360"/>
+      </w:pPr>
+      <w:rPr>
+        <w:rFonts w:ascii="Wingdings" w:hAnsi="Wingdings" w:hint="default"/>
+        <w:sz w:val="20"/>
+      </w:rPr>
+    </w:lvl>
+    <w:lvl w:ilvl="3" w:tentative="1">
+      <w:start w:val="1"/>
+      <w:numFmt w:val="bullet"/>
+      <w:lvlText w:val=""/>
+      <w:lvlJc w:val="left"/>
+      <w:pPr>
+        <w:tabs>
+          <w:tab w:val="num" w:pos="2880"/>
+        </w:tabs>
+        <w:ind w:left="2880" w:hanging="360"/>
+      </w:pPr>
+      <w:rPr>
+        <w:rFonts w:ascii="Wingdings" w:hAnsi="Wingdings" w:hint="default"/>
+        <w:sz w:val="20"/>
+      </w:rPr>
+    </w:lvl>
+    <w:lvl w:ilvl="4" w:tentative="1">
+      <w:start w:val="1"/>
+      <w:numFmt w:val="bullet"/>
+      <w:lvlText w:val=""/>
+      <w:lvlJc w:val="left"/>
+      <w:pPr>
+        <w:tabs>
+          <w:tab w:val="num" w:pos="3600"/>
+        </w:tabs>
+        <w:ind w:left="3600" w:hanging="360"/>
+      </w:pPr>
+      <w:rPr>
+        <w:rFonts w:ascii="Wingdings" w:hAnsi="Wingdings" w:hint="default"/>
+        <w:sz w:val="20"/>
+      </w:rPr>
+    </w:lvl>
+    <w:lvl w:ilvl="5" w:tentative="1">
+      <w:start w:val="1"/>
+      <w:numFmt w:val="bullet"/>
+      <w:lvlText w:val=""/>
+      <w:lvlJc w:val="left"/>
+      <w:pPr>
+        <w:tabs>
+          <w:tab w:val="num" w:pos="4320"/>
+        </w:tabs>
+        <w:ind w:left="4320" w:hanging="360"/>
+      </w:pPr>
+      <w:rPr>
+        <w:rFonts w:ascii="Wingdings" w:hAnsi="Wingdings" w:hint="default"/>
+        <w:sz w:val="20"/>
+      </w:rPr>
+    </w:lvl>
+    <w:lvl w:ilvl="6" w:tentative="1">
+      <w:start w:val="1"/>
+      <w:numFmt w:val="bullet"/>
+      <w:lvlText w:val=""/>
+      <w:lvlJc w:val="left"/>
+      <w:pPr>
+        <w:tabs>
+          <w:tab w:val="num" w:pos="5040"/>
+        </w:tabs>
+        <w:ind w:left="5040" w:hanging="360"/>
+      </w:pPr>
+      <w:rPr>
+        <w:rFonts w:ascii="Wingdings" w:hAnsi="Wingdings" w:hint="default"/>
+        <w:sz w:val="20"/>
+      </w:rPr>
+    </w:lvl>
+    <w:lvl w:ilvl="7" w:tentative="1">
+      <w:start w:val="1"/>
+      <w:numFmt w:val="bullet"/>
+      <w:lvlText w:val=""/>
+      <w:lvlJc w:val="left"/>
+      <w:pPr>
+        <w:tabs>
+          <w:tab w:val="num" w:pos="5760"/>
+        </w:tabs>
+        <w:ind w:left="5760" w:hanging="360"/>
+      </w:pPr>
+      <w:rPr>
+        <w:rFonts w:ascii="Wingdings" w:hAnsi="Wingdings" w:hint="default"/>
+        <w:sz w:val="20"/>
+      </w:rPr>
+    </w:lvl>
+    <w:lvl w:ilvl="8" w:tentative="1">
+      <w:start w:val="1"/>
+      <w:numFmt w:val="bullet"/>
+      <w:lvlText w:val=""/>
+      <w:lvlJc w:val="left"/>
+      <w:pPr>
+        <w:tabs>
+          <w:tab w:val="num" w:pos="6480"/>
+        </w:tabs>
+        <w:ind w:left="6480" w:hanging="360"/>
+      </w:pPr>
+      <w:rPr>
+        <w:rFonts w:ascii="Wingdings" w:hAnsi="Wingdings" w:hint="default"/>
+        <w:sz w:val="20"/>
+      </w:rPr>
+    </w:lvl>
+  </w:abstractNum>
+  <w:abstractNum w:abstractNumId="10" w15:restartNumberingAfterBreak="0">
     <w:nsid w:val="39053FD9"/>
     <w:multiLevelType w:val="multilevel"/>
     <w:tmpl w:val="591C071C"/>
@@ -2110,7 +5503,7 @@
       </w:rPr>
     </w:lvl>
   </w:abstractNum>
-  <w:abstractNum w:abstractNumId="5" w15:restartNumberingAfterBreak="0">
+  <w:abstractNum w:abstractNumId="11" w15:restartNumberingAfterBreak="0">
     <w:nsid w:val="44E71089"/>
     <w:multiLevelType w:val="multilevel"/>
     <w:tmpl w:val="F4BC59B4"/>
@@ -2259,7 +5652,7 @@
       </w:rPr>
     </w:lvl>
   </w:abstractNum>
-  <w:abstractNum w:abstractNumId="6" w15:restartNumberingAfterBreak="0">
+  <w:abstractNum w:abstractNumId="12" w15:restartNumberingAfterBreak="0">
     <w:nsid w:val="4F652183"/>
     <w:multiLevelType w:val="multilevel"/>
     <w:tmpl w:val="BC827CFA"/>
@@ -2408,7 +5801,591 @@
       </w:rPr>
     </w:lvl>
   </w:abstractNum>
-  <w:abstractNum w:abstractNumId="7" w15:restartNumberingAfterBreak="0">
+  <w:abstractNum w:abstractNumId="13" w15:restartNumberingAfterBreak="0">
+    <w:nsid w:val="57DF4F51"/>
+    <w:multiLevelType w:val="multilevel"/>
+    <w:tmpl w:val="44E8CCF8"/>
+    <w:lvl w:ilvl="0">
+      <w:start w:val="1"/>
+      <w:numFmt w:val="bullet"/>
+      <w:lvlText w:val=""/>
+      <w:lvlJc w:val="left"/>
+      <w:pPr>
+        <w:tabs>
+          <w:tab w:val="num" w:pos="720"/>
+        </w:tabs>
+        <w:ind w:left="720" w:hanging="360"/>
+      </w:pPr>
+      <w:rPr>
+        <w:rFonts w:ascii="Symbol" w:hAnsi="Symbol" w:hint="default"/>
+        <w:sz w:val="20"/>
+      </w:rPr>
+    </w:lvl>
+    <w:lvl w:ilvl="1">
+      <w:start w:val="1"/>
+      <w:numFmt w:val="decimal"/>
+      <w:lvlText w:val="%2."/>
+      <w:lvlJc w:val="left"/>
+      <w:pPr>
+        <w:tabs>
+          <w:tab w:val="num" w:pos="1440"/>
+        </w:tabs>
+        <w:ind w:left="1440" w:hanging="360"/>
+      </w:pPr>
+    </w:lvl>
+    <w:lvl w:ilvl="2" w:tentative="1">
+      <w:start w:val="1"/>
+      <w:numFmt w:val="bullet"/>
+      <w:lvlText w:val=""/>
+      <w:lvlJc w:val="left"/>
+      <w:pPr>
+        <w:tabs>
+          <w:tab w:val="num" w:pos="2160"/>
+        </w:tabs>
+        <w:ind w:left="2160" w:hanging="360"/>
+      </w:pPr>
+      <w:rPr>
+        <w:rFonts w:ascii="Wingdings" w:hAnsi="Wingdings" w:hint="default"/>
+        <w:sz w:val="20"/>
+      </w:rPr>
+    </w:lvl>
+    <w:lvl w:ilvl="3" w:tentative="1">
+      <w:start w:val="1"/>
+      <w:numFmt w:val="bullet"/>
+      <w:lvlText w:val=""/>
+      <w:lvlJc w:val="left"/>
+      <w:pPr>
+        <w:tabs>
+          <w:tab w:val="num" w:pos="2880"/>
+        </w:tabs>
+        <w:ind w:left="2880" w:hanging="360"/>
+      </w:pPr>
+      <w:rPr>
+        <w:rFonts w:ascii="Wingdings" w:hAnsi="Wingdings" w:hint="default"/>
+        <w:sz w:val="20"/>
+      </w:rPr>
+    </w:lvl>
+    <w:lvl w:ilvl="4" w:tentative="1">
+      <w:start w:val="1"/>
+      <w:numFmt w:val="bullet"/>
+      <w:lvlText w:val=""/>
+      <w:lvlJc w:val="left"/>
+      <w:pPr>
+        <w:tabs>
+          <w:tab w:val="num" w:pos="3600"/>
+        </w:tabs>
+        <w:ind w:left="3600" w:hanging="360"/>
+      </w:pPr>
+      <w:rPr>
+        <w:rFonts w:ascii="Wingdings" w:hAnsi="Wingdings" w:hint="default"/>
+        <w:sz w:val="20"/>
+      </w:rPr>
+    </w:lvl>
+    <w:lvl w:ilvl="5" w:tentative="1">
+      <w:start w:val="1"/>
+      <w:numFmt w:val="bullet"/>
+      <w:lvlText w:val=""/>
+      <w:lvlJc w:val="left"/>
+      <w:pPr>
+        <w:tabs>
+          <w:tab w:val="num" w:pos="4320"/>
+        </w:tabs>
+        <w:ind w:left="4320" w:hanging="360"/>
+      </w:pPr>
+      <w:rPr>
+        <w:rFonts w:ascii="Wingdings" w:hAnsi="Wingdings" w:hint="default"/>
+        <w:sz w:val="20"/>
+      </w:rPr>
+    </w:lvl>
+    <w:lvl w:ilvl="6" w:tentative="1">
+      <w:start w:val="1"/>
+      <w:numFmt w:val="bullet"/>
+      <w:lvlText w:val=""/>
+      <w:lvlJc w:val="left"/>
+      <w:pPr>
+        <w:tabs>
+          <w:tab w:val="num" w:pos="5040"/>
+        </w:tabs>
+        <w:ind w:left="5040" w:hanging="360"/>
+      </w:pPr>
+      <w:rPr>
+        <w:rFonts w:ascii="Wingdings" w:hAnsi="Wingdings" w:hint="default"/>
+        <w:sz w:val="20"/>
+      </w:rPr>
+    </w:lvl>
+    <w:lvl w:ilvl="7" w:tentative="1">
+      <w:start w:val="1"/>
+      <w:numFmt w:val="bullet"/>
+      <w:lvlText w:val=""/>
+      <w:lvlJc w:val="left"/>
+      <w:pPr>
+        <w:tabs>
+          <w:tab w:val="num" w:pos="5760"/>
+        </w:tabs>
+        <w:ind w:left="5760" w:hanging="360"/>
+      </w:pPr>
+      <w:rPr>
+        <w:rFonts w:ascii="Wingdings" w:hAnsi="Wingdings" w:hint="default"/>
+        <w:sz w:val="20"/>
+      </w:rPr>
+    </w:lvl>
+    <w:lvl w:ilvl="8" w:tentative="1">
+      <w:start w:val="1"/>
+      <w:numFmt w:val="bullet"/>
+      <w:lvlText w:val=""/>
+      <w:lvlJc w:val="left"/>
+      <w:pPr>
+        <w:tabs>
+          <w:tab w:val="num" w:pos="6480"/>
+        </w:tabs>
+        <w:ind w:left="6480" w:hanging="360"/>
+      </w:pPr>
+      <w:rPr>
+        <w:rFonts w:ascii="Wingdings" w:hAnsi="Wingdings" w:hint="default"/>
+        <w:sz w:val="20"/>
+      </w:rPr>
+    </w:lvl>
+  </w:abstractNum>
+  <w:abstractNum w:abstractNumId="14" w15:restartNumberingAfterBreak="0">
+    <w:nsid w:val="59387BDC"/>
+    <w:multiLevelType w:val="multilevel"/>
+    <w:tmpl w:val="FD647D40"/>
+    <w:lvl w:ilvl="0">
+      <w:start w:val="1"/>
+      <w:numFmt w:val="bullet"/>
+      <w:lvlText w:val=""/>
+      <w:lvlJc w:val="left"/>
+      <w:pPr>
+        <w:tabs>
+          <w:tab w:val="num" w:pos="720"/>
+        </w:tabs>
+        <w:ind w:left="720" w:hanging="360"/>
+      </w:pPr>
+      <w:rPr>
+        <w:rFonts w:ascii="Symbol" w:hAnsi="Symbol" w:hint="default"/>
+        <w:sz w:val="20"/>
+      </w:rPr>
+    </w:lvl>
+    <w:lvl w:ilvl="1" w:tentative="1">
+      <w:start w:val="1"/>
+      <w:numFmt w:val="bullet"/>
+      <w:lvlText w:val="o"/>
+      <w:lvlJc w:val="left"/>
+      <w:pPr>
+        <w:tabs>
+          <w:tab w:val="num" w:pos="1440"/>
+        </w:tabs>
+        <w:ind w:left="1440" w:hanging="360"/>
+      </w:pPr>
+      <w:rPr>
+        <w:rFonts w:ascii="Courier New" w:hAnsi="Courier New" w:hint="default"/>
+        <w:sz w:val="20"/>
+      </w:rPr>
+    </w:lvl>
+    <w:lvl w:ilvl="2" w:tentative="1">
+      <w:start w:val="1"/>
+      <w:numFmt w:val="bullet"/>
+      <w:lvlText w:val=""/>
+      <w:lvlJc w:val="left"/>
+      <w:pPr>
+        <w:tabs>
+          <w:tab w:val="num" w:pos="2160"/>
+        </w:tabs>
+        <w:ind w:left="2160" w:hanging="360"/>
+      </w:pPr>
+      <w:rPr>
+        <w:rFonts w:ascii="Wingdings" w:hAnsi="Wingdings" w:hint="default"/>
+        <w:sz w:val="20"/>
+      </w:rPr>
+    </w:lvl>
+    <w:lvl w:ilvl="3" w:tentative="1">
+      <w:start w:val="1"/>
+      <w:numFmt w:val="bullet"/>
+      <w:lvlText w:val=""/>
+      <w:lvlJc w:val="left"/>
+      <w:pPr>
+        <w:tabs>
+          <w:tab w:val="num" w:pos="2880"/>
+        </w:tabs>
+        <w:ind w:left="2880" w:hanging="360"/>
+      </w:pPr>
+      <w:rPr>
+        <w:rFonts w:ascii="Wingdings" w:hAnsi="Wingdings" w:hint="default"/>
+        <w:sz w:val="20"/>
+      </w:rPr>
+    </w:lvl>
+    <w:lvl w:ilvl="4" w:tentative="1">
+      <w:start w:val="1"/>
+      <w:numFmt w:val="bullet"/>
+      <w:lvlText w:val=""/>
+      <w:lvlJc w:val="left"/>
+      <w:pPr>
+        <w:tabs>
+          <w:tab w:val="num" w:pos="3600"/>
+        </w:tabs>
+        <w:ind w:left="3600" w:hanging="360"/>
+      </w:pPr>
+      <w:rPr>
+        <w:rFonts w:ascii="Wingdings" w:hAnsi="Wingdings" w:hint="default"/>
+        <w:sz w:val="20"/>
+      </w:rPr>
+    </w:lvl>
+    <w:lvl w:ilvl="5" w:tentative="1">
+      <w:start w:val="1"/>
+      <w:numFmt w:val="bullet"/>
+      <w:lvlText w:val=""/>
+      <w:lvlJc w:val="left"/>
+      <w:pPr>
+        <w:tabs>
+          <w:tab w:val="num" w:pos="4320"/>
+        </w:tabs>
+        <w:ind w:left="4320" w:hanging="360"/>
+      </w:pPr>
+      <w:rPr>
+        <w:rFonts w:ascii="Wingdings" w:hAnsi="Wingdings" w:hint="default"/>
+        <w:sz w:val="20"/>
+      </w:rPr>
+    </w:lvl>
+    <w:lvl w:ilvl="6" w:tentative="1">
+      <w:start w:val="1"/>
+      <w:numFmt w:val="bullet"/>
+      <w:lvlText w:val=""/>
+      <w:lvlJc w:val="left"/>
+      <w:pPr>
+        <w:tabs>
+          <w:tab w:val="num" w:pos="5040"/>
+        </w:tabs>
+        <w:ind w:left="5040" w:hanging="360"/>
+      </w:pPr>
+      <w:rPr>
+        <w:rFonts w:ascii="Wingdings" w:hAnsi="Wingdings" w:hint="default"/>
+        <w:sz w:val="20"/>
+      </w:rPr>
+    </w:lvl>
+    <w:lvl w:ilvl="7" w:tentative="1">
+      <w:start w:val="1"/>
+      <w:numFmt w:val="bullet"/>
+      <w:lvlText w:val=""/>
+      <w:lvlJc w:val="left"/>
+      <w:pPr>
+        <w:tabs>
+          <w:tab w:val="num" w:pos="5760"/>
+        </w:tabs>
+        <w:ind w:left="5760" w:hanging="360"/>
+      </w:pPr>
+      <w:rPr>
+        <w:rFonts w:ascii="Wingdings" w:hAnsi="Wingdings" w:hint="default"/>
+        <w:sz w:val="20"/>
+      </w:rPr>
+    </w:lvl>
+    <w:lvl w:ilvl="8" w:tentative="1">
+      <w:start w:val="1"/>
+      <w:numFmt w:val="bullet"/>
+      <w:lvlText w:val=""/>
+      <w:lvlJc w:val="left"/>
+      <w:pPr>
+        <w:tabs>
+          <w:tab w:val="num" w:pos="6480"/>
+        </w:tabs>
+        <w:ind w:left="6480" w:hanging="360"/>
+      </w:pPr>
+      <w:rPr>
+        <w:rFonts w:ascii="Wingdings" w:hAnsi="Wingdings" w:hint="default"/>
+        <w:sz w:val="20"/>
+      </w:rPr>
+    </w:lvl>
+  </w:abstractNum>
+  <w:abstractNum w:abstractNumId="15" w15:restartNumberingAfterBreak="0">
+    <w:nsid w:val="596827DA"/>
+    <w:multiLevelType w:val="multilevel"/>
+    <w:tmpl w:val="22626E4C"/>
+    <w:lvl w:ilvl="0">
+      <w:start w:val="1"/>
+      <w:numFmt w:val="bullet"/>
+      <w:lvlText w:val=""/>
+      <w:lvlJc w:val="left"/>
+      <w:pPr>
+        <w:tabs>
+          <w:tab w:val="num" w:pos="720"/>
+        </w:tabs>
+        <w:ind w:left="720" w:hanging="360"/>
+      </w:pPr>
+      <w:rPr>
+        <w:rFonts w:ascii="Symbol" w:hAnsi="Symbol" w:hint="default"/>
+        <w:sz w:val="20"/>
+      </w:rPr>
+    </w:lvl>
+    <w:lvl w:ilvl="1">
+      <w:start w:val="1"/>
+      <w:numFmt w:val="decimal"/>
+      <w:lvlText w:val="%2."/>
+      <w:lvlJc w:val="left"/>
+      <w:pPr>
+        <w:tabs>
+          <w:tab w:val="num" w:pos="1440"/>
+        </w:tabs>
+        <w:ind w:left="1440" w:hanging="360"/>
+      </w:pPr>
+    </w:lvl>
+    <w:lvl w:ilvl="2" w:tentative="1">
+      <w:start w:val="1"/>
+      <w:numFmt w:val="bullet"/>
+      <w:lvlText w:val=""/>
+      <w:lvlJc w:val="left"/>
+      <w:pPr>
+        <w:tabs>
+          <w:tab w:val="num" w:pos="2160"/>
+        </w:tabs>
+        <w:ind w:left="2160" w:hanging="360"/>
+      </w:pPr>
+      <w:rPr>
+        <w:rFonts w:ascii="Wingdings" w:hAnsi="Wingdings" w:hint="default"/>
+        <w:sz w:val="20"/>
+      </w:rPr>
+    </w:lvl>
+    <w:lvl w:ilvl="3" w:tentative="1">
+      <w:start w:val="1"/>
+      <w:numFmt w:val="bullet"/>
+      <w:lvlText w:val=""/>
+      <w:lvlJc w:val="left"/>
+      <w:pPr>
+        <w:tabs>
+          <w:tab w:val="num" w:pos="2880"/>
+        </w:tabs>
+        <w:ind w:left="2880" w:hanging="360"/>
+      </w:pPr>
+      <w:rPr>
+        <w:rFonts w:ascii="Wingdings" w:hAnsi="Wingdings" w:hint="default"/>
+        <w:sz w:val="20"/>
+      </w:rPr>
+    </w:lvl>
+    <w:lvl w:ilvl="4" w:tentative="1">
+      <w:start w:val="1"/>
+      <w:numFmt w:val="bullet"/>
+      <w:lvlText w:val=""/>
+      <w:lvlJc w:val="left"/>
+      <w:pPr>
+        <w:tabs>
+          <w:tab w:val="num" w:pos="3600"/>
+        </w:tabs>
+        <w:ind w:left="3600" w:hanging="360"/>
+      </w:pPr>
+      <w:rPr>
+        <w:rFonts w:ascii="Wingdings" w:hAnsi="Wingdings" w:hint="default"/>
+        <w:sz w:val="20"/>
+      </w:rPr>
+    </w:lvl>
+    <w:lvl w:ilvl="5" w:tentative="1">
+      <w:start w:val="1"/>
+      <w:numFmt w:val="bullet"/>
+      <w:lvlText w:val=""/>
+      <w:lvlJc w:val="left"/>
+      <w:pPr>
+        <w:tabs>
+          <w:tab w:val="num" w:pos="4320"/>
+        </w:tabs>
+        <w:ind w:left="4320" w:hanging="360"/>
+      </w:pPr>
+      <w:rPr>
+        <w:rFonts w:ascii="Wingdings" w:hAnsi="Wingdings" w:hint="default"/>
+        <w:sz w:val="20"/>
+      </w:rPr>
+    </w:lvl>
+    <w:lvl w:ilvl="6" w:tentative="1">
+      <w:start w:val="1"/>
+      <w:numFmt w:val="bullet"/>
+      <w:lvlText w:val=""/>
+      <w:lvlJc w:val="left"/>
+      <w:pPr>
+        <w:tabs>
+          <w:tab w:val="num" w:pos="5040"/>
+        </w:tabs>
+        <w:ind w:left="5040" w:hanging="360"/>
+      </w:pPr>
+      <w:rPr>
+        <w:rFonts w:ascii="Wingdings" w:hAnsi="Wingdings" w:hint="default"/>
+        <w:sz w:val="20"/>
+      </w:rPr>
+    </w:lvl>
+    <w:lvl w:ilvl="7" w:tentative="1">
+      <w:start w:val="1"/>
+      <w:numFmt w:val="bullet"/>
+      <w:lvlText w:val=""/>
+      <w:lvlJc w:val="left"/>
+      <w:pPr>
+        <w:tabs>
+          <w:tab w:val="num" w:pos="5760"/>
+        </w:tabs>
+        <w:ind w:left="5760" w:hanging="360"/>
+      </w:pPr>
+      <w:rPr>
+        <w:rFonts w:ascii="Wingdings" w:hAnsi="Wingdings" w:hint="default"/>
+        <w:sz w:val="20"/>
+      </w:rPr>
+    </w:lvl>
+    <w:lvl w:ilvl="8" w:tentative="1">
+      <w:start w:val="1"/>
+      <w:numFmt w:val="bullet"/>
+      <w:lvlText w:val=""/>
+      <w:lvlJc w:val="left"/>
+      <w:pPr>
+        <w:tabs>
+          <w:tab w:val="num" w:pos="6480"/>
+        </w:tabs>
+        <w:ind w:left="6480" w:hanging="360"/>
+      </w:pPr>
+      <w:rPr>
+        <w:rFonts w:ascii="Wingdings" w:hAnsi="Wingdings" w:hint="default"/>
+        <w:sz w:val="20"/>
+      </w:rPr>
+    </w:lvl>
+  </w:abstractNum>
+  <w:abstractNum w:abstractNumId="16" w15:restartNumberingAfterBreak="0">
+    <w:nsid w:val="5A3155E4"/>
+    <w:multiLevelType w:val="multilevel"/>
+    <w:tmpl w:val="A7EA3098"/>
+    <w:lvl w:ilvl="0">
+      <w:start w:val="1"/>
+      <w:numFmt w:val="bullet"/>
+      <w:lvlText w:val=""/>
+      <w:lvlJc w:val="left"/>
+      <w:pPr>
+        <w:tabs>
+          <w:tab w:val="num" w:pos="720"/>
+        </w:tabs>
+        <w:ind w:left="720" w:hanging="360"/>
+      </w:pPr>
+      <w:rPr>
+        <w:rFonts w:ascii="Symbol" w:hAnsi="Symbol" w:hint="default"/>
+        <w:sz w:val="20"/>
+      </w:rPr>
+    </w:lvl>
+    <w:lvl w:ilvl="1">
+      <w:start w:val="1"/>
+      <w:numFmt w:val="decimal"/>
+      <w:lvlText w:val="%2."/>
+      <w:lvlJc w:val="left"/>
+      <w:pPr>
+        <w:tabs>
+          <w:tab w:val="num" w:pos="1440"/>
+        </w:tabs>
+        <w:ind w:left="1440" w:hanging="360"/>
+      </w:pPr>
+    </w:lvl>
+    <w:lvl w:ilvl="2" w:tentative="1">
+      <w:start w:val="1"/>
+      <w:numFmt w:val="bullet"/>
+      <w:lvlText w:val=""/>
+      <w:lvlJc w:val="left"/>
+      <w:pPr>
+        <w:tabs>
+          <w:tab w:val="num" w:pos="2160"/>
+        </w:tabs>
+        <w:ind w:left="2160" w:hanging="360"/>
+      </w:pPr>
+      <w:rPr>
+        <w:rFonts w:ascii="Wingdings" w:hAnsi="Wingdings" w:hint="default"/>
+        <w:sz w:val="20"/>
+      </w:rPr>
+    </w:lvl>
+    <w:lvl w:ilvl="3" w:tentative="1">
+      <w:start w:val="1"/>
+      <w:numFmt w:val="bullet"/>
+      <w:lvlText w:val=""/>
+      <w:lvlJc w:val="left"/>
+      <w:pPr>
+        <w:tabs>
+          <w:tab w:val="num" w:pos="2880"/>
+        </w:tabs>
+        <w:ind w:left="2880" w:hanging="360"/>
+      </w:pPr>
+      <w:rPr>
+        <w:rFonts w:ascii="Wingdings" w:hAnsi="Wingdings" w:hint="default"/>
+        <w:sz w:val="20"/>
+      </w:rPr>
+    </w:lvl>
+    <w:lvl w:ilvl="4" w:tentative="1">
+      <w:start w:val="1"/>
+      <w:numFmt w:val="bullet"/>
+      <w:lvlText w:val=""/>
+      <w:lvlJc w:val="left"/>
+      <w:pPr>
+        <w:tabs>
+          <w:tab w:val="num" w:pos="3600"/>
+        </w:tabs>
+        <w:ind w:left="3600" w:hanging="360"/>
+      </w:pPr>
+      <w:rPr>
+        <w:rFonts w:ascii="Wingdings" w:hAnsi="Wingdings" w:hint="default"/>
+        <w:sz w:val="20"/>
+      </w:rPr>
+    </w:lvl>
+    <w:lvl w:ilvl="5" w:tentative="1">
+      <w:start w:val="1"/>
+      <w:numFmt w:val="bullet"/>
+      <w:lvlText w:val=""/>
+      <w:lvlJc w:val="left"/>
+      <w:pPr>
+        <w:tabs>
+          <w:tab w:val="num" w:pos="4320"/>
+        </w:tabs>
+        <w:ind w:left="4320" w:hanging="360"/>
+      </w:pPr>
+      <w:rPr>
+        <w:rFonts w:ascii="Wingdings" w:hAnsi="Wingdings" w:hint="default"/>
+        <w:sz w:val="20"/>
+      </w:rPr>
+    </w:lvl>
+    <w:lvl w:ilvl="6" w:tentative="1">
+      <w:start w:val="1"/>
+      <w:numFmt w:val="bullet"/>
+      <w:lvlText w:val=""/>
+      <w:lvlJc w:val="left"/>
+      <w:pPr>
+        <w:tabs>
+          <w:tab w:val="num" w:pos="5040"/>
+        </w:tabs>
+        <w:ind w:left="5040" w:hanging="360"/>
+      </w:pPr>
+      <w:rPr>
+        <w:rFonts w:ascii="Wingdings" w:hAnsi="Wingdings" w:hint="default"/>
+        <w:sz w:val="20"/>
+      </w:rPr>
+    </w:lvl>
+    <w:lvl w:ilvl="7" w:tentative="1">
+      <w:start w:val="1"/>
+      <w:numFmt w:val="bullet"/>
+      <w:lvlText w:val=""/>
+      <w:lvlJc w:val="left"/>
+      <w:pPr>
+        <w:tabs>
+          <w:tab w:val="num" w:pos="5760"/>
+        </w:tabs>
+        <w:ind w:left="5760" w:hanging="360"/>
+      </w:pPr>
+      <w:rPr>
+        <w:rFonts w:ascii="Wingdings" w:hAnsi="Wingdings" w:hint="default"/>
+        <w:sz w:val="20"/>
+      </w:rPr>
+    </w:lvl>
+    <w:lvl w:ilvl="8" w:tentative="1">
+      <w:start w:val="1"/>
+      <w:numFmt w:val="bullet"/>
+      <w:lvlText w:val=""/>
+      <w:lvlJc w:val="left"/>
+      <w:pPr>
+        <w:tabs>
+          <w:tab w:val="num" w:pos="6480"/>
+        </w:tabs>
+        <w:ind w:left="6480" w:hanging="360"/>
+      </w:pPr>
+      <w:rPr>
+        <w:rFonts w:ascii="Wingdings" w:hAnsi="Wingdings" w:hint="default"/>
+        <w:sz w:val="20"/>
+      </w:rPr>
+    </w:lvl>
+  </w:abstractNum>
+  <w:abstractNum w:abstractNumId="17" w15:restartNumberingAfterBreak="0">
     <w:nsid w:val="5AEF4332"/>
     <w:multiLevelType w:val="multilevel"/>
     <w:tmpl w:val="319690FE"/>
@@ -2557,7 +6534,7 @@
       </w:rPr>
     </w:lvl>
   </w:abstractNum>
-  <w:abstractNum w:abstractNumId="8" w15:restartNumberingAfterBreak="0">
+  <w:abstractNum w:abstractNumId="18" w15:restartNumberingAfterBreak="0">
     <w:nsid w:val="5D03164B"/>
     <w:multiLevelType w:val="multilevel"/>
     <w:tmpl w:val="FA8C8E6C"/>
@@ -2706,7 +6683,7 @@
       </w:rPr>
     </w:lvl>
   </w:abstractNum>
-  <w:abstractNum w:abstractNumId="9" w15:restartNumberingAfterBreak="0">
+  <w:abstractNum w:abstractNumId="19" w15:restartNumberingAfterBreak="0">
     <w:nsid w:val="6B4B59D2"/>
     <w:multiLevelType w:val="multilevel"/>
     <w:tmpl w:val="0BB0C054"/>
@@ -2855,34 +6832,212 @@
       </w:rPr>
     </w:lvl>
   </w:abstractNum>
+  <w:abstractNum w:abstractNumId="20" w15:restartNumberingAfterBreak="0">
+    <w:nsid w:val="72C961FD"/>
+    <w:multiLevelType w:val="multilevel"/>
+    <w:tmpl w:val="EF00655A"/>
+    <w:lvl w:ilvl="0">
+      <w:start w:val="1"/>
+      <w:numFmt w:val="bullet"/>
+      <w:lvlText w:val=""/>
+      <w:lvlJc w:val="left"/>
+      <w:pPr>
+        <w:tabs>
+          <w:tab w:val="num" w:pos="720"/>
+        </w:tabs>
+        <w:ind w:left="720" w:hanging="360"/>
+      </w:pPr>
+      <w:rPr>
+        <w:rFonts w:ascii="Symbol" w:hAnsi="Symbol" w:hint="default"/>
+        <w:sz w:val="20"/>
+      </w:rPr>
+    </w:lvl>
+    <w:lvl w:ilvl="1">
+      <w:start w:val="1"/>
+      <w:numFmt w:val="decimal"/>
+      <w:lvlText w:val="%2."/>
+      <w:lvlJc w:val="left"/>
+      <w:pPr>
+        <w:tabs>
+          <w:tab w:val="num" w:pos="1440"/>
+        </w:tabs>
+        <w:ind w:left="1440" w:hanging="360"/>
+      </w:pPr>
+    </w:lvl>
+    <w:lvl w:ilvl="2" w:tentative="1">
+      <w:start w:val="1"/>
+      <w:numFmt w:val="bullet"/>
+      <w:lvlText w:val=""/>
+      <w:lvlJc w:val="left"/>
+      <w:pPr>
+        <w:tabs>
+          <w:tab w:val="num" w:pos="2160"/>
+        </w:tabs>
+        <w:ind w:left="2160" w:hanging="360"/>
+      </w:pPr>
+      <w:rPr>
+        <w:rFonts w:ascii="Wingdings" w:hAnsi="Wingdings" w:hint="default"/>
+        <w:sz w:val="20"/>
+      </w:rPr>
+    </w:lvl>
+    <w:lvl w:ilvl="3" w:tentative="1">
+      <w:start w:val="1"/>
+      <w:numFmt w:val="bullet"/>
+      <w:lvlText w:val=""/>
+      <w:lvlJc w:val="left"/>
+      <w:pPr>
+        <w:tabs>
+          <w:tab w:val="num" w:pos="2880"/>
+        </w:tabs>
+        <w:ind w:left="2880" w:hanging="360"/>
+      </w:pPr>
+      <w:rPr>
+        <w:rFonts w:ascii="Wingdings" w:hAnsi="Wingdings" w:hint="default"/>
+        <w:sz w:val="20"/>
+      </w:rPr>
+    </w:lvl>
+    <w:lvl w:ilvl="4" w:tentative="1">
+      <w:start w:val="1"/>
+      <w:numFmt w:val="bullet"/>
+      <w:lvlText w:val=""/>
+      <w:lvlJc w:val="left"/>
+      <w:pPr>
+        <w:tabs>
+          <w:tab w:val="num" w:pos="3600"/>
+        </w:tabs>
+        <w:ind w:left="3600" w:hanging="360"/>
+      </w:pPr>
+      <w:rPr>
+        <w:rFonts w:ascii="Wingdings" w:hAnsi="Wingdings" w:hint="default"/>
+        <w:sz w:val="20"/>
+      </w:rPr>
+    </w:lvl>
+    <w:lvl w:ilvl="5" w:tentative="1">
+      <w:start w:val="1"/>
+      <w:numFmt w:val="bullet"/>
+      <w:lvlText w:val=""/>
+      <w:lvlJc w:val="left"/>
+      <w:pPr>
+        <w:tabs>
+          <w:tab w:val="num" w:pos="4320"/>
+        </w:tabs>
+        <w:ind w:left="4320" w:hanging="360"/>
+      </w:pPr>
+      <w:rPr>
+        <w:rFonts w:ascii="Wingdings" w:hAnsi="Wingdings" w:hint="default"/>
+        <w:sz w:val="20"/>
+      </w:rPr>
+    </w:lvl>
+    <w:lvl w:ilvl="6" w:tentative="1">
+      <w:start w:val="1"/>
+      <w:numFmt w:val="bullet"/>
+      <w:lvlText w:val=""/>
+      <w:lvlJc w:val="left"/>
+      <w:pPr>
+        <w:tabs>
+          <w:tab w:val="num" w:pos="5040"/>
+        </w:tabs>
+        <w:ind w:left="5040" w:hanging="360"/>
+      </w:pPr>
+      <w:rPr>
+        <w:rFonts w:ascii="Wingdings" w:hAnsi="Wingdings" w:hint="default"/>
+        <w:sz w:val="20"/>
+      </w:rPr>
+    </w:lvl>
+    <w:lvl w:ilvl="7" w:tentative="1">
+      <w:start w:val="1"/>
+      <w:numFmt w:val="bullet"/>
+      <w:lvlText w:val=""/>
+      <w:lvlJc w:val="left"/>
+      <w:pPr>
+        <w:tabs>
+          <w:tab w:val="num" w:pos="5760"/>
+        </w:tabs>
+        <w:ind w:left="5760" w:hanging="360"/>
+      </w:pPr>
+      <w:rPr>
+        <w:rFonts w:ascii="Wingdings" w:hAnsi="Wingdings" w:hint="default"/>
+        <w:sz w:val="20"/>
+      </w:rPr>
+    </w:lvl>
+    <w:lvl w:ilvl="8" w:tentative="1">
+      <w:start w:val="1"/>
+      <w:numFmt w:val="bullet"/>
+      <w:lvlText w:val=""/>
+      <w:lvlJc w:val="left"/>
+      <w:pPr>
+        <w:tabs>
+          <w:tab w:val="num" w:pos="6480"/>
+        </w:tabs>
+        <w:ind w:left="6480" w:hanging="360"/>
+      </w:pPr>
+      <w:rPr>
+        <w:rFonts w:ascii="Wingdings" w:hAnsi="Wingdings" w:hint="default"/>
+        <w:sz w:val="20"/>
+      </w:rPr>
+    </w:lvl>
+  </w:abstractNum>
   <w:num w:numId="1" w16cid:durableId="1588222300">
+    <w:abstractNumId w:val="11"/>
+  </w:num>
+  <w:num w:numId="2" w16cid:durableId="2089687452">
+    <w:abstractNumId w:val="17"/>
+  </w:num>
+  <w:num w:numId="3" w16cid:durableId="397703464">
+    <w:abstractNumId w:val="10"/>
+  </w:num>
+  <w:num w:numId="4" w16cid:durableId="280382709">
+    <w:abstractNumId w:val="12"/>
+  </w:num>
+  <w:num w:numId="5" w16cid:durableId="1527674285">
+    <w:abstractNumId w:val="7"/>
+  </w:num>
+  <w:num w:numId="6" w16cid:durableId="123810299">
+    <w:abstractNumId w:val="19"/>
+  </w:num>
+  <w:num w:numId="7" w16cid:durableId="2090272123">
+    <w:abstractNumId w:val="8"/>
+  </w:num>
+  <w:num w:numId="8" w16cid:durableId="439878419">
+    <w:abstractNumId w:val="18"/>
+  </w:num>
+  <w:num w:numId="9" w16cid:durableId="1099985614">
+    <w:abstractNumId w:val="2"/>
+  </w:num>
+  <w:num w:numId="10" w16cid:durableId="1796945683">
     <w:abstractNumId w:val="5"/>
   </w:num>
-  <w:num w:numId="2" w16cid:durableId="2089687452">
-    <w:abstractNumId w:val="7"/>
+  <w:num w:numId="11" w16cid:durableId="94329195">
+    <w:abstractNumId w:val="0"/>
   </w:num>
-  <w:num w:numId="3" w16cid:durableId="397703464">
+  <w:num w:numId="12" w16cid:durableId="543949881">
     <w:abstractNumId w:val="4"/>
   </w:num>
-  <w:num w:numId="4" w16cid:durableId="280382709">
+  <w:num w:numId="13" w16cid:durableId="686368319">
     <w:abstractNumId w:val="6"/>
   </w:num>
-  <w:num w:numId="5" w16cid:durableId="1527674285">
-    <w:abstractNumId w:val="2"/>
+  <w:num w:numId="14" w16cid:durableId="1670987982">
+    <w:abstractNumId w:val="20"/>
   </w:num>
-  <w:num w:numId="6" w16cid:durableId="123810299">
+  <w:num w:numId="15" w16cid:durableId="1381202660">
+    <w:abstractNumId w:val="16"/>
+  </w:num>
+  <w:num w:numId="16" w16cid:durableId="2020303109">
+    <w:abstractNumId w:val="13"/>
+  </w:num>
+  <w:num w:numId="17" w16cid:durableId="1607694605">
+    <w:abstractNumId w:val="15"/>
+  </w:num>
+  <w:num w:numId="18" w16cid:durableId="655645792">
     <w:abstractNumId w:val="9"/>
   </w:num>
-  <w:num w:numId="7" w16cid:durableId="2090272123">
+  <w:num w:numId="19" w16cid:durableId="1130517311">
     <w:abstractNumId w:val="3"/>
   </w:num>
-  <w:num w:numId="8" w16cid:durableId="439878419">
-    <w:abstractNumId w:val="8"/>
+  <w:num w:numId="20" w16cid:durableId="1141506554">
+    <w:abstractNumId w:val="14"/>
   </w:num>
-  <w:num w:numId="9" w16cid:durableId="1099985614">
-    <w:abstractNumId w:val="0"/>
-  </w:num>
-  <w:num w:numId="10" w16cid:durableId="1796945683">
+  <w:num w:numId="21" w16cid:durableId="424542347">
     <w:abstractNumId w:val="1"/>
   </w:num>
 </w:numbering>
@@ -3491,6 +7646,7 @@
   <w:style w:type="character" w:default="1" w:styleId="DefaultParagraphFont">
     <w:name w:val="Default Paragraph Font"/>
     <w:uiPriority w:val="1"/>
+    <w:semiHidden/>
     <w:unhideWhenUsed/>
   </w:style>
   <w:style w:type="table" w:default="1" w:styleId="TableNormal">

</xml_diff>

<commit_message>
reports: Add Graphical use case model in Section 3
</commit_message>
<xml_diff>
--- a/reports/report.docx
+++ b/reports/report.docx
@@ -1595,13 +1595,71 @@
         <w:spacing w:before="240" w:after="40" w:line="240" w:lineRule="auto"/>
         <w:outlineLvl w:val="3"/>
         <w:rPr>
-          <w:rFonts w:ascii="Times New Roman" w:eastAsia="Times New Roman" w:hAnsi="Times New Roman" w:cs="Times New Roman"/>
-          <w:b/>
-          <w:bCs/>
-          <w:kern w:val="0"/>
-          <w14:ligatures w14:val="none"/>
-        </w:rPr>
-      </w:pPr>
+          <w:rFonts w:ascii="Arial" w:eastAsia="Times New Roman" w:hAnsi="Arial" w:cs="Arial"/>
+          <w:b/>
+          <w:bCs/>
+          <w:color w:val="000000"/>
+          <w:kern w:val="0"/>
+          <w14:ligatures w14:val="none"/>
+        </w:rPr>
+      </w:pPr>
+      <w:r>
+        <w:rPr>
+          <w:rFonts w:ascii="Arial" w:hAnsi="Arial" w:cs="Arial"/>
+          <w:noProof/>
+          <w:color w:val="000000"/>
+          <w:bdr w:val="none" w:sz="0" w:space="0" w:color="auto" w:frame="1"/>
+        </w:rPr>
+        <w:lastRenderedPageBreak/>
+        <w:drawing>
+          <wp:inline distT="0" distB="0" distL="0" distR="0" wp14:anchorId="12AB05BB" wp14:editId="28CFEA31">
+            <wp:extent cx="5943600" cy="4280535"/>
+            <wp:effectExtent l="0" t="0" r="0" b="5715"/>
+            <wp:docPr id="1134187478" name="Picture 1"/>
+            <wp:cNvGraphicFramePr>
+              <a:graphicFrameLocks xmlns:a="http://schemas.openxmlformats.org/drawingml/2006/main" noChangeAspect="1"/>
+            </wp:cNvGraphicFramePr>
+            <a:graphic xmlns:a="http://schemas.openxmlformats.org/drawingml/2006/main">
+              <a:graphicData uri="http://schemas.openxmlformats.org/drawingml/2006/picture">
+                <pic:pic xmlns:pic="http://schemas.openxmlformats.org/drawingml/2006/picture">
+                  <pic:nvPicPr>
+                    <pic:cNvPr id="0" name="Picture 1"/>
+                    <pic:cNvPicPr>
+                      <a:picLocks noChangeAspect="1" noChangeArrowheads="1"/>
+                    </pic:cNvPicPr>
+                  </pic:nvPicPr>
+                  <pic:blipFill>
+                    <a:blip r:embed="rId6">
+                      <a:extLst>
+                        <a:ext uri="{28A0092B-C50C-407E-A947-70E740481C1C}">
+                          <a14:useLocalDpi xmlns:a14="http://schemas.microsoft.com/office/drawing/2010/main" val="0"/>
+                        </a:ext>
+                      </a:extLst>
+                    </a:blip>
+                    <a:srcRect/>
+                    <a:stretch>
+                      <a:fillRect/>
+                    </a:stretch>
+                  </pic:blipFill>
+                  <pic:spPr bwMode="auto">
+                    <a:xfrm>
+                      <a:off x="0" y="0"/>
+                      <a:ext cx="5943600" cy="4280535"/>
+                    </a:xfrm>
+                    <a:prstGeom prst="rect">
+                      <a:avLst/>
+                    </a:prstGeom>
+                    <a:noFill/>
+                    <a:ln>
+                      <a:noFill/>
+                    </a:ln>
+                  </pic:spPr>
+                </pic:pic>
+              </a:graphicData>
+            </a:graphic>
+          </wp:inline>
+        </w:drawing>
+      </w:r>
     </w:p>
     <w:p>
       <w:pPr>
@@ -2007,7 +2065,6 @@
           <w:kern w:val="0"/>
           <w14:ligatures w14:val="none"/>
         </w:rPr>
-        <w:lastRenderedPageBreak/>
         <w:t>The system calculates total costs and applies any discounts.</w:t>
       </w:r>
     </w:p>
@@ -2033,6 +2090,7 @@
           <w:kern w:val="0"/>
           <w14:ligatures w14:val="none"/>
         </w:rPr>
+        <w:lastRenderedPageBreak/>
         <w:t xml:space="preserve">The system triggers the </w:t>
       </w:r>
       <w:r>
@@ -2978,7 +3036,6 @@
           <w:kern w:val="0"/>
           <w14:ligatures w14:val="none"/>
         </w:rPr>
-        <w:lastRenderedPageBreak/>
         <w:t>Description</w:t>
       </w:r>
       <w:r>
@@ -3015,6 +3072,7 @@
           <w:kern w:val="0"/>
           <w14:ligatures w14:val="none"/>
         </w:rPr>
+        <w:lastRenderedPageBreak/>
         <w:t>Main Flow</w:t>
       </w:r>
       <w:r>
@@ -3727,7 +3785,6 @@
           <w:kern w:val="0"/>
           <w14:ligatures w14:val="none"/>
         </w:rPr>
-        <w:lastRenderedPageBreak/>
         <w:t>NFR1: Security</w:t>
       </w:r>
       <w:r>
@@ -3766,6 +3823,7 @@
           <w:kern w:val="0"/>
           <w14:ligatures w14:val="none"/>
         </w:rPr>
+        <w:lastRenderedPageBreak/>
         <w:t>NFR2: Performance</w:t>
       </w:r>
       <w:r>

</xml_diff>

<commit_message>
reports: Add initial draft for Architecture
</commit_message>
<xml_diff>
--- a/reports/report.docx
+++ b/reports/report.docx
@@ -3386,16 +3386,6 @@
     </w:p>
     <w:p>
       <w:pPr>
-        <w:spacing w:after="240" w:line="240" w:lineRule="auto"/>
-        <w:rPr>
-          <w:rFonts w:ascii="Times New Roman" w:eastAsia="Times New Roman" w:hAnsi="Times New Roman" w:cs="Times New Roman"/>
-          <w:kern w:val="0"/>
-          <w14:ligatures w14:val="none"/>
-        </w:rPr>
-      </w:pPr>
-    </w:p>
-    <w:p>
-      <w:pPr>
         <w:spacing w:before="280" w:after="80" w:line="240" w:lineRule="auto"/>
         <w:outlineLvl w:val="2"/>
         <w:rPr>
@@ -3823,7 +3813,6 @@
           <w:kern w:val="0"/>
           <w14:ligatures w14:val="none"/>
         </w:rPr>
-        <w:lastRenderedPageBreak/>
         <w:t>NFR2: Performance</w:t>
       </w:r>
       <w:r>
@@ -3862,6 +3851,7 @@
           <w:kern w:val="0"/>
           <w14:ligatures w14:val="none"/>
         </w:rPr>
+        <w:lastRenderedPageBreak/>
         <w:t>NFR3: Usability</w:t>
       </w:r>
       <w:r>
@@ -3914,17 +3904,668 @@
     </w:p>
     <w:p>
       <w:pPr>
+        <w:spacing w:before="260" w:after="260" w:line="240" w:lineRule="auto"/>
+        <w:rPr>
+          <w:rFonts w:ascii="Times New Roman" w:eastAsia="Times New Roman" w:hAnsi="Times New Roman" w:cs="Times New Roman"/>
+          <w:kern w:val="0"/>
+          <w14:ligatures w14:val="none"/>
+        </w:rPr>
+      </w:pPr>
+      <w:r>
+        <w:rPr>
+          <w:rFonts w:ascii="Arial" w:eastAsia="Times New Roman" w:hAnsi="Arial" w:cs="Arial"/>
+          <w:b/>
+          <w:bCs/>
+          <w:color w:val="000000"/>
+          <w:kern w:val="0"/>
+          <w:sz w:val="46"/>
+          <w:szCs w:val="46"/>
+          <w14:ligatures w14:val="none"/>
+        </w:rPr>
+        <w:t>4. Architecture</w:t>
+      </w:r>
+    </w:p>
+    <w:p>
+      <w:pPr>
+        <w:spacing w:before="280" w:after="80" w:line="240" w:lineRule="auto"/>
+        <w:outlineLvl w:val="2"/>
+        <w:rPr>
+          <w:rFonts w:ascii="Times New Roman" w:eastAsia="Times New Roman" w:hAnsi="Times New Roman" w:cs="Times New Roman"/>
+          <w:b/>
+          <w:bCs/>
+          <w:kern w:val="0"/>
+          <w:sz w:val="27"/>
+          <w:szCs w:val="27"/>
+          <w14:ligatures w14:val="none"/>
+        </w:rPr>
+      </w:pPr>
+      <w:r>
+        <w:rPr>
+          <w:rFonts w:ascii="Arial" w:eastAsia="Times New Roman" w:hAnsi="Arial" w:cs="Arial"/>
+          <w:b/>
+          <w:bCs/>
+          <w:color w:val="000000"/>
+          <w:kern w:val="0"/>
+          <w:sz w:val="26"/>
+          <w:szCs w:val="26"/>
+          <w14:ligatures w14:val="none"/>
+        </w:rPr>
+        <w:t>4.1. Architectural style(s) used</w:t>
+      </w:r>
+    </w:p>
+    <w:p>
+      <w:pPr>
+        <w:spacing w:before="260" w:after="260" w:line="240" w:lineRule="auto"/>
+        <w:rPr>
+          <w:rFonts w:ascii="Times New Roman" w:eastAsia="Times New Roman" w:hAnsi="Times New Roman" w:cs="Times New Roman"/>
+          <w:kern w:val="0"/>
+          <w14:ligatures w14:val="none"/>
+        </w:rPr>
+      </w:pPr>
+      <w:r>
+        <w:rPr>
+          <w:rFonts w:ascii="Arial" w:eastAsia="Times New Roman" w:hAnsi="Arial" w:cs="Arial"/>
+          <w:color w:val="000000"/>
+          <w:kern w:val="0"/>
+          <w14:ligatures w14:val="none"/>
+        </w:rPr>
+        <w:t xml:space="preserve">The system is developed using the </w:t>
+      </w:r>
+      <w:r>
+        <w:rPr>
+          <w:rFonts w:ascii="Arial" w:eastAsia="Times New Roman" w:hAnsi="Arial" w:cs="Arial"/>
+          <w:b/>
+          <w:bCs/>
+          <w:color w:val="000000"/>
+          <w:kern w:val="0"/>
+          <w14:ligatures w14:val="none"/>
+        </w:rPr>
+        <w:t>Model-View-Controller (MVC)</w:t>
+      </w:r>
+      <w:r>
+        <w:rPr>
+          <w:rFonts w:ascii="Arial" w:eastAsia="Times New Roman" w:hAnsi="Arial" w:cs="Arial"/>
+          <w:color w:val="000000"/>
+          <w:kern w:val="0"/>
+          <w14:ligatures w14:val="none"/>
+        </w:rPr>
+        <w:t xml:space="preserve"> architectural pattern. This pattern divides the application into three interconnected components to separate internal representations of information from the ways information is presented to and accepted from the user.</w:t>
+      </w:r>
+    </w:p>
+    <w:p>
+      <w:pPr>
+        <w:spacing w:before="280" w:after="80" w:line="240" w:lineRule="auto"/>
+        <w:outlineLvl w:val="2"/>
+        <w:rPr>
+          <w:rFonts w:ascii="Times New Roman" w:eastAsia="Times New Roman" w:hAnsi="Times New Roman" w:cs="Times New Roman"/>
+          <w:b/>
+          <w:bCs/>
+          <w:kern w:val="0"/>
+          <w:sz w:val="27"/>
+          <w:szCs w:val="27"/>
+          <w14:ligatures w14:val="none"/>
+        </w:rPr>
+      </w:pPr>
+      <w:r>
+        <w:rPr>
+          <w:rFonts w:ascii="Arial" w:eastAsia="Times New Roman" w:hAnsi="Arial" w:cs="Arial"/>
+          <w:b/>
+          <w:bCs/>
+          <w:color w:val="000000"/>
+          <w:kern w:val="0"/>
+          <w:sz w:val="26"/>
+          <w:szCs w:val="26"/>
+          <w14:ligatures w14:val="none"/>
+        </w:rPr>
+        <w:t>4.2. Architectural model</w:t>
+      </w:r>
+    </w:p>
+    <w:p>
+      <w:pPr>
+        <w:spacing w:before="260" w:after="260" w:line="240" w:lineRule="auto"/>
+        <w:rPr>
+          <w:rFonts w:ascii="Times New Roman" w:eastAsia="Times New Roman" w:hAnsi="Times New Roman" w:cs="Times New Roman"/>
+          <w:kern w:val="0"/>
+          <w14:ligatures w14:val="none"/>
+        </w:rPr>
+      </w:pPr>
+      <w:r>
+        <w:rPr>
+          <w:rFonts w:ascii="Arial" w:eastAsia="Times New Roman" w:hAnsi="Arial" w:cs="Arial"/>
+          <w:color w:val="000000"/>
+          <w:kern w:val="0"/>
+          <w14:ligatures w14:val="none"/>
+        </w:rPr>
+        <w:t>The architecture consists of three primary layers:</w:t>
+      </w:r>
+    </w:p>
+    <w:p>
+      <w:pPr>
+        <w:numPr>
+          <w:ilvl w:val="0"/>
+          <w:numId w:val="22"/>
+        </w:numPr>
+        <w:spacing w:before="260" w:after="0" w:line="240" w:lineRule="auto"/>
+        <w:textAlignment w:val="baseline"/>
+        <w:rPr>
+          <w:rFonts w:ascii="Arial" w:eastAsia="Times New Roman" w:hAnsi="Arial" w:cs="Arial"/>
+          <w:color w:val="000000"/>
+          <w:kern w:val="0"/>
+          <w14:ligatures w14:val="none"/>
+        </w:rPr>
+      </w:pPr>
+      <w:r>
+        <w:rPr>
+          <w:rFonts w:ascii="Arial" w:eastAsia="Times New Roman" w:hAnsi="Arial" w:cs="Arial"/>
+          <w:b/>
+          <w:bCs/>
+          <w:color w:val="000000"/>
+          <w:kern w:val="0"/>
+          <w14:ligatures w14:val="none"/>
+        </w:rPr>
+        <w:t>Model</w:t>
+      </w:r>
+      <w:r>
+        <w:rPr>
+          <w:rFonts w:ascii="Arial" w:eastAsia="Times New Roman" w:hAnsi="Arial" w:cs="Arial"/>
+          <w:color w:val="000000"/>
+          <w:kern w:val="0"/>
+          <w14:ligatures w14:val="none"/>
+        </w:rPr>
+        <w:t>: Represents the data structures and business logic (e.g., Product, Invoice, Employee classes). It interacts directly with the database.</w:t>
+      </w:r>
+    </w:p>
+    <w:p>
+      <w:pPr>
+        <w:numPr>
+          <w:ilvl w:val="0"/>
+          <w:numId w:val="22"/>
+        </w:numPr>
+        <w:spacing w:after="0" w:line="240" w:lineRule="auto"/>
+        <w:textAlignment w:val="baseline"/>
+        <w:rPr>
+          <w:rFonts w:ascii="Arial" w:eastAsia="Times New Roman" w:hAnsi="Arial" w:cs="Arial"/>
+          <w:color w:val="000000"/>
+          <w:kern w:val="0"/>
+          <w14:ligatures w14:val="none"/>
+        </w:rPr>
+      </w:pPr>
+      <w:r>
+        <w:rPr>
+          <w:rFonts w:ascii="Arial" w:eastAsia="Times New Roman" w:hAnsi="Arial" w:cs="Arial"/>
+          <w:b/>
+          <w:bCs/>
+          <w:color w:val="000000"/>
+          <w:kern w:val="0"/>
+          <w14:ligatures w14:val="none"/>
+        </w:rPr>
+        <w:t>View</w:t>
+      </w:r>
+      <w:r>
+        <w:rPr>
+          <w:rFonts w:ascii="Arial" w:eastAsia="Times New Roman" w:hAnsi="Arial" w:cs="Arial"/>
+          <w:color w:val="000000"/>
+          <w:kern w:val="0"/>
+          <w14:ligatures w14:val="none"/>
+        </w:rPr>
+        <w:t>: The Graphical User Interface (GUI) built with Windows Forms. It displays data from the Model and sends user inputs to the Controller.</w:t>
+      </w:r>
+    </w:p>
+    <w:p>
+      <w:pPr>
+        <w:numPr>
+          <w:ilvl w:val="0"/>
+          <w:numId w:val="22"/>
+        </w:numPr>
         <w:spacing w:after="260" w:line="240" w:lineRule="auto"/>
         <w:textAlignment w:val="baseline"/>
         <w:rPr>
           <w:rFonts w:ascii="Arial" w:eastAsia="Times New Roman" w:hAnsi="Arial" w:cs="Arial"/>
           <w:color w:val="000000"/>
           <w:kern w:val="0"/>
-          <w:sz w:val="22"/>
-          <w:szCs w:val="22"/>
-          <w14:ligatures w14:val="none"/>
-        </w:rPr>
-      </w:pPr>
+          <w14:ligatures w14:val="none"/>
+        </w:rPr>
+      </w:pPr>
+      <w:r>
+        <w:rPr>
+          <w:rFonts w:ascii="Arial" w:eastAsia="Times New Roman" w:hAnsi="Arial" w:cs="Arial"/>
+          <w:b/>
+          <w:bCs/>
+          <w:color w:val="000000"/>
+          <w:kern w:val="0"/>
+          <w14:ligatures w14:val="none"/>
+        </w:rPr>
+        <w:t>Controller</w:t>
+      </w:r>
+      <w:r>
+        <w:rPr>
+          <w:rFonts w:ascii="Arial" w:eastAsia="Times New Roman" w:hAnsi="Arial" w:cs="Arial"/>
+          <w:color w:val="000000"/>
+          <w:kern w:val="0"/>
+          <w14:ligatures w14:val="none"/>
+        </w:rPr>
+        <w:t>: Acts as an intermediary that processes user input, manipulates data using the Model, and updates the View accordingly.</w:t>
+      </w:r>
+    </w:p>
+    <w:p>
+      <w:pPr>
+        <w:spacing w:before="280" w:after="80" w:line="240" w:lineRule="auto"/>
+        <w:outlineLvl w:val="2"/>
+        <w:rPr>
+          <w:rFonts w:ascii="Times New Roman" w:eastAsia="Times New Roman" w:hAnsi="Times New Roman" w:cs="Times New Roman"/>
+          <w:b/>
+          <w:bCs/>
+          <w:kern w:val="0"/>
+          <w:sz w:val="27"/>
+          <w:szCs w:val="27"/>
+          <w14:ligatures w14:val="none"/>
+        </w:rPr>
+      </w:pPr>
+      <w:r>
+        <w:rPr>
+          <w:rFonts w:ascii="Arial" w:eastAsia="Times New Roman" w:hAnsi="Arial" w:cs="Arial"/>
+          <w:b/>
+          <w:bCs/>
+          <w:color w:val="000000"/>
+          <w:kern w:val="0"/>
+          <w:sz w:val="26"/>
+          <w:szCs w:val="26"/>
+          <w14:ligatures w14:val="none"/>
+        </w:rPr>
+        <w:t>4.3. Technology, software, and hardware used</w:t>
+      </w:r>
+    </w:p>
+    <w:p>
+      <w:pPr>
+        <w:numPr>
+          <w:ilvl w:val="0"/>
+          <w:numId w:val="23"/>
+        </w:numPr>
+        <w:spacing w:before="260" w:after="0" w:line="240" w:lineRule="auto"/>
+        <w:textAlignment w:val="baseline"/>
+        <w:rPr>
+          <w:rFonts w:ascii="Arial" w:eastAsia="Times New Roman" w:hAnsi="Arial" w:cs="Arial"/>
+          <w:color w:val="000000"/>
+          <w:kern w:val="0"/>
+          <w14:ligatures w14:val="none"/>
+        </w:rPr>
+      </w:pPr>
+      <w:r>
+        <w:rPr>
+          <w:rFonts w:ascii="Arial" w:eastAsia="Times New Roman" w:hAnsi="Arial" w:cs="Arial"/>
+          <w:b/>
+          <w:bCs/>
+          <w:color w:val="000000"/>
+          <w:kern w:val="0"/>
+          <w14:ligatures w14:val="none"/>
+        </w:rPr>
+        <w:t>Programming Language</w:t>
+      </w:r>
+      <w:r>
+        <w:rPr>
+          <w:rFonts w:ascii="Arial" w:eastAsia="Times New Roman" w:hAnsi="Arial" w:cs="Arial"/>
+          <w:color w:val="000000"/>
+          <w:kern w:val="0"/>
+          <w14:ligatures w14:val="none"/>
+        </w:rPr>
+        <w:t>: C# (.NET Framework/Core).</w:t>
+      </w:r>
+    </w:p>
+    <w:p>
+      <w:pPr>
+        <w:numPr>
+          <w:ilvl w:val="0"/>
+          <w:numId w:val="23"/>
+        </w:numPr>
+        <w:spacing w:after="0" w:line="240" w:lineRule="auto"/>
+        <w:textAlignment w:val="baseline"/>
+        <w:rPr>
+          <w:rFonts w:ascii="Arial" w:eastAsia="Times New Roman" w:hAnsi="Arial" w:cs="Arial"/>
+          <w:color w:val="000000"/>
+          <w:kern w:val="0"/>
+          <w14:ligatures w14:val="none"/>
+        </w:rPr>
+      </w:pPr>
+      <w:r>
+        <w:rPr>
+          <w:rFonts w:ascii="Arial" w:eastAsia="Times New Roman" w:hAnsi="Arial" w:cs="Arial"/>
+          <w:b/>
+          <w:bCs/>
+          <w:color w:val="000000"/>
+          <w:kern w:val="0"/>
+          <w14:ligatures w14:val="none"/>
+        </w:rPr>
+        <w:t>Development Environment</w:t>
+      </w:r>
+      <w:r>
+        <w:rPr>
+          <w:rFonts w:ascii="Arial" w:eastAsia="Times New Roman" w:hAnsi="Arial" w:cs="Arial"/>
+          <w:color w:val="000000"/>
+          <w:kern w:val="0"/>
+          <w14:ligatures w14:val="none"/>
+        </w:rPr>
+        <w:t>: Microsoft Visual Studio 2026.</w:t>
+      </w:r>
+    </w:p>
+    <w:p>
+      <w:pPr>
+        <w:numPr>
+          <w:ilvl w:val="0"/>
+          <w:numId w:val="23"/>
+        </w:numPr>
+        <w:spacing w:after="0" w:line="240" w:lineRule="auto"/>
+        <w:textAlignment w:val="baseline"/>
+        <w:rPr>
+          <w:rFonts w:ascii="Arial" w:eastAsia="Times New Roman" w:hAnsi="Arial" w:cs="Arial"/>
+          <w:color w:val="000000"/>
+          <w:kern w:val="0"/>
+          <w14:ligatures w14:val="none"/>
+        </w:rPr>
+      </w:pPr>
+      <w:r>
+        <w:rPr>
+          <w:rFonts w:ascii="Arial" w:eastAsia="Times New Roman" w:hAnsi="Arial" w:cs="Arial"/>
+          <w:b/>
+          <w:bCs/>
+          <w:color w:val="000000"/>
+          <w:kern w:val="0"/>
+          <w14:ligatures w14:val="none"/>
+        </w:rPr>
+        <w:t>Database Management System</w:t>
+      </w:r>
+      <w:r>
+        <w:rPr>
+          <w:rFonts w:ascii="Arial" w:eastAsia="Times New Roman" w:hAnsi="Arial" w:cs="Arial"/>
+          <w:color w:val="000000"/>
+          <w:kern w:val="0"/>
+          <w14:ligatures w14:val="none"/>
+        </w:rPr>
+        <w:t>: Microsoft SQL Server.</w:t>
+      </w:r>
+    </w:p>
+    <w:p>
+      <w:pPr>
+        <w:numPr>
+          <w:ilvl w:val="0"/>
+          <w:numId w:val="23"/>
+        </w:numPr>
+        <w:spacing w:after="0" w:line="240" w:lineRule="auto"/>
+        <w:textAlignment w:val="baseline"/>
+        <w:rPr>
+          <w:rFonts w:ascii="Arial" w:eastAsia="Times New Roman" w:hAnsi="Arial" w:cs="Arial"/>
+          <w:color w:val="000000"/>
+          <w:kern w:val="0"/>
+          <w14:ligatures w14:val="none"/>
+        </w:rPr>
+      </w:pPr>
+      <w:r>
+        <w:rPr>
+          <w:rFonts w:ascii="Arial" w:eastAsia="Times New Roman" w:hAnsi="Arial" w:cs="Arial"/>
+          <w:b/>
+          <w:bCs/>
+          <w:color w:val="000000"/>
+          <w:kern w:val="0"/>
+          <w14:ligatures w14:val="none"/>
+        </w:rPr>
+        <w:t>Frameworks</w:t>
+      </w:r>
+      <w:r>
+        <w:rPr>
+          <w:rFonts w:ascii="Arial" w:eastAsia="Times New Roman" w:hAnsi="Arial" w:cs="Arial"/>
+          <w:color w:val="000000"/>
+          <w:kern w:val="0"/>
+          <w14:ligatures w14:val="none"/>
+        </w:rPr>
+        <w:t>: Windows Forms (WinForms) for the UI.</w:t>
+      </w:r>
+    </w:p>
+    <w:p>
+      <w:pPr>
+        <w:numPr>
+          <w:ilvl w:val="0"/>
+          <w:numId w:val="23"/>
+        </w:numPr>
+        <w:spacing w:after="260" w:line="240" w:lineRule="auto"/>
+        <w:textAlignment w:val="baseline"/>
+        <w:rPr>
+          <w:rFonts w:ascii="Arial" w:eastAsia="Times New Roman" w:hAnsi="Arial" w:cs="Arial"/>
+          <w:color w:val="000000"/>
+          <w:kern w:val="0"/>
+          <w14:ligatures w14:val="none"/>
+        </w:rPr>
+      </w:pPr>
+      <w:r>
+        <w:rPr>
+          <w:rFonts w:ascii="Arial" w:eastAsia="Times New Roman" w:hAnsi="Arial" w:cs="Arial"/>
+          <w:b/>
+          <w:bCs/>
+          <w:color w:val="000000"/>
+          <w:kern w:val="0"/>
+          <w14:ligatures w14:val="none"/>
+        </w:rPr>
+        <w:t>Hardware</w:t>
+      </w:r>
+      <w:r>
+        <w:rPr>
+          <w:rFonts w:ascii="Arial" w:eastAsia="Times New Roman" w:hAnsi="Arial" w:cs="Arial"/>
+          <w:color w:val="000000"/>
+          <w:kern w:val="0"/>
+          <w14:ligatures w14:val="none"/>
+        </w:rPr>
+        <w:t>: Standard development workstations (Intel Core i5/i7, 8GB+ RAM).</w:t>
+      </w:r>
+    </w:p>
+    <w:p>
+      <w:pPr>
+        <w:spacing w:before="280" w:after="80" w:line="240" w:lineRule="auto"/>
+        <w:outlineLvl w:val="2"/>
+        <w:rPr>
+          <w:rFonts w:ascii="Times New Roman" w:eastAsia="Times New Roman" w:hAnsi="Times New Roman" w:cs="Times New Roman"/>
+          <w:b/>
+          <w:bCs/>
+          <w:kern w:val="0"/>
+          <w:sz w:val="27"/>
+          <w:szCs w:val="27"/>
+          <w14:ligatures w14:val="none"/>
+        </w:rPr>
+      </w:pPr>
+      <w:r>
+        <w:rPr>
+          <w:rFonts w:ascii="Arial" w:eastAsia="Times New Roman" w:hAnsi="Arial" w:cs="Arial"/>
+          <w:b/>
+          <w:bCs/>
+          <w:color w:val="000000"/>
+          <w:kern w:val="0"/>
+          <w:sz w:val="26"/>
+          <w:szCs w:val="26"/>
+          <w14:ligatures w14:val="none"/>
+        </w:rPr>
+        <w:t>4.4. Rationale for architectural style and model</w:t>
+      </w:r>
+    </w:p>
+    <w:p>
+      <w:pPr>
+        <w:spacing w:before="260" w:after="260" w:line="240" w:lineRule="auto"/>
+        <w:rPr>
+          <w:rFonts w:ascii="Times New Roman" w:eastAsia="Times New Roman" w:hAnsi="Times New Roman" w:cs="Times New Roman"/>
+          <w:kern w:val="0"/>
+          <w14:ligatures w14:val="none"/>
+        </w:rPr>
+      </w:pPr>
+      <w:r>
+        <w:rPr>
+          <w:rFonts w:ascii="Arial" w:eastAsia="Times New Roman" w:hAnsi="Arial" w:cs="Arial"/>
+          <w:color w:val="000000"/>
+          <w:kern w:val="0"/>
+          <w14:ligatures w14:val="none"/>
+        </w:rPr>
+        <w:t>The selection of the MVC pattern for the Computer Shop Management System is based on several key factors:</w:t>
+      </w:r>
+    </w:p>
+    <w:p>
+      <w:pPr>
+        <w:numPr>
+          <w:ilvl w:val="0"/>
+          <w:numId w:val="24"/>
+        </w:numPr>
+        <w:spacing w:before="260" w:after="0" w:line="240" w:lineRule="auto"/>
+        <w:textAlignment w:val="baseline"/>
+        <w:rPr>
+          <w:rFonts w:ascii="Arial" w:eastAsia="Times New Roman" w:hAnsi="Arial" w:cs="Arial"/>
+          <w:color w:val="000000"/>
+          <w:kern w:val="0"/>
+          <w14:ligatures w14:val="none"/>
+        </w:rPr>
+      </w:pPr>
+      <w:r>
+        <w:rPr>
+          <w:rFonts w:ascii="Arial" w:eastAsia="Times New Roman" w:hAnsi="Arial" w:cs="Arial"/>
+          <w:b/>
+          <w:bCs/>
+          <w:color w:val="000000"/>
+          <w:kern w:val="0"/>
+          <w14:ligatures w14:val="none"/>
+        </w:rPr>
+        <w:t>Separation of Concerns</w:t>
+      </w:r>
+      <w:r>
+        <w:rPr>
+          <w:rFonts w:ascii="Arial" w:eastAsia="Times New Roman" w:hAnsi="Arial" w:cs="Arial"/>
+          <w:color w:val="000000"/>
+          <w:kern w:val="0"/>
+          <w14:ligatures w14:val="none"/>
+        </w:rPr>
+        <w:t>: By decoupling the UI (View) from the business logic (Controller), the team can work on different components simultaneously without interference.</w:t>
+      </w:r>
+    </w:p>
+    <w:p>
+      <w:pPr>
+        <w:numPr>
+          <w:ilvl w:val="0"/>
+          <w:numId w:val="24"/>
+        </w:numPr>
+        <w:spacing w:after="0" w:line="240" w:lineRule="auto"/>
+        <w:textAlignment w:val="baseline"/>
+        <w:rPr>
+          <w:rFonts w:ascii="Arial" w:eastAsia="Times New Roman" w:hAnsi="Arial" w:cs="Arial"/>
+          <w:color w:val="000000"/>
+          <w:kern w:val="0"/>
+          <w14:ligatures w14:val="none"/>
+        </w:rPr>
+      </w:pPr>
+      <w:r>
+        <w:rPr>
+          <w:rFonts w:ascii="Arial" w:eastAsia="Times New Roman" w:hAnsi="Arial" w:cs="Arial"/>
+          <w:b/>
+          <w:bCs/>
+          <w:color w:val="000000"/>
+          <w:kern w:val="0"/>
+          <w14:ligatures w14:val="none"/>
+        </w:rPr>
+        <w:t>Maintainability</w:t>
+      </w:r>
+      <w:r>
+        <w:rPr>
+          <w:rFonts w:ascii="Arial" w:eastAsia="Times New Roman" w:hAnsi="Arial" w:cs="Arial"/>
+          <w:color w:val="000000"/>
+          <w:kern w:val="0"/>
+          <w14:ligatures w14:val="none"/>
+        </w:rPr>
+        <w:t>: Changes to the database schema (Model) or the UI layout (View) can be made with minimal impact on other parts of the system.</w:t>
+      </w:r>
+    </w:p>
+    <w:p>
+      <w:pPr>
+        <w:numPr>
+          <w:ilvl w:val="0"/>
+          <w:numId w:val="24"/>
+        </w:numPr>
+        <w:spacing w:after="0" w:line="240" w:lineRule="auto"/>
+        <w:textAlignment w:val="baseline"/>
+        <w:rPr>
+          <w:rFonts w:ascii="Arial" w:eastAsia="Times New Roman" w:hAnsi="Arial" w:cs="Arial"/>
+          <w:color w:val="000000"/>
+          <w:kern w:val="0"/>
+          <w14:ligatures w14:val="none"/>
+        </w:rPr>
+      </w:pPr>
+      <w:r>
+        <w:rPr>
+          <w:rFonts w:ascii="Arial" w:eastAsia="Times New Roman" w:hAnsi="Arial" w:cs="Arial"/>
+          <w:b/>
+          <w:bCs/>
+          <w:color w:val="000000"/>
+          <w:kern w:val="0"/>
+          <w14:ligatures w14:val="none"/>
+        </w:rPr>
+        <w:t>Testability</w:t>
+      </w:r>
+      <w:r>
+        <w:rPr>
+          <w:rFonts w:ascii="Arial" w:eastAsia="Times New Roman" w:hAnsi="Arial" w:cs="Arial"/>
+          <w:color w:val="000000"/>
+          <w:kern w:val="0"/>
+          <w14:ligatures w14:val="none"/>
+        </w:rPr>
+        <w:t xml:space="preserve">: The MVC pattern allows for easier implementation of </w:t>
+      </w:r>
+      <w:r>
+        <w:rPr>
+          <w:rFonts w:ascii="Arial" w:eastAsia="Times New Roman" w:hAnsi="Arial" w:cs="Arial"/>
+          <w:b/>
+          <w:bCs/>
+          <w:color w:val="000000"/>
+          <w:kern w:val="0"/>
+          <w14:ligatures w14:val="none"/>
+        </w:rPr>
+        <w:t>Unit Tests</w:t>
+      </w:r>
+      <w:r>
+        <w:rPr>
+          <w:rFonts w:ascii="Arial" w:eastAsia="Times New Roman" w:hAnsi="Arial" w:cs="Arial"/>
+          <w:color w:val="000000"/>
+          <w:kern w:val="0"/>
+          <w14:ligatures w14:val="none"/>
+        </w:rPr>
+        <w:t xml:space="preserve"> for the Controller and Model layers, which is a critical requirement for this project.</w:t>
+      </w:r>
+    </w:p>
+    <w:p>
+      <w:pPr>
+        <w:numPr>
+          <w:ilvl w:val="0"/>
+          <w:numId w:val="24"/>
+        </w:numPr>
+        <w:spacing w:after="260" w:line="240" w:lineRule="auto"/>
+        <w:textAlignment w:val="baseline"/>
+        <w:rPr>
+          <w:rFonts w:ascii="Arial" w:eastAsia="Times New Roman" w:hAnsi="Arial" w:cs="Arial"/>
+          <w:color w:val="000000"/>
+          <w:kern w:val="0"/>
+          <w14:ligatures w14:val="none"/>
+        </w:rPr>
+      </w:pPr>
+      <w:r>
+        <w:rPr>
+          <w:rFonts w:ascii="Arial" w:eastAsia="Times New Roman" w:hAnsi="Arial" w:cs="Arial"/>
+          <w:b/>
+          <w:bCs/>
+          <w:color w:val="000000"/>
+          <w:kern w:val="0"/>
+          <w14:ligatures w14:val="none"/>
+        </w:rPr>
+        <w:lastRenderedPageBreak/>
+        <w:t>Reusability</w:t>
+      </w:r>
+      <w:r>
+        <w:rPr>
+          <w:rFonts w:ascii="Arial" w:eastAsia="Times New Roman" w:hAnsi="Arial" w:cs="Arial"/>
+          <w:color w:val="000000"/>
+          <w:kern w:val="0"/>
+          <w14:ligatures w14:val="none"/>
+        </w:rPr>
+        <w:t>: Business logic defined in the Model can be reused across different forms within the application.</w:t>
+      </w:r>
     </w:p>
     <w:sectPr>
       <w:pgSz w:w="12240" w:h="15840"/>
@@ -5119,6 +5760,155 @@
     </w:lvl>
   </w:abstractNum>
   <w:abstractNum w:abstractNumId="8" w15:restartNumberingAfterBreak="0">
+    <w:nsid w:val="2CA03F71"/>
+    <w:multiLevelType w:val="multilevel"/>
+    <w:tmpl w:val="24320C24"/>
+    <w:lvl w:ilvl="0">
+      <w:start w:val="1"/>
+      <w:numFmt w:val="bullet"/>
+      <w:lvlText w:val=""/>
+      <w:lvlJc w:val="left"/>
+      <w:pPr>
+        <w:tabs>
+          <w:tab w:val="num" w:pos="720"/>
+        </w:tabs>
+        <w:ind w:left="720" w:hanging="360"/>
+      </w:pPr>
+      <w:rPr>
+        <w:rFonts w:ascii="Symbol" w:hAnsi="Symbol" w:hint="default"/>
+        <w:sz w:val="20"/>
+      </w:rPr>
+    </w:lvl>
+    <w:lvl w:ilvl="1" w:tentative="1">
+      <w:start w:val="1"/>
+      <w:numFmt w:val="bullet"/>
+      <w:lvlText w:val="o"/>
+      <w:lvlJc w:val="left"/>
+      <w:pPr>
+        <w:tabs>
+          <w:tab w:val="num" w:pos="1440"/>
+        </w:tabs>
+        <w:ind w:left="1440" w:hanging="360"/>
+      </w:pPr>
+      <w:rPr>
+        <w:rFonts w:ascii="Courier New" w:hAnsi="Courier New" w:hint="default"/>
+        <w:sz w:val="20"/>
+      </w:rPr>
+    </w:lvl>
+    <w:lvl w:ilvl="2" w:tentative="1">
+      <w:start w:val="1"/>
+      <w:numFmt w:val="bullet"/>
+      <w:lvlText w:val=""/>
+      <w:lvlJc w:val="left"/>
+      <w:pPr>
+        <w:tabs>
+          <w:tab w:val="num" w:pos="2160"/>
+        </w:tabs>
+        <w:ind w:left="2160" w:hanging="360"/>
+      </w:pPr>
+      <w:rPr>
+        <w:rFonts w:ascii="Wingdings" w:hAnsi="Wingdings" w:hint="default"/>
+        <w:sz w:val="20"/>
+      </w:rPr>
+    </w:lvl>
+    <w:lvl w:ilvl="3" w:tentative="1">
+      <w:start w:val="1"/>
+      <w:numFmt w:val="bullet"/>
+      <w:lvlText w:val=""/>
+      <w:lvlJc w:val="left"/>
+      <w:pPr>
+        <w:tabs>
+          <w:tab w:val="num" w:pos="2880"/>
+        </w:tabs>
+        <w:ind w:left="2880" w:hanging="360"/>
+      </w:pPr>
+      <w:rPr>
+        <w:rFonts w:ascii="Wingdings" w:hAnsi="Wingdings" w:hint="default"/>
+        <w:sz w:val="20"/>
+      </w:rPr>
+    </w:lvl>
+    <w:lvl w:ilvl="4" w:tentative="1">
+      <w:start w:val="1"/>
+      <w:numFmt w:val="bullet"/>
+      <w:lvlText w:val=""/>
+      <w:lvlJc w:val="left"/>
+      <w:pPr>
+        <w:tabs>
+          <w:tab w:val="num" w:pos="3600"/>
+        </w:tabs>
+        <w:ind w:left="3600" w:hanging="360"/>
+      </w:pPr>
+      <w:rPr>
+        <w:rFonts w:ascii="Wingdings" w:hAnsi="Wingdings" w:hint="default"/>
+        <w:sz w:val="20"/>
+      </w:rPr>
+    </w:lvl>
+    <w:lvl w:ilvl="5" w:tentative="1">
+      <w:start w:val="1"/>
+      <w:numFmt w:val="bullet"/>
+      <w:lvlText w:val=""/>
+      <w:lvlJc w:val="left"/>
+      <w:pPr>
+        <w:tabs>
+          <w:tab w:val="num" w:pos="4320"/>
+        </w:tabs>
+        <w:ind w:left="4320" w:hanging="360"/>
+      </w:pPr>
+      <w:rPr>
+        <w:rFonts w:ascii="Wingdings" w:hAnsi="Wingdings" w:hint="default"/>
+        <w:sz w:val="20"/>
+      </w:rPr>
+    </w:lvl>
+    <w:lvl w:ilvl="6" w:tentative="1">
+      <w:start w:val="1"/>
+      <w:numFmt w:val="bullet"/>
+      <w:lvlText w:val=""/>
+      <w:lvlJc w:val="left"/>
+      <w:pPr>
+        <w:tabs>
+          <w:tab w:val="num" w:pos="5040"/>
+        </w:tabs>
+        <w:ind w:left="5040" w:hanging="360"/>
+      </w:pPr>
+      <w:rPr>
+        <w:rFonts w:ascii="Wingdings" w:hAnsi="Wingdings" w:hint="default"/>
+        <w:sz w:val="20"/>
+      </w:rPr>
+    </w:lvl>
+    <w:lvl w:ilvl="7" w:tentative="1">
+      <w:start w:val="1"/>
+      <w:numFmt w:val="bullet"/>
+      <w:lvlText w:val=""/>
+      <w:lvlJc w:val="left"/>
+      <w:pPr>
+        <w:tabs>
+          <w:tab w:val="num" w:pos="5760"/>
+        </w:tabs>
+        <w:ind w:left="5760" w:hanging="360"/>
+      </w:pPr>
+      <w:rPr>
+        <w:rFonts w:ascii="Wingdings" w:hAnsi="Wingdings" w:hint="default"/>
+        <w:sz w:val="20"/>
+      </w:rPr>
+    </w:lvl>
+    <w:lvl w:ilvl="8" w:tentative="1">
+      <w:start w:val="1"/>
+      <w:numFmt w:val="bullet"/>
+      <w:lvlText w:val=""/>
+      <w:lvlJc w:val="left"/>
+      <w:pPr>
+        <w:tabs>
+          <w:tab w:val="num" w:pos="6480"/>
+        </w:tabs>
+        <w:ind w:left="6480" w:hanging="360"/>
+      </w:pPr>
+      <w:rPr>
+        <w:rFonts w:ascii="Wingdings" w:hAnsi="Wingdings" w:hint="default"/>
+        <w:sz w:val="20"/>
+      </w:rPr>
+    </w:lvl>
+  </w:abstractNum>
+  <w:abstractNum w:abstractNumId="9" w15:restartNumberingAfterBreak="0">
     <w:nsid w:val="2FE07389"/>
     <w:multiLevelType w:val="multilevel"/>
     <w:tmpl w:val="37A2D4D8"/>
@@ -5267,7 +6057,7 @@
       </w:rPr>
     </w:lvl>
   </w:abstractNum>
-  <w:abstractNum w:abstractNumId="9" w15:restartNumberingAfterBreak="0">
+  <w:abstractNum w:abstractNumId="10" w15:restartNumberingAfterBreak="0">
     <w:nsid w:val="306F5E8B"/>
     <w:multiLevelType w:val="multilevel"/>
     <w:tmpl w:val="772C5982"/>
@@ -5412,7 +6202,7 @@
       </w:rPr>
     </w:lvl>
   </w:abstractNum>
-  <w:abstractNum w:abstractNumId="10" w15:restartNumberingAfterBreak="0">
+  <w:abstractNum w:abstractNumId="11" w15:restartNumberingAfterBreak="0">
     <w:nsid w:val="39053FD9"/>
     <w:multiLevelType w:val="multilevel"/>
     <w:tmpl w:val="591C071C"/>
@@ -5561,7 +6351,156 @@
       </w:rPr>
     </w:lvl>
   </w:abstractNum>
-  <w:abstractNum w:abstractNumId="11" w15:restartNumberingAfterBreak="0">
+  <w:abstractNum w:abstractNumId="12" w15:restartNumberingAfterBreak="0">
+    <w:nsid w:val="3F222A3D"/>
+    <w:multiLevelType w:val="multilevel"/>
+    <w:tmpl w:val="486A91DA"/>
+    <w:lvl w:ilvl="0">
+      <w:start w:val="1"/>
+      <w:numFmt w:val="bullet"/>
+      <w:lvlText w:val=""/>
+      <w:lvlJc w:val="left"/>
+      <w:pPr>
+        <w:tabs>
+          <w:tab w:val="num" w:pos="720"/>
+        </w:tabs>
+        <w:ind w:left="720" w:hanging="360"/>
+      </w:pPr>
+      <w:rPr>
+        <w:rFonts w:ascii="Symbol" w:hAnsi="Symbol" w:hint="default"/>
+        <w:sz w:val="20"/>
+      </w:rPr>
+    </w:lvl>
+    <w:lvl w:ilvl="1" w:tentative="1">
+      <w:start w:val="1"/>
+      <w:numFmt w:val="bullet"/>
+      <w:lvlText w:val="o"/>
+      <w:lvlJc w:val="left"/>
+      <w:pPr>
+        <w:tabs>
+          <w:tab w:val="num" w:pos="1440"/>
+        </w:tabs>
+        <w:ind w:left="1440" w:hanging="360"/>
+      </w:pPr>
+      <w:rPr>
+        <w:rFonts w:ascii="Courier New" w:hAnsi="Courier New" w:hint="default"/>
+        <w:sz w:val="20"/>
+      </w:rPr>
+    </w:lvl>
+    <w:lvl w:ilvl="2" w:tentative="1">
+      <w:start w:val="1"/>
+      <w:numFmt w:val="bullet"/>
+      <w:lvlText w:val=""/>
+      <w:lvlJc w:val="left"/>
+      <w:pPr>
+        <w:tabs>
+          <w:tab w:val="num" w:pos="2160"/>
+        </w:tabs>
+        <w:ind w:left="2160" w:hanging="360"/>
+      </w:pPr>
+      <w:rPr>
+        <w:rFonts w:ascii="Wingdings" w:hAnsi="Wingdings" w:hint="default"/>
+        <w:sz w:val="20"/>
+      </w:rPr>
+    </w:lvl>
+    <w:lvl w:ilvl="3" w:tentative="1">
+      <w:start w:val="1"/>
+      <w:numFmt w:val="bullet"/>
+      <w:lvlText w:val=""/>
+      <w:lvlJc w:val="left"/>
+      <w:pPr>
+        <w:tabs>
+          <w:tab w:val="num" w:pos="2880"/>
+        </w:tabs>
+        <w:ind w:left="2880" w:hanging="360"/>
+      </w:pPr>
+      <w:rPr>
+        <w:rFonts w:ascii="Wingdings" w:hAnsi="Wingdings" w:hint="default"/>
+        <w:sz w:val="20"/>
+      </w:rPr>
+    </w:lvl>
+    <w:lvl w:ilvl="4" w:tentative="1">
+      <w:start w:val="1"/>
+      <w:numFmt w:val="bullet"/>
+      <w:lvlText w:val=""/>
+      <w:lvlJc w:val="left"/>
+      <w:pPr>
+        <w:tabs>
+          <w:tab w:val="num" w:pos="3600"/>
+        </w:tabs>
+        <w:ind w:left="3600" w:hanging="360"/>
+      </w:pPr>
+      <w:rPr>
+        <w:rFonts w:ascii="Wingdings" w:hAnsi="Wingdings" w:hint="default"/>
+        <w:sz w:val="20"/>
+      </w:rPr>
+    </w:lvl>
+    <w:lvl w:ilvl="5" w:tentative="1">
+      <w:start w:val="1"/>
+      <w:numFmt w:val="bullet"/>
+      <w:lvlText w:val=""/>
+      <w:lvlJc w:val="left"/>
+      <w:pPr>
+        <w:tabs>
+          <w:tab w:val="num" w:pos="4320"/>
+        </w:tabs>
+        <w:ind w:left="4320" w:hanging="360"/>
+      </w:pPr>
+      <w:rPr>
+        <w:rFonts w:ascii="Wingdings" w:hAnsi="Wingdings" w:hint="default"/>
+        <w:sz w:val="20"/>
+      </w:rPr>
+    </w:lvl>
+    <w:lvl w:ilvl="6" w:tentative="1">
+      <w:start w:val="1"/>
+      <w:numFmt w:val="bullet"/>
+      <w:lvlText w:val=""/>
+      <w:lvlJc w:val="left"/>
+      <w:pPr>
+        <w:tabs>
+          <w:tab w:val="num" w:pos="5040"/>
+        </w:tabs>
+        <w:ind w:left="5040" w:hanging="360"/>
+      </w:pPr>
+      <w:rPr>
+        <w:rFonts w:ascii="Wingdings" w:hAnsi="Wingdings" w:hint="default"/>
+        <w:sz w:val="20"/>
+      </w:rPr>
+    </w:lvl>
+    <w:lvl w:ilvl="7" w:tentative="1">
+      <w:start w:val="1"/>
+      <w:numFmt w:val="bullet"/>
+      <w:lvlText w:val=""/>
+      <w:lvlJc w:val="left"/>
+      <w:pPr>
+        <w:tabs>
+          <w:tab w:val="num" w:pos="5760"/>
+        </w:tabs>
+        <w:ind w:left="5760" w:hanging="360"/>
+      </w:pPr>
+      <w:rPr>
+        <w:rFonts w:ascii="Wingdings" w:hAnsi="Wingdings" w:hint="default"/>
+        <w:sz w:val="20"/>
+      </w:rPr>
+    </w:lvl>
+    <w:lvl w:ilvl="8" w:tentative="1">
+      <w:start w:val="1"/>
+      <w:numFmt w:val="bullet"/>
+      <w:lvlText w:val=""/>
+      <w:lvlJc w:val="left"/>
+      <w:pPr>
+        <w:tabs>
+          <w:tab w:val="num" w:pos="6480"/>
+        </w:tabs>
+        <w:ind w:left="6480" w:hanging="360"/>
+      </w:pPr>
+      <w:rPr>
+        <w:rFonts w:ascii="Wingdings" w:hAnsi="Wingdings" w:hint="default"/>
+        <w:sz w:val="20"/>
+      </w:rPr>
+    </w:lvl>
+  </w:abstractNum>
+  <w:abstractNum w:abstractNumId="13" w15:restartNumberingAfterBreak="0">
     <w:nsid w:val="44E71089"/>
     <w:multiLevelType w:val="multilevel"/>
     <w:tmpl w:val="F4BC59B4"/>
@@ -5710,7 +6649,7 @@
       </w:rPr>
     </w:lvl>
   </w:abstractNum>
-  <w:abstractNum w:abstractNumId="12" w15:restartNumberingAfterBreak="0">
+  <w:abstractNum w:abstractNumId="14" w15:restartNumberingAfterBreak="0">
     <w:nsid w:val="4F652183"/>
     <w:multiLevelType w:val="multilevel"/>
     <w:tmpl w:val="BC827CFA"/>
@@ -5859,7 +6798,7 @@
       </w:rPr>
     </w:lvl>
   </w:abstractNum>
-  <w:abstractNum w:abstractNumId="13" w15:restartNumberingAfterBreak="0">
+  <w:abstractNum w:abstractNumId="15" w15:restartNumberingAfterBreak="0">
     <w:nsid w:val="57DF4F51"/>
     <w:multiLevelType w:val="multilevel"/>
     <w:tmpl w:val="44E8CCF8"/>
@@ -6004,7 +6943,7 @@
       </w:rPr>
     </w:lvl>
   </w:abstractNum>
-  <w:abstractNum w:abstractNumId="14" w15:restartNumberingAfterBreak="0">
+  <w:abstractNum w:abstractNumId="16" w15:restartNumberingAfterBreak="0">
     <w:nsid w:val="59387BDC"/>
     <w:multiLevelType w:val="multilevel"/>
     <w:tmpl w:val="FD647D40"/>
@@ -6153,7 +7092,7 @@
       </w:rPr>
     </w:lvl>
   </w:abstractNum>
-  <w:abstractNum w:abstractNumId="15" w15:restartNumberingAfterBreak="0">
+  <w:abstractNum w:abstractNumId="17" w15:restartNumberingAfterBreak="0">
     <w:nsid w:val="596827DA"/>
     <w:multiLevelType w:val="multilevel"/>
     <w:tmpl w:val="22626E4C"/>
@@ -6298,7 +7237,7 @@
       </w:rPr>
     </w:lvl>
   </w:abstractNum>
-  <w:abstractNum w:abstractNumId="16" w15:restartNumberingAfterBreak="0">
+  <w:abstractNum w:abstractNumId="18" w15:restartNumberingAfterBreak="0">
     <w:nsid w:val="5A3155E4"/>
     <w:multiLevelType w:val="multilevel"/>
     <w:tmpl w:val="A7EA3098"/>
@@ -6443,7 +7382,7 @@
       </w:rPr>
     </w:lvl>
   </w:abstractNum>
-  <w:abstractNum w:abstractNumId="17" w15:restartNumberingAfterBreak="0">
+  <w:abstractNum w:abstractNumId="19" w15:restartNumberingAfterBreak="0">
     <w:nsid w:val="5AEF4332"/>
     <w:multiLevelType w:val="multilevel"/>
     <w:tmpl w:val="319690FE"/>
@@ -6592,7 +7531,7 @@
       </w:rPr>
     </w:lvl>
   </w:abstractNum>
-  <w:abstractNum w:abstractNumId="18" w15:restartNumberingAfterBreak="0">
+  <w:abstractNum w:abstractNumId="20" w15:restartNumberingAfterBreak="0">
     <w:nsid w:val="5D03164B"/>
     <w:multiLevelType w:val="multilevel"/>
     <w:tmpl w:val="FA8C8E6C"/>
@@ -6741,7 +7680,156 @@
       </w:rPr>
     </w:lvl>
   </w:abstractNum>
-  <w:abstractNum w:abstractNumId="19" w15:restartNumberingAfterBreak="0">
+  <w:abstractNum w:abstractNumId="21" w15:restartNumberingAfterBreak="0">
+    <w:nsid w:val="659C4B51"/>
+    <w:multiLevelType w:val="multilevel"/>
+    <w:tmpl w:val="39D87F7A"/>
+    <w:lvl w:ilvl="0">
+      <w:start w:val="1"/>
+      <w:numFmt w:val="bullet"/>
+      <w:lvlText w:val=""/>
+      <w:lvlJc w:val="left"/>
+      <w:pPr>
+        <w:tabs>
+          <w:tab w:val="num" w:pos="720"/>
+        </w:tabs>
+        <w:ind w:left="720" w:hanging="360"/>
+      </w:pPr>
+      <w:rPr>
+        <w:rFonts w:ascii="Symbol" w:hAnsi="Symbol" w:hint="default"/>
+        <w:sz w:val="20"/>
+      </w:rPr>
+    </w:lvl>
+    <w:lvl w:ilvl="1" w:tentative="1">
+      <w:start w:val="1"/>
+      <w:numFmt w:val="bullet"/>
+      <w:lvlText w:val="o"/>
+      <w:lvlJc w:val="left"/>
+      <w:pPr>
+        <w:tabs>
+          <w:tab w:val="num" w:pos="1440"/>
+        </w:tabs>
+        <w:ind w:left="1440" w:hanging="360"/>
+      </w:pPr>
+      <w:rPr>
+        <w:rFonts w:ascii="Courier New" w:hAnsi="Courier New" w:hint="default"/>
+        <w:sz w:val="20"/>
+      </w:rPr>
+    </w:lvl>
+    <w:lvl w:ilvl="2" w:tentative="1">
+      <w:start w:val="1"/>
+      <w:numFmt w:val="bullet"/>
+      <w:lvlText w:val=""/>
+      <w:lvlJc w:val="left"/>
+      <w:pPr>
+        <w:tabs>
+          <w:tab w:val="num" w:pos="2160"/>
+        </w:tabs>
+        <w:ind w:left="2160" w:hanging="360"/>
+      </w:pPr>
+      <w:rPr>
+        <w:rFonts w:ascii="Wingdings" w:hAnsi="Wingdings" w:hint="default"/>
+        <w:sz w:val="20"/>
+      </w:rPr>
+    </w:lvl>
+    <w:lvl w:ilvl="3" w:tentative="1">
+      <w:start w:val="1"/>
+      <w:numFmt w:val="bullet"/>
+      <w:lvlText w:val=""/>
+      <w:lvlJc w:val="left"/>
+      <w:pPr>
+        <w:tabs>
+          <w:tab w:val="num" w:pos="2880"/>
+        </w:tabs>
+        <w:ind w:left="2880" w:hanging="360"/>
+      </w:pPr>
+      <w:rPr>
+        <w:rFonts w:ascii="Wingdings" w:hAnsi="Wingdings" w:hint="default"/>
+        <w:sz w:val="20"/>
+      </w:rPr>
+    </w:lvl>
+    <w:lvl w:ilvl="4" w:tentative="1">
+      <w:start w:val="1"/>
+      <w:numFmt w:val="bullet"/>
+      <w:lvlText w:val=""/>
+      <w:lvlJc w:val="left"/>
+      <w:pPr>
+        <w:tabs>
+          <w:tab w:val="num" w:pos="3600"/>
+        </w:tabs>
+        <w:ind w:left="3600" w:hanging="360"/>
+      </w:pPr>
+      <w:rPr>
+        <w:rFonts w:ascii="Wingdings" w:hAnsi="Wingdings" w:hint="default"/>
+        <w:sz w:val="20"/>
+      </w:rPr>
+    </w:lvl>
+    <w:lvl w:ilvl="5" w:tentative="1">
+      <w:start w:val="1"/>
+      <w:numFmt w:val="bullet"/>
+      <w:lvlText w:val=""/>
+      <w:lvlJc w:val="left"/>
+      <w:pPr>
+        <w:tabs>
+          <w:tab w:val="num" w:pos="4320"/>
+        </w:tabs>
+        <w:ind w:left="4320" w:hanging="360"/>
+      </w:pPr>
+      <w:rPr>
+        <w:rFonts w:ascii="Wingdings" w:hAnsi="Wingdings" w:hint="default"/>
+        <w:sz w:val="20"/>
+      </w:rPr>
+    </w:lvl>
+    <w:lvl w:ilvl="6" w:tentative="1">
+      <w:start w:val="1"/>
+      <w:numFmt w:val="bullet"/>
+      <w:lvlText w:val=""/>
+      <w:lvlJc w:val="left"/>
+      <w:pPr>
+        <w:tabs>
+          <w:tab w:val="num" w:pos="5040"/>
+        </w:tabs>
+        <w:ind w:left="5040" w:hanging="360"/>
+      </w:pPr>
+      <w:rPr>
+        <w:rFonts w:ascii="Wingdings" w:hAnsi="Wingdings" w:hint="default"/>
+        <w:sz w:val="20"/>
+      </w:rPr>
+    </w:lvl>
+    <w:lvl w:ilvl="7" w:tentative="1">
+      <w:start w:val="1"/>
+      <w:numFmt w:val="bullet"/>
+      <w:lvlText w:val=""/>
+      <w:lvlJc w:val="left"/>
+      <w:pPr>
+        <w:tabs>
+          <w:tab w:val="num" w:pos="5760"/>
+        </w:tabs>
+        <w:ind w:left="5760" w:hanging="360"/>
+      </w:pPr>
+      <w:rPr>
+        <w:rFonts w:ascii="Wingdings" w:hAnsi="Wingdings" w:hint="default"/>
+        <w:sz w:val="20"/>
+      </w:rPr>
+    </w:lvl>
+    <w:lvl w:ilvl="8" w:tentative="1">
+      <w:start w:val="1"/>
+      <w:numFmt w:val="bullet"/>
+      <w:lvlText w:val=""/>
+      <w:lvlJc w:val="left"/>
+      <w:pPr>
+        <w:tabs>
+          <w:tab w:val="num" w:pos="6480"/>
+        </w:tabs>
+        <w:ind w:left="6480" w:hanging="360"/>
+      </w:pPr>
+      <w:rPr>
+        <w:rFonts w:ascii="Wingdings" w:hAnsi="Wingdings" w:hint="default"/>
+        <w:sz w:val="20"/>
+      </w:rPr>
+    </w:lvl>
+  </w:abstractNum>
+  <w:abstractNum w:abstractNumId="22" w15:restartNumberingAfterBreak="0">
     <w:nsid w:val="6B4B59D2"/>
     <w:multiLevelType w:val="multilevel"/>
     <w:tmpl w:val="0BB0C054"/>
@@ -6890,7 +7978,7 @@
       </w:rPr>
     </w:lvl>
   </w:abstractNum>
-  <w:abstractNum w:abstractNumId="20" w15:restartNumberingAfterBreak="0">
+  <w:abstractNum w:abstractNumId="23" w15:restartNumberingAfterBreak="0">
     <w:nsid w:val="72C961FD"/>
     <w:multiLevelType w:val="multilevel"/>
     <w:tmpl w:val="EF00655A"/>
@@ -7036,28 +8124,28 @@
     </w:lvl>
   </w:abstractNum>
   <w:num w:numId="1" w16cid:durableId="1588222300">
+    <w:abstractNumId w:val="13"/>
+  </w:num>
+  <w:num w:numId="2" w16cid:durableId="2089687452">
+    <w:abstractNumId w:val="19"/>
+  </w:num>
+  <w:num w:numId="3" w16cid:durableId="397703464">
     <w:abstractNumId w:val="11"/>
   </w:num>
-  <w:num w:numId="2" w16cid:durableId="2089687452">
-    <w:abstractNumId w:val="17"/>
-  </w:num>
-  <w:num w:numId="3" w16cid:durableId="397703464">
-    <w:abstractNumId w:val="10"/>
-  </w:num>
   <w:num w:numId="4" w16cid:durableId="280382709">
-    <w:abstractNumId w:val="12"/>
+    <w:abstractNumId w:val="14"/>
   </w:num>
   <w:num w:numId="5" w16cid:durableId="1527674285">
     <w:abstractNumId w:val="7"/>
   </w:num>
   <w:num w:numId="6" w16cid:durableId="123810299">
-    <w:abstractNumId w:val="19"/>
+    <w:abstractNumId w:val="22"/>
   </w:num>
   <w:num w:numId="7" w16cid:durableId="2090272123">
-    <w:abstractNumId w:val="8"/>
+    <w:abstractNumId w:val="9"/>
   </w:num>
   <w:num w:numId="8" w16cid:durableId="439878419">
-    <w:abstractNumId w:val="18"/>
+    <w:abstractNumId w:val="20"/>
   </w:num>
   <w:num w:numId="9" w16cid:durableId="1099985614">
     <w:abstractNumId w:val="2"/>
@@ -7075,28 +8163,37 @@
     <w:abstractNumId w:val="6"/>
   </w:num>
   <w:num w:numId="14" w16cid:durableId="1670987982">
-    <w:abstractNumId w:val="20"/>
+    <w:abstractNumId w:val="23"/>
   </w:num>
   <w:num w:numId="15" w16cid:durableId="1381202660">
-    <w:abstractNumId w:val="16"/>
+    <w:abstractNumId w:val="18"/>
   </w:num>
   <w:num w:numId="16" w16cid:durableId="2020303109">
-    <w:abstractNumId w:val="13"/>
+    <w:abstractNumId w:val="15"/>
   </w:num>
   <w:num w:numId="17" w16cid:durableId="1607694605">
-    <w:abstractNumId w:val="15"/>
+    <w:abstractNumId w:val="17"/>
   </w:num>
   <w:num w:numId="18" w16cid:durableId="655645792">
-    <w:abstractNumId w:val="9"/>
+    <w:abstractNumId w:val="10"/>
   </w:num>
   <w:num w:numId="19" w16cid:durableId="1130517311">
     <w:abstractNumId w:val="3"/>
   </w:num>
   <w:num w:numId="20" w16cid:durableId="1141506554">
-    <w:abstractNumId w:val="14"/>
+    <w:abstractNumId w:val="16"/>
   </w:num>
   <w:num w:numId="21" w16cid:durableId="424542347">
     <w:abstractNumId w:val="1"/>
+  </w:num>
+  <w:num w:numId="22" w16cid:durableId="19356756">
+    <w:abstractNumId w:val="21"/>
+  </w:num>
+  <w:num w:numId="23" w16cid:durableId="2058040637">
+    <w:abstractNumId w:val="12"/>
+  </w:num>
+  <w:num w:numId="24" w16cid:durableId="527259456">
+    <w:abstractNumId w:val="8"/>
   </w:num>
 </w:numbering>
 </file>

</xml_diff>

<commit_message>
reports: Add Architecturaldiagram in subsection 4.2
</commit_message>
<xml_diff>
--- a/reports/report.docx
+++ b/reports/report.docx
@@ -4149,6 +4149,67 @@
     </w:p>
     <w:p>
       <w:pPr>
+        <w:spacing w:after="260" w:line="240" w:lineRule="auto"/>
+        <w:textAlignment w:val="baseline"/>
+        <w:rPr>
+          <w:rFonts w:ascii="Arial" w:eastAsia="Times New Roman" w:hAnsi="Arial" w:cs="Arial"/>
+          <w:color w:val="000000"/>
+          <w:kern w:val="0"/>
+          <w14:ligatures w14:val="none"/>
+        </w:rPr>
+      </w:pPr>
+      <w:r>
+        <w:rPr>
+          <w:rFonts w:ascii="Arial" w:eastAsia="Times New Roman" w:hAnsi="Arial" w:cs="Arial"/>
+          <w:noProof/>
+          <w:color w:val="000000"/>
+          <w:kern w:val="0"/>
+        </w:rPr>
+        <w:drawing>
+          <wp:inline distT="0" distB="0" distL="0" distR="0" wp14:anchorId="02C5F159" wp14:editId="7429056F">
+            <wp:extent cx="5943600" cy="2390775"/>
+            <wp:effectExtent l="0" t="0" r="0" b="9525"/>
+            <wp:docPr id="1394108638" name="Picture 1"/>
+            <wp:cNvGraphicFramePr>
+              <a:graphicFrameLocks xmlns:a="http://schemas.openxmlformats.org/drawingml/2006/main" noChangeAspect="1"/>
+            </wp:cNvGraphicFramePr>
+            <a:graphic xmlns:a="http://schemas.openxmlformats.org/drawingml/2006/main">
+              <a:graphicData uri="http://schemas.openxmlformats.org/drawingml/2006/picture">
+                <pic:pic xmlns:pic="http://schemas.openxmlformats.org/drawingml/2006/picture">
+                  <pic:nvPicPr>
+                    <pic:cNvPr id="1394108638" name="Picture 1394108638"/>
+                    <pic:cNvPicPr/>
+                  </pic:nvPicPr>
+                  <pic:blipFill>
+                    <a:blip r:embed="rId7" cstate="print">
+                      <a:extLst>
+                        <a:ext uri="{28A0092B-C50C-407E-A947-70E740481C1C}">
+                          <a14:useLocalDpi xmlns:a14="http://schemas.microsoft.com/office/drawing/2010/main" val="0"/>
+                        </a:ext>
+                      </a:extLst>
+                    </a:blip>
+                    <a:stretch>
+                      <a:fillRect/>
+                    </a:stretch>
+                  </pic:blipFill>
+                  <pic:spPr>
+                    <a:xfrm>
+                      <a:off x="0" y="0"/>
+                      <a:ext cx="5943600" cy="2390775"/>
+                    </a:xfrm>
+                    <a:prstGeom prst="rect">
+                      <a:avLst/>
+                    </a:prstGeom>
+                  </pic:spPr>
+                </pic:pic>
+              </a:graphicData>
+            </a:graphic>
+          </wp:inline>
+        </w:drawing>
+      </w:r>
+    </w:p>
+    <w:p>
+      <w:pPr>
         <w:spacing w:before="280" w:after="80" w:line="240" w:lineRule="auto"/>
         <w:outlineLvl w:val="2"/>
         <w:rPr>
@@ -4343,6 +4404,7 @@
           <w:kern w:val="0"/>
           <w14:ligatures w14:val="none"/>
         </w:rPr>
+        <w:lastRenderedPageBreak/>
         <w:t>Hardware</w:t>
       </w:r>
       <w:r>
@@ -4554,7 +4616,6 @@
           <w:kern w:val="0"/>
           <w14:ligatures w14:val="none"/>
         </w:rPr>
-        <w:lastRenderedPageBreak/>
         <w:t>Reusability</w:t>
       </w:r>
       <w:r>

</xml_diff>

<commit_message>
reports: Add initial draft for Design.
</commit_message>
<xml_diff>
--- a/reports/report.docx
+++ b/reports/report.docx
@@ -1,6 +1,6 @@
 
 <file path=word/document.xml><?xml version="1.0" encoding="utf-8"?>
-<w:document xmlns:wpc="http://schemas.microsoft.com/office/word/2010/wordprocessingCanvas" xmlns:cx="http://schemas.microsoft.com/office/drawing/2014/chartex" xmlns:cx1="http://schemas.microsoft.com/office/drawing/2015/9/8/chartex" xmlns:cx2="http://schemas.microsoft.com/office/drawing/2015/10/21/chartex" xmlns:cx3="http://schemas.microsoft.com/office/drawing/2016/5/9/chartex" xmlns:cx4="http://schemas.microsoft.com/office/drawing/2016/5/10/chartex" xmlns:cx5="http://schemas.microsoft.com/office/drawing/2016/5/11/chartex" xmlns:cx6="http://schemas.microsoft.com/office/drawing/2016/5/12/chartex" xmlns:cx7="http://schemas.microsoft.com/office/drawing/2016/5/13/chartex" xmlns:cx8="http://schemas.microsoft.com/office/drawing/2016/5/14/chartex" xmlns:mc="http://schemas.openxmlformats.org/markup-compatibility/2006" xmlns:aink="http://schemas.microsoft.com/office/drawing/2016/ink" xmlns:am3d="http://schemas.microsoft.com/office/drawing/2017/model3d" xmlns:o="urn:schemas-microsoft-com:office:office" xmlns:oel="http://schemas.microsoft.com/office/2019/extlst" xmlns:r="http://schemas.openxmlformats.org/officeDocument/2006/relationships" xmlns:m="http://schemas.openxmlformats.org/officeDocument/2006/math" xmlns:v="urn:schemas-microsoft-com:vml" xmlns:wp14="http://schemas.microsoft.com/office/word/2010/wordprocessingDrawing" xmlns:wp="http://schemas.openxmlformats.org/drawingml/2006/wordprocessingDrawing" xmlns:w10="urn:schemas-microsoft-com:office:word" xmlns:w="http://schemas.openxmlformats.org/wordprocessingml/2006/main" xmlns:w14="http://schemas.microsoft.com/office/word/2010/wordml" xmlns:w15="http://schemas.microsoft.com/office/word/2012/wordml" xmlns:w16cex="http://schemas.microsoft.com/office/word/2018/wordml/cex" xmlns:w16cid="http://schemas.microsoft.com/office/word/2016/wordml/cid" xmlns:w16="http://schemas.microsoft.com/office/word/2018/wordml" xmlns:w16du="http://schemas.microsoft.com/office/word/2023/wordml/word16du" xmlns:w16sdtdh="http://schemas.microsoft.com/office/word/2020/wordml/sdtdatahash" xmlns:w16sdtfl="http://schemas.microsoft.com/office/word/2024/wordml/sdtformatlock" xmlns:w16se="http://schemas.microsoft.com/office/word/2015/wordml/symex" xmlns:wpg="http://schemas.microsoft.com/office/word/2010/wordprocessingGroup" xmlns:wpi="http://schemas.microsoft.com/office/word/2010/wordprocessingInk" xmlns:wne="http://schemas.microsoft.com/office/word/2006/wordml" xmlns:wps="http://schemas.microsoft.com/office/word/2010/wordprocessingShape" mc:Ignorable="w14 w15 w16se w16cid w16 w16cex w16sdtdh w16sdtfl w16du wp14">
+<w:document xmlns:wpc="http://schemas.microsoft.com/office/word/2010/wordprocessingCanvas" xmlns:cx="http://schemas.microsoft.com/office/drawing/2014/chartex" xmlns:cx1="http://schemas.microsoft.com/office/drawing/2015/9/8/chartex" xmlns:cx2="http://schemas.microsoft.com/office/drawing/2015/10/21/chartex" xmlns:cx3="http://schemas.microsoft.com/office/drawing/2016/5/9/chartex" xmlns:cx4="http://schemas.microsoft.com/office/drawing/2016/5/10/chartex" xmlns:cx5="http://schemas.microsoft.com/office/drawing/2016/5/11/chartex" xmlns:cx6="http://schemas.microsoft.com/office/drawing/2016/5/12/chartex" xmlns:cx7="http://schemas.microsoft.com/office/drawing/2016/5/13/chartex" xmlns:cx8="http://schemas.microsoft.com/office/drawing/2016/5/14/chartex" xmlns:mc="http://schemas.openxmlformats.org/markup-compatibility/2006" xmlns:aink="http://schemas.microsoft.com/office/drawing/2016/ink" xmlns:am3d="http://schemas.microsoft.com/office/drawing/2017/model3d" xmlns:o="urn:schemas-microsoft-com:office:office" xmlns:oel="http://schemas.microsoft.com/office/2019/extlst" xmlns:r="http://schemas.openxmlformats.org/officeDocument/2006/relationships" xmlns:m="http://schemas.openxmlformats.org/officeDocument/2006/math" xmlns:v="urn:schemas-microsoft-com:vml" xmlns:wp14="http://schemas.microsoft.com/office/word/2010/wordprocessingDrawing" xmlns:wp="http://schemas.openxmlformats.org/drawingml/2006/wordprocessingDrawing" xmlns:w10="urn:schemas-microsoft-com:office:word" xmlns:w="http://schemas.openxmlformats.org/wordprocessingml/2006/main" xmlns:w14="http://schemas.microsoft.com/office/word/2010/wordml" xmlns:w15="http://schemas.microsoft.com/office/word/2012/wordml" xmlns:w16cex="http://schemas.microsoft.com/office/word/2018/wordml/cex" xmlns:w16cid="http://schemas.microsoft.com/office/word/2016/wordml/cid" xmlns:w16="http://schemas.microsoft.com/office/word/2018/wordml" xmlns:w16du="http://schemas.microsoft.com/office/word/2023/wordml/word16du" xmlns:w16sdtdh="http://schemas.microsoft.com/office/word/2020/wordml/sdtdatahash" xmlns:w16se="http://schemas.microsoft.com/office/word/2015/wordml/symex" xmlns:wpg="http://schemas.microsoft.com/office/word/2010/wordprocessingGroup" xmlns:wpi="http://schemas.microsoft.com/office/word/2010/wordprocessingInk" xmlns:wne="http://schemas.microsoft.com/office/word/2006/wordml" xmlns:wps="http://schemas.microsoft.com/office/word/2010/wordprocessingShape" mc:Ignorable="w14 w15 w16se w16cid w16 w16cex w16sdtdh wp14">
   <w:body>
     <w:p>
       <w:pPr>
@@ -591,7 +591,27 @@
           <w:kern w:val="0"/>
           <w14:ligatures w14:val="none"/>
         </w:rPr>
-        <w:t>: Trần Quang Duy – Overall coordination and Database design.</w:t>
+        <w:t xml:space="preserve">: </w:t>
+      </w:r>
+      <w:proofErr w:type="spellStart"/>
+      <w:r>
+        <w:rPr>
+          <w:rFonts w:ascii="Arial" w:eastAsia="Times New Roman" w:hAnsi="Arial" w:cs="Arial"/>
+          <w:color w:val="000000"/>
+          <w:kern w:val="0"/>
+          <w14:ligatures w14:val="none"/>
+        </w:rPr>
+        <w:t>Trần</w:t>
+      </w:r>
+      <w:proofErr w:type="spellEnd"/>
+      <w:r>
+        <w:rPr>
+          <w:rFonts w:ascii="Arial" w:eastAsia="Times New Roman" w:hAnsi="Arial" w:cs="Arial"/>
+          <w:color w:val="000000"/>
+          <w:kern w:val="0"/>
+          <w14:ligatures w14:val="none"/>
+        </w:rPr>
+        <w:t xml:space="preserve"> Quang Duy – Overall coordination and Database design.</w:t>
       </w:r>
     </w:p>
     <w:p>
@@ -628,7 +648,47 @@
           <w:kern w:val="0"/>
           <w14:ligatures w14:val="none"/>
         </w:rPr>
-        <w:t>: Lý Tín Hòa – Controller logic and Business rules.</w:t>
+        <w:t xml:space="preserve">: Lý </w:t>
+      </w:r>
+      <w:proofErr w:type="spellStart"/>
+      <w:r>
+        <w:rPr>
+          <w:rFonts w:ascii="Arial" w:eastAsia="Times New Roman" w:hAnsi="Arial" w:cs="Arial"/>
+          <w:color w:val="000000"/>
+          <w:kern w:val="0"/>
+          <w14:ligatures w14:val="none"/>
+        </w:rPr>
+        <w:t>Tín</w:t>
+      </w:r>
+      <w:proofErr w:type="spellEnd"/>
+      <w:r>
+        <w:rPr>
+          <w:rFonts w:ascii="Arial" w:eastAsia="Times New Roman" w:hAnsi="Arial" w:cs="Arial"/>
+          <w:color w:val="000000"/>
+          <w:kern w:val="0"/>
+          <w14:ligatures w14:val="none"/>
+        </w:rPr>
+        <w:t xml:space="preserve"> </w:t>
+      </w:r>
+      <w:proofErr w:type="spellStart"/>
+      <w:r>
+        <w:rPr>
+          <w:rFonts w:ascii="Arial" w:eastAsia="Times New Roman" w:hAnsi="Arial" w:cs="Arial"/>
+          <w:color w:val="000000"/>
+          <w:kern w:val="0"/>
+          <w14:ligatures w14:val="none"/>
+        </w:rPr>
+        <w:t>Hòa</w:t>
+      </w:r>
+      <w:proofErr w:type="spellEnd"/>
+      <w:r>
+        <w:rPr>
+          <w:rFonts w:ascii="Arial" w:eastAsia="Times New Roman" w:hAnsi="Arial" w:cs="Arial"/>
+          <w:color w:val="000000"/>
+          <w:kern w:val="0"/>
+          <w14:ligatures w14:val="none"/>
+        </w:rPr>
+        <w:t xml:space="preserve"> – Controller logic and Business rules.</w:t>
       </w:r>
     </w:p>
     <w:p>
@@ -664,7 +724,27 @@
           <w:kern w:val="0"/>
           <w14:ligatures w14:val="none"/>
         </w:rPr>
-        <w:t>:  Hà Dư Tuấn – UI/UX design and Frontend implementation.</w:t>
+        <w:t xml:space="preserve">:  Hà </w:t>
+      </w:r>
+      <w:proofErr w:type="spellStart"/>
+      <w:r>
+        <w:rPr>
+          <w:rFonts w:ascii="Arial" w:eastAsia="Times New Roman" w:hAnsi="Arial" w:cs="Arial"/>
+          <w:color w:val="000000"/>
+          <w:kern w:val="0"/>
+          <w14:ligatures w14:val="none"/>
+        </w:rPr>
+        <w:t>Dư</w:t>
+      </w:r>
+      <w:proofErr w:type="spellEnd"/>
+      <w:r>
+        <w:rPr>
+          <w:rFonts w:ascii="Arial" w:eastAsia="Times New Roman" w:hAnsi="Arial" w:cs="Arial"/>
+          <w:color w:val="000000"/>
+          <w:kern w:val="0"/>
+          <w14:ligatures w14:val="none"/>
+        </w:rPr>
+        <w:t xml:space="preserve"> Tuấn – UI/UX design and Frontend implementation.</w:t>
       </w:r>
     </w:p>
     <w:p>
@@ -1234,7 +1314,27 @@
           <w:kern w:val="0"/>
           <w14:ligatures w14:val="none"/>
         </w:rPr>
-        <w:t>The project adheres to C# Coding Conventions (PascalCase for methods, camelCase for variables) and IEEE standards for technical documentation.</w:t>
+        <w:t>The project adheres to C# Coding Conventions (</w:t>
+      </w:r>
+      <w:proofErr w:type="spellStart"/>
+      <w:r>
+        <w:rPr>
+          <w:rFonts w:ascii="Arial" w:eastAsia="Times New Roman" w:hAnsi="Arial" w:cs="Arial"/>
+          <w:color w:val="000000"/>
+          <w:kern w:val="0"/>
+          <w14:ligatures w14:val="none"/>
+        </w:rPr>
+        <w:t>PascalCase</w:t>
+      </w:r>
+      <w:proofErr w:type="spellEnd"/>
+      <w:r>
+        <w:rPr>
+          <w:rFonts w:ascii="Arial" w:eastAsia="Times New Roman" w:hAnsi="Arial" w:cs="Arial"/>
+          <w:color w:val="000000"/>
+          <w:kern w:val="0"/>
+          <w14:ligatures w14:val="none"/>
+        </w:rPr>
+        <w:t xml:space="preserve"> for methods, camelCase for variables) and IEEE standards for technical documentation.</w:t>
       </w:r>
     </w:p>
     <w:p>
@@ -4628,6 +4728,1322 @@
         <w:t>: Business logic defined in the Model can be reused across different forms within the application.</w:t>
       </w:r>
     </w:p>
+    <w:p>
+      <w:pPr>
+        <w:spacing w:after="260" w:line="240" w:lineRule="auto"/>
+        <w:ind w:left="720"/>
+        <w:textAlignment w:val="baseline"/>
+        <w:rPr>
+          <w:rFonts w:ascii="Arial" w:eastAsia="Times New Roman" w:hAnsi="Arial" w:cs="Arial"/>
+          <w:color w:val="000000"/>
+          <w:kern w:val="0"/>
+          <w14:ligatures w14:val="none"/>
+        </w:rPr>
+      </w:pPr>
+    </w:p>
+    <w:p>
+      <w:pPr>
+        <w:pStyle w:val="Heading1"/>
+        <w:spacing w:before="260" w:after="260"/>
+      </w:pPr>
+      <w:r>
+        <w:rPr>
+          <w:rFonts w:ascii="Arial" w:hAnsi="Arial" w:cs="Arial"/>
+          <w:color w:val="000000"/>
+          <w:sz w:val="46"/>
+          <w:szCs w:val="46"/>
+        </w:rPr>
+        <w:t>5. Design</w:t>
+      </w:r>
+    </w:p>
+    <w:p>
+      <w:pPr>
+        <w:pStyle w:val="Heading3"/>
+        <w:spacing w:before="0"/>
+        <w:rPr>
+          <w:rFonts w:ascii="Arial" w:eastAsia="Times New Roman" w:hAnsi="Arial" w:cs="Arial"/>
+          <w:b/>
+          <w:bCs/>
+          <w:color w:val="000000"/>
+          <w:kern w:val="0"/>
+          <w:sz w:val="26"/>
+          <w:szCs w:val="26"/>
+          <w14:ligatures w14:val="none"/>
+        </w:rPr>
+      </w:pPr>
+      <w:r>
+        <w:rPr>
+          <w:rFonts w:ascii="Arial" w:eastAsia="Times New Roman" w:hAnsi="Arial" w:cs="Arial"/>
+          <w:b/>
+          <w:bCs/>
+          <w:color w:val="000000"/>
+          <w:kern w:val="0"/>
+          <w:sz w:val="26"/>
+          <w:szCs w:val="26"/>
+          <w14:ligatures w14:val="none"/>
+        </w:rPr>
+        <w:t>5.1. Database design</w:t>
+      </w:r>
+    </w:p>
+    <w:p>
+      <w:pPr>
+        <w:pStyle w:val="NormalWeb"/>
+        <w:spacing w:before="0" w:beforeAutospacing="0" w:after="260" w:afterAutospacing="0"/>
+      </w:pPr>
+      <w:r>
+        <w:rPr>
+          <w:rFonts w:ascii="Arial" w:hAnsi="Arial" w:cs="Arial"/>
+          <w:color w:val="000000"/>
+        </w:rPr>
+        <w:t>The relational database schema is designed to support all 8 use cases defined in the requirements. The core tables include:</w:t>
+      </w:r>
+    </w:p>
+    <w:p>
+      <w:pPr>
+        <w:pStyle w:val="NormalWeb"/>
+        <w:numPr>
+          <w:ilvl w:val="0"/>
+          <w:numId w:val="30"/>
+        </w:numPr>
+        <w:spacing w:before="0" w:beforeAutospacing="0" w:after="0" w:afterAutospacing="0"/>
+        <w:textAlignment w:val="baseline"/>
+        <w:rPr>
+          <w:rFonts w:ascii="Arial" w:hAnsi="Arial" w:cs="Arial"/>
+          <w:color w:val="000000"/>
+        </w:rPr>
+      </w:pPr>
+      <w:r>
+        <w:rPr>
+          <w:rFonts w:ascii="Arial" w:hAnsi="Arial" w:cs="Arial"/>
+          <w:b/>
+          <w:bCs/>
+          <w:color w:val="000000"/>
+        </w:rPr>
+        <w:t>Staff</w:t>
+      </w:r>
+      <w:r>
+        <w:rPr>
+          <w:rFonts w:ascii="Arial" w:hAnsi="Arial" w:cs="Arial"/>
+          <w:color w:val="000000"/>
+        </w:rPr>
+        <w:t xml:space="preserve">: Stores credentials and roles (Manager, Sales, Inventory) to support </w:t>
+      </w:r>
+      <w:r>
+        <w:rPr>
+          <w:rFonts w:ascii="Arial" w:hAnsi="Arial" w:cs="Arial"/>
+          <w:b/>
+          <w:bCs/>
+          <w:color w:val="000000"/>
+        </w:rPr>
+        <w:t>Login</w:t>
+      </w:r>
+      <w:r>
+        <w:rPr>
+          <w:rFonts w:ascii="Arial" w:hAnsi="Arial" w:cs="Arial"/>
+          <w:color w:val="000000"/>
+        </w:rPr>
+        <w:t xml:space="preserve"> and </w:t>
+      </w:r>
+      <w:r>
+        <w:rPr>
+          <w:rFonts w:ascii="Arial" w:hAnsi="Arial" w:cs="Arial"/>
+          <w:b/>
+          <w:bCs/>
+          <w:color w:val="000000"/>
+        </w:rPr>
+        <w:t>Employee Management</w:t>
+      </w:r>
+      <w:r>
+        <w:rPr>
+          <w:rFonts w:ascii="Arial" w:hAnsi="Arial" w:cs="Arial"/>
+          <w:color w:val="000000"/>
+        </w:rPr>
+        <w:t>.</w:t>
+      </w:r>
+    </w:p>
+    <w:p>
+      <w:pPr>
+        <w:pStyle w:val="NormalWeb"/>
+        <w:numPr>
+          <w:ilvl w:val="0"/>
+          <w:numId w:val="30"/>
+        </w:numPr>
+        <w:spacing w:before="0" w:beforeAutospacing="0" w:after="0" w:afterAutospacing="0"/>
+        <w:textAlignment w:val="baseline"/>
+        <w:rPr>
+          <w:rFonts w:ascii="Arial" w:hAnsi="Arial" w:cs="Arial"/>
+          <w:color w:val="000000"/>
+        </w:rPr>
+      </w:pPr>
+      <w:r>
+        <w:rPr>
+          <w:rFonts w:ascii="Arial" w:hAnsi="Arial" w:cs="Arial"/>
+          <w:b/>
+          <w:bCs/>
+          <w:color w:val="000000"/>
+        </w:rPr>
+        <w:t>Products</w:t>
+      </w:r>
+      <w:r>
+        <w:rPr>
+          <w:rFonts w:ascii="Arial" w:hAnsi="Arial" w:cs="Arial"/>
+          <w:color w:val="000000"/>
+        </w:rPr>
+        <w:t xml:space="preserve">: Contains technical specifications and stock quantities to support </w:t>
+      </w:r>
+      <w:r>
+        <w:rPr>
+          <w:rFonts w:ascii="Arial" w:hAnsi="Arial" w:cs="Arial"/>
+          <w:b/>
+          <w:bCs/>
+          <w:color w:val="000000"/>
+        </w:rPr>
+        <w:t>Inventory Management</w:t>
+      </w:r>
+      <w:r>
+        <w:rPr>
+          <w:rFonts w:ascii="Arial" w:hAnsi="Arial" w:cs="Arial"/>
+          <w:color w:val="000000"/>
+        </w:rPr>
+        <w:t xml:space="preserve"> and </w:t>
+      </w:r>
+      <w:r>
+        <w:rPr>
+          <w:rFonts w:ascii="Arial" w:hAnsi="Arial" w:cs="Arial"/>
+          <w:b/>
+          <w:bCs/>
+          <w:color w:val="000000"/>
+        </w:rPr>
+        <w:t>Hardware Tracking</w:t>
+      </w:r>
+      <w:r>
+        <w:rPr>
+          <w:rFonts w:ascii="Arial" w:hAnsi="Arial" w:cs="Arial"/>
+          <w:color w:val="000000"/>
+        </w:rPr>
+        <w:t>.</w:t>
+      </w:r>
+    </w:p>
+    <w:p>
+      <w:pPr>
+        <w:pStyle w:val="NormalWeb"/>
+        <w:numPr>
+          <w:ilvl w:val="0"/>
+          <w:numId w:val="30"/>
+        </w:numPr>
+        <w:spacing w:before="0" w:beforeAutospacing="0" w:after="0" w:afterAutospacing="0"/>
+        <w:textAlignment w:val="baseline"/>
+        <w:rPr>
+          <w:rFonts w:ascii="Arial" w:hAnsi="Arial" w:cs="Arial"/>
+          <w:color w:val="000000"/>
+        </w:rPr>
+      </w:pPr>
+      <w:r>
+        <w:rPr>
+          <w:rFonts w:ascii="Arial" w:hAnsi="Arial" w:cs="Arial"/>
+          <w:b/>
+          <w:bCs/>
+          <w:color w:val="000000"/>
+        </w:rPr>
+        <w:t>Customers</w:t>
+      </w:r>
+      <w:r>
+        <w:rPr>
+          <w:rFonts w:ascii="Arial" w:hAnsi="Arial" w:cs="Arial"/>
+          <w:color w:val="000000"/>
+        </w:rPr>
+        <w:t xml:space="preserve">: Stores profiles and contact info for the </w:t>
+      </w:r>
+      <w:r>
+        <w:rPr>
+          <w:rFonts w:ascii="Arial" w:hAnsi="Arial" w:cs="Arial"/>
+          <w:b/>
+          <w:bCs/>
+          <w:color w:val="000000"/>
+        </w:rPr>
+        <w:t>Customer Management</w:t>
+      </w:r>
+      <w:r>
+        <w:rPr>
+          <w:rFonts w:ascii="Arial" w:hAnsi="Arial" w:cs="Arial"/>
+          <w:color w:val="000000"/>
+        </w:rPr>
+        <w:t xml:space="preserve"> module.</w:t>
+      </w:r>
+    </w:p>
+    <w:p>
+      <w:pPr>
+        <w:pStyle w:val="NormalWeb"/>
+        <w:numPr>
+          <w:ilvl w:val="0"/>
+          <w:numId w:val="30"/>
+        </w:numPr>
+        <w:spacing w:before="0" w:beforeAutospacing="0" w:after="260" w:afterAutospacing="0"/>
+        <w:textAlignment w:val="baseline"/>
+        <w:rPr>
+          <w:rFonts w:ascii="Arial" w:hAnsi="Arial" w:cs="Arial"/>
+          <w:color w:val="000000"/>
+        </w:rPr>
+      </w:pPr>
+      <w:r>
+        <w:rPr>
+          <w:rFonts w:ascii="Arial" w:hAnsi="Arial" w:cs="Arial"/>
+          <w:b/>
+          <w:bCs/>
+          <w:color w:val="000000"/>
+        </w:rPr>
+        <w:t xml:space="preserve">Invoices &amp; </w:t>
+      </w:r>
+      <w:proofErr w:type="spellStart"/>
+      <w:r>
+        <w:rPr>
+          <w:rFonts w:ascii="Arial" w:hAnsi="Arial" w:cs="Arial"/>
+          <w:b/>
+          <w:bCs/>
+          <w:color w:val="000000"/>
+        </w:rPr>
+        <w:t>InvoiceDetails</w:t>
+      </w:r>
+      <w:proofErr w:type="spellEnd"/>
+      <w:r>
+        <w:rPr>
+          <w:rFonts w:ascii="Arial" w:hAnsi="Arial" w:cs="Arial"/>
+          <w:color w:val="000000"/>
+        </w:rPr>
+        <w:t xml:space="preserve">: Records all transaction data generated by the </w:t>
+      </w:r>
+      <w:r>
+        <w:rPr>
+          <w:rFonts w:ascii="Arial" w:hAnsi="Arial" w:cs="Arial"/>
+          <w:b/>
+          <w:bCs/>
+          <w:color w:val="000000"/>
+        </w:rPr>
+        <w:t>Sales Processing</w:t>
+      </w:r>
+      <w:r>
+        <w:rPr>
+          <w:rFonts w:ascii="Arial" w:hAnsi="Arial" w:cs="Arial"/>
+          <w:color w:val="000000"/>
+        </w:rPr>
+        <w:t xml:space="preserve"> function.</w:t>
+      </w:r>
+    </w:p>
+    <w:p>
+      <w:pPr>
+        <w:pStyle w:val="Heading3"/>
+        <w:spacing w:before="0"/>
+        <w:rPr>
+          <w:rFonts w:ascii="Arial" w:eastAsia="Times New Roman" w:hAnsi="Arial" w:cs="Arial"/>
+          <w:b/>
+          <w:bCs/>
+          <w:color w:val="000000"/>
+          <w:kern w:val="0"/>
+          <w:sz w:val="26"/>
+          <w:szCs w:val="26"/>
+          <w14:ligatures w14:val="none"/>
+        </w:rPr>
+      </w:pPr>
+      <w:r>
+        <w:rPr>
+          <w:rFonts w:ascii="Arial" w:eastAsia="Times New Roman" w:hAnsi="Arial" w:cs="Arial"/>
+          <w:b/>
+          <w:bCs/>
+          <w:color w:val="000000"/>
+          <w:kern w:val="0"/>
+          <w:sz w:val="26"/>
+          <w:szCs w:val="26"/>
+          <w14:ligatures w14:val="none"/>
+        </w:rPr>
+        <w:t>5.2. Static model - class diagrams</w:t>
+      </w:r>
+    </w:p>
+    <w:p>
+      <w:pPr>
+        <w:pStyle w:val="NormalWeb"/>
+        <w:spacing w:before="0" w:beforeAutospacing="0" w:after="260" w:afterAutospacing="0"/>
+      </w:pPr>
+      <w:r>
+        <w:rPr>
+          <w:rFonts w:ascii="Arial" w:hAnsi="Arial" w:cs="Arial"/>
+          <w:color w:val="000000"/>
+        </w:rPr>
+        <w:t>The class diagram follows the MVC pattern to ensure a clean separation of concerns:</w:t>
+      </w:r>
+    </w:p>
+    <w:p>
+      <w:pPr>
+        <w:pStyle w:val="NormalWeb"/>
+        <w:numPr>
+          <w:ilvl w:val="0"/>
+          <w:numId w:val="31"/>
+        </w:numPr>
+        <w:spacing w:before="0" w:beforeAutospacing="0" w:after="0" w:afterAutospacing="0"/>
+        <w:textAlignment w:val="baseline"/>
+        <w:rPr>
+          <w:rFonts w:ascii="Arial" w:hAnsi="Arial" w:cs="Arial"/>
+          <w:color w:val="000000"/>
+        </w:rPr>
+      </w:pPr>
+      <w:r>
+        <w:rPr>
+          <w:rFonts w:ascii="Arial" w:hAnsi="Arial" w:cs="Arial"/>
+          <w:b/>
+          <w:bCs/>
+          <w:color w:val="000000"/>
+        </w:rPr>
+        <w:t>Entities (Model)</w:t>
+      </w:r>
+      <w:r>
+        <w:rPr>
+          <w:rFonts w:ascii="Arial" w:hAnsi="Arial" w:cs="Arial"/>
+          <w:color w:val="000000"/>
+        </w:rPr>
+        <w:t xml:space="preserve">: Staff, Product, Customer, Invoice, and </w:t>
+      </w:r>
+      <w:proofErr w:type="spellStart"/>
+      <w:r>
+        <w:rPr>
+          <w:rFonts w:ascii="Arial" w:hAnsi="Arial" w:cs="Arial"/>
+          <w:color w:val="000000"/>
+        </w:rPr>
+        <w:t>HardwareSpec</w:t>
+      </w:r>
+      <w:proofErr w:type="spellEnd"/>
+      <w:r>
+        <w:rPr>
+          <w:rFonts w:ascii="Arial" w:hAnsi="Arial" w:cs="Arial"/>
+          <w:color w:val="000000"/>
+        </w:rPr>
+        <w:t>.</w:t>
+      </w:r>
+    </w:p>
+    <w:p>
+      <w:pPr>
+        <w:pStyle w:val="NormalWeb"/>
+        <w:numPr>
+          <w:ilvl w:val="0"/>
+          <w:numId w:val="31"/>
+        </w:numPr>
+        <w:spacing w:before="0" w:beforeAutospacing="0" w:after="0" w:afterAutospacing="0"/>
+        <w:textAlignment w:val="baseline"/>
+        <w:rPr>
+          <w:rFonts w:ascii="Arial" w:hAnsi="Arial" w:cs="Arial"/>
+          <w:color w:val="000000"/>
+        </w:rPr>
+      </w:pPr>
+      <w:r>
+        <w:rPr>
+          <w:rFonts w:ascii="Arial" w:hAnsi="Arial" w:cs="Arial"/>
+          <w:b/>
+          <w:bCs/>
+          <w:color w:val="000000"/>
+        </w:rPr>
+        <w:t>Controllers</w:t>
+      </w:r>
+      <w:r>
+        <w:rPr>
+          <w:rFonts w:ascii="Arial" w:hAnsi="Arial" w:cs="Arial"/>
+          <w:color w:val="000000"/>
+        </w:rPr>
+        <w:t>:</w:t>
+      </w:r>
+    </w:p>
+    <w:p>
+      <w:pPr>
+        <w:pStyle w:val="NormalWeb"/>
+        <w:numPr>
+          <w:ilvl w:val="1"/>
+          <w:numId w:val="31"/>
+        </w:numPr>
+        <w:spacing w:before="0" w:beforeAutospacing="0" w:after="0" w:afterAutospacing="0"/>
+        <w:textAlignment w:val="baseline"/>
+        <w:rPr>
+          <w:rFonts w:ascii="Arial" w:hAnsi="Arial" w:cs="Arial"/>
+          <w:color w:val="000000"/>
+        </w:rPr>
+      </w:pPr>
+      <w:proofErr w:type="spellStart"/>
+      <w:r>
+        <w:rPr>
+          <w:rFonts w:ascii="Arial" w:hAnsi="Arial" w:cs="Arial"/>
+          <w:color w:val="000000"/>
+        </w:rPr>
+        <w:t>AccountController</w:t>
+      </w:r>
+      <w:proofErr w:type="spellEnd"/>
+      <w:r>
+        <w:rPr>
+          <w:rFonts w:ascii="Arial" w:hAnsi="Arial" w:cs="Arial"/>
+          <w:color w:val="000000"/>
+        </w:rPr>
+        <w:t>: Handles Login/Logout and Employee CRUD.</w:t>
+      </w:r>
+    </w:p>
+    <w:p>
+      <w:pPr>
+        <w:pStyle w:val="NormalWeb"/>
+        <w:numPr>
+          <w:ilvl w:val="1"/>
+          <w:numId w:val="31"/>
+        </w:numPr>
+        <w:spacing w:before="0" w:beforeAutospacing="0" w:after="0" w:afterAutospacing="0"/>
+        <w:textAlignment w:val="baseline"/>
+        <w:rPr>
+          <w:rFonts w:ascii="Arial" w:hAnsi="Arial" w:cs="Arial"/>
+          <w:color w:val="000000"/>
+        </w:rPr>
+      </w:pPr>
+      <w:proofErr w:type="spellStart"/>
+      <w:r>
+        <w:rPr>
+          <w:rFonts w:ascii="Arial" w:hAnsi="Arial" w:cs="Arial"/>
+          <w:color w:val="000000"/>
+        </w:rPr>
+        <w:t>SalesController</w:t>
+      </w:r>
+      <w:proofErr w:type="spellEnd"/>
+      <w:r>
+        <w:rPr>
+          <w:rFonts w:ascii="Arial" w:hAnsi="Arial" w:cs="Arial"/>
+          <w:color w:val="000000"/>
+        </w:rPr>
+        <w:t>: Manages invoicing and automated stock updates.</w:t>
+      </w:r>
+    </w:p>
+    <w:p>
+      <w:pPr>
+        <w:pStyle w:val="NormalWeb"/>
+        <w:numPr>
+          <w:ilvl w:val="1"/>
+          <w:numId w:val="31"/>
+        </w:numPr>
+        <w:spacing w:before="0" w:beforeAutospacing="0" w:after="0" w:afterAutospacing="0"/>
+        <w:textAlignment w:val="baseline"/>
+        <w:rPr>
+          <w:rFonts w:ascii="Arial" w:hAnsi="Arial" w:cs="Arial"/>
+          <w:color w:val="000000"/>
+        </w:rPr>
+      </w:pPr>
+      <w:proofErr w:type="spellStart"/>
+      <w:r>
+        <w:rPr>
+          <w:rFonts w:ascii="Arial" w:hAnsi="Arial" w:cs="Arial"/>
+          <w:color w:val="000000"/>
+        </w:rPr>
+        <w:t>InventoryController</w:t>
+      </w:r>
+      <w:proofErr w:type="spellEnd"/>
+      <w:r>
+        <w:rPr>
+          <w:rFonts w:ascii="Arial" w:hAnsi="Arial" w:cs="Arial"/>
+          <w:color w:val="000000"/>
+        </w:rPr>
+        <w:t>: Manages product catalogs and hardware tracking.</w:t>
+      </w:r>
+    </w:p>
+    <w:p>
+      <w:pPr>
+        <w:pStyle w:val="NormalWeb"/>
+        <w:numPr>
+          <w:ilvl w:val="1"/>
+          <w:numId w:val="31"/>
+        </w:numPr>
+        <w:spacing w:before="0" w:beforeAutospacing="0" w:after="0" w:afterAutospacing="0"/>
+        <w:textAlignment w:val="baseline"/>
+        <w:rPr>
+          <w:rFonts w:ascii="Arial" w:hAnsi="Arial" w:cs="Arial"/>
+          <w:color w:val="000000"/>
+        </w:rPr>
+      </w:pPr>
+      <w:proofErr w:type="spellStart"/>
+      <w:r>
+        <w:rPr>
+          <w:rFonts w:ascii="Arial" w:hAnsi="Arial" w:cs="Arial"/>
+          <w:color w:val="000000"/>
+        </w:rPr>
+        <w:t>ReportController</w:t>
+      </w:r>
+      <w:proofErr w:type="spellEnd"/>
+      <w:r>
+        <w:rPr>
+          <w:rFonts w:ascii="Arial" w:hAnsi="Arial" w:cs="Arial"/>
+          <w:color w:val="000000"/>
+        </w:rPr>
+        <w:t>: Processes data for sales analytics.</w:t>
+      </w:r>
+    </w:p>
+    <w:p>
+      <w:pPr>
+        <w:pStyle w:val="NormalWeb"/>
+        <w:numPr>
+          <w:ilvl w:val="0"/>
+          <w:numId w:val="31"/>
+        </w:numPr>
+        <w:spacing w:before="0" w:beforeAutospacing="0" w:after="260" w:afterAutospacing="0"/>
+        <w:textAlignment w:val="baseline"/>
+        <w:rPr>
+          <w:rFonts w:ascii="Arial" w:hAnsi="Arial" w:cs="Arial"/>
+          <w:color w:val="000000"/>
+        </w:rPr>
+      </w:pPr>
+      <w:r>
+        <w:rPr>
+          <w:rFonts w:ascii="Arial" w:hAnsi="Arial" w:cs="Arial"/>
+          <w:b/>
+          <w:bCs/>
+          <w:color w:val="000000"/>
+        </w:rPr>
+        <w:t>Views</w:t>
+      </w:r>
+      <w:r>
+        <w:rPr>
+          <w:rFonts w:ascii="Arial" w:hAnsi="Arial" w:cs="Arial"/>
+          <w:color w:val="000000"/>
+        </w:rPr>
+        <w:t xml:space="preserve">: A set of WinForms including </w:t>
+      </w:r>
+      <w:proofErr w:type="spellStart"/>
+      <w:r>
+        <w:rPr>
+          <w:rFonts w:ascii="Arial" w:hAnsi="Arial" w:cs="Arial"/>
+          <w:color w:val="000000"/>
+        </w:rPr>
+        <w:t>frmLogin</w:t>
+      </w:r>
+      <w:proofErr w:type="spellEnd"/>
+      <w:r>
+        <w:rPr>
+          <w:rFonts w:ascii="Arial" w:hAnsi="Arial" w:cs="Arial"/>
+          <w:color w:val="000000"/>
+        </w:rPr>
+        <w:t xml:space="preserve">, </w:t>
+      </w:r>
+      <w:proofErr w:type="spellStart"/>
+      <w:r>
+        <w:rPr>
+          <w:rFonts w:ascii="Arial" w:hAnsi="Arial" w:cs="Arial"/>
+          <w:color w:val="000000"/>
+        </w:rPr>
+        <w:t>frmInventory</w:t>
+      </w:r>
+      <w:proofErr w:type="spellEnd"/>
+      <w:r>
+        <w:rPr>
+          <w:rFonts w:ascii="Arial" w:hAnsi="Arial" w:cs="Arial"/>
+          <w:color w:val="000000"/>
+        </w:rPr>
+        <w:t xml:space="preserve">, </w:t>
+      </w:r>
+      <w:proofErr w:type="spellStart"/>
+      <w:r>
+        <w:rPr>
+          <w:rFonts w:ascii="Arial" w:hAnsi="Arial" w:cs="Arial"/>
+          <w:color w:val="000000"/>
+        </w:rPr>
+        <w:t>frmSales</w:t>
+      </w:r>
+      <w:proofErr w:type="spellEnd"/>
+      <w:r>
+        <w:rPr>
+          <w:rFonts w:ascii="Arial" w:hAnsi="Arial" w:cs="Arial"/>
+          <w:color w:val="000000"/>
+        </w:rPr>
+        <w:t xml:space="preserve">, and </w:t>
+      </w:r>
+      <w:proofErr w:type="spellStart"/>
+      <w:r>
+        <w:rPr>
+          <w:rFonts w:ascii="Arial" w:hAnsi="Arial" w:cs="Arial"/>
+          <w:color w:val="000000"/>
+        </w:rPr>
+        <w:t>frmReports</w:t>
+      </w:r>
+      <w:proofErr w:type="spellEnd"/>
+      <w:r>
+        <w:rPr>
+          <w:rFonts w:ascii="Arial" w:hAnsi="Arial" w:cs="Arial"/>
+          <w:color w:val="000000"/>
+        </w:rPr>
+        <w:t>.</w:t>
+      </w:r>
+    </w:p>
+    <w:p>
+      <w:pPr>
+        <w:pStyle w:val="Heading3"/>
+        <w:spacing w:before="0"/>
+        <w:rPr>
+          <w:rFonts w:ascii="Arial" w:eastAsia="Times New Roman" w:hAnsi="Arial" w:cs="Arial"/>
+          <w:b/>
+          <w:bCs/>
+          <w:color w:val="000000"/>
+          <w:kern w:val="0"/>
+          <w:sz w:val="26"/>
+          <w:szCs w:val="26"/>
+          <w14:ligatures w14:val="none"/>
+        </w:rPr>
+      </w:pPr>
+      <w:r>
+        <w:rPr>
+          <w:rFonts w:ascii="Arial" w:eastAsia="Times New Roman" w:hAnsi="Arial" w:cs="Arial"/>
+          <w:b/>
+          <w:bCs/>
+          <w:color w:val="000000"/>
+          <w:kern w:val="0"/>
+          <w:sz w:val="26"/>
+          <w:szCs w:val="26"/>
+          <w14:ligatures w14:val="none"/>
+        </w:rPr>
+        <w:lastRenderedPageBreak/>
+        <w:t>5.3. Dynamic model - sequence diagrams</w:t>
+      </w:r>
+    </w:p>
+    <w:p>
+      <w:pPr>
+        <w:pStyle w:val="NormalWeb"/>
+        <w:spacing w:before="0" w:beforeAutospacing="0" w:after="260" w:afterAutospacing="0"/>
+      </w:pPr>
+      <w:r>
+        <w:rPr>
+          <w:rFonts w:ascii="Arial" w:hAnsi="Arial" w:cs="Arial"/>
+          <w:color w:val="000000"/>
+        </w:rPr>
+        <w:t xml:space="preserve">To illustrate the system's behavior, the </w:t>
+      </w:r>
+      <w:r>
+        <w:rPr>
+          <w:rFonts w:ascii="Arial" w:hAnsi="Arial" w:cs="Arial"/>
+          <w:b/>
+          <w:bCs/>
+          <w:color w:val="000000"/>
+        </w:rPr>
+        <w:t>"Generate Sales Invoice"</w:t>
+      </w:r>
+      <w:r>
+        <w:rPr>
+          <w:rFonts w:ascii="Arial" w:hAnsi="Arial" w:cs="Arial"/>
+          <w:color w:val="000000"/>
+        </w:rPr>
+        <w:t xml:space="preserve"> sequence is modeled. This sequence demonstrates how the </w:t>
+      </w:r>
+      <w:proofErr w:type="spellStart"/>
+      <w:r>
+        <w:rPr>
+          <w:rFonts w:ascii="Arial" w:hAnsi="Arial" w:cs="Arial"/>
+          <w:color w:val="000000"/>
+        </w:rPr>
+        <w:t>SalesView</w:t>
+      </w:r>
+      <w:proofErr w:type="spellEnd"/>
+      <w:r>
+        <w:rPr>
+          <w:rFonts w:ascii="Arial" w:hAnsi="Arial" w:cs="Arial"/>
+          <w:color w:val="000000"/>
+        </w:rPr>
+        <w:t xml:space="preserve"> sends data to the </w:t>
+      </w:r>
+      <w:proofErr w:type="spellStart"/>
+      <w:r>
+        <w:rPr>
+          <w:rFonts w:ascii="Arial" w:hAnsi="Arial" w:cs="Arial"/>
+          <w:color w:val="000000"/>
+        </w:rPr>
+        <w:t>SalesController</w:t>
+      </w:r>
+      <w:proofErr w:type="spellEnd"/>
+      <w:r>
+        <w:rPr>
+          <w:rFonts w:ascii="Arial" w:hAnsi="Arial" w:cs="Arial"/>
+          <w:color w:val="000000"/>
+        </w:rPr>
+        <w:t>, which then interacts with the Invoice entity and triggers a stock reduction in the Product entity before confirming the transaction to the user.</w:t>
+      </w:r>
+    </w:p>
+    <w:p>
+      <w:pPr>
+        <w:pStyle w:val="Heading3"/>
+        <w:spacing w:before="0"/>
+        <w:rPr>
+          <w:rFonts w:ascii="Arial" w:eastAsia="Times New Roman" w:hAnsi="Arial" w:cs="Arial"/>
+          <w:b/>
+          <w:bCs/>
+          <w:color w:val="000000"/>
+          <w:kern w:val="0"/>
+          <w:sz w:val="26"/>
+          <w:szCs w:val="26"/>
+          <w14:ligatures w14:val="none"/>
+        </w:rPr>
+      </w:pPr>
+      <w:r>
+        <w:rPr>
+          <w:rFonts w:ascii="Arial" w:eastAsia="Times New Roman" w:hAnsi="Arial" w:cs="Arial"/>
+          <w:b/>
+          <w:bCs/>
+          <w:color w:val="000000"/>
+          <w:kern w:val="0"/>
+          <w:sz w:val="26"/>
+          <w:szCs w:val="26"/>
+          <w14:ligatures w14:val="none"/>
+        </w:rPr>
+        <w:t>5.4. Rationale for detailed design model</w:t>
+      </w:r>
+    </w:p>
+    <w:p>
+      <w:pPr>
+        <w:pStyle w:val="NormalWeb"/>
+        <w:spacing w:before="0" w:beforeAutospacing="0" w:after="260" w:afterAutospacing="0"/>
+      </w:pPr>
+      <w:r>
+        <w:rPr>
+          <w:rFonts w:ascii="Arial" w:hAnsi="Arial" w:cs="Arial"/>
+          <w:color w:val="000000"/>
+        </w:rPr>
+        <w:t>The design choices prioritize security and consistency:</w:t>
+      </w:r>
+    </w:p>
+    <w:p>
+      <w:pPr>
+        <w:pStyle w:val="NormalWeb"/>
+        <w:numPr>
+          <w:ilvl w:val="0"/>
+          <w:numId w:val="32"/>
+        </w:numPr>
+        <w:spacing w:before="0" w:beforeAutospacing="0" w:after="0" w:afterAutospacing="0"/>
+        <w:textAlignment w:val="baseline"/>
+        <w:rPr>
+          <w:rFonts w:ascii="Arial" w:hAnsi="Arial" w:cs="Arial"/>
+          <w:color w:val="000000"/>
+        </w:rPr>
+      </w:pPr>
+      <w:r>
+        <w:rPr>
+          <w:rFonts w:ascii="Arial" w:hAnsi="Arial" w:cs="Arial"/>
+          <w:b/>
+          <w:bCs/>
+          <w:color w:val="000000"/>
+        </w:rPr>
+        <w:t>Role-Based Access Control (RBAC)</w:t>
+      </w:r>
+      <w:r>
+        <w:rPr>
+          <w:rFonts w:ascii="Arial" w:hAnsi="Arial" w:cs="Arial"/>
+          <w:color w:val="000000"/>
+        </w:rPr>
+        <w:t xml:space="preserve">: Implementing the System User inheritance logic at the code level ensures that only authorized Actors can access sensitive Controllers (e.g., </w:t>
+      </w:r>
+      <w:proofErr w:type="spellStart"/>
+      <w:r>
+        <w:rPr>
+          <w:rFonts w:ascii="Arial" w:hAnsi="Arial" w:cs="Arial"/>
+          <w:color w:val="000000"/>
+        </w:rPr>
+        <w:t>ReportController</w:t>
+      </w:r>
+      <w:proofErr w:type="spellEnd"/>
+      <w:r>
+        <w:rPr>
+          <w:rFonts w:ascii="Arial" w:hAnsi="Arial" w:cs="Arial"/>
+          <w:color w:val="000000"/>
+        </w:rPr>
+        <w:t>).</w:t>
+      </w:r>
+    </w:p>
+    <w:p>
+      <w:pPr>
+        <w:pStyle w:val="NormalWeb"/>
+        <w:numPr>
+          <w:ilvl w:val="0"/>
+          <w:numId w:val="32"/>
+        </w:numPr>
+        <w:spacing w:before="0" w:beforeAutospacing="0" w:after="0" w:afterAutospacing="0"/>
+        <w:textAlignment w:val="baseline"/>
+        <w:rPr>
+          <w:rFonts w:ascii="Arial" w:hAnsi="Arial" w:cs="Arial"/>
+          <w:color w:val="000000"/>
+        </w:rPr>
+      </w:pPr>
+      <w:r>
+        <w:rPr>
+          <w:rFonts w:ascii="Arial" w:hAnsi="Arial" w:cs="Arial"/>
+          <w:b/>
+          <w:bCs/>
+          <w:color w:val="000000"/>
+        </w:rPr>
+        <w:t>Encapsulation</w:t>
+      </w:r>
+      <w:r>
+        <w:rPr>
+          <w:rFonts w:ascii="Arial" w:hAnsi="Arial" w:cs="Arial"/>
+          <w:color w:val="000000"/>
+        </w:rPr>
+        <w:t>: Data entities are encapsulated, meaning the View layer cannot modify the Database directly without going through a Controller.</w:t>
+      </w:r>
+    </w:p>
+    <w:p>
+      <w:pPr>
+        <w:pStyle w:val="NormalWeb"/>
+        <w:numPr>
+          <w:ilvl w:val="0"/>
+          <w:numId w:val="32"/>
+        </w:numPr>
+        <w:spacing w:before="0" w:beforeAutospacing="0" w:after="260" w:afterAutospacing="0"/>
+        <w:textAlignment w:val="baseline"/>
+        <w:rPr>
+          <w:rFonts w:ascii="Arial" w:hAnsi="Arial" w:cs="Arial"/>
+          <w:color w:val="000000"/>
+        </w:rPr>
+      </w:pPr>
+      <w:r>
+        <w:rPr>
+          <w:rFonts w:ascii="Arial" w:hAnsi="Arial" w:cs="Arial"/>
+          <w:b/>
+          <w:bCs/>
+          <w:color w:val="000000"/>
+        </w:rPr>
+        <w:t>Database Normalization</w:t>
+      </w:r>
+      <w:r>
+        <w:rPr>
+          <w:rFonts w:ascii="Arial" w:hAnsi="Arial" w:cs="Arial"/>
+          <w:color w:val="000000"/>
+        </w:rPr>
+        <w:t>: The schema is normalized to the 3rd Normal Form (3NF) to prevent data anomalies during stock updates.</w:t>
+      </w:r>
+    </w:p>
+    <w:p>
+      <w:pPr>
+        <w:pStyle w:val="Heading3"/>
+        <w:spacing w:before="0"/>
+        <w:rPr>
+          <w:rFonts w:ascii="Arial" w:eastAsia="Times New Roman" w:hAnsi="Arial" w:cs="Arial"/>
+          <w:b/>
+          <w:bCs/>
+          <w:color w:val="000000"/>
+          <w:kern w:val="0"/>
+          <w:sz w:val="26"/>
+          <w:szCs w:val="26"/>
+          <w14:ligatures w14:val="none"/>
+        </w:rPr>
+      </w:pPr>
+      <w:r>
+        <w:rPr>
+          <w:rFonts w:ascii="Arial" w:eastAsia="Times New Roman" w:hAnsi="Arial" w:cs="Arial"/>
+          <w:b/>
+          <w:bCs/>
+          <w:color w:val="000000"/>
+          <w:kern w:val="0"/>
+          <w:sz w:val="26"/>
+          <w:szCs w:val="26"/>
+          <w14:ligatures w14:val="none"/>
+        </w:rPr>
+        <w:t>5.5. Traceability from requirements to detailed design model</w:t>
+      </w:r>
+    </w:p>
+    <w:p>
+      <w:pPr>
+        <w:pStyle w:val="NormalWeb"/>
+        <w:spacing w:before="0" w:beforeAutospacing="0" w:after="260" w:afterAutospacing="0"/>
+      </w:pPr>
+      <w:r>
+        <w:rPr>
+          <w:rFonts w:ascii="Arial" w:hAnsi="Arial" w:cs="Arial"/>
+          <w:color w:val="000000"/>
+        </w:rPr>
+        <w:t>Every functional requirement (FR) from Section 3.3 is accounted for in this design:</w:t>
+      </w:r>
+    </w:p>
+    <w:p>
+      <w:pPr>
+        <w:pStyle w:val="NormalWeb"/>
+        <w:numPr>
+          <w:ilvl w:val="0"/>
+          <w:numId w:val="33"/>
+        </w:numPr>
+        <w:spacing w:before="0" w:beforeAutospacing="0" w:after="0" w:afterAutospacing="0"/>
+        <w:textAlignment w:val="baseline"/>
+        <w:rPr>
+          <w:rFonts w:ascii="Arial" w:hAnsi="Arial" w:cs="Arial"/>
+          <w:color w:val="000000"/>
+        </w:rPr>
+      </w:pPr>
+      <w:r>
+        <w:rPr>
+          <w:rFonts w:ascii="Arial" w:hAnsi="Arial" w:cs="Arial"/>
+          <w:b/>
+          <w:bCs/>
+          <w:color w:val="000000"/>
+        </w:rPr>
+        <w:t>FR1 (Authentication)</w:t>
+      </w:r>
+      <w:r>
+        <w:rPr>
+          <w:rFonts w:ascii="Arial" w:hAnsi="Arial" w:cs="Arial"/>
+          <w:color w:val="000000"/>
+        </w:rPr>
+        <w:t xml:space="preserve"> → Managed by </w:t>
+      </w:r>
+      <w:proofErr w:type="spellStart"/>
+      <w:r>
+        <w:rPr>
+          <w:rFonts w:ascii="Arial" w:hAnsi="Arial" w:cs="Arial"/>
+          <w:color w:val="000000"/>
+        </w:rPr>
+        <w:t>AccountController</w:t>
+      </w:r>
+      <w:proofErr w:type="spellEnd"/>
+      <w:r>
+        <w:rPr>
+          <w:rFonts w:ascii="Arial" w:hAnsi="Arial" w:cs="Arial"/>
+          <w:color w:val="000000"/>
+        </w:rPr>
+        <w:t>.</w:t>
+      </w:r>
+    </w:p>
+    <w:p>
+      <w:pPr>
+        <w:pStyle w:val="NormalWeb"/>
+        <w:numPr>
+          <w:ilvl w:val="0"/>
+          <w:numId w:val="33"/>
+        </w:numPr>
+        <w:spacing w:before="0" w:beforeAutospacing="0" w:after="0" w:afterAutospacing="0"/>
+        <w:textAlignment w:val="baseline"/>
+        <w:rPr>
+          <w:rFonts w:ascii="Arial" w:hAnsi="Arial" w:cs="Arial"/>
+          <w:color w:val="000000"/>
+        </w:rPr>
+      </w:pPr>
+      <w:r>
+        <w:rPr>
+          <w:rFonts w:ascii="Arial" w:hAnsi="Arial" w:cs="Arial"/>
+          <w:b/>
+          <w:bCs/>
+          <w:color w:val="000000"/>
+        </w:rPr>
+        <w:t>FR2 (Sales Processing)</w:t>
+      </w:r>
+      <w:r>
+        <w:rPr>
+          <w:rFonts w:ascii="Arial" w:hAnsi="Arial" w:cs="Arial"/>
+          <w:color w:val="000000"/>
+        </w:rPr>
+        <w:t xml:space="preserve"> → Managed by </w:t>
+      </w:r>
+      <w:proofErr w:type="spellStart"/>
+      <w:r>
+        <w:rPr>
+          <w:rFonts w:ascii="Arial" w:hAnsi="Arial" w:cs="Arial"/>
+          <w:color w:val="000000"/>
+        </w:rPr>
+        <w:t>SalesController</w:t>
+      </w:r>
+      <w:proofErr w:type="spellEnd"/>
+      <w:r>
+        <w:rPr>
+          <w:rFonts w:ascii="Arial" w:hAnsi="Arial" w:cs="Arial"/>
+          <w:color w:val="000000"/>
+        </w:rPr>
+        <w:t xml:space="preserve"> and Invoice entity.</w:t>
+      </w:r>
+    </w:p>
+    <w:p>
+      <w:pPr>
+        <w:pStyle w:val="NormalWeb"/>
+        <w:numPr>
+          <w:ilvl w:val="0"/>
+          <w:numId w:val="33"/>
+        </w:numPr>
+        <w:spacing w:before="0" w:beforeAutospacing="0" w:after="0" w:afterAutospacing="0"/>
+        <w:textAlignment w:val="baseline"/>
+        <w:rPr>
+          <w:rFonts w:ascii="Arial" w:hAnsi="Arial" w:cs="Arial"/>
+          <w:color w:val="000000"/>
+        </w:rPr>
+      </w:pPr>
+      <w:r>
+        <w:rPr>
+          <w:rFonts w:ascii="Arial" w:hAnsi="Arial" w:cs="Arial"/>
+          <w:b/>
+          <w:bCs/>
+          <w:color w:val="000000"/>
+        </w:rPr>
+        <w:t>FR3 (Inventory Management) →</w:t>
+      </w:r>
+      <w:r>
+        <w:rPr>
+          <w:rFonts w:ascii="Arial" w:hAnsi="Arial" w:cs="Arial"/>
+          <w:color w:val="000000"/>
+        </w:rPr>
+        <w:t xml:space="preserve"> Managed by </w:t>
+      </w:r>
+      <w:proofErr w:type="spellStart"/>
+      <w:r>
+        <w:rPr>
+          <w:rFonts w:ascii="Arial" w:hAnsi="Arial" w:cs="Arial"/>
+          <w:color w:val="000000"/>
+        </w:rPr>
+        <w:t>InventoryController</w:t>
+      </w:r>
+      <w:proofErr w:type="spellEnd"/>
+      <w:r>
+        <w:rPr>
+          <w:rFonts w:ascii="Arial" w:hAnsi="Arial" w:cs="Arial"/>
+          <w:color w:val="000000"/>
+        </w:rPr>
+        <w:t xml:space="preserve"> and Product entity.</w:t>
+      </w:r>
+    </w:p>
+    <w:p>
+      <w:pPr>
+        <w:pStyle w:val="NormalWeb"/>
+        <w:numPr>
+          <w:ilvl w:val="0"/>
+          <w:numId w:val="33"/>
+        </w:numPr>
+        <w:spacing w:before="0" w:beforeAutospacing="0" w:after="0" w:afterAutospacing="0"/>
+        <w:textAlignment w:val="baseline"/>
+        <w:rPr>
+          <w:rFonts w:ascii="Arial" w:hAnsi="Arial" w:cs="Arial"/>
+          <w:color w:val="000000"/>
+        </w:rPr>
+      </w:pPr>
+      <w:r>
+        <w:rPr>
+          <w:rFonts w:ascii="Arial" w:hAnsi="Arial" w:cs="Arial"/>
+          <w:b/>
+          <w:bCs/>
+          <w:color w:val="000000"/>
+        </w:rPr>
+        <w:t>FR4 (Customer Management)</w:t>
+      </w:r>
+      <w:r>
+        <w:rPr>
+          <w:rFonts w:ascii="Arial" w:hAnsi="Arial" w:cs="Arial"/>
+          <w:color w:val="000000"/>
+        </w:rPr>
+        <w:t xml:space="preserve"> → Managed by </w:t>
+      </w:r>
+      <w:proofErr w:type="spellStart"/>
+      <w:r>
+        <w:rPr>
+          <w:rFonts w:ascii="Arial" w:hAnsi="Arial" w:cs="Arial"/>
+          <w:color w:val="000000"/>
+        </w:rPr>
+        <w:t>CustomerController</w:t>
+      </w:r>
+      <w:proofErr w:type="spellEnd"/>
+      <w:r>
+        <w:rPr>
+          <w:rFonts w:ascii="Arial" w:hAnsi="Arial" w:cs="Arial"/>
+          <w:color w:val="000000"/>
+        </w:rPr>
+        <w:t>.</w:t>
+      </w:r>
+    </w:p>
+    <w:p>
+      <w:pPr>
+        <w:pStyle w:val="NormalWeb"/>
+        <w:numPr>
+          <w:ilvl w:val="0"/>
+          <w:numId w:val="33"/>
+        </w:numPr>
+        <w:spacing w:before="0" w:beforeAutospacing="0" w:after="0" w:afterAutospacing="0"/>
+        <w:textAlignment w:val="baseline"/>
+        <w:rPr>
+          <w:rFonts w:ascii="Arial" w:hAnsi="Arial" w:cs="Arial"/>
+          <w:color w:val="000000"/>
+        </w:rPr>
+      </w:pPr>
+      <w:r>
+        <w:rPr>
+          <w:rFonts w:ascii="Arial" w:hAnsi="Arial" w:cs="Arial"/>
+          <w:b/>
+          <w:bCs/>
+          <w:color w:val="000000"/>
+        </w:rPr>
+        <w:t>FR5 (Employee Administration)</w:t>
+      </w:r>
+      <w:r>
+        <w:rPr>
+          <w:rFonts w:ascii="Arial" w:hAnsi="Arial" w:cs="Arial"/>
+          <w:color w:val="000000"/>
+        </w:rPr>
+        <w:t xml:space="preserve"> </w:t>
+      </w:r>
+      <w:r>
+        <w:rPr>
+          <w:rFonts w:ascii="Arial" w:hAnsi="Arial" w:cs="Arial"/>
+          <w:b/>
+          <w:bCs/>
+          <w:color w:val="000000"/>
+        </w:rPr>
+        <w:t>→</w:t>
+      </w:r>
+      <w:r>
+        <w:rPr>
+          <w:rFonts w:ascii="Arial" w:hAnsi="Arial" w:cs="Arial"/>
+          <w:color w:val="000000"/>
+        </w:rPr>
+        <w:t xml:space="preserve"> Managed by </w:t>
+      </w:r>
+      <w:proofErr w:type="spellStart"/>
+      <w:r>
+        <w:rPr>
+          <w:rFonts w:ascii="Arial" w:hAnsi="Arial" w:cs="Arial"/>
+          <w:color w:val="000000"/>
+        </w:rPr>
+        <w:t>AccountController</w:t>
+      </w:r>
+      <w:proofErr w:type="spellEnd"/>
+      <w:r>
+        <w:rPr>
+          <w:rFonts w:ascii="Arial" w:hAnsi="Arial" w:cs="Arial"/>
+          <w:color w:val="000000"/>
+        </w:rPr>
+        <w:t xml:space="preserve"> and Staff entity.</w:t>
+      </w:r>
+    </w:p>
+    <w:p>
+      <w:pPr>
+        <w:pStyle w:val="NormalWeb"/>
+        <w:numPr>
+          <w:ilvl w:val="0"/>
+          <w:numId w:val="33"/>
+        </w:numPr>
+        <w:spacing w:before="0" w:beforeAutospacing="0" w:after="260" w:afterAutospacing="0"/>
+        <w:textAlignment w:val="baseline"/>
+        <w:rPr>
+          <w:rFonts w:ascii="Arial" w:hAnsi="Arial" w:cs="Arial"/>
+          <w:color w:val="000000"/>
+        </w:rPr>
+      </w:pPr>
+      <w:r>
+        <w:rPr>
+          <w:rFonts w:ascii="Arial" w:hAnsi="Arial" w:cs="Arial"/>
+          <w:b/>
+          <w:bCs/>
+          <w:color w:val="000000"/>
+        </w:rPr>
+        <w:t>FR6 (Automated Synchronization)</w:t>
+      </w:r>
+      <w:r>
+        <w:rPr>
+          <w:rFonts w:ascii="Arial" w:hAnsi="Arial" w:cs="Arial"/>
+          <w:color w:val="000000"/>
+        </w:rPr>
+        <w:t xml:space="preserve"> </w:t>
+      </w:r>
+      <w:r>
+        <w:rPr>
+          <w:rFonts w:ascii="Arial" w:hAnsi="Arial" w:cs="Arial"/>
+          <w:b/>
+          <w:bCs/>
+          <w:color w:val="000000"/>
+        </w:rPr>
+        <w:t>→</w:t>
+      </w:r>
+      <w:r>
+        <w:rPr>
+          <w:rFonts w:ascii="Arial" w:hAnsi="Arial" w:cs="Arial"/>
+          <w:color w:val="000000"/>
+        </w:rPr>
+        <w:t xml:space="preserve"> Implemented as a method within </w:t>
+      </w:r>
+      <w:proofErr w:type="spellStart"/>
+      <w:r>
+        <w:rPr>
+          <w:rFonts w:ascii="Arial" w:hAnsi="Arial" w:cs="Arial"/>
+          <w:color w:val="000000"/>
+        </w:rPr>
+        <w:t>SalesController</w:t>
+      </w:r>
+      <w:proofErr w:type="spellEnd"/>
+      <w:r>
+        <w:rPr>
+          <w:rFonts w:ascii="Arial" w:hAnsi="Arial" w:cs="Arial"/>
+          <w:color w:val="000000"/>
+        </w:rPr>
+        <w:t>.</w:t>
+      </w:r>
+    </w:p>
+    <w:p>
+      <w:pPr>
+        <w:pStyle w:val="NormalWeb"/>
+        <w:numPr>
+          <w:ilvl w:val="0"/>
+          <w:numId w:val="33"/>
+        </w:numPr>
+        <w:spacing w:before="0" w:beforeAutospacing="0" w:after="260" w:afterAutospacing="0"/>
+        <w:textAlignment w:val="baseline"/>
+        <w:rPr>
+          <w:rFonts w:ascii="Arial" w:hAnsi="Arial" w:cs="Arial"/>
+          <w:b/>
+          <w:bCs/>
+          <w:color w:val="000000"/>
+        </w:rPr>
+      </w:pPr>
+      <w:r>
+        <w:rPr>
+          <w:rFonts w:ascii="Arial" w:hAnsi="Arial" w:cs="Arial"/>
+          <w:b/>
+          <w:bCs/>
+          <w:color w:val="000000"/>
+        </w:rPr>
+        <w:t>FR7 (Reporting)</w:t>
+      </w:r>
+      <w:r>
+        <w:rPr>
+          <w:rFonts w:ascii="Arial" w:hAnsi="Arial" w:cs="Arial"/>
+          <w:b/>
+          <w:bCs/>
+          <w:color w:val="000000"/>
+        </w:rPr>
+        <w:t xml:space="preserve"> </w:t>
+      </w:r>
+      <w:r>
+        <w:rPr>
+          <w:rFonts w:ascii="Arial" w:hAnsi="Arial" w:cs="Arial"/>
+          <w:b/>
+          <w:bCs/>
+          <w:color w:val="000000"/>
+        </w:rPr>
+        <w:t>→</w:t>
+      </w:r>
+      <w:r>
+        <w:rPr>
+          <w:rFonts w:ascii="Arial" w:hAnsi="Arial" w:cs="Arial"/>
+          <w:b/>
+          <w:bCs/>
+          <w:color w:val="000000"/>
+        </w:rPr>
+        <w:t xml:space="preserve"> </w:t>
+      </w:r>
+      <w:r>
+        <w:rPr>
+          <w:rFonts w:ascii="Arial" w:hAnsi="Arial" w:cs="Arial"/>
+          <w:color w:val="000000"/>
+        </w:rPr>
+        <w:t xml:space="preserve">Managed by </w:t>
+      </w:r>
+      <w:proofErr w:type="spellStart"/>
+      <w:r>
+        <w:rPr>
+          <w:rFonts w:ascii="Arial" w:hAnsi="Arial" w:cs="Arial"/>
+          <w:color w:val="000000"/>
+        </w:rPr>
+        <w:t>ReportController</w:t>
+      </w:r>
+      <w:proofErr w:type="spellEnd"/>
+      <w:r>
+        <w:rPr>
+          <w:rFonts w:ascii="Arial" w:hAnsi="Arial" w:cs="Arial"/>
+          <w:b/>
+          <w:bCs/>
+          <w:color w:val="000000"/>
+        </w:rPr>
+        <w:t>.</w:t>
+      </w:r>
+    </w:p>
     <w:sectPr>
       <w:pgSz w:w="12240" w:h="15840"/>
       <w:pgMar w:top="1440" w:right="1440" w:bottom="1440" w:left="1440" w:header="720" w:footer="720" w:gutter="0"/>
@@ -4639,7 +6055,7 @@
 </file>
 
 <file path=word/numbering.xml><?xml version="1.0" encoding="utf-8"?>
-<w:numbering xmlns:wpc="http://schemas.microsoft.com/office/word/2010/wordprocessingCanvas" xmlns:cx="http://schemas.microsoft.com/office/drawing/2014/chartex" xmlns:cx1="http://schemas.microsoft.com/office/drawing/2015/9/8/chartex" xmlns:cx2="http://schemas.microsoft.com/office/drawing/2015/10/21/chartex" xmlns:cx3="http://schemas.microsoft.com/office/drawing/2016/5/9/chartex" xmlns:cx4="http://schemas.microsoft.com/office/drawing/2016/5/10/chartex" xmlns:cx5="http://schemas.microsoft.com/office/drawing/2016/5/11/chartex" xmlns:cx6="http://schemas.microsoft.com/office/drawing/2016/5/12/chartex" xmlns:cx7="http://schemas.microsoft.com/office/drawing/2016/5/13/chartex" xmlns:cx8="http://schemas.microsoft.com/office/drawing/2016/5/14/chartex" xmlns:mc="http://schemas.openxmlformats.org/markup-compatibility/2006" xmlns:aink="http://schemas.microsoft.com/office/drawing/2016/ink" xmlns:am3d="http://schemas.microsoft.com/office/drawing/2017/model3d" xmlns:o="urn:schemas-microsoft-com:office:office" xmlns:oel="http://schemas.microsoft.com/office/2019/extlst" xmlns:r="http://schemas.openxmlformats.org/officeDocument/2006/relationships" xmlns:m="http://schemas.openxmlformats.org/officeDocument/2006/math" xmlns:v="urn:schemas-microsoft-com:vml" xmlns:wp14="http://schemas.microsoft.com/office/word/2010/wordprocessingDrawing" xmlns:wp="http://schemas.openxmlformats.org/drawingml/2006/wordprocessingDrawing" xmlns:w10="urn:schemas-microsoft-com:office:word" xmlns:w="http://schemas.openxmlformats.org/wordprocessingml/2006/main" xmlns:w14="http://schemas.microsoft.com/office/word/2010/wordml" xmlns:w15="http://schemas.microsoft.com/office/word/2012/wordml" xmlns:w16cex="http://schemas.microsoft.com/office/word/2018/wordml/cex" xmlns:w16cid="http://schemas.microsoft.com/office/word/2016/wordml/cid" xmlns:w16="http://schemas.microsoft.com/office/word/2018/wordml" xmlns:w16du="http://schemas.microsoft.com/office/word/2023/wordml/word16du" xmlns:w16sdtdh="http://schemas.microsoft.com/office/word/2020/wordml/sdtdatahash" xmlns:w16sdtfl="http://schemas.microsoft.com/office/word/2024/wordml/sdtformatlock" xmlns:w16se="http://schemas.microsoft.com/office/word/2015/wordml/symex" xmlns:wpg="http://schemas.microsoft.com/office/word/2010/wordprocessingGroup" xmlns:wpi="http://schemas.microsoft.com/office/word/2010/wordprocessingInk" xmlns:wne="http://schemas.microsoft.com/office/word/2006/wordml" xmlns:wps="http://schemas.microsoft.com/office/word/2010/wordprocessingShape" mc:Ignorable="w14 w15 w16se w16cid w16 w16cex w16sdtdh w16sdtfl w16du wp14">
+<w:numbering xmlns:wpc="http://schemas.microsoft.com/office/word/2010/wordprocessingCanvas" xmlns:cx="http://schemas.microsoft.com/office/drawing/2014/chartex" xmlns:cx1="http://schemas.microsoft.com/office/drawing/2015/9/8/chartex" xmlns:cx2="http://schemas.microsoft.com/office/drawing/2015/10/21/chartex" xmlns:cx3="http://schemas.microsoft.com/office/drawing/2016/5/9/chartex" xmlns:cx4="http://schemas.microsoft.com/office/drawing/2016/5/10/chartex" xmlns:cx5="http://schemas.microsoft.com/office/drawing/2016/5/11/chartex" xmlns:cx6="http://schemas.microsoft.com/office/drawing/2016/5/12/chartex" xmlns:cx7="http://schemas.microsoft.com/office/drawing/2016/5/13/chartex" xmlns:cx8="http://schemas.microsoft.com/office/drawing/2016/5/14/chartex" xmlns:mc="http://schemas.openxmlformats.org/markup-compatibility/2006" xmlns:aink="http://schemas.microsoft.com/office/drawing/2016/ink" xmlns:am3d="http://schemas.microsoft.com/office/drawing/2017/model3d" xmlns:o="urn:schemas-microsoft-com:office:office" xmlns:oel="http://schemas.microsoft.com/office/2019/extlst" xmlns:r="http://schemas.openxmlformats.org/officeDocument/2006/relationships" xmlns:m="http://schemas.openxmlformats.org/officeDocument/2006/math" xmlns:v="urn:schemas-microsoft-com:vml" xmlns:wp14="http://schemas.microsoft.com/office/word/2010/wordprocessingDrawing" xmlns:wp="http://schemas.openxmlformats.org/drawingml/2006/wordprocessingDrawing" xmlns:w10="urn:schemas-microsoft-com:office:word" xmlns:w="http://schemas.openxmlformats.org/wordprocessingml/2006/main" xmlns:w14="http://schemas.microsoft.com/office/word/2010/wordml" xmlns:w15="http://schemas.microsoft.com/office/word/2012/wordml" xmlns:w16cex="http://schemas.microsoft.com/office/word/2018/wordml/cex" xmlns:w16cid="http://schemas.microsoft.com/office/word/2016/wordml/cid" xmlns:w16="http://schemas.microsoft.com/office/word/2018/wordml" xmlns:w16du="http://schemas.microsoft.com/office/word/2023/wordml/word16du" xmlns:w16sdtdh="http://schemas.microsoft.com/office/word/2020/wordml/sdtdatahash" xmlns:w16se="http://schemas.microsoft.com/office/word/2015/wordml/symex" xmlns:wpg="http://schemas.microsoft.com/office/word/2010/wordprocessingGroup" xmlns:wpi="http://schemas.microsoft.com/office/word/2010/wordprocessingInk" xmlns:wne="http://schemas.microsoft.com/office/word/2006/wordml" xmlns:wps="http://schemas.microsoft.com/office/word/2010/wordprocessingShape" mc:Ignorable="w14 w15 w16se w16cid w16 w16cex w16sdtdh wp14">
   <w:abstractNum w:abstractNumId="0" w15:restartNumberingAfterBreak="0">
     <w:nsid w:val="01BC4726"/>
     <w:multiLevelType w:val="multilevel"/>
@@ -4790,6 +6206,155 @@
     </w:lvl>
   </w:abstractNum>
   <w:abstractNum w:abstractNumId="1" w15:restartNumberingAfterBreak="0">
+    <w:nsid w:val="050701D0"/>
+    <w:multiLevelType w:val="multilevel"/>
+    <w:tmpl w:val="82EE5E80"/>
+    <w:lvl w:ilvl="0">
+      <w:start w:val="1"/>
+      <w:numFmt w:val="bullet"/>
+      <w:lvlText w:val=""/>
+      <w:lvlJc w:val="left"/>
+      <w:pPr>
+        <w:tabs>
+          <w:tab w:val="num" w:pos="720"/>
+        </w:tabs>
+        <w:ind w:left="720" w:hanging="360"/>
+      </w:pPr>
+      <w:rPr>
+        <w:rFonts w:ascii="Symbol" w:hAnsi="Symbol" w:hint="default"/>
+        <w:sz w:val="20"/>
+      </w:rPr>
+    </w:lvl>
+    <w:lvl w:ilvl="1" w:tentative="1">
+      <w:start w:val="1"/>
+      <w:numFmt w:val="bullet"/>
+      <w:lvlText w:val="o"/>
+      <w:lvlJc w:val="left"/>
+      <w:pPr>
+        <w:tabs>
+          <w:tab w:val="num" w:pos="1440"/>
+        </w:tabs>
+        <w:ind w:left="1440" w:hanging="360"/>
+      </w:pPr>
+      <w:rPr>
+        <w:rFonts w:ascii="Courier New" w:hAnsi="Courier New" w:hint="default"/>
+        <w:sz w:val="20"/>
+      </w:rPr>
+    </w:lvl>
+    <w:lvl w:ilvl="2" w:tentative="1">
+      <w:start w:val="1"/>
+      <w:numFmt w:val="bullet"/>
+      <w:lvlText w:val=""/>
+      <w:lvlJc w:val="left"/>
+      <w:pPr>
+        <w:tabs>
+          <w:tab w:val="num" w:pos="2160"/>
+        </w:tabs>
+        <w:ind w:left="2160" w:hanging="360"/>
+      </w:pPr>
+      <w:rPr>
+        <w:rFonts w:ascii="Wingdings" w:hAnsi="Wingdings" w:hint="default"/>
+        <w:sz w:val="20"/>
+      </w:rPr>
+    </w:lvl>
+    <w:lvl w:ilvl="3" w:tentative="1">
+      <w:start w:val="1"/>
+      <w:numFmt w:val="bullet"/>
+      <w:lvlText w:val=""/>
+      <w:lvlJc w:val="left"/>
+      <w:pPr>
+        <w:tabs>
+          <w:tab w:val="num" w:pos="2880"/>
+        </w:tabs>
+        <w:ind w:left="2880" w:hanging="360"/>
+      </w:pPr>
+      <w:rPr>
+        <w:rFonts w:ascii="Wingdings" w:hAnsi="Wingdings" w:hint="default"/>
+        <w:sz w:val="20"/>
+      </w:rPr>
+    </w:lvl>
+    <w:lvl w:ilvl="4" w:tentative="1">
+      <w:start w:val="1"/>
+      <w:numFmt w:val="bullet"/>
+      <w:lvlText w:val=""/>
+      <w:lvlJc w:val="left"/>
+      <w:pPr>
+        <w:tabs>
+          <w:tab w:val="num" w:pos="3600"/>
+        </w:tabs>
+        <w:ind w:left="3600" w:hanging="360"/>
+      </w:pPr>
+      <w:rPr>
+        <w:rFonts w:ascii="Wingdings" w:hAnsi="Wingdings" w:hint="default"/>
+        <w:sz w:val="20"/>
+      </w:rPr>
+    </w:lvl>
+    <w:lvl w:ilvl="5" w:tentative="1">
+      <w:start w:val="1"/>
+      <w:numFmt w:val="bullet"/>
+      <w:lvlText w:val=""/>
+      <w:lvlJc w:val="left"/>
+      <w:pPr>
+        <w:tabs>
+          <w:tab w:val="num" w:pos="4320"/>
+        </w:tabs>
+        <w:ind w:left="4320" w:hanging="360"/>
+      </w:pPr>
+      <w:rPr>
+        <w:rFonts w:ascii="Wingdings" w:hAnsi="Wingdings" w:hint="default"/>
+        <w:sz w:val="20"/>
+      </w:rPr>
+    </w:lvl>
+    <w:lvl w:ilvl="6" w:tentative="1">
+      <w:start w:val="1"/>
+      <w:numFmt w:val="bullet"/>
+      <w:lvlText w:val=""/>
+      <w:lvlJc w:val="left"/>
+      <w:pPr>
+        <w:tabs>
+          <w:tab w:val="num" w:pos="5040"/>
+        </w:tabs>
+        <w:ind w:left="5040" w:hanging="360"/>
+      </w:pPr>
+      <w:rPr>
+        <w:rFonts w:ascii="Wingdings" w:hAnsi="Wingdings" w:hint="default"/>
+        <w:sz w:val="20"/>
+      </w:rPr>
+    </w:lvl>
+    <w:lvl w:ilvl="7" w:tentative="1">
+      <w:start w:val="1"/>
+      <w:numFmt w:val="bullet"/>
+      <w:lvlText w:val=""/>
+      <w:lvlJc w:val="left"/>
+      <w:pPr>
+        <w:tabs>
+          <w:tab w:val="num" w:pos="5760"/>
+        </w:tabs>
+        <w:ind w:left="5760" w:hanging="360"/>
+      </w:pPr>
+      <w:rPr>
+        <w:rFonts w:ascii="Wingdings" w:hAnsi="Wingdings" w:hint="default"/>
+        <w:sz w:val="20"/>
+      </w:rPr>
+    </w:lvl>
+    <w:lvl w:ilvl="8" w:tentative="1">
+      <w:start w:val="1"/>
+      <w:numFmt w:val="bullet"/>
+      <w:lvlText w:val=""/>
+      <w:lvlJc w:val="left"/>
+      <w:pPr>
+        <w:tabs>
+          <w:tab w:val="num" w:pos="6480"/>
+        </w:tabs>
+        <w:ind w:left="6480" w:hanging="360"/>
+      </w:pPr>
+      <w:rPr>
+        <w:rFonts w:ascii="Wingdings" w:hAnsi="Wingdings" w:hint="default"/>
+        <w:sz w:val="20"/>
+      </w:rPr>
+    </w:lvl>
+  </w:abstractNum>
+  <w:abstractNum w:abstractNumId="2" w15:restartNumberingAfterBreak="0">
     <w:nsid w:val="121611FE"/>
     <w:multiLevelType w:val="multilevel"/>
     <w:tmpl w:val="C6540CAA"/>
@@ -4938,7 +6503,305 @@
       </w:rPr>
     </w:lvl>
   </w:abstractNum>
-  <w:abstractNum w:abstractNumId="2" w15:restartNumberingAfterBreak="0">
+  <w:abstractNum w:abstractNumId="3" w15:restartNumberingAfterBreak="0">
+    <w:nsid w:val="1C400CA2"/>
+    <w:multiLevelType w:val="multilevel"/>
+    <w:tmpl w:val="9C80864E"/>
+    <w:lvl w:ilvl="0">
+      <w:start w:val="1"/>
+      <w:numFmt w:val="bullet"/>
+      <w:lvlText w:val=""/>
+      <w:lvlJc w:val="left"/>
+      <w:pPr>
+        <w:tabs>
+          <w:tab w:val="num" w:pos="720"/>
+        </w:tabs>
+        <w:ind w:left="720" w:hanging="360"/>
+      </w:pPr>
+      <w:rPr>
+        <w:rFonts w:ascii="Symbol" w:hAnsi="Symbol" w:hint="default"/>
+        <w:sz w:val="20"/>
+      </w:rPr>
+    </w:lvl>
+    <w:lvl w:ilvl="1" w:tentative="1">
+      <w:start w:val="1"/>
+      <w:numFmt w:val="bullet"/>
+      <w:lvlText w:val="o"/>
+      <w:lvlJc w:val="left"/>
+      <w:pPr>
+        <w:tabs>
+          <w:tab w:val="num" w:pos="1440"/>
+        </w:tabs>
+        <w:ind w:left="1440" w:hanging="360"/>
+      </w:pPr>
+      <w:rPr>
+        <w:rFonts w:ascii="Courier New" w:hAnsi="Courier New" w:hint="default"/>
+        <w:sz w:val="20"/>
+      </w:rPr>
+    </w:lvl>
+    <w:lvl w:ilvl="2" w:tentative="1">
+      <w:start w:val="1"/>
+      <w:numFmt w:val="bullet"/>
+      <w:lvlText w:val=""/>
+      <w:lvlJc w:val="left"/>
+      <w:pPr>
+        <w:tabs>
+          <w:tab w:val="num" w:pos="2160"/>
+        </w:tabs>
+        <w:ind w:left="2160" w:hanging="360"/>
+      </w:pPr>
+      <w:rPr>
+        <w:rFonts w:ascii="Wingdings" w:hAnsi="Wingdings" w:hint="default"/>
+        <w:sz w:val="20"/>
+      </w:rPr>
+    </w:lvl>
+    <w:lvl w:ilvl="3" w:tentative="1">
+      <w:start w:val="1"/>
+      <w:numFmt w:val="bullet"/>
+      <w:lvlText w:val=""/>
+      <w:lvlJc w:val="left"/>
+      <w:pPr>
+        <w:tabs>
+          <w:tab w:val="num" w:pos="2880"/>
+        </w:tabs>
+        <w:ind w:left="2880" w:hanging="360"/>
+      </w:pPr>
+      <w:rPr>
+        <w:rFonts w:ascii="Wingdings" w:hAnsi="Wingdings" w:hint="default"/>
+        <w:sz w:val="20"/>
+      </w:rPr>
+    </w:lvl>
+    <w:lvl w:ilvl="4" w:tentative="1">
+      <w:start w:val="1"/>
+      <w:numFmt w:val="bullet"/>
+      <w:lvlText w:val=""/>
+      <w:lvlJc w:val="left"/>
+      <w:pPr>
+        <w:tabs>
+          <w:tab w:val="num" w:pos="3600"/>
+        </w:tabs>
+        <w:ind w:left="3600" w:hanging="360"/>
+      </w:pPr>
+      <w:rPr>
+        <w:rFonts w:ascii="Wingdings" w:hAnsi="Wingdings" w:hint="default"/>
+        <w:sz w:val="20"/>
+      </w:rPr>
+    </w:lvl>
+    <w:lvl w:ilvl="5" w:tentative="1">
+      <w:start w:val="1"/>
+      <w:numFmt w:val="bullet"/>
+      <w:lvlText w:val=""/>
+      <w:lvlJc w:val="left"/>
+      <w:pPr>
+        <w:tabs>
+          <w:tab w:val="num" w:pos="4320"/>
+        </w:tabs>
+        <w:ind w:left="4320" w:hanging="360"/>
+      </w:pPr>
+      <w:rPr>
+        <w:rFonts w:ascii="Wingdings" w:hAnsi="Wingdings" w:hint="default"/>
+        <w:sz w:val="20"/>
+      </w:rPr>
+    </w:lvl>
+    <w:lvl w:ilvl="6" w:tentative="1">
+      <w:start w:val="1"/>
+      <w:numFmt w:val="bullet"/>
+      <w:lvlText w:val=""/>
+      <w:lvlJc w:val="left"/>
+      <w:pPr>
+        <w:tabs>
+          <w:tab w:val="num" w:pos="5040"/>
+        </w:tabs>
+        <w:ind w:left="5040" w:hanging="360"/>
+      </w:pPr>
+      <w:rPr>
+        <w:rFonts w:ascii="Wingdings" w:hAnsi="Wingdings" w:hint="default"/>
+        <w:sz w:val="20"/>
+      </w:rPr>
+    </w:lvl>
+    <w:lvl w:ilvl="7" w:tentative="1">
+      <w:start w:val="1"/>
+      <w:numFmt w:val="bullet"/>
+      <w:lvlText w:val=""/>
+      <w:lvlJc w:val="left"/>
+      <w:pPr>
+        <w:tabs>
+          <w:tab w:val="num" w:pos="5760"/>
+        </w:tabs>
+        <w:ind w:left="5760" w:hanging="360"/>
+      </w:pPr>
+      <w:rPr>
+        <w:rFonts w:ascii="Wingdings" w:hAnsi="Wingdings" w:hint="default"/>
+        <w:sz w:val="20"/>
+      </w:rPr>
+    </w:lvl>
+    <w:lvl w:ilvl="8" w:tentative="1">
+      <w:start w:val="1"/>
+      <w:numFmt w:val="bullet"/>
+      <w:lvlText w:val=""/>
+      <w:lvlJc w:val="left"/>
+      <w:pPr>
+        <w:tabs>
+          <w:tab w:val="num" w:pos="6480"/>
+        </w:tabs>
+        <w:ind w:left="6480" w:hanging="360"/>
+      </w:pPr>
+      <w:rPr>
+        <w:rFonts w:ascii="Wingdings" w:hAnsi="Wingdings" w:hint="default"/>
+        <w:sz w:val="20"/>
+      </w:rPr>
+    </w:lvl>
+  </w:abstractNum>
+  <w:abstractNum w:abstractNumId="4" w15:restartNumberingAfterBreak="0">
+    <w:nsid w:val="1CA80269"/>
+    <w:multiLevelType w:val="multilevel"/>
+    <w:tmpl w:val="5D8093CE"/>
+    <w:lvl w:ilvl="0">
+      <w:start w:val="1"/>
+      <w:numFmt w:val="bullet"/>
+      <w:lvlText w:val=""/>
+      <w:lvlJc w:val="left"/>
+      <w:pPr>
+        <w:tabs>
+          <w:tab w:val="num" w:pos="720"/>
+        </w:tabs>
+        <w:ind w:left="720" w:hanging="360"/>
+      </w:pPr>
+      <w:rPr>
+        <w:rFonts w:ascii="Symbol" w:hAnsi="Symbol" w:hint="default"/>
+        <w:sz w:val="20"/>
+      </w:rPr>
+    </w:lvl>
+    <w:lvl w:ilvl="1" w:tentative="1">
+      <w:start w:val="1"/>
+      <w:numFmt w:val="bullet"/>
+      <w:lvlText w:val="o"/>
+      <w:lvlJc w:val="left"/>
+      <w:pPr>
+        <w:tabs>
+          <w:tab w:val="num" w:pos="1440"/>
+        </w:tabs>
+        <w:ind w:left="1440" w:hanging="360"/>
+      </w:pPr>
+      <w:rPr>
+        <w:rFonts w:ascii="Courier New" w:hAnsi="Courier New" w:hint="default"/>
+        <w:sz w:val="20"/>
+      </w:rPr>
+    </w:lvl>
+    <w:lvl w:ilvl="2" w:tentative="1">
+      <w:start w:val="1"/>
+      <w:numFmt w:val="bullet"/>
+      <w:lvlText w:val=""/>
+      <w:lvlJc w:val="left"/>
+      <w:pPr>
+        <w:tabs>
+          <w:tab w:val="num" w:pos="2160"/>
+        </w:tabs>
+        <w:ind w:left="2160" w:hanging="360"/>
+      </w:pPr>
+      <w:rPr>
+        <w:rFonts w:ascii="Wingdings" w:hAnsi="Wingdings" w:hint="default"/>
+        <w:sz w:val="20"/>
+      </w:rPr>
+    </w:lvl>
+    <w:lvl w:ilvl="3" w:tentative="1">
+      <w:start w:val="1"/>
+      <w:numFmt w:val="bullet"/>
+      <w:lvlText w:val=""/>
+      <w:lvlJc w:val="left"/>
+      <w:pPr>
+        <w:tabs>
+          <w:tab w:val="num" w:pos="2880"/>
+        </w:tabs>
+        <w:ind w:left="2880" w:hanging="360"/>
+      </w:pPr>
+      <w:rPr>
+        <w:rFonts w:ascii="Wingdings" w:hAnsi="Wingdings" w:hint="default"/>
+        <w:sz w:val="20"/>
+      </w:rPr>
+    </w:lvl>
+    <w:lvl w:ilvl="4" w:tentative="1">
+      <w:start w:val="1"/>
+      <w:numFmt w:val="bullet"/>
+      <w:lvlText w:val=""/>
+      <w:lvlJc w:val="left"/>
+      <w:pPr>
+        <w:tabs>
+          <w:tab w:val="num" w:pos="3600"/>
+        </w:tabs>
+        <w:ind w:left="3600" w:hanging="360"/>
+      </w:pPr>
+      <w:rPr>
+        <w:rFonts w:ascii="Wingdings" w:hAnsi="Wingdings" w:hint="default"/>
+        <w:sz w:val="20"/>
+      </w:rPr>
+    </w:lvl>
+    <w:lvl w:ilvl="5" w:tentative="1">
+      <w:start w:val="1"/>
+      <w:numFmt w:val="bullet"/>
+      <w:lvlText w:val=""/>
+      <w:lvlJc w:val="left"/>
+      <w:pPr>
+        <w:tabs>
+          <w:tab w:val="num" w:pos="4320"/>
+        </w:tabs>
+        <w:ind w:left="4320" w:hanging="360"/>
+      </w:pPr>
+      <w:rPr>
+        <w:rFonts w:ascii="Wingdings" w:hAnsi="Wingdings" w:hint="default"/>
+        <w:sz w:val="20"/>
+      </w:rPr>
+    </w:lvl>
+    <w:lvl w:ilvl="6" w:tentative="1">
+      <w:start w:val="1"/>
+      <w:numFmt w:val="bullet"/>
+      <w:lvlText w:val=""/>
+      <w:lvlJc w:val="left"/>
+      <w:pPr>
+        <w:tabs>
+          <w:tab w:val="num" w:pos="5040"/>
+        </w:tabs>
+        <w:ind w:left="5040" w:hanging="360"/>
+      </w:pPr>
+      <w:rPr>
+        <w:rFonts w:ascii="Wingdings" w:hAnsi="Wingdings" w:hint="default"/>
+        <w:sz w:val="20"/>
+      </w:rPr>
+    </w:lvl>
+    <w:lvl w:ilvl="7" w:tentative="1">
+      <w:start w:val="1"/>
+      <w:numFmt w:val="bullet"/>
+      <w:lvlText w:val=""/>
+      <w:lvlJc w:val="left"/>
+      <w:pPr>
+        <w:tabs>
+          <w:tab w:val="num" w:pos="5760"/>
+        </w:tabs>
+        <w:ind w:left="5760" w:hanging="360"/>
+      </w:pPr>
+      <w:rPr>
+        <w:rFonts w:ascii="Wingdings" w:hAnsi="Wingdings" w:hint="default"/>
+        <w:sz w:val="20"/>
+      </w:rPr>
+    </w:lvl>
+    <w:lvl w:ilvl="8" w:tentative="1">
+      <w:start w:val="1"/>
+      <w:numFmt w:val="bullet"/>
+      <w:lvlText w:val=""/>
+      <w:lvlJc w:val="left"/>
+      <w:pPr>
+        <w:tabs>
+          <w:tab w:val="num" w:pos="6480"/>
+        </w:tabs>
+        <w:ind w:left="6480" w:hanging="360"/>
+      </w:pPr>
+      <w:rPr>
+        <w:rFonts w:ascii="Wingdings" w:hAnsi="Wingdings" w:hint="default"/>
+        <w:sz w:val="20"/>
+      </w:rPr>
+    </w:lvl>
+  </w:abstractNum>
+  <w:abstractNum w:abstractNumId="5" w15:restartNumberingAfterBreak="0">
     <w:nsid w:val="1ECF1909"/>
     <w:multiLevelType w:val="multilevel"/>
     <w:tmpl w:val="2864CFAC"/>
@@ -5087,7 +6950,7 @@
       </w:rPr>
     </w:lvl>
   </w:abstractNum>
-  <w:abstractNum w:abstractNumId="3" w15:restartNumberingAfterBreak="0">
+  <w:abstractNum w:abstractNumId="6" w15:restartNumberingAfterBreak="0">
     <w:nsid w:val="1F9B279A"/>
     <w:multiLevelType w:val="multilevel"/>
     <w:tmpl w:val="E7BA563A"/>
@@ -5232,7 +7095,7 @@
       </w:rPr>
     </w:lvl>
   </w:abstractNum>
-  <w:abstractNum w:abstractNumId="4" w15:restartNumberingAfterBreak="0">
+  <w:abstractNum w:abstractNumId="7" w15:restartNumberingAfterBreak="0">
     <w:nsid w:val="1FB802D9"/>
     <w:multiLevelType w:val="multilevel"/>
     <w:tmpl w:val="CE320488"/>
@@ -5377,7 +7240,156 @@
       </w:rPr>
     </w:lvl>
   </w:abstractNum>
-  <w:abstractNum w:abstractNumId="5" w15:restartNumberingAfterBreak="0">
+  <w:abstractNum w:abstractNumId="8" w15:restartNumberingAfterBreak="0">
+    <w:nsid w:val="2169608C"/>
+    <w:multiLevelType w:val="multilevel"/>
+    <w:tmpl w:val="4042AFB4"/>
+    <w:lvl w:ilvl="0">
+      <w:start w:val="1"/>
+      <w:numFmt w:val="bullet"/>
+      <w:lvlText w:val=""/>
+      <w:lvlJc w:val="left"/>
+      <w:pPr>
+        <w:tabs>
+          <w:tab w:val="num" w:pos="720"/>
+        </w:tabs>
+        <w:ind w:left="720" w:hanging="360"/>
+      </w:pPr>
+      <w:rPr>
+        <w:rFonts w:ascii="Symbol" w:hAnsi="Symbol" w:hint="default"/>
+        <w:sz w:val="20"/>
+      </w:rPr>
+    </w:lvl>
+    <w:lvl w:ilvl="1" w:tentative="1">
+      <w:start w:val="1"/>
+      <w:numFmt w:val="bullet"/>
+      <w:lvlText w:val="o"/>
+      <w:lvlJc w:val="left"/>
+      <w:pPr>
+        <w:tabs>
+          <w:tab w:val="num" w:pos="1440"/>
+        </w:tabs>
+        <w:ind w:left="1440" w:hanging="360"/>
+      </w:pPr>
+      <w:rPr>
+        <w:rFonts w:ascii="Courier New" w:hAnsi="Courier New" w:hint="default"/>
+        <w:sz w:val="20"/>
+      </w:rPr>
+    </w:lvl>
+    <w:lvl w:ilvl="2" w:tentative="1">
+      <w:start w:val="1"/>
+      <w:numFmt w:val="bullet"/>
+      <w:lvlText w:val=""/>
+      <w:lvlJc w:val="left"/>
+      <w:pPr>
+        <w:tabs>
+          <w:tab w:val="num" w:pos="2160"/>
+        </w:tabs>
+        <w:ind w:left="2160" w:hanging="360"/>
+      </w:pPr>
+      <w:rPr>
+        <w:rFonts w:ascii="Wingdings" w:hAnsi="Wingdings" w:hint="default"/>
+        <w:sz w:val="20"/>
+      </w:rPr>
+    </w:lvl>
+    <w:lvl w:ilvl="3" w:tentative="1">
+      <w:start w:val="1"/>
+      <w:numFmt w:val="bullet"/>
+      <w:lvlText w:val=""/>
+      <w:lvlJc w:val="left"/>
+      <w:pPr>
+        <w:tabs>
+          <w:tab w:val="num" w:pos="2880"/>
+        </w:tabs>
+        <w:ind w:left="2880" w:hanging="360"/>
+      </w:pPr>
+      <w:rPr>
+        <w:rFonts w:ascii="Wingdings" w:hAnsi="Wingdings" w:hint="default"/>
+        <w:sz w:val="20"/>
+      </w:rPr>
+    </w:lvl>
+    <w:lvl w:ilvl="4" w:tentative="1">
+      <w:start w:val="1"/>
+      <w:numFmt w:val="bullet"/>
+      <w:lvlText w:val=""/>
+      <w:lvlJc w:val="left"/>
+      <w:pPr>
+        <w:tabs>
+          <w:tab w:val="num" w:pos="3600"/>
+        </w:tabs>
+        <w:ind w:left="3600" w:hanging="360"/>
+      </w:pPr>
+      <w:rPr>
+        <w:rFonts w:ascii="Wingdings" w:hAnsi="Wingdings" w:hint="default"/>
+        <w:sz w:val="20"/>
+      </w:rPr>
+    </w:lvl>
+    <w:lvl w:ilvl="5" w:tentative="1">
+      <w:start w:val="1"/>
+      <w:numFmt w:val="bullet"/>
+      <w:lvlText w:val=""/>
+      <w:lvlJc w:val="left"/>
+      <w:pPr>
+        <w:tabs>
+          <w:tab w:val="num" w:pos="4320"/>
+        </w:tabs>
+        <w:ind w:left="4320" w:hanging="360"/>
+      </w:pPr>
+      <w:rPr>
+        <w:rFonts w:ascii="Wingdings" w:hAnsi="Wingdings" w:hint="default"/>
+        <w:sz w:val="20"/>
+      </w:rPr>
+    </w:lvl>
+    <w:lvl w:ilvl="6" w:tentative="1">
+      <w:start w:val="1"/>
+      <w:numFmt w:val="bullet"/>
+      <w:lvlText w:val=""/>
+      <w:lvlJc w:val="left"/>
+      <w:pPr>
+        <w:tabs>
+          <w:tab w:val="num" w:pos="5040"/>
+        </w:tabs>
+        <w:ind w:left="5040" w:hanging="360"/>
+      </w:pPr>
+      <w:rPr>
+        <w:rFonts w:ascii="Wingdings" w:hAnsi="Wingdings" w:hint="default"/>
+        <w:sz w:val="20"/>
+      </w:rPr>
+    </w:lvl>
+    <w:lvl w:ilvl="7" w:tentative="1">
+      <w:start w:val="1"/>
+      <w:numFmt w:val="bullet"/>
+      <w:lvlText w:val=""/>
+      <w:lvlJc w:val="left"/>
+      <w:pPr>
+        <w:tabs>
+          <w:tab w:val="num" w:pos="5760"/>
+        </w:tabs>
+        <w:ind w:left="5760" w:hanging="360"/>
+      </w:pPr>
+      <w:rPr>
+        <w:rFonts w:ascii="Wingdings" w:hAnsi="Wingdings" w:hint="default"/>
+        <w:sz w:val="20"/>
+      </w:rPr>
+    </w:lvl>
+    <w:lvl w:ilvl="8" w:tentative="1">
+      <w:start w:val="1"/>
+      <w:numFmt w:val="bullet"/>
+      <w:lvlText w:val=""/>
+      <w:lvlJc w:val="left"/>
+      <w:pPr>
+        <w:tabs>
+          <w:tab w:val="num" w:pos="6480"/>
+        </w:tabs>
+        <w:ind w:left="6480" w:hanging="360"/>
+      </w:pPr>
+      <w:rPr>
+        <w:rFonts w:ascii="Wingdings" w:hAnsi="Wingdings" w:hint="default"/>
+        <w:sz w:val="20"/>
+      </w:rPr>
+    </w:lvl>
+  </w:abstractNum>
+  <w:abstractNum w:abstractNumId="9" w15:restartNumberingAfterBreak="0">
     <w:nsid w:val="24B9155C"/>
     <w:multiLevelType w:val="multilevel"/>
     <w:tmpl w:val="625257AC"/>
@@ -5526,7 +7538,7 @@
       </w:rPr>
     </w:lvl>
   </w:abstractNum>
-  <w:abstractNum w:abstractNumId="6" w15:restartNumberingAfterBreak="0">
+  <w:abstractNum w:abstractNumId="10" w15:restartNumberingAfterBreak="0">
     <w:nsid w:val="26425C9D"/>
     <w:multiLevelType w:val="multilevel"/>
     <w:tmpl w:val="83DADCBA"/>
@@ -5671,7 +7683,7 @@
       </w:rPr>
     </w:lvl>
   </w:abstractNum>
-  <w:abstractNum w:abstractNumId="7" w15:restartNumberingAfterBreak="0">
+  <w:abstractNum w:abstractNumId="11" w15:restartNumberingAfterBreak="0">
     <w:nsid w:val="2A7035AC"/>
     <w:multiLevelType w:val="multilevel"/>
     <w:tmpl w:val="AB821B04"/>
@@ -5820,7 +7832,7 @@
       </w:rPr>
     </w:lvl>
   </w:abstractNum>
-  <w:abstractNum w:abstractNumId="8" w15:restartNumberingAfterBreak="0">
+  <w:abstractNum w:abstractNumId="12" w15:restartNumberingAfterBreak="0">
     <w:nsid w:val="2CA03F71"/>
     <w:multiLevelType w:val="multilevel"/>
     <w:tmpl w:val="24320C24"/>
@@ -5969,7 +7981,156 @@
       </w:rPr>
     </w:lvl>
   </w:abstractNum>
-  <w:abstractNum w:abstractNumId="9" w15:restartNumberingAfterBreak="0">
+  <w:abstractNum w:abstractNumId="13" w15:restartNumberingAfterBreak="0">
+    <w:nsid w:val="2CAF7FF3"/>
+    <w:multiLevelType w:val="multilevel"/>
+    <w:tmpl w:val="CBAC44B2"/>
+    <w:lvl w:ilvl="0">
+      <w:start w:val="1"/>
+      <w:numFmt w:val="bullet"/>
+      <w:lvlText w:val=""/>
+      <w:lvlJc w:val="left"/>
+      <w:pPr>
+        <w:tabs>
+          <w:tab w:val="num" w:pos="720"/>
+        </w:tabs>
+        <w:ind w:left="720" w:hanging="360"/>
+      </w:pPr>
+      <w:rPr>
+        <w:rFonts w:ascii="Symbol" w:hAnsi="Symbol" w:hint="default"/>
+        <w:sz w:val="20"/>
+      </w:rPr>
+    </w:lvl>
+    <w:lvl w:ilvl="1" w:tentative="1">
+      <w:start w:val="1"/>
+      <w:numFmt w:val="bullet"/>
+      <w:lvlText w:val="o"/>
+      <w:lvlJc w:val="left"/>
+      <w:pPr>
+        <w:tabs>
+          <w:tab w:val="num" w:pos="1440"/>
+        </w:tabs>
+        <w:ind w:left="1440" w:hanging="360"/>
+      </w:pPr>
+      <w:rPr>
+        <w:rFonts w:ascii="Courier New" w:hAnsi="Courier New" w:hint="default"/>
+        <w:sz w:val="20"/>
+      </w:rPr>
+    </w:lvl>
+    <w:lvl w:ilvl="2" w:tentative="1">
+      <w:start w:val="1"/>
+      <w:numFmt w:val="bullet"/>
+      <w:lvlText w:val=""/>
+      <w:lvlJc w:val="left"/>
+      <w:pPr>
+        <w:tabs>
+          <w:tab w:val="num" w:pos="2160"/>
+        </w:tabs>
+        <w:ind w:left="2160" w:hanging="360"/>
+      </w:pPr>
+      <w:rPr>
+        <w:rFonts w:ascii="Wingdings" w:hAnsi="Wingdings" w:hint="default"/>
+        <w:sz w:val="20"/>
+      </w:rPr>
+    </w:lvl>
+    <w:lvl w:ilvl="3" w:tentative="1">
+      <w:start w:val="1"/>
+      <w:numFmt w:val="bullet"/>
+      <w:lvlText w:val=""/>
+      <w:lvlJc w:val="left"/>
+      <w:pPr>
+        <w:tabs>
+          <w:tab w:val="num" w:pos="2880"/>
+        </w:tabs>
+        <w:ind w:left="2880" w:hanging="360"/>
+      </w:pPr>
+      <w:rPr>
+        <w:rFonts w:ascii="Wingdings" w:hAnsi="Wingdings" w:hint="default"/>
+        <w:sz w:val="20"/>
+      </w:rPr>
+    </w:lvl>
+    <w:lvl w:ilvl="4" w:tentative="1">
+      <w:start w:val="1"/>
+      <w:numFmt w:val="bullet"/>
+      <w:lvlText w:val=""/>
+      <w:lvlJc w:val="left"/>
+      <w:pPr>
+        <w:tabs>
+          <w:tab w:val="num" w:pos="3600"/>
+        </w:tabs>
+        <w:ind w:left="3600" w:hanging="360"/>
+      </w:pPr>
+      <w:rPr>
+        <w:rFonts w:ascii="Wingdings" w:hAnsi="Wingdings" w:hint="default"/>
+        <w:sz w:val="20"/>
+      </w:rPr>
+    </w:lvl>
+    <w:lvl w:ilvl="5" w:tentative="1">
+      <w:start w:val="1"/>
+      <w:numFmt w:val="bullet"/>
+      <w:lvlText w:val=""/>
+      <w:lvlJc w:val="left"/>
+      <w:pPr>
+        <w:tabs>
+          <w:tab w:val="num" w:pos="4320"/>
+        </w:tabs>
+        <w:ind w:left="4320" w:hanging="360"/>
+      </w:pPr>
+      <w:rPr>
+        <w:rFonts w:ascii="Wingdings" w:hAnsi="Wingdings" w:hint="default"/>
+        <w:sz w:val="20"/>
+      </w:rPr>
+    </w:lvl>
+    <w:lvl w:ilvl="6" w:tentative="1">
+      <w:start w:val="1"/>
+      <w:numFmt w:val="bullet"/>
+      <w:lvlText w:val=""/>
+      <w:lvlJc w:val="left"/>
+      <w:pPr>
+        <w:tabs>
+          <w:tab w:val="num" w:pos="5040"/>
+        </w:tabs>
+        <w:ind w:left="5040" w:hanging="360"/>
+      </w:pPr>
+      <w:rPr>
+        <w:rFonts w:ascii="Wingdings" w:hAnsi="Wingdings" w:hint="default"/>
+        <w:sz w:val="20"/>
+      </w:rPr>
+    </w:lvl>
+    <w:lvl w:ilvl="7" w:tentative="1">
+      <w:start w:val="1"/>
+      <w:numFmt w:val="bullet"/>
+      <w:lvlText w:val=""/>
+      <w:lvlJc w:val="left"/>
+      <w:pPr>
+        <w:tabs>
+          <w:tab w:val="num" w:pos="5760"/>
+        </w:tabs>
+        <w:ind w:left="5760" w:hanging="360"/>
+      </w:pPr>
+      <w:rPr>
+        <w:rFonts w:ascii="Wingdings" w:hAnsi="Wingdings" w:hint="default"/>
+        <w:sz w:val="20"/>
+      </w:rPr>
+    </w:lvl>
+    <w:lvl w:ilvl="8" w:tentative="1">
+      <w:start w:val="1"/>
+      <w:numFmt w:val="bullet"/>
+      <w:lvlText w:val=""/>
+      <w:lvlJc w:val="left"/>
+      <w:pPr>
+        <w:tabs>
+          <w:tab w:val="num" w:pos="6480"/>
+        </w:tabs>
+        <w:ind w:left="6480" w:hanging="360"/>
+      </w:pPr>
+      <w:rPr>
+        <w:rFonts w:ascii="Wingdings" w:hAnsi="Wingdings" w:hint="default"/>
+        <w:sz w:val="20"/>
+      </w:rPr>
+    </w:lvl>
+  </w:abstractNum>
+  <w:abstractNum w:abstractNumId="14" w15:restartNumberingAfterBreak="0">
     <w:nsid w:val="2FE07389"/>
     <w:multiLevelType w:val="multilevel"/>
     <w:tmpl w:val="37A2D4D8"/>
@@ -6118,7 +8279,7 @@
       </w:rPr>
     </w:lvl>
   </w:abstractNum>
-  <w:abstractNum w:abstractNumId="10" w15:restartNumberingAfterBreak="0">
+  <w:abstractNum w:abstractNumId="15" w15:restartNumberingAfterBreak="0">
     <w:nsid w:val="306F5E8B"/>
     <w:multiLevelType w:val="multilevel"/>
     <w:tmpl w:val="772C5982"/>
@@ -6263,7 +8424,7 @@
       </w:rPr>
     </w:lvl>
   </w:abstractNum>
-  <w:abstractNum w:abstractNumId="11" w15:restartNumberingAfterBreak="0">
+  <w:abstractNum w:abstractNumId="16" w15:restartNumberingAfterBreak="0">
     <w:nsid w:val="39053FD9"/>
     <w:multiLevelType w:val="multilevel"/>
     <w:tmpl w:val="591C071C"/>
@@ -6412,7 +8573,7 @@
       </w:rPr>
     </w:lvl>
   </w:abstractNum>
-  <w:abstractNum w:abstractNumId="12" w15:restartNumberingAfterBreak="0">
+  <w:abstractNum w:abstractNumId="17" w15:restartNumberingAfterBreak="0">
     <w:nsid w:val="3F222A3D"/>
     <w:multiLevelType w:val="multilevel"/>
     <w:tmpl w:val="486A91DA"/>
@@ -6561,7 +8722,7 @@
       </w:rPr>
     </w:lvl>
   </w:abstractNum>
-  <w:abstractNum w:abstractNumId="13" w15:restartNumberingAfterBreak="0">
+  <w:abstractNum w:abstractNumId="18" w15:restartNumberingAfterBreak="0">
     <w:nsid w:val="44E71089"/>
     <w:multiLevelType w:val="multilevel"/>
     <w:tmpl w:val="F4BC59B4"/>
@@ -6710,7 +8871,156 @@
       </w:rPr>
     </w:lvl>
   </w:abstractNum>
-  <w:abstractNum w:abstractNumId="14" w15:restartNumberingAfterBreak="0">
+  <w:abstractNum w:abstractNumId="19" w15:restartNumberingAfterBreak="0">
+    <w:nsid w:val="455D3B44"/>
+    <w:multiLevelType w:val="multilevel"/>
+    <w:tmpl w:val="A2948046"/>
+    <w:lvl w:ilvl="0">
+      <w:start w:val="1"/>
+      <w:numFmt w:val="bullet"/>
+      <w:lvlText w:val=""/>
+      <w:lvlJc w:val="left"/>
+      <w:pPr>
+        <w:tabs>
+          <w:tab w:val="num" w:pos="720"/>
+        </w:tabs>
+        <w:ind w:left="720" w:hanging="360"/>
+      </w:pPr>
+      <w:rPr>
+        <w:rFonts w:ascii="Symbol" w:hAnsi="Symbol" w:hint="default"/>
+        <w:sz w:val="20"/>
+      </w:rPr>
+    </w:lvl>
+    <w:lvl w:ilvl="1" w:tentative="1">
+      <w:start w:val="1"/>
+      <w:numFmt w:val="bullet"/>
+      <w:lvlText w:val="o"/>
+      <w:lvlJc w:val="left"/>
+      <w:pPr>
+        <w:tabs>
+          <w:tab w:val="num" w:pos="1440"/>
+        </w:tabs>
+        <w:ind w:left="1440" w:hanging="360"/>
+      </w:pPr>
+      <w:rPr>
+        <w:rFonts w:ascii="Courier New" w:hAnsi="Courier New" w:hint="default"/>
+        <w:sz w:val="20"/>
+      </w:rPr>
+    </w:lvl>
+    <w:lvl w:ilvl="2" w:tentative="1">
+      <w:start w:val="1"/>
+      <w:numFmt w:val="bullet"/>
+      <w:lvlText w:val=""/>
+      <w:lvlJc w:val="left"/>
+      <w:pPr>
+        <w:tabs>
+          <w:tab w:val="num" w:pos="2160"/>
+        </w:tabs>
+        <w:ind w:left="2160" w:hanging="360"/>
+      </w:pPr>
+      <w:rPr>
+        <w:rFonts w:ascii="Wingdings" w:hAnsi="Wingdings" w:hint="default"/>
+        <w:sz w:val="20"/>
+      </w:rPr>
+    </w:lvl>
+    <w:lvl w:ilvl="3" w:tentative="1">
+      <w:start w:val="1"/>
+      <w:numFmt w:val="bullet"/>
+      <w:lvlText w:val=""/>
+      <w:lvlJc w:val="left"/>
+      <w:pPr>
+        <w:tabs>
+          <w:tab w:val="num" w:pos="2880"/>
+        </w:tabs>
+        <w:ind w:left="2880" w:hanging="360"/>
+      </w:pPr>
+      <w:rPr>
+        <w:rFonts w:ascii="Wingdings" w:hAnsi="Wingdings" w:hint="default"/>
+        <w:sz w:val="20"/>
+      </w:rPr>
+    </w:lvl>
+    <w:lvl w:ilvl="4" w:tentative="1">
+      <w:start w:val="1"/>
+      <w:numFmt w:val="bullet"/>
+      <w:lvlText w:val=""/>
+      <w:lvlJc w:val="left"/>
+      <w:pPr>
+        <w:tabs>
+          <w:tab w:val="num" w:pos="3600"/>
+        </w:tabs>
+        <w:ind w:left="3600" w:hanging="360"/>
+      </w:pPr>
+      <w:rPr>
+        <w:rFonts w:ascii="Wingdings" w:hAnsi="Wingdings" w:hint="default"/>
+        <w:sz w:val="20"/>
+      </w:rPr>
+    </w:lvl>
+    <w:lvl w:ilvl="5" w:tentative="1">
+      <w:start w:val="1"/>
+      <w:numFmt w:val="bullet"/>
+      <w:lvlText w:val=""/>
+      <w:lvlJc w:val="left"/>
+      <w:pPr>
+        <w:tabs>
+          <w:tab w:val="num" w:pos="4320"/>
+        </w:tabs>
+        <w:ind w:left="4320" w:hanging="360"/>
+      </w:pPr>
+      <w:rPr>
+        <w:rFonts w:ascii="Wingdings" w:hAnsi="Wingdings" w:hint="default"/>
+        <w:sz w:val="20"/>
+      </w:rPr>
+    </w:lvl>
+    <w:lvl w:ilvl="6" w:tentative="1">
+      <w:start w:val="1"/>
+      <w:numFmt w:val="bullet"/>
+      <w:lvlText w:val=""/>
+      <w:lvlJc w:val="left"/>
+      <w:pPr>
+        <w:tabs>
+          <w:tab w:val="num" w:pos="5040"/>
+        </w:tabs>
+        <w:ind w:left="5040" w:hanging="360"/>
+      </w:pPr>
+      <w:rPr>
+        <w:rFonts w:ascii="Wingdings" w:hAnsi="Wingdings" w:hint="default"/>
+        <w:sz w:val="20"/>
+      </w:rPr>
+    </w:lvl>
+    <w:lvl w:ilvl="7" w:tentative="1">
+      <w:start w:val="1"/>
+      <w:numFmt w:val="bullet"/>
+      <w:lvlText w:val=""/>
+      <w:lvlJc w:val="left"/>
+      <w:pPr>
+        <w:tabs>
+          <w:tab w:val="num" w:pos="5760"/>
+        </w:tabs>
+        <w:ind w:left="5760" w:hanging="360"/>
+      </w:pPr>
+      <w:rPr>
+        <w:rFonts w:ascii="Wingdings" w:hAnsi="Wingdings" w:hint="default"/>
+        <w:sz w:val="20"/>
+      </w:rPr>
+    </w:lvl>
+    <w:lvl w:ilvl="8" w:tentative="1">
+      <w:start w:val="1"/>
+      <w:numFmt w:val="bullet"/>
+      <w:lvlText w:val=""/>
+      <w:lvlJc w:val="left"/>
+      <w:pPr>
+        <w:tabs>
+          <w:tab w:val="num" w:pos="6480"/>
+        </w:tabs>
+        <w:ind w:left="6480" w:hanging="360"/>
+      </w:pPr>
+      <w:rPr>
+        <w:rFonts w:ascii="Wingdings" w:hAnsi="Wingdings" w:hint="default"/>
+        <w:sz w:val="20"/>
+      </w:rPr>
+    </w:lvl>
+  </w:abstractNum>
+  <w:abstractNum w:abstractNumId="20" w15:restartNumberingAfterBreak="0">
     <w:nsid w:val="4F652183"/>
     <w:multiLevelType w:val="multilevel"/>
     <w:tmpl w:val="BC827CFA"/>
@@ -6859,7 +9169,156 @@
       </w:rPr>
     </w:lvl>
   </w:abstractNum>
-  <w:abstractNum w:abstractNumId="15" w15:restartNumberingAfterBreak="0">
+  <w:abstractNum w:abstractNumId="21" w15:restartNumberingAfterBreak="0">
+    <w:nsid w:val="52112CEC"/>
+    <w:multiLevelType w:val="multilevel"/>
+    <w:tmpl w:val="4BDCC2A8"/>
+    <w:lvl w:ilvl="0">
+      <w:start w:val="1"/>
+      <w:numFmt w:val="bullet"/>
+      <w:lvlText w:val=""/>
+      <w:lvlJc w:val="left"/>
+      <w:pPr>
+        <w:tabs>
+          <w:tab w:val="num" w:pos="720"/>
+        </w:tabs>
+        <w:ind w:left="720" w:hanging="360"/>
+      </w:pPr>
+      <w:rPr>
+        <w:rFonts w:ascii="Symbol" w:hAnsi="Symbol" w:hint="default"/>
+        <w:sz w:val="20"/>
+      </w:rPr>
+    </w:lvl>
+    <w:lvl w:ilvl="1" w:tentative="1">
+      <w:start w:val="1"/>
+      <w:numFmt w:val="bullet"/>
+      <w:lvlText w:val="o"/>
+      <w:lvlJc w:val="left"/>
+      <w:pPr>
+        <w:tabs>
+          <w:tab w:val="num" w:pos="1440"/>
+        </w:tabs>
+        <w:ind w:left="1440" w:hanging="360"/>
+      </w:pPr>
+      <w:rPr>
+        <w:rFonts w:ascii="Courier New" w:hAnsi="Courier New" w:hint="default"/>
+        <w:sz w:val="20"/>
+      </w:rPr>
+    </w:lvl>
+    <w:lvl w:ilvl="2" w:tentative="1">
+      <w:start w:val="1"/>
+      <w:numFmt w:val="bullet"/>
+      <w:lvlText w:val=""/>
+      <w:lvlJc w:val="left"/>
+      <w:pPr>
+        <w:tabs>
+          <w:tab w:val="num" w:pos="2160"/>
+        </w:tabs>
+        <w:ind w:left="2160" w:hanging="360"/>
+      </w:pPr>
+      <w:rPr>
+        <w:rFonts w:ascii="Wingdings" w:hAnsi="Wingdings" w:hint="default"/>
+        <w:sz w:val="20"/>
+      </w:rPr>
+    </w:lvl>
+    <w:lvl w:ilvl="3" w:tentative="1">
+      <w:start w:val="1"/>
+      <w:numFmt w:val="bullet"/>
+      <w:lvlText w:val=""/>
+      <w:lvlJc w:val="left"/>
+      <w:pPr>
+        <w:tabs>
+          <w:tab w:val="num" w:pos="2880"/>
+        </w:tabs>
+        <w:ind w:left="2880" w:hanging="360"/>
+      </w:pPr>
+      <w:rPr>
+        <w:rFonts w:ascii="Wingdings" w:hAnsi="Wingdings" w:hint="default"/>
+        <w:sz w:val="20"/>
+      </w:rPr>
+    </w:lvl>
+    <w:lvl w:ilvl="4" w:tentative="1">
+      <w:start w:val="1"/>
+      <w:numFmt w:val="bullet"/>
+      <w:lvlText w:val=""/>
+      <w:lvlJc w:val="left"/>
+      <w:pPr>
+        <w:tabs>
+          <w:tab w:val="num" w:pos="3600"/>
+        </w:tabs>
+        <w:ind w:left="3600" w:hanging="360"/>
+      </w:pPr>
+      <w:rPr>
+        <w:rFonts w:ascii="Wingdings" w:hAnsi="Wingdings" w:hint="default"/>
+        <w:sz w:val="20"/>
+      </w:rPr>
+    </w:lvl>
+    <w:lvl w:ilvl="5" w:tentative="1">
+      <w:start w:val="1"/>
+      <w:numFmt w:val="bullet"/>
+      <w:lvlText w:val=""/>
+      <w:lvlJc w:val="left"/>
+      <w:pPr>
+        <w:tabs>
+          <w:tab w:val="num" w:pos="4320"/>
+        </w:tabs>
+        <w:ind w:left="4320" w:hanging="360"/>
+      </w:pPr>
+      <w:rPr>
+        <w:rFonts w:ascii="Wingdings" w:hAnsi="Wingdings" w:hint="default"/>
+        <w:sz w:val="20"/>
+      </w:rPr>
+    </w:lvl>
+    <w:lvl w:ilvl="6" w:tentative="1">
+      <w:start w:val="1"/>
+      <w:numFmt w:val="bullet"/>
+      <w:lvlText w:val=""/>
+      <w:lvlJc w:val="left"/>
+      <w:pPr>
+        <w:tabs>
+          <w:tab w:val="num" w:pos="5040"/>
+        </w:tabs>
+        <w:ind w:left="5040" w:hanging="360"/>
+      </w:pPr>
+      <w:rPr>
+        <w:rFonts w:ascii="Wingdings" w:hAnsi="Wingdings" w:hint="default"/>
+        <w:sz w:val="20"/>
+      </w:rPr>
+    </w:lvl>
+    <w:lvl w:ilvl="7" w:tentative="1">
+      <w:start w:val="1"/>
+      <w:numFmt w:val="bullet"/>
+      <w:lvlText w:val=""/>
+      <w:lvlJc w:val="left"/>
+      <w:pPr>
+        <w:tabs>
+          <w:tab w:val="num" w:pos="5760"/>
+        </w:tabs>
+        <w:ind w:left="5760" w:hanging="360"/>
+      </w:pPr>
+      <w:rPr>
+        <w:rFonts w:ascii="Wingdings" w:hAnsi="Wingdings" w:hint="default"/>
+        <w:sz w:val="20"/>
+      </w:rPr>
+    </w:lvl>
+    <w:lvl w:ilvl="8" w:tentative="1">
+      <w:start w:val="1"/>
+      <w:numFmt w:val="bullet"/>
+      <w:lvlText w:val=""/>
+      <w:lvlJc w:val="left"/>
+      <w:pPr>
+        <w:tabs>
+          <w:tab w:val="num" w:pos="6480"/>
+        </w:tabs>
+        <w:ind w:left="6480" w:hanging="360"/>
+      </w:pPr>
+      <w:rPr>
+        <w:rFonts w:ascii="Wingdings" w:hAnsi="Wingdings" w:hint="default"/>
+        <w:sz w:val="20"/>
+      </w:rPr>
+    </w:lvl>
+  </w:abstractNum>
+  <w:abstractNum w:abstractNumId="22" w15:restartNumberingAfterBreak="0">
     <w:nsid w:val="57DF4F51"/>
     <w:multiLevelType w:val="multilevel"/>
     <w:tmpl w:val="44E8CCF8"/>
@@ -7004,7 +9463,7 @@
       </w:rPr>
     </w:lvl>
   </w:abstractNum>
-  <w:abstractNum w:abstractNumId="16" w15:restartNumberingAfterBreak="0">
+  <w:abstractNum w:abstractNumId="23" w15:restartNumberingAfterBreak="0">
     <w:nsid w:val="59387BDC"/>
     <w:multiLevelType w:val="multilevel"/>
     <w:tmpl w:val="FD647D40"/>
@@ -7153,7 +9612,7 @@
       </w:rPr>
     </w:lvl>
   </w:abstractNum>
-  <w:abstractNum w:abstractNumId="17" w15:restartNumberingAfterBreak="0">
+  <w:abstractNum w:abstractNumId="24" w15:restartNumberingAfterBreak="0">
     <w:nsid w:val="596827DA"/>
     <w:multiLevelType w:val="multilevel"/>
     <w:tmpl w:val="22626E4C"/>
@@ -7298,7 +9757,7 @@
       </w:rPr>
     </w:lvl>
   </w:abstractNum>
-  <w:abstractNum w:abstractNumId="18" w15:restartNumberingAfterBreak="0">
+  <w:abstractNum w:abstractNumId="25" w15:restartNumberingAfterBreak="0">
     <w:nsid w:val="5A3155E4"/>
     <w:multiLevelType w:val="multilevel"/>
     <w:tmpl w:val="A7EA3098"/>
@@ -7443,7 +9902,7 @@
       </w:rPr>
     </w:lvl>
   </w:abstractNum>
-  <w:abstractNum w:abstractNumId="19" w15:restartNumberingAfterBreak="0">
+  <w:abstractNum w:abstractNumId="26" w15:restartNumberingAfterBreak="0">
     <w:nsid w:val="5AEF4332"/>
     <w:multiLevelType w:val="multilevel"/>
     <w:tmpl w:val="319690FE"/>
@@ -7592,7 +10051,7 @@
       </w:rPr>
     </w:lvl>
   </w:abstractNum>
-  <w:abstractNum w:abstractNumId="20" w15:restartNumberingAfterBreak="0">
+  <w:abstractNum w:abstractNumId="27" w15:restartNumberingAfterBreak="0">
     <w:nsid w:val="5D03164B"/>
     <w:multiLevelType w:val="multilevel"/>
     <w:tmpl w:val="FA8C8E6C"/>
@@ -7741,7 +10200,7 @@
       </w:rPr>
     </w:lvl>
   </w:abstractNum>
-  <w:abstractNum w:abstractNumId="21" w15:restartNumberingAfterBreak="0">
+  <w:abstractNum w:abstractNumId="28" w15:restartNumberingAfterBreak="0">
     <w:nsid w:val="659C4B51"/>
     <w:multiLevelType w:val="multilevel"/>
     <w:tmpl w:val="39D87F7A"/>
@@ -7890,7 +10349,156 @@
       </w:rPr>
     </w:lvl>
   </w:abstractNum>
-  <w:abstractNum w:abstractNumId="22" w15:restartNumberingAfterBreak="0">
+  <w:abstractNum w:abstractNumId="29" w15:restartNumberingAfterBreak="0">
+    <w:nsid w:val="6AE80BF0"/>
+    <w:multiLevelType w:val="multilevel"/>
+    <w:tmpl w:val="7138ED50"/>
+    <w:lvl w:ilvl="0">
+      <w:start w:val="1"/>
+      <w:numFmt w:val="bullet"/>
+      <w:lvlText w:val=""/>
+      <w:lvlJc w:val="left"/>
+      <w:pPr>
+        <w:tabs>
+          <w:tab w:val="num" w:pos="720"/>
+        </w:tabs>
+        <w:ind w:left="720" w:hanging="360"/>
+      </w:pPr>
+      <w:rPr>
+        <w:rFonts w:ascii="Symbol" w:hAnsi="Symbol" w:hint="default"/>
+        <w:sz w:val="20"/>
+      </w:rPr>
+    </w:lvl>
+    <w:lvl w:ilvl="1">
+      <w:start w:val="1"/>
+      <w:numFmt w:val="bullet"/>
+      <w:lvlText w:val="o"/>
+      <w:lvlJc w:val="left"/>
+      <w:pPr>
+        <w:tabs>
+          <w:tab w:val="num" w:pos="1440"/>
+        </w:tabs>
+        <w:ind w:left="1440" w:hanging="360"/>
+      </w:pPr>
+      <w:rPr>
+        <w:rFonts w:ascii="Courier New" w:hAnsi="Courier New" w:hint="default"/>
+        <w:sz w:val="20"/>
+      </w:rPr>
+    </w:lvl>
+    <w:lvl w:ilvl="2" w:tentative="1">
+      <w:start w:val="1"/>
+      <w:numFmt w:val="bullet"/>
+      <w:lvlText w:val=""/>
+      <w:lvlJc w:val="left"/>
+      <w:pPr>
+        <w:tabs>
+          <w:tab w:val="num" w:pos="2160"/>
+        </w:tabs>
+        <w:ind w:left="2160" w:hanging="360"/>
+      </w:pPr>
+      <w:rPr>
+        <w:rFonts w:ascii="Wingdings" w:hAnsi="Wingdings" w:hint="default"/>
+        <w:sz w:val="20"/>
+      </w:rPr>
+    </w:lvl>
+    <w:lvl w:ilvl="3" w:tentative="1">
+      <w:start w:val="1"/>
+      <w:numFmt w:val="bullet"/>
+      <w:lvlText w:val=""/>
+      <w:lvlJc w:val="left"/>
+      <w:pPr>
+        <w:tabs>
+          <w:tab w:val="num" w:pos="2880"/>
+        </w:tabs>
+        <w:ind w:left="2880" w:hanging="360"/>
+      </w:pPr>
+      <w:rPr>
+        <w:rFonts w:ascii="Wingdings" w:hAnsi="Wingdings" w:hint="default"/>
+        <w:sz w:val="20"/>
+      </w:rPr>
+    </w:lvl>
+    <w:lvl w:ilvl="4" w:tentative="1">
+      <w:start w:val="1"/>
+      <w:numFmt w:val="bullet"/>
+      <w:lvlText w:val=""/>
+      <w:lvlJc w:val="left"/>
+      <w:pPr>
+        <w:tabs>
+          <w:tab w:val="num" w:pos="3600"/>
+        </w:tabs>
+        <w:ind w:left="3600" w:hanging="360"/>
+      </w:pPr>
+      <w:rPr>
+        <w:rFonts w:ascii="Wingdings" w:hAnsi="Wingdings" w:hint="default"/>
+        <w:sz w:val="20"/>
+      </w:rPr>
+    </w:lvl>
+    <w:lvl w:ilvl="5" w:tentative="1">
+      <w:start w:val="1"/>
+      <w:numFmt w:val="bullet"/>
+      <w:lvlText w:val=""/>
+      <w:lvlJc w:val="left"/>
+      <w:pPr>
+        <w:tabs>
+          <w:tab w:val="num" w:pos="4320"/>
+        </w:tabs>
+        <w:ind w:left="4320" w:hanging="360"/>
+      </w:pPr>
+      <w:rPr>
+        <w:rFonts w:ascii="Wingdings" w:hAnsi="Wingdings" w:hint="default"/>
+        <w:sz w:val="20"/>
+      </w:rPr>
+    </w:lvl>
+    <w:lvl w:ilvl="6" w:tentative="1">
+      <w:start w:val="1"/>
+      <w:numFmt w:val="bullet"/>
+      <w:lvlText w:val=""/>
+      <w:lvlJc w:val="left"/>
+      <w:pPr>
+        <w:tabs>
+          <w:tab w:val="num" w:pos="5040"/>
+        </w:tabs>
+        <w:ind w:left="5040" w:hanging="360"/>
+      </w:pPr>
+      <w:rPr>
+        <w:rFonts w:ascii="Wingdings" w:hAnsi="Wingdings" w:hint="default"/>
+        <w:sz w:val="20"/>
+      </w:rPr>
+    </w:lvl>
+    <w:lvl w:ilvl="7" w:tentative="1">
+      <w:start w:val="1"/>
+      <w:numFmt w:val="bullet"/>
+      <w:lvlText w:val=""/>
+      <w:lvlJc w:val="left"/>
+      <w:pPr>
+        <w:tabs>
+          <w:tab w:val="num" w:pos="5760"/>
+        </w:tabs>
+        <w:ind w:left="5760" w:hanging="360"/>
+      </w:pPr>
+      <w:rPr>
+        <w:rFonts w:ascii="Wingdings" w:hAnsi="Wingdings" w:hint="default"/>
+        <w:sz w:val="20"/>
+      </w:rPr>
+    </w:lvl>
+    <w:lvl w:ilvl="8" w:tentative="1">
+      <w:start w:val="1"/>
+      <w:numFmt w:val="bullet"/>
+      <w:lvlText w:val=""/>
+      <w:lvlJc w:val="left"/>
+      <w:pPr>
+        <w:tabs>
+          <w:tab w:val="num" w:pos="6480"/>
+        </w:tabs>
+        <w:ind w:left="6480" w:hanging="360"/>
+      </w:pPr>
+      <w:rPr>
+        <w:rFonts w:ascii="Wingdings" w:hAnsi="Wingdings" w:hint="default"/>
+        <w:sz w:val="20"/>
+      </w:rPr>
+    </w:lvl>
+  </w:abstractNum>
+  <w:abstractNum w:abstractNumId="30" w15:restartNumberingAfterBreak="0">
     <w:nsid w:val="6B4B59D2"/>
     <w:multiLevelType w:val="multilevel"/>
     <w:tmpl w:val="0BB0C054"/>
@@ -8039,7 +10647,156 @@
       </w:rPr>
     </w:lvl>
   </w:abstractNum>
-  <w:abstractNum w:abstractNumId="23" w15:restartNumberingAfterBreak="0">
+  <w:abstractNum w:abstractNumId="31" w15:restartNumberingAfterBreak="0">
+    <w:nsid w:val="6B672276"/>
+    <w:multiLevelType w:val="multilevel"/>
+    <w:tmpl w:val="98208C9A"/>
+    <w:lvl w:ilvl="0">
+      <w:start w:val="1"/>
+      <w:numFmt w:val="bullet"/>
+      <w:lvlText w:val=""/>
+      <w:lvlJc w:val="left"/>
+      <w:pPr>
+        <w:tabs>
+          <w:tab w:val="num" w:pos="720"/>
+        </w:tabs>
+        <w:ind w:left="720" w:hanging="360"/>
+      </w:pPr>
+      <w:rPr>
+        <w:rFonts w:ascii="Symbol" w:hAnsi="Symbol" w:hint="default"/>
+        <w:sz w:val="20"/>
+      </w:rPr>
+    </w:lvl>
+    <w:lvl w:ilvl="1" w:tentative="1">
+      <w:start w:val="1"/>
+      <w:numFmt w:val="bullet"/>
+      <w:lvlText w:val="o"/>
+      <w:lvlJc w:val="left"/>
+      <w:pPr>
+        <w:tabs>
+          <w:tab w:val="num" w:pos="1440"/>
+        </w:tabs>
+        <w:ind w:left="1440" w:hanging="360"/>
+      </w:pPr>
+      <w:rPr>
+        <w:rFonts w:ascii="Courier New" w:hAnsi="Courier New" w:hint="default"/>
+        <w:sz w:val="20"/>
+      </w:rPr>
+    </w:lvl>
+    <w:lvl w:ilvl="2" w:tentative="1">
+      <w:start w:val="1"/>
+      <w:numFmt w:val="bullet"/>
+      <w:lvlText w:val=""/>
+      <w:lvlJc w:val="left"/>
+      <w:pPr>
+        <w:tabs>
+          <w:tab w:val="num" w:pos="2160"/>
+        </w:tabs>
+        <w:ind w:left="2160" w:hanging="360"/>
+      </w:pPr>
+      <w:rPr>
+        <w:rFonts w:ascii="Wingdings" w:hAnsi="Wingdings" w:hint="default"/>
+        <w:sz w:val="20"/>
+      </w:rPr>
+    </w:lvl>
+    <w:lvl w:ilvl="3" w:tentative="1">
+      <w:start w:val="1"/>
+      <w:numFmt w:val="bullet"/>
+      <w:lvlText w:val=""/>
+      <w:lvlJc w:val="left"/>
+      <w:pPr>
+        <w:tabs>
+          <w:tab w:val="num" w:pos="2880"/>
+        </w:tabs>
+        <w:ind w:left="2880" w:hanging="360"/>
+      </w:pPr>
+      <w:rPr>
+        <w:rFonts w:ascii="Wingdings" w:hAnsi="Wingdings" w:hint="default"/>
+        <w:sz w:val="20"/>
+      </w:rPr>
+    </w:lvl>
+    <w:lvl w:ilvl="4" w:tentative="1">
+      <w:start w:val="1"/>
+      <w:numFmt w:val="bullet"/>
+      <w:lvlText w:val=""/>
+      <w:lvlJc w:val="left"/>
+      <w:pPr>
+        <w:tabs>
+          <w:tab w:val="num" w:pos="3600"/>
+        </w:tabs>
+        <w:ind w:left="3600" w:hanging="360"/>
+      </w:pPr>
+      <w:rPr>
+        <w:rFonts w:ascii="Wingdings" w:hAnsi="Wingdings" w:hint="default"/>
+        <w:sz w:val="20"/>
+      </w:rPr>
+    </w:lvl>
+    <w:lvl w:ilvl="5" w:tentative="1">
+      <w:start w:val="1"/>
+      <w:numFmt w:val="bullet"/>
+      <w:lvlText w:val=""/>
+      <w:lvlJc w:val="left"/>
+      <w:pPr>
+        <w:tabs>
+          <w:tab w:val="num" w:pos="4320"/>
+        </w:tabs>
+        <w:ind w:left="4320" w:hanging="360"/>
+      </w:pPr>
+      <w:rPr>
+        <w:rFonts w:ascii="Wingdings" w:hAnsi="Wingdings" w:hint="default"/>
+        <w:sz w:val="20"/>
+      </w:rPr>
+    </w:lvl>
+    <w:lvl w:ilvl="6" w:tentative="1">
+      <w:start w:val="1"/>
+      <w:numFmt w:val="bullet"/>
+      <w:lvlText w:val=""/>
+      <w:lvlJc w:val="left"/>
+      <w:pPr>
+        <w:tabs>
+          <w:tab w:val="num" w:pos="5040"/>
+        </w:tabs>
+        <w:ind w:left="5040" w:hanging="360"/>
+      </w:pPr>
+      <w:rPr>
+        <w:rFonts w:ascii="Wingdings" w:hAnsi="Wingdings" w:hint="default"/>
+        <w:sz w:val="20"/>
+      </w:rPr>
+    </w:lvl>
+    <w:lvl w:ilvl="7" w:tentative="1">
+      <w:start w:val="1"/>
+      <w:numFmt w:val="bullet"/>
+      <w:lvlText w:val=""/>
+      <w:lvlJc w:val="left"/>
+      <w:pPr>
+        <w:tabs>
+          <w:tab w:val="num" w:pos="5760"/>
+        </w:tabs>
+        <w:ind w:left="5760" w:hanging="360"/>
+      </w:pPr>
+      <w:rPr>
+        <w:rFonts w:ascii="Wingdings" w:hAnsi="Wingdings" w:hint="default"/>
+        <w:sz w:val="20"/>
+      </w:rPr>
+    </w:lvl>
+    <w:lvl w:ilvl="8" w:tentative="1">
+      <w:start w:val="1"/>
+      <w:numFmt w:val="bullet"/>
+      <w:lvlText w:val=""/>
+      <w:lvlJc w:val="left"/>
+      <w:pPr>
+        <w:tabs>
+          <w:tab w:val="num" w:pos="6480"/>
+        </w:tabs>
+        <w:ind w:left="6480" w:hanging="360"/>
+      </w:pPr>
+      <w:rPr>
+        <w:rFonts w:ascii="Wingdings" w:hAnsi="Wingdings" w:hint="default"/>
+        <w:sz w:val="20"/>
+      </w:rPr>
+    </w:lvl>
+  </w:abstractNum>
+  <w:abstractNum w:abstractNumId="32" w15:restartNumberingAfterBreak="0">
     <w:nsid w:val="72C961FD"/>
     <w:multiLevelType w:val="multilevel"/>
     <w:tmpl w:val="EF00655A"/>
@@ -8185,82 +10942,109 @@
     </w:lvl>
   </w:abstractNum>
   <w:num w:numId="1" w16cid:durableId="1588222300">
-    <w:abstractNumId w:val="13"/>
+    <w:abstractNumId w:val="18"/>
   </w:num>
   <w:num w:numId="2" w16cid:durableId="2089687452">
-    <w:abstractNumId w:val="19"/>
+    <w:abstractNumId w:val="26"/>
   </w:num>
   <w:num w:numId="3" w16cid:durableId="397703464">
+    <w:abstractNumId w:val="16"/>
+  </w:num>
+  <w:num w:numId="4" w16cid:durableId="280382709">
+    <w:abstractNumId w:val="20"/>
+  </w:num>
+  <w:num w:numId="5" w16cid:durableId="1527674285">
     <w:abstractNumId w:val="11"/>
   </w:num>
-  <w:num w:numId="4" w16cid:durableId="280382709">
+  <w:num w:numId="6" w16cid:durableId="123810299">
+    <w:abstractNumId w:val="30"/>
+  </w:num>
+  <w:num w:numId="7" w16cid:durableId="2090272123">
     <w:abstractNumId w:val="14"/>
   </w:num>
-  <w:num w:numId="5" w16cid:durableId="1527674285">
-    <w:abstractNumId w:val="7"/>
-  </w:num>
-  <w:num w:numId="6" w16cid:durableId="123810299">
-    <w:abstractNumId w:val="22"/>
-  </w:num>
-  <w:num w:numId="7" w16cid:durableId="2090272123">
-    <w:abstractNumId w:val="9"/>
-  </w:num>
   <w:num w:numId="8" w16cid:durableId="439878419">
-    <w:abstractNumId w:val="20"/>
+    <w:abstractNumId w:val="27"/>
   </w:num>
   <w:num w:numId="9" w16cid:durableId="1099985614">
-    <w:abstractNumId w:val="2"/>
+    <w:abstractNumId w:val="5"/>
   </w:num>
   <w:num w:numId="10" w16cid:durableId="1796945683">
-    <w:abstractNumId w:val="5"/>
+    <w:abstractNumId w:val="9"/>
   </w:num>
   <w:num w:numId="11" w16cid:durableId="94329195">
     <w:abstractNumId w:val="0"/>
   </w:num>
   <w:num w:numId="12" w16cid:durableId="543949881">
+    <w:abstractNumId w:val="7"/>
+  </w:num>
+  <w:num w:numId="13" w16cid:durableId="686368319">
+    <w:abstractNumId w:val="10"/>
+  </w:num>
+  <w:num w:numId="14" w16cid:durableId="1670987982">
+    <w:abstractNumId w:val="32"/>
+  </w:num>
+  <w:num w:numId="15" w16cid:durableId="1381202660">
+    <w:abstractNumId w:val="25"/>
+  </w:num>
+  <w:num w:numId="16" w16cid:durableId="2020303109">
+    <w:abstractNumId w:val="22"/>
+  </w:num>
+  <w:num w:numId="17" w16cid:durableId="1607694605">
+    <w:abstractNumId w:val="24"/>
+  </w:num>
+  <w:num w:numId="18" w16cid:durableId="655645792">
+    <w:abstractNumId w:val="15"/>
+  </w:num>
+  <w:num w:numId="19" w16cid:durableId="1130517311">
+    <w:abstractNumId w:val="6"/>
+  </w:num>
+  <w:num w:numId="20" w16cid:durableId="1141506554">
+    <w:abstractNumId w:val="23"/>
+  </w:num>
+  <w:num w:numId="21" w16cid:durableId="424542347">
+    <w:abstractNumId w:val="2"/>
+  </w:num>
+  <w:num w:numId="22" w16cid:durableId="19356756">
+    <w:abstractNumId w:val="28"/>
+  </w:num>
+  <w:num w:numId="23" w16cid:durableId="2058040637">
+    <w:abstractNumId w:val="17"/>
+  </w:num>
+  <w:num w:numId="24" w16cid:durableId="527259456">
+    <w:abstractNumId w:val="12"/>
+  </w:num>
+  <w:num w:numId="25" w16cid:durableId="1264418365">
+    <w:abstractNumId w:val="8"/>
+  </w:num>
+  <w:num w:numId="26" w16cid:durableId="771558162">
+    <w:abstractNumId w:val="19"/>
+  </w:num>
+  <w:num w:numId="27" w16cid:durableId="1715151768">
+    <w:abstractNumId w:val="1"/>
+  </w:num>
+  <w:num w:numId="28" w16cid:durableId="729614964">
+    <w:abstractNumId w:val="13"/>
+  </w:num>
+  <w:num w:numId="29" w16cid:durableId="685013139">
+    <w:abstractNumId w:val="31"/>
+  </w:num>
+  <w:num w:numId="30" w16cid:durableId="1393232898">
+    <w:abstractNumId w:val="3"/>
+  </w:num>
+  <w:num w:numId="31" w16cid:durableId="1459882097">
+    <w:abstractNumId w:val="29"/>
+  </w:num>
+  <w:num w:numId="32" w16cid:durableId="23755228">
     <w:abstractNumId w:val="4"/>
   </w:num>
-  <w:num w:numId="13" w16cid:durableId="686368319">
-    <w:abstractNumId w:val="6"/>
-  </w:num>
-  <w:num w:numId="14" w16cid:durableId="1670987982">
-    <w:abstractNumId w:val="23"/>
-  </w:num>
-  <w:num w:numId="15" w16cid:durableId="1381202660">
-    <w:abstractNumId w:val="18"/>
-  </w:num>
-  <w:num w:numId="16" w16cid:durableId="2020303109">
-    <w:abstractNumId w:val="15"/>
-  </w:num>
-  <w:num w:numId="17" w16cid:durableId="1607694605">
-    <w:abstractNumId w:val="17"/>
-  </w:num>
-  <w:num w:numId="18" w16cid:durableId="655645792">
-    <w:abstractNumId w:val="10"/>
-  </w:num>
-  <w:num w:numId="19" w16cid:durableId="1130517311">
-    <w:abstractNumId w:val="3"/>
-  </w:num>
-  <w:num w:numId="20" w16cid:durableId="1141506554">
-    <w:abstractNumId w:val="16"/>
-  </w:num>
-  <w:num w:numId="21" w16cid:durableId="424542347">
-    <w:abstractNumId w:val="1"/>
-  </w:num>
-  <w:num w:numId="22" w16cid:durableId="19356756">
+  <w:num w:numId="33" w16cid:durableId="1374387751">
     <w:abstractNumId w:val="21"/>
-  </w:num>
-  <w:num w:numId="23" w16cid:durableId="2058040637">
-    <w:abstractNumId w:val="12"/>
-  </w:num>
-  <w:num w:numId="24" w16cid:durableId="527259456">
-    <w:abstractNumId w:val="8"/>
   </w:num>
 </w:numbering>
 </file>
 
 <file path=word/styles.xml><?xml version="1.0" encoding="utf-8"?>
-<w:styles xmlns:mc="http://schemas.openxmlformats.org/markup-compatibility/2006" xmlns:r="http://schemas.openxmlformats.org/officeDocument/2006/relationships" xmlns:w="http://schemas.openxmlformats.org/wordprocessingml/2006/main" xmlns:w14="http://schemas.microsoft.com/office/word/2010/wordml" xmlns:w15="http://schemas.microsoft.com/office/word/2012/wordml" xmlns:w16cex="http://schemas.microsoft.com/office/word/2018/wordml/cex" xmlns:w16cid="http://schemas.microsoft.com/office/word/2016/wordml/cid" xmlns:w16="http://schemas.microsoft.com/office/word/2018/wordml" xmlns:w16du="http://schemas.microsoft.com/office/word/2023/wordml/word16du" xmlns:w16sdtdh="http://schemas.microsoft.com/office/word/2020/wordml/sdtdatahash" xmlns:w16sdtfl="http://schemas.microsoft.com/office/word/2024/wordml/sdtformatlock" xmlns:w16se="http://schemas.microsoft.com/office/word/2015/wordml/symex" mc:Ignorable="w14 w15 w16se w16cid w16 w16cex w16sdtdh w16sdtfl w16du">
+<w:styles xmlns:mc="http://schemas.openxmlformats.org/markup-compatibility/2006" xmlns:r="http://schemas.openxmlformats.org/officeDocument/2006/relationships" xmlns:w="http://schemas.openxmlformats.org/wordprocessingml/2006/main" xmlns:w14="http://schemas.microsoft.com/office/word/2010/wordml" xmlns:w15="http://schemas.microsoft.com/office/word/2012/wordml" xmlns:w16cex="http://schemas.microsoft.com/office/word/2018/wordml/cex" xmlns:w16cid="http://schemas.microsoft.com/office/word/2016/wordml/cid" xmlns:w16="http://schemas.microsoft.com/office/word/2018/wordml" xmlns:w16sdtdh="http://schemas.microsoft.com/office/word/2020/wordml/sdtdatahash" xmlns:w16se="http://schemas.microsoft.com/office/word/2015/wordml/symex" mc:Ignorable="w14 w15 w16se w16cid w16 w16cex w16sdtdh">
   <w:docDefaults>
     <w:rPrDefault>
       <w:rPr>
@@ -8710,7 +11494,6 @@
     <w:next w:val="Normal"/>
     <w:link w:val="Heading3Char"/>
     <w:uiPriority w:val="9"/>
-    <w:semiHidden/>
     <w:unhideWhenUsed/>
     <w:qFormat/>
     <w:rsid w:val="005F2F5E"/>
@@ -8918,7 +11701,6 @@
     <w:basedOn w:val="DefaultParagraphFont"/>
     <w:link w:val="Heading3"/>
     <w:uiPriority w:val="9"/>
-    <w:semiHidden/>
     <w:rsid w:val="005F2F5E"/>
     <w:rPr>
       <w:rFonts w:eastAsiaTheme="majorEastAsia" w:cstheme="majorBidi"/>
@@ -9197,6 +11979,23 @@
     <w:rPr>
       <w:color w:val="605E5C"/>
       <w:shd w:val="clear" w:color="auto" w:fill="E1DFDD"/>
+    </w:rPr>
+  </w:style>
+  <w:style w:type="paragraph" w:styleId="NormalWeb">
+    <w:name w:val="Normal (Web)"/>
+    <w:basedOn w:val="Normal"/>
+    <w:uiPriority w:val="99"/>
+    <w:semiHidden/>
+    <w:unhideWhenUsed/>
+    <w:rsid w:val="00151659"/>
+    <w:pPr>
+      <w:spacing w:before="100" w:beforeAutospacing="1" w:after="100" w:afterAutospacing="1" w:line="240" w:lineRule="auto"/>
+    </w:pPr>
+    <w:rPr>
+      <w:rFonts w:ascii="Times New Roman" w:eastAsia="Times New Roman" w:hAnsi="Times New Roman" w:cs="Times New Roman"/>
+      <w:kern w:val="0"/>
+      <w:lang w:eastAsia="ko-KR"/>
+      <w14:ligatures w14:val="none"/>
     </w:rPr>
   </w:style>
 </w:styles>

</xml_diff>

<commit_message>
reports: Add ERD Design in subsection 5.1.
</commit_message>
<xml_diff>
--- a/reports/report.docx
+++ b/reports/report.docx
@@ -5031,6 +5031,74 @@
     </w:p>
     <w:p>
       <w:pPr>
+        <w:pStyle w:val="NormalWeb"/>
+        <w:spacing w:before="0" w:beforeAutospacing="0" w:after="260" w:afterAutospacing="0"/>
+        <w:ind w:left="720"/>
+        <w:textAlignment w:val="baseline"/>
+        <w:rPr>
+          <w:rFonts w:ascii="Arial" w:hAnsi="Arial" w:cs="Arial"/>
+          <w:color w:val="000000"/>
+        </w:rPr>
+      </w:pPr>
+      <w:r>
+        <w:rPr>
+          <w:rFonts w:ascii="Arial" w:hAnsi="Arial" w:cs="Arial"/>
+          <w:noProof/>
+          <w:color w:val="000000"/>
+        </w:rPr>
+        <w:lastRenderedPageBreak/>
+        <w:drawing>
+          <wp:inline distT="0" distB="0" distL="0" distR="0" wp14:anchorId="574C44FC" wp14:editId="1AD39230">
+            <wp:extent cx="5250873" cy="3204217"/>
+            <wp:effectExtent l="0" t="0" r="6985" b="0"/>
+            <wp:docPr id="1922184554" name="Picture 1"/>
+            <wp:cNvGraphicFramePr>
+              <a:graphicFrameLocks xmlns:a="http://schemas.openxmlformats.org/drawingml/2006/main" noChangeAspect="1"/>
+            </wp:cNvGraphicFramePr>
+            <a:graphic xmlns:a="http://schemas.openxmlformats.org/drawingml/2006/main">
+              <a:graphicData uri="http://schemas.openxmlformats.org/drawingml/2006/picture">
+                <pic:pic xmlns:pic="http://schemas.openxmlformats.org/drawingml/2006/picture">
+                  <pic:nvPicPr>
+                    <pic:cNvPr id="0" name="Picture 1"/>
+                    <pic:cNvPicPr>
+                      <a:picLocks noChangeAspect="1" noChangeArrowheads="1"/>
+                    </pic:cNvPicPr>
+                  </pic:nvPicPr>
+                  <pic:blipFill>
+                    <a:blip r:embed="rId8">
+                      <a:extLst>
+                        <a:ext uri="{28A0092B-C50C-407E-A947-70E740481C1C}">
+                          <a14:useLocalDpi xmlns:a14="http://schemas.microsoft.com/office/drawing/2010/main" val="0"/>
+                        </a:ext>
+                      </a:extLst>
+                    </a:blip>
+                    <a:srcRect/>
+                    <a:stretch>
+                      <a:fillRect/>
+                    </a:stretch>
+                  </pic:blipFill>
+                  <pic:spPr bwMode="auto">
+                    <a:xfrm>
+                      <a:off x="0" y="0"/>
+                      <a:ext cx="5256892" cy="3207890"/>
+                    </a:xfrm>
+                    <a:prstGeom prst="rect">
+                      <a:avLst/>
+                    </a:prstGeom>
+                    <a:noFill/>
+                    <a:ln>
+                      <a:noFill/>
+                    </a:ln>
+                  </pic:spPr>
+                </pic:pic>
+              </a:graphicData>
+            </a:graphic>
+          </wp:inline>
+        </w:drawing>
+      </w:r>
+    </w:p>
+    <w:p>
+      <w:pPr>
         <w:pStyle w:val="Heading3"/>
         <w:spacing w:before="0"/>
         <w:rPr>
@@ -5394,7 +5462,6 @@
           <w:szCs w:val="26"/>
           <w14:ligatures w14:val="none"/>
         </w:rPr>
-        <w:lastRenderedPageBreak/>
         <w:t>5.3. Dynamic model - sequence diagrams</w:t>
       </w:r>
     </w:p>
@@ -5600,6 +5667,7 @@
           <w:bCs/>
           <w:color w:val="000000"/>
         </w:rPr>
+        <w:lastRenderedPageBreak/>
         <w:t>Database Normalization</w:t>
       </w:r>
       <w:r>

</xml_diff>

<commit_message>
reports: Updated more details for Models, Controllers and Views in subsection 5.2.
</commit_message>
<xml_diff>
--- a/reports/report.docx
+++ b/reports/report.docx
@@ -5112,7 +5112,11 @@
           <w14:ligatures w14:val="none"/>
         </w:rPr>
       </w:pPr>
-      <w:r>
+    </w:p>
+    <w:p>
+      <w:pPr>
+        <w:pStyle w:val="Heading3"/>
+        <w:spacing w:before="0"/>
         <w:rPr>
           <w:rFonts w:ascii="Arial" w:eastAsia="Times New Roman" w:hAnsi="Arial" w:cs="Arial"/>
           <w:b/>
@@ -5123,7 +5127,19 @@
           <w:szCs w:val="26"/>
           <w14:ligatures w14:val="none"/>
         </w:rPr>
-        <w:t>5.2. Static model - class diagrams</w:t>
+      </w:pPr>
+      <w:r>
+        <w:rPr>
+          <w:rFonts w:ascii="Arial" w:eastAsia="Times New Roman" w:hAnsi="Arial" w:cs="Arial"/>
+          <w:b/>
+          <w:bCs/>
+          <w:color w:val="000000"/>
+          <w:kern w:val="0"/>
+          <w:sz w:val="26"/>
+          <w:szCs w:val="26"/>
+          <w14:ligatures w14:val="none"/>
+        </w:rPr>
+        <w:t>5.2. Static model - Class diagrams</w:t>
       </w:r>
     </w:p>
     <w:p>
@@ -5136,7 +5152,23 @@
           <w:rFonts w:ascii="Arial" w:hAnsi="Arial" w:cs="Arial"/>
           <w:color w:val="000000"/>
         </w:rPr>
-        <w:t>The class diagram follows the MVC pattern to ensure a clean separation of concerns:</w:t>
+        <w:t xml:space="preserve">The system's class diagram is structured according to the </w:t>
+      </w:r>
+      <w:r>
+        <w:rPr>
+          <w:rFonts w:ascii="Arial" w:hAnsi="Arial" w:cs="Arial"/>
+          <w:b/>
+          <w:bCs/>
+          <w:color w:val="000000"/>
+        </w:rPr>
+        <w:t>Model-View-Controller (MVC)</w:t>
+      </w:r>
+      <w:r>
+        <w:rPr>
+          <w:rFonts w:ascii="Arial" w:hAnsi="Arial" w:cs="Arial"/>
+          <w:color w:val="000000"/>
+        </w:rPr>
+        <w:t xml:space="preserve"> pattern to ensure a clear separation of concerns between business logic, user interface, and data entities:</w:t>
       </w:r>
     </w:p>
     <w:p>
@@ -5144,7 +5176,7 @@
         <w:pStyle w:val="NormalWeb"/>
         <w:numPr>
           <w:ilvl w:val="0"/>
-          <w:numId w:val="31"/>
+          <w:numId w:val="34"/>
         </w:numPr>
         <w:spacing w:before="0" w:beforeAutospacing="0" w:after="0" w:afterAutospacing="0"/>
         <w:textAlignment w:val="baseline"/>
@@ -5160,19 +5192,60 @@
           <w:bCs/>
           <w:color w:val="000000"/>
         </w:rPr>
-        <w:t>Entities (Model)</w:t>
-      </w:r>
-      <w:r>
-        <w:rPr>
-          <w:rFonts w:ascii="Arial" w:hAnsi="Arial" w:cs="Arial"/>
-          <w:color w:val="000000"/>
-        </w:rPr>
-        <w:t xml:space="preserve">: Staff, Product, Customer, Invoice, and </w:t>
-      </w:r>
+        <w:t>Entities (Model):</w:t>
+      </w:r>
+    </w:p>
+    <w:p>
+      <w:pPr>
+        <w:pStyle w:val="NormalWeb"/>
+        <w:numPr>
+          <w:ilvl w:val="1"/>
+          <w:numId w:val="34"/>
+        </w:numPr>
+        <w:spacing w:before="0" w:beforeAutospacing="0" w:after="0" w:afterAutospacing="0"/>
+        <w:textAlignment w:val="baseline"/>
+        <w:rPr>
+          <w:rFonts w:ascii="Arial" w:hAnsi="Arial" w:cs="Arial"/>
+          <w:color w:val="000000"/>
+        </w:rPr>
+      </w:pPr>
+      <w:r>
+        <w:rPr>
+          <w:rFonts w:ascii="Arial" w:hAnsi="Arial" w:cs="Arial"/>
+          <w:b/>
+          <w:bCs/>
+          <w:color w:val="000000"/>
+        </w:rPr>
+        <w:t>Staff, Product, and Customer:</w:t>
+      </w:r>
+      <w:r>
+        <w:rPr>
+          <w:rFonts w:ascii="Arial" w:hAnsi="Arial" w:cs="Arial"/>
+          <w:color w:val="000000"/>
+        </w:rPr>
+        <w:t xml:space="preserve"> Core classes representing the primary data objects within the system.</w:t>
+      </w:r>
+    </w:p>
+    <w:p>
+      <w:pPr>
+        <w:pStyle w:val="NormalWeb"/>
+        <w:numPr>
+          <w:ilvl w:val="1"/>
+          <w:numId w:val="34"/>
+        </w:numPr>
+        <w:spacing w:before="0" w:beforeAutospacing="0" w:after="0" w:afterAutospacing="0"/>
+        <w:textAlignment w:val="baseline"/>
+        <w:rPr>
+          <w:rFonts w:ascii="Arial" w:hAnsi="Arial" w:cs="Arial"/>
+          <w:color w:val="000000"/>
+        </w:rPr>
+      </w:pPr>
       <w:proofErr w:type="spellStart"/>
       <w:r>
         <w:rPr>
           <w:rFonts w:ascii="Arial" w:hAnsi="Arial" w:cs="Arial"/>
+          <w:b/>
+          <w:bCs/>
           <w:color w:val="000000"/>
         </w:rPr>
         <w:t>HardwareSpec</w:t>
@@ -5181,9 +5254,85 @@
       <w:r>
         <w:rPr>
           <w:rFonts w:ascii="Arial" w:hAnsi="Arial" w:cs="Arial"/>
-          <w:color w:val="000000"/>
-        </w:rPr>
-        <w:t>.</w:t>
+          <w:b/>
+          <w:bCs/>
+          <w:color w:val="000000"/>
+        </w:rPr>
+        <w:t>:</w:t>
+      </w:r>
+      <w:r>
+        <w:rPr>
+          <w:rFonts w:ascii="Arial" w:hAnsi="Arial" w:cs="Arial"/>
+          <w:color w:val="000000"/>
+        </w:rPr>
+        <w:t xml:space="preserve"> A specialized class used to manage detailed technical specifications, supporting the hardware tracking requirement (FR3).</w:t>
+      </w:r>
+    </w:p>
+    <w:p>
+      <w:pPr>
+        <w:pStyle w:val="NormalWeb"/>
+        <w:numPr>
+          <w:ilvl w:val="1"/>
+          <w:numId w:val="34"/>
+        </w:numPr>
+        <w:spacing w:before="0" w:beforeAutospacing="0" w:after="0" w:afterAutospacing="0"/>
+        <w:textAlignment w:val="baseline"/>
+        <w:rPr>
+          <w:rFonts w:ascii="Arial" w:hAnsi="Arial" w:cs="Arial"/>
+          <w:color w:val="000000"/>
+        </w:rPr>
+      </w:pPr>
+      <w:r>
+        <w:rPr>
+          <w:rFonts w:ascii="Arial" w:hAnsi="Arial" w:cs="Arial"/>
+          <w:b/>
+          <w:bCs/>
+          <w:color w:val="000000"/>
+        </w:rPr>
+        <w:t xml:space="preserve">Invoice &amp; </w:t>
+      </w:r>
+      <w:proofErr w:type="spellStart"/>
+      <w:r>
+        <w:rPr>
+          <w:rFonts w:ascii="Arial" w:hAnsi="Arial" w:cs="Arial"/>
+          <w:b/>
+          <w:bCs/>
+          <w:color w:val="000000"/>
+        </w:rPr>
+        <w:t>InvoiceDetail</w:t>
+      </w:r>
+      <w:proofErr w:type="spellEnd"/>
+      <w:r>
+        <w:rPr>
+          <w:rFonts w:ascii="Arial" w:hAnsi="Arial" w:cs="Arial"/>
+          <w:b/>
+          <w:bCs/>
+          <w:color w:val="000000"/>
+        </w:rPr>
+        <w:t>:</w:t>
+      </w:r>
+      <w:r>
+        <w:rPr>
+          <w:rFonts w:ascii="Arial" w:hAnsi="Arial" w:cs="Arial"/>
+          <w:color w:val="000000"/>
+        </w:rPr>
+        <w:t xml:space="preserve"> These classes record transaction data; a Composition relationship is used to ensure that an </w:t>
+      </w:r>
+      <w:proofErr w:type="spellStart"/>
+      <w:r>
+        <w:rPr>
+          <w:rFonts w:ascii="Arial" w:hAnsi="Arial" w:cs="Arial"/>
+          <w:color w:val="000000"/>
+        </w:rPr>
+        <w:t>InvoiceDetail</w:t>
+      </w:r>
+      <w:proofErr w:type="spellEnd"/>
+      <w:r>
+        <w:rPr>
+          <w:rFonts w:ascii="Arial" w:hAnsi="Arial" w:cs="Arial"/>
+          <w:color w:val="000000"/>
+        </w:rPr>
+        <w:t xml:space="preserve"> cannot exist without its parent Invoice.</w:t>
       </w:r>
     </w:p>
     <w:p>
@@ -5191,7 +5340,7 @@
         <w:pStyle w:val="NormalWeb"/>
         <w:numPr>
           <w:ilvl w:val="0"/>
-          <w:numId w:val="31"/>
+          <w:numId w:val="34"/>
         </w:numPr>
         <w:spacing w:before="0" w:beforeAutospacing="0" w:after="0" w:afterAutospacing="0"/>
         <w:textAlignment w:val="baseline"/>
@@ -5207,14 +5356,7 @@
           <w:bCs/>
           <w:color w:val="000000"/>
         </w:rPr>
-        <w:t>Controllers</w:t>
-      </w:r>
-      <w:r>
-        <w:rPr>
-          <w:rFonts w:ascii="Arial" w:hAnsi="Arial" w:cs="Arial"/>
-          <w:color w:val="000000"/>
-        </w:rPr>
-        <w:t>:</w:t>
+        <w:t>Controllers:</w:t>
       </w:r>
     </w:p>
     <w:p>
@@ -5222,7 +5364,7 @@
         <w:pStyle w:val="NormalWeb"/>
         <w:numPr>
           <w:ilvl w:val="1"/>
-          <w:numId w:val="31"/>
+          <w:numId w:val="34"/>
         </w:numPr>
         <w:spacing w:before="0" w:beforeAutospacing="0" w:after="0" w:afterAutospacing="0"/>
         <w:textAlignment w:val="baseline"/>
@@ -5235,6 +5377,8 @@
       <w:r>
         <w:rPr>
           <w:rFonts w:ascii="Arial" w:hAnsi="Arial" w:cs="Arial"/>
+          <w:b/>
+          <w:bCs/>
           <w:color w:val="000000"/>
         </w:rPr>
         <w:t>AccountController</w:t>
@@ -5243,9 +5387,18 @@
       <w:r>
         <w:rPr>
           <w:rFonts w:ascii="Arial" w:hAnsi="Arial" w:cs="Arial"/>
-          <w:color w:val="000000"/>
-        </w:rPr>
-        <w:t>: Handles Login/Logout and Employee CRUD.</w:t>
+          <w:b/>
+          <w:bCs/>
+          <w:color w:val="000000"/>
+        </w:rPr>
+        <w:t>:</w:t>
+      </w:r>
+      <w:r>
+        <w:rPr>
+          <w:rFonts w:ascii="Arial" w:hAnsi="Arial" w:cs="Arial"/>
+          <w:color w:val="000000"/>
+        </w:rPr>
+        <w:t xml:space="preserve"> Manages user authentication, session security, and role-based access control (FR1, FR5).</w:t>
       </w:r>
     </w:p>
     <w:p>
@@ -5253,7 +5406,7 @@
         <w:pStyle w:val="NormalWeb"/>
         <w:numPr>
           <w:ilvl w:val="1"/>
-          <w:numId w:val="31"/>
+          <w:numId w:val="34"/>
         </w:numPr>
         <w:spacing w:before="0" w:beforeAutospacing="0" w:after="0" w:afterAutospacing="0"/>
         <w:textAlignment w:val="baseline"/>
@@ -5266,6 +5419,8 @@
       <w:r>
         <w:rPr>
           <w:rFonts w:ascii="Arial" w:hAnsi="Arial" w:cs="Arial"/>
+          <w:b/>
+          <w:bCs/>
           <w:color w:val="000000"/>
         </w:rPr>
         <w:t>SalesController</w:t>
@@ -5274,9 +5429,18 @@
       <w:r>
         <w:rPr>
           <w:rFonts w:ascii="Arial" w:hAnsi="Arial" w:cs="Arial"/>
-          <w:color w:val="000000"/>
-        </w:rPr>
-        <w:t>: Manages invoicing and automated stock updates.</w:t>
+          <w:b/>
+          <w:bCs/>
+          <w:color w:val="000000"/>
+        </w:rPr>
+        <w:t>:</w:t>
+      </w:r>
+      <w:r>
+        <w:rPr>
+          <w:rFonts w:ascii="Arial" w:hAnsi="Arial" w:cs="Arial"/>
+          <w:color w:val="000000"/>
+        </w:rPr>
+        <w:t xml:space="preserve"> Orchestrates the invoicing process and triggers automated stock level synchronization (FR2, FR6).</w:t>
       </w:r>
     </w:p>
     <w:p>
@@ -5284,7 +5448,7 @@
         <w:pStyle w:val="NormalWeb"/>
         <w:numPr>
           <w:ilvl w:val="1"/>
-          <w:numId w:val="31"/>
+          <w:numId w:val="34"/>
         </w:numPr>
         <w:spacing w:before="0" w:beforeAutospacing="0" w:after="0" w:afterAutospacing="0"/>
         <w:textAlignment w:val="baseline"/>
@@ -5297,6 +5461,8 @@
       <w:r>
         <w:rPr>
           <w:rFonts w:ascii="Arial" w:hAnsi="Arial" w:cs="Arial"/>
+          <w:b/>
+          <w:bCs/>
           <w:color w:val="000000"/>
         </w:rPr>
         <w:t>InventoryController</w:t>
@@ -5305,9 +5471,18 @@
       <w:r>
         <w:rPr>
           <w:rFonts w:ascii="Arial" w:hAnsi="Arial" w:cs="Arial"/>
-          <w:color w:val="000000"/>
-        </w:rPr>
-        <w:t>: Manages product catalogs and hardware tracking.</w:t>
+          <w:b/>
+          <w:bCs/>
+          <w:color w:val="000000"/>
+        </w:rPr>
+        <w:t>:</w:t>
+      </w:r>
+      <w:r>
+        <w:rPr>
+          <w:rFonts w:ascii="Arial" w:hAnsi="Arial" w:cs="Arial"/>
+          <w:color w:val="000000"/>
+        </w:rPr>
+        <w:t xml:space="preserve"> Handles the product catalog, stock updates, and hardware specification management (FR3).</w:t>
       </w:r>
     </w:p>
     <w:p>
@@ -5315,7 +5490,7 @@
         <w:pStyle w:val="NormalWeb"/>
         <w:numPr>
           <w:ilvl w:val="1"/>
-          <w:numId w:val="31"/>
+          <w:numId w:val="34"/>
         </w:numPr>
         <w:spacing w:before="0" w:beforeAutospacing="0" w:after="0" w:afterAutospacing="0"/>
         <w:textAlignment w:val="baseline"/>
@@ -5328,6 +5503,8 @@
       <w:r>
         <w:rPr>
           <w:rFonts w:ascii="Arial" w:hAnsi="Arial" w:cs="Arial"/>
+          <w:b/>
+          <w:bCs/>
           <w:color w:val="000000"/>
         </w:rPr>
         <w:t>ReportController</w:t>
@@ -5336,9 +5513,18 @@
       <w:r>
         <w:rPr>
           <w:rFonts w:ascii="Arial" w:hAnsi="Arial" w:cs="Arial"/>
-          <w:color w:val="000000"/>
-        </w:rPr>
-        <w:t>: Processes data for sales analytics.</w:t>
+          <w:b/>
+          <w:bCs/>
+          <w:color w:val="000000"/>
+        </w:rPr>
+        <w:t>:</w:t>
+      </w:r>
+      <w:r>
+        <w:rPr>
+          <w:rFonts w:ascii="Arial" w:hAnsi="Arial" w:cs="Arial"/>
+          <w:color w:val="000000"/>
+        </w:rPr>
+        <w:t xml:space="preserve"> Processes raw transaction data to generate business performance statistics and visual reports (FR7).</w:t>
       </w:r>
     </w:p>
     <w:p>
@@ -5346,7 +5532,31 @@
         <w:pStyle w:val="NormalWeb"/>
         <w:numPr>
           <w:ilvl w:val="0"/>
-          <w:numId w:val="31"/>
+          <w:numId w:val="34"/>
+        </w:numPr>
+        <w:spacing w:before="0" w:beforeAutospacing="0" w:after="0" w:afterAutospacing="0"/>
+        <w:textAlignment w:val="baseline"/>
+        <w:rPr>
+          <w:rFonts w:ascii="Arial" w:hAnsi="Arial" w:cs="Arial"/>
+          <w:color w:val="000000"/>
+        </w:rPr>
+      </w:pPr>
+      <w:r>
+        <w:rPr>
+          <w:rFonts w:ascii="Arial" w:hAnsi="Arial" w:cs="Arial"/>
+          <w:b/>
+          <w:bCs/>
+          <w:color w:val="000000"/>
+        </w:rPr>
+        <w:t>Views:</w:t>
+      </w:r>
+    </w:p>
+    <w:p>
+      <w:pPr>
+        <w:pStyle w:val="NormalWeb"/>
+        <w:numPr>
+          <w:ilvl w:val="1"/>
+          <w:numId w:val="34"/>
         </w:numPr>
         <w:spacing w:before="0" w:beforeAutospacing="0" w:after="260" w:afterAutospacing="0"/>
         <w:textAlignment w:val="baseline"/>
@@ -5358,18 +5568,10 @@
       <w:r>
         <w:rPr>
           <w:rFonts w:ascii="Arial" w:hAnsi="Arial" w:cs="Arial"/>
-          <w:b/>
-          <w:bCs/>
-          <w:color w:val="000000"/>
-        </w:rPr>
-        <w:t>Views</w:t>
-      </w:r>
-      <w:r>
-        <w:rPr>
-          <w:rFonts w:ascii="Arial" w:hAnsi="Arial" w:cs="Arial"/>
-          <w:color w:val="000000"/>
-        </w:rPr>
-        <w:t xml:space="preserve">: A set of WinForms including </w:t>
+          <w:color w:val="000000"/>
+        </w:rPr>
+        <w:lastRenderedPageBreak/>
+        <w:t>The View layer consists of Windows Forms (</w:t>
       </w:r>
       <w:proofErr w:type="spellStart"/>
       <w:r>
@@ -5393,6 +5595,22 @@
           <w:rFonts w:ascii="Arial" w:hAnsi="Arial" w:cs="Arial"/>
           <w:color w:val="000000"/>
         </w:rPr>
+        <w:t>frmSales</w:t>
+      </w:r>
+      <w:proofErr w:type="spellEnd"/>
+      <w:r>
+        <w:rPr>
+          <w:rFonts w:ascii="Arial" w:hAnsi="Arial" w:cs="Arial"/>
+          <w:color w:val="000000"/>
+        </w:rPr>
+        <w:t xml:space="preserve">, </w:t>
+      </w:r>
+      <w:proofErr w:type="spellStart"/>
+      <w:r>
+        <w:rPr>
+          <w:rFonts w:ascii="Arial" w:hAnsi="Arial" w:cs="Arial"/>
+          <w:color w:val="000000"/>
+        </w:rPr>
         <w:t>frmInventory</w:t>
       </w:r>
       <w:proofErr w:type="spellEnd"/>
@@ -5409,7 +5627,7 @@
           <w:rFonts w:ascii="Arial" w:hAnsi="Arial" w:cs="Arial"/>
           <w:color w:val="000000"/>
         </w:rPr>
-        <w:t>frmSales</w:t>
+        <w:t>frmReports</w:t>
       </w:r>
       <w:proofErr w:type="spellEnd"/>
       <w:r>
@@ -5417,23 +5635,7 @@
           <w:rFonts w:ascii="Arial" w:hAnsi="Arial" w:cs="Arial"/>
           <w:color w:val="000000"/>
         </w:rPr>
-        <w:t xml:space="preserve">, and </w:t>
-      </w:r>
-      <w:proofErr w:type="spellStart"/>
-      <w:r>
-        <w:rPr>
-          <w:rFonts w:ascii="Arial" w:hAnsi="Arial" w:cs="Arial"/>
-          <w:color w:val="000000"/>
-        </w:rPr>
-        <w:t>frmReports</w:t>
-      </w:r>
-      <w:proofErr w:type="spellEnd"/>
-      <w:r>
-        <w:rPr>
-          <w:rFonts w:ascii="Arial" w:hAnsi="Arial" w:cs="Arial"/>
-          <w:color w:val="000000"/>
-        </w:rPr>
-        <w:t>.</w:t>
+        <w:t>) that capture user input and display data retrieved from the Controllers.</w:t>
       </w:r>
     </w:p>
     <w:p>
@@ -5667,7 +5869,6 @@
           <w:bCs/>
           <w:color w:val="000000"/>
         </w:rPr>
-        <w:lastRenderedPageBreak/>
         <w:t>Database Normalization</w:t>
       </w:r>
       <w:r>
@@ -9387,6 +9588,155 @@
     </w:lvl>
   </w:abstractNum>
   <w:abstractNum w:abstractNumId="22" w15:restartNumberingAfterBreak="0">
+    <w:nsid w:val="52D7406C"/>
+    <w:multiLevelType w:val="multilevel"/>
+    <w:tmpl w:val="4BDCC2A8"/>
+    <w:lvl w:ilvl="0">
+      <w:start w:val="1"/>
+      <w:numFmt w:val="bullet"/>
+      <w:lvlText w:val=""/>
+      <w:lvlJc w:val="left"/>
+      <w:pPr>
+        <w:tabs>
+          <w:tab w:val="num" w:pos="720"/>
+        </w:tabs>
+        <w:ind w:left="720" w:hanging="360"/>
+      </w:pPr>
+      <w:rPr>
+        <w:rFonts w:ascii="Symbol" w:hAnsi="Symbol" w:hint="default"/>
+        <w:sz w:val="20"/>
+      </w:rPr>
+    </w:lvl>
+    <w:lvl w:ilvl="1">
+      <w:start w:val="1"/>
+      <w:numFmt w:val="bullet"/>
+      <w:lvlText w:val="o"/>
+      <w:lvlJc w:val="left"/>
+      <w:pPr>
+        <w:tabs>
+          <w:tab w:val="num" w:pos="1440"/>
+        </w:tabs>
+        <w:ind w:left="1440" w:hanging="360"/>
+      </w:pPr>
+      <w:rPr>
+        <w:rFonts w:ascii="Courier New" w:hAnsi="Courier New" w:hint="default"/>
+        <w:sz w:val="20"/>
+      </w:rPr>
+    </w:lvl>
+    <w:lvl w:ilvl="2" w:tentative="1">
+      <w:start w:val="1"/>
+      <w:numFmt w:val="bullet"/>
+      <w:lvlText w:val=""/>
+      <w:lvlJc w:val="left"/>
+      <w:pPr>
+        <w:tabs>
+          <w:tab w:val="num" w:pos="2160"/>
+        </w:tabs>
+        <w:ind w:left="2160" w:hanging="360"/>
+      </w:pPr>
+      <w:rPr>
+        <w:rFonts w:ascii="Wingdings" w:hAnsi="Wingdings" w:hint="default"/>
+        <w:sz w:val="20"/>
+      </w:rPr>
+    </w:lvl>
+    <w:lvl w:ilvl="3" w:tentative="1">
+      <w:start w:val="1"/>
+      <w:numFmt w:val="bullet"/>
+      <w:lvlText w:val=""/>
+      <w:lvlJc w:val="left"/>
+      <w:pPr>
+        <w:tabs>
+          <w:tab w:val="num" w:pos="2880"/>
+        </w:tabs>
+        <w:ind w:left="2880" w:hanging="360"/>
+      </w:pPr>
+      <w:rPr>
+        <w:rFonts w:ascii="Wingdings" w:hAnsi="Wingdings" w:hint="default"/>
+        <w:sz w:val="20"/>
+      </w:rPr>
+    </w:lvl>
+    <w:lvl w:ilvl="4" w:tentative="1">
+      <w:start w:val="1"/>
+      <w:numFmt w:val="bullet"/>
+      <w:lvlText w:val=""/>
+      <w:lvlJc w:val="left"/>
+      <w:pPr>
+        <w:tabs>
+          <w:tab w:val="num" w:pos="3600"/>
+        </w:tabs>
+        <w:ind w:left="3600" w:hanging="360"/>
+      </w:pPr>
+      <w:rPr>
+        <w:rFonts w:ascii="Wingdings" w:hAnsi="Wingdings" w:hint="default"/>
+        <w:sz w:val="20"/>
+      </w:rPr>
+    </w:lvl>
+    <w:lvl w:ilvl="5" w:tentative="1">
+      <w:start w:val="1"/>
+      <w:numFmt w:val="bullet"/>
+      <w:lvlText w:val=""/>
+      <w:lvlJc w:val="left"/>
+      <w:pPr>
+        <w:tabs>
+          <w:tab w:val="num" w:pos="4320"/>
+        </w:tabs>
+        <w:ind w:left="4320" w:hanging="360"/>
+      </w:pPr>
+      <w:rPr>
+        <w:rFonts w:ascii="Wingdings" w:hAnsi="Wingdings" w:hint="default"/>
+        <w:sz w:val="20"/>
+      </w:rPr>
+    </w:lvl>
+    <w:lvl w:ilvl="6" w:tentative="1">
+      <w:start w:val="1"/>
+      <w:numFmt w:val="bullet"/>
+      <w:lvlText w:val=""/>
+      <w:lvlJc w:val="left"/>
+      <w:pPr>
+        <w:tabs>
+          <w:tab w:val="num" w:pos="5040"/>
+        </w:tabs>
+        <w:ind w:left="5040" w:hanging="360"/>
+      </w:pPr>
+      <w:rPr>
+        <w:rFonts w:ascii="Wingdings" w:hAnsi="Wingdings" w:hint="default"/>
+        <w:sz w:val="20"/>
+      </w:rPr>
+    </w:lvl>
+    <w:lvl w:ilvl="7" w:tentative="1">
+      <w:start w:val="1"/>
+      <w:numFmt w:val="bullet"/>
+      <w:lvlText w:val=""/>
+      <w:lvlJc w:val="left"/>
+      <w:pPr>
+        <w:tabs>
+          <w:tab w:val="num" w:pos="5760"/>
+        </w:tabs>
+        <w:ind w:left="5760" w:hanging="360"/>
+      </w:pPr>
+      <w:rPr>
+        <w:rFonts w:ascii="Wingdings" w:hAnsi="Wingdings" w:hint="default"/>
+        <w:sz w:val="20"/>
+      </w:rPr>
+    </w:lvl>
+    <w:lvl w:ilvl="8" w:tentative="1">
+      <w:start w:val="1"/>
+      <w:numFmt w:val="bullet"/>
+      <w:lvlText w:val=""/>
+      <w:lvlJc w:val="left"/>
+      <w:pPr>
+        <w:tabs>
+          <w:tab w:val="num" w:pos="6480"/>
+        </w:tabs>
+        <w:ind w:left="6480" w:hanging="360"/>
+      </w:pPr>
+      <w:rPr>
+        <w:rFonts w:ascii="Wingdings" w:hAnsi="Wingdings" w:hint="default"/>
+        <w:sz w:val="20"/>
+      </w:rPr>
+    </w:lvl>
+  </w:abstractNum>
+  <w:abstractNum w:abstractNumId="23" w15:restartNumberingAfterBreak="0">
     <w:nsid w:val="57DF4F51"/>
     <w:multiLevelType w:val="multilevel"/>
     <w:tmpl w:val="44E8CCF8"/>
@@ -9531,7 +9881,7 @@
       </w:rPr>
     </w:lvl>
   </w:abstractNum>
-  <w:abstractNum w:abstractNumId="23" w15:restartNumberingAfterBreak="0">
+  <w:abstractNum w:abstractNumId="24" w15:restartNumberingAfterBreak="0">
     <w:nsid w:val="59387BDC"/>
     <w:multiLevelType w:val="multilevel"/>
     <w:tmpl w:val="FD647D40"/>
@@ -9680,7 +10030,7 @@
       </w:rPr>
     </w:lvl>
   </w:abstractNum>
-  <w:abstractNum w:abstractNumId="24" w15:restartNumberingAfterBreak="0">
+  <w:abstractNum w:abstractNumId="25" w15:restartNumberingAfterBreak="0">
     <w:nsid w:val="596827DA"/>
     <w:multiLevelType w:val="multilevel"/>
     <w:tmpl w:val="22626E4C"/>
@@ -9825,7 +10175,7 @@
       </w:rPr>
     </w:lvl>
   </w:abstractNum>
-  <w:abstractNum w:abstractNumId="25" w15:restartNumberingAfterBreak="0">
+  <w:abstractNum w:abstractNumId="26" w15:restartNumberingAfterBreak="0">
     <w:nsid w:val="5A3155E4"/>
     <w:multiLevelType w:val="multilevel"/>
     <w:tmpl w:val="A7EA3098"/>
@@ -9970,7 +10320,7 @@
       </w:rPr>
     </w:lvl>
   </w:abstractNum>
-  <w:abstractNum w:abstractNumId="26" w15:restartNumberingAfterBreak="0">
+  <w:abstractNum w:abstractNumId="27" w15:restartNumberingAfterBreak="0">
     <w:nsid w:val="5AEF4332"/>
     <w:multiLevelType w:val="multilevel"/>
     <w:tmpl w:val="319690FE"/>
@@ -10119,7 +10469,7 @@
       </w:rPr>
     </w:lvl>
   </w:abstractNum>
-  <w:abstractNum w:abstractNumId="27" w15:restartNumberingAfterBreak="0">
+  <w:abstractNum w:abstractNumId="28" w15:restartNumberingAfterBreak="0">
     <w:nsid w:val="5D03164B"/>
     <w:multiLevelType w:val="multilevel"/>
     <w:tmpl w:val="FA8C8E6C"/>
@@ -10268,7 +10618,7 @@
       </w:rPr>
     </w:lvl>
   </w:abstractNum>
-  <w:abstractNum w:abstractNumId="28" w15:restartNumberingAfterBreak="0">
+  <w:abstractNum w:abstractNumId="29" w15:restartNumberingAfterBreak="0">
     <w:nsid w:val="659C4B51"/>
     <w:multiLevelType w:val="multilevel"/>
     <w:tmpl w:val="39D87F7A"/>
@@ -10417,7 +10767,7 @@
       </w:rPr>
     </w:lvl>
   </w:abstractNum>
-  <w:abstractNum w:abstractNumId="29" w15:restartNumberingAfterBreak="0">
+  <w:abstractNum w:abstractNumId="30" w15:restartNumberingAfterBreak="0">
     <w:nsid w:val="6AE80BF0"/>
     <w:multiLevelType w:val="multilevel"/>
     <w:tmpl w:val="7138ED50"/>
@@ -10566,7 +10916,7 @@
       </w:rPr>
     </w:lvl>
   </w:abstractNum>
-  <w:abstractNum w:abstractNumId="30" w15:restartNumberingAfterBreak="0">
+  <w:abstractNum w:abstractNumId="31" w15:restartNumberingAfterBreak="0">
     <w:nsid w:val="6B4B59D2"/>
     <w:multiLevelType w:val="multilevel"/>
     <w:tmpl w:val="0BB0C054"/>
@@ -10715,7 +11065,7 @@
       </w:rPr>
     </w:lvl>
   </w:abstractNum>
-  <w:abstractNum w:abstractNumId="31" w15:restartNumberingAfterBreak="0">
+  <w:abstractNum w:abstractNumId="32" w15:restartNumberingAfterBreak="0">
     <w:nsid w:val="6B672276"/>
     <w:multiLevelType w:val="multilevel"/>
     <w:tmpl w:val="98208C9A"/>
@@ -10864,7 +11214,7 @@
       </w:rPr>
     </w:lvl>
   </w:abstractNum>
-  <w:abstractNum w:abstractNumId="32" w15:restartNumberingAfterBreak="0">
+  <w:abstractNum w:abstractNumId="33" w15:restartNumberingAfterBreak="0">
     <w:nsid w:val="72C961FD"/>
     <w:multiLevelType w:val="multilevel"/>
     <w:tmpl w:val="EF00655A"/>
@@ -11013,7 +11363,7 @@
     <w:abstractNumId w:val="18"/>
   </w:num>
   <w:num w:numId="2" w16cid:durableId="2089687452">
-    <w:abstractNumId w:val="26"/>
+    <w:abstractNumId w:val="27"/>
   </w:num>
   <w:num w:numId="3" w16cid:durableId="397703464">
     <w:abstractNumId w:val="16"/>
@@ -11025,13 +11375,13 @@
     <w:abstractNumId w:val="11"/>
   </w:num>
   <w:num w:numId="6" w16cid:durableId="123810299">
-    <w:abstractNumId w:val="30"/>
+    <w:abstractNumId w:val="31"/>
   </w:num>
   <w:num w:numId="7" w16cid:durableId="2090272123">
     <w:abstractNumId w:val="14"/>
   </w:num>
   <w:num w:numId="8" w16cid:durableId="439878419">
-    <w:abstractNumId w:val="27"/>
+    <w:abstractNumId w:val="28"/>
   </w:num>
   <w:num w:numId="9" w16cid:durableId="1099985614">
     <w:abstractNumId w:val="5"/>
@@ -11049,16 +11399,16 @@
     <w:abstractNumId w:val="10"/>
   </w:num>
   <w:num w:numId="14" w16cid:durableId="1670987982">
-    <w:abstractNumId w:val="32"/>
+    <w:abstractNumId w:val="33"/>
   </w:num>
   <w:num w:numId="15" w16cid:durableId="1381202660">
-    <w:abstractNumId w:val="25"/>
+    <w:abstractNumId w:val="26"/>
   </w:num>
   <w:num w:numId="16" w16cid:durableId="2020303109">
-    <w:abstractNumId w:val="22"/>
+    <w:abstractNumId w:val="23"/>
   </w:num>
   <w:num w:numId="17" w16cid:durableId="1607694605">
-    <w:abstractNumId w:val="24"/>
+    <w:abstractNumId w:val="25"/>
   </w:num>
   <w:num w:numId="18" w16cid:durableId="655645792">
     <w:abstractNumId w:val="15"/>
@@ -11067,13 +11417,13 @@
     <w:abstractNumId w:val="6"/>
   </w:num>
   <w:num w:numId="20" w16cid:durableId="1141506554">
-    <w:abstractNumId w:val="23"/>
+    <w:abstractNumId w:val="24"/>
   </w:num>
   <w:num w:numId="21" w16cid:durableId="424542347">
     <w:abstractNumId w:val="2"/>
   </w:num>
   <w:num w:numId="22" w16cid:durableId="19356756">
-    <w:abstractNumId w:val="28"/>
+    <w:abstractNumId w:val="29"/>
   </w:num>
   <w:num w:numId="23" w16cid:durableId="2058040637">
     <w:abstractNumId w:val="17"/>
@@ -11094,19 +11444,22 @@
     <w:abstractNumId w:val="13"/>
   </w:num>
   <w:num w:numId="29" w16cid:durableId="685013139">
-    <w:abstractNumId w:val="31"/>
+    <w:abstractNumId w:val="32"/>
   </w:num>
   <w:num w:numId="30" w16cid:durableId="1393232898">
     <w:abstractNumId w:val="3"/>
   </w:num>
   <w:num w:numId="31" w16cid:durableId="1459882097">
-    <w:abstractNumId w:val="29"/>
+    <w:abstractNumId w:val="30"/>
   </w:num>
   <w:num w:numId="32" w16cid:durableId="23755228">
     <w:abstractNumId w:val="4"/>
   </w:num>
   <w:num w:numId="33" w16cid:durableId="1374387751">
     <w:abstractNumId w:val="21"/>
+  </w:num>
+  <w:num w:numId="34" w16cid:durableId="679818156">
+    <w:abstractNumId w:val="22"/>
   </w:num>
 </w:numbering>
 </file>

</xml_diff>

<commit_message>
reports: Add Class Diagram in subsection 5.2.
</commit_message>
<xml_diff>
--- a/reports/report.docx
+++ b/reports/report.docx
@@ -5640,6 +5640,72 @@
     </w:p>
     <w:p>
       <w:pPr>
+        <w:pStyle w:val="NormalWeb"/>
+        <w:spacing w:before="0" w:beforeAutospacing="0" w:after="260" w:afterAutospacing="0"/>
+        <w:textAlignment w:val="baseline"/>
+        <w:rPr>
+          <w:rFonts w:ascii="Arial" w:hAnsi="Arial" w:cs="Arial"/>
+          <w:color w:val="000000"/>
+        </w:rPr>
+      </w:pPr>
+      <w:r>
+        <w:rPr>
+          <w:rFonts w:ascii="Arial" w:hAnsi="Arial" w:cs="Arial"/>
+          <w:noProof/>
+          <w:color w:val="000000"/>
+        </w:rPr>
+        <w:drawing>
+          <wp:inline distT="0" distB="0" distL="0" distR="0" wp14:anchorId="2FCE15C6" wp14:editId="2E14555E">
+            <wp:extent cx="5809437" cy="4681983"/>
+            <wp:effectExtent l="0" t="0" r="1270" b="4445"/>
+            <wp:docPr id="435424044" name="Picture 1"/>
+            <wp:cNvGraphicFramePr>
+              <a:graphicFrameLocks xmlns:a="http://schemas.openxmlformats.org/drawingml/2006/main" noChangeAspect="1"/>
+            </wp:cNvGraphicFramePr>
+            <a:graphic xmlns:a="http://schemas.openxmlformats.org/drawingml/2006/main">
+              <a:graphicData uri="http://schemas.openxmlformats.org/drawingml/2006/picture">
+                <pic:pic xmlns:pic="http://schemas.openxmlformats.org/drawingml/2006/picture">
+                  <pic:nvPicPr>
+                    <pic:cNvPr id="0" name="Picture 1"/>
+                    <pic:cNvPicPr>
+                      <a:picLocks noChangeAspect="1" noChangeArrowheads="1"/>
+                    </pic:cNvPicPr>
+                  </pic:nvPicPr>
+                  <pic:blipFill>
+                    <a:blip r:embed="rId9">
+                      <a:extLst>
+                        <a:ext uri="{28A0092B-C50C-407E-A947-70E740481C1C}">
+                          <a14:useLocalDpi xmlns:a14="http://schemas.microsoft.com/office/drawing/2010/main" val="0"/>
+                        </a:ext>
+                      </a:extLst>
+                    </a:blip>
+                    <a:srcRect/>
+                    <a:stretch>
+                      <a:fillRect/>
+                    </a:stretch>
+                  </pic:blipFill>
+                  <pic:spPr bwMode="auto">
+                    <a:xfrm>
+                      <a:off x="0" y="0"/>
+                      <a:ext cx="5826313" cy="4695584"/>
+                    </a:xfrm>
+                    <a:prstGeom prst="rect">
+                      <a:avLst/>
+                    </a:prstGeom>
+                    <a:noFill/>
+                    <a:ln>
+                      <a:noFill/>
+                    </a:ln>
+                  </pic:spPr>
+                </pic:pic>
+              </a:graphicData>
+            </a:graphic>
+          </wp:inline>
+        </w:drawing>
+      </w:r>
+    </w:p>
+    <w:p>
+      <w:pPr>
         <w:pStyle w:val="Heading3"/>
         <w:spacing w:before="0"/>
         <w:rPr>
@@ -5671,6 +5737,10 @@
       <w:pPr>
         <w:pStyle w:val="NormalWeb"/>
         <w:spacing w:before="0" w:beforeAutospacing="0" w:after="260" w:afterAutospacing="0"/>
+        <w:rPr>
+          <w:rFonts w:ascii="Arial" w:hAnsi="Arial" w:cs="Arial"/>
+          <w:color w:val="000000"/>
+        </w:rPr>
       </w:pPr>
       <w:r>
         <w:rPr>
@@ -5727,6 +5797,12 @@
         </w:rPr>
         <w:t>, which then interacts with the Invoice entity and triggers a stock reduction in the Product entity before confirming the transaction to the user.</w:t>
       </w:r>
+    </w:p>
+    <w:p>
+      <w:pPr>
+        <w:pStyle w:val="NormalWeb"/>
+        <w:spacing w:before="0" w:beforeAutospacing="0" w:after="260" w:afterAutospacing="0"/>
+      </w:pPr>
     </w:p>
     <w:p>
       <w:pPr>
@@ -5838,6 +5914,7 @@
           <w:bCs/>
           <w:color w:val="000000"/>
         </w:rPr>
+        <w:lastRenderedPageBreak/>
         <w:t>Encapsulation</w:t>
       </w:r>
       <w:r>

</xml_diff>

<commit_message>
reports: Add Sequence Diagram in subsection 5.3.
</commit_message>
<xml_diff>
--- a/reports/report.docx
+++ b/reports/report.docx
@@ -591,27 +591,7 @@
           <w:kern w:val="0"/>
           <w14:ligatures w14:val="none"/>
         </w:rPr>
-        <w:t xml:space="preserve">: </w:t>
-      </w:r>
-      <w:proofErr w:type="spellStart"/>
-      <w:r>
-        <w:rPr>
-          <w:rFonts w:ascii="Arial" w:eastAsia="Times New Roman" w:hAnsi="Arial" w:cs="Arial"/>
-          <w:color w:val="000000"/>
-          <w:kern w:val="0"/>
-          <w14:ligatures w14:val="none"/>
-        </w:rPr>
-        <w:t>Trần</w:t>
-      </w:r>
-      <w:proofErr w:type="spellEnd"/>
-      <w:r>
-        <w:rPr>
-          <w:rFonts w:ascii="Arial" w:eastAsia="Times New Roman" w:hAnsi="Arial" w:cs="Arial"/>
-          <w:color w:val="000000"/>
-          <w:kern w:val="0"/>
-          <w14:ligatures w14:val="none"/>
-        </w:rPr>
-        <w:t xml:space="preserve"> Quang Duy – Overall coordination and Database design.</w:t>
+        <w:t>: Trần Quang Duy – Overall coordination and Database design.</w:t>
       </w:r>
     </w:p>
     <w:p>
@@ -648,47 +628,7 @@
           <w:kern w:val="0"/>
           <w14:ligatures w14:val="none"/>
         </w:rPr>
-        <w:t xml:space="preserve">: Lý </w:t>
-      </w:r>
-      <w:proofErr w:type="spellStart"/>
-      <w:r>
-        <w:rPr>
-          <w:rFonts w:ascii="Arial" w:eastAsia="Times New Roman" w:hAnsi="Arial" w:cs="Arial"/>
-          <w:color w:val="000000"/>
-          <w:kern w:val="0"/>
-          <w14:ligatures w14:val="none"/>
-        </w:rPr>
-        <w:t>Tín</w:t>
-      </w:r>
-      <w:proofErr w:type="spellEnd"/>
-      <w:r>
-        <w:rPr>
-          <w:rFonts w:ascii="Arial" w:eastAsia="Times New Roman" w:hAnsi="Arial" w:cs="Arial"/>
-          <w:color w:val="000000"/>
-          <w:kern w:val="0"/>
-          <w14:ligatures w14:val="none"/>
-        </w:rPr>
-        <w:t xml:space="preserve"> </w:t>
-      </w:r>
-      <w:proofErr w:type="spellStart"/>
-      <w:r>
-        <w:rPr>
-          <w:rFonts w:ascii="Arial" w:eastAsia="Times New Roman" w:hAnsi="Arial" w:cs="Arial"/>
-          <w:color w:val="000000"/>
-          <w:kern w:val="0"/>
-          <w14:ligatures w14:val="none"/>
-        </w:rPr>
-        <w:t>Hòa</w:t>
-      </w:r>
-      <w:proofErr w:type="spellEnd"/>
-      <w:r>
-        <w:rPr>
-          <w:rFonts w:ascii="Arial" w:eastAsia="Times New Roman" w:hAnsi="Arial" w:cs="Arial"/>
-          <w:color w:val="000000"/>
-          <w:kern w:val="0"/>
-          <w14:ligatures w14:val="none"/>
-        </w:rPr>
-        <w:t xml:space="preserve"> – Controller logic and Business rules.</w:t>
+        <w:t>: Lý Tín Hòa – Controller logic and Business rules.</w:t>
       </w:r>
     </w:p>
     <w:p>
@@ -724,27 +664,7 @@
           <w:kern w:val="0"/>
           <w14:ligatures w14:val="none"/>
         </w:rPr>
-        <w:t xml:space="preserve">:  Hà </w:t>
-      </w:r>
-      <w:proofErr w:type="spellStart"/>
-      <w:r>
-        <w:rPr>
-          <w:rFonts w:ascii="Arial" w:eastAsia="Times New Roman" w:hAnsi="Arial" w:cs="Arial"/>
-          <w:color w:val="000000"/>
-          <w:kern w:val="0"/>
-          <w14:ligatures w14:val="none"/>
-        </w:rPr>
-        <w:t>Dư</w:t>
-      </w:r>
-      <w:proofErr w:type="spellEnd"/>
-      <w:r>
-        <w:rPr>
-          <w:rFonts w:ascii="Arial" w:eastAsia="Times New Roman" w:hAnsi="Arial" w:cs="Arial"/>
-          <w:color w:val="000000"/>
-          <w:kern w:val="0"/>
-          <w14:ligatures w14:val="none"/>
-        </w:rPr>
-        <w:t xml:space="preserve"> Tuấn – UI/UX design and Frontend implementation.</w:t>
+        <w:t>:  Hà Dư Tuấn – UI/UX design and Frontend implementation.</w:t>
       </w:r>
     </w:p>
     <w:p>
@@ -1314,27 +1234,7 @@
           <w:kern w:val="0"/>
           <w14:ligatures w14:val="none"/>
         </w:rPr>
-        <w:t>The project adheres to C# Coding Conventions (</w:t>
-      </w:r>
-      <w:proofErr w:type="spellStart"/>
-      <w:r>
-        <w:rPr>
-          <w:rFonts w:ascii="Arial" w:eastAsia="Times New Roman" w:hAnsi="Arial" w:cs="Arial"/>
-          <w:color w:val="000000"/>
-          <w:kern w:val="0"/>
-          <w14:ligatures w14:val="none"/>
-        </w:rPr>
-        <w:t>PascalCase</w:t>
-      </w:r>
-      <w:proofErr w:type="spellEnd"/>
-      <w:r>
-        <w:rPr>
-          <w:rFonts w:ascii="Arial" w:eastAsia="Times New Roman" w:hAnsi="Arial" w:cs="Arial"/>
-          <w:color w:val="000000"/>
-          <w:kern w:val="0"/>
-          <w14:ligatures w14:val="none"/>
-        </w:rPr>
-        <w:t xml:space="preserve"> for methods, camelCase for variables) and IEEE standards for technical documentation.</w:t>
+        <w:t>The project adheres to C# Coding Conventions (PascalCase for methods, camelCase for variables) and IEEE standards for technical documentation.</w:t>
       </w:r>
     </w:p>
     <w:p>
@@ -4992,19 +4892,8 @@
           <w:bCs/>
           <w:color w:val="000000"/>
         </w:rPr>
-        <w:t xml:space="preserve">Invoices &amp; </w:t>
-      </w:r>
-      <w:proofErr w:type="spellStart"/>
-      <w:r>
-        <w:rPr>
-          <w:rFonts w:ascii="Arial" w:hAnsi="Arial" w:cs="Arial"/>
-          <w:b/>
-          <w:bCs/>
-          <w:color w:val="000000"/>
-        </w:rPr>
-        <w:t>InvoiceDetails</w:t>
-      </w:r>
-      <w:proofErr w:type="spellEnd"/>
+        <w:t>Invoices &amp; InvoiceDetails</w:t>
+      </w:r>
       <w:r>
         <w:rPr>
           <w:rFonts w:ascii="Arial" w:hAnsi="Arial" w:cs="Arial"/>
@@ -5240,7 +5129,6 @@
           <w:color w:val="000000"/>
         </w:rPr>
       </w:pPr>
-      <w:proofErr w:type="spellStart"/>
       <w:r>
         <w:rPr>
           <w:rFonts w:ascii="Arial" w:hAnsi="Arial" w:cs="Arial"/>
@@ -5248,17 +5136,7 @@
           <w:bCs/>
           <w:color w:val="000000"/>
         </w:rPr>
-        <w:t>HardwareSpec</w:t>
-      </w:r>
-      <w:proofErr w:type="spellEnd"/>
-      <w:r>
-        <w:rPr>
-          <w:rFonts w:ascii="Arial" w:hAnsi="Arial" w:cs="Arial"/>
-          <w:b/>
-          <w:bCs/>
-          <w:color w:val="000000"/>
-        </w:rPr>
-        <w:t>:</w:t>
+        <w:t>HardwareSpec:</w:t>
       </w:r>
       <w:r>
         <w:rPr>
@@ -5289,50 +5167,14 @@
           <w:bCs/>
           <w:color w:val="000000"/>
         </w:rPr>
-        <w:t xml:space="preserve">Invoice &amp; </w:t>
-      </w:r>
-      <w:proofErr w:type="spellStart"/>
+        <w:t>Invoice &amp; InvoiceDetail:</w:t>
+      </w:r>
       <w:r>
         <w:rPr>
           <w:rFonts w:ascii="Arial" w:hAnsi="Arial" w:cs="Arial"/>
-          <w:b/>
-          <w:bCs/>
-          <w:color w:val="000000"/>
-        </w:rPr>
-        <w:t>InvoiceDetail</w:t>
-      </w:r>
-      <w:proofErr w:type="spellEnd"/>
-      <w:r>
-        <w:rPr>
-          <w:rFonts w:ascii="Arial" w:hAnsi="Arial" w:cs="Arial"/>
-          <w:b/>
-          <w:bCs/>
-          <w:color w:val="000000"/>
-        </w:rPr>
-        <w:t>:</w:t>
-      </w:r>
-      <w:r>
-        <w:rPr>
-          <w:rFonts w:ascii="Arial" w:hAnsi="Arial" w:cs="Arial"/>
-          <w:color w:val="000000"/>
-        </w:rPr>
-        <w:t xml:space="preserve"> These classes record transaction data; a Composition relationship is used to ensure that an </w:t>
-      </w:r>
-      <w:proofErr w:type="spellStart"/>
-      <w:r>
-        <w:rPr>
-          <w:rFonts w:ascii="Arial" w:hAnsi="Arial" w:cs="Arial"/>
-          <w:color w:val="000000"/>
-        </w:rPr>
-        <w:t>InvoiceDetail</w:t>
-      </w:r>
-      <w:proofErr w:type="spellEnd"/>
-      <w:r>
-        <w:rPr>
-          <w:rFonts w:ascii="Arial" w:hAnsi="Arial" w:cs="Arial"/>
-          <w:color w:val="000000"/>
-        </w:rPr>
-        <w:t xml:space="preserve"> cannot exist without its parent Invoice.</w:t>
+          <w:color w:val="000000"/>
+        </w:rPr>
+        <w:t xml:space="preserve"> These classes record transaction data; a Composition relationship is used to ensure that an InvoiceDetail cannot exist without its parent Invoice.</w:t>
       </w:r>
     </w:p>
     <w:p>
@@ -5373,7 +5215,6 @@
           <w:color w:val="000000"/>
         </w:rPr>
       </w:pPr>
-      <w:proofErr w:type="spellStart"/>
       <w:r>
         <w:rPr>
           <w:rFonts w:ascii="Arial" w:hAnsi="Arial" w:cs="Arial"/>
@@ -5381,17 +5222,7 @@
           <w:bCs/>
           <w:color w:val="000000"/>
         </w:rPr>
-        <w:t>AccountController</w:t>
-      </w:r>
-      <w:proofErr w:type="spellEnd"/>
-      <w:r>
-        <w:rPr>
-          <w:rFonts w:ascii="Arial" w:hAnsi="Arial" w:cs="Arial"/>
-          <w:b/>
-          <w:bCs/>
-          <w:color w:val="000000"/>
-        </w:rPr>
-        <w:t>:</w:t>
+        <w:t>AccountController:</w:t>
       </w:r>
       <w:r>
         <w:rPr>
@@ -5415,7 +5246,6 @@
           <w:color w:val="000000"/>
         </w:rPr>
       </w:pPr>
-      <w:proofErr w:type="spellStart"/>
       <w:r>
         <w:rPr>
           <w:rFonts w:ascii="Arial" w:hAnsi="Arial" w:cs="Arial"/>
@@ -5423,17 +5253,7 @@
           <w:bCs/>
           <w:color w:val="000000"/>
         </w:rPr>
-        <w:t>SalesController</w:t>
-      </w:r>
-      <w:proofErr w:type="spellEnd"/>
-      <w:r>
-        <w:rPr>
-          <w:rFonts w:ascii="Arial" w:hAnsi="Arial" w:cs="Arial"/>
-          <w:b/>
-          <w:bCs/>
-          <w:color w:val="000000"/>
-        </w:rPr>
-        <w:t>:</w:t>
+        <w:t>SalesController:</w:t>
       </w:r>
       <w:r>
         <w:rPr>
@@ -5457,7 +5277,6 @@
           <w:color w:val="000000"/>
         </w:rPr>
       </w:pPr>
-      <w:proofErr w:type="spellStart"/>
       <w:r>
         <w:rPr>
           <w:rFonts w:ascii="Arial" w:hAnsi="Arial" w:cs="Arial"/>
@@ -5465,17 +5284,7 @@
           <w:bCs/>
           <w:color w:val="000000"/>
         </w:rPr>
-        <w:t>InventoryController</w:t>
-      </w:r>
-      <w:proofErr w:type="spellEnd"/>
-      <w:r>
-        <w:rPr>
-          <w:rFonts w:ascii="Arial" w:hAnsi="Arial" w:cs="Arial"/>
-          <w:b/>
-          <w:bCs/>
-          <w:color w:val="000000"/>
-        </w:rPr>
-        <w:t>:</w:t>
+        <w:t>InventoryController:</w:t>
       </w:r>
       <w:r>
         <w:rPr>
@@ -5499,7 +5308,6 @@
           <w:color w:val="000000"/>
         </w:rPr>
       </w:pPr>
-      <w:proofErr w:type="spellStart"/>
       <w:r>
         <w:rPr>
           <w:rFonts w:ascii="Arial" w:hAnsi="Arial" w:cs="Arial"/>
@@ -5507,17 +5315,7 @@
           <w:bCs/>
           <w:color w:val="000000"/>
         </w:rPr>
-        <w:t>ReportController</w:t>
-      </w:r>
-      <w:proofErr w:type="spellEnd"/>
-      <w:r>
-        <w:rPr>
-          <w:rFonts w:ascii="Arial" w:hAnsi="Arial" w:cs="Arial"/>
-          <w:b/>
-          <w:bCs/>
-          <w:color w:val="000000"/>
-        </w:rPr>
-        <w:t>:</w:t>
+        <w:t>ReportController:</w:t>
       </w:r>
       <w:r>
         <w:rPr>
@@ -5571,71 +5369,7 @@
           <w:color w:val="000000"/>
         </w:rPr>
         <w:lastRenderedPageBreak/>
-        <w:t>The View layer consists of Windows Forms (</w:t>
-      </w:r>
-      <w:proofErr w:type="spellStart"/>
-      <w:r>
-        <w:rPr>
-          <w:rFonts w:ascii="Arial" w:hAnsi="Arial" w:cs="Arial"/>
-          <w:color w:val="000000"/>
-        </w:rPr>
-        <w:t>frmLogin</w:t>
-      </w:r>
-      <w:proofErr w:type="spellEnd"/>
-      <w:r>
-        <w:rPr>
-          <w:rFonts w:ascii="Arial" w:hAnsi="Arial" w:cs="Arial"/>
-          <w:color w:val="000000"/>
-        </w:rPr>
-        <w:t xml:space="preserve">, </w:t>
-      </w:r>
-      <w:proofErr w:type="spellStart"/>
-      <w:r>
-        <w:rPr>
-          <w:rFonts w:ascii="Arial" w:hAnsi="Arial" w:cs="Arial"/>
-          <w:color w:val="000000"/>
-        </w:rPr>
-        <w:t>frmSales</w:t>
-      </w:r>
-      <w:proofErr w:type="spellEnd"/>
-      <w:r>
-        <w:rPr>
-          <w:rFonts w:ascii="Arial" w:hAnsi="Arial" w:cs="Arial"/>
-          <w:color w:val="000000"/>
-        </w:rPr>
-        <w:t xml:space="preserve">, </w:t>
-      </w:r>
-      <w:proofErr w:type="spellStart"/>
-      <w:r>
-        <w:rPr>
-          <w:rFonts w:ascii="Arial" w:hAnsi="Arial" w:cs="Arial"/>
-          <w:color w:val="000000"/>
-        </w:rPr>
-        <w:t>frmInventory</w:t>
-      </w:r>
-      <w:proofErr w:type="spellEnd"/>
-      <w:r>
-        <w:rPr>
-          <w:rFonts w:ascii="Arial" w:hAnsi="Arial" w:cs="Arial"/>
-          <w:color w:val="000000"/>
-        </w:rPr>
-        <w:t xml:space="preserve">, </w:t>
-      </w:r>
-      <w:proofErr w:type="spellStart"/>
-      <w:r>
-        <w:rPr>
-          <w:rFonts w:ascii="Arial" w:hAnsi="Arial" w:cs="Arial"/>
-          <w:color w:val="000000"/>
-        </w:rPr>
-        <w:t>frmReports</w:t>
-      </w:r>
-      <w:proofErr w:type="spellEnd"/>
-      <w:r>
-        <w:rPr>
-          <w:rFonts w:ascii="Arial" w:hAnsi="Arial" w:cs="Arial"/>
-          <w:color w:val="000000"/>
-        </w:rPr>
-        <w:t>) that capture user input and display data retrieved from the Controllers.</w:t>
+        <w:t>The View layer consists of Windows Forms (frmLogin, frmSales, frmInventory, frmReports) that capture user input and display data retrieved from the Controllers.</w:t>
       </w:r>
     </w:p>
     <w:p>
@@ -5763,39 +5497,7 @@
           <w:rFonts w:ascii="Arial" w:hAnsi="Arial" w:cs="Arial"/>
           <w:color w:val="000000"/>
         </w:rPr>
-        <w:t xml:space="preserve"> sequence is modeled. This sequence demonstrates how the </w:t>
-      </w:r>
-      <w:proofErr w:type="spellStart"/>
-      <w:r>
-        <w:rPr>
-          <w:rFonts w:ascii="Arial" w:hAnsi="Arial" w:cs="Arial"/>
-          <w:color w:val="000000"/>
-        </w:rPr>
-        <w:t>SalesView</w:t>
-      </w:r>
-      <w:proofErr w:type="spellEnd"/>
-      <w:r>
-        <w:rPr>
-          <w:rFonts w:ascii="Arial" w:hAnsi="Arial" w:cs="Arial"/>
-          <w:color w:val="000000"/>
-        </w:rPr>
-        <w:t xml:space="preserve"> sends data to the </w:t>
-      </w:r>
-      <w:proofErr w:type="spellStart"/>
-      <w:r>
-        <w:rPr>
-          <w:rFonts w:ascii="Arial" w:hAnsi="Arial" w:cs="Arial"/>
-          <w:color w:val="000000"/>
-        </w:rPr>
-        <w:t>SalesController</w:t>
-      </w:r>
-      <w:proofErr w:type="spellEnd"/>
-      <w:r>
-        <w:rPr>
-          <w:rFonts w:ascii="Arial" w:hAnsi="Arial" w:cs="Arial"/>
-          <w:color w:val="000000"/>
-        </w:rPr>
-        <w:t>, which then interacts with the Invoice entity and triggers a stock reduction in the Product entity before confirming the transaction to the user.</w:t>
+        <w:t xml:space="preserve"> sequence is modeled. This sequence demonstrates how the SalesView sends data to the SalesController, which then interacts with the Invoice entity and triggers a stock reduction in the Product entity before confirming the transaction to the user.</w:t>
       </w:r>
     </w:p>
     <w:p>
@@ -5803,6 +5505,60 @@
         <w:pStyle w:val="NormalWeb"/>
         <w:spacing w:before="0" w:beforeAutospacing="0" w:after="260" w:afterAutospacing="0"/>
       </w:pPr>
+      <w:r>
+        <w:rPr>
+          <w:noProof/>
+        </w:rPr>
+        <w:lastRenderedPageBreak/>
+        <w:drawing>
+          <wp:inline distT="0" distB="0" distL="0" distR="0" wp14:anchorId="662C8673" wp14:editId="36BF42BD">
+            <wp:extent cx="5935345" cy="6180455"/>
+            <wp:effectExtent l="0" t="0" r="8255" b="0"/>
+            <wp:docPr id="1845974120" name="Picture 1"/>
+            <wp:cNvGraphicFramePr>
+              <a:graphicFrameLocks xmlns:a="http://schemas.openxmlformats.org/drawingml/2006/main" noChangeAspect="1"/>
+            </wp:cNvGraphicFramePr>
+            <a:graphic xmlns:a="http://schemas.openxmlformats.org/drawingml/2006/main">
+              <a:graphicData uri="http://schemas.openxmlformats.org/drawingml/2006/picture">
+                <pic:pic xmlns:pic="http://schemas.openxmlformats.org/drawingml/2006/picture">
+                  <pic:nvPicPr>
+                    <pic:cNvPr id="0" name="Picture 1"/>
+                    <pic:cNvPicPr>
+                      <a:picLocks noChangeAspect="1" noChangeArrowheads="1"/>
+                    </pic:cNvPicPr>
+                  </pic:nvPicPr>
+                  <pic:blipFill>
+                    <a:blip r:embed="rId10" cstate="print">
+                      <a:extLst>
+                        <a:ext uri="{28A0092B-C50C-407E-A947-70E740481C1C}">
+                          <a14:useLocalDpi xmlns:a14="http://schemas.microsoft.com/office/drawing/2010/main" val="0"/>
+                        </a:ext>
+                      </a:extLst>
+                    </a:blip>
+                    <a:srcRect/>
+                    <a:stretch>
+                      <a:fillRect/>
+                    </a:stretch>
+                  </pic:blipFill>
+                  <pic:spPr bwMode="auto">
+                    <a:xfrm>
+                      <a:off x="0" y="0"/>
+                      <a:ext cx="5935345" cy="6180455"/>
+                    </a:xfrm>
+                    <a:prstGeom prst="rect">
+                      <a:avLst/>
+                    </a:prstGeom>
+                    <a:noFill/>
+                    <a:ln>
+                      <a:noFill/>
+                    </a:ln>
+                  </pic:spPr>
+                </pic:pic>
+              </a:graphicData>
+            </a:graphic>
+          </wp:inline>
+        </w:drawing>
+      </w:r>
     </w:p>
     <w:p>
       <w:pPr>
@@ -5874,23 +5630,7 @@
           <w:rFonts w:ascii="Arial" w:hAnsi="Arial" w:cs="Arial"/>
           <w:color w:val="000000"/>
         </w:rPr>
-        <w:t xml:space="preserve">: Implementing the System User inheritance logic at the code level ensures that only authorized Actors can access sensitive Controllers (e.g., </w:t>
-      </w:r>
-      <w:proofErr w:type="spellStart"/>
-      <w:r>
-        <w:rPr>
-          <w:rFonts w:ascii="Arial" w:hAnsi="Arial" w:cs="Arial"/>
-          <w:color w:val="000000"/>
-        </w:rPr>
-        <w:t>ReportController</w:t>
-      </w:r>
-      <w:proofErr w:type="spellEnd"/>
-      <w:r>
-        <w:rPr>
-          <w:rFonts w:ascii="Arial" w:hAnsi="Arial" w:cs="Arial"/>
-          <w:color w:val="000000"/>
-        </w:rPr>
-        <w:t>).</w:t>
+        <w:t>: Implementing the System User inheritance logic at the code level ensures that only authorized Actors can access sensitive Controllers (e.g., ReportController).</w:t>
       </w:r>
     </w:p>
     <w:p>
@@ -5914,7 +5654,6 @@
           <w:bCs/>
           <w:color w:val="000000"/>
         </w:rPr>
-        <w:lastRenderedPageBreak/>
         <w:t>Encapsulation</w:t>
       </w:r>
       <w:r>
@@ -5982,6 +5721,7 @@
           <w:szCs w:val="26"/>
           <w14:ligatures w14:val="none"/>
         </w:rPr>
+        <w:lastRenderedPageBreak/>
         <w:t>5.5. Traceability from requirements to detailed design model</w:t>
       </w:r>
     </w:p>
@@ -6026,23 +5766,7 @@
           <w:rFonts w:ascii="Arial" w:hAnsi="Arial" w:cs="Arial"/>
           <w:color w:val="000000"/>
         </w:rPr>
-        <w:t xml:space="preserve"> → Managed by </w:t>
-      </w:r>
-      <w:proofErr w:type="spellStart"/>
-      <w:r>
-        <w:rPr>
-          <w:rFonts w:ascii="Arial" w:hAnsi="Arial" w:cs="Arial"/>
-          <w:color w:val="000000"/>
-        </w:rPr>
-        <w:t>AccountController</w:t>
-      </w:r>
-      <w:proofErr w:type="spellEnd"/>
-      <w:r>
-        <w:rPr>
-          <w:rFonts w:ascii="Arial" w:hAnsi="Arial" w:cs="Arial"/>
-          <w:color w:val="000000"/>
-        </w:rPr>
-        <w:t>.</w:t>
+        <w:t xml:space="preserve"> → Managed by AccountController.</w:t>
       </w:r>
     </w:p>
     <w:p>
@@ -6073,23 +5797,7 @@
           <w:rFonts w:ascii="Arial" w:hAnsi="Arial" w:cs="Arial"/>
           <w:color w:val="000000"/>
         </w:rPr>
-        <w:t xml:space="preserve"> → Managed by </w:t>
-      </w:r>
-      <w:proofErr w:type="spellStart"/>
-      <w:r>
-        <w:rPr>
-          <w:rFonts w:ascii="Arial" w:hAnsi="Arial" w:cs="Arial"/>
-          <w:color w:val="000000"/>
-        </w:rPr>
-        <w:t>SalesController</w:t>
-      </w:r>
-      <w:proofErr w:type="spellEnd"/>
-      <w:r>
-        <w:rPr>
-          <w:rFonts w:ascii="Arial" w:hAnsi="Arial" w:cs="Arial"/>
-          <w:color w:val="000000"/>
-        </w:rPr>
-        <w:t xml:space="preserve"> and Invoice entity.</w:t>
+        <w:t xml:space="preserve"> → Managed by SalesController and Invoice entity.</w:t>
       </w:r>
     </w:p>
     <w:p>
@@ -6120,23 +5828,7 @@
           <w:rFonts w:ascii="Arial" w:hAnsi="Arial" w:cs="Arial"/>
           <w:color w:val="000000"/>
         </w:rPr>
-        <w:t xml:space="preserve"> Managed by </w:t>
-      </w:r>
-      <w:proofErr w:type="spellStart"/>
-      <w:r>
-        <w:rPr>
-          <w:rFonts w:ascii="Arial" w:hAnsi="Arial" w:cs="Arial"/>
-          <w:color w:val="000000"/>
-        </w:rPr>
-        <w:t>InventoryController</w:t>
-      </w:r>
-      <w:proofErr w:type="spellEnd"/>
-      <w:r>
-        <w:rPr>
-          <w:rFonts w:ascii="Arial" w:hAnsi="Arial" w:cs="Arial"/>
-          <w:color w:val="000000"/>
-        </w:rPr>
-        <w:t xml:space="preserve"> and Product entity.</w:t>
+        <w:t xml:space="preserve"> Managed by InventoryController and Product entity.</w:t>
       </w:r>
     </w:p>
     <w:p>
@@ -6167,23 +5859,7 @@
           <w:rFonts w:ascii="Arial" w:hAnsi="Arial" w:cs="Arial"/>
           <w:color w:val="000000"/>
         </w:rPr>
-        <w:t xml:space="preserve"> → Managed by </w:t>
-      </w:r>
-      <w:proofErr w:type="spellStart"/>
-      <w:r>
-        <w:rPr>
-          <w:rFonts w:ascii="Arial" w:hAnsi="Arial" w:cs="Arial"/>
-          <w:color w:val="000000"/>
-        </w:rPr>
-        <w:t>CustomerController</w:t>
-      </w:r>
-      <w:proofErr w:type="spellEnd"/>
-      <w:r>
-        <w:rPr>
-          <w:rFonts w:ascii="Arial" w:hAnsi="Arial" w:cs="Arial"/>
-          <w:color w:val="000000"/>
-        </w:rPr>
-        <w:t>.</w:t>
+        <w:t xml:space="preserve"> → Managed by CustomerController.</w:t>
       </w:r>
     </w:p>
     <w:p>
@@ -6230,23 +5906,7 @@
           <w:rFonts w:ascii="Arial" w:hAnsi="Arial" w:cs="Arial"/>
           <w:color w:val="000000"/>
         </w:rPr>
-        <w:t xml:space="preserve"> Managed by </w:t>
-      </w:r>
-      <w:proofErr w:type="spellStart"/>
-      <w:r>
-        <w:rPr>
-          <w:rFonts w:ascii="Arial" w:hAnsi="Arial" w:cs="Arial"/>
-          <w:color w:val="000000"/>
-        </w:rPr>
-        <w:t>AccountController</w:t>
-      </w:r>
-      <w:proofErr w:type="spellEnd"/>
-      <w:r>
-        <w:rPr>
-          <w:rFonts w:ascii="Arial" w:hAnsi="Arial" w:cs="Arial"/>
-          <w:color w:val="000000"/>
-        </w:rPr>
-        <w:t xml:space="preserve"> and Staff entity.</w:t>
+        <w:t xml:space="preserve"> Managed by AccountController and Staff entity.</w:t>
       </w:r>
     </w:p>
     <w:p>
@@ -6293,23 +5953,7 @@
           <w:rFonts w:ascii="Arial" w:hAnsi="Arial" w:cs="Arial"/>
           <w:color w:val="000000"/>
         </w:rPr>
-        <w:t xml:space="preserve"> Implemented as a method within </w:t>
-      </w:r>
-      <w:proofErr w:type="spellStart"/>
-      <w:r>
-        <w:rPr>
-          <w:rFonts w:ascii="Arial" w:hAnsi="Arial" w:cs="Arial"/>
-          <w:color w:val="000000"/>
-        </w:rPr>
-        <w:t>SalesController</w:t>
-      </w:r>
-      <w:proofErr w:type="spellEnd"/>
-      <w:r>
-        <w:rPr>
-          <w:rFonts w:ascii="Arial" w:hAnsi="Arial" w:cs="Arial"/>
-          <w:color w:val="000000"/>
-        </w:rPr>
-        <w:t>.</w:t>
+        <w:t xml:space="preserve"> Implemented as a method within SalesController.</w:t>
       </w:r>
     </w:p>
     <w:p>
@@ -6369,17 +6013,8 @@
           <w:rFonts w:ascii="Arial" w:hAnsi="Arial" w:cs="Arial"/>
           <w:color w:val="000000"/>
         </w:rPr>
-        <w:t xml:space="preserve">Managed by </w:t>
-      </w:r>
-      <w:proofErr w:type="spellStart"/>
-      <w:r>
-        <w:rPr>
-          <w:rFonts w:ascii="Arial" w:hAnsi="Arial" w:cs="Arial"/>
-          <w:color w:val="000000"/>
-        </w:rPr>
-        <w:t>ReportController</w:t>
-      </w:r>
-      <w:proofErr w:type="spellEnd"/>
+        <w:t>Managed by ReportController</w:t>
+      </w:r>
       <w:r>
         <w:rPr>
           <w:rFonts w:ascii="Arial" w:hAnsi="Arial" w:cs="Arial"/>

</xml_diff>

<commit_message>
reports: Add initial draft for Test Plan
</commit_message>
<xml_diff>
--- a/reports/report.docx
+++ b/reports/report.docx
@@ -1,6 +1,6 @@
 
 <file path=word/document.xml><?xml version="1.0" encoding="utf-8"?>
-<w:document xmlns:wpc="http://schemas.microsoft.com/office/word/2010/wordprocessingCanvas" xmlns:cx="http://schemas.microsoft.com/office/drawing/2014/chartex" xmlns:cx1="http://schemas.microsoft.com/office/drawing/2015/9/8/chartex" xmlns:cx2="http://schemas.microsoft.com/office/drawing/2015/10/21/chartex" xmlns:cx3="http://schemas.microsoft.com/office/drawing/2016/5/9/chartex" xmlns:cx4="http://schemas.microsoft.com/office/drawing/2016/5/10/chartex" xmlns:cx5="http://schemas.microsoft.com/office/drawing/2016/5/11/chartex" xmlns:cx6="http://schemas.microsoft.com/office/drawing/2016/5/12/chartex" xmlns:cx7="http://schemas.microsoft.com/office/drawing/2016/5/13/chartex" xmlns:cx8="http://schemas.microsoft.com/office/drawing/2016/5/14/chartex" xmlns:mc="http://schemas.openxmlformats.org/markup-compatibility/2006" xmlns:aink="http://schemas.microsoft.com/office/drawing/2016/ink" xmlns:am3d="http://schemas.microsoft.com/office/drawing/2017/model3d" xmlns:o="urn:schemas-microsoft-com:office:office" xmlns:oel="http://schemas.microsoft.com/office/2019/extlst" xmlns:r="http://schemas.openxmlformats.org/officeDocument/2006/relationships" xmlns:m="http://schemas.openxmlformats.org/officeDocument/2006/math" xmlns:v="urn:schemas-microsoft-com:vml" xmlns:wp14="http://schemas.microsoft.com/office/word/2010/wordprocessingDrawing" xmlns:wp="http://schemas.openxmlformats.org/drawingml/2006/wordprocessingDrawing" xmlns:w10="urn:schemas-microsoft-com:office:word" xmlns:w="http://schemas.openxmlformats.org/wordprocessingml/2006/main" xmlns:w14="http://schemas.microsoft.com/office/word/2010/wordml" xmlns:w15="http://schemas.microsoft.com/office/word/2012/wordml" xmlns:w16cex="http://schemas.microsoft.com/office/word/2018/wordml/cex" xmlns:w16cid="http://schemas.microsoft.com/office/word/2016/wordml/cid" xmlns:w16="http://schemas.microsoft.com/office/word/2018/wordml" xmlns:w16du="http://schemas.microsoft.com/office/word/2023/wordml/word16du" xmlns:w16sdtdh="http://schemas.microsoft.com/office/word/2020/wordml/sdtdatahash" xmlns:w16se="http://schemas.microsoft.com/office/word/2015/wordml/symex" xmlns:wpg="http://schemas.microsoft.com/office/word/2010/wordprocessingGroup" xmlns:wpi="http://schemas.microsoft.com/office/word/2010/wordprocessingInk" xmlns:wne="http://schemas.microsoft.com/office/word/2006/wordml" xmlns:wps="http://schemas.microsoft.com/office/word/2010/wordprocessingShape" mc:Ignorable="w14 w15 w16se w16cid w16 w16cex w16sdtdh wp14">
+<w:document xmlns:wpc="http://schemas.microsoft.com/office/word/2010/wordprocessingCanvas" xmlns:cx="http://schemas.microsoft.com/office/drawing/2014/chartex" xmlns:cx1="http://schemas.microsoft.com/office/drawing/2015/9/8/chartex" xmlns:cx2="http://schemas.microsoft.com/office/drawing/2015/10/21/chartex" xmlns:cx3="http://schemas.microsoft.com/office/drawing/2016/5/9/chartex" xmlns:cx4="http://schemas.microsoft.com/office/drawing/2016/5/10/chartex" xmlns:cx5="http://schemas.microsoft.com/office/drawing/2016/5/11/chartex" xmlns:cx6="http://schemas.microsoft.com/office/drawing/2016/5/12/chartex" xmlns:cx7="http://schemas.microsoft.com/office/drawing/2016/5/13/chartex" xmlns:cx8="http://schemas.microsoft.com/office/drawing/2016/5/14/chartex" xmlns:mc="http://schemas.openxmlformats.org/markup-compatibility/2006" xmlns:aink="http://schemas.microsoft.com/office/drawing/2016/ink" xmlns:am3d="http://schemas.microsoft.com/office/drawing/2017/model3d" xmlns:o="urn:schemas-microsoft-com:office:office" xmlns:oel="http://schemas.microsoft.com/office/2019/extlst" xmlns:r="http://schemas.openxmlformats.org/officeDocument/2006/relationships" xmlns:m="http://schemas.openxmlformats.org/officeDocument/2006/math" xmlns:v="urn:schemas-microsoft-com:vml" xmlns:wp14="http://schemas.microsoft.com/office/word/2010/wordprocessingDrawing" xmlns:wp="http://schemas.openxmlformats.org/drawingml/2006/wordprocessingDrawing" xmlns:w10="urn:schemas-microsoft-com:office:word" xmlns:w="http://schemas.openxmlformats.org/wordprocessingml/2006/main" xmlns:w14="http://schemas.microsoft.com/office/word/2010/wordml" xmlns:w15="http://schemas.microsoft.com/office/word/2012/wordml" xmlns:w16cex="http://schemas.microsoft.com/office/word/2018/wordml/cex" xmlns:w16cid="http://schemas.microsoft.com/office/word/2016/wordml/cid" xmlns:w16="http://schemas.microsoft.com/office/word/2018/wordml" xmlns:w16du="http://schemas.microsoft.com/office/word/2023/wordml/word16du" xmlns:w16sdtdh="http://schemas.microsoft.com/office/word/2020/wordml/sdtdatahash" xmlns:w16sdtfl="http://schemas.microsoft.com/office/word/2024/wordml/sdtformatlock" xmlns:w16se="http://schemas.microsoft.com/office/word/2015/wordml/symex" xmlns:wpg="http://schemas.microsoft.com/office/word/2010/wordprocessingGroup" xmlns:wpi="http://schemas.microsoft.com/office/word/2010/wordprocessingInk" xmlns:wne="http://schemas.microsoft.com/office/word/2006/wordml" xmlns:wps="http://schemas.microsoft.com/office/word/2010/wordprocessingShape" mc:Ignorable="w14 w15 w16se w16cid w16 w16cex w16sdtdh w16sdtfl w16du wp14">
   <w:body>
     <w:p>
       <w:pPr>
@@ -6025,6 +6025,3551 @@
         <w:t>.</w:t>
       </w:r>
     </w:p>
+    <w:p>
+      <w:pPr>
+        <w:pStyle w:val="NormalWeb"/>
+        <w:spacing w:after="260"/>
+        <w:textAlignment w:val="baseline"/>
+        <w:rPr>
+          <w:rFonts w:ascii="Arial" w:hAnsi="Arial" w:cs="Arial"/>
+          <w:b/>
+          <w:bCs/>
+          <w:color w:val="000000"/>
+          <w:lang w:val="vi-VN"/>
+        </w:rPr>
+      </w:pPr>
+      <w:r>
+        <w:rPr>
+          <w:rFonts w:ascii="Arial" w:hAnsi="Arial" w:cs="Arial"/>
+          <w:b/>
+          <w:bCs/>
+          <w:color w:val="000000"/>
+          <w:lang w:val="vi-VN"/>
+        </w:rPr>
+        <w:t>6. Test Plan</w:t>
+      </w:r>
+    </w:p>
+    <w:p>
+      <w:pPr>
+        <w:pStyle w:val="NormalWeb"/>
+        <w:spacing w:after="260"/>
+        <w:textAlignment w:val="baseline"/>
+        <w:rPr>
+          <w:rFonts w:ascii="Arial" w:hAnsi="Arial" w:cs="Arial"/>
+          <w:b/>
+          <w:bCs/>
+          <w:color w:val="000000"/>
+          <w:lang w:val="vi-VN"/>
+        </w:rPr>
+      </w:pPr>
+      <w:r>
+        <w:rPr>
+          <w:rFonts w:ascii="Arial" w:hAnsi="Arial" w:cs="Arial"/>
+          <w:b/>
+          <w:bCs/>
+          <w:color w:val="000000"/>
+          <w:lang w:val="vi-VN"/>
+        </w:rPr>
+        <w:t>6.1. Requirements/specifications-based system level test cases</w:t>
+      </w:r>
+    </w:p>
+    <w:p>
+      <w:pPr>
+        <w:pStyle w:val="NormalWeb"/>
+        <w:textAlignment w:val="baseline"/>
+        <w:rPr>
+          <w:rFonts w:ascii="Arial" w:hAnsi="Arial" w:cs="Arial"/>
+          <w:color w:val="000000"/>
+          <w:lang w:val="vi-VN"/>
+        </w:rPr>
+      </w:pPr>
+      <w:r>
+        <w:rPr>
+          <w:rFonts w:ascii="Arial" w:hAnsi="Arial" w:cs="Arial"/>
+          <w:color w:val="000000"/>
+          <w:lang w:val="vi-VN"/>
+        </w:rPr>
+        <w:t>The following system-level test cases were executed to validate core functionalities:</w:t>
+      </w:r>
+    </w:p>
+    <w:tbl>
+      <w:tblPr>
+        <w:tblW w:w="0" w:type="auto"/>
+        <w:tblCellMar>
+          <w:top w:w="15" w:type="dxa"/>
+          <w:left w:w="15" w:type="dxa"/>
+          <w:bottom w:w="15" w:type="dxa"/>
+          <w:right w:w="15" w:type="dxa"/>
+        </w:tblCellMar>
+        <w:tblLook w:val="04A0" w:firstRow="1" w:lastRow="0" w:firstColumn="1" w:lastColumn="0" w:noHBand="0" w:noVBand="1"/>
+      </w:tblPr>
+      <w:tblGrid>
+        <w:gridCol w:w="950"/>
+        <w:gridCol w:w="1816"/>
+        <w:gridCol w:w="2643"/>
+        <w:gridCol w:w="3197"/>
+        <w:gridCol w:w="744"/>
+      </w:tblGrid>
+      <w:tr>
+        <w:trPr>
+          <w:trHeight w:val="1380"/>
+        </w:trPr>
+        <w:tc>
+          <w:tcPr>
+            <w:tcW w:w="0" w:type="auto"/>
+            <w:tcBorders>
+              <w:top w:val="single" w:sz="4" w:space="0" w:color="1F1F1F"/>
+              <w:left w:val="single" w:sz="4" w:space="0" w:color="1F1F1F"/>
+              <w:bottom w:val="single" w:sz="4" w:space="0" w:color="1F1F1F"/>
+              <w:right w:val="single" w:sz="4" w:space="0" w:color="1F1F1F"/>
+            </w:tcBorders>
+            <w:shd w:val="clear" w:color="auto" w:fill="EFEFEF"/>
+            <w:tcMar>
+              <w:top w:w="240" w:type="dxa"/>
+              <w:left w:w="0" w:type="dxa"/>
+              <w:bottom w:w="240" w:type="dxa"/>
+              <w:right w:w="180" w:type="dxa"/>
+            </w:tcMar>
+            <w:hideMark/>
+          </w:tcPr>
+          <w:p>
+            <w:pPr>
+              <w:pStyle w:val="NormalWeb"/>
+              <w:spacing w:after="260"/>
+              <w:textAlignment w:val="baseline"/>
+              <w:rPr>
+                <w:rFonts w:ascii="Arial" w:hAnsi="Arial" w:cs="Arial"/>
+                <w:color w:val="000000"/>
+                <w:lang w:val="vi-VN"/>
+              </w:rPr>
+            </w:pPr>
+            <w:r>
+              <w:rPr>
+                <w:rFonts w:ascii="Arial" w:hAnsi="Arial" w:cs="Arial"/>
+                <w:b/>
+                <w:bCs/>
+                <w:color w:val="000000"/>
+                <w:lang w:val="vi-VN"/>
+              </w:rPr>
+              <w:t>Test Case ID</w:t>
+            </w:r>
+          </w:p>
+        </w:tc>
+        <w:tc>
+          <w:tcPr>
+            <w:tcW w:w="0" w:type="auto"/>
+            <w:tcBorders>
+              <w:top w:val="single" w:sz="4" w:space="0" w:color="1F1F1F"/>
+              <w:left w:val="single" w:sz="4" w:space="0" w:color="1F1F1F"/>
+              <w:bottom w:val="single" w:sz="4" w:space="0" w:color="1F1F1F"/>
+              <w:right w:val="single" w:sz="4" w:space="0" w:color="1F1F1F"/>
+            </w:tcBorders>
+            <w:shd w:val="clear" w:color="auto" w:fill="EFEFEF"/>
+            <w:tcMar>
+              <w:top w:w="240" w:type="dxa"/>
+              <w:left w:w="0" w:type="dxa"/>
+              <w:bottom w:w="240" w:type="dxa"/>
+              <w:right w:w="180" w:type="dxa"/>
+            </w:tcMar>
+            <w:hideMark/>
+          </w:tcPr>
+          <w:p>
+            <w:pPr>
+              <w:pStyle w:val="NormalWeb"/>
+              <w:spacing w:after="260"/>
+              <w:textAlignment w:val="baseline"/>
+              <w:rPr>
+                <w:rFonts w:ascii="Arial" w:hAnsi="Arial" w:cs="Arial"/>
+                <w:color w:val="000000"/>
+                <w:lang w:val="vi-VN"/>
+              </w:rPr>
+            </w:pPr>
+            <w:r>
+              <w:rPr>
+                <w:rFonts w:ascii="Arial" w:hAnsi="Arial" w:cs="Arial"/>
+                <w:b/>
+                <w:bCs/>
+                <w:color w:val="000000"/>
+                <w:lang w:val="vi-VN"/>
+              </w:rPr>
+              <w:t>Feature / Module</w:t>
+            </w:r>
+          </w:p>
+        </w:tc>
+        <w:tc>
+          <w:tcPr>
+            <w:tcW w:w="0" w:type="auto"/>
+            <w:tcBorders>
+              <w:top w:val="single" w:sz="4" w:space="0" w:color="1F1F1F"/>
+              <w:left w:val="single" w:sz="4" w:space="0" w:color="1F1F1F"/>
+              <w:bottom w:val="single" w:sz="4" w:space="0" w:color="1F1F1F"/>
+              <w:right w:val="single" w:sz="4" w:space="0" w:color="1F1F1F"/>
+            </w:tcBorders>
+            <w:shd w:val="clear" w:color="auto" w:fill="EFEFEF"/>
+            <w:tcMar>
+              <w:top w:w="240" w:type="dxa"/>
+              <w:left w:w="0" w:type="dxa"/>
+              <w:bottom w:w="240" w:type="dxa"/>
+              <w:right w:w="180" w:type="dxa"/>
+            </w:tcMar>
+            <w:hideMark/>
+          </w:tcPr>
+          <w:p>
+            <w:pPr>
+              <w:pStyle w:val="NormalWeb"/>
+              <w:spacing w:after="260"/>
+              <w:textAlignment w:val="baseline"/>
+              <w:rPr>
+                <w:rFonts w:ascii="Arial" w:hAnsi="Arial" w:cs="Arial"/>
+                <w:color w:val="000000"/>
+                <w:lang w:val="vi-VN"/>
+              </w:rPr>
+            </w:pPr>
+            <w:r>
+              <w:rPr>
+                <w:rFonts w:ascii="Arial" w:hAnsi="Arial" w:cs="Arial"/>
+                <w:b/>
+                <w:bCs/>
+                <w:color w:val="000000"/>
+                <w:lang w:val="vi-VN"/>
+              </w:rPr>
+              <w:t>Test Steps</w:t>
+            </w:r>
+          </w:p>
+        </w:tc>
+        <w:tc>
+          <w:tcPr>
+            <w:tcW w:w="0" w:type="auto"/>
+            <w:tcBorders>
+              <w:top w:val="single" w:sz="4" w:space="0" w:color="1F1F1F"/>
+              <w:left w:val="single" w:sz="4" w:space="0" w:color="1F1F1F"/>
+              <w:bottom w:val="single" w:sz="4" w:space="0" w:color="1F1F1F"/>
+              <w:right w:val="single" w:sz="4" w:space="0" w:color="1F1F1F"/>
+            </w:tcBorders>
+            <w:shd w:val="clear" w:color="auto" w:fill="EFEFEF"/>
+            <w:tcMar>
+              <w:top w:w="240" w:type="dxa"/>
+              <w:left w:w="0" w:type="dxa"/>
+              <w:bottom w:w="240" w:type="dxa"/>
+              <w:right w:w="180" w:type="dxa"/>
+            </w:tcMar>
+            <w:hideMark/>
+          </w:tcPr>
+          <w:p>
+            <w:pPr>
+              <w:pStyle w:val="NormalWeb"/>
+              <w:spacing w:after="260"/>
+              <w:textAlignment w:val="baseline"/>
+              <w:rPr>
+                <w:rFonts w:ascii="Arial" w:hAnsi="Arial" w:cs="Arial"/>
+                <w:color w:val="000000"/>
+                <w:lang w:val="vi-VN"/>
+              </w:rPr>
+            </w:pPr>
+            <w:r>
+              <w:rPr>
+                <w:rFonts w:ascii="Arial" w:hAnsi="Arial" w:cs="Arial"/>
+                <w:b/>
+                <w:bCs/>
+                <w:color w:val="000000"/>
+                <w:lang w:val="vi-VN"/>
+              </w:rPr>
+              <w:t>Expected Result</w:t>
+            </w:r>
+          </w:p>
+        </w:tc>
+        <w:tc>
+          <w:tcPr>
+            <w:tcW w:w="0" w:type="auto"/>
+            <w:tcBorders>
+              <w:top w:val="single" w:sz="4" w:space="0" w:color="1F1F1F"/>
+              <w:left w:val="single" w:sz="4" w:space="0" w:color="1F1F1F"/>
+              <w:bottom w:val="single" w:sz="4" w:space="0" w:color="1F1F1F"/>
+              <w:right w:val="single" w:sz="4" w:space="0" w:color="1F1F1F"/>
+            </w:tcBorders>
+            <w:shd w:val="clear" w:color="auto" w:fill="EFEFEF"/>
+            <w:tcMar>
+              <w:top w:w="240" w:type="dxa"/>
+              <w:left w:w="0" w:type="dxa"/>
+              <w:bottom w:w="240" w:type="dxa"/>
+              <w:right w:w="0" w:type="dxa"/>
+            </w:tcMar>
+            <w:hideMark/>
+          </w:tcPr>
+          <w:p>
+            <w:pPr>
+              <w:pStyle w:val="NormalWeb"/>
+              <w:spacing w:after="260"/>
+              <w:textAlignment w:val="baseline"/>
+              <w:rPr>
+                <w:rFonts w:ascii="Arial" w:hAnsi="Arial" w:cs="Arial"/>
+                <w:color w:val="000000"/>
+                <w:lang w:val="vi-VN"/>
+              </w:rPr>
+            </w:pPr>
+            <w:r>
+              <w:rPr>
+                <w:rFonts w:ascii="Arial" w:hAnsi="Arial" w:cs="Arial"/>
+                <w:b/>
+                <w:bCs/>
+                <w:color w:val="000000"/>
+                <w:lang w:val="vi-VN"/>
+              </w:rPr>
+              <w:t>Status</w:t>
+            </w:r>
+          </w:p>
+        </w:tc>
+      </w:tr>
+      <w:tr>
+        <w:trPr>
+          <w:trHeight w:val="1965"/>
+        </w:trPr>
+        <w:tc>
+          <w:tcPr>
+            <w:tcW w:w="0" w:type="auto"/>
+            <w:tcBorders>
+              <w:top w:val="single" w:sz="4" w:space="0" w:color="1F1F1F"/>
+              <w:left w:val="single" w:sz="4" w:space="0" w:color="1F1F1F"/>
+              <w:bottom w:val="single" w:sz="4" w:space="0" w:color="1F1F1F"/>
+              <w:right w:val="single" w:sz="4" w:space="0" w:color="1F1F1F"/>
+            </w:tcBorders>
+            <w:tcMar>
+              <w:top w:w="240" w:type="dxa"/>
+              <w:left w:w="0" w:type="dxa"/>
+              <w:bottom w:w="240" w:type="dxa"/>
+              <w:right w:w="180" w:type="dxa"/>
+            </w:tcMar>
+            <w:hideMark/>
+          </w:tcPr>
+          <w:p>
+            <w:pPr>
+              <w:pStyle w:val="NormalWeb"/>
+              <w:spacing w:after="260"/>
+              <w:textAlignment w:val="baseline"/>
+              <w:rPr>
+                <w:rFonts w:ascii="Arial" w:hAnsi="Arial" w:cs="Arial"/>
+                <w:color w:val="000000"/>
+                <w:lang w:val="vi-VN"/>
+              </w:rPr>
+            </w:pPr>
+            <w:r>
+              <w:rPr>
+                <w:rFonts w:ascii="Arial" w:hAnsi="Arial" w:cs="Arial"/>
+                <w:b/>
+                <w:bCs/>
+                <w:color w:val="000000"/>
+                <w:lang w:val="vi-VN"/>
+              </w:rPr>
+              <w:t>TC-01</w:t>
+            </w:r>
+          </w:p>
+        </w:tc>
+        <w:tc>
+          <w:tcPr>
+            <w:tcW w:w="0" w:type="auto"/>
+            <w:tcBorders>
+              <w:top w:val="single" w:sz="4" w:space="0" w:color="1F1F1F"/>
+              <w:left w:val="single" w:sz="4" w:space="0" w:color="1F1F1F"/>
+              <w:bottom w:val="single" w:sz="4" w:space="0" w:color="1F1F1F"/>
+              <w:right w:val="single" w:sz="4" w:space="0" w:color="1F1F1F"/>
+            </w:tcBorders>
+            <w:tcMar>
+              <w:top w:w="240" w:type="dxa"/>
+              <w:left w:w="0" w:type="dxa"/>
+              <w:bottom w:w="240" w:type="dxa"/>
+              <w:right w:w="180" w:type="dxa"/>
+            </w:tcMar>
+            <w:hideMark/>
+          </w:tcPr>
+          <w:p>
+            <w:pPr>
+              <w:pStyle w:val="NormalWeb"/>
+              <w:spacing w:after="260"/>
+              <w:textAlignment w:val="baseline"/>
+              <w:rPr>
+                <w:rFonts w:ascii="Arial" w:hAnsi="Arial" w:cs="Arial"/>
+                <w:color w:val="000000"/>
+                <w:lang w:val="vi-VN"/>
+              </w:rPr>
+            </w:pPr>
+            <w:r>
+              <w:rPr>
+                <w:rFonts w:ascii="Arial" w:hAnsi="Arial" w:cs="Arial"/>
+                <w:color w:val="000000"/>
+                <w:lang w:val="vi-VN"/>
+              </w:rPr>
+              <w:t>Authentication</w:t>
+            </w:r>
+          </w:p>
+        </w:tc>
+        <w:tc>
+          <w:tcPr>
+            <w:tcW w:w="0" w:type="auto"/>
+            <w:tcBorders>
+              <w:top w:val="single" w:sz="4" w:space="0" w:color="1F1F1F"/>
+              <w:left w:val="single" w:sz="4" w:space="0" w:color="1F1F1F"/>
+              <w:bottom w:val="single" w:sz="4" w:space="0" w:color="1F1F1F"/>
+              <w:right w:val="single" w:sz="4" w:space="0" w:color="1F1F1F"/>
+            </w:tcBorders>
+            <w:tcMar>
+              <w:top w:w="240" w:type="dxa"/>
+              <w:left w:w="0" w:type="dxa"/>
+              <w:bottom w:w="240" w:type="dxa"/>
+              <w:right w:w="180" w:type="dxa"/>
+            </w:tcMar>
+            <w:hideMark/>
+          </w:tcPr>
+          <w:p>
+            <w:pPr>
+              <w:pStyle w:val="NormalWeb"/>
+              <w:spacing w:after="260"/>
+              <w:textAlignment w:val="baseline"/>
+              <w:rPr>
+                <w:rFonts w:ascii="Arial" w:hAnsi="Arial" w:cs="Arial"/>
+                <w:color w:val="000000"/>
+                <w:lang w:val="vi-VN"/>
+              </w:rPr>
+            </w:pPr>
+            <w:r>
+              <w:rPr>
+                <w:rFonts w:ascii="Arial" w:hAnsi="Arial" w:cs="Arial"/>
+                <w:color w:val="000000"/>
+                <w:lang w:val="vi-VN"/>
+              </w:rPr>
+              <w:t>1. Enter valid username and password.</w:t>
+            </w:r>
+          </w:p>
+          <w:p>
+            <w:pPr>
+              <w:pStyle w:val="NormalWeb"/>
+              <w:spacing w:after="260"/>
+              <w:textAlignment w:val="baseline"/>
+              <w:rPr>
+                <w:rFonts w:ascii="Arial" w:hAnsi="Arial" w:cs="Arial"/>
+                <w:color w:val="000000"/>
+                <w:lang w:val="vi-VN"/>
+              </w:rPr>
+            </w:pPr>
+            <w:r>
+              <w:rPr>
+                <w:rFonts w:ascii="Arial" w:hAnsi="Arial" w:cs="Arial"/>
+                <w:color w:val="000000"/>
+                <w:lang w:val="vi-VN"/>
+              </w:rPr>
+              <w:t>2. Click Login.</w:t>
+            </w:r>
+          </w:p>
+        </w:tc>
+        <w:tc>
+          <w:tcPr>
+            <w:tcW w:w="0" w:type="auto"/>
+            <w:tcBorders>
+              <w:top w:val="single" w:sz="4" w:space="0" w:color="1F1F1F"/>
+              <w:left w:val="single" w:sz="4" w:space="0" w:color="1F1F1F"/>
+              <w:bottom w:val="single" w:sz="4" w:space="0" w:color="1F1F1F"/>
+              <w:right w:val="single" w:sz="4" w:space="0" w:color="1F1F1F"/>
+            </w:tcBorders>
+            <w:tcMar>
+              <w:top w:w="240" w:type="dxa"/>
+              <w:left w:w="0" w:type="dxa"/>
+              <w:bottom w:w="240" w:type="dxa"/>
+              <w:right w:w="180" w:type="dxa"/>
+            </w:tcMar>
+            <w:hideMark/>
+          </w:tcPr>
+          <w:p>
+            <w:pPr>
+              <w:pStyle w:val="NormalWeb"/>
+              <w:spacing w:after="260"/>
+              <w:textAlignment w:val="baseline"/>
+              <w:rPr>
+                <w:rFonts w:ascii="Arial" w:hAnsi="Arial" w:cs="Arial"/>
+                <w:color w:val="000000"/>
+                <w:lang w:val="vi-VN"/>
+              </w:rPr>
+            </w:pPr>
+            <w:r>
+              <w:rPr>
+                <w:rFonts w:ascii="Arial" w:hAnsi="Arial" w:cs="Arial"/>
+                <w:color w:val="000000"/>
+                <w:lang w:val="vi-VN"/>
+              </w:rPr>
+              <w:t>System authenticates and redirects to Dashboard based on Role.</w:t>
+            </w:r>
+          </w:p>
+        </w:tc>
+        <w:tc>
+          <w:tcPr>
+            <w:tcW w:w="0" w:type="auto"/>
+            <w:tcBorders>
+              <w:top w:val="single" w:sz="4" w:space="0" w:color="1F1F1F"/>
+              <w:left w:val="single" w:sz="4" w:space="0" w:color="1F1F1F"/>
+              <w:bottom w:val="single" w:sz="4" w:space="0" w:color="1F1F1F"/>
+              <w:right w:val="single" w:sz="4" w:space="0" w:color="1F1F1F"/>
+            </w:tcBorders>
+            <w:tcMar>
+              <w:top w:w="240" w:type="dxa"/>
+              <w:left w:w="0" w:type="dxa"/>
+              <w:bottom w:w="240" w:type="dxa"/>
+              <w:right w:w="0" w:type="dxa"/>
+            </w:tcMar>
+            <w:hideMark/>
+          </w:tcPr>
+          <w:p>
+            <w:pPr>
+              <w:pStyle w:val="NormalWeb"/>
+              <w:spacing w:after="260"/>
+              <w:textAlignment w:val="baseline"/>
+              <w:rPr>
+                <w:rFonts w:ascii="Arial" w:hAnsi="Arial" w:cs="Arial"/>
+                <w:color w:val="000000"/>
+                <w:lang w:val="vi-VN"/>
+              </w:rPr>
+            </w:pPr>
+            <w:r>
+              <w:rPr>
+                <w:rFonts w:ascii="Arial" w:hAnsi="Arial" w:cs="Arial"/>
+                <w:color w:val="000000"/>
+                <w:lang w:val="vi-VN"/>
+              </w:rPr>
+              <w:t>Pass</w:t>
+            </w:r>
+          </w:p>
+        </w:tc>
+      </w:tr>
+      <w:tr>
+        <w:trPr>
+          <w:trHeight w:val="1965"/>
+        </w:trPr>
+        <w:tc>
+          <w:tcPr>
+            <w:tcW w:w="0" w:type="auto"/>
+            <w:tcBorders>
+              <w:top w:val="single" w:sz="4" w:space="0" w:color="1F1F1F"/>
+              <w:left w:val="single" w:sz="4" w:space="0" w:color="1F1F1F"/>
+              <w:bottom w:val="single" w:sz="4" w:space="0" w:color="1F1F1F"/>
+              <w:right w:val="single" w:sz="4" w:space="0" w:color="1F1F1F"/>
+            </w:tcBorders>
+            <w:tcMar>
+              <w:top w:w="240" w:type="dxa"/>
+              <w:left w:w="0" w:type="dxa"/>
+              <w:bottom w:w="240" w:type="dxa"/>
+              <w:right w:w="180" w:type="dxa"/>
+            </w:tcMar>
+            <w:hideMark/>
+          </w:tcPr>
+          <w:p>
+            <w:pPr>
+              <w:pStyle w:val="NormalWeb"/>
+              <w:spacing w:after="260"/>
+              <w:textAlignment w:val="baseline"/>
+              <w:rPr>
+                <w:rFonts w:ascii="Arial" w:hAnsi="Arial" w:cs="Arial"/>
+                <w:color w:val="000000"/>
+                <w:lang w:val="vi-VN"/>
+              </w:rPr>
+            </w:pPr>
+            <w:r>
+              <w:rPr>
+                <w:rFonts w:ascii="Arial" w:hAnsi="Arial" w:cs="Arial"/>
+                <w:b/>
+                <w:bCs/>
+                <w:color w:val="000000"/>
+                <w:lang w:val="vi-VN"/>
+              </w:rPr>
+              <w:t>TC-02</w:t>
+            </w:r>
+          </w:p>
+        </w:tc>
+        <w:tc>
+          <w:tcPr>
+            <w:tcW w:w="0" w:type="auto"/>
+            <w:tcBorders>
+              <w:top w:val="single" w:sz="4" w:space="0" w:color="1F1F1F"/>
+              <w:left w:val="single" w:sz="4" w:space="0" w:color="1F1F1F"/>
+              <w:bottom w:val="single" w:sz="4" w:space="0" w:color="1F1F1F"/>
+              <w:right w:val="single" w:sz="4" w:space="0" w:color="1F1F1F"/>
+            </w:tcBorders>
+            <w:tcMar>
+              <w:top w:w="240" w:type="dxa"/>
+              <w:left w:w="0" w:type="dxa"/>
+              <w:bottom w:w="240" w:type="dxa"/>
+              <w:right w:w="180" w:type="dxa"/>
+            </w:tcMar>
+            <w:hideMark/>
+          </w:tcPr>
+          <w:p>
+            <w:pPr>
+              <w:pStyle w:val="NormalWeb"/>
+              <w:spacing w:after="260"/>
+              <w:textAlignment w:val="baseline"/>
+              <w:rPr>
+                <w:rFonts w:ascii="Arial" w:hAnsi="Arial" w:cs="Arial"/>
+                <w:color w:val="000000"/>
+                <w:lang w:val="vi-VN"/>
+              </w:rPr>
+            </w:pPr>
+            <w:r>
+              <w:rPr>
+                <w:rFonts w:ascii="Arial" w:hAnsi="Arial" w:cs="Arial"/>
+                <w:color w:val="000000"/>
+                <w:lang w:val="vi-VN"/>
+              </w:rPr>
+              <w:t>Authentication</w:t>
+            </w:r>
+          </w:p>
+        </w:tc>
+        <w:tc>
+          <w:tcPr>
+            <w:tcW w:w="0" w:type="auto"/>
+            <w:tcBorders>
+              <w:top w:val="single" w:sz="4" w:space="0" w:color="1F1F1F"/>
+              <w:left w:val="single" w:sz="4" w:space="0" w:color="1F1F1F"/>
+              <w:bottom w:val="single" w:sz="4" w:space="0" w:color="1F1F1F"/>
+              <w:right w:val="single" w:sz="4" w:space="0" w:color="1F1F1F"/>
+            </w:tcBorders>
+            <w:tcMar>
+              <w:top w:w="240" w:type="dxa"/>
+              <w:left w:w="0" w:type="dxa"/>
+              <w:bottom w:w="240" w:type="dxa"/>
+              <w:right w:w="180" w:type="dxa"/>
+            </w:tcMar>
+            <w:hideMark/>
+          </w:tcPr>
+          <w:p>
+            <w:pPr>
+              <w:pStyle w:val="NormalWeb"/>
+              <w:spacing w:after="260"/>
+              <w:textAlignment w:val="baseline"/>
+              <w:rPr>
+                <w:rFonts w:ascii="Arial" w:hAnsi="Arial" w:cs="Arial"/>
+                <w:color w:val="000000"/>
+                <w:lang w:val="vi-VN"/>
+              </w:rPr>
+            </w:pPr>
+            <w:r>
+              <w:rPr>
+                <w:rFonts w:ascii="Arial" w:hAnsi="Arial" w:cs="Arial"/>
+                <w:color w:val="000000"/>
+                <w:lang w:val="vi-VN"/>
+              </w:rPr>
+              <w:t>1. Enter invalid credentials (wrong password).</w:t>
+            </w:r>
+          </w:p>
+          <w:p>
+            <w:pPr>
+              <w:pStyle w:val="NormalWeb"/>
+              <w:spacing w:after="260"/>
+              <w:textAlignment w:val="baseline"/>
+              <w:rPr>
+                <w:rFonts w:ascii="Arial" w:hAnsi="Arial" w:cs="Arial"/>
+                <w:color w:val="000000"/>
+                <w:lang w:val="vi-VN"/>
+              </w:rPr>
+            </w:pPr>
+            <w:r>
+              <w:rPr>
+                <w:rFonts w:ascii="Arial" w:hAnsi="Arial" w:cs="Arial"/>
+                <w:color w:val="000000"/>
+                <w:lang w:val="vi-VN"/>
+              </w:rPr>
+              <w:t>2. Click Login.</w:t>
+            </w:r>
+          </w:p>
+        </w:tc>
+        <w:tc>
+          <w:tcPr>
+            <w:tcW w:w="0" w:type="auto"/>
+            <w:tcBorders>
+              <w:top w:val="single" w:sz="4" w:space="0" w:color="1F1F1F"/>
+              <w:left w:val="single" w:sz="4" w:space="0" w:color="1F1F1F"/>
+              <w:bottom w:val="single" w:sz="4" w:space="0" w:color="1F1F1F"/>
+              <w:right w:val="single" w:sz="4" w:space="0" w:color="1F1F1F"/>
+            </w:tcBorders>
+            <w:tcMar>
+              <w:top w:w="240" w:type="dxa"/>
+              <w:left w:w="0" w:type="dxa"/>
+              <w:bottom w:w="240" w:type="dxa"/>
+              <w:right w:w="180" w:type="dxa"/>
+            </w:tcMar>
+            <w:hideMark/>
+          </w:tcPr>
+          <w:p>
+            <w:pPr>
+              <w:pStyle w:val="NormalWeb"/>
+              <w:spacing w:after="260"/>
+              <w:textAlignment w:val="baseline"/>
+              <w:rPr>
+                <w:rFonts w:ascii="Arial" w:hAnsi="Arial" w:cs="Arial"/>
+                <w:color w:val="000000"/>
+                <w:lang w:val="vi-VN"/>
+              </w:rPr>
+            </w:pPr>
+            <w:r>
+              <w:rPr>
+                <w:rFonts w:ascii="Arial" w:hAnsi="Arial" w:cs="Arial"/>
+                <w:color w:val="000000"/>
+                <w:lang w:val="vi-VN"/>
+              </w:rPr>
+              <w:t>System denies access and displays "Invalid credentials" error message.</w:t>
+            </w:r>
+          </w:p>
+        </w:tc>
+        <w:tc>
+          <w:tcPr>
+            <w:tcW w:w="0" w:type="auto"/>
+            <w:tcBorders>
+              <w:top w:val="single" w:sz="4" w:space="0" w:color="1F1F1F"/>
+              <w:left w:val="single" w:sz="4" w:space="0" w:color="1F1F1F"/>
+              <w:bottom w:val="single" w:sz="4" w:space="0" w:color="1F1F1F"/>
+              <w:right w:val="single" w:sz="4" w:space="0" w:color="1F1F1F"/>
+            </w:tcBorders>
+            <w:tcMar>
+              <w:top w:w="240" w:type="dxa"/>
+              <w:left w:w="0" w:type="dxa"/>
+              <w:bottom w:w="240" w:type="dxa"/>
+              <w:right w:w="0" w:type="dxa"/>
+            </w:tcMar>
+            <w:hideMark/>
+          </w:tcPr>
+          <w:p>
+            <w:pPr>
+              <w:pStyle w:val="NormalWeb"/>
+              <w:spacing w:after="260"/>
+              <w:textAlignment w:val="baseline"/>
+              <w:rPr>
+                <w:rFonts w:ascii="Arial" w:hAnsi="Arial" w:cs="Arial"/>
+                <w:color w:val="000000"/>
+                <w:lang w:val="vi-VN"/>
+              </w:rPr>
+            </w:pPr>
+            <w:r>
+              <w:rPr>
+                <w:rFonts w:ascii="Arial" w:hAnsi="Arial" w:cs="Arial"/>
+                <w:color w:val="000000"/>
+                <w:lang w:val="vi-VN"/>
+              </w:rPr>
+              <w:t>Pass</w:t>
+            </w:r>
+          </w:p>
+        </w:tc>
+      </w:tr>
+      <w:tr>
+        <w:trPr>
+          <w:trHeight w:val="2265"/>
+        </w:trPr>
+        <w:tc>
+          <w:tcPr>
+            <w:tcW w:w="0" w:type="auto"/>
+            <w:tcBorders>
+              <w:top w:val="single" w:sz="4" w:space="0" w:color="1F1F1F"/>
+              <w:left w:val="single" w:sz="4" w:space="0" w:color="1F1F1F"/>
+              <w:bottom w:val="single" w:sz="4" w:space="0" w:color="1F1F1F"/>
+              <w:right w:val="single" w:sz="4" w:space="0" w:color="1F1F1F"/>
+            </w:tcBorders>
+            <w:tcMar>
+              <w:top w:w="240" w:type="dxa"/>
+              <w:left w:w="0" w:type="dxa"/>
+              <w:bottom w:w="240" w:type="dxa"/>
+              <w:right w:w="180" w:type="dxa"/>
+            </w:tcMar>
+            <w:hideMark/>
+          </w:tcPr>
+          <w:p>
+            <w:pPr>
+              <w:pStyle w:val="NormalWeb"/>
+              <w:spacing w:after="260"/>
+              <w:textAlignment w:val="baseline"/>
+              <w:rPr>
+                <w:rFonts w:ascii="Arial" w:hAnsi="Arial" w:cs="Arial"/>
+                <w:color w:val="000000"/>
+                <w:lang w:val="vi-VN"/>
+              </w:rPr>
+            </w:pPr>
+            <w:r>
+              <w:rPr>
+                <w:rFonts w:ascii="Arial" w:hAnsi="Arial" w:cs="Arial"/>
+                <w:b/>
+                <w:bCs/>
+                <w:color w:val="000000"/>
+                <w:lang w:val="vi-VN"/>
+              </w:rPr>
+              <w:lastRenderedPageBreak/>
+              <w:t>TC-03</w:t>
+            </w:r>
+          </w:p>
+        </w:tc>
+        <w:tc>
+          <w:tcPr>
+            <w:tcW w:w="0" w:type="auto"/>
+            <w:tcBorders>
+              <w:top w:val="single" w:sz="4" w:space="0" w:color="1F1F1F"/>
+              <w:left w:val="single" w:sz="4" w:space="0" w:color="1F1F1F"/>
+              <w:bottom w:val="single" w:sz="4" w:space="0" w:color="1F1F1F"/>
+              <w:right w:val="single" w:sz="4" w:space="0" w:color="1F1F1F"/>
+            </w:tcBorders>
+            <w:tcMar>
+              <w:top w:w="240" w:type="dxa"/>
+              <w:left w:w="0" w:type="dxa"/>
+              <w:bottom w:w="240" w:type="dxa"/>
+              <w:right w:w="180" w:type="dxa"/>
+            </w:tcMar>
+            <w:hideMark/>
+          </w:tcPr>
+          <w:p>
+            <w:pPr>
+              <w:pStyle w:val="NormalWeb"/>
+              <w:spacing w:after="260"/>
+              <w:textAlignment w:val="baseline"/>
+              <w:rPr>
+                <w:rFonts w:ascii="Arial" w:hAnsi="Arial" w:cs="Arial"/>
+                <w:color w:val="000000"/>
+                <w:lang w:val="vi-VN"/>
+              </w:rPr>
+            </w:pPr>
+            <w:r>
+              <w:rPr>
+                <w:rFonts w:ascii="Arial" w:hAnsi="Arial" w:cs="Arial"/>
+                <w:color w:val="000000"/>
+                <w:lang w:val="vi-VN"/>
+              </w:rPr>
+              <w:t>Sales Processing</w:t>
+            </w:r>
+          </w:p>
+        </w:tc>
+        <w:tc>
+          <w:tcPr>
+            <w:tcW w:w="0" w:type="auto"/>
+            <w:tcBorders>
+              <w:top w:val="single" w:sz="4" w:space="0" w:color="1F1F1F"/>
+              <w:left w:val="single" w:sz="4" w:space="0" w:color="1F1F1F"/>
+              <w:bottom w:val="single" w:sz="4" w:space="0" w:color="1F1F1F"/>
+              <w:right w:val="single" w:sz="4" w:space="0" w:color="1F1F1F"/>
+            </w:tcBorders>
+            <w:tcMar>
+              <w:top w:w="240" w:type="dxa"/>
+              <w:left w:w="0" w:type="dxa"/>
+              <w:bottom w:w="240" w:type="dxa"/>
+              <w:right w:w="180" w:type="dxa"/>
+            </w:tcMar>
+            <w:hideMark/>
+          </w:tcPr>
+          <w:p>
+            <w:pPr>
+              <w:pStyle w:val="NormalWeb"/>
+              <w:spacing w:after="260"/>
+              <w:textAlignment w:val="baseline"/>
+              <w:rPr>
+                <w:rFonts w:ascii="Arial" w:hAnsi="Arial" w:cs="Arial"/>
+                <w:color w:val="000000"/>
+                <w:lang w:val="vi-VN"/>
+              </w:rPr>
+            </w:pPr>
+            <w:r>
+              <w:rPr>
+                <w:rFonts w:ascii="Arial" w:hAnsi="Arial" w:cs="Arial"/>
+                <w:color w:val="000000"/>
+                <w:lang w:val="vi-VN"/>
+              </w:rPr>
+              <w:t>1. Add valid Product ID and Quantity.</w:t>
+            </w:r>
+          </w:p>
+          <w:p>
+            <w:pPr>
+              <w:pStyle w:val="NormalWeb"/>
+              <w:spacing w:after="260"/>
+              <w:textAlignment w:val="baseline"/>
+              <w:rPr>
+                <w:rFonts w:ascii="Arial" w:hAnsi="Arial" w:cs="Arial"/>
+                <w:color w:val="000000"/>
+                <w:lang w:val="vi-VN"/>
+              </w:rPr>
+            </w:pPr>
+          </w:p>
+          <w:p>
+            <w:pPr>
+              <w:pStyle w:val="NormalWeb"/>
+              <w:spacing w:after="260"/>
+              <w:textAlignment w:val="baseline"/>
+              <w:rPr>
+                <w:rFonts w:ascii="Arial" w:hAnsi="Arial" w:cs="Arial"/>
+                <w:color w:val="000000"/>
+                <w:lang w:val="vi-VN"/>
+              </w:rPr>
+            </w:pPr>
+            <w:r>
+              <w:rPr>
+                <w:rFonts w:ascii="Arial" w:hAnsi="Arial" w:cs="Arial"/>
+                <w:color w:val="000000"/>
+                <w:lang w:val="vi-VN"/>
+              </w:rPr>
+              <w:t>2. Proceed to checkout.</w:t>
+            </w:r>
+          </w:p>
+        </w:tc>
+        <w:tc>
+          <w:tcPr>
+            <w:tcW w:w="0" w:type="auto"/>
+            <w:tcBorders>
+              <w:top w:val="single" w:sz="4" w:space="0" w:color="1F1F1F"/>
+              <w:left w:val="single" w:sz="4" w:space="0" w:color="1F1F1F"/>
+              <w:bottom w:val="single" w:sz="4" w:space="0" w:color="1F1F1F"/>
+              <w:right w:val="single" w:sz="4" w:space="0" w:color="1F1F1F"/>
+            </w:tcBorders>
+            <w:tcMar>
+              <w:top w:w="240" w:type="dxa"/>
+              <w:left w:w="0" w:type="dxa"/>
+              <w:bottom w:w="240" w:type="dxa"/>
+              <w:right w:w="180" w:type="dxa"/>
+            </w:tcMar>
+            <w:hideMark/>
+          </w:tcPr>
+          <w:p>
+            <w:pPr>
+              <w:pStyle w:val="NormalWeb"/>
+              <w:spacing w:after="260"/>
+              <w:textAlignment w:val="baseline"/>
+              <w:rPr>
+                <w:rFonts w:ascii="Arial" w:hAnsi="Arial" w:cs="Arial"/>
+                <w:color w:val="000000"/>
+                <w:lang w:val="vi-VN"/>
+              </w:rPr>
+            </w:pPr>
+            <w:r>
+              <w:rPr>
+                <w:rFonts w:ascii="Arial" w:hAnsi="Arial" w:cs="Arial"/>
+                <w:color w:val="000000"/>
+                <w:lang w:val="vi-VN"/>
+              </w:rPr>
+              <w:t>Invoice is generated successfully; Total amount is calculated correctly.</w:t>
+            </w:r>
+          </w:p>
+        </w:tc>
+        <w:tc>
+          <w:tcPr>
+            <w:tcW w:w="0" w:type="auto"/>
+            <w:tcBorders>
+              <w:top w:val="single" w:sz="4" w:space="0" w:color="1F1F1F"/>
+              <w:left w:val="single" w:sz="4" w:space="0" w:color="1F1F1F"/>
+              <w:bottom w:val="single" w:sz="4" w:space="0" w:color="1F1F1F"/>
+              <w:right w:val="single" w:sz="4" w:space="0" w:color="1F1F1F"/>
+            </w:tcBorders>
+            <w:tcMar>
+              <w:top w:w="240" w:type="dxa"/>
+              <w:left w:w="0" w:type="dxa"/>
+              <w:bottom w:w="240" w:type="dxa"/>
+              <w:right w:w="0" w:type="dxa"/>
+            </w:tcMar>
+            <w:hideMark/>
+          </w:tcPr>
+          <w:p>
+            <w:pPr>
+              <w:pStyle w:val="NormalWeb"/>
+              <w:spacing w:after="260"/>
+              <w:textAlignment w:val="baseline"/>
+              <w:rPr>
+                <w:rFonts w:ascii="Arial" w:hAnsi="Arial" w:cs="Arial"/>
+                <w:color w:val="000000"/>
+                <w:lang w:val="vi-VN"/>
+              </w:rPr>
+            </w:pPr>
+            <w:r>
+              <w:rPr>
+                <w:rFonts w:ascii="Arial" w:hAnsi="Arial" w:cs="Arial"/>
+                <w:color w:val="000000"/>
+                <w:lang w:val="vi-VN"/>
+              </w:rPr>
+              <w:t>Pass</w:t>
+            </w:r>
+          </w:p>
+        </w:tc>
+      </w:tr>
+      <w:tr>
+        <w:trPr>
+          <w:trHeight w:val="2265"/>
+        </w:trPr>
+        <w:tc>
+          <w:tcPr>
+            <w:tcW w:w="0" w:type="auto"/>
+            <w:tcBorders>
+              <w:top w:val="single" w:sz="4" w:space="0" w:color="1F1F1F"/>
+              <w:left w:val="single" w:sz="4" w:space="0" w:color="1F1F1F"/>
+              <w:bottom w:val="single" w:sz="4" w:space="0" w:color="1F1F1F"/>
+              <w:right w:val="single" w:sz="4" w:space="0" w:color="1F1F1F"/>
+            </w:tcBorders>
+            <w:tcMar>
+              <w:top w:w="240" w:type="dxa"/>
+              <w:left w:w="0" w:type="dxa"/>
+              <w:bottom w:w="240" w:type="dxa"/>
+              <w:right w:w="180" w:type="dxa"/>
+            </w:tcMar>
+            <w:hideMark/>
+          </w:tcPr>
+          <w:p>
+            <w:pPr>
+              <w:pStyle w:val="NormalWeb"/>
+              <w:spacing w:after="260"/>
+              <w:textAlignment w:val="baseline"/>
+              <w:rPr>
+                <w:rFonts w:ascii="Arial" w:hAnsi="Arial" w:cs="Arial"/>
+                <w:color w:val="000000"/>
+                <w:lang w:val="vi-VN"/>
+              </w:rPr>
+            </w:pPr>
+            <w:r>
+              <w:rPr>
+                <w:rFonts w:ascii="Arial" w:hAnsi="Arial" w:cs="Arial"/>
+                <w:b/>
+                <w:bCs/>
+                <w:color w:val="000000"/>
+                <w:lang w:val="vi-VN"/>
+              </w:rPr>
+              <w:t>TC-04</w:t>
+            </w:r>
+          </w:p>
+        </w:tc>
+        <w:tc>
+          <w:tcPr>
+            <w:tcW w:w="0" w:type="auto"/>
+            <w:tcBorders>
+              <w:top w:val="single" w:sz="4" w:space="0" w:color="1F1F1F"/>
+              <w:left w:val="single" w:sz="4" w:space="0" w:color="1F1F1F"/>
+              <w:bottom w:val="single" w:sz="4" w:space="0" w:color="1F1F1F"/>
+              <w:right w:val="single" w:sz="4" w:space="0" w:color="1F1F1F"/>
+            </w:tcBorders>
+            <w:tcMar>
+              <w:top w:w="240" w:type="dxa"/>
+              <w:left w:w="0" w:type="dxa"/>
+              <w:bottom w:w="240" w:type="dxa"/>
+              <w:right w:w="180" w:type="dxa"/>
+            </w:tcMar>
+            <w:hideMark/>
+          </w:tcPr>
+          <w:p>
+            <w:pPr>
+              <w:pStyle w:val="NormalWeb"/>
+              <w:spacing w:after="260"/>
+              <w:textAlignment w:val="baseline"/>
+              <w:rPr>
+                <w:rFonts w:ascii="Arial" w:hAnsi="Arial" w:cs="Arial"/>
+                <w:color w:val="000000"/>
+                <w:lang w:val="vi-VN"/>
+              </w:rPr>
+            </w:pPr>
+            <w:r>
+              <w:rPr>
+                <w:rFonts w:ascii="Arial" w:hAnsi="Arial" w:cs="Arial"/>
+                <w:color w:val="000000"/>
+                <w:lang w:val="vi-VN"/>
+              </w:rPr>
+              <w:t>Inventory Sync</w:t>
+            </w:r>
+          </w:p>
+        </w:tc>
+        <w:tc>
+          <w:tcPr>
+            <w:tcW w:w="0" w:type="auto"/>
+            <w:tcBorders>
+              <w:top w:val="single" w:sz="4" w:space="0" w:color="1F1F1F"/>
+              <w:left w:val="single" w:sz="4" w:space="0" w:color="1F1F1F"/>
+              <w:bottom w:val="single" w:sz="4" w:space="0" w:color="1F1F1F"/>
+              <w:right w:val="single" w:sz="4" w:space="0" w:color="1F1F1F"/>
+            </w:tcBorders>
+            <w:tcMar>
+              <w:top w:w="240" w:type="dxa"/>
+              <w:left w:w="0" w:type="dxa"/>
+              <w:bottom w:w="240" w:type="dxa"/>
+              <w:right w:w="180" w:type="dxa"/>
+            </w:tcMar>
+            <w:hideMark/>
+          </w:tcPr>
+          <w:p>
+            <w:pPr>
+              <w:pStyle w:val="NormalWeb"/>
+              <w:spacing w:after="260"/>
+              <w:textAlignment w:val="baseline"/>
+              <w:rPr>
+                <w:rFonts w:ascii="Arial" w:hAnsi="Arial" w:cs="Arial"/>
+                <w:color w:val="000000"/>
+                <w:lang w:val="vi-VN"/>
+              </w:rPr>
+            </w:pPr>
+            <w:r>
+              <w:rPr>
+                <w:rFonts w:ascii="Arial" w:hAnsi="Arial" w:cs="Arial"/>
+                <w:color w:val="000000"/>
+                <w:lang w:val="vi-VN"/>
+              </w:rPr>
+              <w:t>1. Add Product with Quantity &gt; Current Stock.</w:t>
+            </w:r>
+          </w:p>
+          <w:p>
+            <w:pPr>
+              <w:pStyle w:val="NormalWeb"/>
+              <w:spacing w:after="260"/>
+              <w:textAlignment w:val="baseline"/>
+              <w:rPr>
+                <w:rFonts w:ascii="Arial" w:hAnsi="Arial" w:cs="Arial"/>
+                <w:color w:val="000000"/>
+                <w:lang w:val="vi-VN"/>
+              </w:rPr>
+            </w:pPr>
+            <w:r>
+              <w:rPr>
+                <w:rFonts w:ascii="Arial" w:hAnsi="Arial" w:cs="Arial"/>
+                <w:color w:val="000000"/>
+                <w:lang w:val="vi-VN"/>
+              </w:rPr>
+              <w:t>2. Click Add to Cart.</w:t>
+            </w:r>
+          </w:p>
+        </w:tc>
+        <w:tc>
+          <w:tcPr>
+            <w:tcW w:w="0" w:type="auto"/>
+            <w:tcBorders>
+              <w:top w:val="single" w:sz="4" w:space="0" w:color="1F1F1F"/>
+              <w:left w:val="single" w:sz="4" w:space="0" w:color="1F1F1F"/>
+              <w:bottom w:val="single" w:sz="4" w:space="0" w:color="1F1F1F"/>
+              <w:right w:val="single" w:sz="4" w:space="0" w:color="1F1F1F"/>
+            </w:tcBorders>
+            <w:tcMar>
+              <w:top w:w="240" w:type="dxa"/>
+              <w:left w:w="0" w:type="dxa"/>
+              <w:bottom w:w="240" w:type="dxa"/>
+              <w:right w:w="180" w:type="dxa"/>
+            </w:tcMar>
+            <w:hideMark/>
+          </w:tcPr>
+          <w:p>
+            <w:pPr>
+              <w:pStyle w:val="NormalWeb"/>
+              <w:spacing w:after="260"/>
+              <w:textAlignment w:val="baseline"/>
+              <w:rPr>
+                <w:rFonts w:ascii="Arial" w:hAnsi="Arial" w:cs="Arial"/>
+                <w:color w:val="000000"/>
+                <w:lang w:val="vi-VN"/>
+              </w:rPr>
+            </w:pPr>
+            <w:r>
+              <w:rPr>
+                <w:rFonts w:ascii="Arial" w:hAnsi="Arial" w:cs="Arial"/>
+                <w:color w:val="000000"/>
+                <w:lang w:val="vi-VN"/>
+              </w:rPr>
+              <w:t>System prevents action and shows "Insufficient Stock" warning.</w:t>
+            </w:r>
+          </w:p>
+        </w:tc>
+        <w:tc>
+          <w:tcPr>
+            <w:tcW w:w="0" w:type="auto"/>
+            <w:tcBorders>
+              <w:top w:val="single" w:sz="4" w:space="0" w:color="1F1F1F"/>
+              <w:left w:val="single" w:sz="4" w:space="0" w:color="1F1F1F"/>
+              <w:bottom w:val="single" w:sz="4" w:space="0" w:color="1F1F1F"/>
+              <w:right w:val="single" w:sz="4" w:space="0" w:color="1F1F1F"/>
+            </w:tcBorders>
+            <w:tcMar>
+              <w:top w:w="240" w:type="dxa"/>
+              <w:left w:w="0" w:type="dxa"/>
+              <w:bottom w:w="240" w:type="dxa"/>
+              <w:right w:w="0" w:type="dxa"/>
+            </w:tcMar>
+            <w:hideMark/>
+          </w:tcPr>
+          <w:p>
+            <w:pPr>
+              <w:pStyle w:val="NormalWeb"/>
+              <w:spacing w:after="260"/>
+              <w:textAlignment w:val="baseline"/>
+              <w:rPr>
+                <w:rFonts w:ascii="Arial" w:hAnsi="Arial" w:cs="Arial"/>
+                <w:color w:val="000000"/>
+                <w:lang w:val="vi-VN"/>
+              </w:rPr>
+            </w:pPr>
+            <w:r>
+              <w:rPr>
+                <w:rFonts w:ascii="Arial" w:hAnsi="Arial" w:cs="Arial"/>
+                <w:color w:val="000000"/>
+                <w:lang w:val="vi-VN"/>
+              </w:rPr>
+              <w:t>Pass</w:t>
+            </w:r>
+          </w:p>
+        </w:tc>
+      </w:tr>
+      <w:tr>
+        <w:trPr>
+          <w:trHeight w:val="1680"/>
+        </w:trPr>
+        <w:tc>
+          <w:tcPr>
+            <w:tcW w:w="0" w:type="auto"/>
+            <w:tcBorders>
+              <w:top w:val="single" w:sz="4" w:space="0" w:color="1F1F1F"/>
+              <w:left w:val="single" w:sz="4" w:space="0" w:color="1F1F1F"/>
+              <w:bottom w:val="single" w:sz="4" w:space="0" w:color="1F1F1F"/>
+              <w:right w:val="single" w:sz="4" w:space="0" w:color="1F1F1F"/>
+            </w:tcBorders>
+            <w:tcMar>
+              <w:top w:w="240" w:type="dxa"/>
+              <w:left w:w="0" w:type="dxa"/>
+              <w:bottom w:w="240" w:type="dxa"/>
+              <w:right w:w="180" w:type="dxa"/>
+            </w:tcMar>
+            <w:hideMark/>
+          </w:tcPr>
+          <w:p>
+            <w:pPr>
+              <w:pStyle w:val="NormalWeb"/>
+              <w:spacing w:after="260"/>
+              <w:textAlignment w:val="baseline"/>
+              <w:rPr>
+                <w:rFonts w:ascii="Arial" w:hAnsi="Arial" w:cs="Arial"/>
+                <w:color w:val="000000"/>
+                <w:lang w:val="vi-VN"/>
+              </w:rPr>
+            </w:pPr>
+            <w:r>
+              <w:rPr>
+                <w:rFonts w:ascii="Arial" w:hAnsi="Arial" w:cs="Arial"/>
+                <w:b/>
+                <w:bCs/>
+                <w:color w:val="000000"/>
+                <w:lang w:val="vi-VN"/>
+              </w:rPr>
+              <w:t>TC-05</w:t>
+            </w:r>
+          </w:p>
+        </w:tc>
+        <w:tc>
+          <w:tcPr>
+            <w:tcW w:w="0" w:type="auto"/>
+            <w:tcBorders>
+              <w:top w:val="single" w:sz="4" w:space="0" w:color="1F1F1F"/>
+              <w:left w:val="single" w:sz="4" w:space="0" w:color="1F1F1F"/>
+              <w:bottom w:val="single" w:sz="4" w:space="0" w:color="1F1F1F"/>
+              <w:right w:val="single" w:sz="4" w:space="0" w:color="1F1F1F"/>
+            </w:tcBorders>
+            <w:tcMar>
+              <w:top w:w="240" w:type="dxa"/>
+              <w:left w:w="0" w:type="dxa"/>
+              <w:bottom w:w="240" w:type="dxa"/>
+              <w:right w:w="180" w:type="dxa"/>
+            </w:tcMar>
+            <w:hideMark/>
+          </w:tcPr>
+          <w:p>
+            <w:pPr>
+              <w:pStyle w:val="NormalWeb"/>
+              <w:spacing w:after="260"/>
+              <w:textAlignment w:val="baseline"/>
+              <w:rPr>
+                <w:rFonts w:ascii="Arial" w:hAnsi="Arial" w:cs="Arial"/>
+                <w:color w:val="000000"/>
+                <w:lang w:val="vi-VN"/>
+              </w:rPr>
+            </w:pPr>
+            <w:r>
+              <w:rPr>
+                <w:rFonts w:ascii="Arial" w:hAnsi="Arial" w:cs="Arial"/>
+                <w:color w:val="000000"/>
+                <w:lang w:val="vi-VN"/>
+              </w:rPr>
+              <w:t>Database Sync</w:t>
+            </w:r>
+          </w:p>
+        </w:tc>
+        <w:tc>
+          <w:tcPr>
+            <w:tcW w:w="0" w:type="auto"/>
+            <w:tcBorders>
+              <w:top w:val="single" w:sz="4" w:space="0" w:color="1F1F1F"/>
+              <w:left w:val="single" w:sz="4" w:space="0" w:color="1F1F1F"/>
+              <w:bottom w:val="single" w:sz="4" w:space="0" w:color="1F1F1F"/>
+              <w:right w:val="single" w:sz="4" w:space="0" w:color="1F1F1F"/>
+            </w:tcBorders>
+            <w:tcMar>
+              <w:top w:w="240" w:type="dxa"/>
+              <w:left w:w="0" w:type="dxa"/>
+              <w:bottom w:w="240" w:type="dxa"/>
+              <w:right w:w="180" w:type="dxa"/>
+            </w:tcMar>
+            <w:hideMark/>
+          </w:tcPr>
+          <w:p>
+            <w:pPr>
+              <w:pStyle w:val="NormalWeb"/>
+              <w:spacing w:after="260"/>
+              <w:textAlignment w:val="baseline"/>
+              <w:rPr>
+                <w:rFonts w:ascii="Arial" w:hAnsi="Arial" w:cs="Arial"/>
+                <w:color w:val="000000"/>
+                <w:lang w:val="vi-VN"/>
+              </w:rPr>
+            </w:pPr>
+            <w:r>
+              <w:rPr>
+                <w:rFonts w:ascii="Arial" w:hAnsi="Arial" w:cs="Arial"/>
+                <w:color w:val="000000"/>
+                <w:lang w:val="vi-VN"/>
+              </w:rPr>
+              <w:t>1. Complete a successful checkout transaction.</w:t>
+            </w:r>
+          </w:p>
+        </w:tc>
+        <w:tc>
+          <w:tcPr>
+            <w:tcW w:w="0" w:type="auto"/>
+            <w:tcBorders>
+              <w:top w:val="single" w:sz="4" w:space="0" w:color="1F1F1F"/>
+              <w:left w:val="single" w:sz="4" w:space="0" w:color="1F1F1F"/>
+              <w:bottom w:val="single" w:sz="4" w:space="0" w:color="1F1F1F"/>
+              <w:right w:val="single" w:sz="4" w:space="0" w:color="1F1F1F"/>
+            </w:tcBorders>
+            <w:tcMar>
+              <w:top w:w="240" w:type="dxa"/>
+              <w:left w:w="0" w:type="dxa"/>
+              <w:bottom w:w="240" w:type="dxa"/>
+              <w:right w:w="180" w:type="dxa"/>
+            </w:tcMar>
+            <w:hideMark/>
+          </w:tcPr>
+          <w:p>
+            <w:pPr>
+              <w:pStyle w:val="NormalWeb"/>
+              <w:spacing w:after="260"/>
+              <w:textAlignment w:val="baseline"/>
+              <w:rPr>
+                <w:rFonts w:ascii="Arial" w:hAnsi="Arial" w:cs="Arial"/>
+                <w:color w:val="000000"/>
+                <w:lang w:val="vi-VN"/>
+              </w:rPr>
+            </w:pPr>
+            <w:r>
+              <w:rPr>
+                <w:rFonts w:ascii="Arial" w:hAnsi="Arial" w:cs="Arial"/>
+                <w:color w:val="000000"/>
+                <w:lang w:val="vi-VN"/>
+              </w:rPr>
+              <w:t>Stock quantity in the Database decreases exactly by the sold amount.</w:t>
+            </w:r>
+          </w:p>
+        </w:tc>
+        <w:tc>
+          <w:tcPr>
+            <w:tcW w:w="0" w:type="auto"/>
+            <w:tcBorders>
+              <w:top w:val="single" w:sz="4" w:space="0" w:color="1F1F1F"/>
+              <w:left w:val="single" w:sz="4" w:space="0" w:color="1F1F1F"/>
+              <w:bottom w:val="single" w:sz="4" w:space="0" w:color="1F1F1F"/>
+              <w:right w:val="single" w:sz="4" w:space="0" w:color="1F1F1F"/>
+            </w:tcBorders>
+            <w:tcMar>
+              <w:top w:w="240" w:type="dxa"/>
+              <w:left w:w="0" w:type="dxa"/>
+              <w:bottom w:w="240" w:type="dxa"/>
+              <w:right w:w="0" w:type="dxa"/>
+            </w:tcMar>
+            <w:hideMark/>
+          </w:tcPr>
+          <w:p>
+            <w:pPr>
+              <w:pStyle w:val="NormalWeb"/>
+              <w:spacing w:after="260"/>
+              <w:textAlignment w:val="baseline"/>
+              <w:rPr>
+                <w:rFonts w:ascii="Arial" w:hAnsi="Arial" w:cs="Arial"/>
+                <w:color w:val="000000"/>
+                <w:lang w:val="vi-VN"/>
+              </w:rPr>
+            </w:pPr>
+            <w:r>
+              <w:rPr>
+                <w:rFonts w:ascii="Arial" w:hAnsi="Arial" w:cs="Arial"/>
+                <w:color w:val="000000"/>
+                <w:lang w:val="vi-VN"/>
+              </w:rPr>
+              <w:t>Pass</w:t>
+            </w:r>
+          </w:p>
+        </w:tc>
+      </w:tr>
+      <w:tr>
+        <w:trPr>
+          <w:trHeight w:val="1965"/>
+        </w:trPr>
+        <w:tc>
+          <w:tcPr>
+            <w:tcW w:w="0" w:type="auto"/>
+            <w:tcBorders>
+              <w:top w:val="single" w:sz="4" w:space="0" w:color="1F1F1F"/>
+              <w:left w:val="single" w:sz="4" w:space="0" w:color="1F1F1F"/>
+              <w:bottom w:val="single" w:sz="4" w:space="0" w:color="1F1F1F"/>
+              <w:right w:val="single" w:sz="4" w:space="0" w:color="1F1F1F"/>
+            </w:tcBorders>
+            <w:tcMar>
+              <w:top w:w="240" w:type="dxa"/>
+              <w:left w:w="0" w:type="dxa"/>
+              <w:bottom w:w="240" w:type="dxa"/>
+              <w:right w:w="180" w:type="dxa"/>
+            </w:tcMar>
+            <w:hideMark/>
+          </w:tcPr>
+          <w:p>
+            <w:pPr>
+              <w:pStyle w:val="NormalWeb"/>
+              <w:spacing w:after="260"/>
+              <w:textAlignment w:val="baseline"/>
+              <w:rPr>
+                <w:rFonts w:ascii="Arial" w:hAnsi="Arial" w:cs="Arial"/>
+                <w:color w:val="000000"/>
+                <w:lang w:val="vi-VN"/>
+              </w:rPr>
+            </w:pPr>
+            <w:r>
+              <w:rPr>
+                <w:rFonts w:ascii="Arial" w:hAnsi="Arial" w:cs="Arial"/>
+                <w:b/>
+                <w:bCs/>
+                <w:color w:val="000000"/>
+                <w:lang w:val="vi-VN"/>
+              </w:rPr>
+              <w:t>TC-06</w:t>
+            </w:r>
+          </w:p>
+        </w:tc>
+        <w:tc>
+          <w:tcPr>
+            <w:tcW w:w="0" w:type="auto"/>
+            <w:tcBorders>
+              <w:top w:val="single" w:sz="4" w:space="0" w:color="1F1F1F"/>
+              <w:left w:val="single" w:sz="4" w:space="0" w:color="1F1F1F"/>
+              <w:bottom w:val="single" w:sz="4" w:space="0" w:color="1F1F1F"/>
+              <w:right w:val="single" w:sz="4" w:space="0" w:color="1F1F1F"/>
+            </w:tcBorders>
+            <w:tcMar>
+              <w:top w:w="240" w:type="dxa"/>
+              <w:left w:w="0" w:type="dxa"/>
+              <w:bottom w:w="240" w:type="dxa"/>
+              <w:right w:w="180" w:type="dxa"/>
+            </w:tcMar>
+            <w:hideMark/>
+          </w:tcPr>
+          <w:p>
+            <w:pPr>
+              <w:pStyle w:val="NormalWeb"/>
+              <w:spacing w:after="260"/>
+              <w:textAlignment w:val="baseline"/>
+              <w:rPr>
+                <w:rFonts w:ascii="Arial" w:hAnsi="Arial" w:cs="Arial"/>
+                <w:color w:val="000000"/>
+                <w:lang w:val="vi-VN"/>
+              </w:rPr>
+            </w:pPr>
+            <w:r>
+              <w:rPr>
+                <w:rFonts w:ascii="Arial" w:hAnsi="Arial" w:cs="Arial"/>
+                <w:color w:val="000000"/>
+                <w:lang w:val="vi-VN"/>
+              </w:rPr>
+              <w:t>Customer Mgmt</w:t>
+            </w:r>
+          </w:p>
+        </w:tc>
+        <w:tc>
+          <w:tcPr>
+            <w:tcW w:w="0" w:type="auto"/>
+            <w:tcBorders>
+              <w:top w:val="single" w:sz="4" w:space="0" w:color="1F1F1F"/>
+              <w:left w:val="single" w:sz="4" w:space="0" w:color="1F1F1F"/>
+              <w:bottom w:val="single" w:sz="4" w:space="0" w:color="1F1F1F"/>
+              <w:right w:val="single" w:sz="4" w:space="0" w:color="1F1F1F"/>
+            </w:tcBorders>
+            <w:tcMar>
+              <w:top w:w="240" w:type="dxa"/>
+              <w:left w:w="0" w:type="dxa"/>
+              <w:bottom w:w="240" w:type="dxa"/>
+              <w:right w:w="180" w:type="dxa"/>
+            </w:tcMar>
+            <w:hideMark/>
+          </w:tcPr>
+          <w:p>
+            <w:pPr>
+              <w:pStyle w:val="NormalWeb"/>
+              <w:spacing w:after="260"/>
+              <w:textAlignment w:val="baseline"/>
+              <w:rPr>
+                <w:rFonts w:ascii="Arial" w:hAnsi="Arial" w:cs="Arial"/>
+                <w:color w:val="000000"/>
+                <w:lang w:val="vi-VN"/>
+              </w:rPr>
+            </w:pPr>
+            <w:r>
+              <w:rPr>
+                <w:rFonts w:ascii="Arial" w:hAnsi="Arial" w:cs="Arial"/>
+                <w:color w:val="000000"/>
+                <w:lang w:val="vi-VN"/>
+              </w:rPr>
+              <w:t>1. Enter details for a new customer (Name, Phone).</w:t>
+            </w:r>
+          </w:p>
+          <w:p>
+            <w:pPr>
+              <w:pStyle w:val="NormalWeb"/>
+              <w:spacing w:after="260"/>
+              <w:textAlignment w:val="baseline"/>
+              <w:rPr>
+                <w:rFonts w:ascii="Arial" w:hAnsi="Arial" w:cs="Arial"/>
+                <w:color w:val="000000"/>
+                <w:lang w:val="vi-VN"/>
+              </w:rPr>
+            </w:pPr>
+            <w:r>
+              <w:rPr>
+                <w:rFonts w:ascii="Arial" w:hAnsi="Arial" w:cs="Arial"/>
+                <w:color w:val="000000"/>
+                <w:lang w:val="vi-VN"/>
+              </w:rPr>
+              <w:t>2. Click Save.</w:t>
+            </w:r>
+          </w:p>
+        </w:tc>
+        <w:tc>
+          <w:tcPr>
+            <w:tcW w:w="0" w:type="auto"/>
+            <w:tcBorders>
+              <w:top w:val="single" w:sz="4" w:space="0" w:color="1F1F1F"/>
+              <w:left w:val="single" w:sz="4" w:space="0" w:color="1F1F1F"/>
+              <w:bottom w:val="single" w:sz="4" w:space="0" w:color="1F1F1F"/>
+              <w:right w:val="single" w:sz="4" w:space="0" w:color="1F1F1F"/>
+            </w:tcBorders>
+            <w:tcMar>
+              <w:top w:w="240" w:type="dxa"/>
+              <w:left w:w="0" w:type="dxa"/>
+              <w:bottom w:w="240" w:type="dxa"/>
+              <w:right w:w="180" w:type="dxa"/>
+            </w:tcMar>
+            <w:hideMark/>
+          </w:tcPr>
+          <w:p>
+            <w:pPr>
+              <w:pStyle w:val="NormalWeb"/>
+              <w:spacing w:after="260"/>
+              <w:textAlignment w:val="baseline"/>
+              <w:rPr>
+                <w:rFonts w:ascii="Arial" w:hAnsi="Arial" w:cs="Arial"/>
+                <w:color w:val="000000"/>
+                <w:lang w:val="vi-VN"/>
+              </w:rPr>
+            </w:pPr>
+            <w:r>
+              <w:rPr>
+                <w:rFonts w:ascii="Arial" w:hAnsi="Arial" w:cs="Arial"/>
+                <w:color w:val="000000"/>
+                <w:lang w:val="vi-VN"/>
+              </w:rPr>
+              <w:t>Customer profile is created and saved securely in the database.</w:t>
+            </w:r>
+          </w:p>
+        </w:tc>
+        <w:tc>
+          <w:tcPr>
+            <w:tcW w:w="0" w:type="auto"/>
+            <w:tcBorders>
+              <w:top w:val="single" w:sz="4" w:space="0" w:color="1F1F1F"/>
+              <w:left w:val="single" w:sz="4" w:space="0" w:color="1F1F1F"/>
+              <w:bottom w:val="single" w:sz="4" w:space="0" w:color="1F1F1F"/>
+              <w:right w:val="single" w:sz="4" w:space="0" w:color="1F1F1F"/>
+            </w:tcBorders>
+            <w:tcMar>
+              <w:top w:w="240" w:type="dxa"/>
+              <w:left w:w="0" w:type="dxa"/>
+              <w:bottom w:w="240" w:type="dxa"/>
+              <w:right w:w="0" w:type="dxa"/>
+            </w:tcMar>
+            <w:hideMark/>
+          </w:tcPr>
+          <w:p>
+            <w:pPr>
+              <w:pStyle w:val="NormalWeb"/>
+              <w:spacing w:after="260"/>
+              <w:textAlignment w:val="baseline"/>
+              <w:rPr>
+                <w:rFonts w:ascii="Arial" w:hAnsi="Arial" w:cs="Arial"/>
+                <w:color w:val="000000"/>
+                <w:lang w:val="vi-VN"/>
+              </w:rPr>
+            </w:pPr>
+            <w:r>
+              <w:rPr>
+                <w:rFonts w:ascii="Arial" w:hAnsi="Arial" w:cs="Arial"/>
+                <w:color w:val="000000"/>
+                <w:lang w:val="vi-VN"/>
+              </w:rPr>
+              <w:t>Pass</w:t>
+            </w:r>
+          </w:p>
+        </w:tc>
+      </w:tr>
+      <w:tr>
+        <w:trPr>
+          <w:trHeight w:val="1680"/>
+        </w:trPr>
+        <w:tc>
+          <w:tcPr>
+            <w:tcW w:w="0" w:type="auto"/>
+            <w:tcBorders>
+              <w:top w:val="single" w:sz="4" w:space="0" w:color="1F1F1F"/>
+              <w:left w:val="single" w:sz="4" w:space="0" w:color="1F1F1F"/>
+              <w:bottom w:val="single" w:sz="4" w:space="0" w:color="1F1F1F"/>
+              <w:right w:val="single" w:sz="4" w:space="0" w:color="1F1F1F"/>
+            </w:tcBorders>
+            <w:tcMar>
+              <w:top w:w="240" w:type="dxa"/>
+              <w:left w:w="0" w:type="dxa"/>
+              <w:bottom w:w="240" w:type="dxa"/>
+              <w:right w:w="180" w:type="dxa"/>
+            </w:tcMar>
+            <w:hideMark/>
+          </w:tcPr>
+          <w:p>
+            <w:pPr>
+              <w:pStyle w:val="NormalWeb"/>
+              <w:spacing w:after="260"/>
+              <w:textAlignment w:val="baseline"/>
+              <w:rPr>
+                <w:rFonts w:ascii="Arial" w:hAnsi="Arial" w:cs="Arial"/>
+                <w:color w:val="000000"/>
+                <w:lang w:val="vi-VN"/>
+              </w:rPr>
+            </w:pPr>
+            <w:r>
+              <w:rPr>
+                <w:rFonts w:ascii="Arial" w:hAnsi="Arial" w:cs="Arial"/>
+                <w:b/>
+                <w:bCs/>
+                <w:color w:val="000000"/>
+                <w:lang w:val="vi-VN"/>
+              </w:rPr>
+              <w:t>TC-07</w:t>
+            </w:r>
+          </w:p>
+        </w:tc>
+        <w:tc>
+          <w:tcPr>
+            <w:tcW w:w="0" w:type="auto"/>
+            <w:tcBorders>
+              <w:top w:val="single" w:sz="4" w:space="0" w:color="1F1F1F"/>
+              <w:left w:val="single" w:sz="4" w:space="0" w:color="1F1F1F"/>
+              <w:bottom w:val="single" w:sz="4" w:space="0" w:color="1F1F1F"/>
+              <w:right w:val="single" w:sz="4" w:space="0" w:color="1F1F1F"/>
+            </w:tcBorders>
+            <w:tcMar>
+              <w:top w:w="240" w:type="dxa"/>
+              <w:left w:w="0" w:type="dxa"/>
+              <w:bottom w:w="240" w:type="dxa"/>
+              <w:right w:w="180" w:type="dxa"/>
+            </w:tcMar>
+            <w:hideMark/>
+          </w:tcPr>
+          <w:p>
+            <w:pPr>
+              <w:pStyle w:val="NormalWeb"/>
+              <w:spacing w:after="260"/>
+              <w:textAlignment w:val="baseline"/>
+              <w:rPr>
+                <w:rFonts w:ascii="Arial" w:hAnsi="Arial" w:cs="Arial"/>
+                <w:color w:val="000000"/>
+                <w:lang w:val="vi-VN"/>
+              </w:rPr>
+            </w:pPr>
+            <w:r>
+              <w:rPr>
+                <w:rFonts w:ascii="Arial" w:hAnsi="Arial" w:cs="Arial"/>
+                <w:color w:val="000000"/>
+                <w:lang w:val="vi-VN"/>
+              </w:rPr>
+              <w:t>Customer Mgmt</w:t>
+            </w:r>
+          </w:p>
+        </w:tc>
+        <w:tc>
+          <w:tcPr>
+            <w:tcW w:w="0" w:type="auto"/>
+            <w:tcBorders>
+              <w:top w:val="single" w:sz="4" w:space="0" w:color="1F1F1F"/>
+              <w:left w:val="single" w:sz="4" w:space="0" w:color="1F1F1F"/>
+              <w:bottom w:val="single" w:sz="4" w:space="0" w:color="1F1F1F"/>
+              <w:right w:val="single" w:sz="4" w:space="0" w:color="1F1F1F"/>
+            </w:tcBorders>
+            <w:tcMar>
+              <w:top w:w="240" w:type="dxa"/>
+              <w:left w:w="0" w:type="dxa"/>
+              <w:bottom w:w="240" w:type="dxa"/>
+              <w:right w:w="180" w:type="dxa"/>
+            </w:tcMar>
+            <w:hideMark/>
+          </w:tcPr>
+          <w:p>
+            <w:pPr>
+              <w:pStyle w:val="NormalWeb"/>
+              <w:spacing w:after="260"/>
+              <w:textAlignment w:val="baseline"/>
+              <w:rPr>
+                <w:rFonts w:ascii="Arial" w:hAnsi="Arial" w:cs="Arial"/>
+                <w:color w:val="000000"/>
+                <w:lang w:val="vi-VN"/>
+              </w:rPr>
+            </w:pPr>
+            <w:r>
+              <w:rPr>
+                <w:rFonts w:ascii="Arial" w:hAnsi="Arial" w:cs="Arial"/>
+                <w:color w:val="000000"/>
+                <w:lang w:val="vi-VN"/>
+              </w:rPr>
+              <w:t>1. Search for a phone number that does not exist.</w:t>
+            </w:r>
+          </w:p>
+        </w:tc>
+        <w:tc>
+          <w:tcPr>
+            <w:tcW w:w="0" w:type="auto"/>
+            <w:tcBorders>
+              <w:top w:val="single" w:sz="4" w:space="0" w:color="1F1F1F"/>
+              <w:left w:val="single" w:sz="4" w:space="0" w:color="1F1F1F"/>
+              <w:bottom w:val="single" w:sz="4" w:space="0" w:color="1F1F1F"/>
+              <w:right w:val="single" w:sz="4" w:space="0" w:color="1F1F1F"/>
+            </w:tcBorders>
+            <w:tcMar>
+              <w:top w:w="240" w:type="dxa"/>
+              <w:left w:w="0" w:type="dxa"/>
+              <w:bottom w:w="240" w:type="dxa"/>
+              <w:right w:w="180" w:type="dxa"/>
+            </w:tcMar>
+            <w:hideMark/>
+          </w:tcPr>
+          <w:p>
+            <w:pPr>
+              <w:pStyle w:val="NormalWeb"/>
+              <w:spacing w:after="260"/>
+              <w:textAlignment w:val="baseline"/>
+              <w:rPr>
+                <w:rFonts w:ascii="Arial" w:hAnsi="Arial" w:cs="Arial"/>
+                <w:color w:val="000000"/>
+                <w:lang w:val="vi-VN"/>
+              </w:rPr>
+            </w:pPr>
+            <w:r>
+              <w:rPr>
+                <w:rFonts w:ascii="Arial" w:hAnsi="Arial" w:cs="Arial"/>
+                <w:color w:val="000000"/>
+                <w:lang w:val="vi-VN"/>
+              </w:rPr>
+              <w:t>System displays "Customer not found" and clears the data fields.</w:t>
+            </w:r>
+          </w:p>
+        </w:tc>
+        <w:tc>
+          <w:tcPr>
+            <w:tcW w:w="0" w:type="auto"/>
+            <w:tcBorders>
+              <w:top w:val="single" w:sz="4" w:space="0" w:color="1F1F1F"/>
+              <w:left w:val="single" w:sz="4" w:space="0" w:color="1F1F1F"/>
+              <w:bottom w:val="single" w:sz="4" w:space="0" w:color="1F1F1F"/>
+              <w:right w:val="single" w:sz="4" w:space="0" w:color="1F1F1F"/>
+            </w:tcBorders>
+            <w:tcMar>
+              <w:top w:w="240" w:type="dxa"/>
+              <w:left w:w="0" w:type="dxa"/>
+              <w:bottom w:w="240" w:type="dxa"/>
+              <w:right w:w="0" w:type="dxa"/>
+            </w:tcMar>
+            <w:hideMark/>
+          </w:tcPr>
+          <w:p>
+            <w:pPr>
+              <w:pStyle w:val="NormalWeb"/>
+              <w:spacing w:after="260"/>
+              <w:textAlignment w:val="baseline"/>
+              <w:rPr>
+                <w:rFonts w:ascii="Arial" w:hAnsi="Arial" w:cs="Arial"/>
+                <w:color w:val="000000"/>
+                <w:lang w:val="vi-VN"/>
+              </w:rPr>
+            </w:pPr>
+            <w:r>
+              <w:rPr>
+                <w:rFonts w:ascii="Arial" w:hAnsi="Arial" w:cs="Arial"/>
+                <w:color w:val="000000"/>
+                <w:lang w:val="vi-VN"/>
+              </w:rPr>
+              <w:t>Pass</w:t>
+            </w:r>
+          </w:p>
+        </w:tc>
+      </w:tr>
+      <w:tr>
+        <w:trPr>
+          <w:trHeight w:val="2265"/>
+        </w:trPr>
+        <w:tc>
+          <w:tcPr>
+            <w:tcW w:w="0" w:type="auto"/>
+            <w:tcBorders>
+              <w:top w:val="single" w:sz="4" w:space="0" w:color="1F1F1F"/>
+              <w:left w:val="single" w:sz="4" w:space="0" w:color="1F1F1F"/>
+              <w:bottom w:val="single" w:sz="4" w:space="0" w:color="1F1F1F"/>
+              <w:right w:val="single" w:sz="4" w:space="0" w:color="1F1F1F"/>
+            </w:tcBorders>
+            <w:tcMar>
+              <w:top w:w="240" w:type="dxa"/>
+              <w:left w:w="0" w:type="dxa"/>
+              <w:bottom w:w="240" w:type="dxa"/>
+              <w:right w:w="180" w:type="dxa"/>
+            </w:tcMar>
+            <w:hideMark/>
+          </w:tcPr>
+          <w:p>
+            <w:pPr>
+              <w:pStyle w:val="NormalWeb"/>
+              <w:spacing w:after="260"/>
+              <w:textAlignment w:val="baseline"/>
+              <w:rPr>
+                <w:rFonts w:ascii="Arial" w:hAnsi="Arial" w:cs="Arial"/>
+                <w:color w:val="000000"/>
+                <w:lang w:val="vi-VN"/>
+              </w:rPr>
+            </w:pPr>
+            <w:r>
+              <w:rPr>
+                <w:rFonts w:ascii="Arial" w:hAnsi="Arial" w:cs="Arial"/>
+                <w:b/>
+                <w:bCs/>
+                <w:color w:val="000000"/>
+                <w:lang w:val="vi-VN"/>
+              </w:rPr>
+              <w:lastRenderedPageBreak/>
+              <w:t>TC-08</w:t>
+            </w:r>
+          </w:p>
+        </w:tc>
+        <w:tc>
+          <w:tcPr>
+            <w:tcW w:w="0" w:type="auto"/>
+            <w:tcBorders>
+              <w:top w:val="single" w:sz="4" w:space="0" w:color="1F1F1F"/>
+              <w:left w:val="single" w:sz="4" w:space="0" w:color="1F1F1F"/>
+              <w:bottom w:val="single" w:sz="4" w:space="0" w:color="1F1F1F"/>
+              <w:right w:val="single" w:sz="4" w:space="0" w:color="1F1F1F"/>
+            </w:tcBorders>
+            <w:tcMar>
+              <w:top w:w="240" w:type="dxa"/>
+              <w:left w:w="0" w:type="dxa"/>
+              <w:bottom w:w="240" w:type="dxa"/>
+              <w:right w:w="180" w:type="dxa"/>
+            </w:tcMar>
+            <w:hideMark/>
+          </w:tcPr>
+          <w:p>
+            <w:pPr>
+              <w:pStyle w:val="NormalWeb"/>
+              <w:spacing w:after="260"/>
+              <w:textAlignment w:val="baseline"/>
+              <w:rPr>
+                <w:rFonts w:ascii="Arial" w:hAnsi="Arial" w:cs="Arial"/>
+                <w:color w:val="000000"/>
+                <w:lang w:val="vi-VN"/>
+              </w:rPr>
+            </w:pPr>
+            <w:r>
+              <w:rPr>
+                <w:rFonts w:ascii="Arial" w:hAnsi="Arial" w:cs="Arial"/>
+                <w:color w:val="000000"/>
+                <w:lang w:val="vi-VN"/>
+              </w:rPr>
+              <w:t>Employee Admin</w:t>
+            </w:r>
+          </w:p>
+        </w:tc>
+        <w:tc>
+          <w:tcPr>
+            <w:tcW w:w="0" w:type="auto"/>
+            <w:tcBorders>
+              <w:top w:val="single" w:sz="4" w:space="0" w:color="1F1F1F"/>
+              <w:left w:val="single" w:sz="4" w:space="0" w:color="1F1F1F"/>
+              <w:bottom w:val="single" w:sz="4" w:space="0" w:color="1F1F1F"/>
+              <w:right w:val="single" w:sz="4" w:space="0" w:color="1F1F1F"/>
+            </w:tcBorders>
+            <w:tcMar>
+              <w:top w:w="240" w:type="dxa"/>
+              <w:left w:w="0" w:type="dxa"/>
+              <w:bottom w:w="240" w:type="dxa"/>
+              <w:right w:w="180" w:type="dxa"/>
+            </w:tcMar>
+            <w:hideMark/>
+          </w:tcPr>
+          <w:p>
+            <w:pPr>
+              <w:pStyle w:val="NormalWeb"/>
+              <w:spacing w:after="260"/>
+              <w:textAlignment w:val="baseline"/>
+              <w:rPr>
+                <w:rFonts w:ascii="Arial" w:hAnsi="Arial" w:cs="Arial"/>
+                <w:color w:val="000000"/>
+                <w:lang w:val="vi-VN"/>
+              </w:rPr>
+            </w:pPr>
+            <w:r>
+              <w:rPr>
+                <w:rFonts w:ascii="Arial" w:hAnsi="Arial" w:cs="Arial"/>
+                <w:color w:val="000000"/>
+                <w:lang w:val="vi-VN"/>
+              </w:rPr>
+              <w:t>1. Log in as Manager.</w:t>
+            </w:r>
+          </w:p>
+          <w:p>
+            <w:pPr>
+              <w:pStyle w:val="NormalWeb"/>
+              <w:spacing w:after="260"/>
+              <w:textAlignment w:val="baseline"/>
+              <w:rPr>
+                <w:rFonts w:ascii="Arial" w:hAnsi="Arial" w:cs="Arial"/>
+                <w:color w:val="000000"/>
+                <w:lang w:val="vi-VN"/>
+              </w:rPr>
+            </w:pPr>
+          </w:p>
+          <w:p>
+            <w:pPr>
+              <w:pStyle w:val="NormalWeb"/>
+              <w:spacing w:after="260"/>
+              <w:textAlignment w:val="baseline"/>
+              <w:rPr>
+                <w:rFonts w:ascii="Arial" w:hAnsi="Arial" w:cs="Arial"/>
+                <w:color w:val="000000"/>
+                <w:lang w:val="vi-VN"/>
+              </w:rPr>
+            </w:pPr>
+            <w:r>
+              <w:rPr>
+                <w:rFonts w:ascii="Arial" w:hAnsi="Arial" w:cs="Arial"/>
+                <w:color w:val="000000"/>
+                <w:lang w:val="vi-VN"/>
+              </w:rPr>
+              <w:t>2. Create a new Staff account with valid data.</w:t>
+            </w:r>
+          </w:p>
+        </w:tc>
+        <w:tc>
+          <w:tcPr>
+            <w:tcW w:w="0" w:type="auto"/>
+            <w:tcBorders>
+              <w:top w:val="single" w:sz="4" w:space="0" w:color="1F1F1F"/>
+              <w:left w:val="single" w:sz="4" w:space="0" w:color="1F1F1F"/>
+              <w:bottom w:val="single" w:sz="4" w:space="0" w:color="1F1F1F"/>
+              <w:right w:val="single" w:sz="4" w:space="0" w:color="1F1F1F"/>
+            </w:tcBorders>
+            <w:tcMar>
+              <w:top w:w="240" w:type="dxa"/>
+              <w:left w:w="0" w:type="dxa"/>
+              <w:bottom w:w="240" w:type="dxa"/>
+              <w:right w:w="180" w:type="dxa"/>
+            </w:tcMar>
+            <w:hideMark/>
+          </w:tcPr>
+          <w:p>
+            <w:pPr>
+              <w:pStyle w:val="NormalWeb"/>
+              <w:spacing w:after="260"/>
+              <w:textAlignment w:val="baseline"/>
+              <w:rPr>
+                <w:rFonts w:ascii="Arial" w:hAnsi="Arial" w:cs="Arial"/>
+                <w:color w:val="000000"/>
+                <w:lang w:val="vi-VN"/>
+              </w:rPr>
+            </w:pPr>
+            <w:r>
+              <w:rPr>
+                <w:rFonts w:ascii="Arial" w:hAnsi="Arial" w:cs="Arial"/>
+                <w:color w:val="000000"/>
+                <w:lang w:val="vi-VN"/>
+              </w:rPr>
+              <w:t>System saves the new account; the new user can log in successfully.</w:t>
+            </w:r>
+          </w:p>
+        </w:tc>
+        <w:tc>
+          <w:tcPr>
+            <w:tcW w:w="0" w:type="auto"/>
+            <w:tcBorders>
+              <w:top w:val="single" w:sz="4" w:space="0" w:color="1F1F1F"/>
+              <w:left w:val="single" w:sz="4" w:space="0" w:color="1F1F1F"/>
+              <w:bottom w:val="single" w:sz="4" w:space="0" w:color="1F1F1F"/>
+              <w:right w:val="single" w:sz="4" w:space="0" w:color="1F1F1F"/>
+            </w:tcBorders>
+            <w:tcMar>
+              <w:top w:w="240" w:type="dxa"/>
+              <w:left w:w="0" w:type="dxa"/>
+              <w:bottom w:w="240" w:type="dxa"/>
+              <w:right w:w="0" w:type="dxa"/>
+            </w:tcMar>
+            <w:hideMark/>
+          </w:tcPr>
+          <w:p>
+            <w:pPr>
+              <w:pStyle w:val="NormalWeb"/>
+              <w:spacing w:after="260"/>
+              <w:textAlignment w:val="baseline"/>
+              <w:rPr>
+                <w:rFonts w:ascii="Arial" w:hAnsi="Arial" w:cs="Arial"/>
+                <w:color w:val="000000"/>
+                <w:lang w:val="vi-VN"/>
+              </w:rPr>
+            </w:pPr>
+            <w:r>
+              <w:rPr>
+                <w:rFonts w:ascii="Arial" w:hAnsi="Arial" w:cs="Arial"/>
+                <w:color w:val="000000"/>
+                <w:lang w:val="vi-VN"/>
+              </w:rPr>
+              <w:t>Pass</w:t>
+            </w:r>
+          </w:p>
+        </w:tc>
+      </w:tr>
+      <w:tr>
+        <w:trPr>
+          <w:trHeight w:val="2265"/>
+        </w:trPr>
+        <w:tc>
+          <w:tcPr>
+            <w:tcW w:w="0" w:type="auto"/>
+            <w:tcBorders>
+              <w:top w:val="single" w:sz="4" w:space="0" w:color="1F1F1F"/>
+              <w:left w:val="single" w:sz="4" w:space="0" w:color="1F1F1F"/>
+              <w:bottom w:val="single" w:sz="4" w:space="0" w:color="1F1F1F"/>
+              <w:right w:val="single" w:sz="4" w:space="0" w:color="1F1F1F"/>
+            </w:tcBorders>
+            <w:tcMar>
+              <w:top w:w="240" w:type="dxa"/>
+              <w:left w:w="0" w:type="dxa"/>
+              <w:bottom w:w="240" w:type="dxa"/>
+              <w:right w:w="180" w:type="dxa"/>
+            </w:tcMar>
+            <w:hideMark/>
+          </w:tcPr>
+          <w:p>
+            <w:pPr>
+              <w:pStyle w:val="NormalWeb"/>
+              <w:spacing w:after="260"/>
+              <w:textAlignment w:val="baseline"/>
+              <w:rPr>
+                <w:rFonts w:ascii="Arial" w:hAnsi="Arial" w:cs="Arial"/>
+                <w:color w:val="000000"/>
+                <w:lang w:val="vi-VN"/>
+              </w:rPr>
+            </w:pPr>
+            <w:r>
+              <w:rPr>
+                <w:rFonts w:ascii="Arial" w:hAnsi="Arial" w:cs="Arial"/>
+                <w:b/>
+                <w:bCs/>
+                <w:color w:val="000000"/>
+                <w:lang w:val="vi-VN"/>
+              </w:rPr>
+              <w:t>TC-09</w:t>
+            </w:r>
+          </w:p>
+        </w:tc>
+        <w:tc>
+          <w:tcPr>
+            <w:tcW w:w="0" w:type="auto"/>
+            <w:tcBorders>
+              <w:top w:val="single" w:sz="4" w:space="0" w:color="1F1F1F"/>
+              <w:left w:val="single" w:sz="4" w:space="0" w:color="1F1F1F"/>
+              <w:bottom w:val="single" w:sz="4" w:space="0" w:color="1F1F1F"/>
+              <w:right w:val="single" w:sz="4" w:space="0" w:color="1F1F1F"/>
+            </w:tcBorders>
+            <w:tcMar>
+              <w:top w:w="240" w:type="dxa"/>
+              <w:left w:w="0" w:type="dxa"/>
+              <w:bottom w:w="240" w:type="dxa"/>
+              <w:right w:w="180" w:type="dxa"/>
+            </w:tcMar>
+            <w:hideMark/>
+          </w:tcPr>
+          <w:p>
+            <w:pPr>
+              <w:pStyle w:val="NormalWeb"/>
+              <w:spacing w:after="260"/>
+              <w:textAlignment w:val="baseline"/>
+              <w:rPr>
+                <w:rFonts w:ascii="Arial" w:hAnsi="Arial" w:cs="Arial"/>
+                <w:color w:val="000000"/>
+                <w:lang w:val="vi-VN"/>
+              </w:rPr>
+            </w:pPr>
+            <w:r>
+              <w:rPr>
+                <w:rFonts w:ascii="Arial" w:hAnsi="Arial" w:cs="Arial"/>
+                <w:color w:val="000000"/>
+                <w:lang w:val="vi-VN"/>
+              </w:rPr>
+              <w:t>Security / Access</w:t>
+            </w:r>
+          </w:p>
+        </w:tc>
+        <w:tc>
+          <w:tcPr>
+            <w:tcW w:w="0" w:type="auto"/>
+            <w:tcBorders>
+              <w:top w:val="single" w:sz="4" w:space="0" w:color="1F1F1F"/>
+              <w:left w:val="single" w:sz="4" w:space="0" w:color="1F1F1F"/>
+              <w:bottom w:val="single" w:sz="4" w:space="0" w:color="1F1F1F"/>
+              <w:right w:val="single" w:sz="4" w:space="0" w:color="1F1F1F"/>
+            </w:tcBorders>
+            <w:tcMar>
+              <w:top w:w="240" w:type="dxa"/>
+              <w:left w:w="0" w:type="dxa"/>
+              <w:bottom w:w="240" w:type="dxa"/>
+              <w:right w:w="180" w:type="dxa"/>
+            </w:tcMar>
+            <w:hideMark/>
+          </w:tcPr>
+          <w:p>
+            <w:pPr>
+              <w:pStyle w:val="NormalWeb"/>
+              <w:spacing w:after="260"/>
+              <w:textAlignment w:val="baseline"/>
+              <w:rPr>
+                <w:rFonts w:ascii="Arial" w:hAnsi="Arial" w:cs="Arial"/>
+                <w:color w:val="000000"/>
+                <w:lang w:val="vi-VN"/>
+              </w:rPr>
+            </w:pPr>
+            <w:r>
+              <w:rPr>
+                <w:rFonts w:ascii="Arial" w:hAnsi="Arial" w:cs="Arial"/>
+                <w:color w:val="000000"/>
+                <w:lang w:val="vi-VN"/>
+              </w:rPr>
+              <w:t>1. Log in as Sales Staff.</w:t>
+            </w:r>
+          </w:p>
+          <w:p>
+            <w:pPr>
+              <w:pStyle w:val="NormalWeb"/>
+              <w:spacing w:after="260"/>
+              <w:textAlignment w:val="baseline"/>
+              <w:rPr>
+                <w:rFonts w:ascii="Arial" w:hAnsi="Arial" w:cs="Arial"/>
+                <w:color w:val="000000"/>
+                <w:lang w:val="vi-VN"/>
+              </w:rPr>
+            </w:pPr>
+          </w:p>
+          <w:p>
+            <w:pPr>
+              <w:pStyle w:val="NormalWeb"/>
+              <w:spacing w:after="260"/>
+              <w:textAlignment w:val="baseline"/>
+              <w:rPr>
+                <w:rFonts w:ascii="Arial" w:hAnsi="Arial" w:cs="Arial"/>
+                <w:color w:val="000000"/>
+                <w:lang w:val="vi-VN"/>
+              </w:rPr>
+            </w:pPr>
+            <w:r>
+              <w:rPr>
+                <w:rFonts w:ascii="Arial" w:hAnsi="Arial" w:cs="Arial"/>
+                <w:color w:val="000000"/>
+                <w:lang w:val="vi-VN"/>
+              </w:rPr>
+              <w:t>2. Attempt to access Employee Mgmt module.</w:t>
+            </w:r>
+          </w:p>
+        </w:tc>
+        <w:tc>
+          <w:tcPr>
+            <w:tcW w:w="0" w:type="auto"/>
+            <w:tcBorders>
+              <w:top w:val="single" w:sz="4" w:space="0" w:color="1F1F1F"/>
+              <w:left w:val="single" w:sz="4" w:space="0" w:color="1F1F1F"/>
+              <w:bottom w:val="single" w:sz="4" w:space="0" w:color="1F1F1F"/>
+              <w:right w:val="single" w:sz="4" w:space="0" w:color="1F1F1F"/>
+            </w:tcBorders>
+            <w:tcMar>
+              <w:top w:w="240" w:type="dxa"/>
+              <w:left w:w="0" w:type="dxa"/>
+              <w:bottom w:w="240" w:type="dxa"/>
+              <w:right w:w="180" w:type="dxa"/>
+            </w:tcMar>
+            <w:hideMark/>
+          </w:tcPr>
+          <w:p>
+            <w:pPr>
+              <w:pStyle w:val="NormalWeb"/>
+              <w:spacing w:after="260"/>
+              <w:textAlignment w:val="baseline"/>
+              <w:rPr>
+                <w:rFonts w:ascii="Arial" w:hAnsi="Arial" w:cs="Arial"/>
+                <w:color w:val="000000"/>
+                <w:lang w:val="vi-VN"/>
+              </w:rPr>
+            </w:pPr>
+            <w:r>
+              <w:rPr>
+                <w:rFonts w:ascii="Arial" w:hAnsi="Arial" w:cs="Arial"/>
+                <w:color w:val="000000"/>
+                <w:lang w:val="vi-VN"/>
+              </w:rPr>
+              <w:t>System denies access (Role-Based Access Control functions correctly).</w:t>
+            </w:r>
+          </w:p>
+        </w:tc>
+        <w:tc>
+          <w:tcPr>
+            <w:tcW w:w="0" w:type="auto"/>
+            <w:tcBorders>
+              <w:top w:val="single" w:sz="4" w:space="0" w:color="1F1F1F"/>
+              <w:left w:val="single" w:sz="4" w:space="0" w:color="1F1F1F"/>
+              <w:bottom w:val="single" w:sz="4" w:space="0" w:color="1F1F1F"/>
+              <w:right w:val="single" w:sz="4" w:space="0" w:color="1F1F1F"/>
+            </w:tcBorders>
+            <w:tcMar>
+              <w:top w:w="240" w:type="dxa"/>
+              <w:left w:w="0" w:type="dxa"/>
+              <w:bottom w:w="240" w:type="dxa"/>
+              <w:right w:w="0" w:type="dxa"/>
+            </w:tcMar>
+            <w:hideMark/>
+          </w:tcPr>
+          <w:p>
+            <w:pPr>
+              <w:pStyle w:val="NormalWeb"/>
+              <w:spacing w:after="260"/>
+              <w:textAlignment w:val="baseline"/>
+              <w:rPr>
+                <w:rFonts w:ascii="Arial" w:hAnsi="Arial" w:cs="Arial"/>
+                <w:color w:val="000000"/>
+                <w:lang w:val="vi-VN"/>
+              </w:rPr>
+            </w:pPr>
+            <w:r>
+              <w:rPr>
+                <w:rFonts w:ascii="Arial" w:hAnsi="Arial" w:cs="Arial"/>
+                <w:color w:val="000000"/>
+                <w:lang w:val="vi-VN"/>
+              </w:rPr>
+              <w:t>Pass</w:t>
+            </w:r>
+          </w:p>
+        </w:tc>
+      </w:tr>
+      <w:tr>
+        <w:trPr>
+          <w:trHeight w:val="2265"/>
+        </w:trPr>
+        <w:tc>
+          <w:tcPr>
+            <w:tcW w:w="0" w:type="auto"/>
+            <w:tcBorders>
+              <w:top w:val="single" w:sz="4" w:space="0" w:color="1F1F1F"/>
+              <w:left w:val="single" w:sz="4" w:space="0" w:color="1F1F1F"/>
+              <w:bottom w:val="single" w:sz="4" w:space="0" w:color="1F1F1F"/>
+              <w:right w:val="single" w:sz="4" w:space="0" w:color="1F1F1F"/>
+            </w:tcBorders>
+            <w:tcMar>
+              <w:top w:w="240" w:type="dxa"/>
+              <w:left w:w="0" w:type="dxa"/>
+              <w:bottom w:w="240" w:type="dxa"/>
+              <w:right w:w="180" w:type="dxa"/>
+            </w:tcMar>
+            <w:hideMark/>
+          </w:tcPr>
+          <w:p>
+            <w:pPr>
+              <w:pStyle w:val="NormalWeb"/>
+              <w:spacing w:after="260"/>
+              <w:textAlignment w:val="baseline"/>
+              <w:rPr>
+                <w:rFonts w:ascii="Arial" w:hAnsi="Arial" w:cs="Arial"/>
+                <w:color w:val="000000"/>
+                <w:lang w:val="vi-VN"/>
+              </w:rPr>
+            </w:pPr>
+            <w:r>
+              <w:rPr>
+                <w:rFonts w:ascii="Arial" w:hAnsi="Arial" w:cs="Arial"/>
+                <w:b/>
+                <w:bCs/>
+                <w:color w:val="000000"/>
+                <w:lang w:val="vi-VN"/>
+              </w:rPr>
+              <w:t>TC-10</w:t>
+            </w:r>
+          </w:p>
+        </w:tc>
+        <w:tc>
+          <w:tcPr>
+            <w:tcW w:w="0" w:type="auto"/>
+            <w:tcBorders>
+              <w:top w:val="single" w:sz="4" w:space="0" w:color="1F1F1F"/>
+              <w:left w:val="single" w:sz="4" w:space="0" w:color="1F1F1F"/>
+              <w:bottom w:val="single" w:sz="4" w:space="0" w:color="1F1F1F"/>
+              <w:right w:val="single" w:sz="4" w:space="0" w:color="1F1F1F"/>
+            </w:tcBorders>
+            <w:tcMar>
+              <w:top w:w="240" w:type="dxa"/>
+              <w:left w:w="0" w:type="dxa"/>
+              <w:bottom w:w="240" w:type="dxa"/>
+              <w:right w:w="180" w:type="dxa"/>
+            </w:tcMar>
+            <w:hideMark/>
+          </w:tcPr>
+          <w:p>
+            <w:pPr>
+              <w:pStyle w:val="NormalWeb"/>
+              <w:spacing w:after="260"/>
+              <w:textAlignment w:val="baseline"/>
+              <w:rPr>
+                <w:rFonts w:ascii="Arial" w:hAnsi="Arial" w:cs="Arial"/>
+                <w:color w:val="000000"/>
+                <w:lang w:val="vi-VN"/>
+              </w:rPr>
+            </w:pPr>
+            <w:r>
+              <w:rPr>
+                <w:rFonts w:ascii="Arial" w:hAnsi="Arial" w:cs="Arial"/>
+                <w:color w:val="000000"/>
+                <w:lang w:val="vi-VN"/>
+              </w:rPr>
+              <w:t>Inventory Mgmt</w:t>
+            </w:r>
+          </w:p>
+        </w:tc>
+        <w:tc>
+          <w:tcPr>
+            <w:tcW w:w="0" w:type="auto"/>
+            <w:tcBorders>
+              <w:top w:val="single" w:sz="4" w:space="0" w:color="1F1F1F"/>
+              <w:left w:val="single" w:sz="4" w:space="0" w:color="1F1F1F"/>
+              <w:bottom w:val="single" w:sz="4" w:space="0" w:color="1F1F1F"/>
+              <w:right w:val="single" w:sz="4" w:space="0" w:color="1F1F1F"/>
+            </w:tcBorders>
+            <w:tcMar>
+              <w:top w:w="240" w:type="dxa"/>
+              <w:left w:w="0" w:type="dxa"/>
+              <w:bottom w:w="240" w:type="dxa"/>
+              <w:right w:w="180" w:type="dxa"/>
+            </w:tcMar>
+            <w:hideMark/>
+          </w:tcPr>
+          <w:p>
+            <w:pPr>
+              <w:pStyle w:val="NormalWeb"/>
+              <w:spacing w:after="260"/>
+              <w:textAlignment w:val="baseline"/>
+              <w:rPr>
+                <w:rFonts w:ascii="Arial" w:hAnsi="Arial" w:cs="Arial"/>
+                <w:color w:val="000000"/>
+                <w:lang w:val="vi-VN"/>
+              </w:rPr>
+            </w:pPr>
+            <w:r>
+              <w:rPr>
+                <w:rFonts w:ascii="Arial" w:hAnsi="Arial" w:cs="Arial"/>
+                <w:color w:val="000000"/>
+                <w:lang w:val="vi-VN"/>
+              </w:rPr>
+              <w:t>1. Enter new product details (Name, Base Price, Quantity).</w:t>
+            </w:r>
+          </w:p>
+          <w:p>
+            <w:pPr>
+              <w:pStyle w:val="NormalWeb"/>
+              <w:spacing w:after="260"/>
+              <w:textAlignment w:val="baseline"/>
+              <w:rPr>
+                <w:rFonts w:ascii="Arial" w:hAnsi="Arial" w:cs="Arial"/>
+                <w:color w:val="000000"/>
+                <w:lang w:val="vi-VN"/>
+              </w:rPr>
+            </w:pPr>
+          </w:p>
+          <w:p>
+            <w:pPr>
+              <w:pStyle w:val="NormalWeb"/>
+              <w:spacing w:after="260"/>
+              <w:textAlignment w:val="baseline"/>
+              <w:rPr>
+                <w:rFonts w:ascii="Arial" w:hAnsi="Arial" w:cs="Arial"/>
+                <w:color w:val="000000"/>
+                <w:lang w:val="vi-VN"/>
+              </w:rPr>
+            </w:pPr>
+            <w:r>
+              <w:rPr>
+                <w:rFonts w:ascii="Arial" w:hAnsi="Arial" w:cs="Arial"/>
+                <w:color w:val="000000"/>
+                <w:lang w:val="vi-VN"/>
+              </w:rPr>
+              <w:t>2. Click Add.</w:t>
+            </w:r>
+          </w:p>
+        </w:tc>
+        <w:tc>
+          <w:tcPr>
+            <w:tcW w:w="0" w:type="auto"/>
+            <w:tcBorders>
+              <w:top w:val="single" w:sz="4" w:space="0" w:color="1F1F1F"/>
+              <w:left w:val="single" w:sz="4" w:space="0" w:color="1F1F1F"/>
+              <w:bottom w:val="single" w:sz="4" w:space="0" w:color="1F1F1F"/>
+              <w:right w:val="single" w:sz="4" w:space="0" w:color="1F1F1F"/>
+            </w:tcBorders>
+            <w:tcMar>
+              <w:top w:w="240" w:type="dxa"/>
+              <w:left w:w="0" w:type="dxa"/>
+              <w:bottom w:w="240" w:type="dxa"/>
+              <w:right w:w="180" w:type="dxa"/>
+            </w:tcMar>
+            <w:hideMark/>
+          </w:tcPr>
+          <w:p>
+            <w:pPr>
+              <w:pStyle w:val="NormalWeb"/>
+              <w:spacing w:after="260"/>
+              <w:textAlignment w:val="baseline"/>
+              <w:rPr>
+                <w:rFonts w:ascii="Arial" w:hAnsi="Arial" w:cs="Arial"/>
+                <w:color w:val="000000"/>
+                <w:lang w:val="vi-VN"/>
+              </w:rPr>
+            </w:pPr>
+            <w:r>
+              <w:rPr>
+                <w:rFonts w:ascii="Arial" w:hAnsi="Arial" w:cs="Arial"/>
+                <w:color w:val="000000"/>
+                <w:lang w:val="vi-VN"/>
+              </w:rPr>
+              <w:t>The new product is added to the catalog and visible in the UI.</w:t>
+            </w:r>
+          </w:p>
+        </w:tc>
+        <w:tc>
+          <w:tcPr>
+            <w:tcW w:w="0" w:type="auto"/>
+            <w:tcBorders>
+              <w:top w:val="single" w:sz="4" w:space="0" w:color="1F1F1F"/>
+              <w:left w:val="single" w:sz="4" w:space="0" w:color="1F1F1F"/>
+              <w:bottom w:val="single" w:sz="4" w:space="0" w:color="1F1F1F"/>
+              <w:right w:val="single" w:sz="4" w:space="0" w:color="1F1F1F"/>
+            </w:tcBorders>
+            <w:tcMar>
+              <w:top w:w="240" w:type="dxa"/>
+              <w:left w:w="0" w:type="dxa"/>
+              <w:bottom w:w="240" w:type="dxa"/>
+              <w:right w:w="0" w:type="dxa"/>
+            </w:tcMar>
+            <w:hideMark/>
+          </w:tcPr>
+          <w:p>
+            <w:pPr>
+              <w:pStyle w:val="NormalWeb"/>
+              <w:spacing w:after="260"/>
+              <w:textAlignment w:val="baseline"/>
+              <w:rPr>
+                <w:rFonts w:ascii="Arial" w:hAnsi="Arial" w:cs="Arial"/>
+                <w:color w:val="000000"/>
+                <w:lang w:val="vi-VN"/>
+              </w:rPr>
+            </w:pPr>
+            <w:r>
+              <w:rPr>
+                <w:rFonts w:ascii="Arial" w:hAnsi="Arial" w:cs="Arial"/>
+                <w:color w:val="000000"/>
+                <w:lang w:val="vi-VN"/>
+              </w:rPr>
+              <w:t>Pass</w:t>
+            </w:r>
+          </w:p>
+        </w:tc>
+      </w:tr>
+      <w:tr>
+        <w:trPr>
+          <w:trHeight w:val="2550"/>
+        </w:trPr>
+        <w:tc>
+          <w:tcPr>
+            <w:tcW w:w="0" w:type="auto"/>
+            <w:tcBorders>
+              <w:top w:val="single" w:sz="4" w:space="0" w:color="1F1F1F"/>
+              <w:left w:val="single" w:sz="4" w:space="0" w:color="1F1F1F"/>
+              <w:bottom w:val="single" w:sz="4" w:space="0" w:color="1F1F1F"/>
+              <w:right w:val="single" w:sz="4" w:space="0" w:color="1F1F1F"/>
+            </w:tcBorders>
+            <w:tcMar>
+              <w:top w:w="240" w:type="dxa"/>
+              <w:left w:w="0" w:type="dxa"/>
+              <w:bottom w:w="240" w:type="dxa"/>
+              <w:right w:w="180" w:type="dxa"/>
+            </w:tcMar>
+            <w:hideMark/>
+          </w:tcPr>
+          <w:p>
+            <w:pPr>
+              <w:pStyle w:val="NormalWeb"/>
+              <w:spacing w:after="260"/>
+              <w:textAlignment w:val="baseline"/>
+              <w:rPr>
+                <w:rFonts w:ascii="Arial" w:hAnsi="Arial" w:cs="Arial"/>
+                <w:color w:val="000000"/>
+                <w:lang w:val="vi-VN"/>
+              </w:rPr>
+            </w:pPr>
+            <w:r>
+              <w:rPr>
+                <w:rFonts w:ascii="Arial" w:hAnsi="Arial" w:cs="Arial"/>
+                <w:b/>
+                <w:bCs/>
+                <w:color w:val="000000"/>
+                <w:lang w:val="vi-VN"/>
+              </w:rPr>
+              <w:t>TC-11</w:t>
+            </w:r>
+          </w:p>
+        </w:tc>
+        <w:tc>
+          <w:tcPr>
+            <w:tcW w:w="0" w:type="auto"/>
+            <w:tcBorders>
+              <w:top w:val="single" w:sz="4" w:space="0" w:color="1F1F1F"/>
+              <w:left w:val="single" w:sz="4" w:space="0" w:color="1F1F1F"/>
+              <w:bottom w:val="single" w:sz="4" w:space="0" w:color="1F1F1F"/>
+              <w:right w:val="single" w:sz="4" w:space="0" w:color="1F1F1F"/>
+            </w:tcBorders>
+            <w:tcMar>
+              <w:top w:w="240" w:type="dxa"/>
+              <w:left w:w="0" w:type="dxa"/>
+              <w:bottom w:w="240" w:type="dxa"/>
+              <w:right w:w="180" w:type="dxa"/>
+            </w:tcMar>
+            <w:hideMark/>
+          </w:tcPr>
+          <w:p>
+            <w:pPr>
+              <w:pStyle w:val="NormalWeb"/>
+              <w:spacing w:after="260"/>
+              <w:textAlignment w:val="baseline"/>
+              <w:rPr>
+                <w:rFonts w:ascii="Arial" w:hAnsi="Arial" w:cs="Arial"/>
+                <w:color w:val="000000"/>
+                <w:lang w:val="vi-VN"/>
+              </w:rPr>
+            </w:pPr>
+            <w:r>
+              <w:rPr>
+                <w:rFonts w:ascii="Arial" w:hAnsi="Arial" w:cs="Arial"/>
+                <w:color w:val="000000"/>
+                <w:lang w:val="vi-VN"/>
+              </w:rPr>
+              <w:t>Hardware Tracking</w:t>
+            </w:r>
+          </w:p>
+        </w:tc>
+        <w:tc>
+          <w:tcPr>
+            <w:tcW w:w="0" w:type="auto"/>
+            <w:tcBorders>
+              <w:top w:val="single" w:sz="4" w:space="0" w:color="1F1F1F"/>
+              <w:left w:val="single" w:sz="4" w:space="0" w:color="1F1F1F"/>
+              <w:bottom w:val="single" w:sz="4" w:space="0" w:color="1F1F1F"/>
+              <w:right w:val="single" w:sz="4" w:space="0" w:color="1F1F1F"/>
+            </w:tcBorders>
+            <w:tcMar>
+              <w:top w:w="240" w:type="dxa"/>
+              <w:left w:w="0" w:type="dxa"/>
+              <w:bottom w:w="240" w:type="dxa"/>
+              <w:right w:w="180" w:type="dxa"/>
+            </w:tcMar>
+            <w:hideMark/>
+          </w:tcPr>
+          <w:p>
+            <w:pPr>
+              <w:pStyle w:val="NormalWeb"/>
+              <w:spacing w:after="260"/>
+              <w:textAlignment w:val="baseline"/>
+              <w:rPr>
+                <w:rFonts w:ascii="Arial" w:hAnsi="Arial" w:cs="Arial"/>
+                <w:color w:val="000000"/>
+                <w:lang w:val="vi-VN"/>
+              </w:rPr>
+            </w:pPr>
+            <w:r>
+              <w:rPr>
+                <w:rFonts w:ascii="Arial" w:hAnsi="Arial" w:cs="Arial"/>
+                <w:color w:val="000000"/>
+                <w:lang w:val="vi-VN"/>
+              </w:rPr>
+              <w:t>1. Select a hardware component.</w:t>
+            </w:r>
+          </w:p>
+          <w:p>
+            <w:pPr>
+              <w:pStyle w:val="NormalWeb"/>
+              <w:spacing w:after="260"/>
+              <w:textAlignment w:val="baseline"/>
+              <w:rPr>
+                <w:rFonts w:ascii="Arial" w:hAnsi="Arial" w:cs="Arial"/>
+                <w:color w:val="000000"/>
+                <w:lang w:val="vi-VN"/>
+              </w:rPr>
+            </w:pPr>
+          </w:p>
+          <w:p>
+            <w:pPr>
+              <w:pStyle w:val="NormalWeb"/>
+              <w:spacing w:after="260"/>
+              <w:textAlignment w:val="baseline"/>
+              <w:rPr>
+                <w:rFonts w:ascii="Arial" w:hAnsi="Arial" w:cs="Arial"/>
+                <w:color w:val="000000"/>
+                <w:lang w:val="vi-VN"/>
+              </w:rPr>
+            </w:pPr>
+            <w:r>
+              <w:rPr>
+                <w:rFonts w:ascii="Arial" w:hAnsi="Arial" w:cs="Arial"/>
+                <w:color w:val="000000"/>
+                <w:lang w:val="vi-VN"/>
+              </w:rPr>
+              <w:t>2. Update its Specs (CPU, RAM).</w:t>
+            </w:r>
+          </w:p>
+        </w:tc>
+        <w:tc>
+          <w:tcPr>
+            <w:tcW w:w="0" w:type="auto"/>
+            <w:tcBorders>
+              <w:top w:val="single" w:sz="4" w:space="0" w:color="1F1F1F"/>
+              <w:left w:val="single" w:sz="4" w:space="0" w:color="1F1F1F"/>
+              <w:bottom w:val="single" w:sz="4" w:space="0" w:color="1F1F1F"/>
+              <w:right w:val="single" w:sz="4" w:space="0" w:color="1F1F1F"/>
+            </w:tcBorders>
+            <w:tcMar>
+              <w:top w:w="240" w:type="dxa"/>
+              <w:left w:w="0" w:type="dxa"/>
+              <w:bottom w:w="240" w:type="dxa"/>
+              <w:right w:w="180" w:type="dxa"/>
+            </w:tcMar>
+            <w:hideMark/>
+          </w:tcPr>
+          <w:p>
+            <w:pPr>
+              <w:pStyle w:val="NormalWeb"/>
+              <w:spacing w:after="260"/>
+              <w:textAlignment w:val="baseline"/>
+              <w:rPr>
+                <w:rFonts w:ascii="Arial" w:hAnsi="Arial" w:cs="Arial"/>
+                <w:color w:val="000000"/>
+                <w:lang w:val="vi-VN"/>
+              </w:rPr>
+            </w:pPr>
+            <w:r>
+              <w:rPr>
+                <w:rFonts w:ascii="Arial" w:hAnsi="Arial" w:cs="Arial"/>
+                <w:color w:val="000000"/>
+                <w:lang w:val="vi-VN"/>
+              </w:rPr>
+              <w:t>The technical specifications are updated and formatted correctly.</w:t>
+            </w:r>
+          </w:p>
+        </w:tc>
+        <w:tc>
+          <w:tcPr>
+            <w:tcW w:w="0" w:type="auto"/>
+            <w:tcBorders>
+              <w:top w:val="single" w:sz="4" w:space="0" w:color="1F1F1F"/>
+              <w:left w:val="single" w:sz="4" w:space="0" w:color="1F1F1F"/>
+              <w:bottom w:val="single" w:sz="4" w:space="0" w:color="1F1F1F"/>
+              <w:right w:val="single" w:sz="4" w:space="0" w:color="1F1F1F"/>
+            </w:tcBorders>
+            <w:tcMar>
+              <w:top w:w="240" w:type="dxa"/>
+              <w:left w:w="0" w:type="dxa"/>
+              <w:bottom w:w="240" w:type="dxa"/>
+              <w:right w:w="0" w:type="dxa"/>
+            </w:tcMar>
+            <w:hideMark/>
+          </w:tcPr>
+          <w:p>
+            <w:pPr>
+              <w:pStyle w:val="NormalWeb"/>
+              <w:spacing w:after="260"/>
+              <w:textAlignment w:val="baseline"/>
+              <w:rPr>
+                <w:rFonts w:ascii="Arial" w:hAnsi="Arial" w:cs="Arial"/>
+                <w:color w:val="000000"/>
+                <w:lang w:val="vi-VN"/>
+              </w:rPr>
+            </w:pPr>
+            <w:r>
+              <w:rPr>
+                <w:rFonts w:ascii="Arial" w:hAnsi="Arial" w:cs="Arial"/>
+                <w:color w:val="000000"/>
+                <w:lang w:val="vi-VN"/>
+              </w:rPr>
+              <w:t>Pass</w:t>
+            </w:r>
+          </w:p>
+        </w:tc>
+      </w:tr>
+      <w:tr>
+        <w:trPr>
+          <w:trHeight w:val="2265"/>
+        </w:trPr>
+        <w:tc>
+          <w:tcPr>
+            <w:tcW w:w="0" w:type="auto"/>
+            <w:tcBorders>
+              <w:top w:val="single" w:sz="4" w:space="0" w:color="1F1F1F"/>
+              <w:left w:val="single" w:sz="4" w:space="0" w:color="1F1F1F"/>
+              <w:bottom w:val="single" w:sz="4" w:space="0" w:color="1F1F1F"/>
+              <w:right w:val="single" w:sz="4" w:space="0" w:color="1F1F1F"/>
+            </w:tcBorders>
+            <w:tcMar>
+              <w:top w:w="240" w:type="dxa"/>
+              <w:left w:w="0" w:type="dxa"/>
+              <w:bottom w:w="240" w:type="dxa"/>
+              <w:right w:w="180" w:type="dxa"/>
+            </w:tcMar>
+            <w:hideMark/>
+          </w:tcPr>
+          <w:p>
+            <w:pPr>
+              <w:pStyle w:val="NormalWeb"/>
+              <w:spacing w:after="260"/>
+              <w:textAlignment w:val="baseline"/>
+              <w:rPr>
+                <w:rFonts w:ascii="Arial" w:hAnsi="Arial" w:cs="Arial"/>
+                <w:color w:val="000000"/>
+                <w:lang w:val="vi-VN"/>
+              </w:rPr>
+            </w:pPr>
+            <w:r>
+              <w:rPr>
+                <w:rFonts w:ascii="Arial" w:hAnsi="Arial" w:cs="Arial"/>
+                <w:b/>
+                <w:bCs/>
+                <w:color w:val="000000"/>
+                <w:lang w:val="vi-VN"/>
+              </w:rPr>
+              <w:lastRenderedPageBreak/>
+              <w:t>TC-12</w:t>
+            </w:r>
+          </w:p>
+        </w:tc>
+        <w:tc>
+          <w:tcPr>
+            <w:tcW w:w="0" w:type="auto"/>
+            <w:tcBorders>
+              <w:top w:val="single" w:sz="4" w:space="0" w:color="1F1F1F"/>
+              <w:left w:val="single" w:sz="4" w:space="0" w:color="1F1F1F"/>
+              <w:bottom w:val="single" w:sz="4" w:space="0" w:color="1F1F1F"/>
+              <w:right w:val="single" w:sz="4" w:space="0" w:color="1F1F1F"/>
+            </w:tcBorders>
+            <w:tcMar>
+              <w:top w:w="240" w:type="dxa"/>
+              <w:left w:w="0" w:type="dxa"/>
+              <w:bottom w:w="240" w:type="dxa"/>
+              <w:right w:w="180" w:type="dxa"/>
+            </w:tcMar>
+            <w:hideMark/>
+          </w:tcPr>
+          <w:p>
+            <w:pPr>
+              <w:pStyle w:val="NormalWeb"/>
+              <w:spacing w:after="260"/>
+              <w:textAlignment w:val="baseline"/>
+              <w:rPr>
+                <w:rFonts w:ascii="Arial" w:hAnsi="Arial" w:cs="Arial"/>
+                <w:color w:val="000000"/>
+                <w:lang w:val="vi-VN"/>
+              </w:rPr>
+            </w:pPr>
+            <w:r>
+              <w:rPr>
+                <w:rFonts w:ascii="Arial" w:hAnsi="Arial" w:cs="Arial"/>
+                <w:color w:val="000000"/>
+                <w:lang w:val="vi-VN"/>
+              </w:rPr>
+              <w:t>Reporting</w:t>
+            </w:r>
+          </w:p>
+        </w:tc>
+        <w:tc>
+          <w:tcPr>
+            <w:tcW w:w="0" w:type="auto"/>
+            <w:tcBorders>
+              <w:top w:val="single" w:sz="4" w:space="0" w:color="1F1F1F"/>
+              <w:left w:val="single" w:sz="4" w:space="0" w:color="1F1F1F"/>
+              <w:bottom w:val="single" w:sz="4" w:space="0" w:color="1F1F1F"/>
+              <w:right w:val="single" w:sz="4" w:space="0" w:color="1F1F1F"/>
+            </w:tcBorders>
+            <w:tcMar>
+              <w:top w:w="240" w:type="dxa"/>
+              <w:left w:w="0" w:type="dxa"/>
+              <w:bottom w:w="240" w:type="dxa"/>
+              <w:right w:w="180" w:type="dxa"/>
+            </w:tcMar>
+            <w:hideMark/>
+          </w:tcPr>
+          <w:p>
+            <w:pPr>
+              <w:pStyle w:val="NormalWeb"/>
+              <w:spacing w:after="260"/>
+              <w:textAlignment w:val="baseline"/>
+              <w:rPr>
+                <w:rFonts w:ascii="Arial" w:hAnsi="Arial" w:cs="Arial"/>
+                <w:color w:val="000000"/>
+                <w:lang w:val="vi-VN"/>
+              </w:rPr>
+            </w:pPr>
+            <w:r>
+              <w:rPr>
+                <w:rFonts w:ascii="Arial" w:hAnsi="Arial" w:cs="Arial"/>
+                <w:color w:val="000000"/>
+                <w:lang w:val="vi-VN"/>
+              </w:rPr>
+              <w:t>1. Select a date range with existing transactions.</w:t>
+            </w:r>
+          </w:p>
+          <w:p>
+            <w:pPr>
+              <w:pStyle w:val="NormalWeb"/>
+              <w:spacing w:after="260"/>
+              <w:textAlignment w:val="baseline"/>
+              <w:rPr>
+                <w:rFonts w:ascii="Arial" w:hAnsi="Arial" w:cs="Arial"/>
+                <w:color w:val="000000"/>
+                <w:lang w:val="vi-VN"/>
+              </w:rPr>
+            </w:pPr>
+          </w:p>
+          <w:p>
+            <w:pPr>
+              <w:pStyle w:val="NormalWeb"/>
+              <w:spacing w:after="260"/>
+              <w:textAlignment w:val="baseline"/>
+              <w:rPr>
+                <w:rFonts w:ascii="Arial" w:hAnsi="Arial" w:cs="Arial"/>
+                <w:color w:val="000000"/>
+                <w:lang w:val="vi-VN"/>
+              </w:rPr>
+            </w:pPr>
+            <w:r>
+              <w:rPr>
+                <w:rFonts w:ascii="Arial" w:hAnsi="Arial" w:cs="Arial"/>
+                <w:color w:val="000000"/>
+                <w:lang w:val="vi-VN"/>
+              </w:rPr>
+              <w:t>2. Generate Report.</w:t>
+            </w:r>
+          </w:p>
+        </w:tc>
+        <w:tc>
+          <w:tcPr>
+            <w:tcW w:w="0" w:type="auto"/>
+            <w:tcBorders>
+              <w:top w:val="single" w:sz="4" w:space="0" w:color="1F1F1F"/>
+              <w:left w:val="single" w:sz="4" w:space="0" w:color="1F1F1F"/>
+              <w:bottom w:val="single" w:sz="4" w:space="0" w:color="1F1F1F"/>
+              <w:right w:val="single" w:sz="4" w:space="0" w:color="1F1F1F"/>
+            </w:tcBorders>
+            <w:tcMar>
+              <w:top w:w="240" w:type="dxa"/>
+              <w:left w:w="0" w:type="dxa"/>
+              <w:bottom w:w="240" w:type="dxa"/>
+              <w:right w:w="180" w:type="dxa"/>
+            </w:tcMar>
+            <w:hideMark/>
+          </w:tcPr>
+          <w:p>
+            <w:pPr>
+              <w:pStyle w:val="NormalWeb"/>
+              <w:spacing w:after="260"/>
+              <w:textAlignment w:val="baseline"/>
+              <w:rPr>
+                <w:rFonts w:ascii="Arial" w:hAnsi="Arial" w:cs="Arial"/>
+                <w:color w:val="000000"/>
+                <w:lang w:val="vi-VN"/>
+              </w:rPr>
+            </w:pPr>
+            <w:r>
+              <w:rPr>
+                <w:rFonts w:ascii="Arial" w:hAnsi="Arial" w:cs="Arial"/>
+                <w:color w:val="000000"/>
+                <w:lang w:val="vi-VN"/>
+              </w:rPr>
+              <w:t>System displays accurate total revenue and charts based on database records.</w:t>
+            </w:r>
+          </w:p>
+        </w:tc>
+        <w:tc>
+          <w:tcPr>
+            <w:tcW w:w="0" w:type="auto"/>
+            <w:tcBorders>
+              <w:top w:val="single" w:sz="4" w:space="0" w:color="1F1F1F"/>
+              <w:left w:val="single" w:sz="4" w:space="0" w:color="1F1F1F"/>
+              <w:bottom w:val="single" w:sz="4" w:space="0" w:color="1F1F1F"/>
+              <w:right w:val="single" w:sz="4" w:space="0" w:color="1F1F1F"/>
+            </w:tcBorders>
+            <w:tcMar>
+              <w:top w:w="240" w:type="dxa"/>
+              <w:left w:w="0" w:type="dxa"/>
+              <w:bottom w:w="240" w:type="dxa"/>
+              <w:right w:w="0" w:type="dxa"/>
+            </w:tcMar>
+            <w:hideMark/>
+          </w:tcPr>
+          <w:p>
+            <w:pPr>
+              <w:pStyle w:val="NormalWeb"/>
+              <w:spacing w:after="260"/>
+              <w:textAlignment w:val="baseline"/>
+              <w:rPr>
+                <w:rFonts w:ascii="Arial" w:hAnsi="Arial" w:cs="Arial"/>
+                <w:color w:val="000000"/>
+                <w:lang w:val="vi-VN"/>
+              </w:rPr>
+            </w:pPr>
+            <w:r>
+              <w:rPr>
+                <w:rFonts w:ascii="Arial" w:hAnsi="Arial" w:cs="Arial"/>
+                <w:color w:val="000000"/>
+                <w:lang w:val="vi-VN"/>
+              </w:rPr>
+              <w:t>Pass</w:t>
+            </w:r>
+          </w:p>
+        </w:tc>
+      </w:tr>
+    </w:tbl>
+    <w:p>
+      <w:pPr>
+        <w:pStyle w:val="NormalWeb"/>
+        <w:spacing w:after="260"/>
+        <w:textAlignment w:val="baseline"/>
+        <w:rPr>
+          <w:rFonts w:ascii="Arial" w:hAnsi="Arial" w:cs="Arial"/>
+          <w:color w:val="000000"/>
+          <w:lang w:val="vi-VN"/>
+        </w:rPr>
+      </w:pPr>
+    </w:p>
+    <w:p>
+      <w:pPr>
+        <w:pStyle w:val="NormalWeb"/>
+        <w:spacing w:after="260"/>
+        <w:textAlignment w:val="baseline"/>
+        <w:rPr>
+          <w:rFonts w:ascii="Arial" w:hAnsi="Arial" w:cs="Arial"/>
+          <w:b/>
+          <w:bCs/>
+          <w:color w:val="000000"/>
+          <w:lang w:val="vi-VN"/>
+        </w:rPr>
+      </w:pPr>
+      <w:r>
+        <w:rPr>
+          <w:rFonts w:ascii="Arial" w:hAnsi="Arial" w:cs="Arial"/>
+          <w:b/>
+          <w:bCs/>
+          <w:color w:val="000000"/>
+          <w:lang w:val="vi-VN"/>
+        </w:rPr>
+        <w:t>6.2. Traceability of test cases to use cases</w:t>
+      </w:r>
+    </w:p>
+    <w:p>
+      <w:pPr>
+        <w:pStyle w:val="NormalWeb"/>
+        <w:textAlignment w:val="baseline"/>
+        <w:rPr>
+          <w:rFonts w:ascii="Arial" w:hAnsi="Arial" w:cs="Arial"/>
+          <w:color w:val="000000"/>
+          <w:lang w:val="vi-VN"/>
+        </w:rPr>
+      </w:pPr>
+      <w:r>
+        <w:rPr>
+          <w:rFonts w:ascii="Arial" w:hAnsi="Arial" w:cs="Arial"/>
+          <w:color w:val="000000"/>
+          <w:lang w:val="vi-VN"/>
+        </w:rPr>
+        <w:t>To ensure comprehensive coverage, test cases are directly mapped to the defined Use Cases:</w:t>
+      </w:r>
+    </w:p>
+    <w:p>
+      <w:pPr>
+        <w:pStyle w:val="NormalWeb"/>
+        <w:numPr>
+          <w:ilvl w:val="0"/>
+          <w:numId w:val="35"/>
+        </w:numPr>
+        <w:spacing w:after="260"/>
+        <w:rPr>
+          <w:rFonts w:ascii="Arial" w:hAnsi="Arial" w:cs="Arial"/>
+          <w:color w:val="000000"/>
+          <w:lang w:val="vi-VN"/>
+        </w:rPr>
+      </w:pPr>
+      <w:r>
+        <w:rPr>
+          <w:rFonts w:ascii="Arial" w:hAnsi="Arial" w:cs="Arial"/>
+          <w:b/>
+          <w:bCs/>
+          <w:color w:val="000000"/>
+          <w:lang w:val="vi-VN"/>
+        </w:rPr>
+        <w:t>UC1 (FR1): Login / Logout → Covered by TC-01, TC-02</w:t>
+      </w:r>
+    </w:p>
+    <w:p>
+      <w:pPr>
+        <w:pStyle w:val="NormalWeb"/>
+        <w:numPr>
+          <w:ilvl w:val="0"/>
+          <w:numId w:val="35"/>
+        </w:numPr>
+        <w:spacing w:after="260"/>
+        <w:rPr>
+          <w:rFonts w:ascii="Arial" w:hAnsi="Arial" w:cs="Arial"/>
+          <w:color w:val="000000"/>
+          <w:lang w:val="vi-VN"/>
+        </w:rPr>
+      </w:pPr>
+      <w:r>
+        <w:rPr>
+          <w:rFonts w:ascii="Arial" w:hAnsi="Arial" w:cs="Arial"/>
+          <w:b/>
+          <w:bCs/>
+          <w:color w:val="000000"/>
+          <w:lang w:val="vi-VN"/>
+        </w:rPr>
+        <w:t>UC2 (FR2): Generate Sales Invoices → Covered by TC-03</w:t>
+      </w:r>
+    </w:p>
+    <w:p>
+      <w:pPr>
+        <w:pStyle w:val="NormalWeb"/>
+        <w:numPr>
+          <w:ilvl w:val="0"/>
+          <w:numId w:val="35"/>
+        </w:numPr>
+        <w:spacing w:after="260"/>
+        <w:rPr>
+          <w:rFonts w:ascii="Arial" w:hAnsi="Arial" w:cs="Arial"/>
+          <w:color w:val="000000"/>
+          <w:lang w:val="vi-VN"/>
+        </w:rPr>
+      </w:pPr>
+      <w:r>
+        <w:rPr>
+          <w:rFonts w:ascii="Arial" w:hAnsi="Arial" w:cs="Arial"/>
+          <w:b/>
+          <w:bCs/>
+          <w:color w:val="000000"/>
+          <w:lang w:val="vi-VN"/>
+        </w:rPr>
+        <w:t>UC3 (FR4): Manage Customers → Covered by TC-06, TC-07</w:t>
+      </w:r>
+    </w:p>
+    <w:p>
+      <w:pPr>
+        <w:pStyle w:val="NormalWeb"/>
+        <w:numPr>
+          <w:ilvl w:val="0"/>
+          <w:numId w:val="35"/>
+        </w:numPr>
+        <w:spacing w:after="260"/>
+        <w:rPr>
+          <w:rFonts w:ascii="Arial" w:hAnsi="Arial" w:cs="Arial"/>
+          <w:color w:val="000000"/>
+          <w:lang w:val="vi-VN"/>
+        </w:rPr>
+      </w:pPr>
+      <w:r>
+        <w:rPr>
+          <w:rFonts w:ascii="Arial" w:hAnsi="Arial" w:cs="Arial"/>
+          <w:b/>
+          <w:bCs/>
+          <w:color w:val="000000"/>
+          <w:lang w:val="vi-VN"/>
+        </w:rPr>
+        <w:t>UC4 (FR5): Manage Employees → Covered by TC-08, TC-09</w:t>
+      </w:r>
+    </w:p>
+    <w:p>
+      <w:pPr>
+        <w:pStyle w:val="NormalWeb"/>
+        <w:numPr>
+          <w:ilvl w:val="0"/>
+          <w:numId w:val="35"/>
+        </w:numPr>
+        <w:spacing w:after="260"/>
+        <w:rPr>
+          <w:rFonts w:ascii="Arial" w:hAnsi="Arial" w:cs="Arial"/>
+          <w:color w:val="000000"/>
+          <w:lang w:val="vi-VN"/>
+        </w:rPr>
+      </w:pPr>
+      <w:r>
+        <w:rPr>
+          <w:rFonts w:ascii="Arial" w:hAnsi="Arial" w:cs="Arial"/>
+          <w:b/>
+          <w:bCs/>
+          <w:color w:val="000000"/>
+          <w:lang w:val="vi-VN"/>
+        </w:rPr>
+        <w:t>UC5 (FR7): View Sales Reports → Covered by TC-12</w:t>
+      </w:r>
+    </w:p>
+    <w:p>
+      <w:pPr>
+        <w:pStyle w:val="NormalWeb"/>
+        <w:numPr>
+          <w:ilvl w:val="0"/>
+          <w:numId w:val="35"/>
+        </w:numPr>
+        <w:spacing w:after="260"/>
+        <w:rPr>
+          <w:rFonts w:ascii="Arial" w:hAnsi="Arial" w:cs="Arial"/>
+          <w:color w:val="000000"/>
+          <w:lang w:val="vi-VN"/>
+        </w:rPr>
+      </w:pPr>
+      <w:r>
+        <w:rPr>
+          <w:rFonts w:ascii="Arial" w:hAnsi="Arial" w:cs="Arial"/>
+          <w:b/>
+          <w:bCs/>
+          <w:color w:val="000000"/>
+          <w:lang w:val="vi-VN"/>
+        </w:rPr>
+        <w:t>UC6 (FR3): Manage Inventory → Covered by TC-10</w:t>
+      </w:r>
+    </w:p>
+    <w:p>
+      <w:pPr>
+        <w:pStyle w:val="NormalWeb"/>
+        <w:numPr>
+          <w:ilvl w:val="0"/>
+          <w:numId w:val="35"/>
+        </w:numPr>
+        <w:spacing w:after="260"/>
+        <w:rPr>
+          <w:rFonts w:ascii="Arial" w:hAnsi="Arial" w:cs="Arial"/>
+          <w:color w:val="000000"/>
+          <w:lang w:val="vi-VN"/>
+        </w:rPr>
+      </w:pPr>
+      <w:r>
+        <w:rPr>
+          <w:rFonts w:ascii="Arial" w:hAnsi="Arial" w:cs="Arial"/>
+          <w:b/>
+          <w:bCs/>
+          <w:color w:val="000000"/>
+          <w:lang w:val="vi-VN"/>
+        </w:rPr>
+        <w:t>UC7 (FR3): Track Hardware Components → Covered by TC-11</w:t>
+      </w:r>
+    </w:p>
+    <w:p>
+      <w:pPr>
+        <w:pStyle w:val="NormalWeb"/>
+        <w:numPr>
+          <w:ilvl w:val="0"/>
+          <w:numId w:val="35"/>
+        </w:numPr>
+        <w:rPr>
+          <w:rFonts w:ascii="Arial" w:hAnsi="Arial" w:cs="Arial"/>
+          <w:color w:val="000000"/>
+          <w:lang w:val="vi-VN"/>
+        </w:rPr>
+      </w:pPr>
+      <w:r>
+        <w:rPr>
+          <w:rFonts w:ascii="Arial" w:hAnsi="Arial" w:cs="Arial"/>
+          <w:b/>
+          <w:bCs/>
+          <w:color w:val="000000"/>
+          <w:lang w:val="vi-VN"/>
+        </w:rPr>
+        <w:t>UC8 (FR6): Update Stock Levels → Covered by TC-04, TC-05</w:t>
+      </w:r>
+    </w:p>
+    <w:p>
+      <w:pPr>
+        <w:pStyle w:val="NormalWeb"/>
+        <w:spacing w:after="260"/>
+        <w:textAlignment w:val="baseline"/>
+        <w:rPr>
+          <w:rFonts w:ascii="Arial" w:hAnsi="Arial" w:cs="Arial"/>
+          <w:color w:val="000000"/>
+          <w:lang w:val="vi-VN"/>
+        </w:rPr>
+      </w:pPr>
+    </w:p>
+    <w:p>
+      <w:pPr>
+        <w:pStyle w:val="NormalWeb"/>
+        <w:spacing w:after="260"/>
+        <w:textAlignment w:val="baseline"/>
+        <w:rPr>
+          <w:rFonts w:ascii="Arial" w:hAnsi="Arial" w:cs="Arial"/>
+          <w:b/>
+          <w:bCs/>
+          <w:color w:val="000000"/>
+          <w:lang w:val="vi-VN"/>
+        </w:rPr>
+      </w:pPr>
+      <w:r>
+        <w:rPr>
+          <w:rFonts w:ascii="Arial" w:hAnsi="Arial" w:cs="Arial"/>
+          <w:b/>
+          <w:bCs/>
+          <w:color w:val="000000"/>
+          <w:lang w:val="vi-VN"/>
+        </w:rPr>
+        <w:t>6.3. Techniques used for test generation</w:t>
+      </w:r>
+    </w:p>
+    <w:p>
+      <w:pPr>
+        <w:pStyle w:val="NormalWeb"/>
+        <w:textAlignment w:val="baseline"/>
+        <w:rPr>
+          <w:rFonts w:ascii="Arial" w:hAnsi="Arial" w:cs="Arial"/>
+          <w:color w:val="000000"/>
+          <w:lang w:val="vi-VN"/>
+        </w:rPr>
+      </w:pPr>
+      <w:r>
+        <w:rPr>
+          <w:rFonts w:ascii="Arial" w:hAnsi="Arial" w:cs="Arial"/>
+          <w:color w:val="000000"/>
+          <w:lang w:val="vi-VN"/>
+        </w:rPr>
+        <w:t>Both Black-box and White-box testing techniques were applied during development:</w:t>
+      </w:r>
+    </w:p>
+    <w:p>
+      <w:pPr>
+        <w:pStyle w:val="NormalWeb"/>
+        <w:numPr>
+          <w:ilvl w:val="0"/>
+          <w:numId w:val="36"/>
+        </w:numPr>
+        <w:spacing w:after="260"/>
+        <w:rPr>
+          <w:rFonts w:ascii="Arial" w:hAnsi="Arial" w:cs="Arial"/>
+          <w:color w:val="000000"/>
+          <w:lang w:val="vi-VN"/>
+        </w:rPr>
+      </w:pPr>
+      <w:r>
+        <w:rPr>
+          <w:rFonts w:ascii="Arial" w:hAnsi="Arial" w:cs="Arial"/>
+          <w:b/>
+          <w:bCs/>
+          <w:color w:val="000000"/>
+          <w:lang w:val="vi-VN"/>
+        </w:rPr>
+        <w:t>Black-Box Testing (System Level):</w:t>
+      </w:r>
+    </w:p>
+    <w:p>
+      <w:pPr>
+        <w:pStyle w:val="NormalWeb"/>
+        <w:numPr>
+          <w:ilvl w:val="1"/>
+          <w:numId w:val="36"/>
+        </w:numPr>
+        <w:spacing w:after="260"/>
+        <w:rPr>
+          <w:rFonts w:ascii="Arial" w:hAnsi="Arial" w:cs="Arial"/>
+          <w:color w:val="000000"/>
+          <w:lang w:val="vi-VN"/>
+        </w:rPr>
+      </w:pPr>
+      <w:r>
+        <w:rPr>
+          <w:rFonts w:ascii="Arial" w:hAnsi="Arial" w:cs="Arial"/>
+          <w:b/>
+          <w:bCs/>
+          <w:color w:val="000000"/>
+          <w:lang w:val="vi-VN"/>
+        </w:rPr>
+        <w:t>Equivalence Partitioning:</w:t>
+      </w:r>
+      <w:r>
+        <w:rPr>
+          <w:rFonts w:ascii="Arial" w:hAnsi="Arial" w:cs="Arial"/>
+          <w:color w:val="000000"/>
+          <w:lang w:val="vi-VN"/>
+        </w:rPr>
+        <w:t xml:space="preserve"> Used to validate input fields (e.g., separating valid phone numbers from invalid strings in Customer Management).</w:t>
+      </w:r>
+    </w:p>
+    <w:p>
+      <w:pPr>
+        <w:pStyle w:val="NormalWeb"/>
+        <w:numPr>
+          <w:ilvl w:val="1"/>
+          <w:numId w:val="36"/>
+        </w:numPr>
+        <w:spacing w:after="260"/>
+        <w:rPr>
+          <w:rFonts w:ascii="Arial" w:hAnsi="Arial" w:cs="Arial"/>
+          <w:color w:val="000000"/>
+          <w:lang w:val="vi-VN"/>
+        </w:rPr>
+      </w:pPr>
+      <w:r>
+        <w:rPr>
+          <w:rFonts w:ascii="Arial" w:hAnsi="Arial" w:cs="Arial"/>
+          <w:b/>
+          <w:bCs/>
+          <w:color w:val="000000"/>
+          <w:lang w:val="vi-VN"/>
+        </w:rPr>
+        <w:t>Boundary Value Analysis:</w:t>
+      </w:r>
+      <w:r>
+        <w:rPr>
+          <w:rFonts w:ascii="Arial" w:hAnsi="Arial" w:cs="Arial"/>
+          <w:color w:val="000000"/>
+          <w:lang w:val="vi-VN"/>
+        </w:rPr>
+        <w:t xml:space="preserve"> Applied to stock quantities (e.g., testing behaviors when buying exactly the maximum available stock vs. max stock + 1).</w:t>
+      </w:r>
+    </w:p>
+    <w:p>
+      <w:pPr>
+        <w:pStyle w:val="NormalWeb"/>
+        <w:numPr>
+          <w:ilvl w:val="0"/>
+          <w:numId w:val="36"/>
+        </w:numPr>
+        <w:spacing w:after="260"/>
+        <w:rPr>
+          <w:rFonts w:ascii="Arial" w:hAnsi="Arial" w:cs="Arial"/>
+          <w:color w:val="000000"/>
+          <w:lang w:val="vi-VN"/>
+        </w:rPr>
+      </w:pPr>
+      <w:r>
+        <w:rPr>
+          <w:rFonts w:ascii="Arial" w:hAnsi="Arial" w:cs="Arial"/>
+          <w:b/>
+          <w:bCs/>
+          <w:color w:val="000000"/>
+          <w:lang w:val="vi-VN"/>
+        </w:rPr>
+        <w:t>White-Box Testing (Unit Level):</w:t>
+      </w:r>
+    </w:p>
+    <w:p>
+      <w:pPr>
+        <w:pStyle w:val="NormalWeb"/>
+        <w:numPr>
+          <w:ilvl w:val="1"/>
+          <w:numId w:val="36"/>
+        </w:numPr>
+        <w:rPr>
+          <w:rFonts w:ascii="Arial" w:hAnsi="Arial" w:cs="Arial"/>
+          <w:color w:val="000000"/>
+          <w:lang w:val="vi-VN"/>
+        </w:rPr>
+      </w:pPr>
+      <w:r>
+        <w:rPr>
+          <w:rFonts w:ascii="Arial" w:hAnsi="Arial" w:cs="Arial"/>
+          <w:b/>
+          <w:bCs/>
+          <w:color w:val="000000"/>
+          <w:lang w:val="vi-VN"/>
+        </w:rPr>
+        <w:t>Statement &amp; Branch Coverage:</w:t>
+      </w:r>
+      <w:r>
+        <w:rPr>
+          <w:rFonts w:ascii="Arial" w:hAnsi="Arial" w:cs="Arial"/>
+          <w:color w:val="000000"/>
+          <w:lang w:val="vi-VN"/>
+        </w:rPr>
+        <w:t xml:space="preserve"> MSTest framework in Visual Studio was used to write Unit Tests specifically targeting the logic inside SalesController.calculateFinalTotal() and AccountController.authenticate().</w:t>
+      </w:r>
+    </w:p>
+    <w:p>
+      <w:pPr>
+        <w:pStyle w:val="NormalWeb"/>
+        <w:spacing w:after="260"/>
+        <w:textAlignment w:val="baseline"/>
+        <w:rPr>
+          <w:rFonts w:ascii="Arial" w:hAnsi="Arial" w:cs="Arial"/>
+          <w:b/>
+          <w:bCs/>
+          <w:color w:val="000000"/>
+          <w:lang w:val="vi-VN"/>
+        </w:rPr>
+      </w:pPr>
+      <w:r>
+        <w:rPr>
+          <w:rFonts w:ascii="Arial" w:hAnsi="Arial" w:cs="Arial"/>
+          <w:b/>
+          <w:bCs/>
+          <w:color w:val="000000"/>
+          <w:lang w:val="vi-VN"/>
+        </w:rPr>
+        <w:t>6.4. Assessment of the goodness of your testsuite</w:t>
+      </w:r>
+    </w:p>
+    <w:p>
+      <w:pPr>
+        <w:pStyle w:val="NormalWeb"/>
+        <w:textAlignment w:val="baseline"/>
+        <w:rPr>
+          <w:rFonts w:ascii="Arial" w:hAnsi="Arial" w:cs="Arial"/>
+          <w:color w:val="000000"/>
+          <w:lang w:val="vi-VN"/>
+        </w:rPr>
+      </w:pPr>
+      <w:r>
+        <w:rPr>
+          <w:rFonts w:ascii="Arial" w:hAnsi="Arial" w:cs="Arial"/>
+          <w:color w:val="000000"/>
+          <w:lang w:val="vi-VN"/>
+        </w:rPr>
+        <w:lastRenderedPageBreak/>
+        <w:t>The effectiveness of the test suite was evaluated using the following metrics:</w:t>
+      </w:r>
+    </w:p>
+    <w:p>
+      <w:pPr>
+        <w:pStyle w:val="NormalWeb"/>
+        <w:numPr>
+          <w:ilvl w:val="0"/>
+          <w:numId w:val="37"/>
+        </w:numPr>
+        <w:spacing w:after="260"/>
+        <w:rPr>
+          <w:rFonts w:ascii="Arial" w:hAnsi="Arial" w:cs="Arial"/>
+          <w:color w:val="000000"/>
+          <w:lang w:val="vi-VN"/>
+        </w:rPr>
+      </w:pPr>
+      <w:r>
+        <w:rPr>
+          <w:rFonts w:ascii="Arial" w:hAnsi="Arial" w:cs="Arial"/>
+          <w:b/>
+          <w:bCs/>
+          <w:color w:val="000000"/>
+          <w:lang w:val="vi-VN"/>
+        </w:rPr>
+        <w:t>Requirements Coverage:</w:t>
+      </w:r>
+      <w:r>
+        <w:rPr>
+          <w:rFonts w:ascii="Arial" w:hAnsi="Arial" w:cs="Arial"/>
+          <w:color w:val="000000"/>
+          <w:lang w:val="vi-VN"/>
+        </w:rPr>
+        <w:t xml:space="preserve"> 100% of the Functional Requirements (FR1-FR7) have at least one associated test case.</w:t>
+      </w:r>
+    </w:p>
+    <w:p>
+      <w:pPr>
+        <w:pStyle w:val="NormalWeb"/>
+        <w:numPr>
+          <w:ilvl w:val="0"/>
+          <w:numId w:val="37"/>
+        </w:numPr>
+        <w:spacing w:after="260"/>
+        <w:rPr>
+          <w:rFonts w:ascii="Arial" w:hAnsi="Arial" w:cs="Arial"/>
+          <w:color w:val="000000"/>
+          <w:lang w:val="vi-VN"/>
+        </w:rPr>
+      </w:pPr>
+      <w:r>
+        <w:rPr>
+          <w:rFonts w:ascii="Arial" w:hAnsi="Arial" w:cs="Arial"/>
+          <w:b/>
+          <w:bCs/>
+          <w:color w:val="000000"/>
+          <w:lang w:val="vi-VN"/>
+        </w:rPr>
+        <w:t>Test Pass Rate:</w:t>
+      </w:r>
+      <w:r>
+        <w:rPr>
+          <w:rFonts w:ascii="Arial" w:hAnsi="Arial" w:cs="Arial"/>
+          <w:color w:val="000000"/>
+          <w:lang w:val="vi-VN"/>
+        </w:rPr>
+        <w:t xml:space="preserve"> 95% (Calculated as [Passed Tests / Total Executed Tests] * 100). Minor UI bugs were logged for future fixes, but core functionalities passed.</w:t>
+      </w:r>
+    </w:p>
+    <w:p>
+      <w:pPr>
+        <w:pStyle w:val="NormalWeb"/>
+        <w:numPr>
+          <w:ilvl w:val="0"/>
+          <w:numId w:val="37"/>
+        </w:numPr>
+        <w:rPr>
+          <w:rFonts w:ascii="Arial" w:hAnsi="Arial" w:cs="Arial"/>
+          <w:color w:val="000000"/>
+          <w:lang w:val="vi-VN"/>
+        </w:rPr>
+      </w:pPr>
+      <w:r>
+        <w:rPr>
+          <w:rFonts w:ascii="Arial" w:hAnsi="Arial" w:cs="Arial"/>
+          <w:b/>
+          <w:bCs/>
+          <w:color w:val="000000"/>
+          <w:lang w:val="vi-VN"/>
+        </w:rPr>
+        <w:t>Defect Density:</w:t>
+      </w:r>
+      <w:r>
+        <w:rPr>
+          <w:rFonts w:ascii="Arial" w:hAnsi="Arial" w:cs="Arial"/>
+          <w:color w:val="000000"/>
+          <w:lang w:val="vi-VN"/>
+        </w:rPr>
+        <w:t xml:space="preserve"> Kept below acceptable thresholds, with 0 critical bugs detected in the Database transaction modules (Model layer).</w:t>
+      </w:r>
+    </w:p>
+    <w:p>
+      <w:pPr>
+        <w:pStyle w:val="NormalWeb"/>
+        <w:spacing w:before="0" w:beforeAutospacing="0" w:after="260" w:afterAutospacing="0"/>
+        <w:textAlignment w:val="baseline"/>
+        <w:rPr>
+          <w:rFonts w:ascii="Arial" w:hAnsi="Arial" w:cs="Arial"/>
+          <w:color w:val="000000"/>
+        </w:rPr>
+      </w:pPr>
+    </w:p>
     <w:sectPr>
       <w:pgSz w:w="12240" w:h="15840"/>
       <w:pgMar w:top="1440" w:right="1440" w:bottom="1440" w:left="1440" w:header="720" w:footer="720" w:gutter="0"/>
@@ -6036,7 +9581,7 @@
 </file>
 
 <file path=word/numbering.xml><?xml version="1.0" encoding="utf-8"?>
-<w:numbering xmlns:wpc="http://schemas.microsoft.com/office/word/2010/wordprocessingCanvas" xmlns:cx="http://schemas.microsoft.com/office/drawing/2014/chartex" xmlns:cx1="http://schemas.microsoft.com/office/drawing/2015/9/8/chartex" xmlns:cx2="http://schemas.microsoft.com/office/drawing/2015/10/21/chartex" xmlns:cx3="http://schemas.microsoft.com/office/drawing/2016/5/9/chartex" xmlns:cx4="http://schemas.microsoft.com/office/drawing/2016/5/10/chartex" xmlns:cx5="http://schemas.microsoft.com/office/drawing/2016/5/11/chartex" xmlns:cx6="http://schemas.microsoft.com/office/drawing/2016/5/12/chartex" xmlns:cx7="http://schemas.microsoft.com/office/drawing/2016/5/13/chartex" xmlns:cx8="http://schemas.microsoft.com/office/drawing/2016/5/14/chartex" xmlns:mc="http://schemas.openxmlformats.org/markup-compatibility/2006" xmlns:aink="http://schemas.microsoft.com/office/drawing/2016/ink" xmlns:am3d="http://schemas.microsoft.com/office/drawing/2017/model3d" xmlns:o="urn:schemas-microsoft-com:office:office" xmlns:oel="http://schemas.microsoft.com/office/2019/extlst" xmlns:r="http://schemas.openxmlformats.org/officeDocument/2006/relationships" xmlns:m="http://schemas.openxmlformats.org/officeDocument/2006/math" xmlns:v="urn:schemas-microsoft-com:vml" xmlns:wp14="http://schemas.microsoft.com/office/word/2010/wordprocessingDrawing" xmlns:wp="http://schemas.openxmlformats.org/drawingml/2006/wordprocessingDrawing" xmlns:w10="urn:schemas-microsoft-com:office:word" xmlns:w="http://schemas.openxmlformats.org/wordprocessingml/2006/main" xmlns:w14="http://schemas.microsoft.com/office/word/2010/wordml" xmlns:w15="http://schemas.microsoft.com/office/word/2012/wordml" xmlns:w16cex="http://schemas.microsoft.com/office/word/2018/wordml/cex" xmlns:w16cid="http://schemas.microsoft.com/office/word/2016/wordml/cid" xmlns:w16="http://schemas.microsoft.com/office/word/2018/wordml" xmlns:w16du="http://schemas.microsoft.com/office/word/2023/wordml/word16du" xmlns:w16sdtdh="http://schemas.microsoft.com/office/word/2020/wordml/sdtdatahash" xmlns:w16se="http://schemas.microsoft.com/office/word/2015/wordml/symex" xmlns:wpg="http://schemas.microsoft.com/office/word/2010/wordprocessingGroup" xmlns:wpi="http://schemas.microsoft.com/office/word/2010/wordprocessingInk" xmlns:wne="http://schemas.microsoft.com/office/word/2006/wordml" xmlns:wps="http://schemas.microsoft.com/office/word/2010/wordprocessingShape" mc:Ignorable="w14 w15 w16se w16cid w16 w16cex w16sdtdh wp14">
+<w:numbering xmlns:wpc="http://schemas.microsoft.com/office/word/2010/wordprocessingCanvas" xmlns:cx="http://schemas.microsoft.com/office/drawing/2014/chartex" xmlns:cx1="http://schemas.microsoft.com/office/drawing/2015/9/8/chartex" xmlns:cx2="http://schemas.microsoft.com/office/drawing/2015/10/21/chartex" xmlns:cx3="http://schemas.microsoft.com/office/drawing/2016/5/9/chartex" xmlns:cx4="http://schemas.microsoft.com/office/drawing/2016/5/10/chartex" xmlns:cx5="http://schemas.microsoft.com/office/drawing/2016/5/11/chartex" xmlns:cx6="http://schemas.microsoft.com/office/drawing/2016/5/12/chartex" xmlns:cx7="http://schemas.microsoft.com/office/drawing/2016/5/13/chartex" xmlns:cx8="http://schemas.microsoft.com/office/drawing/2016/5/14/chartex" xmlns:mc="http://schemas.openxmlformats.org/markup-compatibility/2006" xmlns:aink="http://schemas.microsoft.com/office/drawing/2016/ink" xmlns:am3d="http://schemas.microsoft.com/office/drawing/2017/model3d" xmlns:o="urn:schemas-microsoft-com:office:office" xmlns:oel="http://schemas.microsoft.com/office/2019/extlst" xmlns:r="http://schemas.openxmlformats.org/officeDocument/2006/relationships" xmlns:m="http://schemas.openxmlformats.org/officeDocument/2006/math" xmlns:v="urn:schemas-microsoft-com:vml" xmlns:wp14="http://schemas.microsoft.com/office/word/2010/wordprocessingDrawing" xmlns:wp="http://schemas.openxmlformats.org/drawingml/2006/wordprocessingDrawing" xmlns:w10="urn:schemas-microsoft-com:office:word" xmlns:w="http://schemas.openxmlformats.org/wordprocessingml/2006/main" xmlns:w14="http://schemas.microsoft.com/office/word/2010/wordml" xmlns:w15="http://schemas.microsoft.com/office/word/2012/wordml" xmlns:w16cex="http://schemas.microsoft.com/office/word/2018/wordml/cex" xmlns:w16cid="http://schemas.microsoft.com/office/word/2016/wordml/cid" xmlns:w16="http://schemas.microsoft.com/office/word/2018/wordml" xmlns:w16du="http://schemas.microsoft.com/office/word/2023/wordml/word16du" xmlns:w16sdtdh="http://schemas.microsoft.com/office/word/2020/wordml/sdtdatahash" xmlns:w16sdtfl="http://schemas.microsoft.com/office/word/2024/wordml/sdtformatlock" xmlns:w16se="http://schemas.microsoft.com/office/word/2015/wordml/symex" xmlns:wpg="http://schemas.microsoft.com/office/word/2010/wordprocessingGroup" xmlns:wpi="http://schemas.microsoft.com/office/word/2010/wordprocessingInk" xmlns:wne="http://schemas.microsoft.com/office/word/2006/wordml" xmlns:wps="http://schemas.microsoft.com/office/word/2010/wordprocessingShape" mc:Ignorable="w14 w15 w16se w16cid w16 w16cex w16sdtdh w16sdtfl w16du wp14">
   <w:abstractNum w:abstractNumId="0" w15:restartNumberingAfterBreak="0">
     <w:nsid w:val="01BC4726"/>
     <w:multiLevelType w:val="multilevel"/>
@@ -6336,6 +9881,155 @@
     </w:lvl>
   </w:abstractNum>
   <w:abstractNum w:abstractNumId="2" w15:restartNumberingAfterBreak="0">
+    <w:nsid w:val="0F555492"/>
+    <w:multiLevelType w:val="multilevel"/>
+    <w:tmpl w:val="75327FFC"/>
+    <w:lvl w:ilvl="0">
+      <w:start w:val="1"/>
+      <w:numFmt w:val="bullet"/>
+      <w:lvlText w:val=""/>
+      <w:lvlJc w:val="left"/>
+      <w:pPr>
+        <w:tabs>
+          <w:tab w:val="num" w:pos="720"/>
+        </w:tabs>
+        <w:ind w:left="720" w:hanging="360"/>
+      </w:pPr>
+      <w:rPr>
+        <w:rFonts w:ascii="Symbol" w:hAnsi="Symbol" w:hint="default"/>
+        <w:sz w:val="20"/>
+      </w:rPr>
+    </w:lvl>
+    <w:lvl w:ilvl="1" w:tentative="1">
+      <w:start w:val="1"/>
+      <w:numFmt w:val="bullet"/>
+      <w:lvlText w:val="o"/>
+      <w:lvlJc w:val="left"/>
+      <w:pPr>
+        <w:tabs>
+          <w:tab w:val="num" w:pos="1440"/>
+        </w:tabs>
+        <w:ind w:left="1440" w:hanging="360"/>
+      </w:pPr>
+      <w:rPr>
+        <w:rFonts w:ascii="Courier New" w:hAnsi="Courier New" w:hint="default"/>
+        <w:sz w:val="20"/>
+      </w:rPr>
+    </w:lvl>
+    <w:lvl w:ilvl="2" w:tentative="1">
+      <w:start w:val="1"/>
+      <w:numFmt w:val="bullet"/>
+      <w:lvlText w:val=""/>
+      <w:lvlJc w:val="left"/>
+      <w:pPr>
+        <w:tabs>
+          <w:tab w:val="num" w:pos="2160"/>
+        </w:tabs>
+        <w:ind w:left="2160" w:hanging="360"/>
+      </w:pPr>
+      <w:rPr>
+        <w:rFonts w:ascii="Wingdings" w:hAnsi="Wingdings" w:hint="default"/>
+        <w:sz w:val="20"/>
+      </w:rPr>
+    </w:lvl>
+    <w:lvl w:ilvl="3" w:tentative="1">
+      <w:start w:val="1"/>
+      <w:numFmt w:val="bullet"/>
+      <w:lvlText w:val=""/>
+      <w:lvlJc w:val="left"/>
+      <w:pPr>
+        <w:tabs>
+          <w:tab w:val="num" w:pos="2880"/>
+        </w:tabs>
+        <w:ind w:left="2880" w:hanging="360"/>
+      </w:pPr>
+      <w:rPr>
+        <w:rFonts w:ascii="Wingdings" w:hAnsi="Wingdings" w:hint="default"/>
+        <w:sz w:val="20"/>
+      </w:rPr>
+    </w:lvl>
+    <w:lvl w:ilvl="4" w:tentative="1">
+      <w:start w:val="1"/>
+      <w:numFmt w:val="bullet"/>
+      <w:lvlText w:val=""/>
+      <w:lvlJc w:val="left"/>
+      <w:pPr>
+        <w:tabs>
+          <w:tab w:val="num" w:pos="3600"/>
+        </w:tabs>
+        <w:ind w:left="3600" w:hanging="360"/>
+      </w:pPr>
+      <w:rPr>
+        <w:rFonts w:ascii="Wingdings" w:hAnsi="Wingdings" w:hint="default"/>
+        <w:sz w:val="20"/>
+      </w:rPr>
+    </w:lvl>
+    <w:lvl w:ilvl="5" w:tentative="1">
+      <w:start w:val="1"/>
+      <w:numFmt w:val="bullet"/>
+      <w:lvlText w:val=""/>
+      <w:lvlJc w:val="left"/>
+      <w:pPr>
+        <w:tabs>
+          <w:tab w:val="num" w:pos="4320"/>
+        </w:tabs>
+        <w:ind w:left="4320" w:hanging="360"/>
+      </w:pPr>
+      <w:rPr>
+        <w:rFonts w:ascii="Wingdings" w:hAnsi="Wingdings" w:hint="default"/>
+        <w:sz w:val="20"/>
+      </w:rPr>
+    </w:lvl>
+    <w:lvl w:ilvl="6" w:tentative="1">
+      <w:start w:val="1"/>
+      <w:numFmt w:val="bullet"/>
+      <w:lvlText w:val=""/>
+      <w:lvlJc w:val="left"/>
+      <w:pPr>
+        <w:tabs>
+          <w:tab w:val="num" w:pos="5040"/>
+        </w:tabs>
+        <w:ind w:left="5040" w:hanging="360"/>
+      </w:pPr>
+      <w:rPr>
+        <w:rFonts w:ascii="Wingdings" w:hAnsi="Wingdings" w:hint="default"/>
+        <w:sz w:val="20"/>
+      </w:rPr>
+    </w:lvl>
+    <w:lvl w:ilvl="7" w:tentative="1">
+      <w:start w:val="1"/>
+      <w:numFmt w:val="bullet"/>
+      <w:lvlText w:val=""/>
+      <w:lvlJc w:val="left"/>
+      <w:pPr>
+        <w:tabs>
+          <w:tab w:val="num" w:pos="5760"/>
+        </w:tabs>
+        <w:ind w:left="5760" w:hanging="360"/>
+      </w:pPr>
+      <w:rPr>
+        <w:rFonts w:ascii="Wingdings" w:hAnsi="Wingdings" w:hint="default"/>
+        <w:sz w:val="20"/>
+      </w:rPr>
+    </w:lvl>
+    <w:lvl w:ilvl="8" w:tentative="1">
+      <w:start w:val="1"/>
+      <w:numFmt w:val="bullet"/>
+      <w:lvlText w:val=""/>
+      <w:lvlJc w:val="left"/>
+      <w:pPr>
+        <w:tabs>
+          <w:tab w:val="num" w:pos="6480"/>
+        </w:tabs>
+        <w:ind w:left="6480" w:hanging="360"/>
+      </w:pPr>
+      <w:rPr>
+        <w:rFonts w:ascii="Wingdings" w:hAnsi="Wingdings" w:hint="default"/>
+        <w:sz w:val="20"/>
+      </w:rPr>
+    </w:lvl>
+  </w:abstractNum>
+  <w:abstractNum w:abstractNumId="3" w15:restartNumberingAfterBreak="0">
     <w:nsid w:val="121611FE"/>
     <w:multiLevelType w:val="multilevel"/>
     <w:tmpl w:val="C6540CAA"/>
@@ -6484,7 +10178,7 @@
       </w:rPr>
     </w:lvl>
   </w:abstractNum>
-  <w:abstractNum w:abstractNumId="3" w15:restartNumberingAfterBreak="0">
+  <w:abstractNum w:abstractNumId="4" w15:restartNumberingAfterBreak="0">
     <w:nsid w:val="1C400CA2"/>
     <w:multiLevelType w:val="multilevel"/>
     <w:tmpl w:val="9C80864E"/>
@@ -6633,7 +10327,7 @@
       </w:rPr>
     </w:lvl>
   </w:abstractNum>
-  <w:abstractNum w:abstractNumId="4" w15:restartNumberingAfterBreak="0">
+  <w:abstractNum w:abstractNumId="5" w15:restartNumberingAfterBreak="0">
     <w:nsid w:val="1CA80269"/>
     <w:multiLevelType w:val="multilevel"/>
     <w:tmpl w:val="5D8093CE"/>
@@ -6782,7 +10476,7 @@
       </w:rPr>
     </w:lvl>
   </w:abstractNum>
-  <w:abstractNum w:abstractNumId="5" w15:restartNumberingAfterBreak="0">
+  <w:abstractNum w:abstractNumId="6" w15:restartNumberingAfterBreak="0">
     <w:nsid w:val="1ECF1909"/>
     <w:multiLevelType w:val="multilevel"/>
     <w:tmpl w:val="2864CFAC"/>
@@ -6931,7 +10625,7 @@
       </w:rPr>
     </w:lvl>
   </w:abstractNum>
-  <w:abstractNum w:abstractNumId="6" w15:restartNumberingAfterBreak="0">
+  <w:abstractNum w:abstractNumId="7" w15:restartNumberingAfterBreak="0">
     <w:nsid w:val="1F9B279A"/>
     <w:multiLevelType w:val="multilevel"/>
     <w:tmpl w:val="E7BA563A"/>
@@ -7076,7 +10770,7 @@
       </w:rPr>
     </w:lvl>
   </w:abstractNum>
-  <w:abstractNum w:abstractNumId="7" w15:restartNumberingAfterBreak="0">
+  <w:abstractNum w:abstractNumId="8" w15:restartNumberingAfterBreak="0">
     <w:nsid w:val="1FB802D9"/>
     <w:multiLevelType w:val="multilevel"/>
     <w:tmpl w:val="CE320488"/>
@@ -7221,7 +10915,7 @@
       </w:rPr>
     </w:lvl>
   </w:abstractNum>
-  <w:abstractNum w:abstractNumId="8" w15:restartNumberingAfterBreak="0">
+  <w:abstractNum w:abstractNumId="9" w15:restartNumberingAfterBreak="0">
     <w:nsid w:val="2169608C"/>
     <w:multiLevelType w:val="multilevel"/>
     <w:tmpl w:val="4042AFB4"/>
@@ -7370,7 +11064,7 @@
       </w:rPr>
     </w:lvl>
   </w:abstractNum>
-  <w:abstractNum w:abstractNumId="9" w15:restartNumberingAfterBreak="0">
+  <w:abstractNum w:abstractNumId="10" w15:restartNumberingAfterBreak="0">
     <w:nsid w:val="24B9155C"/>
     <w:multiLevelType w:val="multilevel"/>
     <w:tmpl w:val="625257AC"/>
@@ -7519,7 +11213,7 @@
       </w:rPr>
     </w:lvl>
   </w:abstractNum>
-  <w:abstractNum w:abstractNumId="10" w15:restartNumberingAfterBreak="0">
+  <w:abstractNum w:abstractNumId="11" w15:restartNumberingAfterBreak="0">
     <w:nsid w:val="26425C9D"/>
     <w:multiLevelType w:val="multilevel"/>
     <w:tmpl w:val="83DADCBA"/>
@@ -7664,7 +11358,7 @@
       </w:rPr>
     </w:lvl>
   </w:abstractNum>
-  <w:abstractNum w:abstractNumId="11" w15:restartNumberingAfterBreak="0">
+  <w:abstractNum w:abstractNumId="12" w15:restartNumberingAfterBreak="0">
     <w:nsid w:val="2A7035AC"/>
     <w:multiLevelType w:val="multilevel"/>
     <w:tmpl w:val="AB821B04"/>
@@ -7813,7 +11507,7 @@
       </w:rPr>
     </w:lvl>
   </w:abstractNum>
-  <w:abstractNum w:abstractNumId="12" w15:restartNumberingAfterBreak="0">
+  <w:abstractNum w:abstractNumId="13" w15:restartNumberingAfterBreak="0">
     <w:nsid w:val="2CA03F71"/>
     <w:multiLevelType w:val="multilevel"/>
     <w:tmpl w:val="24320C24"/>
@@ -7962,7 +11656,7 @@
       </w:rPr>
     </w:lvl>
   </w:abstractNum>
-  <w:abstractNum w:abstractNumId="13" w15:restartNumberingAfterBreak="0">
+  <w:abstractNum w:abstractNumId="14" w15:restartNumberingAfterBreak="0">
     <w:nsid w:val="2CAF7FF3"/>
     <w:multiLevelType w:val="multilevel"/>
     <w:tmpl w:val="CBAC44B2"/>
@@ -8111,7 +11805,7 @@
       </w:rPr>
     </w:lvl>
   </w:abstractNum>
-  <w:abstractNum w:abstractNumId="14" w15:restartNumberingAfterBreak="0">
+  <w:abstractNum w:abstractNumId="15" w15:restartNumberingAfterBreak="0">
     <w:nsid w:val="2FE07389"/>
     <w:multiLevelType w:val="multilevel"/>
     <w:tmpl w:val="37A2D4D8"/>
@@ -8260,7 +11954,7 @@
       </w:rPr>
     </w:lvl>
   </w:abstractNum>
-  <w:abstractNum w:abstractNumId="15" w15:restartNumberingAfterBreak="0">
+  <w:abstractNum w:abstractNumId="16" w15:restartNumberingAfterBreak="0">
     <w:nsid w:val="306F5E8B"/>
     <w:multiLevelType w:val="multilevel"/>
     <w:tmpl w:val="772C5982"/>
@@ -8405,7 +12099,7 @@
       </w:rPr>
     </w:lvl>
   </w:abstractNum>
-  <w:abstractNum w:abstractNumId="16" w15:restartNumberingAfterBreak="0">
+  <w:abstractNum w:abstractNumId="17" w15:restartNumberingAfterBreak="0">
     <w:nsid w:val="39053FD9"/>
     <w:multiLevelType w:val="multilevel"/>
     <w:tmpl w:val="591C071C"/>
@@ -8554,7 +12248,7 @@
       </w:rPr>
     </w:lvl>
   </w:abstractNum>
-  <w:abstractNum w:abstractNumId="17" w15:restartNumberingAfterBreak="0">
+  <w:abstractNum w:abstractNumId="18" w15:restartNumberingAfterBreak="0">
     <w:nsid w:val="3F222A3D"/>
     <w:multiLevelType w:val="multilevel"/>
     <w:tmpl w:val="486A91DA"/>
@@ -8703,7 +12397,156 @@
       </w:rPr>
     </w:lvl>
   </w:abstractNum>
-  <w:abstractNum w:abstractNumId="18" w15:restartNumberingAfterBreak="0">
+  <w:abstractNum w:abstractNumId="19" w15:restartNumberingAfterBreak="0">
+    <w:nsid w:val="43A60C17"/>
+    <w:multiLevelType w:val="multilevel"/>
+    <w:tmpl w:val="02E6A696"/>
+    <w:lvl w:ilvl="0">
+      <w:start w:val="1"/>
+      <w:numFmt w:val="bullet"/>
+      <w:lvlText w:val=""/>
+      <w:lvlJc w:val="left"/>
+      <w:pPr>
+        <w:tabs>
+          <w:tab w:val="num" w:pos="720"/>
+        </w:tabs>
+        <w:ind w:left="720" w:hanging="360"/>
+      </w:pPr>
+      <w:rPr>
+        <w:rFonts w:ascii="Symbol" w:hAnsi="Symbol" w:hint="default"/>
+        <w:sz w:val="20"/>
+      </w:rPr>
+    </w:lvl>
+    <w:lvl w:ilvl="1" w:tentative="1">
+      <w:start w:val="1"/>
+      <w:numFmt w:val="bullet"/>
+      <w:lvlText w:val="o"/>
+      <w:lvlJc w:val="left"/>
+      <w:pPr>
+        <w:tabs>
+          <w:tab w:val="num" w:pos="1440"/>
+        </w:tabs>
+        <w:ind w:left="1440" w:hanging="360"/>
+      </w:pPr>
+      <w:rPr>
+        <w:rFonts w:ascii="Courier New" w:hAnsi="Courier New" w:hint="default"/>
+        <w:sz w:val="20"/>
+      </w:rPr>
+    </w:lvl>
+    <w:lvl w:ilvl="2" w:tentative="1">
+      <w:start w:val="1"/>
+      <w:numFmt w:val="bullet"/>
+      <w:lvlText w:val=""/>
+      <w:lvlJc w:val="left"/>
+      <w:pPr>
+        <w:tabs>
+          <w:tab w:val="num" w:pos="2160"/>
+        </w:tabs>
+        <w:ind w:left="2160" w:hanging="360"/>
+      </w:pPr>
+      <w:rPr>
+        <w:rFonts w:ascii="Wingdings" w:hAnsi="Wingdings" w:hint="default"/>
+        <w:sz w:val="20"/>
+      </w:rPr>
+    </w:lvl>
+    <w:lvl w:ilvl="3" w:tentative="1">
+      <w:start w:val="1"/>
+      <w:numFmt w:val="bullet"/>
+      <w:lvlText w:val=""/>
+      <w:lvlJc w:val="left"/>
+      <w:pPr>
+        <w:tabs>
+          <w:tab w:val="num" w:pos="2880"/>
+        </w:tabs>
+        <w:ind w:left="2880" w:hanging="360"/>
+      </w:pPr>
+      <w:rPr>
+        <w:rFonts w:ascii="Wingdings" w:hAnsi="Wingdings" w:hint="default"/>
+        <w:sz w:val="20"/>
+      </w:rPr>
+    </w:lvl>
+    <w:lvl w:ilvl="4" w:tentative="1">
+      <w:start w:val="1"/>
+      <w:numFmt w:val="bullet"/>
+      <w:lvlText w:val=""/>
+      <w:lvlJc w:val="left"/>
+      <w:pPr>
+        <w:tabs>
+          <w:tab w:val="num" w:pos="3600"/>
+        </w:tabs>
+        <w:ind w:left="3600" w:hanging="360"/>
+      </w:pPr>
+      <w:rPr>
+        <w:rFonts w:ascii="Wingdings" w:hAnsi="Wingdings" w:hint="default"/>
+        <w:sz w:val="20"/>
+      </w:rPr>
+    </w:lvl>
+    <w:lvl w:ilvl="5" w:tentative="1">
+      <w:start w:val="1"/>
+      <w:numFmt w:val="bullet"/>
+      <w:lvlText w:val=""/>
+      <w:lvlJc w:val="left"/>
+      <w:pPr>
+        <w:tabs>
+          <w:tab w:val="num" w:pos="4320"/>
+        </w:tabs>
+        <w:ind w:left="4320" w:hanging="360"/>
+      </w:pPr>
+      <w:rPr>
+        <w:rFonts w:ascii="Wingdings" w:hAnsi="Wingdings" w:hint="default"/>
+        <w:sz w:val="20"/>
+      </w:rPr>
+    </w:lvl>
+    <w:lvl w:ilvl="6" w:tentative="1">
+      <w:start w:val="1"/>
+      <w:numFmt w:val="bullet"/>
+      <w:lvlText w:val=""/>
+      <w:lvlJc w:val="left"/>
+      <w:pPr>
+        <w:tabs>
+          <w:tab w:val="num" w:pos="5040"/>
+        </w:tabs>
+        <w:ind w:left="5040" w:hanging="360"/>
+      </w:pPr>
+      <w:rPr>
+        <w:rFonts w:ascii="Wingdings" w:hAnsi="Wingdings" w:hint="default"/>
+        <w:sz w:val="20"/>
+      </w:rPr>
+    </w:lvl>
+    <w:lvl w:ilvl="7" w:tentative="1">
+      <w:start w:val="1"/>
+      <w:numFmt w:val="bullet"/>
+      <w:lvlText w:val=""/>
+      <w:lvlJc w:val="left"/>
+      <w:pPr>
+        <w:tabs>
+          <w:tab w:val="num" w:pos="5760"/>
+        </w:tabs>
+        <w:ind w:left="5760" w:hanging="360"/>
+      </w:pPr>
+      <w:rPr>
+        <w:rFonts w:ascii="Wingdings" w:hAnsi="Wingdings" w:hint="default"/>
+        <w:sz w:val="20"/>
+      </w:rPr>
+    </w:lvl>
+    <w:lvl w:ilvl="8" w:tentative="1">
+      <w:start w:val="1"/>
+      <w:numFmt w:val="bullet"/>
+      <w:lvlText w:val=""/>
+      <w:lvlJc w:val="left"/>
+      <w:pPr>
+        <w:tabs>
+          <w:tab w:val="num" w:pos="6480"/>
+        </w:tabs>
+        <w:ind w:left="6480" w:hanging="360"/>
+      </w:pPr>
+      <w:rPr>
+        <w:rFonts w:ascii="Wingdings" w:hAnsi="Wingdings" w:hint="default"/>
+        <w:sz w:val="20"/>
+      </w:rPr>
+    </w:lvl>
+  </w:abstractNum>
+  <w:abstractNum w:abstractNumId="20" w15:restartNumberingAfterBreak="0">
     <w:nsid w:val="44E71089"/>
     <w:multiLevelType w:val="multilevel"/>
     <w:tmpl w:val="F4BC59B4"/>
@@ -8852,7 +12695,7 @@
       </w:rPr>
     </w:lvl>
   </w:abstractNum>
-  <w:abstractNum w:abstractNumId="19" w15:restartNumberingAfterBreak="0">
+  <w:abstractNum w:abstractNumId="21" w15:restartNumberingAfterBreak="0">
     <w:nsid w:val="455D3B44"/>
     <w:multiLevelType w:val="multilevel"/>
     <w:tmpl w:val="A2948046"/>
@@ -9001,7 +12844,7 @@
       </w:rPr>
     </w:lvl>
   </w:abstractNum>
-  <w:abstractNum w:abstractNumId="20" w15:restartNumberingAfterBreak="0">
+  <w:abstractNum w:abstractNumId="22" w15:restartNumberingAfterBreak="0">
     <w:nsid w:val="4F652183"/>
     <w:multiLevelType w:val="multilevel"/>
     <w:tmpl w:val="BC827CFA"/>
@@ -9150,7 +12993,7 @@
       </w:rPr>
     </w:lvl>
   </w:abstractNum>
-  <w:abstractNum w:abstractNumId="21" w15:restartNumberingAfterBreak="0">
+  <w:abstractNum w:abstractNumId="23" w15:restartNumberingAfterBreak="0">
     <w:nsid w:val="52112CEC"/>
     <w:multiLevelType w:val="multilevel"/>
     <w:tmpl w:val="4BDCC2A8"/>
@@ -9299,7 +13142,7 @@
       </w:rPr>
     </w:lvl>
   </w:abstractNum>
-  <w:abstractNum w:abstractNumId="22" w15:restartNumberingAfterBreak="0">
+  <w:abstractNum w:abstractNumId="24" w15:restartNumberingAfterBreak="0">
     <w:nsid w:val="52D7406C"/>
     <w:multiLevelType w:val="multilevel"/>
     <w:tmpl w:val="4BDCC2A8"/>
@@ -9448,7 +13291,7 @@
       </w:rPr>
     </w:lvl>
   </w:abstractNum>
-  <w:abstractNum w:abstractNumId="23" w15:restartNumberingAfterBreak="0">
+  <w:abstractNum w:abstractNumId="25" w15:restartNumberingAfterBreak="0">
     <w:nsid w:val="57DF4F51"/>
     <w:multiLevelType w:val="multilevel"/>
     <w:tmpl w:val="44E8CCF8"/>
@@ -9593,7 +13436,7 @@
       </w:rPr>
     </w:lvl>
   </w:abstractNum>
-  <w:abstractNum w:abstractNumId="24" w15:restartNumberingAfterBreak="0">
+  <w:abstractNum w:abstractNumId="26" w15:restartNumberingAfterBreak="0">
     <w:nsid w:val="59387BDC"/>
     <w:multiLevelType w:val="multilevel"/>
     <w:tmpl w:val="FD647D40"/>
@@ -9742,7 +13585,7 @@
       </w:rPr>
     </w:lvl>
   </w:abstractNum>
-  <w:abstractNum w:abstractNumId="25" w15:restartNumberingAfterBreak="0">
+  <w:abstractNum w:abstractNumId="27" w15:restartNumberingAfterBreak="0">
     <w:nsid w:val="596827DA"/>
     <w:multiLevelType w:val="multilevel"/>
     <w:tmpl w:val="22626E4C"/>
@@ -9887,7 +13730,7 @@
       </w:rPr>
     </w:lvl>
   </w:abstractNum>
-  <w:abstractNum w:abstractNumId="26" w15:restartNumberingAfterBreak="0">
+  <w:abstractNum w:abstractNumId="28" w15:restartNumberingAfterBreak="0">
     <w:nsid w:val="5A3155E4"/>
     <w:multiLevelType w:val="multilevel"/>
     <w:tmpl w:val="A7EA3098"/>
@@ -10032,7 +13875,7 @@
       </w:rPr>
     </w:lvl>
   </w:abstractNum>
-  <w:abstractNum w:abstractNumId="27" w15:restartNumberingAfterBreak="0">
+  <w:abstractNum w:abstractNumId="29" w15:restartNumberingAfterBreak="0">
     <w:nsid w:val="5AEF4332"/>
     <w:multiLevelType w:val="multilevel"/>
     <w:tmpl w:val="319690FE"/>
@@ -10181,7 +14024,7 @@
       </w:rPr>
     </w:lvl>
   </w:abstractNum>
-  <w:abstractNum w:abstractNumId="28" w15:restartNumberingAfterBreak="0">
+  <w:abstractNum w:abstractNumId="30" w15:restartNumberingAfterBreak="0">
     <w:nsid w:val="5D03164B"/>
     <w:multiLevelType w:val="multilevel"/>
     <w:tmpl w:val="FA8C8E6C"/>
@@ -10330,7 +14173,7 @@
       </w:rPr>
     </w:lvl>
   </w:abstractNum>
-  <w:abstractNum w:abstractNumId="29" w15:restartNumberingAfterBreak="0">
+  <w:abstractNum w:abstractNumId="31" w15:restartNumberingAfterBreak="0">
     <w:nsid w:val="659C4B51"/>
     <w:multiLevelType w:val="multilevel"/>
     <w:tmpl w:val="39D87F7A"/>
@@ -10479,7 +14322,7 @@
       </w:rPr>
     </w:lvl>
   </w:abstractNum>
-  <w:abstractNum w:abstractNumId="30" w15:restartNumberingAfterBreak="0">
+  <w:abstractNum w:abstractNumId="32" w15:restartNumberingAfterBreak="0">
     <w:nsid w:val="6AE80BF0"/>
     <w:multiLevelType w:val="multilevel"/>
     <w:tmpl w:val="7138ED50"/>
@@ -10628,7 +14471,7 @@
       </w:rPr>
     </w:lvl>
   </w:abstractNum>
-  <w:abstractNum w:abstractNumId="31" w15:restartNumberingAfterBreak="0">
+  <w:abstractNum w:abstractNumId="33" w15:restartNumberingAfterBreak="0">
     <w:nsid w:val="6B4B59D2"/>
     <w:multiLevelType w:val="multilevel"/>
     <w:tmpl w:val="0BB0C054"/>
@@ -10777,7 +14620,7 @@
       </w:rPr>
     </w:lvl>
   </w:abstractNum>
-  <w:abstractNum w:abstractNumId="32" w15:restartNumberingAfterBreak="0">
+  <w:abstractNum w:abstractNumId="34" w15:restartNumberingAfterBreak="0">
     <w:nsid w:val="6B672276"/>
     <w:multiLevelType w:val="multilevel"/>
     <w:tmpl w:val="98208C9A"/>
@@ -10926,7 +14769,7 @@
       </w:rPr>
     </w:lvl>
   </w:abstractNum>
-  <w:abstractNum w:abstractNumId="33" w15:restartNumberingAfterBreak="0">
+  <w:abstractNum w:abstractNumId="35" w15:restartNumberingAfterBreak="0">
     <w:nsid w:val="72C961FD"/>
     <w:multiLevelType w:val="multilevel"/>
     <w:tmpl w:val="EF00655A"/>
@@ -11071,113 +14914,271 @@
       </w:rPr>
     </w:lvl>
   </w:abstractNum>
+  <w:abstractNum w:abstractNumId="36" w15:restartNumberingAfterBreak="0">
+    <w:nsid w:val="78CB632A"/>
+    <w:multiLevelType w:val="multilevel"/>
+    <w:tmpl w:val="2BF6E7A8"/>
+    <w:lvl w:ilvl="0">
+      <w:start w:val="1"/>
+      <w:numFmt w:val="bullet"/>
+      <w:lvlText w:val=""/>
+      <w:lvlJc w:val="left"/>
+      <w:pPr>
+        <w:tabs>
+          <w:tab w:val="num" w:pos="720"/>
+        </w:tabs>
+        <w:ind w:left="720" w:hanging="360"/>
+      </w:pPr>
+      <w:rPr>
+        <w:rFonts w:ascii="Symbol" w:hAnsi="Symbol" w:hint="default"/>
+        <w:sz w:val="20"/>
+      </w:rPr>
+    </w:lvl>
+    <w:lvl w:ilvl="1">
+      <w:start w:val="1"/>
+      <w:numFmt w:val="bullet"/>
+      <w:lvlText w:val="o"/>
+      <w:lvlJc w:val="left"/>
+      <w:pPr>
+        <w:tabs>
+          <w:tab w:val="num" w:pos="1440"/>
+        </w:tabs>
+        <w:ind w:left="1440" w:hanging="360"/>
+      </w:pPr>
+      <w:rPr>
+        <w:rFonts w:ascii="Courier New" w:hAnsi="Courier New" w:hint="default"/>
+        <w:sz w:val="20"/>
+      </w:rPr>
+    </w:lvl>
+    <w:lvl w:ilvl="2" w:tentative="1">
+      <w:start w:val="1"/>
+      <w:numFmt w:val="bullet"/>
+      <w:lvlText w:val=""/>
+      <w:lvlJc w:val="left"/>
+      <w:pPr>
+        <w:tabs>
+          <w:tab w:val="num" w:pos="2160"/>
+        </w:tabs>
+        <w:ind w:left="2160" w:hanging="360"/>
+      </w:pPr>
+      <w:rPr>
+        <w:rFonts w:ascii="Wingdings" w:hAnsi="Wingdings" w:hint="default"/>
+        <w:sz w:val="20"/>
+      </w:rPr>
+    </w:lvl>
+    <w:lvl w:ilvl="3" w:tentative="1">
+      <w:start w:val="1"/>
+      <w:numFmt w:val="bullet"/>
+      <w:lvlText w:val=""/>
+      <w:lvlJc w:val="left"/>
+      <w:pPr>
+        <w:tabs>
+          <w:tab w:val="num" w:pos="2880"/>
+        </w:tabs>
+        <w:ind w:left="2880" w:hanging="360"/>
+      </w:pPr>
+      <w:rPr>
+        <w:rFonts w:ascii="Wingdings" w:hAnsi="Wingdings" w:hint="default"/>
+        <w:sz w:val="20"/>
+      </w:rPr>
+    </w:lvl>
+    <w:lvl w:ilvl="4" w:tentative="1">
+      <w:start w:val="1"/>
+      <w:numFmt w:val="bullet"/>
+      <w:lvlText w:val=""/>
+      <w:lvlJc w:val="left"/>
+      <w:pPr>
+        <w:tabs>
+          <w:tab w:val="num" w:pos="3600"/>
+        </w:tabs>
+        <w:ind w:left="3600" w:hanging="360"/>
+      </w:pPr>
+      <w:rPr>
+        <w:rFonts w:ascii="Wingdings" w:hAnsi="Wingdings" w:hint="default"/>
+        <w:sz w:val="20"/>
+      </w:rPr>
+    </w:lvl>
+    <w:lvl w:ilvl="5" w:tentative="1">
+      <w:start w:val="1"/>
+      <w:numFmt w:val="bullet"/>
+      <w:lvlText w:val=""/>
+      <w:lvlJc w:val="left"/>
+      <w:pPr>
+        <w:tabs>
+          <w:tab w:val="num" w:pos="4320"/>
+        </w:tabs>
+        <w:ind w:left="4320" w:hanging="360"/>
+      </w:pPr>
+      <w:rPr>
+        <w:rFonts w:ascii="Wingdings" w:hAnsi="Wingdings" w:hint="default"/>
+        <w:sz w:val="20"/>
+      </w:rPr>
+    </w:lvl>
+    <w:lvl w:ilvl="6" w:tentative="1">
+      <w:start w:val="1"/>
+      <w:numFmt w:val="bullet"/>
+      <w:lvlText w:val=""/>
+      <w:lvlJc w:val="left"/>
+      <w:pPr>
+        <w:tabs>
+          <w:tab w:val="num" w:pos="5040"/>
+        </w:tabs>
+        <w:ind w:left="5040" w:hanging="360"/>
+      </w:pPr>
+      <w:rPr>
+        <w:rFonts w:ascii="Wingdings" w:hAnsi="Wingdings" w:hint="default"/>
+        <w:sz w:val="20"/>
+      </w:rPr>
+    </w:lvl>
+    <w:lvl w:ilvl="7" w:tentative="1">
+      <w:start w:val="1"/>
+      <w:numFmt w:val="bullet"/>
+      <w:lvlText w:val=""/>
+      <w:lvlJc w:val="left"/>
+      <w:pPr>
+        <w:tabs>
+          <w:tab w:val="num" w:pos="5760"/>
+        </w:tabs>
+        <w:ind w:left="5760" w:hanging="360"/>
+      </w:pPr>
+      <w:rPr>
+        <w:rFonts w:ascii="Wingdings" w:hAnsi="Wingdings" w:hint="default"/>
+        <w:sz w:val="20"/>
+      </w:rPr>
+    </w:lvl>
+    <w:lvl w:ilvl="8" w:tentative="1">
+      <w:start w:val="1"/>
+      <w:numFmt w:val="bullet"/>
+      <w:lvlText w:val=""/>
+      <w:lvlJc w:val="left"/>
+      <w:pPr>
+        <w:tabs>
+          <w:tab w:val="num" w:pos="6480"/>
+        </w:tabs>
+        <w:ind w:left="6480" w:hanging="360"/>
+      </w:pPr>
+      <w:rPr>
+        <w:rFonts w:ascii="Wingdings" w:hAnsi="Wingdings" w:hint="default"/>
+        <w:sz w:val="20"/>
+      </w:rPr>
+    </w:lvl>
+  </w:abstractNum>
   <w:num w:numId="1" w16cid:durableId="1588222300">
-    <w:abstractNumId w:val="18"/>
+    <w:abstractNumId w:val="20"/>
   </w:num>
   <w:num w:numId="2" w16cid:durableId="2089687452">
-    <w:abstractNumId w:val="27"/>
+    <w:abstractNumId w:val="29"/>
   </w:num>
   <w:num w:numId="3" w16cid:durableId="397703464">
-    <w:abstractNumId w:val="16"/>
+    <w:abstractNumId w:val="17"/>
   </w:num>
   <w:num w:numId="4" w16cid:durableId="280382709">
-    <w:abstractNumId w:val="20"/>
+    <w:abstractNumId w:val="22"/>
   </w:num>
   <w:num w:numId="5" w16cid:durableId="1527674285">
-    <w:abstractNumId w:val="11"/>
+    <w:abstractNumId w:val="12"/>
   </w:num>
   <w:num w:numId="6" w16cid:durableId="123810299">
-    <w:abstractNumId w:val="31"/>
+    <w:abstractNumId w:val="33"/>
   </w:num>
   <w:num w:numId="7" w16cid:durableId="2090272123">
-    <w:abstractNumId w:val="14"/>
+    <w:abstractNumId w:val="15"/>
   </w:num>
   <w:num w:numId="8" w16cid:durableId="439878419">
-    <w:abstractNumId w:val="28"/>
+    <w:abstractNumId w:val="30"/>
   </w:num>
   <w:num w:numId="9" w16cid:durableId="1099985614">
-    <w:abstractNumId w:val="5"/>
+    <w:abstractNumId w:val="6"/>
   </w:num>
   <w:num w:numId="10" w16cid:durableId="1796945683">
-    <w:abstractNumId w:val="9"/>
+    <w:abstractNumId w:val="10"/>
   </w:num>
   <w:num w:numId="11" w16cid:durableId="94329195">
     <w:abstractNumId w:val="0"/>
   </w:num>
   <w:num w:numId="12" w16cid:durableId="543949881">
+    <w:abstractNumId w:val="8"/>
+  </w:num>
+  <w:num w:numId="13" w16cid:durableId="686368319">
+    <w:abstractNumId w:val="11"/>
+  </w:num>
+  <w:num w:numId="14" w16cid:durableId="1670987982">
+    <w:abstractNumId w:val="35"/>
+  </w:num>
+  <w:num w:numId="15" w16cid:durableId="1381202660">
+    <w:abstractNumId w:val="28"/>
+  </w:num>
+  <w:num w:numId="16" w16cid:durableId="2020303109">
+    <w:abstractNumId w:val="25"/>
+  </w:num>
+  <w:num w:numId="17" w16cid:durableId="1607694605">
+    <w:abstractNumId w:val="27"/>
+  </w:num>
+  <w:num w:numId="18" w16cid:durableId="655645792">
+    <w:abstractNumId w:val="16"/>
+  </w:num>
+  <w:num w:numId="19" w16cid:durableId="1130517311">
     <w:abstractNumId w:val="7"/>
   </w:num>
-  <w:num w:numId="13" w16cid:durableId="686368319">
-    <w:abstractNumId w:val="10"/>
-  </w:num>
-  <w:num w:numId="14" w16cid:durableId="1670987982">
-    <w:abstractNumId w:val="33"/>
-  </w:num>
-  <w:num w:numId="15" w16cid:durableId="1381202660">
+  <w:num w:numId="20" w16cid:durableId="1141506554">
     <w:abstractNumId w:val="26"/>
   </w:num>
-  <w:num w:numId="16" w16cid:durableId="2020303109">
-    <w:abstractNumId w:val="23"/>
-  </w:num>
-  <w:num w:numId="17" w16cid:durableId="1607694605">
-    <w:abstractNumId w:val="25"/>
-  </w:num>
-  <w:num w:numId="18" w16cid:durableId="655645792">
-    <w:abstractNumId w:val="15"/>
-  </w:num>
-  <w:num w:numId="19" w16cid:durableId="1130517311">
-    <w:abstractNumId w:val="6"/>
-  </w:num>
-  <w:num w:numId="20" w16cid:durableId="1141506554">
-    <w:abstractNumId w:val="24"/>
-  </w:num>
   <w:num w:numId="21" w16cid:durableId="424542347">
-    <w:abstractNumId w:val="2"/>
+    <w:abstractNumId w:val="3"/>
   </w:num>
   <w:num w:numId="22" w16cid:durableId="19356756">
-    <w:abstractNumId w:val="29"/>
+    <w:abstractNumId w:val="31"/>
   </w:num>
   <w:num w:numId="23" w16cid:durableId="2058040637">
-    <w:abstractNumId w:val="17"/>
+    <w:abstractNumId w:val="18"/>
   </w:num>
   <w:num w:numId="24" w16cid:durableId="527259456">
-    <w:abstractNumId w:val="12"/>
+    <w:abstractNumId w:val="13"/>
   </w:num>
   <w:num w:numId="25" w16cid:durableId="1264418365">
-    <w:abstractNumId w:val="8"/>
+    <w:abstractNumId w:val="9"/>
   </w:num>
   <w:num w:numId="26" w16cid:durableId="771558162">
-    <w:abstractNumId w:val="19"/>
+    <w:abstractNumId w:val="21"/>
   </w:num>
   <w:num w:numId="27" w16cid:durableId="1715151768">
     <w:abstractNumId w:val="1"/>
   </w:num>
   <w:num w:numId="28" w16cid:durableId="729614964">
-    <w:abstractNumId w:val="13"/>
+    <w:abstractNumId w:val="14"/>
   </w:num>
   <w:num w:numId="29" w16cid:durableId="685013139">
+    <w:abstractNumId w:val="34"/>
+  </w:num>
+  <w:num w:numId="30" w16cid:durableId="1393232898">
+    <w:abstractNumId w:val="4"/>
+  </w:num>
+  <w:num w:numId="31" w16cid:durableId="1459882097">
     <w:abstractNumId w:val="32"/>
   </w:num>
-  <w:num w:numId="30" w16cid:durableId="1393232898">
-    <w:abstractNumId w:val="3"/>
-  </w:num>
-  <w:num w:numId="31" w16cid:durableId="1459882097">
-    <w:abstractNumId w:val="30"/>
-  </w:num>
   <w:num w:numId="32" w16cid:durableId="23755228">
-    <w:abstractNumId w:val="4"/>
+    <w:abstractNumId w:val="5"/>
   </w:num>
   <w:num w:numId="33" w16cid:durableId="1374387751">
-    <w:abstractNumId w:val="21"/>
+    <w:abstractNumId w:val="23"/>
   </w:num>
   <w:num w:numId="34" w16cid:durableId="679818156">
-    <w:abstractNumId w:val="22"/>
+    <w:abstractNumId w:val="24"/>
+  </w:num>
+  <w:num w:numId="35" w16cid:durableId="1108507639">
+    <w:abstractNumId w:val="2"/>
+  </w:num>
+  <w:num w:numId="36" w16cid:durableId="1412388233">
+    <w:abstractNumId w:val="36"/>
+  </w:num>
+  <w:num w:numId="37" w16cid:durableId="516578219">
+    <w:abstractNumId w:val="19"/>
   </w:num>
 </w:numbering>
 </file>
 
 <file path=word/styles.xml><?xml version="1.0" encoding="utf-8"?>
-<w:styles xmlns:mc="http://schemas.openxmlformats.org/markup-compatibility/2006" xmlns:r="http://schemas.openxmlformats.org/officeDocument/2006/relationships" xmlns:w="http://schemas.openxmlformats.org/wordprocessingml/2006/main" xmlns:w14="http://schemas.microsoft.com/office/word/2010/wordml" xmlns:w15="http://schemas.microsoft.com/office/word/2012/wordml" xmlns:w16cex="http://schemas.microsoft.com/office/word/2018/wordml/cex" xmlns:w16cid="http://schemas.microsoft.com/office/word/2016/wordml/cid" xmlns:w16="http://schemas.microsoft.com/office/word/2018/wordml" xmlns:w16sdtdh="http://schemas.microsoft.com/office/word/2020/wordml/sdtdatahash" xmlns:w16se="http://schemas.microsoft.com/office/word/2015/wordml/symex" mc:Ignorable="w14 w15 w16se w16cid w16 w16cex w16sdtdh">
+<w:styles xmlns:mc="http://schemas.openxmlformats.org/markup-compatibility/2006" xmlns:r="http://schemas.openxmlformats.org/officeDocument/2006/relationships" xmlns:w="http://schemas.openxmlformats.org/wordprocessingml/2006/main" xmlns:w14="http://schemas.microsoft.com/office/word/2010/wordml" xmlns:w15="http://schemas.microsoft.com/office/word/2012/wordml" xmlns:w16cex="http://schemas.microsoft.com/office/word/2018/wordml/cex" xmlns:w16cid="http://schemas.microsoft.com/office/word/2016/wordml/cid" xmlns:w16="http://schemas.microsoft.com/office/word/2018/wordml" xmlns:w16du="http://schemas.microsoft.com/office/word/2023/wordml/word16du" xmlns:w16sdtdh="http://schemas.microsoft.com/office/word/2020/wordml/sdtdatahash" xmlns:w16sdtfl="http://schemas.microsoft.com/office/word/2024/wordml/sdtformatlock" xmlns:w16se="http://schemas.microsoft.com/office/word/2015/wordml/symex" mc:Ignorable="w14 w15 w16se w16cid w16 w16cex w16sdtdh w16sdtfl w16du">
   <w:docDefaults>
     <w:rPrDefault>
       <w:rPr>
@@ -11778,7 +15779,6 @@
   <w:style w:type="character" w:default="1" w:styleId="DefaultParagraphFont">
     <w:name w:val="Default Paragraph Font"/>
     <w:uiPriority w:val="1"/>
-    <w:semiHidden/>
     <w:unhideWhenUsed/>
   </w:style>
   <w:style w:type="table" w:default="1" w:styleId="TableNormal">

</xml_diff>

<commit_message>
Add ComputerShopDB.sql in Database folder. reports: Add initial draft for Test Plan.
</commit_message>
<xml_diff>
--- a/reports/report.docx
+++ b/reports/report.docx
@@ -1,6 +1,6 @@
 
 <file path=word/document.xml><?xml version="1.0" encoding="utf-8"?>
-<w:document xmlns:wpc="http://schemas.microsoft.com/office/word/2010/wordprocessingCanvas" xmlns:cx="http://schemas.microsoft.com/office/drawing/2014/chartex" xmlns:cx1="http://schemas.microsoft.com/office/drawing/2015/9/8/chartex" xmlns:cx2="http://schemas.microsoft.com/office/drawing/2015/10/21/chartex" xmlns:cx3="http://schemas.microsoft.com/office/drawing/2016/5/9/chartex" xmlns:cx4="http://schemas.microsoft.com/office/drawing/2016/5/10/chartex" xmlns:cx5="http://schemas.microsoft.com/office/drawing/2016/5/11/chartex" xmlns:cx6="http://schemas.microsoft.com/office/drawing/2016/5/12/chartex" xmlns:cx7="http://schemas.microsoft.com/office/drawing/2016/5/13/chartex" xmlns:cx8="http://schemas.microsoft.com/office/drawing/2016/5/14/chartex" xmlns:mc="http://schemas.openxmlformats.org/markup-compatibility/2006" xmlns:aink="http://schemas.microsoft.com/office/drawing/2016/ink" xmlns:am3d="http://schemas.microsoft.com/office/drawing/2017/model3d" xmlns:o="urn:schemas-microsoft-com:office:office" xmlns:oel="http://schemas.microsoft.com/office/2019/extlst" xmlns:r="http://schemas.openxmlformats.org/officeDocument/2006/relationships" xmlns:m="http://schemas.openxmlformats.org/officeDocument/2006/math" xmlns:v="urn:schemas-microsoft-com:vml" xmlns:wp14="http://schemas.microsoft.com/office/word/2010/wordprocessingDrawing" xmlns:wp="http://schemas.openxmlformats.org/drawingml/2006/wordprocessingDrawing" xmlns:w10="urn:schemas-microsoft-com:office:word" xmlns:w="http://schemas.openxmlformats.org/wordprocessingml/2006/main" xmlns:w14="http://schemas.microsoft.com/office/word/2010/wordml" xmlns:w15="http://schemas.microsoft.com/office/word/2012/wordml" xmlns:w16cex="http://schemas.microsoft.com/office/word/2018/wordml/cex" xmlns:w16cid="http://schemas.microsoft.com/office/word/2016/wordml/cid" xmlns:w16="http://schemas.microsoft.com/office/word/2018/wordml" xmlns:w16du="http://schemas.microsoft.com/office/word/2023/wordml/word16du" xmlns:w16sdtdh="http://schemas.microsoft.com/office/word/2020/wordml/sdtdatahash" xmlns:w16se="http://schemas.microsoft.com/office/word/2015/wordml/symex" xmlns:wpg="http://schemas.microsoft.com/office/word/2010/wordprocessingGroup" xmlns:wpi="http://schemas.microsoft.com/office/word/2010/wordprocessingInk" xmlns:wne="http://schemas.microsoft.com/office/word/2006/wordml" xmlns:wps="http://schemas.microsoft.com/office/word/2010/wordprocessingShape" mc:Ignorable="w14 w15 w16se w16cid w16 w16cex w16sdtdh wp14">
+<w:document xmlns:wpc="http://schemas.microsoft.com/office/word/2010/wordprocessingCanvas" xmlns:cx="http://schemas.microsoft.com/office/drawing/2014/chartex" xmlns:cx1="http://schemas.microsoft.com/office/drawing/2015/9/8/chartex" xmlns:cx2="http://schemas.microsoft.com/office/drawing/2015/10/21/chartex" xmlns:cx3="http://schemas.microsoft.com/office/drawing/2016/5/9/chartex" xmlns:cx4="http://schemas.microsoft.com/office/drawing/2016/5/10/chartex" xmlns:cx5="http://schemas.microsoft.com/office/drawing/2016/5/11/chartex" xmlns:cx6="http://schemas.microsoft.com/office/drawing/2016/5/12/chartex" xmlns:cx7="http://schemas.microsoft.com/office/drawing/2016/5/13/chartex" xmlns:cx8="http://schemas.microsoft.com/office/drawing/2016/5/14/chartex" xmlns:mc="http://schemas.openxmlformats.org/markup-compatibility/2006" xmlns:aink="http://schemas.microsoft.com/office/drawing/2016/ink" xmlns:am3d="http://schemas.microsoft.com/office/drawing/2017/model3d" xmlns:o="urn:schemas-microsoft-com:office:office" xmlns:oel="http://schemas.microsoft.com/office/2019/extlst" xmlns:r="http://schemas.openxmlformats.org/officeDocument/2006/relationships" xmlns:m="http://schemas.openxmlformats.org/officeDocument/2006/math" xmlns:v="urn:schemas-microsoft-com:vml" xmlns:wp14="http://schemas.microsoft.com/office/word/2010/wordprocessingDrawing" xmlns:wp="http://schemas.openxmlformats.org/drawingml/2006/wordprocessingDrawing" xmlns:w10="urn:schemas-microsoft-com:office:word" xmlns:w="http://schemas.openxmlformats.org/wordprocessingml/2006/main" xmlns:w14="http://schemas.microsoft.com/office/word/2010/wordml" xmlns:w15="http://schemas.microsoft.com/office/word/2012/wordml" xmlns:w16cex="http://schemas.microsoft.com/office/word/2018/wordml/cex" xmlns:w16cid="http://schemas.microsoft.com/office/word/2016/wordml/cid" xmlns:w16="http://schemas.microsoft.com/office/word/2018/wordml" xmlns:w16du="http://schemas.microsoft.com/office/word/2023/wordml/word16du" xmlns:w16sdtdh="http://schemas.microsoft.com/office/word/2020/wordml/sdtdatahash" xmlns:w16sdtfl="http://schemas.microsoft.com/office/word/2024/wordml/sdtformatlock" xmlns:w16se="http://schemas.microsoft.com/office/word/2015/wordml/symex" xmlns:wpg="http://schemas.microsoft.com/office/word/2010/wordprocessingGroup" xmlns:wpi="http://schemas.microsoft.com/office/word/2010/wordprocessingInk" xmlns:wne="http://schemas.microsoft.com/office/word/2006/wordml" xmlns:wps="http://schemas.microsoft.com/office/word/2010/wordprocessingShape" mc:Ignorable="w14 w15 w16se w16cid w16 w16cex w16sdtdh w16sdtfl w16du wp14">
   <w:body>
     <w:p>
       <w:pPr>
@@ -4927,20 +4927,21 @@
         <w:rPr>
           <w:rFonts w:ascii="Arial" w:hAnsi="Arial" w:cs="Arial"/>
           <w:color w:val="000000"/>
-        </w:rPr>
-      </w:pPr>
-      <w:r>
-        <w:rPr>
-          <w:rFonts w:ascii="Arial" w:hAnsi="Arial" w:cs="Arial"/>
-          <w:noProof/>
-          <w:color w:val="000000"/>
+          <w:lang w:val="vi-VN"/>
+        </w:rPr>
+      </w:pPr>
+      <w:r>
+        <w:rPr>
+          <w:rFonts w:ascii="Arial" w:hAnsi="Arial" w:cs="Arial"/>
+          <w:color w:val="000000"/>
+          <w:lang w:val="vi-VN"/>
         </w:rPr>
         <w:lastRenderedPageBreak/>
         <w:drawing>
-          <wp:inline distT="0" distB="0" distL="0" distR="0" wp14:anchorId="574C44FC" wp14:editId="1AD39230">
-            <wp:extent cx="5250873" cy="3204217"/>
-            <wp:effectExtent l="0" t="0" r="6985" b="0"/>
-            <wp:docPr id="1922184554" name="Picture 1"/>
+          <wp:inline distT="0" distB="0" distL="0" distR="0" wp14:anchorId="3214FA56" wp14:editId="0C708B25">
+            <wp:extent cx="5467350" cy="3372701"/>
+            <wp:effectExtent l="0" t="0" r="0" b="0"/>
+            <wp:docPr id="1344633976" name="Picture 2"/>
             <wp:cNvGraphicFramePr>
               <a:graphicFrameLocks xmlns:a="http://schemas.openxmlformats.org/drawingml/2006/main" noChangeAspect="1"/>
             </wp:cNvGraphicFramePr>
@@ -4948,7 +4949,7 @@
               <a:graphicData uri="http://schemas.openxmlformats.org/drawingml/2006/picture">
                 <pic:pic xmlns:pic="http://schemas.openxmlformats.org/drawingml/2006/picture">
                   <pic:nvPicPr>
-                    <pic:cNvPr id="0" name="Picture 1"/>
+                    <pic:cNvPr id="0" name="Picture 6"/>
                     <pic:cNvPicPr>
                       <a:picLocks noChangeAspect="1" noChangeArrowheads="1"/>
                     </pic:cNvPicPr>
@@ -4969,7 +4970,7 @@
                   <pic:spPr bwMode="auto">
                     <a:xfrm>
                       <a:off x="0" y="0"/>
-                      <a:ext cx="5256892" cy="3207890"/>
+                      <a:ext cx="5481681" cy="3381542"/>
                     </a:xfrm>
                     <a:prstGeom prst="rect">
                       <a:avLst/>
@@ -4988,6 +4989,18 @@
     </w:p>
     <w:p>
       <w:pPr>
+        <w:pStyle w:val="NormalWeb"/>
+        <w:spacing w:before="0" w:beforeAutospacing="0" w:after="260" w:afterAutospacing="0"/>
+        <w:ind w:left="720"/>
+        <w:textAlignment w:val="baseline"/>
+        <w:rPr>
+          <w:rFonts w:ascii="Arial" w:hAnsi="Arial" w:cs="Arial"/>
+          <w:color w:val="000000"/>
+        </w:rPr>
+      </w:pPr>
+    </w:p>
+    <w:p>
+      <w:pPr>
         <w:pStyle w:val="Heading3"/>
         <w:spacing w:before="0"/>
         <w:rPr>
@@ -5346,6 +5359,7 @@
           <w:bCs/>
           <w:color w:val="000000"/>
         </w:rPr>
+        <w:lastRenderedPageBreak/>
         <w:t>Views:</w:t>
       </w:r>
     </w:p>
@@ -5368,7 +5382,6 @@
           <w:rFonts w:ascii="Arial" w:hAnsi="Arial" w:cs="Arial"/>
           <w:color w:val="000000"/>
         </w:rPr>
-        <w:lastRenderedPageBreak/>
         <w:t>The View layer consists of Windows Forms (frmLogin, frmSales, frmInventory, frmReports) that capture user input and display data retrieved from the Controllers.</w:t>
       </w:r>
     </w:p>
@@ -6025,6 +6038,3774 @@
         <w:t>.</w:t>
       </w:r>
     </w:p>
+    <w:p>
+      <w:pPr>
+        <w:pStyle w:val="NormalWeb"/>
+        <w:spacing w:before="0" w:after="260"/>
+        <w:textAlignment w:val="baseline"/>
+        <w:rPr>
+          <w:rFonts w:ascii="Arial" w:hAnsi="Arial" w:cs="Arial"/>
+          <w:b/>
+          <w:bCs/>
+          <w:color w:val="000000"/>
+          <w:lang w:val="vi-VN"/>
+        </w:rPr>
+      </w:pPr>
+      <w:r>
+        <w:rPr>
+          <w:rFonts w:ascii="Arial" w:hAnsi="Arial" w:cs="Arial"/>
+          <w:b/>
+          <w:bCs/>
+          <w:color w:val="000000"/>
+          <w:lang w:val="vi-VN"/>
+        </w:rPr>
+        <w:t>6. Test Plan</w:t>
+      </w:r>
+    </w:p>
+    <w:p>
+      <w:pPr>
+        <w:pStyle w:val="NormalWeb"/>
+        <w:spacing w:before="0" w:after="260"/>
+        <w:textAlignment w:val="baseline"/>
+        <w:rPr>
+          <w:rFonts w:ascii="Arial" w:hAnsi="Arial" w:cs="Arial"/>
+          <w:b/>
+          <w:bCs/>
+          <w:color w:val="000000"/>
+          <w:lang w:val="vi-VN"/>
+        </w:rPr>
+      </w:pPr>
+      <w:r>
+        <w:rPr>
+          <w:rFonts w:ascii="Arial" w:hAnsi="Arial" w:cs="Arial"/>
+          <w:b/>
+          <w:bCs/>
+          <w:color w:val="000000"/>
+          <w:lang w:val="vi-VN"/>
+        </w:rPr>
+        <w:t>6.1. Requirements/specifications-based system level test cases</w:t>
+      </w:r>
+    </w:p>
+    <w:p>
+      <w:pPr>
+        <w:pStyle w:val="NormalWeb"/>
+        <w:spacing w:before="0" w:after="260"/>
+        <w:textAlignment w:val="baseline"/>
+        <w:rPr>
+          <w:rFonts w:ascii="Arial" w:hAnsi="Arial" w:cs="Arial"/>
+          <w:color w:val="000000"/>
+          <w:lang w:val="vi-VN"/>
+        </w:rPr>
+      </w:pPr>
+      <w:r>
+        <w:rPr>
+          <w:rFonts w:ascii="Arial" w:hAnsi="Arial" w:cs="Arial"/>
+          <w:color w:val="000000"/>
+          <w:lang w:val="vi-VN"/>
+        </w:rPr>
+        <w:t>The following system-level test cases were executed to validate core functionalities:</w:t>
+      </w:r>
+    </w:p>
+    <w:tbl>
+      <w:tblPr>
+        <w:tblW w:w="0" w:type="auto"/>
+        <w:tblCellMar>
+          <w:top w:w="15" w:type="dxa"/>
+          <w:left w:w="15" w:type="dxa"/>
+          <w:bottom w:w="15" w:type="dxa"/>
+          <w:right w:w="15" w:type="dxa"/>
+        </w:tblCellMar>
+        <w:tblLook w:val="04A0" w:firstRow="1" w:lastRow="0" w:firstColumn="1" w:lastColumn="0" w:noHBand="0" w:noVBand="1"/>
+      </w:tblPr>
+      <w:tblGrid>
+        <w:gridCol w:w="949"/>
+        <w:gridCol w:w="1816"/>
+        <w:gridCol w:w="2639"/>
+        <w:gridCol w:w="3191"/>
+        <w:gridCol w:w="749"/>
+      </w:tblGrid>
+      <w:tr>
+        <w:trPr>
+          <w:trHeight w:val="1380"/>
+        </w:trPr>
+        <w:tc>
+          <w:tcPr>
+            <w:tcW w:w="0" w:type="auto"/>
+            <w:tcBorders>
+              <w:top w:val="single" w:sz="6" w:space="0" w:color="1F1F1F"/>
+              <w:left w:val="single" w:sz="6" w:space="0" w:color="1F1F1F"/>
+              <w:bottom w:val="single" w:sz="6" w:space="0" w:color="1F1F1F"/>
+              <w:right w:val="single" w:sz="6" w:space="0" w:color="1F1F1F"/>
+            </w:tcBorders>
+            <w:shd w:val="clear" w:color="auto" w:fill="EFEFEF"/>
+            <w:tcMar>
+              <w:top w:w="240" w:type="dxa"/>
+              <w:left w:w="0" w:type="dxa"/>
+              <w:bottom w:w="240" w:type="dxa"/>
+              <w:right w:w="180" w:type="dxa"/>
+            </w:tcMar>
+            <w:hideMark/>
+          </w:tcPr>
+          <w:p>
+            <w:pPr>
+              <w:pStyle w:val="NormalWeb"/>
+              <w:spacing w:before="0" w:after="260"/>
+              <w:textAlignment w:val="baseline"/>
+              <w:rPr>
+                <w:rFonts w:ascii="Arial" w:hAnsi="Arial" w:cs="Arial"/>
+                <w:b/>
+                <w:bCs/>
+                <w:color w:val="000000"/>
+                <w:lang w:val="vi-VN"/>
+              </w:rPr>
+            </w:pPr>
+            <w:r>
+              <w:rPr>
+                <w:rFonts w:ascii="Arial" w:hAnsi="Arial" w:cs="Arial"/>
+                <w:b/>
+                <w:bCs/>
+                <w:color w:val="000000"/>
+                <w:lang w:val="vi-VN"/>
+              </w:rPr>
+              <w:t>Test Case ID</w:t>
+            </w:r>
+          </w:p>
+        </w:tc>
+        <w:tc>
+          <w:tcPr>
+            <w:tcW w:w="0" w:type="auto"/>
+            <w:tcBorders>
+              <w:top w:val="single" w:sz="6" w:space="0" w:color="1F1F1F"/>
+              <w:left w:val="single" w:sz="6" w:space="0" w:color="1F1F1F"/>
+              <w:bottom w:val="single" w:sz="6" w:space="0" w:color="1F1F1F"/>
+              <w:right w:val="single" w:sz="6" w:space="0" w:color="1F1F1F"/>
+            </w:tcBorders>
+            <w:shd w:val="clear" w:color="auto" w:fill="EFEFEF"/>
+            <w:tcMar>
+              <w:top w:w="240" w:type="dxa"/>
+              <w:left w:w="0" w:type="dxa"/>
+              <w:bottom w:w="240" w:type="dxa"/>
+              <w:right w:w="180" w:type="dxa"/>
+            </w:tcMar>
+            <w:hideMark/>
+          </w:tcPr>
+          <w:p>
+            <w:pPr>
+              <w:pStyle w:val="NormalWeb"/>
+              <w:spacing w:before="0" w:after="260"/>
+              <w:textAlignment w:val="baseline"/>
+              <w:rPr>
+                <w:rFonts w:ascii="Arial" w:hAnsi="Arial" w:cs="Arial"/>
+                <w:b/>
+                <w:bCs/>
+                <w:color w:val="000000"/>
+                <w:lang w:val="vi-VN"/>
+              </w:rPr>
+            </w:pPr>
+            <w:r>
+              <w:rPr>
+                <w:rFonts w:ascii="Arial" w:hAnsi="Arial" w:cs="Arial"/>
+                <w:b/>
+                <w:bCs/>
+                <w:color w:val="000000"/>
+                <w:lang w:val="vi-VN"/>
+              </w:rPr>
+              <w:t>Feature / Module</w:t>
+            </w:r>
+          </w:p>
+        </w:tc>
+        <w:tc>
+          <w:tcPr>
+            <w:tcW w:w="0" w:type="auto"/>
+            <w:tcBorders>
+              <w:top w:val="single" w:sz="6" w:space="0" w:color="1F1F1F"/>
+              <w:left w:val="single" w:sz="6" w:space="0" w:color="1F1F1F"/>
+              <w:bottom w:val="single" w:sz="6" w:space="0" w:color="1F1F1F"/>
+              <w:right w:val="single" w:sz="6" w:space="0" w:color="1F1F1F"/>
+            </w:tcBorders>
+            <w:shd w:val="clear" w:color="auto" w:fill="EFEFEF"/>
+            <w:tcMar>
+              <w:top w:w="240" w:type="dxa"/>
+              <w:left w:w="0" w:type="dxa"/>
+              <w:bottom w:w="240" w:type="dxa"/>
+              <w:right w:w="180" w:type="dxa"/>
+            </w:tcMar>
+            <w:hideMark/>
+          </w:tcPr>
+          <w:p>
+            <w:pPr>
+              <w:pStyle w:val="NormalWeb"/>
+              <w:spacing w:before="0" w:after="260"/>
+              <w:textAlignment w:val="baseline"/>
+              <w:rPr>
+                <w:rFonts w:ascii="Arial" w:hAnsi="Arial" w:cs="Arial"/>
+                <w:b/>
+                <w:bCs/>
+                <w:color w:val="000000"/>
+                <w:lang w:val="vi-VN"/>
+              </w:rPr>
+            </w:pPr>
+            <w:r>
+              <w:rPr>
+                <w:rFonts w:ascii="Arial" w:hAnsi="Arial" w:cs="Arial"/>
+                <w:b/>
+                <w:bCs/>
+                <w:color w:val="000000"/>
+                <w:lang w:val="vi-VN"/>
+              </w:rPr>
+              <w:t>Test Steps</w:t>
+            </w:r>
+          </w:p>
+        </w:tc>
+        <w:tc>
+          <w:tcPr>
+            <w:tcW w:w="0" w:type="auto"/>
+            <w:tcBorders>
+              <w:top w:val="single" w:sz="6" w:space="0" w:color="1F1F1F"/>
+              <w:left w:val="single" w:sz="6" w:space="0" w:color="1F1F1F"/>
+              <w:bottom w:val="single" w:sz="6" w:space="0" w:color="1F1F1F"/>
+              <w:right w:val="single" w:sz="6" w:space="0" w:color="1F1F1F"/>
+            </w:tcBorders>
+            <w:shd w:val="clear" w:color="auto" w:fill="EFEFEF"/>
+            <w:tcMar>
+              <w:top w:w="240" w:type="dxa"/>
+              <w:left w:w="0" w:type="dxa"/>
+              <w:bottom w:w="240" w:type="dxa"/>
+              <w:right w:w="180" w:type="dxa"/>
+            </w:tcMar>
+            <w:hideMark/>
+          </w:tcPr>
+          <w:p>
+            <w:pPr>
+              <w:pStyle w:val="NormalWeb"/>
+              <w:spacing w:before="0" w:after="260"/>
+              <w:textAlignment w:val="baseline"/>
+              <w:rPr>
+                <w:rFonts w:ascii="Arial" w:hAnsi="Arial" w:cs="Arial"/>
+                <w:b/>
+                <w:bCs/>
+                <w:color w:val="000000"/>
+                <w:lang w:val="vi-VN"/>
+              </w:rPr>
+            </w:pPr>
+            <w:r>
+              <w:rPr>
+                <w:rFonts w:ascii="Arial" w:hAnsi="Arial" w:cs="Arial"/>
+                <w:b/>
+                <w:bCs/>
+                <w:color w:val="000000"/>
+                <w:lang w:val="vi-VN"/>
+              </w:rPr>
+              <w:t>Expected Result</w:t>
+            </w:r>
+          </w:p>
+        </w:tc>
+        <w:tc>
+          <w:tcPr>
+            <w:tcW w:w="0" w:type="auto"/>
+            <w:tcBorders>
+              <w:top w:val="single" w:sz="6" w:space="0" w:color="1F1F1F"/>
+              <w:left w:val="single" w:sz="6" w:space="0" w:color="1F1F1F"/>
+              <w:bottom w:val="single" w:sz="6" w:space="0" w:color="1F1F1F"/>
+              <w:right w:val="single" w:sz="6" w:space="0" w:color="1F1F1F"/>
+            </w:tcBorders>
+            <w:shd w:val="clear" w:color="auto" w:fill="EFEFEF"/>
+            <w:tcMar>
+              <w:top w:w="240" w:type="dxa"/>
+              <w:left w:w="0" w:type="dxa"/>
+              <w:bottom w:w="240" w:type="dxa"/>
+              <w:right w:w="0" w:type="dxa"/>
+            </w:tcMar>
+            <w:hideMark/>
+          </w:tcPr>
+          <w:p>
+            <w:pPr>
+              <w:pStyle w:val="NormalWeb"/>
+              <w:spacing w:before="0" w:after="260"/>
+              <w:textAlignment w:val="baseline"/>
+              <w:rPr>
+                <w:rFonts w:ascii="Arial" w:hAnsi="Arial" w:cs="Arial"/>
+                <w:b/>
+                <w:bCs/>
+                <w:color w:val="000000"/>
+                <w:lang w:val="vi-VN"/>
+              </w:rPr>
+            </w:pPr>
+            <w:r>
+              <w:rPr>
+                <w:rFonts w:ascii="Arial" w:hAnsi="Arial" w:cs="Arial"/>
+                <w:b/>
+                <w:bCs/>
+                <w:color w:val="000000"/>
+                <w:lang w:val="vi-VN"/>
+              </w:rPr>
+              <w:t>Status</w:t>
+            </w:r>
+          </w:p>
+        </w:tc>
+      </w:tr>
+      <w:tr>
+        <w:trPr>
+          <w:trHeight w:val="1965"/>
+        </w:trPr>
+        <w:tc>
+          <w:tcPr>
+            <w:tcW w:w="0" w:type="auto"/>
+            <w:tcBorders>
+              <w:top w:val="single" w:sz="6" w:space="0" w:color="1F1F1F"/>
+              <w:left w:val="single" w:sz="6" w:space="0" w:color="1F1F1F"/>
+              <w:bottom w:val="single" w:sz="6" w:space="0" w:color="1F1F1F"/>
+              <w:right w:val="single" w:sz="6" w:space="0" w:color="1F1F1F"/>
+            </w:tcBorders>
+            <w:tcMar>
+              <w:top w:w="240" w:type="dxa"/>
+              <w:left w:w="0" w:type="dxa"/>
+              <w:bottom w:w="240" w:type="dxa"/>
+              <w:right w:w="180" w:type="dxa"/>
+            </w:tcMar>
+            <w:hideMark/>
+          </w:tcPr>
+          <w:p>
+            <w:pPr>
+              <w:pStyle w:val="NormalWeb"/>
+              <w:spacing w:before="0" w:after="260"/>
+              <w:textAlignment w:val="baseline"/>
+              <w:rPr>
+                <w:rFonts w:ascii="Arial" w:hAnsi="Arial" w:cs="Arial"/>
+                <w:color w:val="000000"/>
+                <w:lang w:val="vi-VN"/>
+              </w:rPr>
+            </w:pPr>
+            <w:r>
+              <w:rPr>
+                <w:rFonts w:ascii="Arial" w:hAnsi="Arial" w:cs="Arial"/>
+                <w:color w:val="000000"/>
+                <w:lang w:val="vi-VN"/>
+              </w:rPr>
+              <w:t>TC-01</w:t>
+            </w:r>
+          </w:p>
+        </w:tc>
+        <w:tc>
+          <w:tcPr>
+            <w:tcW w:w="0" w:type="auto"/>
+            <w:tcBorders>
+              <w:top w:val="single" w:sz="6" w:space="0" w:color="1F1F1F"/>
+              <w:left w:val="single" w:sz="6" w:space="0" w:color="1F1F1F"/>
+              <w:bottom w:val="single" w:sz="6" w:space="0" w:color="1F1F1F"/>
+              <w:right w:val="single" w:sz="6" w:space="0" w:color="1F1F1F"/>
+            </w:tcBorders>
+            <w:tcMar>
+              <w:top w:w="240" w:type="dxa"/>
+              <w:left w:w="0" w:type="dxa"/>
+              <w:bottom w:w="240" w:type="dxa"/>
+              <w:right w:w="180" w:type="dxa"/>
+            </w:tcMar>
+            <w:hideMark/>
+          </w:tcPr>
+          <w:p>
+            <w:pPr>
+              <w:pStyle w:val="NormalWeb"/>
+              <w:spacing w:before="0" w:after="260"/>
+              <w:textAlignment w:val="baseline"/>
+              <w:rPr>
+                <w:rFonts w:ascii="Arial" w:hAnsi="Arial" w:cs="Arial"/>
+                <w:color w:val="000000"/>
+                <w:lang w:val="vi-VN"/>
+              </w:rPr>
+            </w:pPr>
+            <w:r>
+              <w:rPr>
+                <w:rFonts w:ascii="Arial" w:hAnsi="Arial" w:cs="Arial"/>
+                <w:color w:val="000000"/>
+                <w:lang w:val="vi-VN"/>
+              </w:rPr>
+              <w:t>Authentication</w:t>
+            </w:r>
+          </w:p>
+        </w:tc>
+        <w:tc>
+          <w:tcPr>
+            <w:tcW w:w="0" w:type="auto"/>
+            <w:tcBorders>
+              <w:top w:val="single" w:sz="6" w:space="0" w:color="1F1F1F"/>
+              <w:left w:val="single" w:sz="6" w:space="0" w:color="1F1F1F"/>
+              <w:bottom w:val="single" w:sz="6" w:space="0" w:color="1F1F1F"/>
+              <w:right w:val="single" w:sz="6" w:space="0" w:color="1F1F1F"/>
+            </w:tcBorders>
+            <w:tcMar>
+              <w:top w:w="240" w:type="dxa"/>
+              <w:left w:w="0" w:type="dxa"/>
+              <w:bottom w:w="240" w:type="dxa"/>
+              <w:right w:w="180" w:type="dxa"/>
+            </w:tcMar>
+            <w:hideMark/>
+          </w:tcPr>
+          <w:p>
+            <w:pPr>
+              <w:pStyle w:val="NormalWeb"/>
+              <w:spacing w:before="0" w:after="260"/>
+              <w:textAlignment w:val="baseline"/>
+              <w:rPr>
+                <w:rFonts w:ascii="Arial" w:hAnsi="Arial" w:cs="Arial"/>
+                <w:color w:val="000000"/>
+                <w:lang w:val="vi-VN"/>
+              </w:rPr>
+            </w:pPr>
+            <w:r>
+              <w:rPr>
+                <w:rFonts w:ascii="Arial" w:hAnsi="Arial" w:cs="Arial"/>
+                <w:color w:val="000000"/>
+                <w:lang w:val="vi-VN"/>
+              </w:rPr>
+              <w:t>1. Enter valid username and password.</w:t>
+            </w:r>
+          </w:p>
+          <w:p>
+            <w:pPr>
+              <w:pStyle w:val="NormalWeb"/>
+              <w:spacing w:before="0" w:after="260"/>
+              <w:textAlignment w:val="baseline"/>
+              <w:rPr>
+                <w:rFonts w:ascii="Arial" w:hAnsi="Arial" w:cs="Arial"/>
+                <w:color w:val="000000"/>
+                <w:lang w:val="vi-VN"/>
+              </w:rPr>
+            </w:pPr>
+            <w:r>
+              <w:rPr>
+                <w:rFonts w:ascii="Arial" w:hAnsi="Arial" w:cs="Arial"/>
+                <w:color w:val="000000"/>
+                <w:lang w:val="vi-VN"/>
+              </w:rPr>
+              <w:t>2. Click Login.</w:t>
+            </w:r>
+          </w:p>
+        </w:tc>
+        <w:tc>
+          <w:tcPr>
+            <w:tcW w:w="0" w:type="auto"/>
+            <w:tcBorders>
+              <w:top w:val="single" w:sz="6" w:space="0" w:color="1F1F1F"/>
+              <w:left w:val="single" w:sz="6" w:space="0" w:color="1F1F1F"/>
+              <w:bottom w:val="single" w:sz="6" w:space="0" w:color="1F1F1F"/>
+              <w:right w:val="single" w:sz="6" w:space="0" w:color="1F1F1F"/>
+            </w:tcBorders>
+            <w:tcMar>
+              <w:top w:w="240" w:type="dxa"/>
+              <w:left w:w="0" w:type="dxa"/>
+              <w:bottom w:w="240" w:type="dxa"/>
+              <w:right w:w="180" w:type="dxa"/>
+            </w:tcMar>
+            <w:hideMark/>
+          </w:tcPr>
+          <w:p>
+            <w:pPr>
+              <w:pStyle w:val="NormalWeb"/>
+              <w:spacing w:before="0" w:after="260"/>
+              <w:textAlignment w:val="baseline"/>
+              <w:rPr>
+                <w:rFonts w:ascii="Arial" w:hAnsi="Arial" w:cs="Arial"/>
+                <w:color w:val="000000"/>
+                <w:lang w:val="vi-VN"/>
+              </w:rPr>
+            </w:pPr>
+            <w:r>
+              <w:rPr>
+                <w:rFonts w:ascii="Arial" w:hAnsi="Arial" w:cs="Arial"/>
+                <w:color w:val="000000"/>
+                <w:lang w:val="vi-VN"/>
+              </w:rPr>
+              <w:t>System authenticates and redirects to Dashboard based on Role.</w:t>
+            </w:r>
+          </w:p>
+        </w:tc>
+        <w:tc>
+          <w:tcPr>
+            <w:tcW w:w="0" w:type="auto"/>
+            <w:tcBorders>
+              <w:top w:val="single" w:sz="6" w:space="0" w:color="1F1F1F"/>
+              <w:left w:val="single" w:sz="6" w:space="0" w:color="1F1F1F"/>
+              <w:bottom w:val="single" w:sz="6" w:space="0" w:color="1F1F1F"/>
+              <w:right w:val="single" w:sz="6" w:space="0" w:color="1F1F1F"/>
+            </w:tcBorders>
+            <w:tcMar>
+              <w:top w:w="240" w:type="dxa"/>
+              <w:left w:w="0" w:type="dxa"/>
+              <w:bottom w:w="240" w:type="dxa"/>
+              <w:right w:w="0" w:type="dxa"/>
+            </w:tcMar>
+            <w:hideMark/>
+          </w:tcPr>
+          <w:p>
+            <w:pPr>
+              <w:pStyle w:val="NormalWeb"/>
+              <w:spacing w:before="0" w:after="260"/>
+              <w:textAlignment w:val="baseline"/>
+              <w:rPr>
+                <w:rFonts w:ascii="Arial" w:hAnsi="Arial" w:cs="Arial"/>
+                <w:b/>
+                <w:bCs/>
+                <w:color w:val="000000"/>
+                <w:lang w:val="vi-VN"/>
+              </w:rPr>
+            </w:pPr>
+            <w:r>
+              <w:rPr>
+                <w:rFonts w:ascii="Arial" w:hAnsi="Arial" w:cs="Arial"/>
+                <w:b/>
+                <w:bCs/>
+                <w:color w:val="000000"/>
+                <w:lang w:val="vi-VN"/>
+              </w:rPr>
+              <w:t>Pass</w:t>
+            </w:r>
+          </w:p>
+        </w:tc>
+      </w:tr>
+      <w:tr>
+        <w:trPr>
+          <w:trHeight w:val="1965"/>
+        </w:trPr>
+        <w:tc>
+          <w:tcPr>
+            <w:tcW w:w="0" w:type="auto"/>
+            <w:tcBorders>
+              <w:top w:val="single" w:sz="6" w:space="0" w:color="1F1F1F"/>
+              <w:left w:val="single" w:sz="6" w:space="0" w:color="1F1F1F"/>
+              <w:bottom w:val="single" w:sz="6" w:space="0" w:color="1F1F1F"/>
+              <w:right w:val="single" w:sz="6" w:space="0" w:color="1F1F1F"/>
+            </w:tcBorders>
+            <w:tcMar>
+              <w:top w:w="240" w:type="dxa"/>
+              <w:left w:w="0" w:type="dxa"/>
+              <w:bottom w:w="240" w:type="dxa"/>
+              <w:right w:w="180" w:type="dxa"/>
+            </w:tcMar>
+            <w:hideMark/>
+          </w:tcPr>
+          <w:p>
+            <w:pPr>
+              <w:pStyle w:val="NormalWeb"/>
+              <w:spacing w:before="0" w:after="260"/>
+              <w:textAlignment w:val="baseline"/>
+              <w:rPr>
+                <w:rFonts w:ascii="Arial" w:hAnsi="Arial" w:cs="Arial"/>
+                <w:color w:val="000000"/>
+                <w:lang w:val="vi-VN"/>
+              </w:rPr>
+            </w:pPr>
+            <w:r>
+              <w:rPr>
+                <w:rFonts w:ascii="Arial" w:hAnsi="Arial" w:cs="Arial"/>
+                <w:color w:val="000000"/>
+                <w:lang w:val="vi-VN"/>
+              </w:rPr>
+              <w:t>TC-02</w:t>
+            </w:r>
+          </w:p>
+        </w:tc>
+        <w:tc>
+          <w:tcPr>
+            <w:tcW w:w="0" w:type="auto"/>
+            <w:tcBorders>
+              <w:top w:val="single" w:sz="6" w:space="0" w:color="1F1F1F"/>
+              <w:left w:val="single" w:sz="6" w:space="0" w:color="1F1F1F"/>
+              <w:bottom w:val="single" w:sz="6" w:space="0" w:color="1F1F1F"/>
+              <w:right w:val="single" w:sz="6" w:space="0" w:color="1F1F1F"/>
+            </w:tcBorders>
+            <w:tcMar>
+              <w:top w:w="240" w:type="dxa"/>
+              <w:left w:w="0" w:type="dxa"/>
+              <w:bottom w:w="240" w:type="dxa"/>
+              <w:right w:w="180" w:type="dxa"/>
+            </w:tcMar>
+            <w:hideMark/>
+          </w:tcPr>
+          <w:p>
+            <w:pPr>
+              <w:pStyle w:val="NormalWeb"/>
+              <w:spacing w:before="0" w:after="260"/>
+              <w:textAlignment w:val="baseline"/>
+              <w:rPr>
+                <w:rFonts w:ascii="Arial" w:hAnsi="Arial" w:cs="Arial"/>
+                <w:color w:val="000000"/>
+                <w:lang w:val="vi-VN"/>
+              </w:rPr>
+            </w:pPr>
+            <w:r>
+              <w:rPr>
+                <w:rFonts w:ascii="Arial" w:hAnsi="Arial" w:cs="Arial"/>
+                <w:color w:val="000000"/>
+                <w:lang w:val="vi-VN"/>
+              </w:rPr>
+              <w:t>Authentication</w:t>
+            </w:r>
+          </w:p>
+        </w:tc>
+        <w:tc>
+          <w:tcPr>
+            <w:tcW w:w="0" w:type="auto"/>
+            <w:tcBorders>
+              <w:top w:val="single" w:sz="6" w:space="0" w:color="1F1F1F"/>
+              <w:left w:val="single" w:sz="6" w:space="0" w:color="1F1F1F"/>
+              <w:bottom w:val="single" w:sz="6" w:space="0" w:color="1F1F1F"/>
+              <w:right w:val="single" w:sz="6" w:space="0" w:color="1F1F1F"/>
+            </w:tcBorders>
+            <w:tcMar>
+              <w:top w:w="240" w:type="dxa"/>
+              <w:left w:w="0" w:type="dxa"/>
+              <w:bottom w:w="240" w:type="dxa"/>
+              <w:right w:w="180" w:type="dxa"/>
+            </w:tcMar>
+            <w:hideMark/>
+          </w:tcPr>
+          <w:p>
+            <w:pPr>
+              <w:pStyle w:val="NormalWeb"/>
+              <w:spacing w:before="0" w:after="260"/>
+              <w:textAlignment w:val="baseline"/>
+              <w:rPr>
+                <w:rFonts w:ascii="Arial" w:hAnsi="Arial" w:cs="Arial"/>
+                <w:color w:val="000000"/>
+                <w:lang w:val="vi-VN"/>
+              </w:rPr>
+            </w:pPr>
+            <w:r>
+              <w:rPr>
+                <w:rFonts w:ascii="Arial" w:hAnsi="Arial" w:cs="Arial"/>
+                <w:color w:val="000000"/>
+                <w:lang w:val="vi-VN"/>
+              </w:rPr>
+              <w:t>1. Enter invalid credentials (wrong password).</w:t>
+            </w:r>
+          </w:p>
+          <w:p>
+            <w:pPr>
+              <w:pStyle w:val="NormalWeb"/>
+              <w:spacing w:before="0" w:after="260"/>
+              <w:textAlignment w:val="baseline"/>
+              <w:rPr>
+                <w:rFonts w:ascii="Arial" w:hAnsi="Arial" w:cs="Arial"/>
+                <w:color w:val="000000"/>
+                <w:lang w:val="vi-VN"/>
+              </w:rPr>
+            </w:pPr>
+            <w:r>
+              <w:rPr>
+                <w:rFonts w:ascii="Arial" w:hAnsi="Arial" w:cs="Arial"/>
+                <w:color w:val="000000"/>
+                <w:lang w:val="vi-VN"/>
+              </w:rPr>
+              <w:t>2. Click Login.</w:t>
+            </w:r>
+          </w:p>
+        </w:tc>
+        <w:tc>
+          <w:tcPr>
+            <w:tcW w:w="0" w:type="auto"/>
+            <w:tcBorders>
+              <w:top w:val="single" w:sz="6" w:space="0" w:color="1F1F1F"/>
+              <w:left w:val="single" w:sz="6" w:space="0" w:color="1F1F1F"/>
+              <w:bottom w:val="single" w:sz="6" w:space="0" w:color="1F1F1F"/>
+              <w:right w:val="single" w:sz="6" w:space="0" w:color="1F1F1F"/>
+            </w:tcBorders>
+            <w:tcMar>
+              <w:top w:w="240" w:type="dxa"/>
+              <w:left w:w="0" w:type="dxa"/>
+              <w:bottom w:w="240" w:type="dxa"/>
+              <w:right w:w="180" w:type="dxa"/>
+            </w:tcMar>
+            <w:hideMark/>
+          </w:tcPr>
+          <w:p>
+            <w:pPr>
+              <w:pStyle w:val="NormalWeb"/>
+              <w:spacing w:before="0" w:after="260"/>
+              <w:textAlignment w:val="baseline"/>
+              <w:rPr>
+                <w:rFonts w:ascii="Arial" w:hAnsi="Arial" w:cs="Arial"/>
+                <w:color w:val="000000"/>
+                <w:lang w:val="vi-VN"/>
+              </w:rPr>
+            </w:pPr>
+            <w:r>
+              <w:rPr>
+                <w:rFonts w:ascii="Arial" w:hAnsi="Arial" w:cs="Arial"/>
+                <w:color w:val="000000"/>
+                <w:lang w:val="vi-VN"/>
+              </w:rPr>
+              <w:t>System denies access and displays "Invalid credentials" error message.</w:t>
+            </w:r>
+          </w:p>
+        </w:tc>
+        <w:tc>
+          <w:tcPr>
+            <w:tcW w:w="0" w:type="auto"/>
+            <w:tcBorders>
+              <w:top w:val="single" w:sz="6" w:space="0" w:color="1F1F1F"/>
+              <w:left w:val="single" w:sz="6" w:space="0" w:color="1F1F1F"/>
+              <w:bottom w:val="single" w:sz="6" w:space="0" w:color="1F1F1F"/>
+              <w:right w:val="single" w:sz="6" w:space="0" w:color="1F1F1F"/>
+            </w:tcBorders>
+            <w:tcMar>
+              <w:top w:w="240" w:type="dxa"/>
+              <w:left w:w="0" w:type="dxa"/>
+              <w:bottom w:w="240" w:type="dxa"/>
+              <w:right w:w="0" w:type="dxa"/>
+            </w:tcMar>
+            <w:hideMark/>
+          </w:tcPr>
+          <w:p>
+            <w:pPr>
+              <w:pStyle w:val="NormalWeb"/>
+              <w:spacing w:before="0" w:after="260"/>
+              <w:textAlignment w:val="baseline"/>
+              <w:rPr>
+                <w:rFonts w:ascii="Arial" w:hAnsi="Arial" w:cs="Arial"/>
+                <w:b/>
+                <w:bCs/>
+                <w:color w:val="000000"/>
+                <w:lang w:val="vi-VN"/>
+              </w:rPr>
+            </w:pPr>
+            <w:r>
+              <w:rPr>
+                <w:rFonts w:ascii="Arial" w:hAnsi="Arial" w:cs="Arial"/>
+                <w:b/>
+                <w:bCs/>
+                <w:color w:val="000000"/>
+                <w:lang w:val="vi-VN"/>
+              </w:rPr>
+              <w:t>Pass</w:t>
+            </w:r>
+          </w:p>
+        </w:tc>
+      </w:tr>
+      <w:tr>
+        <w:trPr>
+          <w:trHeight w:val="2385"/>
+        </w:trPr>
+        <w:tc>
+          <w:tcPr>
+            <w:tcW w:w="0" w:type="auto"/>
+            <w:tcBorders>
+              <w:top w:val="single" w:sz="6" w:space="0" w:color="1F1F1F"/>
+              <w:left w:val="single" w:sz="6" w:space="0" w:color="1F1F1F"/>
+              <w:bottom w:val="single" w:sz="6" w:space="0" w:color="1F1F1F"/>
+              <w:right w:val="single" w:sz="6" w:space="0" w:color="1F1F1F"/>
+            </w:tcBorders>
+            <w:tcMar>
+              <w:top w:w="240" w:type="dxa"/>
+              <w:left w:w="0" w:type="dxa"/>
+              <w:bottom w:w="240" w:type="dxa"/>
+              <w:right w:w="180" w:type="dxa"/>
+            </w:tcMar>
+            <w:hideMark/>
+          </w:tcPr>
+          <w:p>
+            <w:pPr>
+              <w:pStyle w:val="NormalWeb"/>
+              <w:spacing w:before="0" w:after="260"/>
+              <w:textAlignment w:val="baseline"/>
+              <w:rPr>
+                <w:rFonts w:ascii="Arial" w:hAnsi="Arial" w:cs="Arial"/>
+                <w:color w:val="000000"/>
+                <w:lang w:val="vi-VN"/>
+              </w:rPr>
+            </w:pPr>
+            <w:r>
+              <w:rPr>
+                <w:rFonts w:ascii="Arial" w:hAnsi="Arial" w:cs="Arial"/>
+                <w:color w:val="000000"/>
+                <w:lang w:val="vi-VN"/>
+              </w:rPr>
+              <w:lastRenderedPageBreak/>
+              <w:t>TC-03</w:t>
+            </w:r>
+          </w:p>
+        </w:tc>
+        <w:tc>
+          <w:tcPr>
+            <w:tcW w:w="0" w:type="auto"/>
+            <w:tcBorders>
+              <w:top w:val="single" w:sz="6" w:space="0" w:color="1F1F1F"/>
+              <w:left w:val="single" w:sz="6" w:space="0" w:color="1F1F1F"/>
+              <w:bottom w:val="single" w:sz="6" w:space="0" w:color="1F1F1F"/>
+              <w:right w:val="single" w:sz="6" w:space="0" w:color="1F1F1F"/>
+            </w:tcBorders>
+            <w:tcMar>
+              <w:top w:w="240" w:type="dxa"/>
+              <w:left w:w="0" w:type="dxa"/>
+              <w:bottom w:w="240" w:type="dxa"/>
+              <w:right w:w="180" w:type="dxa"/>
+            </w:tcMar>
+            <w:hideMark/>
+          </w:tcPr>
+          <w:p>
+            <w:pPr>
+              <w:pStyle w:val="NormalWeb"/>
+              <w:spacing w:before="0" w:after="260"/>
+              <w:textAlignment w:val="baseline"/>
+              <w:rPr>
+                <w:rFonts w:ascii="Arial" w:hAnsi="Arial" w:cs="Arial"/>
+                <w:color w:val="000000"/>
+                <w:lang w:val="vi-VN"/>
+              </w:rPr>
+            </w:pPr>
+            <w:r>
+              <w:rPr>
+                <w:rFonts w:ascii="Arial" w:hAnsi="Arial" w:cs="Arial"/>
+                <w:color w:val="000000"/>
+                <w:lang w:val="vi-VN"/>
+              </w:rPr>
+              <w:t>Sales Processing</w:t>
+            </w:r>
+          </w:p>
+        </w:tc>
+        <w:tc>
+          <w:tcPr>
+            <w:tcW w:w="0" w:type="auto"/>
+            <w:tcBorders>
+              <w:top w:val="single" w:sz="6" w:space="0" w:color="1F1F1F"/>
+              <w:left w:val="single" w:sz="6" w:space="0" w:color="1F1F1F"/>
+              <w:bottom w:val="single" w:sz="6" w:space="0" w:color="1F1F1F"/>
+              <w:right w:val="single" w:sz="6" w:space="0" w:color="1F1F1F"/>
+            </w:tcBorders>
+            <w:tcMar>
+              <w:top w:w="240" w:type="dxa"/>
+              <w:left w:w="0" w:type="dxa"/>
+              <w:bottom w:w="240" w:type="dxa"/>
+              <w:right w:w="180" w:type="dxa"/>
+            </w:tcMar>
+            <w:hideMark/>
+          </w:tcPr>
+          <w:p>
+            <w:pPr>
+              <w:pStyle w:val="NormalWeb"/>
+              <w:spacing w:before="0" w:after="260"/>
+              <w:textAlignment w:val="baseline"/>
+              <w:rPr>
+                <w:rFonts w:ascii="Arial" w:hAnsi="Arial" w:cs="Arial"/>
+                <w:color w:val="000000"/>
+                <w:lang w:val="vi-VN"/>
+              </w:rPr>
+            </w:pPr>
+            <w:r>
+              <w:rPr>
+                <w:rFonts w:ascii="Arial" w:hAnsi="Arial" w:cs="Arial"/>
+                <w:color w:val="000000"/>
+                <w:lang w:val="vi-VN"/>
+              </w:rPr>
+              <w:t>1. Add valid Product ID and Quantity.</w:t>
+            </w:r>
+          </w:p>
+          <w:p>
+            <w:pPr>
+              <w:pStyle w:val="NormalWeb"/>
+              <w:spacing w:before="0" w:after="260"/>
+              <w:textAlignment w:val="baseline"/>
+              <w:rPr>
+                <w:rFonts w:ascii="Arial" w:hAnsi="Arial" w:cs="Arial"/>
+                <w:color w:val="000000"/>
+                <w:lang w:val="vi-VN"/>
+              </w:rPr>
+            </w:pPr>
+            <w:r>
+              <w:rPr>
+                <w:rFonts w:ascii="Arial" w:hAnsi="Arial" w:cs="Arial"/>
+                <w:color w:val="000000"/>
+                <w:lang w:val="vi-VN"/>
+              </w:rPr>
+              <w:t> </w:t>
+            </w:r>
+          </w:p>
+          <w:p>
+            <w:pPr>
+              <w:pStyle w:val="NormalWeb"/>
+              <w:spacing w:before="0" w:after="260"/>
+              <w:textAlignment w:val="baseline"/>
+              <w:rPr>
+                <w:rFonts w:ascii="Arial" w:hAnsi="Arial" w:cs="Arial"/>
+                <w:color w:val="000000"/>
+                <w:lang w:val="vi-VN"/>
+              </w:rPr>
+            </w:pPr>
+            <w:r>
+              <w:rPr>
+                <w:rFonts w:ascii="Arial" w:hAnsi="Arial" w:cs="Arial"/>
+                <w:color w:val="000000"/>
+                <w:lang w:val="vi-VN"/>
+              </w:rPr>
+              <w:t>2. Proceed to checkout.</w:t>
+            </w:r>
+          </w:p>
+        </w:tc>
+        <w:tc>
+          <w:tcPr>
+            <w:tcW w:w="0" w:type="auto"/>
+            <w:tcBorders>
+              <w:top w:val="single" w:sz="6" w:space="0" w:color="1F1F1F"/>
+              <w:left w:val="single" w:sz="6" w:space="0" w:color="1F1F1F"/>
+              <w:bottom w:val="single" w:sz="6" w:space="0" w:color="1F1F1F"/>
+              <w:right w:val="single" w:sz="6" w:space="0" w:color="1F1F1F"/>
+            </w:tcBorders>
+            <w:tcMar>
+              <w:top w:w="240" w:type="dxa"/>
+              <w:left w:w="0" w:type="dxa"/>
+              <w:bottom w:w="240" w:type="dxa"/>
+              <w:right w:w="180" w:type="dxa"/>
+            </w:tcMar>
+            <w:hideMark/>
+          </w:tcPr>
+          <w:p>
+            <w:pPr>
+              <w:pStyle w:val="NormalWeb"/>
+              <w:spacing w:before="0" w:after="260"/>
+              <w:textAlignment w:val="baseline"/>
+              <w:rPr>
+                <w:rFonts w:ascii="Arial" w:hAnsi="Arial" w:cs="Arial"/>
+                <w:color w:val="000000"/>
+                <w:lang w:val="vi-VN"/>
+              </w:rPr>
+            </w:pPr>
+            <w:r>
+              <w:rPr>
+                <w:rFonts w:ascii="Arial" w:hAnsi="Arial" w:cs="Arial"/>
+                <w:color w:val="000000"/>
+                <w:lang w:val="vi-VN"/>
+              </w:rPr>
+              <w:t>Invoice is generated successfully; Total amount is calculated correctly.</w:t>
+            </w:r>
+          </w:p>
+        </w:tc>
+        <w:tc>
+          <w:tcPr>
+            <w:tcW w:w="0" w:type="auto"/>
+            <w:tcBorders>
+              <w:top w:val="single" w:sz="6" w:space="0" w:color="1F1F1F"/>
+              <w:left w:val="single" w:sz="6" w:space="0" w:color="1F1F1F"/>
+              <w:bottom w:val="single" w:sz="6" w:space="0" w:color="1F1F1F"/>
+              <w:right w:val="single" w:sz="6" w:space="0" w:color="1F1F1F"/>
+            </w:tcBorders>
+            <w:tcMar>
+              <w:top w:w="240" w:type="dxa"/>
+              <w:left w:w="0" w:type="dxa"/>
+              <w:bottom w:w="240" w:type="dxa"/>
+              <w:right w:w="0" w:type="dxa"/>
+            </w:tcMar>
+            <w:hideMark/>
+          </w:tcPr>
+          <w:p>
+            <w:pPr>
+              <w:pStyle w:val="NormalWeb"/>
+              <w:spacing w:before="0" w:after="260"/>
+              <w:textAlignment w:val="baseline"/>
+              <w:rPr>
+                <w:rFonts w:ascii="Arial" w:hAnsi="Arial" w:cs="Arial"/>
+                <w:b/>
+                <w:bCs/>
+                <w:color w:val="000000"/>
+                <w:lang w:val="vi-VN"/>
+              </w:rPr>
+            </w:pPr>
+            <w:r>
+              <w:rPr>
+                <w:rFonts w:ascii="Arial" w:hAnsi="Arial" w:cs="Arial"/>
+                <w:b/>
+                <w:bCs/>
+                <w:color w:val="000000"/>
+                <w:lang w:val="vi-VN"/>
+              </w:rPr>
+              <w:t>Pass</w:t>
+            </w:r>
+          </w:p>
+        </w:tc>
+      </w:tr>
+      <w:tr>
+        <w:trPr>
+          <w:trHeight w:val="2265"/>
+        </w:trPr>
+        <w:tc>
+          <w:tcPr>
+            <w:tcW w:w="0" w:type="auto"/>
+            <w:tcBorders>
+              <w:top w:val="single" w:sz="6" w:space="0" w:color="1F1F1F"/>
+              <w:left w:val="single" w:sz="6" w:space="0" w:color="1F1F1F"/>
+              <w:bottom w:val="single" w:sz="6" w:space="0" w:color="1F1F1F"/>
+              <w:right w:val="single" w:sz="6" w:space="0" w:color="1F1F1F"/>
+            </w:tcBorders>
+            <w:tcMar>
+              <w:top w:w="240" w:type="dxa"/>
+              <w:left w:w="0" w:type="dxa"/>
+              <w:bottom w:w="240" w:type="dxa"/>
+              <w:right w:w="180" w:type="dxa"/>
+            </w:tcMar>
+            <w:hideMark/>
+          </w:tcPr>
+          <w:p>
+            <w:pPr>
+              <w:pStyle w:val="NormalWeb"/>
+              <w:spacing w:before="0" w:after="260"/>
+              <w:textAlignment w:val="baseline"/>
+              <w:rPr>
+                <w:rFonts w:ascii="Arial" w:hAnsi="Arial" w:cs="Arial"/>
+                <w:color w:val="000000"/>
+                <w:lang w:val="vi-VN"/>
+              </w:rPr>
+            </w:pPr>
+            <w:r>
+              <w:rPr>
+                <w:rFonts w:ascii="Arial" w:hAnsi="Arial" w:cs="Arial"/>
+                <w:color w:val="000000"/>
+                <w:lang w:val="vi-VN"/>
+              </w:rPr>
+              <w:t>TC-04</w:t>
+            </w:r>
+          </w:p>
+        </w:tc>
+        <w:tc>
+          <w:tcPr>
+            <w:tcW w:w="0" w:type="auto"/>
+            <w:tcBorders>
+              <w:top w:val="single" w:sz="6" w:space="0" w:color="1F1F1F"/>
+              <w:left w:val="single" w:sz="6" w:space="0" w:color="1F1F1F"/>
+              <w:bottom w:val="single" w:sz="6" w:space="0" w:color="1F1F1F"/>
+              <w:right w:val="single" w:sz="6" w:space="0" w:color="1F1F1F"/>
+            </w:tcBorders>
+            <w:tcMar>
+              <w:top w:w="240" w:type="dxa"/>
+              <w:left w:w="0" w:type="dxa"/>
+              <w:bottom w:w="240" w:type="dxa"/>
+              <w:right w:w="180" w:type="dxa"/>
+            </w:tcMar>
+            <w:hideMark/>
+          </w:tcPr>
+          <w:p>
+            <w:pPr>
+              <w:pStyle w:val="NormalWeb"/>
+              <w:spacing w:before="0" w:after="260"/>
+              <w:textAlignment w:val="baseline"/>
+              <w:rPr>
+                <w:rFonts w:ascii="Arial" w:hAnsi="Arial" w:cs="Arial"/>
+                <w:color w:val="000000"/>
+                <w:lang w:val="vi-VN"/>
+              </w:rPr>
+            </w:pPr>
+            <w:r>
+              <w:rPr>
+                <w:rFonts w:ascii="Arial" w:hAnsi="Arial" w:cs="Arial"/>
+                <w:color w:val="000000"/>
+                <w:lang w:val="vi-VN"/>
+              </w:rPr>
+              <w:t>Inventory Sync</w:t>
+            </w:r>
+          </w:p>
+        </w:tc>
+        <w:tc>
+          <w:tcPr>
+            <w:tcW w:w="0" w:type="auto"/>
+            <w:tcBorders>
+              <w:top w:val="single" w:sz="6" w:space="0" w:color="1F1F1F"/>
+              <w:left w:val="single" w:sz="6" w:space="0" w:color="1F1F1F"/>
+              <w:bottom w:val="single" w:sz="6" w:space="0" w:color="1F1F1F"/>
+              <w:right w:val="single" w:sz="6" w:space="0" w:color="1F1F1F"/>
+            </w:tcBorders>
+            <w:tcMar>
+              <w:top w:w="240" w:type="dxa"/>
+              <w:left w:w="0" w:type="dxa"/>
+              <w:bottom w:w="240" w:type="dxa"/>
+              <w:right w:w="180" w:type="dxa"/>
+            </w:tcMar>
+            <w:hideMark/>
+          </w:tcPr>
+          <w:p>
+            <w:pPr>
+              <w:pStyle w:val="NormalWeb"/>
+              <w:spacing w:before="0" w:after="260"/>
+              <w:textAlignment w:val="baseline"/>
+              <w:rPr>
+                <w:rFonts w:ascii="Arial" w:hAnsi="Arial" w:cs="Arial"/>
+                <w:color w:val="000000"/>
+                <w:lang w:val="vi-VN"/>
+              </w:rPr>
+            </w:pPr>
+            <w:r>
+              <w:rPr>
+                <w:rFonts w:ascii="Arial" w:hAnsi="Arial" w:cs="Arial"/>
+                <w:color w:val="000000"/>
+                <w:lang w:val="vi-VN"/>
+              </w:rPr>
+              <w:t>1. Add Product with Quantity &gt; Current Stock.</w:t>
+            </w:r>
+          </w:p>
+          <w:p>
+            <w:pPr>
+              <w:pStyle w:val="NormalWeb"/>
+              <w:spacing w:before="0" w:after="260"/>
+              <w:textAlignment w:val="baseline"/>
+              <w:rPr>
+                <w:rFonts w:ascii="Arial" w:hAnsi="Arial" w:cs="Arial"/>
+                <w:color w:val="000000"/>
+                <w:lang w:val="vi-VN"/>
+              </w:rPr>
+            </w:pPr>
+            <w:r>
+              <w:rPr>
+                <w:rFonts w:ascii="Arial" w:hAnsi="Arial" w:cs="Arial"/>
+                <w:color w:val="000000"/>
+                <w:lang w:val="vi-VN"/>
+              </w:rPr>
+              <w:t>2. Click Add to Cart.</w:t>
+            </w:r>
+          </w:p>
+        </w:tc>
+        <w:tc>
+          <w:tcPr>
+            <w:tcW w:w="0" w:type="auto"/>
+            <w:tcBorders>
+              <w:top w:val="single" w:sz="6" w:space="0" w:color="1F1F1F"/>
+              <w:left w:val="single" w:sz="6" w:space="0" w:color="1F1F1F"/>
+              <w:bottom w:val="single" w:sz="6" w:space="0" w:color="1F1F1F"/>
+              <w:right w:val="single" w:sz="6" w:space="0" w:color="1F1F1F"/>
+            </w:tcBorders>
+            <w:tcMar>
+              <w:top w:w="240" w:type="dxa"/>
+              <w:left w:w="0" w:type="dxa"/>
+              <w:bottom w:w="240" w:type="dxa"/>
+              <w:right w:w="180" w:type="dxa"/>
+            </w:tcMar>
+            <w:hideMark/>
+          </w:tcPr>
+          <w:p>
+            <w:pPr>
+              <w:pStyle w:val="NormalWeb"/>
+              <w:spacing w:before="0" w:after="260"/>
+              <w:textAlignment w:val="baseline"/>
+              <w:rPr>
+                <w:rFonts w:ascii="Arial" w:hAnsi="Arial" w:cs="Arial"/>
+                <w:color w:val="000000"/>
+                <w:lang w:val="vi-VN"/>
+              </w:rPr>
+            </w:pPr>
+            <w:r>
+              <w:rPr>
+                <w:rFonts w:ascii="Arial" w:hAnsi="Arial" w:cs="Arial"/>
+                <w:color w:val="000000"/>
+                <w:lang w:val="vi-VN"/>
+              </w:rPr>
+              <w:t>System prevents action and shows "Insufficient Stock" warning.</w:t>
+            </w:r>
+          </w:p>
+        </w:tc>
+        <w:tc>
+          <w:tcPr>
+            <w:tcW w:w="0" w:type="auto"/>
+            <w:tcBorders>
+              <w:top w:val="single" w:sz="6" w:space="0" w:color="1F1F1F"/>
+              <w:left w:val="single" w:sz="6" w:space="0" w:color="1F1F1F"/>
+              <w:bottom w:val="single" w:sz="6" w:space="0" w:color="1F1F1F"/>
+              <w:right w:val="single" w:sz="6" w:space="0" w:color="1F1F1F"/>
+            </w:tcBorders>
+            <w:tcMar>
+              <w:top w:w="240" w:type="dxa"/>
+              <w:left w:w="0" w:type="dxa"/>
+              <w:bottom w:w="240" w:type="dxa"/>
+              <w:right w:w="0" w:type="dxa"/>
+            </w:tcMar>
+            <w:hideMark/>
+          </w:tcPr>
+          <w:p>
+            <w:pPr>
+              <w:pStyle w:val="NormalWeb"/>
+              <w:spacing w:before="0" w:after="260"/>
+              <w:textAlignment w:val="baseline"/>
+              <w:rPr>
+                <w:rFonts w:ascii="Arial" w:hAnsi="Arial" w:cs="Arial"/>
+                <w:b/>
+                <w:bCs/>
+                <w:color w:val="000000"/>
+                <w:lang w:val="vi-VN"/>
+              </w:rPr>
+            </w:pPr>
+            <w:r>
+              <w:rPr>
+                <w:rFonts w:ascii="Arial" w:hAnsi="Arial" w:cs="Arial"/>
+                <w:b/>
+                <w:bCs/>
+                <w:color w:val="000000"/>
+                <w:lang w:val="vi-VN"/>
+              </w:rPr>
+              <w:t>Pass</w:t>
+            </w:r>
+          </w:p>
+        </w:tc>
+      </w:tr>
+      <w:tr>
+        <w:trPr>
+          <w:trHeight w:val="1680"/>
+        </w:trPr>
+        <w:tc>
+          <w:tcPr>
+            <w:tcW w:w="0" w:type="auto"/>
+            <w:tcBorders>
+              <w:top w:val="single" w:sz="6" w:space="0" w:color="1F1F1F"/>
+              <w:left w:val="single" w:sz="6" w:space="0" w:color="1F1F1F"/>
+              <w:bottom w:val="single" w:sz="6" w:space="0" w:color="1F1F1F"/>
+              <w:right w:val="single" w:sz="6" w:space="0" w:color="1F1F1F"/>
+            </w:tcBorders>
+            <w:tcMar>
+              <w:top w:w="240" w:type="dxa"/>
+              <w:left w:w="0" w:type="dxa"/>
+              <w:bottom w:w="240" w:type="dxa"/>
+              <w:right w:w="180" w:type="dxa"/>
+            </w:tcMar>
+            <w:hideMark/>
+          </w:tcPr>
+          <w:p>
+            <w:pPr>
+              <w:pStyle w:val="NormalWeb"/>
+              <w:spacing w:before="0" w:after="260"/>
+              <w:textAlignment w:val="baseline"/>
+              <w:rPr>
+                <w:rFonts w:ascii="Arial" w:hAnsi="Arial" w:cs="Arial"/>
+                <w:color w:val="000000"/>
+                <w:lang w:val="vi-VN"/>
+              </w:rPr>
+            </w:pPr>
+            <w:r>
+              <w:rPr>
+                <w:rFonts w:ascii="Arial" w:hAnsi="Arial" w:cs="Arial"/>
+                <w:color w:val="000000"/>
+                <w:lang w:val="vi-VN"/>
+              </w:rPr>
+              <w:t>TC-05</w:t>
+            </w:r>
+          </w:p>
+        </w:tc>
+        <w:tc>
+          <w:tcPr>
+            <w:tcW w:w="0" w:type="auto"/>
+            <w:tcBorders>
+              <w:top w:val="single" w:sz="6" w:space="0" w:color="1F1F1F"/>
+              <w:left w:val="single" w:sz="6" w:space="0" w:color="1F1F1F"/>
+              <w:bottom w:val="single" w:sz="6" w:space="0" w:color="1F1F1F"/>
+              <w:right w:val="single" w:sz="6" w:space="0" w:color="1F1F1F"/>
+            </w:tcBorders>
+            <w:tcMar>
+              <w:top w:w="240" w:type="dxa"/>
+              <w:left w:w="0" w:type="dxa"/>
+              <w:bottom w:w="240" w:type="dxa"/>
+              <w:right w:w="180" w:type="dxa"/>
+            </w:tcMar>
+            <w:hideMark/>
+          </w:tcPr>
+          <w:p>
+            <w:pPr>
+              <w:pStyle w:val="NormalWeb"/>
+              <w:spacing w:before="0" w:after="260"/>
+              <w:textAlignment w:val="baseline"/>
+              <w:rPr>
+                <w:rFonts w:ascii="Arial" w:hAnsi="Arial" w:cs="Arial"/>
+                <w:color w:val="000000"/>
+                <w:lang w:val="vi-VN"/>
+              </w:rPr>
+            </w:pPr>
+            <w:r>
+              <w:rPr>
+                <w:rFonts w:ascii="Arial" w:hAnsi="Arial" w:cs="Arial"/>
+                <w:color w:val="000000"/>
+                <w:lang w:val="vi-VN"/>
+              </w:rPr>
+              <w:t>Database Sync</w:t>
+            </w:r>
+          </w:p>
+        </w:tc>
+        <w:tc>
+          <w:tcPr>
+            <w:tcW w:w="0" w:type="auto"/>
+            <w:tcBorders>
+              <w:top w:val="single" w:sz="6" w:space="0" w:color="1F1F1F"/>
+              <w:left w:val="single" w:sz="6" w:space="0" w:color="1F1F1F"/>
+              <w:bottom w:val="single" w:sz="6" w:space="0" w:color="1F1F1F"/>
+              <w:right w:val="single" w:sz="6" w:space="0" w:color="1F1F1F"/>
+            </w:tcBorders>
+            <w:tcMar>
+              <w:top w:w="240" w:type="dxa"/>
+              <w:left w:w="0" w:type="dxa"/>
+              <w:bottom w:w="240" w:type="dxa"/>
+              <w:right w:w="180" w:type="dxa"/>
+            </w:tcMar>
+            <w:hideMark/>
+          </w:tcPr>
+          <w:p>
+            <w:pPr>
+              <w:pStyle w:val="NormalWeb"/>
+              <w:spacing w:before="0" w:after="260"/>
+              <w:textAlignment w:val="baseline"/>
+              <w:rPr>
+                <w:rFonts w:ascii="Arial" w:hAnsi="Arial" w:cs="Arial"/>
+                <w:color w:val="000000"/>
+                <w:lang w:val="vi-VN"/>
+              </w:rPr>
+            </w:pPr>
+            <w:r>
+              <w:rPr>
+                <w:rFonts w:ascii="Arial" w:hAnsi="Arial" w:cs="Arial"/>
+                <w:color w:val="000000"/>
+                <w:lang w:val="vi-VN"/>
+              </w:rPr>
+              <w:t>1. Complete a successful checkout transaction.</w:t>
+            </w:r>
+          </w:p>
+        </w:tc>
+        <w:tc>
+          <w:tcPr>
+            <w:tcW w:w="0" w:type="auto"/>
+            <w:tcBorders>
+              <w:top w:val="single" w:sz="6" w:space="0" w:color="1F1F1F"/>
+              <w:left w:val="single" w:sz="6" w:space="0" w:color="1F1F1F"/>
+              <w:bottom w:val="single" w:sz="6" w:space="0" w:color="1F1F1F"/>
+              <w:right w:val="single" w:sz="6" w:space="0" w:color="1F1F1F"/>
+            </w:tcBorders>
+            <w:tcMar>
+              <w:top w:w="240" w:type="dxa"/>
+              <w:left w:w="0" w:type="dxa"/>
+              <w:bottom w:w="240" w:type="dxa"/>
+              <w:right w:w="180" w:type="dxa"/>
+            </w:tcMar>
+            <w:hideMark/>
+          </w:tcPr>
+          <w:p>
+            <w:pPr>
+              <w:pStyle w:val="NormalWeb"/>
+              <w:spacing w:before="0" w:after="260"/>
+              <w:textAlignment w:val="baseline"/>
+              <w:rPr>
+                <w:rFonts w:ascii="Arial" w:hAnsi="Arial" w:cs="Arial"/>
+                <w:color w:val="000000"/>
+                <w:lang w:val="vi-VN"/>
+              </w:rPr>
+            </w:pPr>
+            <w:r>
+              <w:rPr>
+                <w:rFonts w:ascii="Arial" w:hAnsi="Arial" w:cs="Arial"/>
+                <w:color w:val="000000"/>
+                <w:lang w:val="vi-VN"/>
+              </w:rPr>
+              <w:t>Stock quantity in the Database decreases exactly by the sold amount.</w:t>
+            </w:r>
+          </w:p>
+        </w:tc>
+        <w:tc>
+          <w:tcPr>
+            <w:tcW w:w="0" w:type="auto"/>
+            <w:tcBorders>
+              <w:top w:val="single" w:sz="6" w:space="0" w:color="1F1F1F"/>
+              <w:left w:val="single" w:sz="6" w:space="0" w:color="1F1F1F"/>
+              <w:bottom w:val="single" w:sz="6" w:space="0" w:color="1F1F1F"/>
+              <w:right w:val="single" w:sz="6" w:space="0" w:color="1F1F1F"/>
+            </w:tcBorders>
+            <w:tcMar>
+              <w:top w:w="240" w:type="dxa"/>
+              <w:left w:w="0" w:type="dxa"/>
+              <w:bottom w:w="240" w:type="dxa"/>
+              <w:right w:w="0" w:type="dxa"/>
+            </w:tcMar>
+            <w:hideMark/>
+          </w:tcPr>
+          <w:p>
+            <w:pPr>
+              <w:pStyle w:val="NormalWeb"/>
+              <w:spacing w:before="0" w:after="260"/>
+              <w:textAlignment w:val="baseline"/>
+              <w:rPr>
+                <w:rFonts w:ascii="Arial" w:hAnsi="Arial" w:cs="Arial"/>
+                <w:b/>
+                <w:bCs/>
+                <w:color w:val="000000"/>
+                <w:lang w:val="vi-VN"/>
+              </w:rPr>
+            </w:pPr>
+            <w:r>
+              <w:rPr>
+                <w:rFonts w:ascii="Arial" w:hAnsi="Arial" w:cs="Arial"/>
+                <w:b/>
+                <w:bCs/>
+                <w:color w:val="000000"/>
+                <w:lang w:val="vi-VN"/>
+              </w:rPr>
+              <w:t>Pass</w:t>
+            </w:r>
+          </w:p>
+        </w:tc>
+      </w:tr>
+      <w:tr>
+        <w:trPr>
+          <w:trHeight w:val="1965"/>
+        </w:trPr>
+        <w:tc>
+          <w:tcPr>
+            <w:tcW w:w="0" w:type="auto"/>
+            <w:tcBorders>
+              <w:top w:val="single" w:sz="6" w:space="0" w:color="1F1F1F"/>
+              <w:left w:val="single" w:sz="6" w:space="0" w:color="1F1F1F"/>
+              <w:bottom w:val="single" w:sz="6" w:space="0" w:color="1F1F1F"/>
+              <w:right w:val="single" w:sz="6" w:space="0" w:color="1F1F1F"/>
+            </w:tcBorders>
+            <w:tcMar>
+              <w:top w:w="240" w:type="dxa"/>
+              <w:left w:w="0" w:type="dxa"/>
+              <w:bottom w:w="240" w:type="dxa"/>
+              <w:right w:w="180" w:type="dxa"/>
+            </w:tcMar>
+            <w:hideMark/>
+          </w:tcPr>
+          <w:p>
+            <w:pPr>
+              <w:pStyle w:val="NormalWeb"/>
+              <w:spacing w:before="0" w:after="260"/>
+              <w:textAlignment w:val="baseline"/>
+              <w:rPr>
+                <w:rFonts w:ascii="Arial" w:hAnsi="Arial" w:cs="Arial"/>
+                <w:color w:val="000000"/>
+                <w:lang w:val="vi-VN"/>
+              </w:rPr>
+            </w:pPr>
+            <w:r>
+              <w:rPr>
+                <w:rFonts w:ascii="Arial" w:hAnsi="Arial" w:cs="Arial"/>
+                <w:color w:val="000000"/>
+                <w:lang w:val="vi-VN"/>
+              </w:rPr>
+              <w:t>TC-06</w:t>
+            </w:r>
+          </w:p>
+        </w:tc>
+        <w:tc>
+          <w:tcPr>
+            <w:tcW w:w="0" w:type="auto"/>
+            <w:tcBorders>
+              <w:top w:val="single" w:sz="6" w:space="0" w:color="1F1F1F"/>
+              <w:left w:val="single" w:sz="6" w:space="0" w:color="1F1F1F"/>
+              <w:bottom w:val="single" w:sz="6" w:space="0" w:color="1F1F1F"/>
+              <w:right w:val="single" w:sz="6" w:space="0" w:color="1F1F1F"/>
+            </w:tcBorders>
+            <w:tcMar>
+              <w:top w:w="240" w:type="dxa"/>
+              <w:left w:w="0" w:type="dxa"/>
+              <w:bottom w:w="240" w:type="dxa"/>
+              <w:right w:w="180" w:type="dxa"/>
+            </w:tcMar>
+            <w:hideMark/>
+          </w:tcPr>
+          <w:p>
+            <w:pPr>
+              <w:pStyle w:val="NormalWeb"/>
+              <w:spacing w:before="0" w:after="260"/>
+              <w:textAlignment w:val="baseline"/>
+              <w:rPr>
+                <w:rFonts w:ascii="Arial" w:hAnsi="Arial" w:cs="Arial"/>
+                <w:color w:val="000000"/>
+                <w:lang w:val="vi-VN"/>
+              </w:rPr>
+            </w:pPr>
+            <w:r>
+              <w:rPr>
+                <w:rFonts w:ascii="Arial" w:hAnsi="Arial" w:cs="Arial"/>
+                <w:color w:val="000000"/>
+                <w:lang w:val="vi-VN"/>
+              </w:rPr>
+              <w:t>Customer Mgmt</w:t>
+            </w:r>
+          </w:p>
+        </w:tc>
+        <w:tc>
+          <w:tcPr>
+            <w:tcW w:w="0" w:type="auto"/>
+            <w:tcBorders>
+              <w:top w:val="single" w:sz="6" w:space="0" w:color="1F1F1F"/>
+              <w:left w:val="single" w:sz="6" w:space="0" w:color="1F1F1F"/>
+              <w:bottom w:val="single" w:sz="6" w:space="0" w:color="1F1F1F"/>
+              <w:right w:val="single" w:sz="6" w:space="0" w:color="1F1F1F"/>
+            </w:tcBorders>
+            <w:tcMar>
+              <w:top w:w="240" w:type="dxa"/>
+              <w:left w:w="0" w:type="dxa"/>
+              <w:bottom w:w="240" w:type="dxa"/>
+              <w:right w:w="180" w:type="dxa"/>
+            </w:tcMar>
+            <w:hideMark/>
+          </w:tcPr>
+          <w:p>
+            <w:pPr>
+              <w:pStyle w:val="NormalWeb"/>
+              <w:spacing w:before="0" w:after="260"/>
+              <w:textAlignment w:val="baseline"/>
+              <w:rPr>
+                <w:rFonts w:ascii="Arial" w:hAnsi="Arial" w:cs="Arial"/>
+                <w:color w:val="000000"/>
+                <w:lang w:val="vi-VN"/>
+              </w:rPr>
+            </w:pPr>
+            <w:r>
+              <w:rPr>
+                <w:rFonts w:ascii="Arial" w:hAnsi="Arial" w:cs="Arial"/>
+                <w:color w:val="000000"/>
+                <w:lang w:val="vi-VN"/>
+              </w:rPr>
+              <w:t>1. Enter details for a new customer (Name, Phone).</w:t>
+            </w:r>
+          </w:p>
+          <w:p>
+            <w:pPr>
+              <w:pStyle w:val="NormalWeb"/>
+              <w:spacing w:before="0" w:after="260"/>
+              <w:textAlignment w:val="baseline"/>
+              <w:rPr>
+                <w:rFonts w:ascii="Arial" w:hAnsi="Arial" w:cs="Arial"/>
+                <w:color w:val="000000"/>
+                <w:lang w:val="vi-VN"/>
+              </w:rPr>
+            </w:pPr>
+            <w:r>
+              <w:rPr>
+                <w:rFonts w:ascii="Arial" w:hAnsi="Arial" w:cs="Arial"/>
+                <w:color w:val="000000"/>
+                <w:lang w:val="vi-VN"/>
+              </w:rPr>
+              <w:t>2. Click Save.</w:t>
+            </w:r>
+          </w:p>
+        </w:tc>
+        <w:tc>
+          <w:tcPr>
+            <w:tcW w:w="0" w:type="auto"/>
+            <w:tcBorders>
+              <w:top w:val="single" w:sz="6" w:space="0" w:color="1F1F1F"/>
+              <w:left w:val="single" w:sz="6" w:space="0" w:color="1F1F1F"/>
+              <w:bottom w:val="single" w:sz="6" w:space="0" w:color="1F1F1F"/>
+              <w:right w:val="single" w:sz="6" w:space="0" w:color="1F1F1F"/>
+            </w:tcBorders>
+            <w:tcMar>
+              <w:top w:w="240" w:type="dxa"/>
+              <w:left w:w="0" w:type="dxa"/>
+              <w:bottom w:w="240" w:type="dxa"/>
+              <w:right w:w="180" w:type="dxa"/>
+            </w:tcMar>
+            <w:hideMark/>
+          </w:tcPr>
+          <w:p>
+            <w:pPr>
+              <w:pStyle w:val="NormalWeb"/>
+              <w:spacing w:before="0" w:after="260"/>
+              <w:textAlignment w:val="baseline"/>
+              <w:rPr>
+                <w:rFonts w:ascii="Arial" w:hAnsi="Arial" w:cs="Arial"/>
+                <w:color w:val="000000"/>
+                <w:lang w:val="vi-VN"/>
+              </w:rPr>
+            </w:pPr>
+            <w:r>
+              <w:rPr>
+                <w:rFonts w:ascii="Arial" w:hAnsi="Arial" w:cs="Arial"/>
+                <w:color w:val="000000"/>
+                <w:lang w:val="vi-VN"/>
+              </w:rPr>
+              <w:t>Customer profile is created and saved securely in the database.</w:t>
+            </w:r>
+          </w:p>
+        </w:tc>
+        <w:tc>
+          <w:tcPr>
+            <w:tcW w:w="0" w:type="auto"/>
+            <w:tcBorders>
+              <w:top w:val="single" w:sz="6" w:space="0" w:color="1F1F1F"/>
+              <w:left w:val="single" w:sz="6" w:space="0" w:color="1F1F1F"/>
+              <w:bottom w:val="single" w:sz="6" w:space="0" w:color="1F1F1F"/>
+              <w:right w:val="single" w:sz="6" w:space="0" w:color="1F1F1F"/>
+            </w:tcBorders>
+            <w:tcMar>
+              <w:top w:w="240" w:type="dxa"/>
+              <w:left w:w="0" w:type="dxa"/>
+              <w:bottom w:w="240" w:type="dxa"/>
+              <w:right w:w="0" w:type="dxa"/>
+            </w:tcMar>
+            <w:hideMark/>
+          </w:tcPr>
+          <w:p>
+            <w:pPr>
+              <w:pStyle w:val="NormalWeb"/>
+              <w:spacing w:before="0" w:after="260"/>
+              <w:textAlignment w:val="baseline"/>
+              <w:rPr>
+                <w:rFonts w:ascii="Arial" w:hAnsi="Arial" w:cs="Arial"/>
+                <w:b/>
+                <w:bCs/>
+                <w:color w:val="000000"/>
+                <w:lang w:val="vi-VN"/>
+              </w:rPr>
+            </w:pPr>
+            <w:r>
+              <w:rPr>
+                <w:rFonts w:ascii="Arial" w:hAnsi="Arial" w:cs="Arial"/>
+                <w:b/>
+                <w:bCs/>
+                <w:color w:val="000000"/>
+                <w:lang w:val="vi-VN"/>
+              </w:rPr>
+              <w:t>Pass</w:t>
+            </w:r>
+          </w:p>
+        </w:tc>
+      </w:tr>
+      <w:tr>
+        <w:trPr>
+          <w:trHeight w:val="1680"/>
+        </w:trPr>
+        <w:tc>
+          <w:tcPr>
+            <w:tcW w:w="0" w:type="auto"/>
+            <w:tcBorders>
+              <w:top w:val="single" w:sz="6" w:space="0" w:color="1F1F1F"/>
+              <w:left w:val="single" w:sz="6" w:space="0" w:color="1F1F1F"/>
+              <w:bottom w:val="single" w:sz="6" w:space="0" w:color="1F1F1F"/>
+              <w:right w:val="single" w:sz="6" w:space="0" w:color="1F1F1F"/>
+            </w:tcBorders>
+            <w:tcMar>
+              <w:top w:w="240" w:type="dxa"/>
+              <w:left w:w="0" w:type="dxa"/>
+              <w:bottom w:w="240" w:type="dxa"/>
+              <w:right w:w="180" w:type="dxa"/>
+            </w:tcMar>
+            <w:hideMark/>
+          </w:tcPr>
+          <w:p>
+            <w:pPr>
+              <w:pStyle w:val="NormalWeb"/>
+              <w:spacing w:before="0" w:after="260"/>
+              <w:textAlignment w:val="baseline"/>
+              <w:rPr>
+                <w:rFonts w:ascii="Arial" w:hAnsi="Arial" w:cs="Arial"/>
+                <w:color w:val="000000"/>
+                <w:lang w:val="vi-VN"/>
+              </w:rPr>
+            </w:pPr>
+            <w:r>
+              <w:rPr>
+                <w:rFonts w:ascii="Arial" w:hAnsi="Arial" w:cs="Arial"/>
+                <w:color w:val="000000"/>
+                <w:lang w:val="vi-VN"/>
+              </w:rPr>
+              <w:t>TC-07</w:t>
+            </w:r>
+          </w:p>
+        </w:tc>
+        <w:tc>
+          <w:tcPr>
+            <w:tcW w:w="0" w:type="auto"/>
+            <w:tcBorders>
+              <w:top w:val="single" w:sz="6" w:space="0" w:color="1F1F1F"/>
+              <w:left w:val="single" w:sz="6" w:space="0" w:color="1F1F1F"/>
+              <w:bottom w:val="single" w:sz="6" w:space="0" w:color="1F1F1F"/>
+              <w:right w:val="single" w:sz="6" w:space="0" w:color="1F1F1F"/>
+            </w:tcBorders>
+            <w:tcMar>
+              <w:top w:w="240" w:type="dxa"/>
+              <w:left w:w="0" w:type="dxa"/>
+              <w:bottom w:w="240" w:type="dxa"/>
+              <w:right w:w="180" w:type="dxa"/>
+            </w:tcMar>
+            <w:hideMark/>
+          </w:tcPr>
+          <w:p>
+            <w:pPr>
+              <w:pStyle w:val="NormalWeb"/>
+              <w:spacing w:before="0" w:after="260"/>
+              <w:textAlignment w:val="baseline"/>
+              <w:rPr>
+                <w:rFonts w:ascii="Arial" w:hAnsi="Arial" w:cs="Arial"/>
+                <w:color w:val="000000"/>
+                <w:lang w:val="vi-VN"/>
+              </w:rPr>
+            </w:pPr>
+            <w:r>
+              <w:rPr>
+                <w:rFonts w:ascii="Arial" w:hAnsi="Arial" w:cs="Arial"/>
+                <w:color w:val="000000"/>
+                <w:lang w:val="vi-VN"/>
+              </w:rPr>
+              <w:t>Customer Mgmt</w:t>
+            </w:r>
+          </w:p>
+        </w:tc>
+        <w:tc>
+          <w:tcPr>
+            <w:tcW w:w="0" w:type="auto"/>
+            <w:tcBorders>
+              <w:top w:val="single" w:sz="6" w:space="0" w:color="1F1F1F"/>
+              <w:left w:val="single" w:sz="6" w:space="0" w:color="1F1F1F"/>
+              <w:bottom w:val="single" w:sz="6" w:space="0" w:color="1F1F1F"/>
+              <w:right w:val="single" w:sz="6" w:space="0" w:color="1F1F1F"/>
+            </w:tcBorders>
+            <w:tcMar>
+              <w:top w:w="240" w:type="dxa"/>
+              <w:left w:w="0" w:type="dxa"/>
+              <w:bottom w:w="240" w:type="dxa"/>
+              <w:right w:w="180" w:type="dxa"/>
+            </w:tcMar>
+            <w:hideMark/>
+          </w:tcPr>
+          <w:p>
+            <w:pPr>
+              <w:pStyle w:val="NormalWeb"/>
+              <w:spacing w:before="0" w:after="260"/>
+              <w:textAlignment w:val="baseline"/>
+              <w:rPr>
+                <w:rFonts w:ascii="Arial" w:hAnsi="Arial" w:cs="Arial"/>
+                <w:color w:val="000000"/>
+                <w:lang w:val="vi-VN"/>
+              </w:rPr>
+            </w:pPr>
+            <w:r>
+              <w:rPr>
+                <w:rFonts w:ascii="Arial" w:hAnsi="Arial" w:cs="Arial"/>
+                <w:color w:val="000000"/>
+                <w:lang w:val="vi-VN"/>
+              </w:rPr>
+              <w:t>1. Search for a phone number that does not exist.</w:t>
+            </w:r>
+          </w:p>
+        </w:tc>
+        <w:tc>
+          <w:tcPr>
+            <w:tcW w:w="0" w:type="auto"/>
+            <w:tcBorders>
+              <w:top w:val="single" w:sz="6" w:space="0" w:color="1F1F1F"/>
+              <w:left w:val="single" w:sz="6" w:space="0" w:color="1F1F1F"/>
+              <w:bottom w:val="single" w:sz="6" w:space="0" w:color="1F1F1F"/>
+              <w:right w:val="single" w:sz="6" w:space="0" w:color="1F1F1F"/>
+            </w:tcBorders>
+            <w:tcMar>
+              <w:top w:w="240" w:type="dxa"/>
+              <w:left w:w="0" w:type="dxa"/>
+              <w:bottom w:w="240" w:type="dxa"/>
+              <w:right w:w="180" w:type="dxa"/>
+            </w:tcMar>
+            <w:hideMark/>
+          </w:tcPr>
+          <w:p>
+            <w:pPr>
+              <w:pStyle w:val="NormalWeb"/>
+              <w:spacing w:before="0" w:after="260"/>
+              <w:textAlignment w:val="baseline"/>
+              <w:rPr>
+                <w:rFonts w:ascii="Arial" w:hAnsi="Arial" w:cs="Arial"/>
+                <w:color w:val="000000"/>
+                <w:lang w:val="vi-VN"/>
+              </w:rPr>
+            </w:pPr>
+            <w:r>
+              <w:rPr>
+                <w:rFonts w:ascii="Arial" w:hAnsi="Arial" w:cs="Arial"/>
+                <w:color w:val="000000"/>
+                <w:lang w:val="vi-VN"/>
+              </w:rPr>
+              <w:t>System displays "Customer not found" and clears the data fields.</w:t>
+            </w:r>
+          </w:p>
+        </w:tc>
+        <w:tc>
+          <w:tcPr>
+            <w:tcW w:w="0" w:type="auto"/>
+            <w:tcBorders>
+              <w:top w:val="single" w:sz="6" w:space="0" w:color="1F1F1F"/>
+              <w:left w:val="single" w:sz="6" w:space="0" w:color="1F1F1F"/>
+              <w:bottom w:val="single" w:sz="6" w:space="0" w:color="1F1F1F"/>
+              <w:right w:val="single" w:sz="6" w:space="0" w:color="1F1F1F"/>
+            </w:tcBorders>
+            <w:tcMar>
+              <w:top w:w="240" w:type="dxa"/>
+              <w:left w:w="0" w:type="dxa"/>
+              <w:bottom w:w="240" w:type="dxa"/>
+              <w:right w:w="0" w:type="dxa"/>
+            </w:tcMar>
+            <w:hideMark/>
+          </w:tcPr>
+          <w:p>
+            <w:pPr>
+              <w:pStyle w:val="NormalWeb"/>
+              <w:spacing w:before="0" w:after="260"/>
+              <w:textAlignment w:val="baseline"/>
+              <w:rPr>
+                <w:rFonts w:ascii="Arial" w:hAnsi="Arial" w:cs="Arial"/>
+                <w:b/>
+                <w:bCs/>
+                <w:color w:val="000000"/>
+                <w:lang w:val="vi-VN"/>
+              </w:rPr>
+            </w:pPr>
+            <w:r>
+              <w:rPr>
+                <w:rFonts w:ascii="Arial" w:hAnsi="Arial" w:cs="Arial"/>
+                <w:b/>
+                <w:bCs/>
+                <w:color w:val="000000"/>
+                <w:lang w:val="vi-VN"/>
+              </w:rPr>
+              <w:t>Pass</w:t>
+            </w:r>
+          </w:p>
+        </w:tc>
+      </w:tr>
+      <w:tr>
+        <w:trPr>
+          <w:trHeight w:val="2670"/>
+        </w:trPr>
+        <w:tc>
+          <w:tcPr>
+            <w:tcW w:w="0" w:type="auto"/>
+            <w:tcBorders>
+              <w:top w:val="single" w:sz="6" w:space="0" w:color="1F1F1F"/>
+              <w:left w:val="single" w:sz="6" w:space="0" w:color="1F1F1F"/>
+              <w:bottom w:val="single" w:sz="6" w:space="0" w:color="1F1F1F"/>
+              <w:right w:val="single" w:sz="6" w:space="0" w:color="1F1F1F"/>
+            </w:tcBorders>
+            <w:tcMar>
+              <w:top w:w="240" w:type="dxa"/>
+              <w:left w:w="0" w:type="dxa"/>
+              <w:bottom w:w="240" w:type="dxa"/>
+              <w:right w:w="180" w:type="dxa"/>
+            </w:tcMar>
+            <w:hideMark/>
+          </w:tcPr>
+          <w:p>
+            <w:pPr>
+              <w:pStyle w:val="NormalWeb"/>
+              <w:spacing w:before="0" w:after="260"/>
+              <w:textAlignment w:val="baseline"/>
+              <w:rPr>
+                <w:rFonts w:ascii="Arial" w:hAnsi="Arial" w:cs="Arial"/>
+                <w:color w:val="000000"/>
+                <w:lang w:val="vi-VN"/>
+              </w:rPr>
+            </w:pPr>
+            <w:r>
+              <w:rPr>
+                <w:rFonts w:ascii="Arial" w:hAnsi="Arial" w:cs="Arial"/>
+                <w:color w:val="000000"/>
+                <w:lang w:val="vi-VN"/>
+              </w:rPr>
+              <w:lastRenderedPageBreak/>
+              <w:t>TC-08</w:t>
+            </w:r>
+          </w:p>
+        </w:tc>
+        <w:tc>
+          <w:tcPr>
+            <w:tcW w:w="0" w:type="auto"/>
+            <w:tcBorders>
+              <w:top w:val="single" w:sz="6" w:space="0" w:color="1F1F1F"/>
+              <w:left w:val="single" w:sz="6" w:space="0" w:color="1F1F1F"/>
+              <w:bottom w:val="single" w:sz="6" w:space="0" w:color="1F1F1F"/>
+              <w:right w:val="single" w:sz="6" w:space="0" w:color="1F1F1F"/>
+            </w:tcBorders>
+            <w:tcMar>
+              <w:top w:w="240" w:type="dxa"/>
+              <w:left w:w="0" w:type="dxa"/>
+              <w:bottom w:w="240" w:type="dxa"/>
+              <w:right w:w="180" w:type="dxa"/>
+            </w:tcMar>
+            <w:hideMark/>
+          </w:tcPr>
+          <w:p>
+            <w:pPr>
+              <w:pStyle w:val="NormalWeb"/>
+              <w:spacing w:before="0" w:after="260"/>
+              <w:textAlignment w:val="baseline"/>
+              <w:rPr>
+                <w:rFonts w:ascii="Arial" w:hAnsi="Arial" w:cs="Arial"/>
+                <w:color w:val="000000"/>
+                <w:lang w:val="vi-VN"/>
+              </w:rPr>
+            </w:pPr>
+            <w:r>
+              <w:rPr>
+                <w:rFonts w:ascii="Arial" w:hAnsi="Arial" w:cs="Arial"/>
+                <w:color w:val="000000"/>
+                <w:lang w:val="vi-VN"/>
+              </w:rPr>
+              <w:t>Employee Admin</w:t>
+            </w:r>
+          </w:p>
+        </w:tc>
+        <w:tc>
+          <w:tcPr>
+            <w:tcW w:w="0" w:type="auto"/>
+            <w:tcBorders>
+              <w:top w:val="single" w:sz="6" w:space="0" w:color="1F1F1F"/>
+              <w:left w:val="single" w:sz="6" w:space="0" w:color="1F1F1F"/>
+              <w:bottom w:val="single" w:sz="6" w:space="0" w:color="1F1F1F"/>
+              <w:right w:val="single" w:sz="6" w:space="0" w:color="1F1F1F"/>
+            </w:tcBorders>
+            <w:tcMar>
+              <w:top w:w="240" w:type="dxa"/>
+              <w:left w:w="0" w:type="dxa"/>
+              <w:bottom w:w="240" w:type="dxa"/>
+              <w:right w:w="180" w:type="dxa"/>
+            </w:tcMar>
+            <w:hideMark/>
+          </w:tcPr>
+          <w:p>
+            <w:pPr>
+              <w:pStyle w:val="NormalWeb"/>
+              <w:spacing w:before="0" w:after="260"/>
+              <w:textAlignment w:val="baseline"/>
+              <w:rPr>
+                <w:rFonts w:ascii="Arial" w:hAnsi="Arial" w:cs="Arial"/>
+                <w:color w:val="000000"/>
+                <w:lang w:val="vi-VN"/>
+              </w:rPr>
+            </w:pPr>
+            <w:r>
+              <w:rPr>
+                <w:rFonts w:ascii="Arial" w:hAnsi="Arial" w:cs="Arial"/>
+                <w:color w:val="000000"/>
+                <w:lang w:val="vi-VN"/>
+              </w:rPr>
+              <w:t>1. Log in as Manager.</w:t>
+            </w:r>
+          </w:p>
+          <w:p>
+            <w:pPr>
+              <w:pStyle w:val="NormalWeb"/>
+              <w:spacing w:before="0" w:after="260"/>
+              <w:textAlignment w:val="baseline"/>
+              <w:rPr>
+                <w:rFonts w:ascii="Arial" w:hAnsi="Arial" w:cs="Arial"/>
+                <w:color w:val="000000"/>
+                <w:lang w:val="vi-VN"/>
+              </w:rPr>
+            </w:pPr>
+            <w:r>
+              <w:rPr>
+                <w:rFonts w:ascii="Arial" w:hAnsi="Arial" w:cs="Arial"/>
+                <w:color w:val="000000"/>
+                <w:lang w:val="vi-VN"/>
+              </w:rPr>
+              <w:t> </w:t>
+            </w:r>
+          </w:p>
+          <w:p>
+            <w:pPr>
+              <w:pStyle w:val="NormalWeb"/>
+              <w:spacing w:before="0" w:after="260"/>
+              <w:textAlignment w:val="baseline"/>
+              <w:rPr>
+                <w:rFonts w:ascii="Arial" w:hAnsi="Arial" w:cs="Arial"/>
+                <w:color w:val="000000"/>
+                <w:lang w:val="vi-VN"/>
+              </w:rPr>
+            </w:pPr>
+            <w:r>
+              <w:rPr>
+                <w:rFonts w:ascii="Arial" w:hAnsi="Arial" w:cs="Arial"/>
+                <w:color w:val="000000"/>
+                <w:lang w:val="vi-VN"/>
+              </w:rPr>
+              <w:t>2. Create a new Staff account with valid data.</w:t>
+            </w:r>
+          </w:p>
+        </w:tc>
+        <w:tc>
+          <w:tcPr>
+            <w:tcW w:w="0" w:type="auto"/>
+            <w:tcBorders>
+              <w:top w:val="single" w:sz="6" w:space="0" w:color="1F1F1F"/>
+              <w:left w:val="single" w:sz="6" w:space="0" w:color="1F1F1F"/>
+              <w:bottom w:val="single" w:sz="6" w:space="0" w:color="1F1F1F"/>
+              <w:right w:val="single" w:sz="6" w:space="0" w:color="1F1F1F"/>
+            </w:tcBorders>
+            <w:tcMar>
+              <w:top w:w="240" w:type="dxa"/>
+              <w:left w:w="0" w:type="dxa"/>
+              <w:bottom w:w="240" w:type="dxa"/>
+              <w:right w:w="180" w:type="dxa"/>
+            </w:tcMar>
+            <w:hideMark/>
+          </w:tcPr>
+          <w:p>
+            <w:pPr>
+              <w:pStyle w:val="NormalWeb"/>
+              <w:spacing w:before="0" w:after="260"/>
+              <w:textAlignment w:val="baseline"/>
+              <w:rPr>
+                <w:rFonts w:ascii="Arial" w:hAnsi="Arial" w:cs="Arial"/>
+                <w:color w:val="000000"/>
+                <w:lang w:val="vi-VN"/>
+              </w:rPr>
+            </w:pPr>
+            <w:r>
+              <w:rPr>
+                <w:rFonts w:ascii="Arial" w:hAnsi="Arial" w:cs="Arial"/>
+                <w:color w:val="000000"/>
+                <w:lang w:val="vi-VN"/>
+              </w:rPr>
+              <w:t>System saves the new account; the new user can log in successfully.</w:t>
+            </w:r>
+          </w:p>
+        </w:tc>
+        <w:tc>
+          <w:tcPr>
+            <w:tcW w:w="0" w:type="auto"/>
+            <w:tcBorders>
+              <w:top w:val="single" w:sz="6" w:space="0" w:color="1F1F1F"/>
+              <w:left w:val="single" w:sz="6" w:space="0" w:color="1F1F1F"/>
+              <w:bottom w:val="single" w:sz="6" w:space="0" w:color="1F1F1F"/>
+              <w:right w:val="single" w:sz="6" w:space="0" w:color="1F1F1F"/>
+            </w:tcBorders>
+            <w:tcMar>
+              <w:top w:w="240" w:type="dxa"/>
+              <w:left w:w="0" w:type="dxa"/>
+              <w:bottom w:w="240" w:type="dxa"/>
+              <w:right w:w="0" w:type="dxa"/>
+            </w:tcMar>
+            <w:hideMark/>
+          </w:tcPr>
+          <w:p>
+            <w:pPr>
+              <w:pStyle w:val="NormalWeb"/>
+              <w:spacing w:before="0" w:after="260"/>
+              <w:textAlignment w:val="baseline"/>
+              <w:rPr>
+                <w:rFonts w:ascii="Arial" w:hAnsi="Arial" w:cs="Arial"/>
+                <w:b/>
+                <w:bCs/>
+                <w:color w:val="000000"/>
+                <w:lang w:val="vi-VN"/>
+              </w:rPr>
+            </w:pPr>
+            <w:r>
+              <w:rPr>
+                <w:rFonts w:ascii="Arial" w:hAnsi="Arial" w:cs="Arial"/>
+                <w:b/>
+                <w:bCs/>
+                <w:color w:val="000000"/>
+                <w:lang w:val="vi-VN"/>
+              </w:rPr>
+              <w:t>Pass</w:t>
+            </w:r>
+          </w:p>
+        </w:tc>
+      </w:tr>
+      <w:tr>
+        <w:trPr>
+          <w:trHeight w:val="2670"/>
+        </w:trPr>
+        <w:tc>
+          <w:tcPr>
+            <w:tcW w:w="0" w:type="auto"/>
+            <w:tcBorders>
+              <w:top w:val="single" w:sz="6" w:space="0" w:color="1F1F1F"/>
+              <w:left w:val="single" w:sz="6" w:space="0" w:color="1F1F1F"/>
+              <w:bottom w:val="single" w:sz="6" w:space="0" w:color="1F1F1F"/>
+              <w:right w:val="single" w:sz="6" w:space="0" w:color="1F1F1F"/>
+            </w:tcBorders>
+            <w:tcMar>
+              <w:top w:w="240" w:type="dxa"/>
+              <w:left w:w="0" w:type="dxa"/>
+              <w:bottom w:w="240" w:type="dxa"/>
+              <w:right w:w="180" w:type="dxa"/>
+            </w:tcMar>
+            <w:hideMark/>
+          </w:tcPr>
+          <w:p>
+            <w:pPr>
+              <w:pStyle w:val="NormalWeb"/>
+              <w:spacing w:before="0" w:after="260"/>
+              <w:textAlignment w:val="baseline"/>
+              <w:rPr>
+                <w:rFonts w:ascii="Arial" w:hAnsi="Arial" w:cs="Arial"/>
+                <w:color w:val="000000"/>
+                <w:lang w:val="vi-VN"/>
+              </w:rPr>
+            </w:pPr>
+            <w:r>
+              <w:rPr>
+                <w:rFonts w:ascii="Arial" w:hAnsi="Arial" w:cs="Arial"/>
+                <w:color w:val="000000"/>
+                <w:lang w:val="vi-VN"/>
+              </w:rPr>
+              <w:t>TC-09</w:t>
+            </w:r>
+          </w:p>
+        </w:tc>
+        <w:tc>
+          <w:tcPr>
+            <w:tcW w:w="0" w:type="auto"/>
+            <w:tcBorders>
+              <w:top w:val="single" w:sz="6" w:space="0" w:color="1F1F1F"/>
+              <w:left w:val="single" w:sz="6" w:space="0" w:color="1F1F1F"/>
+              <w:bottom w:val="single" w:sz="6" w:space="0" w:color="1F1F1F"/>
+              <w:right w:val="single" w:sz="6" w:space="0" w:color="1F1F1F"/>
+            </w:tcBorders>
+            <w:tcMar>
+              <w:top w:w="240" w:type="dxa"/>
+              <w:left w:w="0" w:type="dxa"/>
+              <w:bottom w:w="240" w:type="dxa"/>
+              <w:right w:w="180" w:type="dxa"/>
+            </w:tcMar>
+            <w:hideMark/>
+          </w:tcPr>
+          <w:p>
+            <w:pPr>
+              <w:pStyle w:val="NormalWeb"/>
+              <w:spacing w:before="0" w:after="260"/>
+              <w:textAlignment w:val="baseline"/>
+              <w:rPr>
+                <w:rFonts w:ascii="Arial" w:hAnsi="Arial" w:cs="Arial"/>
+                <w:color w:val="000000"/>
+                <w:lang w:val="vi-VN"/>
+              </w:rPr>
+            </w:pPr>
+            <w:r>
+              <w:rPr>
+                <w:rFonts w:ascii="Arial" w:hAnsi="Arial" w:cs="Arial"/>
+                <w:color w:val="000000"/>
+                <w:lang w:val="vi-VN"/>
+              </w:rPr>
+              <w:t>Security / Access</w:t>
+            </w:r>
+          </w:p>
+        </w:tc>
+        <w:tc>
+          <w:tcPr>
+            <w:tcW w:w="0" w:type="auto"/>
+            <w:tcBorders>
+              <w:top w:val="single" w:sz="6" w:space="0" w:color="1F1F1F"/>
+              <w:left w:val="single" w:sz="6" w:space="0" w:color="1F1F1F"/>
+              <w:bottom w:val="single" w:sz="6" w:space="0" w:color="1F1F1F"/>
+              <w:right w:val="single" w:sz="6" w:space="0" w:color="1F1F1F"/>
+            </w:tcBorders>
+            <w:tcMar>
+              <w:top w:w="240" w:type="dxa"/>
+              <w:left w:w="0" w:type="dxa"/>
+              <w:bottom w:w="240" w:type="dxa"/>
+              <w:right w:w="180" w:type="dxa"/>
+            </w:tcMar>
+            <w:hideMark/>
+          </w:tcPr>
+          <w:p>
+            <w:pPr>
+              <w:pStyle w:val="NormalWeb"/>
+              <w:spacing w:before="0" w:after="260"/>
+              <w:textAlignment w:val="baseline"/>
+              <w:rPr>
+                <w:rFonts w:ascii="Arial" w:hAnsi="Arial" w:cs="Arial"/>
+                <w:color w:val="000000"/>
+                <w:lang w:val="vi-VN"/>
+              </w:rPr>
+            </w:pPr>
+            <w:r>
+              <w:rPr>
+                <w:rFonts w:ascii="Arial" w:hAnsi="Arial" w:cs="Arial"/>
+                <w:color w:val="000000"/>
+                <w:lang w:val="vi-VN"/>
+              </w:rPr>
+              <w:t>1. Log in as Sales Staff.</w:t>
+            </w:r>
+          </w:p>
+          <w:p>
+            <w:pPr>
+              <w:pStyle w:val="NormalWeb"/>
+              <w:spacing w:before="0" w:after="260"/>
+              <w:textAlignment w:val="baseline"/>
+              <w:rPr>
+                <w:rFonts w:ascii="Arial" w:hAnsi="Arial" w:cs="Arial"/>
+                <w:color w:val="000000"/>
+                <w:lang w:val="vi-VN"/>
+              </w:rPr>
+            </w:pPr>
+            <w:r>
+              <w:rPr>
+                <w:rFonts w:ascii="Arial" w:hAnsi="Arial" w:cs="Arial"/>
+                <w:color w:val="000000"/>
+                <w:lang w:val="vi-VN"/>
+              </w:rPr>
+              <w:t> </w:t>
+            </w:r>
+          </w:p>
+          <w:p>
+            <w:pPr>
+              <w:pStyle w:val="NormalWeb"/>
+              <w:spacing w:before="0" w:after="260"/>
+              <w:textAlignment w:val="baseline"/>
+              <w:rPr>
+                <w:rFonts w:ascii="Arial" w:hAnsi="Arial" w:cs="Arial"/>
+                <w:color w:val="000000"/>
+                <w:lang w:val="vi-VN"/>
+              </w:rPr>
+            </w:pPr>
+            <w:r>
+              <w:rPr>
+                <w:rFonts w:ascii="Arial" w:hAnsi="Arial" w:cs="Arial"/>
+                <w:color w:val="000000"/>
+                <w:lang w:val="vi-VN"/>
+              </w:rPr>
+              <w:t>2. Attempt to access Employee Mgmt module.</w:t>
+            </w:r>
+          </w:p>
+        </w:tc>
+        <w:tc>
+          <w:tcPr>
+            <w:tcW w:w="0" w:type="auto"/>
+            <w:tcBorders>
+              <w:top w:val="single" w:sz="6" w:space="0" w:color="1F1F1F"/>
+              <w:left w:val="single" w:sz="6" w:space="0" w:color="1F1F1F"/>
+              <w:bottom w:val="single" w:sz="6" w:space="0" w:color="1F1F1F"/>
+              <w:right w:val="single" w:sz="6" w:space="0" w:color="1F1F1F"/>
+            </w:tcBorders>
+            <w:tcMar>
+              <w:top w:w="240" w:type="dxa"/>
+              <w:left w:w="0" w:type="dxa"/>
+              <w:bottom w:w="240" w:type="dxa"/>
+              <w:right w:w="180" w:type="dxa"/>
+            </w:tcMar>
+            <w:hideMark/>
+          </w:tcPr>
+          <w:p>
+            <w:pPr>
+              <w:pStyle w:val="NormalWeb"/>
+              <w:spacing w:before="0" w:after="260"/>
+              <w:textAlignment w:val="baseline"/>
+              <w:rPr>
+                <w:rFonts w:ascii="Arial" w:hAnsi="Arial" w:cs="Arial"/>
+                <w:color w:val="000000"/>
+                <w:lang w:val="vi-VN"/>
+              </w:rPr>
+            </w:pPr>
+            <w:r>
+              <w:rPr>
+                <w:rFonts w:ascii="Arial" w:hAnsi="Arial" w:cs="Arial"/>
+                <w:color w:val="000000"/>
+                <w:lang w:val="vi-VN"/>
+              </w:rPr>
+              <w:t>System denies access (Role-Based Access Control functions correctly).</w:t>
+            </w:r>
+          </w:p>
+        </w:tc>
+        <w:tc>
+          <w:tcPr>
+            <w:tcW w:w="0" w:type="auto"/>
+            <w:tcBorders>
+              <w:top w:val="single" w:sz="6" w:space="0" w:color="1F1F1F"/>
+              <w:left w:val="single" w:sz="6" w:space="0" w:color="1F1F1F"/>
+              <w:bottom w:val="single" w:sz="6" w:space="0" w:color="1F1F1F"/>
+              <w:right w:val="single" w:sz="6" w:space="0" w:color="1F1F1F"/>
+            </w:tcBorders>
+            <w:tcMar>
+              <w:top w:w="240" w:type="dxa"/>
+              <w:left w:w="0" w:type="dxa"/>
+              <w:bottom w:w="240" w:type="dxa"/>
+              <w:right w:w="0" w:type="dxa"/>
+            </w:tcMar>
+            <w:hideMark/>
+          </w:tcPr>
+          <w:p>
+            <w:pPr>
+              <w:pStyle w:val="NormalWeb"/>
+              <w:spacing w:before="0" w:after="260"/>
+              <w:textAlignment w:val="baseline"/>
+              <w:rPr>
+                <w:rFonts w:ascii="Arial" w:hAnsi="Arial" w:cs="Arial"/>
+                <w:b/>
+                <w:bCs/>
+                <w:color w:val="000000"/>
+                <w:lang w:val="vi-VN"/>
+              </w:rPr>
+            </w:pPr>
+            <w:r>
+              <w:rPr>
+                <w:rFonts w:ascii="Arial" w:hAnsi="Arial" w:cs="Arial"/>
+                <w:b/>
+                <w:bCs/>
+                <w:color w:val="000000"/>
+                <w:lang w:val="vi-VN"/>
+              </w:rPr>
+              <w:t>Pass</w:t>
+            </w:r>
+          </w:p>
+        </w:tc>
+      </w:tr>
+      <w:tr>
+        <w:trPr>
+          <w:trHeight w:val="2385"/>
+        </w:trPr>
+        <w:tc>
+          <w:tcPr>
+            <w:tcW w:w="0" w:type="auto"/>
+            <w:tcBorders>
+              <w:top w:val="single" w:sz="6" w:space="0" w:color="1F1F1F"/>
+              <w:left w:val="single" w:sz="6" w:space="0" w:color="1F1F1F"/>
+              <w:bottom w:val="single" w:sz="6" w:space="0" w:color="1F1F1F"/>
+              <w:right w:val="single" w:sz="6" w:space="0" w:color="1F1F1F"/>
+            </w:tcBorders>
+            <w:tcMar>
+              <w:top w:w="240" w:type="dxa"/>
+              <w:left w:w="0" w:type="dxa"/>
+              <w:bottom w:w="240" w:type="dxa"/>
+              <w:right w:w="180" w:type="dxa"/>
+            </w:tcMar>
+            <w:hideMark/>
+          </w:tcPr>
+          <w:p>
+            <w:pPr>
+              <w:pStyle w:val="NormalWeb"/>
+              <w:spacing w:before="0" w:after="260"/>
+              <w:textAlignment w:val="baseline"/>
+              <w:rPr>
+                <w:rFonts w:ascii="Arial" w:hAnsi="Arial" w:cs="Arial"/>
+                <w:color w:val="000000"/>
+                <w:lang w:val="vi-VN"/>
+              </w:rPr>
+            </w:pPr>
+            <w:r>
+              <w:rPr>
+                <w:rFonts w:ascii="Arial" w:hAnsi="Arial" w:cs="Arial"/>
+                <w:color w:val="000000"/>
+                <w:lang w:val="vi-VN"/>
+              </w:rPr>
+              <w:t>TC-10</w:t>
+            </w:r>
+          </w:p>
+        </w:tc>
+        <w:tc>
+          <w:tcPr>
+            <w:tcW w:w="0" w:type="auto"/>
+            <w:tcBorders>
+              <w:top w:val="single" w:sz="6" w:space="0" w:color="1F1F1F"/>
+              <w:left w:val="single" w:sz="6" w:space="0" w:color="1F1F1F"/>
+              <w:bottom w:val="single" w:sz="6" w:space="0" w:color="1F1F1F"/>
+              <w:right w:val="single" w:sz="6" w:space="0" w:color="1F1F1F"/>
+            </w:tcBorders>
+            <w:tcMar>
+              <w:top w:w="240" w:type="dxa"/>
+              <w:left w:w="0" w:type="dxa"/>
+              <w:bottom w:w="240" w:type="dxa"/>
+              <w:right w:w="180" w:type="dxa"/>
+            </w:tcMar>
+            <w:hideMark/>
+          </w:tcPr>
+          <w:p>
+            <w:pPr>
+              <w:pStyle w:val="NormalWeb"/>
+              <w:spacing w:before="0" w:after="260"/>
+              <w:textAlignment w:val="baseline"/>
+              <w:rPr>
+                <w:rFonts w:ascii="Arial" w:hAnsi="Arial" w:cs="Arial"/>
+                <w:color w:val="000000"/>
+                <w:lang w:val="vi-VN"/>
+              </w:rPr>
+            </w:pPr>
+            <w:r>
+              <w:rPr>
+                <w:rFonts w:ascii="Arial" w:hAnsi="Arial" w:cs="Arial"/>
+                <w:color w:val="000000"/>
+                <w:lang w:val="vi-VN"/>
+              </w:rPr>
+              <w:t>Inventory Mgmt</w:t>
+            </w:r>
+          </w:p>
+        </w:tc>
+        <w:tc>
+          <w:tcPr>
+            <w:tcW w:w="0" w:type="auto"/>
+            <w:tcBorders>
+              <w:top w:val="single" w:sz="6" w:space="0" w:color="1F1F1F"/>
+              <w:left w:val="single" w:sz="6" w:space="0" w:color="1F1F1F"/>
+              <w:bottom w:val="single" w:sz="6" w:space="0" w:color="1F1F1F"/>
+              <w:right w:val="single" w:sz="6" w:space="0" w:color="1F1F1F"/>
+            </w:tcBorders>
+            <w:tcMar>
+              <w:top w:w="240" w:type="dxa"/>
+              <w:left w:w="0" w:type="dxa"/>
+              <w:bottom w:w="240" w:type="dxa"/>
+              <w:right w:w="180" w:type="dxa"/>
+            </w:tcMar>
+            <w:hideMark/>
+          </w:tcPr>
+          <w:p>
+            <w:pPr>
+              <w:pStyle w:val="NormalWeb"/>
+              <w:spacing w:before="0" w:after="260"/>
+              <w:textAlignment w:val="baseline"/>
+              <w:rPr>
+                <w:rFonts w:ascii="Arial" w:hAnsi="Arial" w:cs="Arial"/>
+                <w:color w:val="000000"/>
+                <w:lang w:val="vi-VN"/>
+              </w:rPr>
+            </w:pPr>
+            <w:r>
+              <w:rPr>
+                <w:rFonts w:ascii="Arial" w:hAnsi="Arial" w:cs="Arial"/>
+                <w:color w:val="000000"/>
+                <w:lang w:val="vi-VN"/>
+              </w:rPr>
+              <w:t>1. Enter new product details (Name, Base Price, Quantity).</w:t>
+            </w:r>
+          </w:p>
+          <w:p>
+            <w:pPr>
+              <w:pStyle w:val="NormalWeb"/>
+              <w:spacing w:before="0" w:after="260"/>
+              <w:textAlignment w:val="baseline"/>
+              <w:rPr>
+                <w:rFonts w:ascii="Arial" w:hAnsi="Arial" w:cs="Arial"/>
+                <w:color w:val="000000"/>
+                <w:lang w:val="vi-VN"/>
+              </w:rPr>
+            </w:pPr>
+            <w:r>
+              <w:rPr>
+                <w:rFonts w:ascii="Arial" w:hAnsi="Arial" w:cs="Arial"/>
+                <w:color w:val="000000"/>
+                <w:lang w:val="vi-VN"/>
+              </w:rPr>
+              <w:t> </w:t>
+            </w:r>
+          </w:p>
+          <w:p>
+            <w:pPr>
+              <w:pStyle w:val="NormalWeb"/>
+              <w:spacing w:before="0" w:after="260"/>
+              <w:textAlignment w:val="baseline"/>
+              <w:rPr>
+                <w:rFonts w:ascii="Arial" w:hAnsi="Arial" w:cs="Arial"/>
+                <w:color w:val="000000"/>
+                <w:lang w:val="vi-VN"/>
+              </w:rPr>
+            </w:pPr>
+            <w:r>
+              <w:rPr>
+                <w:rFonts w:ascii="Arial" w:hAnsi="Arial" w:cs="Arial"/>
+                <w:color w:val="000000"/>
+                <w:lang w:val="vi-VN"/>
+              </w:rPr>
+              <w:t>2. Click Add.</w:t>
+            </w:r>
+          </w:p>
+        </w:tc>
+        <w:tc>
+          <w:tcPr>
+            <w:tcW w:w="0" w:type="auto"/>
+            <w:tcBorders>
+              <w:top w:val="single" w:sz="6" w:space="0" w:color="1F1F1F"/>
+              <w:left w:val="single" w:sz="6" w:space="0" w:color="1F1F1F"/>
+              <w:bottom w:val="single" w:sz="6" w:space="0" w:color="1F1F1F"/>
+              <w:right w:val="single" w:sz="6" w:space="0" w:color="1F1F1F"/>
+            </w:tcBorders>
+            <w:tcMar>
+              <w:top w:w="240" w:type="dxa"/>
+              <w:left w:w="0" w:type="dxa"/>
+              <w:bottom w:w="240" w:type="dxa"/>
+              <w:right w:w="180" w:type="dxa"/>
+            </w:tcMar>
+            <w:hideMark/>
+          </w:tcPr>
+          <w:p>
+            <w:pPr>
+              <w:pStyle w:val="NormalWeb"/>
+              <w:spacing w:before="0" w:after="260"/>
+              <w:textAlignment w:val="baseline"/>
+              <w:rPr>
+                <w:rFonts w:ascii="Arial" w:hAnsi="Arial" w:cs="Arial"/>
+                <w:color w:val="000000"/>
+                <w:lang w:val="vi-VN"/>
+              </w:rPr>
+            </w:pPr>
+            <w:r>
+              <w:rPr>
+                <w:rFonts w:ascii="Arial" w:hAnsi="Arial" w:cs="Arial"/>
+                <w:color w:val="000000"/>
+                <w:lang w:val="vi-VN"/>
+              </w:rPr>
+              <w:t>The new product is added to the catalog and visible in the UI.</w:t>
+            </w:r>
+          </w:p>
+        </w:tc>
+        <w:tc>
+          <w:tcPr>
+            <w:tcW w:w="0" w:type="auto"/>
+            <w:tcBorders>
+              <w:top w:val="single" w:sz="6" w:space="0" w:color="1F1F1F"/>
+              <w:left w:val="single" w:sz="6" w:space="0" w:color="1F1F1F"/>
+              <w:bottom w:val="single" w:sz="6" w:space="0" w:color="1F1F1F"/>
+              <w:right w:val="single" w:sz="6" w:space="0" w:color="1F1F1F"/>
+            </w:tcBorders>
+            <w:tcMar>
+              <w:top w:w="240" w:type="dxa"/>
+              <w:left w:w="0" w:type="dxa"/>
+              <w:bottom w:w="240" w:type="dxa"/>
+              <w:right w:w="0" w:type="dxa"/>
+            </w:tcMar>
+            <w:hideMark/>
+          </w:tcPr>
+          <w:p>
+            <w:pPr>
+              <w:pStyle w:val="NormalWeb"/>
+              <w:spacing w:before="0" w:after="260"/>
+              <w:textAlignment w:val="baseline"/>
+              <w:rPr>
+                <w:rFonts w:ascii="Arial" w:hAnsi="Arial" w:cs="Arial"/>
+                <w:b/>
+                <w:bCs/>
+                <w:color w:val="000000"/>
+                <w:lang w:val="vi-VN"/>
+              </w:rPr>
+            </w:pPr>
+            <w:r>
+              <w:rPr>
+                <w:rFonts w:ascii="Arial" w:hAnsi="Arial" w:cs="Arial"/>
+                <w:b/>
+                <w:bCs/>
+                <w:color w:val="000000"/>
+                <w:lang w:val="vi-VN"/>
+              </w:rPr>
+              <w:t>Pass</w:t>
+            </w:r>
+          </w:p>
+        </w:tc>
+      </w:tr>
+      <w:tr>
+        <w:trPr>
+          <w:trHeight w:val="2550"/>
+        </w:trPr>
+        <w:tc>
+          <w:tcPr>
+            <w:tcW w:w="0" w:type="auto"/>
+            <w:tcBorders>
+              <w:top w:val="single" w:sz="6" w:space="0" w:color="1F1F1F"/>
+              <w:left w:val="single" w:sz="6" w:space="0" w:color="1F1F1F"/>
+              <w:bottom w:val="single" w:sz="6" w:space="0" w:color="1F1F1F"/>
+              <w:right w:val="single" w:sz="6" w:space="0" w:color="1F1F1F"/>
+            </w:tcBorders>
+            <w:tcMar>
+              <w:top w:w="240" w:type="dxa"/>
+              <w:left w:w="0" w:type="dxa"/>
+              <w:bottom w:w="240" w:type="dxa"/>
+              <w:right w:w="180" w:type="dxa"/>
+            </w:tcMar>
+            <w:hideMark/>
+          </w:tcPr>
+          <w:p>
+            <w:pPr>
+              <w:pStyle w:val="NormalWeb"/>
+              <w:spacing w:before="0" w:after="260"/>
+              <w:textAlignment w:val="baseline"/>
+              <w:rPr>
+                <w:rFonts w:ascii="Arial" w:hAnsi="Arial" w:cs="Arial"/>
+                <w:color w:val="000000"/>
+                <w:lang w:val="vi-VN"/>
+              </w:rPr>
+            </w:pPr>
+            <w:r>
+              <w:rPr>
+                <w:rFonts w:ascii="Arial" w:hAnsi="Arial" w:cs="Arial"/>
+                <w:color w:val="000000"/>
+                <w:lang w:val="vi-VN"/>
+              </w:rPr>
+              <w:t>TC-11</w:t>
+            </w:r>
+          </w:p>
+        </w:tc>
+        <w:tc>
+          <w:tcPr>
+            <w:tcW w:w="0" w:type="auto"/>
+            <w:tcBorders>
+              <w:top w:val="single" w:sz="6" w:space="0" w:color="1F1F1F"/>
+              <w:left w:val="single" w:sz="6" w:space="0" w:color="1F1F1F"/>
+              <w:bottom w:val="single" w:sz="6" w:space="0" w:color="1F1F1F"/>
+              <w:right w:val="single" w:sz="6" w:space="0" w:color="1F1F1F"/>
+            </w:tcBorders>
+            <w:tcMar>
+              <w:top w:w="240" w:type="dxa"/>
+              <w:left w:w="0" w:type="dxa"/>
+              <w:bottom w:w="240" w:type="dxa"/>
+              <w:right w:w="180" w:type="dxa"/>
+            </w:tcMar>
+            <w:hideMark/>
+          </w:tcPr>
+          <w:p>
+            <w:pPr>
+              <w:pStyle w:val="NormalWeb"/>
+              <w:spacing w:before="0" w:after="260"/>
+              <w:textAlignment w:val="baseline"/>
+              <w:rPr>
+                <w:rFonts w:ascii="Arial" w:hAnsi="Arial" w:cs="Arial"/>
+                <w:color w:val="000000"/>
+                <w:lang w:val="vi-VN"/>
+              </w:rPr>
+            </w:pPr>
+            <w:r>
+              <w:rPr>
+                <w:rFonts w:ascii="Arial" w:hAnsi="Arial" w:cs="Arial"/>
+                <w:color w:val="000000"/>
+                <w:lang w:val="vi-VN"/>
+              </w:rPr>
+              <w:t>Hardware Tracking</w:t>
+            </w:r>
+          </w:p>
+        </w:tc>
+        <w:tc>
+          <w:tcPr>
+            <w:tcW w:w="0" w:type="auto"/>
+            <w:tcBorders>
+              <w:top w:val="single" w:sz="6" w:space="0" w:color="1F1F1F"/>
+              <w:left w:val="single" w:sz="6" w:space="0" w:color="1F1F1F"/>
+              <w:bottom w:val="single" w:sz="6" w:space="0" w:color="1F1F1F"/>
+              <w:right w:val="single" w:sz="6" w:space="0" w:color="1F1F1F"/>
+            </w:tcBorders>
+            <w:tcMar>
+              <w:top w:w="240" w:type="dxa"/>
+              <w:left w:w="0" w:type="dxa"/>
+              <w:bottom w:w="240" w:type="dxa"/>
+              <w:right w:w="180" w:type="dxa"/>
+            </w:tcMar>
+            <w:hideMark/>
+          </w:tcPr>
+          <w:p>
+            <w:pPr>
+              <w:pStyle w:val="NormalWeb"/>
+              <w:spacing w:before="0" w:after="260"/>
+              <w:textAlignment w:val="baseline"/>
+              <w:rPr>
+                <w:rFonts w:ascii="Arial" w:hAnsi="Arial" w:cs="Arial"/>
+                <w:color w:val="000000"/>
+                <w:lang w:val="vi-VN"/>
+              </w:rPr>
+            </w:pPr>
+            <w:r>
+              <w:rPr>
+                <w:rFonts w:ascii="Arial" w:hAnsi="Arial" w:cs="Arial"/>
+                <w:color w:val="000000"/>
+                <w:lang w:val="vi-VN"/>
+              </w:rPr>
+              <w:t>1. Select a hardware component.</w:t>
+            </w:r>
+          </w:p>
+          <w:p>
+            <w:pPr>
+              <w:pStyle w:val="NormalWeb"/>
+              <w:spacing w:before="0" w:after="260"/>
+              <w:textAlignment w:val="baseline"/>
+              <w:rPr>
+                <w:rFonts w:ascii="Arial" w:hAnsi="Arial" w:cs="Arial"/>
+                <w:color w:val="000000"/>
+                <w:lang w:val="vi-VN"/>
+              </w:rPr>
+            </w:pPr>
+            <w:r>
+              <w:rPr>
+                <w:rFonts w:ascii="Arial" w:hAnsi="Arial" w:cs="Arial"/>
+                <w:color w:val="000000"/>
+                <w:lang w:val="vi-VN"/>
+              </w:rPr>
+              <w:t> </w:t>
+            </w:r>
+          </w:p>
+          <w:p>
+            <w:pPr>
+              <w:pStyle w:val="NormalWeb"/>
+              <w:spacing w:before="0" w:after="260"/>
+              <w:textAlignment w:val="baseline"/>
+              <w:rPr>
+                <w:rFonts w:ascii="Arial" w:hAnsi="Arial" w:cs="Arial"/>
+                <w:color w:val="000000"/>
+                <w:lang w:val="vi-VN"/>
+              </w:rPr>
+            </w:pPr>
+            <w:r>
+              <w:rPr>
+                <w:rFonts w:ascii="Arial" w:hAnsi="Arial" w:cs="Arial"/>
+                <w:color w:val="000000"/>
+                <w:lang w:val="vi-VN"/>
+              </w:rPr>
+              <w:t>2. Update its Specs (CPU, RAM).</w:t>
+            </w:r>
+          </w:p>
+        </w:tc>
+        <w:tc>
+          <w:tcPr>
+            <w:tcW w:w="0" w:type="auto"/>
+            <w:tcBorders>
+              <w:top w:val="single" w:sz="6" w:space="0" w:color="1F1F1F"/>
+              <w:left w:val="single" w:sz="6" w:space="0" w:color="1F1F1F"/>
+              <w:bottom w:val="single" w:sz="6" w:space="0" w:color="1F1F1F"/>
+              <w:right w:val="single" w:sz="6" w:space="0" w:color="1F1F1F"/>
+            </w:tcBorders>
+            <w:tcMar>
+              <w:top w:w="240" w:type="dxa"/>
+              <w:left w:w="0" w:type="dxa"/>
+              <w:bottom w:w="240" w:type="dxa"/>
+              <w:right w:w="180" w:type="dxa"/>
+            </w:tcMar>
+            <w:hideMark/>
+          </w:tcPr>
+          <w:p>
+            <w:pPr>
+              <w:pStyle w:val="NormalWeb"/>
+              <w:spacing w:before="0" w:after="260"/>
+              <w:textAlignment w:val="baseline"/>
+              <w:rPr>
+                <w:rFonts w:ascii="Arial" w:hAnsi="Arial" w:cs="Arial"/>
+                <w:color w:val="000000"/>
+                <w:lang w:val="vi-VN"/>
+              </w:rPr>
+            </w:pPr>
+            <w:r>
+              <w:rPr>
+                <w:rFonts w:ascii="Arial" w:hAnsi="Arial" w:cs="Arial"/>
+                <w:color w:val="000000"/>
+                <w:lang w:val="vi-VN"/>
+              </w:rPr>
+              <w:t>The technical specifications are updated and formatted correctly.</w:t>
+            </w:r>
+          </w:p>
+        </w:tc>
+        <w:tc>
+          <w:tcPr>
+            <w:tcW w:w="0" w:type="auto"/>
+            <w:tcBorders>
+              <w:top w:val="single" w:sz="6" w:space="0" w:color="1F1F1F"/>
+              <w:left w:val="single" w:sz="6" w:space="0" w:color="1F1F1F"/>
+              <w:bottom w:val="single" w:sz="6" w:space="0" w:color="1F1F1F"/>
+              <w:right w:val="single" w:sz="6" w:space="0" w:color="1F1F1F"/>
+            </w:tcBorders>
+            <w:tcMar>
+              <w:top w:w="240" w:type="dxa"/>
+              <w:left w:w="0" w:type="dxa"/>
+              <w:bottom w:w="240" w:type="dxa"/>
+              <w:right w:w="0" w:type="dxa"/>
+            </w:tcMar>
+            <w:hideMark/>
+          </w:tcPr>
+          <w:p>
+            <w:pPr>
+              <w:pStyle w:val="NormalWeb"/>
+              <w:spacing w:before="0" w:after="260"/>
+              <w:textAlignment w:val="baseline"/>
+              <w:rPr>
+                <w:rFonts w:ascii="Arial" w:hAnsi="Arial" w:cs="Arial"/>
+                <w:b/>
+                <w:bCs/>
+                <w:color w:val="000000"/>
+                <w:lang w:val="vi-VN"/>
+              </w:rPr>
+            </w:pPr>
+            <w:r>
+              <w:rPr>
+                <w:rFonts w:ascii="Arial" w:hAnsi="Arial" w:cs="Arial"/>
+                <w:b/>
+                <w:bCs/>
+                <w:color w:val="000000"/>
+                <w:lang w:val="vi-VN"/>
+              </w:rPr>
+              <w:t>Pass</w:t>
+            </w:r>
+          </w:p>
+        </w:tc>
+      </w:tr>
+      <w:tr>
+        <w:trPr>
+          <w:trHeight w:val="2385"/>
+        </w:trPr>
+        <w:tc>
+          <w:tcPr>
+            <w:tcW w:w="0" w:type="auto"/>
+            <w:tcBorders>
+              <w:top w:val="single" w:sz="6" w:space="0" w:color="1F1F1F"/>
+              <w:left w:val="single" w:sz="6" w:space="0" w:color="1F1F1F"/>
+              <w:bottom w:val="single" w:sz="6" w:space="0" w:color="1F1F1F"/>
+              <w:right w:val="single" w:sz="6" w:space="0" w:color="1F1F1F"/>
+            </w:tcBorders>
+            <w:tcMar>
+              <w:top w:w="240" w:type="dxa"/>
+              <w:left w:w="0" w:type="dxa"/>
+              <w:bottom w:w="240" w:type="dxa"/>
+              <w:right w:w="180" w:type="dxa"/>
+            </w:tcMar>
+            <w:hideMark/>
+          </w:tcPr>
+          <w:p>
+            <w:pPr>
+              <w:pStyle w:val="NormalWeb"/>
+              <w:spacing w:before="0" w:after="260"/>
+              <w:textAlignment w:val="baseline"/>
+              <w:rPr>
+                <w:rFonts w:ascii="Arial" w:hAnsi="Arial" w:cs="Arial"/>
+                <w:color w:val="000000"/>
+                <w:lang w:val="vi-VN"/>
+              </w:rPr>
+            </w:pPr>
+            <w:r>
+              <w:rPr>
+                <w:rFonts w:ascii="Arial" w:hAnsi="Arial" w:cs="Arial"/>
+                <w:color w:val="000000"/>
+                <w:lang w:val="vi-VN"/>
+              </w:rPr>
+              <w:lastRenderedPageBreak/>
+              <w:t>TC-12</w:t>
+            </w:r>
+          </w:p>
+        </w:tc>
+        <w:tc>
+          <w:tcPr>
+            <w:tcW w:w="0" w:type="auto"/>
+            <w:tcBorders>
+              <w:top w:val="single" w:sz="6" w:space="0" w:color="1F1F1F"/>
+              <w:left w:val="single" w:sz="6" w:space="0" w:color="1F1F1F"/>
+              <w:bottom w:val="single" w:sz="6" w:space="0" w:color="1F1F1F"/>
+              <w:right w:val="single" w:sz="6" w:space="0" w:color="1F1F1F"/>
+            </w:tcBorders>
+            <w:tcMar>
+              <w:top w:w="240" w:type="dxa"/>
+              <w:left w:w="0" w:type="dxa"/>
+              <w:bottom w:w="240" w:type="dxa"/>
+              <w:right w:w="180" w:type="dxa"/>
+            </w:tcMar>
+            <w:hideMark/>
+          </w:tcPr>
+          <w:p>
+            <w:pPr>
+              <w:pStyle w:val="NormalWeb"/>
+              <w:spacing w:before="0" w:after="260"/>
+              <w:textAlignment w:val="baseline"/>
+              <w:rPr>
+                <w:rFonts w:ascii="Arial" w:hAnsi="Arial" w:cs="Arial"/>
+                <w:color w:val="000000"/>
+                <w:lang w:val="vi-VN"/>
+              </w:rPr>
+            </w:pPr>
+            <w:r>
+              <w:rPr>
+                <w:rFonts w:ascii="Arial" w:hAnsi="Arial" w:cs="Arial"/>
+                <w:color w:val="000000"/>
+                <w:lang w:val="vi-VN"/>
+              </w:rPr>
+              <w:t>Reporting</w:t>
+            </w:r>
+          </w:p>
+        </w:tc>
+        <w:tc>
+          <w:tcPr>
+            <w:tcW w:w="0" w:type="auto"/>
+            <w:tcBorders>
+              <w:top w:val="single" w:sz="6" w:space="0" w:color="1F1F1F"/>
+              <w:left w:val="single" w:sz="6" w:space="0" w:color="1F1F1F"/>
+              <w:bottom w:val="single" w:sz="6" w:space="0" w:color="1F1F1F"/>
+              <w:right w:val="single" w:sz="6" w:space="0" w:color="1F1F1F"/>
+            </w:tcBorders>
+            <w:tcMar>
+              <w:top w:w="240" w:type="dxa"/>
+              <w:left w:w="0" w:type="dxa"/>
+              <w:bottom w:w="240" w:type="dxa"/>
+              <w:right w:w="180" w:type="dxa"/>
+            </w:tcMar>
+            <w:hideMark/>
+          </w:tcPr>
+          <w:p>
+            <w:pPr>
+              <w:pStyle w:val="NormalWeb"/>
+              <w:spacing w:before="0" w:after="260"/>
+              <w:textAlignment w:val="baseline"/>
+              <w:rPr>
+                <w:rFonts w:ascii="Arial" w:hAnsi="Arial" w:cs="Arial"/>
+                <w:color w:val="000000"/>
+                <w:lang w:val="vi-VN"/>
+              </w:rPr>
+            </w:pPr>
+            <w:r>
+              <w:rPr>
+                <w:rFonts w:ascii="Arial" w:hAnsi="Arial" w:cs="Arial"/>
+                <w:color w:val="000000"/>
+                <w:lang w:val="vi-VN"/>
+              </w:rPr>
+              <w:t>1. Select a date range with existing transactions.</w:t>
+            </w:r>
+          </w:p>
+          <w:p>
+            <w:pPr>
+              <w:pStyle w:val="NormalWeb"/>
+              <w:spacing w:before="0" w:after="260"/>
+              <w:textAlignment w:val="baseline"/>
+              <w:rPr>
+                <w:rFonts w:ascii="Arial" w:hAnsi="Arial" w:cs="Arial"/>
+                <w:color w:val="000000"/>
+                <w:lang w:val="vi-VN"/>
+              </w:rPr>
+            </w:pPr>
+            <w:r>
+              <w:rPr>
+                <w:rFonts w:ascii="Arial" w:hAnsi="Arial" w:cs="Arial"/>
+                <w:color w:val="000000"/>
+                <w:lang w:val="vi-VN"/>
+              </w:rPr>
+              <w:t> </w:t>
+            </w:r>
+          </w:p>
+          <w:p>
+            <w:pPr>
+              <w:pStyle w:val="NormalWeb"/>
+              <w:spacing w:before="0" w:after="260"/>
+              <w:textAlignment w:val="baseline"/>
+              <w:rPr>
+                <w:rFonts w:ascii="Arial" w:hAnsi="Arial" w:cs="Arial"/>
+                <w:color w:val="000000"/>
+                <w:lang w:val="vi-VN"/>
+              </w:rPr>
+            </w:pPr>
+            <w:r>
+              <w:rPr>
+                <w:rFonts w:ascii="Arial" w:hAnsi="Arial" w:cs="Arial"/>
+                <w:color w:val="000000"/>
+                <w:lang w:val="vi-VN"/>
+              </w:rPr>
+              <w:t>2. Generate Report.</w:t>
+            </w:r>
+          </w:p>
+        </w:tc>
+        <w:tc>
+          <w:tcPr>
+            <w:tcW w:w="0" w:type="auto"/>
+            <w:tcBorders>
+              <w:top w:val="single" w:sz="6" w:space="0" w:color="1F1F1F"/>
+              <w:left w:val="single" w:sz="6" w:space="0" w:color="1F1F1F"/>
+              <w:bottom w:val="single" w:sz="6" w:space="0" w:color="1F1F1F"/>
+              <w:right w:val="single" w:sz="6" w:space="0" w:color="1F1F1F"/>
+            </w:tcBorders>
+            <w:tcMar>
+              <w:top w:w="240" w:type="dxa"/>
+              <w:left w:w="0" w:type="dxa"/>
+              <w:bottom w:w="240" w:type="dxa"/>
+              <w:right w:w="180" w:type="dxa"/>
+            </w:tcMar>
+            <w:hideMark/>
+          </w:tcPr>
+          <w:p>
+            <w:pPr>
+              <w:pStyle w:val="NormalWeb"/>
+              <w:spacing w:before="0" w:after="260"/>
+              <w:textAlignment w:val="baseline"/>
+              <w:rPr>
+                <w:rFonts w:ascii="Arial" w:hAnsi="Arial" w:cs="Arial"/>
+                <w:color w:val="000000"/>
+                <w:lang w:val="vi-VN"/>
+              </w:rPr>
+            </w:pPr>
+            <w:r>
+              <w:rPr>
+                <w:rFonts w:ascii="Arial" w:hAnsi="Arial" w:cs="Arial"/>
+                <w:color w:val="000000"/>
+                <w:lang w:val="vi-VN"/>
+              </w:rPr>
+              <w:t>System displays accurate total revenue and charts based on database records.</w:t>
+            </w:r>
+          </w:p>
+        </w:tc>
+        <w:tc>
+          <w:tcPr>
+            <w:tcW w:w="0" w:type="auto"/>
+            <w:tcBorders>
+              <w:top w:val="single" w:sz="6" w:space="0" w:color="1F1F1F"/>
+              <w:left w:val="single" w:sz="6" w:space="0" w:color="1F1F1F"/>
+              <w:bottom w:val="single" w:sz="6" w:space="0" w:color="1F1F1F"/>
+              <w:right w:val="single" w:sz="6" w:space="0" w:color="1F1F1F"/>
+            </w:tcBorders>
+            <w:tcMar>
+              <w:top w:w="240" w:type="dxa"/>
+              <w:left w:w="0" w:type="dxa"/>
+              <w:bottom w:w="240" w:type="dxa"/>
+              <w:right w:w="0" w:type="dxa"/>
+            </w:tcMar>
+            <w:hideMark/>
+          </w:tcPr>
+          <w:p>
+            <w:pPr>
+              <w:pStyle w:val="NormalWeb"/>
+              <w:spacing w:before="0" w:after="260"/>
+              <w:textAlignment w:val="baseline"/>
+              <w:rPr>
+                <w:rFonts w:ascii="Arial" w:hAnsi="Arial" w:cs="Arial"/>
+                <w:color w:val="000000"/>
+                <w:lang w:val="vi-VN"/>
+              </w:rPr>
+            </w:pPr>
+            <w:r>
+              <w:rPr>
+                <w:rFonts w:ascii="Arial" w:hAnsi="Arial" w:cs="Arial"/>
+                <w:color w:val="000000"/>
+                <w:lang w:val="vi-VN"/>
+              </w:rPr>
+              <w:t>Pass</w:t>
+            </w:r>
+          </w:p>
+        </w:tc>
+      </w:tr>
+    </w:tbl>
+    <w:p>
+      <w:pPr>
+        <w:pStyle w:val="NormalWeb"/>
+        <w:spacing w:before="0" w:after="260"/>
+        <w:textAlignment w:val="baseline"/>
+        <w:rPr>
+          <w:rFonts w:ascii="Arial" w:hAnsi="Arial" w:cs="Arial"/>
+          <w:b/>
+          <w:bCs/>
+          <w:color w:val="000000"/>
+          <w:lang w:val="vi-VN"/>
+        </w:rPr>
+      </w:pPr>
+      <w:r>
+        <w:rPr>
+          <w:rFonts w:ascii="Arial" w:hAnsi="Arial" w:cs="Arial"/>
+          <w:b/>
+          <w:bCs/>
+          <w:color w:val="000000"/>
+          <w:lang w:val="vi-VN"/>
+        </w:rPr>
+        <w:t> </w:t>
+      </w:r>
+    </w:p>
+    <w:p>
+      <w:pPr>
+        <w:pStyle w:val="NormalWeb"/>
+        <w:spacing w:before="0" w:after="260"/>
+        <w:textAlignment w:val="baseline"/>
+        <w:rPr>
+          <w:rFonts w:ascii="Arial" w:hAnsi="Arial" w:cs="Arial"/>
+          <w:b/>
+          <w:bCs/>
+          <w:color w:val="000000"/>
+          <w:lang w:val="vi-VN"/>
+        </w:rPr>
+      </w:pPr>
+      <w:r>
+        <w:rPr>
+          <w:rFonts w:ascii="Arial" w:hAnsi="Arial" w:cs="Arial"/>
+          <w:b/>
+          <w:bCs/>
+          <w:color w:val="000000"/>
+          <w:lang w:val="vi-VN"/>
+        </w:rPr>
+        <w:t>6.2. Traceability of test cases to use cases</w:t>
+      </w:r>
+    </w:p>
+    <w:p>
+      <w:pPr>
+        <w:pStyle w:val="NormalWeb"/>
+        <w:spacing w:before="0" w:after="260"/>
+        <w:textAlignment w:val="baseline"/>
+        <w:rPr>
+          <w:rFonts w:ascii="Arial" w:hAnsi="Arial" w:cs="Arial"/>
+          <w:color w:val="000000"/>
+          <w:lang w:val="vi-VN"/>
+        </w:rPr>
+      </w:pPr>
+      <w:r>
+        <w:rPr>
+          <w:rFonts w:ascii="Arial" w:hAnsi="Arial" w:cs="Arial"/>
+          <w:color w:val="000000"/>
+          <w:lang w:val="vi-VN"/>
+        </w:rPr>
+        <w:t xml:space="preserve">To ensure comprehensive coverage, test cases are directly mapped to the defined Use </w:t>
+      </w:r>
+      <w:r>
+        <w:rPr>
+          <w:rFonts w:ascii="Arial" w:hAnsi="Arial" w:cs="Arial"/>
+          <w:color w:val="000000"/>
+          <w:lang w:val="vi-VN"/>
+        </w:rPr>
+        <w:t>Cases:</w:t>
+      </w:r>
+    </w:p>
+    <w:p>
+      <w:pPr>
+        <w:pStyle w:val="NormalWeb"/>
+        <w:numPr>
+          <w:ilvl w:val="0"/>
+          <w:numId w:val="35"/>
+        </w:numPr>
+        <w:spacing w:before="0" w:after="260"/>
+        <w:textAlignment w:val="baseline"/>
+        <w:rPr>
+          <w:rFonts w:ascii="Arial" w:hAnsi="Arial" w:cs="Arial"/>
+          <w:color w:val="000000"/>
+          <w:lang w:val="vi-VN"/>
+        </w:rPr>
+      </w:pPr>
+      <w:r>
+        <w:rPr>
+          <w:rFonts w:ascii="Arial" w:hAnsi="Arial" w:cs="Arial"/>
+          <w:b/>
+          <w:bCs/>
+          <w:color w:val="000000"/>
+          <w:lang w:val="vi-VN"/>
+        </w:rPr>
+        <w:t>UC1 (FR1)</w:t>
+      </w:r>
+      <w:r>
+        <w:rPr>
+          <w:rFonts w:ascii="Arial" w:hAnsi="Arial" w:cs="Arial"/>
+          <w:color w:val="000000"/>
+          <w:lang w:val="vi-VN"/>
+        </w:rPr>
+        <w:t>: Login / Logout → Covered by TC-01, TC-02</w:t>
+      </w:r>
+    </w:p>
+    <w:p>
+      <w:pPr>
+        <w:pStyle w:val="NormalWeb"/>
+        <w:numPr>
+          <w:ilvl w:val="0"/>
+          <w:numId w:val="35"/>
+        </w:numPr>
+        <w:spacing w:before="0" w:after="260"/>
+        <w:textAlignment w:val="baseline"/>
+        <w:rPr>
+          <w:rFonts w:ascii="Arial" w:hAnsi="Arial" w:cs="Arial"/>
+          <w:color w:val="000000"/>
+          <w:lang w:val="vi-VN"/>
+        </w:rPr>
+      </w:pPr>
+      <w:r>
+        <w:rPr>
+          <w:rFonts w:ascii="Arial" w:hAnsi="Arial" w:cs="Arial"/>
+          <w:b/>
+          <w:bCs/>
+          <w:color w:val="000000"/>
+          <w:lang w:val="vi-VN"/>
+        </w:rPr>
+        <w:t>UC2 (FR2)</w:t>
+      </w:r>
+      <w:r>
+        <w:rPr>
+          <w:rFonts w:ascii="Arial" w:hAnsi="Arial" w:cs="Arial"/>
+          <w:color w:val="000000"/>
+          <w:lang w:val="vi-VN"/>
+        </w:rPr>
+        <w:t>: Generate Sales Invoices → Covered by TC-03</w:t>
+      </w:r>
+    </w:p>
+    <w:p>
+      <w:pPr>
+        <w:pStyle w:val="NormalWeb"/>
+        <w:numPr>
+          <w:ilvl w:val="0"/>
+          <w:numId w:val="35"/>
+        </w:numPr>
+        <w:spacing w:before="0" w:after="260"/>
+        <w:textAlignment w:val="baseline"/>
+        <w:rPr>
+          <w:rFonts w:ascii="Arial" w:hAnsi="Arial" w:cs="Arial"/>
+          <w:color w:val="000000"/>
+          <w:lang w:val="vi-VN"/>
+        </w:rPr>
+      </w:pPr>
+      <w:r>
+        <w:rPr>
+          <w:rFonts w:ascii="Arial" w:hAnsi="Arial" w:cs="Arial"/>
+          <w:b/>
+          <w:bCs/>
+          <w:color w:val="000000"/>
+          <w:lang w:val="vi-VN"/>
+        </w:rPr>
+        <w:t>UC3 (FR4):</w:t>
+      </w:r>
+      <w:r>
+        <w:rPr>
+          <w:rFonts w:ascii="Arial" w:hAnsi="Arial" w:cs="Arial"/>
+          <w:color w:val="000000"/>
+          <w:lang w:val="vi-VN"/>
+        </w:rPr>
+        <w:t xml:space="preserve"> Manage Customers → Covered by TC-06, TC-07</w:t>
+      </w:r>
+    </w:p>
+    <w:p>
+      <w:pPr>
+        <w:pStyle w:val="NormalWeb"/>
+        <w:numPr>
+          <w:ilvl w:val="0"/>
+          <w:numId w:val="35"/>
+        </w:numPr>
+        <w:spacing w:before="0" w:after="260"/>
+        <w:textAlignment w:val="baseline"/>
+        <w:rPr>
+          <w:rFonts w:ascii="Arial" w:hAnsi="Arial" w:cs="Arial"/>
+          <w:color w:val="000000"/>
+          <w:lang w:val="vi-VN"/>
+        </w:rPr>
+      </w:pPr>
+      <w:r>
+        <w:rPr>
+          <w:rFonts w:ascii="Arial" w:hAnsi="Arial" w:cs="Arial"/>
+          <w:b/>
+          <w:bCs/>
+          <w:color w:val="000000"/>
+          <w:lang w:val="vi-VN"/>
+        </w:rPr>
+        <w:t>UC4 (FR5):</w:t>
+      </w:r>
+      <w:r>
+        <w:rPr>
+          <w:rFonts w:ascii="Arial" w:hAnsi="Arial" w:cs="Arial"/>
+          <w:color w:val="000000"/>
+          <w:lang w:val="vi-VN"/>
+        </w:rPr>
+        <w:t xml:space="preserve"> Manage Employees → Covered by TC-08, TC-09</w:t>
+      </w:r>
+    </w:p>
+    <w:p>
+      <w:pPr>
+        <w:pStyle w:val="NormalWeb"/>
+        <w:numPr>
+          <w:ilvl w:val="0"/>
+          <w:numId w:val="35"/>
+        </w:numPr>
+        <w:spacing w:before="0" w:after="260"/>
+        <w:textAlignment w:val="baseline"/>
+        <w:rPr>
+          <w:rFonts w:ascii="Arial" w:hAnsi="Arial" w:cs="Arial"/>
+          <w:color w:val="000000"/>
+          <w:lang w:val="vi-VN"/>
+        </w:rPr>
+      </w:pPr>
+      <w:r>
+        <w:rPr>
+          <w:rFonts w:ascii="Arial" w:hAnsi="Arial" w:cs="Arial"/>
+          <w:b/>
+          <w:bCs/>
+          <w:color w:val="000000"/>
+          <w:lang w:val="vi-VN"/>
+        </w:rPr>
+        <w:t>UC5 (FR7):</w:t>
+      </w:r>
+      <w:r>
+        <w:rPr>
+          <w:rFonts w:ascii="Arial" w:hAnsi="Arial" w:cs="Arial"/>
+          <w:color w:val="000000"/>
+          <w:lang w:val="vi-VN"/>
+        </w:rPr>
+        <w:t xml:space="preserve"> View Sales Reports → Covered by TC-12</w:t>
+      </w:r>
+    </w:p>
+    <w:p>
+      <w:pPr>
+        <w:pStyle w:val="NormalWeb"/>
+        <w:numPr>
+          <w:ilvl w:val="0"/>
+          <w:numId w:val="35"/>
+        </w:numPr>
+        <w:spacing w:before="0" w:after="260"/>
+        <w:textAlignment w:val="baseline"/>
+        <w:rPr>
+          <w:rFonts w:ascii="Arial" w:hAnsi="Arial" w:cs="Arial"/>
+          <w:color w:val="000000"/>
+          <w:lang w:val="vi-VN"/>
+        </w:rPr>
+      </w:pPr>
+      <w:r>
+        <w:rPr>
+          <w:rFonts w:ascii="Arial" w:hAnsi="Arial" w:cs="Arial"/>
+          <w:b/>
+          <w:bCs/>
+          <w:color w:val="000000"/>
+          <w:lang w:val="vi-VN"/>
+        </w:rPr>
+        <w:t>UC6 (FR3):</w:t>
+      </w:r>
+      <w:r>
+        <w:rPr>
+          <w:rFonts w:ascii="Arial" w:hAnsi="Arial" w:cs="Arial"/>
+          <w:color w:val="000000"/>
+          <w:lang w:val="vi-VN"/>
+        </w:rPr>
+        <w:t xml:space="preserve"> Manage Inventory → Covered by TC-10</w:t>
+      </w:r>
+    </w:p>
+    <w:p>
+      <w:pPr>
+        <w:pStyle w:val="NormalWeb"/>
+        <w:numPr>
+          <w:ilvl w:val="0"/>
+          <w:numId w:val="35"/>
+        </w:numPr>
+        <w:spacing w:before="0" w:after="260"/>
+        <w:textAlignment w:val="baseline"/>
+        <w:rPr>
+          <w:rFonts w:ascii="Arial" w:hAnsi="Arial" w:cs="Arial"/>
+          <w:color w:val="000000"/>
+          <w:lang w:val="vi-VN"/>
+        </w:rPr>
+      </w:pPr>
+      <w:r>
+        <w:rPr>
+          <w:rFonts w:ascii="Arial" w:hAnsi="Arial" w:cs="Arial"/>
+          <w:b/>
+          <w:bCs/>
+          <w:color w:val="000000"/>
+          <w:lang w:val="vi-VN"/>
+        </w:rPr>
+        <w:t>UC7 (FR3):</w:t>
+      </w:r>
+      <w:r>
+        <w:rPr>
+          <w:rFonts w:ascii="Arial" w:hAnsi="Arial" w:cs="Arial"/>
+          <w:color w:val="000000"/>
+          <w:lang w:val="vi-VN"/>
+        </w:rPr>
+        <w:t xml:space="preserve"> Track Hardware Components → Covered by TC-11</w:t>
+      </w:r>
+    </w:p>
+    <w:p>
+      <w:pPr>
+        <w:pStyle w:val="NormalWeb"/>
+        <w:numPr>
+          <w:ilvl w:val="0"/>
+          <w:numId w:val="35"/>
+        </w:numPr>
+        <w:spacing w:before="0" w:after="260"/>
+        <w:textAlignment w:val="baseline"/>
+        <w:rPr>
+          <w:rFonts w:ascii="Arial" w:hAnsi="Arial" w:cs="Arial"/>
+          <w:color w:val="000000"/>
+          <w:lang w:val="vi-VN"/>
+        </w:rPr>
+      </w:pPr>
+      <w:r>
+        <w:rPr>
+          <w:rFonts w:ascii="Arial" w:hAnsi="Arial" w:cs="Arial"/>
+          <w:b/>
+          <w:bCs/>
+          <w:color w:val="000000"/>
+          <w:lang w:val="vi-VN"/>
+        </w:rPr>
+        <w:t>UC8 (FR6):</w:t>
+      </w:r>
+      <w:r>
+        <w:rPr>
+          <w:rFonts w:ascii="Arial" w:hAnsi="Arial" w:cs="Arial"/>
+          <w:color w:val="000000"/>
+          <w:lang w:val="vi-VN"/>
+        </w:rPr>
+        <w:t xml:space="preserve"> Update Stock Levels → Covered by TC-04, TC-05</w:t>
+      </w:r>
+      <w:r>
+        <w:rPr>
+          <w:rFonts w:ascii="Arial" w:hAnsi="Arial" w:cs="Arial"/>
+          <w:b/>
+          <w:bCs/>
+          <w:color w:val="000000"/>
+          <w:lang w:val="vi-VN"/>
+        </w:rPr>
+        <w:t> </w:t>
+      </w:r>
+    </w:p>
+    <w:p>
+      <w:pPr>
+        <w:pStyle w:val="NormalWeb"/>
+        <w:spacing w:before="0" w:after="260"/>
+        <w:textAlignment w:val="baseline"/>
+        <w:rPr>
+          <w:rFonts w:ascii="Arial" w:hAnsi="Arial" w:cs="Arial"/>
+          <w:b/>
+          <w:bCs/>
+          <w:color w:val="000000"/>
+          <w:lang w:val="vi-VN"/>
+        </w:rPr>
+      </w:pPr>
+      <w:r>
+        <w:rPr>
+          <w:rFonts w:ascii="Arial" w:hAnsi="Arial" w:cs="Arial"/>
+          <w:b/>
+          <w:bCs/>
+          <w:color w:val="000000"/>
+          <w:lang w:val="vi-VN"/>
+        </w:rPr>
+        <w:t>6.3. Techniques used for test generation</w:t>
+      </w:r>
+    </w:p>
+    <w:p>
+      <w:pPr>
+        <w:pStyle w:val="NormalWeb"/>
+        <w:spacing w:before="0" w:after="260"/>
+        <w:textAlignment w:val="baseline"/>
+        <w:rPr>
+          <w:rFonts w:ascii="Arial" w:hAnsi="Arial" w:cs="Arial"/>
+          <w:color w:val="000000"/>
+          <w:lang w:val="vi-VN"/>
+        </w:rPr>
+      </w:pPr>
+      <w:r>
+        <w:rPr>
+          <w:rFonts w:ascii="Arial" w:hAnsi="Arial" w:cs="Arial"/>
+          <w:color w:val="000000"/>
+          <w:lang w:val="vi-VN"/>
+        </w:rPr>
+        <w:t>Both Black-box and White-box testing techniques were applied during development:</w:t>
+      </w:r>
+    </w:p>
+    <w:p>
+      <w:pPr>
+        <w:pStyle w:val="NormalWeb"/>
+        <w:numPr>
+          <w:ilvl w:val="0"/>
+          <w:numId w:val="36"/>
+        </w:numPr>
+        <w:spacing w:before="0" w:after="260"/>
+        <w:textAlignment w:val="baseline"/>
+        <w:rPr>
+          <w:rFonts w:ascii="Arial" w:hAnsi="Arial" w:cs="Arial"/>
+          <w:color w:val="000000"/>
+          <w:lang w:val="vi-VN"/>
+        </w:rPr>
+      </w:pPr>
+      <w:r>
+        <w:rPr>
+          <w:rFonts w:ascii="Arial" w:hAnsi="Arial" w:cs="Arial"/>
+          <w:b/>
+          <w:bCs/>
+          <w:color w:val="000000"/>
+          <w:lang w:val="vi-VN"/>
+        </w:rPr>
+        <w:t>Black-Box Testing</w:t>
+      </w:r>
+      <w:r>
+        <w:rPr>
+          <w:rFonts w:ascii="Arial" w:hAnsi="Arial" w:cs="Arial"/>
+          <w:color w:val="000000"/>
+          <w:lang w:val="vi-VN"/>
+        </w:rPr>
+        <w:t xml:space="preserve"> (System Level):</w:t>
+      </w:r>
+    </w:p>
+    <w:p>
+      <w:pPr>
+        <w:pStyle w:val="NormalWeb"/>
+        <w:numPr>
+          <w:ilvl w:val="1"/>
+          <w:numId w:val="36"/>
+        </w:numPr>
+        <w:spacing w:before="0" w:after="260"/>
+        <w:textAlignment w:val="baseline"/>
+        <w:rPr>
+          <w:rFonts w:ascii="Arial" w:hAnsi="Arial" w:cs="Arial"/>
+          <w:color w:val="000000"/>
+          <w:lang w:val="vi-VN"/>
+        </w:rPr>
+      </w:pPr>
+      <w:r>
+        <w:rPr>
+          <w:rFonts w:ascii="Arial" w:hAnsi="Arial" w:cs="Arial"/>
+          <w:b/>
+          <w:bCs/>
+          <w:color w:val="000000"/>
+          <w:lang w:val="vi-VN"/>
+        </w:rPr>
+        <w:t>Equivalence Partitioning:</w:t>
+      </w:r>
+      <w:r>
+        <w:rPr>
+          <w:rFonts w:ascii="Arial" w:hAnsi="Arial" w:cs="Arial"/>
+          <w:color w:val="000000"/>
+          <w:lang w:val="vi-VN"/>
+        </w:rPr>
+        <w:t xml:space="preserve"> Used to validate input fields (e.g., separating valid phone numbers from invalid strings in Customer Management).</w:t>
+      </w:r>
+    </w:p>
+    <w:p>
+      <w:pPr>
+        <w:pStyle w:val="NormalWeb"/>
+        <w:numPr>
+          <w:ilvl w:val="1"/>
+          <w:numId w:val="36"/>
+        </w:numPr>
+        <w:spacing w:before="0" w:after="260"/>
+        <w:textAlignment w:val="baseline"/>
+        <w:rPr>
+          <w:rFonts w:ascii="Arial" w:hAnsi="Arial" w:cs="Arial"/>
+          <w:color w:val="000000"/>
+          <w:lang w:val="vi-VN"/>
+        </w:rPr>
+      </w:pPr>
+      <w:r>
+        <w:rPr>
+          <w:rFonts w:ascii="Arial" w:hAnsi="Arial" w:cs="Arial"/>
+          <w:b/>
+          <w:bCs/>
+          <w:color w:val="000000"/>
+          <w:lang w:val="vi-VN"/>
+        </w:rPr>
+        <w:t>Boundary Value Analysis:</w:t>
+      </w:r>
+      <w:r>
+        <w:rPr>
+          <w:rFonts w:ascii="Arial" w:hAnsi="Arial" w:cs="Arial"/>
+          <w:color w:val="000000"/>
+          <w:lang w:val="vi-VN"/>
+        </w:rPr>
+        <w:t xml:space="preserve"> Applied to stock quantities (e.g., testing behaviors when buying exactly the maximum available stock vs. max stock + 1).</w:t>
+      </w:r>
+    </w:p>
+    <w:p>
+      <w:pPr>
+        <w:pStyle w:val="NormalWeb"/>
+        <w:numPr>
+          <w:ilvl w:val="0"/>
+          <w:numId w:val="36"/>
+        </w:numPr>
+        <w:spacing w:before="0" w:after="260"/>
+        <w:textAlignment w:val="baseline"/>
+        <w:rPr>
+          <w:rFonts w:ascii="Arial" w:hAnsi="Arial" w:cs="Arial"/>
+          <w:color w:val="000000"/>
+          <w:lang w:val="vi-VN"/>
+        </w:rPr>
+      </w:pPr>
+      <w:r>
+        <w:rPr>
+          <w:rFonts w:ascii="Arial" w:hAnsi="Arial" w:cs="Arial"/>
+          <w:b/>
+          <w:bCs/>
+          <w:color w:val="000000"/>
+          <w:lang w:val="vi-VN"/>
+        </w:rPr>
+        <w:t>White-Box Testing</w:t>
+      </w:r>
+      <w:r>
+        <w:rPr>
+          <w:rFonts w:ascii="Arial" w:hAnsi="Arial" w:cs="Arial"/>
+          <w:color w:val="000000"/>
+          <w:lang w:val="vi-VN"/>
+        </w:rPr>
+        <w:t xml:space="preserve"> (Unit Level):</w:t>
+      </w:r>
+    </w:p>
+    <w:p>
+      <w:pPr>
+        <w:pStyle w:val="NormalWeb"/>
+        <w:numPr>
+          <w:ilvl w:val="1"/>
+          <w:numId w:val="36"/>
+        </w:numPr>
+        <w:spacing w:before="0" w:after="260"/>
+        <w:textAlignment w:val="baseline"/>
+        <w:rPr>
+          <w:rFonts w:ascii="Arial" w:hAnsi="Arial" w:cs="Arial"/>
+          <w:color w:val="000000"/>
+          <w:lang w:val="vi-VN"/>
+        </w:rPr>
+      </w:pPr>
+      <w:r>
+        <w:rPr>
+          <w:rFonts w:ascii="Arial" w:hAnsi="Arial" w:cs="Arial"/>
+          <w:b/>
+          <w:bCs/>
+          <w:color w:val="000000"/>
+          <w:lang w:val="vi-VN"/>
+        </w:rPr>
+        <w:t>Statement &amp; Branch Coverage</w:t>
+      </w:r>
+      <w:r>
+        <w:rPr>
+          <w:rFonts w:ascii="Arial" w:hAnsi="Arial" w:cs="Arial"/>
+          <w:color w:val="000000"/>
+          <w:lang w:val="vi-VN"/>
+        </w:rPr>
+        <w:t>: MSTest framework in Visual Studio was used to write Unit Tests specifically targeting the logic inside SalesController.calculateFinalTotal() and AccountController.authenticate().</w:t>
+      </w:r>
+    </w:p>
+    <w:p>
+      <w:pPr>
+        <w:rPr>
+          <w:rFonts w:ascii="Arial" w:eastAsia="Times New Roman" w:hAnsi="Arial" w:cs="Arial"/>
+          <w:b/>
+          <w:bCs/>
+          <w:color w:val="000000"/>
+          <w:kern w:val="0"/>
+          <w:lang w:val="vi-VN" w:eastAsia="ko-KR"/>
+          <w14:ligatures w14:val="none"/>
+        </w:rPr>
+      </w:pPr>
+      <w:r>
+        <w:rPr>
+          <w:rFonts w:ascii="Arial" w:hAnsi="Arial" w:cs="Arial"/>
+          <w:b/>
+          <w:bCs/>
+          <w:color w:val="000000"/>
+          <w:lang w:val="vi-VN"/>
+        </w:rPr>
+        <w:br w:type="page"/>
+      </w:r>
+    </w:p>
+    <w:p>
+      <w:pPr>
+        <w:pStyle w:val="NormalWeb"/>
+        <w:spacing w:before="0" w:after="260"/>
+        <w:textAlignment w:val="baseline"/>
+        <w:rPr>
+          <w:rFonts w:ascii="Arial" w:hAnsi="Arial" w:cs="Arial"/>
+          <w:b/>
+          <w:bCs/>
+          <w:color w:val="000000"/>
+          <w:lang w:val="vi-VN"/>
+        </w:rPr>
+      </w:pPr>
+      <w:r>
+        <w:rPr>
+          <w:rFonts w:ascii="Arial" w:hAnsi="Arial" w:cs="Arial"/>
+          <w:b/>
+          <w:bCs/>
+          <w:color w:val="000000"/>
+          <w:lang w:val="vi-VN"/>
+        </w:rPr>
+        <w:lastRenderedPageBreak/>
+        <w:t>6.4. Assessment of the goodness of your testsuite</w:t>
+      </w:r>
+    </w:p>
+    <w:p>
+      <w:pPr>
+        <w:pStyle w:val="NormalWeb"/>
+        <w:spacing w:before="0" w:after="260"/>
+        <w:textAlignment w:val="baseline"/>
+        <w:rPr>
+          <w:rFonts w:ascii="Arial" w:hAnsi="Arial" w:cs="Arial"/>
+          <w:color w:val="000000"/>
+          <w:lang w:val="vi-VN"/>
+        </w:rPr>
+      </w:pPr>
+      <w:r>
+        <w:rPr>
+          <w:rFonts w:ascii="Arial" w:hAnsi="Arial" w:cs="Arial"/>
+          <w:color w:val="000000"/>
+          <w:lang w:val="vi-VN"/>
+        </w:rPr>
+        <w:t>The effectiveness of the test suite was evaluated using the following metrics:</w:t>
+      </w:r>
+    </w:p>
+    <w:p>
+      <w:pPr>
+        <w:pStyle w:val="NormalWeb"/>
+        <w:numPr>
+          <w:ilvl w:val="0"/>
+          <w:numId w:val="37"/>
+        </w:numPr>
+        <w:spacing w:before="0" w:after="260"/>
+        <w:textAlignment w:val="baseline"/>
+        <w:rPr>
+          <w:rFonts w:ascii="Arial" w:hAnsi="Arial" w:cs="Arial"/>
+          <w:color w:val="000000"/>
+          <w:lang w:val="vi-VN"/>
+        </w:rPr>
+      </w:pPr>
+      <w:r>
+        <w:rPr>
+          <w:rFonts w:ascii="Arial" w:hAnsi="Arial" w:cs="Arial"/>
+          <w:b/>
+          <w:bCs/>
+          <w:color w:val="000000"/>
+          <w:lang w:val="vi-VN"/>
+        </w:rPr>
+        <w:t>Requirements Coverage:</w:t>
+      </w:r>
+      <w:r>
+        <w:rPr>
+          <w:rFonts w:ascii="Arial" w:hAnsi="Arial" w:cs="Arial"/>
+          <w:color w:val="000000"/>
+          <w:lang w:val="vi-VN"/>
+        </w:rPr>
+        <w:t xml:space="preserve"> 100% of the Functional Requirements (FR1-FR7) have at least one associated test case.</w:t>
+      </w:r>
+    </w:p>
+    <w:p>
+      <w:pPr>
+        <w:pStyle w:val="NormalWeb"/>
+        <w:numPr>
+          <w:ilvl w:val="0"/>
+          <w:numId w:val="37"/>
+        </w:numPr>
+        <w:spacing w:before="0" w:after="260"/>
+        <w:textAlignment w:val="baseline"/>
+        <w:rPr>
+          <w:rFonts w:ascii="Arial" w:hAnsi="Arial" w:cs="Arial"/>
+          <w:color w:val="000000"/>
+          <w:lang w:val="vi-VN"/>
+        </w:rPr>
+      </w:pPr>
+      <w:r>
+        <w:rPr>
+          <w:rFonts w:ascii="Arial" w:hAnsi="Arial" w:cs="Arial"/>
+          <w:b/>
+          <w:bCs/>
+          <w:color w:val="000000"/>
+          <w:lang w:val="vi-VN"/>
+        </w:rPr>
+        <w:t>Test Pass Rate:</w:t>
+      </w:r>
+      <w:r>
+        <w:rPr>
+          <w:rFonts w:ascii="Arial" w:hAnsi="Arial" w:cs="Arial"/>
+          <w:color w:val="000000"/>
+          <w:lang w:val="vi-VN"/>
+        </w:rPr>
+        <w:t xml:space="preserve"> 95% (Calculated as [Passed Tests / Total Executed Tests] * 100). Minor UI bugs were logged for future fixes, but core functionalities passed.</w:t>
+      </w:r>
+    </w:p>
+    <w:p>
+      <w:pPr>
+        <w:pStyle w:val="NormalWeb"/>
+        <w:numPr>
+          <w:ilvl w:val="0"/>
+          <w:numId w:val="37"/>
+        </w:numPr>
+        <w:spacing w:before="0" w:after="260"/>
+        <w:textAlignment w:val="baseline"/>
+        <w:rPr>
+          <w:rFonts w:ascii="Arial" w:hAnsi="Arial" w:cs="Arial"/>
+          <w:color w:val="000000"/>
+          <w:lang w:val="vi-VN"/>
+        </w:rPr>
+      </w:pPr>
+      <w:r>
+        <w:rPr>
+          <w:rFonts w:ascii="Arial" w:hAnsi="Arial" w:cs="Arial"/>
+          <w:b/>
+          <w:bCs/>
+          <w:color w:val="000000"/>
+          <w:lang w:val="vi-VN"/>
+        </w:rPr>
+        <w:t>Defect Density:</w:t>
+      </w:r>
+      <w:r>
+        <w:rPr>
+          <w:rFonts w:ascii="Arial" w:hAnsi="Arial" w:cs="Arial"/>
+          <w:color w:val="000000"/>
+          <w:lang w:val="vi-VN"/>
+        </w:rPr>
+        <w:t xml:space="preserve"> Kept below acceptable thresholds, with 0 critical bugs detected in the Database transaction modules (Model layer).</w:t>
+      </w:r>
+    </w:p>
+    <w:p>
+      <w:pPr>
+        <w:pStyle w:val="NormalWeb"/>
+        <w:spacing w:before="0" w:beforeAutospacing="0" w:after="260" w:afterAutospacing="0"/>
+        <w:textAlignment w:val="baseline"/>
+        <w:rPr>
+          <w:rFonts w:ascii="Arial" w:hAnsi="Arial" w:cs="Arial"/>
+          <w:color w:val="000000"/>
+          <w:lang w:val="vi-VN"/>
+        </w:rPr>
+      </w:pPr>
+    </w:p>
     <w:sectPr>
       <w:pgSz w:w="12240" w:h="15840"/>
       <w:pgMar w:top="1440" w:right="1440" w:bottom="1440" w:left="1440" w:header="720" w:footer="720" w:gutter="0"/>
@@ -6036,7 +9817,7 @@
 </file>
 
 <file path=word/numbering.xml><?xml version="1.0" encoding="utf-8"?>
-<w:numbering xmlns:wpc="http://schemas.microsoft.com/office/word/2010/wordprocessingCanvas" xmlns:cx="http://schemas.microsoft.com/office/drawing/2014/chartex" xmlns:cx1="http://schemas.microsoft.com/office/drawing/2015/9/8/chartex" xmlns:cx2="http://schemas.microsoft.com/office/drawing/2015/10/21/chartex" xmlns:cx3="http://schemas.microsoft.com/office/drawing/2016/5/9/chartex" xmlns:cx4="http://schemas.microsoft.com/office/drawing/2016/5/10/chartex" xmlns:cx5="http://schemas.microsoft.com/office/drawing/2016/5/11/chartex" xmlns:cx6="http://schemas.microsoft.com/office/drawing/2016/5/12/chartex" xmlns:cx7="http://schemas.microsoft.com/office/drawing/2016/5/13/chartex" xmlns:cx8="http://schemas.microsoft.com/office/drawing/2016/5/14/chartex" xmlns:mc="http://schemas.openxmlformats.org/markup-compatibility/2006" xmlns:aink="http://schemas.microsoft.com/office/drawing/2016/ink" xmlns:am3d="http://schemas.microsoft.com/office/drawing/2017/model3d" xmlns:o="urn:schemas-microsoft-com:office:office" xmlns:oel="http://schemas.microsoft.com/office/2019/extlst" xmlns:r="http://schemas.openxmlformats.org/officeDocument/2006/relationships" xmlns:m="http://schemas.openxmlformats.org/officeDocument/2006/math" xmlns:v="urn:schemas-microsoft-com:vml" xmlns:wp14="http://schemas.microsoft.com/office/word/2010/wordprocessingDrawing" xmlns:wp="http://schemas.openxmlformats.org/drawingml/2006/wordprocessingDrawing" xmlns:w10="urn:schemas-microsoft-com:office:word" xmlns:w="http://schemas.openxmlformats.org/wordprocessingml/2006/main" xmlns:w14="http://schemas.microsoft.com/office/word/2010/wordml" xmlns:w15="http://schemas.microsoft.com/office/word/2012/wordml" xmlns:w16cex="http://schemas.microsoft.com/office/word/2018/wordml/cex" xmlns:w16cid="http://schemas.microsoft.com/office/word/2016/wordml/cid" xmlns:w16="http://schemas.microsoft.com/office/word/2018/wordml" xmlns:w16du="http://schemas.microsoft.com/office/word/2023/wordml/word16du" xmlns:w16sdtdh="http://schemas.microsoft.com/office/word/2020/wordml/sdtdatahash" xmlns:w16se="http://schemas.microsoft.com/office/word/2015/wordml/symex" xmlns:wpg="http://schemas.microsoft.com/office/word/2010/wordprocessingGroup" xmlns:wpi="http://schemas.microsoft.com/office/word/2010/wordprocessingInk" xmlns:wne="http://schemas.microsoft.com/office/word/2006/wordml" xmlns:wps="http://schemas.microsoft.com/office/word/2010/wordprocessingShape" mc:Ignorable="w14 w15 w16se w16cid w16 w16cex w16sdtdh wp14">
+<w:numbering xmlns:wpc="http://schemas.microsoft.com/office/word/2010/wordprocessingCanvas" xmlns:cx="http://schemas.microsoft.com/office/drawing/2014/chartex" xmlns:cx1="http://schemas.microsoft.com/office/drawing/2015/9/8/chartex" xmlns:cx2="http://schemas.microsoft.com/office/drawing/2015/10/21/chartex" xmlns:cx3="http://schemas.microsoft.com/office/drawing/2016/5/9/chartex" xmlns:cx4="http://schemas.microsoft.com/office/drawing/2016/5/10/chartex" xmlns:cx5="http://schemas.microsoft.com/office/drawing/2016/5/11/chartex" xmlns:cx6="http://schemas.microsoft.com/office/drawing/2016/5/12/chartex" xmlns:cx7="http://schemas.microsoft.com/office/drawing/2016/5/13/chartex" xmlns:cx8="http://schemas.microsoft.com/office/drawing/2016/5/14/chartex" xmlns:mc="http://schemas.openxmlformats.org/markup-compatibility/2006" xmlns:aink="http://schemas.microsoft.com/office/drawing/2016/ink" xmlns:am3d="http://schemas.microsoft.com/office/drawing/2017/model3d" xmlns:o="urn:schemas-microsoft-com:office:office" xmlns:oel="http://schemas.microsoft.com/office/2019/extlst" xmlns:r="http://schemas.openxmlformats.org/officeDocument/2006/relationships" xmlns:m="http://schemas.openxmlformats.org/officeDocument/2006/math" xmlns:v="urn:schemas-microsoft-com:vml" xmlns:wp14="http://schemas.microsoft.com/office/word/2010/wordprocessingDrawing" xmlns:wp="http://schemas.openxmlformats.org/drawingml/2006/wordprocessingDrawing" xmlns:w10="urn:schemas-microsoft-com:office:word" xmlns:w="http://schemas.openxmlformats.org/wordprocessingml/2006/main" xmlns:w14="http://schemas.microsoft.com/office/word/2010/wordml" xmlns:w15="http://schemas.microsoft.com/office/word/2012/wordml" xmlns:w16cex="http://schemas.microsoft.com/office/word/2018/wordml/cex" xmlns:w16cid="http://schemas.microsoft.com/office/word/2016/wordml/cid" xmlns:w16="http://schemas.microsoft.com/office/word/2018/wordml" xmlns:w16du="http://schemas.microsoft.com/office/word/2023/wordml/word16du" xmlns:w16sdtdh="http://schemas.microsoft.com/office/word/2020/wordml/sdtdatahash" xmlns:w16sdtfl="http://schemas.microsoft.com/office/word/2024/wordml/sdtformatlock" xmlns:w16se="http://schemas.microsoft.com/office/word/2015/wordml/symex" xmlns:wpg="http://schemas.microsoft.com/office/word/2010/wordprocessingGroup" xmlns:wpi="http://schemas.microsoft.com/office/word/2010/wordprocessingInk" xmlns:wne="http://schemas.microsoft.com/office/word/2006/wordml" xmlns:wps="http://schemas.microsoft.com/office/word/2010/wordprocessingShape" mc:Ignorable="w14 w15 w16se w16cid w16 w16cex w16sdtdh w16sdtfl w16du wp14">
   <w:abstractNum w:abstractNumId="0" w15:restartNumberingAfterBreak="0">
     <w:nsid w:val="01BC4726"/>
     <w:multiLevelType w:val="multilevel"/>
@@ -6187,6 +9968,119 @@
     </w:lvl>
   </w:abstractNum>
   <w:abstractNum w:abstractNumId="1" w15:restartNumberingAfterBreak="0">
+    <w:nsid w:val="04DD484D"/>
+    <w:multiLevelType w:val="hybridMultilevel"/>
+    <w:tmpl w:val="DD70C85E"/>
+    <w:lvl w:ilvl="0" w:tplc="042A0001">
+      <w:start w:val="1"/>
+      <w:numFmt w:val="bullet"/>
+      <w:lvlText w:val=""/>
+      <w:lvlJc w:val="left"/>
+      <w:pPr>
+        <w:ind w:left="720" w:hanging="360"/>
+      </w:pPr>
+      <w:rPr>
+        <w:rFonts w:ascii="Symbol" w:hAnsi="Symbol" w:hint="default"/>
+      </w:rPr>
+    </w:lvl>
+    <w:lvl w:ilvl="1" w:tplc="042A0003" w:tentative="1">
+      <w:start w:val="1"/>
+      <w:numFmt w:val="bullet"/>
+      <w:lvlText w:val="o"/>
+      <w:lvlJc w:val="left"/>
+      <w:pPr>
+        <w:ind w:left="1440" w:hanging="360"/>
+      </w:pPr>
+      <w:rPr>
+        <w:rFonts w:ascii="Courier New" w:hAnsi="Courier New" w:cs="Courier New" w:hint="default"/>
+      </w:rPr>
+    </w:lvl>
+    <w:lvl w:ilvl="2" w:tplc="042A0005" w:tentative="1">
+      <w:start w:val="1"/>
+      <w:numFmt w:val="bullet"/>
+      <w:lvlText w:val=""/>
+      <w:lvlJc w:val="left"/>
+      <w:pPr>
+        <w:ind w:left="2160" w:hanging="360"/>
+      </w:pPr>
+      <w:rPr>
+        <w:rFonts w:ascii="Wingdings" w:hAnsi="Wingdings" w:hint="default"/>
+      </w:rPr>
+    </w:lvl>
+    <w:lvl w:ilvl="3" w:tplc="042A0001" w:tentative="1">
+      <w:start w:val="1"/>
+      <w:numFmt w:val="bullet"/>
+      <w:lvlText w:val=""/>
+      <w:lvlJc w:val="left"/>
+      <w:pPr>
+        <w:ind w:left="2880" w:hanging="360"/>
+      </w:pPr>
+      <w:rPr>
+        <w:rFonts w:ascii="Symbol" w:hAnsi="Symbol" w:hint="default"/>
+      </w:rPr>
+    </w:lvl>
+    <w:lvl w:ilvl="4" w:tplc="042A0003" w:tentative="1">
+      <w:start w:val="1"/>
+      <w:numFmt w:val="bullet"/>
+      <w:lvlText w:val="o"/>
+      <w:lvlJc w:val="left"/>
+      <w:pPr>
+        <w:ind w:left="3600" w:hanging="360"/>
+      </w:pPr>
+      <w:rPr>
+        <w:rFonts w:ascii="Courier New" w:hAnsi="Courier New" w:cs="Courier New" w:hint="default"/>
+      </w:rPr>
+    </w:lvl>
+    <w:lvl w:ilvl="5" w:tplc="042A0005" w:tentative="1">
+      <w:start w:val="1"/>
+      <w:numFmt w:val="bullet"/>
+      <w:lvlText w:val=""/>
+      <w:lvlJc w:val="left"/>
+      <w:pPr>
+        <w:ind w:left="4320" w:hanging="360"/>
+      </w:pPr>
+      <w:rPr>
+        <w:rFonts w:ascii="Wingdings" w:hAnsi="Wingdings" w:hint="default"/>
+      </w:rPr>
+    </w:lvl>
+    <w:lvl w:ilvl="6" w:tplc="042A0001" w:tentative="1">
+      <w:start w:val="1"/>
+      <w:numFmt w:val="bullet"/>
+      <w:lvlText w:val=""/>
+      <w:lvlJc w:val="left"/>
+      <w:pPr>
+        <w:ind w:left="5040" w:hanging="360"/>
+      </w:pPr>
+      <w:rPr>
+        <w:rFonts w:ascii="Symbol" w:hAnsi="Symbol" w:hint="default"/>
+      </w:rPr>
+    </w:lvl>
+    <w:lvl w:ilvl="7" w:tplc="042A0003" w:tentative="1">
+      <w:start w:val="1"/>
+      <w:numFmt w:val="bullet"/>
+      <w:lvlText w:val="o"/>
+      <w:lvlJc w:val="left"/>
+      <w:pPr>
+        <w:ind w:left="5760" w:hanging="360"/>
+      </w:pPr>
+      <w:rPr>
+        <w:rFonts w:ascii="Courier New" w:hAnsi="Courier New" w:cs="Courier New" w:hint="default"/>
+      </w:rPr>
+    </w:lvl>
+    <w:lvl w:ilvl="8" w:tplc="042A0005" w:tentative="1">
+      <w:start w:val="1"/>
+      <w:numFmt w:val="bullet"/>
+      <w:lvlText w:val=""/>
+      <w:lvlJc w:val="left"/>
+      <w:pPr>
+        <w:ind w:left="6480" w:hanging="360"/>
+      </w:pPr>
+      <w:rPr>
+        <w:rFonts w:ascii="Wingdings" w:hAnsi="Wingdings" w:hint="default"/>
+      </w:rPr>
+    </w:lvl>
+  </w:abstractNum>
+  <w:abstractNum w:abstractNumId="2" w15:restartNumberingAfterBreak="0">
     <w:nsid w:val="050701D0"/>
     <w:multiLevelType w:val="multilevel"/>
     <w:tmpl w:val="82EE5E80"/>
@@ -6335,7 +10229,7 @@
       </w:rPr>
     </w:lvl>
   </w:abstractNum>
-  <w:abstractNum w:abstractNumId="2" w15:restartNumberingAfterBreak="0">
+  <w:abstractNum w:abstractNumId="3" w15:restartNumberingAfterBreak="0">
     <w:nsid w:val="121611FE"/>
     <w:multiLevelType w:val="multilevel"/>
     <w:tmpl w:val="C6540CAA"/>
@@ -6484,7 +10378,7 @@
       </w:rPr>
     </w:lvl>
   </w:abstractNum>
-  <w:abstractNum w:abstractNumId="3" w15:restartNumberingAfterBreak="0">
+  <w:abstractNum w:abstractNumId="4" w15:restartNumberingAfterBreak="0">
     <w:nsid w:val="1C400CA2"/>
     <w:multiLevelType w:val="multilevel"/>
     <w:tmpl w:val="9C80864E"/>
@@ -6633,7 +10527,7 @@
       </w:rPr>
     </w:lvl>
   </w:abstractNum>
-  <w:abstractNum w:abstractNumId="4" w15:restartNumberingAfterBreak="0">
+  <w:abstractNum w:abstractNumId="5" w15:restartNumberingAfterBreak="0">
     <w:nsid w:val="1CA80269"/>
     <w:multiLevelType w:val="multilevel"/>
     <w:tmpl w:val="5D8093CE"/>
@@ -6782,7 +10676,7 @@
       </w:rPr>
     </w:lvl>
   </w:abstractNum>
-  <w:abstractNum w:abstractNumId="5" w15:restartNumberingAfterBreak="0">
+  <w:abstractNum w:abstractNumId="6" w15:restartNumberingAfterBreak="0">
     <w:nsid w:val="1ECF1909"/>
     <w:multiLevelType w:val="multilevel"/>
     <w:tmpl w:val="2864CFAC"/>
@@ -6931,7 +10825,7 @@
       </w:rPr>
     </w:lvl>
   </w:abstractNum>
-  <w:abstractNum w:abstractNumId="6" w15:restartNumberingAfterBreak="0">
+  <w:abstractNum w:abstractNumId="7" w15:restartNumberingAfterBreak="0">
     <w:nsid w:val="1F9B279A"/>
     <w:multiLevelType w:val="multilevel"/>
     <w:tmpl w:val="E7BA563A"/>
@@ -7076,7 +10970,7 @@
       </w:rPr>
     </w:lvl>
   </w:abstractNum>
-  <w:abstractNum w:abstractNumId="7" w15:restartNumberingAfterBreak="0">
+  <w:abstractNum w:abstractNumId="8" w15:restartNumberingAfterBreak="0">
     <w:nsid w:val="1FB802D9"/>
     <w:multiLevelType w:val="multilevel"/>
     <w:tmpl w:val="CE320488"/>
@@ -7221,7 +11115,7 @@
       </w:rPr>
     </w:lvl>
   </w:abstractNum>
-  <w:abstractNum w:abstractNumId="8" w15:restartNumberingAfterBreak="0">
+  <w:abstractNum w:abstractNumId="9" w15:restartNumberingAfterBreak="0">
     <w:nsid w:val="2169608C"/>
     <w:multiLevelType w:val="multilevel"/>
     <w:tmpl w:val="4042AFB4"/>
@@ -7370,7 +11264,7 @@
       </w:rPr>
     </w:lvl>
   </w:abstractNum>
-  <w:abstractNum w:abstractNumId="9" w15:restartNumberingAfterBreak="0">
+  <w:abstractNum w:abstractNumId="10" w15:restartNumberingAfterBreak="0">
     <w:nsid w:val="24B9155C"/>
     <w:multiLevelType w:val="multilevel"/>
     <w:tmpl w:val="625257AC"/>
@@ -7519,7 +11413,7 @@
       </w:rPr>
     </w:lvl>
   </w:abstractNum>
-  <w:abstractNum w:abstractNumId="10" w15:restartNumberingAfterBreak="0">
+  <w:abstractNum w:abstractNumId="11" w15:restartNumberingAfterBreak="0">
     <w:nsid w:val="26425C9D"/>
     <w:multiLevelType w:val="multilevel"/>
     <w:tmpl w:val="83DADCBA"/>
@@ -7664,7 +11558,7 @@
       </w:rPr>
     </w:lvl>
   </w:abstractNum>
-  <w:abstractNum w:abstractNumId="11" w15:restartNumberingAfterBreak="0">
+  <w:abstractNum w:abstractNumId="12" w15:restartNumberingAfterBreak="0">
     <w:nsid w:val="2A7035AC"/>
     <w:multiLevelType w:val="multilevel"/>
     <w:tmpl w:val="AB821B04"/>
@@ -7813,7 +11707,7 @@
       </w:rPr>
     </w:lvl>
   </w:abstractNum>
-  <w:abstractNum w:abstractNumId="12" w15:restartNumberingAfterBreak="0">
+  <w:abstractNum w:abstractNumId="13" w15:restartNumberingAfterBreak="0">
     <w:nsid w:val="2CA03F71"/>
     <w:multiLevelType w:val="multilevel"/>
     <w:tmpl w:val="24320C24"/>
@@ -7962,7 +11856,7 @@
       </w:rPr>
     </w:lvl>
   </w:abstractNum>
-  <w:abstractNum w:abstractNumId="13" w15:restartNumberingAfterBreak="0">
+  <w:abstractNum w:abstractNumId="14" w15:restartNumberingAfterBreak="0">
     <w:nsid w:val="2CAF7FF3"/>
     <w:multiLevelType w:val="multilevel"/>
     <w:tmpl w:val="CBAC44B2"/>
@@ -8111,7 +12005,7 @@
       </w:rPr>
     </w:lvl>
   </w:abstractNum>
-  <w:abstractNum w:abstractNumId="14" w15:restartNumberingAfterBreak="0">
+  <w:abstractNum w:abstractNumId="15" w15:restartNumberingAfterBreak="0">
     <w:nsid w:val="2FE07389"/>
     <w:multiLevelType w:val="multilevel"/>
     <w:tmpl w:val="37A2D4D8"/>
@@ -8260,7 +12154,7 @@
       </w:rPr>
     </w:lvl>
   </w:abstractNum>
-  <w:abstractNum w:abstractNumId="15" w15:restartNumberingAfterBreak="0">
+  <w:abstractNum w:abstractNumId="16" w15:restartNumberingAfterBreak="0">
     <w:nsid w:val="306F5E8B"/>
     <w:multiLevelType w:val="multilevel"/>
     <w:tmpl w:val="772C5982"/>
@@ -8405,7 +12299,7 @@
       </w:rPr>
     </w:lvl>
   </w:abstractNum>
-  <w:abstractNum w:abstractNumId="16" w15:restartNumberingAfterBreak="0">
+  <w:abstractNum w:abstractNumId="17" w15:restartNumberingAfterBreak="0">
     <w:nsid w:val="39053FD9"/>
     <w:multiLevelType w:val="multilevel"/>
     <w:tmpl w:val="591C071C"/>
@@ -8554,7 +12448,7 @@
       </w:rPr>
     </w:lvl>
   </w:abstractNum>
-  <w:abstractNum w:abstractNumId="17" w15:restartNumberingAfterBreak="0">
+  <w:abstractNum w:abstractNumId="18" w15:restartNumberingAfterBreak="0">
     <w:nsid w:val="3F222A3D"/>
     <w:multiLevelType w:val="multilevel"/>
     <w:tmpl w:val="486A91DA"/>
@@ -8703,7 +12597,7 @@
       </w:rPr>
     </w:lvl>
   </w:abstractNum>
-  <w:abstractNum w:abstractNumId="18" w15:restartNumberingAfterBreak="0">
+  <w:abstractNum w:abstractNumId="19" w15:restartNumberingAfterBreak="0">
     <w:nsid w:val="44E71089"/>
     <w:multiLevelType w:val="multilevel"/>
     <w:tmpl w:val="F4BC59B4"/>
@@ -8852,7 +12746,7 @@
       </w:rPr>
     </w:lvl>
   </w:abstractNum>
-  <w:abstractNum w:abstractNumId="19" w15:restartNumberingAfterBreak="0">
+  <w:abstractNum w:abstractNumId="20" w15:restartNumberingAfterBreak="0">
     <w:nsid w:val="455D3B44"/>
     <w:multiLevelType w:val="multilevel"/>
     <w:tmpl w:val="A2948046"/>
@@ -9001,7 +12895,7 @@
       </w:rPr>
     </w:lvl>
   </w:abstractNum>
-  <w:abstractNum w:abstractNumId="20" w15:restartNumberingAfterBreak="0">
+  <w:abstractNum w:abstractNumId="21" w15:restartNumberingAfterBreak="0">
     <w:nsid w:val="4F652183"/>
     <w:multiLevelType w:val="multilevel"/>
     <w:tmpl w:val="BC827CFA"/>
@@ -9150,7 +13044,7 @@
       </w:rPr>
     </w:lvl>
   </w:abstractNum>
-  <w:abstractNum w:abstractNumId="21" w15:restartNumberingAfterBreak="0">
+  <w:abstractNum w:abstractNumId="22" w15:restartNumberingAfterBreak="0">
     <w:nsid w:val="52112CEC"/>
     <w:multiLevelType w:val="multilevel"/>
     <w:tmpl w:val="4BDCC2A8"/>
@@ -9299,7 +13193,7 @@
       </w:rPr>
     </w:lvl>
   </w:abstractNum>
-  <w:abstractNum w:abstractNumId="22" w15:restartNumberingAfterBreak="0">
+  <w:abstractNum w:abstractNumId="23" w15:restartNumberingAfterBreak="0">
     <w:nsid w:val="52D7406C"/>
     <w:multiLevelType w:val="multilevel"/>
     <w:tmpl w:val="4BDCC2A8"/>
@@ -9448,7 +13342,7 @@
       </w:rPr>
     </w:lvl>
   </w:abstractNum>
-  <w:abstractNum w:abstractNumId="23" w15:restartNumberingAfterBreak="0">
+  <w:abstractNum w:abstractNumId="24" w15:restartNumberingAfterBreak="0">
     <w:nsid w:val="57DF4F51"/>
     <w:multiLevelType w:val="multilevel"/>
     <w:tmpl w:val="44E8CCF8"/>
@@ -9593,7 +13487,7 @@
       </w:rPr>
     </w:lvl>
   </w:abstractNum>
-  <w:abstractNum w:abstractNumId="24" w15:restartNumberingAfterBreak="0">
+  <w:abstractNum w:abstractNumId="25" w15:restartNumberingAfterBreak="0">
     <w:nsid w:val="59387BDC"/>
     <w:multiLevelType w:val="multilevel"/>
     <w:tmpl w:val="FD647D40"/>
@@ -9742,7 +13636,7 @@
       </w:rPr>
     </w:lvl>
   </w:abstractNum>
-  <w:abstractNum w:abstractNumId="25" w15:restartNumberingAfterBreak="0">
+  <w:abstractNum w:abstractNumId="26" w15:restartNumberingAfterBreak="0">
     <w:nsid w:val="596827DA"/>
     <w:multiLevelType w:val="multilevel"/>
     <w:tmpl w:val="22626E4C"/>
@@ -9887,7 +13781,7 @@
       </w:rPr>
     </w:lvl>
   </w:abstractNum>
-  <w:abstractNum w:abstractNumId="26" w15:restartNumberingAfterBreak="0">
+  <w:abstractNum w:abstractNumId="27" w15:restartNumberingAfterBreak="0">
     <w:nsid w:val="5A3155E4"/>
     <w:multiLevelType w:val="multilevel"/>
     <w:tmpl w:val="A7EA3098"/>
@@ -10032,7 +13926,7 @@
       </w:rPr>
     </w:lvl>
   </w:abstractNum>
-  <w:abstractNum w:abstractNumId="27" w15:restartNumberingAfterBreak="0">
+  <w:abstractNum w:abstractNumId="28" w15:restartNumberingAfterBreak="0">
     <w:nsid w:val="5AEF4332"/>
     <w:multiLevelType w:val="multilevel"/>
     <w:tmpl w:val="319690FE"/>
@@ -10181,7 +14075,120 @@
       </w:rPr>
     </w:lvl>
   </w:abstractNum>
-  <w:abstractNum w:abstractNumId="28" w15:restartNumberingAfterBreak="0">
+  <w:abstractNum w:abstractNumId="29" w15:restartNumberingAfterBreak="0">
+    <w:nsid w:val="5BE64416"/>
+    <w:multiLevelType w:val="hybridMultilevel"/>
+    <w:tmpl w:val="A1EC802C"/>
+    <w:lvl w:ilvl="0" w:tplc="042A0001">
+      <w:start w:val="1"/>
+      <w:numFmt w:val="bullet"/>
+      <w:lvlText w:val=""/>
+      <w:lvlJc w:val="left"/>
+      <w:pPr>
+        <w:ind w:left="720" w:hanging="360"/>
+      </w:pPr>
+      <w:rPr>
+        <w:rFonts w:ascii="Symbol" w:hAnsi="Symbol" w:hint="default"/>
+      </w:rPr>
+    </w:lvl>
+    <w:lvl w:ilvl="1" w:tplc="042A0003" w:tentative="1">
+      <w:start w:val="1"/>
+      <w:numFmt w:val="bullet"/>
+      <w:lvlText w:val="o"/>
+      <w:lvlJc w:val="left"/>
+      <w:pPr>
+        <w:ind w:left="1440" w:hanging="360"/>
+      </w:pPr>
+      <w:rPr>
+        <w:rFonts w:ascii="Courier New" w:hAnsi="Courier New" w:cs="Courier New" w:hint="default"/>
+      </w:rPr>
+    </w:lvl>
+    <w:lvl w:ilvl="2" w:tplc="042A0005" w:tentative="1">
+      <w:start w:val="1"/>
+      <w:numFmt w:val="bullet"/>
+      <w:lvlText w:val=""/>
+      <w:lvlJc w:val="left"/>
+      <w:pPr>
+        <w:ind w:left="2160" w:hanging="360"/>
+      </w:pPr>
+      <w:rPr>
+        <w:rFonts w:ascii="Wingdings" w:hAnsi="Wingdings" w:hint="default"/>
+      </w:rPr>
+    </w:lvl>
+    <w:lvl w:ilvl="3" w:tplc="042A0001" w:tentative="1">
+      <w:start w:val="1"/>
+      <w:numFmt w:val="bullet"/>
+      <w:lvlText w:val=""/>
+      <w:lvlJc w:val="left"/>
+      <w:pPr>
+        <w:ind w:left="2880" w:hanging="360"/>
+      </w:pPr>
+      <w:rPr>
+        <w:rFonts w:ascii="Symbol" w:hAnsi="Symbol" w:hint="default"/>
+      </w:rPr>
+    </w:lvl>
+    <w:lvl w:ilvl="4" w:tplc="042A0003" w:tentative="1">
+      <w:start w:val="1"/>
+      <w:numFmt w:val="bullet"/>
+      <w:lvlText w:val="o"/>
+      <w:lvlJc w:val="left"/>
+      <w:pPr>
+        <w:ind w:left="3600" w:hanging="360"/>
+      </w:pPr>
+      <w:rPr>
+        <w:rFonts w:ascii="Courier New" w:hAnsi="Courier New" w:cs="Courier New" w:hint="default"/>
+      </w:rPr>
+    </w:lvl>
+    <w:lvl w:ilvl="5" w:tplc="042A0005" w:tentative="1">
+      <w:start w:val="1"/>
+      <w:numFmt w:val="bullet"/>
+      <w:lvlText w:val=""/>
+      <w:lvlJc w:val="left"/>
+      <w:pPr>
+        <w:ind w:left="4320" w:hanging="360"/>
+      </w:pPr>
+      <w:rPr>
+        <w:rFonts w:ascii="Wingdings" w:hAnsi="Wingdings" w:hint="default"/>
+      </w:rPr>
+    </w:lvl>
+    <w:lvl w:ilvl="6" w:tplc="042A0001" w:tentative="1">
+      <w:start w:val="1"/>
+      <w:numFmt w:val="bullet"/>
+      <w:lvlText w:val=""/>
+      <w:lvlJc w:val="left"/>
+      <w:pPr>
+        <w:ind w:left="5040" w:hanging="360"/>
+      </w:pPr>
+      <w:rPr>
+        <w:rFonts w:ascii="Symbol" w:hAnsi="Symbol" w:hint="default"/>
+      </w:rPr>
+    </w:lvl>
+    <w:lvl w:ilvl="7" w:tplc="042A0003" w:tentative="1">
+      <w:start w:val="1"/>
+      <w:numFmt w:val="bullet"/>
+      <w:lvlText w:val="o"/>
+      <w:lvlJc w:val="left"/>
+      <w:pPr>
+        <w:ind w:left="5760" w:hanging="360"/>
+      </w:pPr>
+      <w:rPr>
+        <w:rFonts w:ascii="Courier New" w:hAnsi="Courier New" w:cs="Courier New" w:hint="default"/>
+      </w:rPr>
+    </w:lvl>
+    <w:lvl w:ilvl="8" w:tplc="042A0005" w:tentative="1">
+      <w:start w:val="1"/>
+      <w:numFmt w:val="bullet"/>
+      <w:lvlText w:val=""/>
+      <w:lvlJc w:val="left"/>
+      <w:pPr>
+        <w:ind w:left="6480" w:hanging="360"/>
+      </w:pPr>
+      <w:rPr>
+        <w:rFonts w:ascii="Wingdings" w:hAnsi="Wingdings" w:hint="default"/>
+      </w:rPr>
+    </w:lvl>
+  </w:abstractNum>
+  <w:abstractNum w:abstractNumId="30" w15:restartNumberingAfterBreak="0">
     <w:nsid w:val="5D03164B"/>
     <w:multiLevelType w:val="multilevel"/>
     <w:tmpl w:val="FA8C8E6C"/>
@@ -10330,7 +14337,7 @@
       </w:rPr>
     </w:lvl>
   </w:abstractNum>
-  <w:abstractNum w:abstractNumId="29" w15:restartNumberingAfterBreak="0">
+  <w:abstractNum w:abstractNumId="31" w15:restartNumberingAfterBreak="0">
     <w:nsid w:val="659C4B51"/>
     <w:multiLevelType w:val="multilevel"/>
     <w:tmpl w:val="39D87F7A"/>
@@ -10479,7 +14486,120 @@
       </w:rPr>
     </w:lvl>
   </w:abstractNum>
-  <w:abstractNum w:abstractNumId="30" w15:restartNumberingAfterBreak="0">
+  <w:abstractNum w:abstractNumId="32" w15:restartNumberingAfterBreak="0">
+    <w:nsid w:val="676A2495"/>
+    <w:multiLevelType w:val="hybridMultilevel"/>
+    <w:tmpl w:val="4B1034EC"/>
+    <w:lvl w:ilvl="0" w:tplc="042A0001">
+      <w:start w:val="1"/>
+      <w:numFmt w:val="bullet"/>
+      <w:lvlText w:val=""/>
+      <w:lvlJc w:val="left"/>
+      <w:pPr>
+        <w:ind w:left="720" w:hanging="360"/>
+      </w:pPr>
+      <w:rPr>
+        <w:rFonts w:ascii="Symbol" w:hAnsi="Symbol" w:hint="default"/>
+      </w:rPr>
+    </w:lvl>
+    <w:lvl w:ilvl="1" w:tplc="042A0003">
+      <w:start w:val="1"/>
+      <w:numFmt w:val="bullet"/>
+      <w:lvlText w:val="o"/>
+      <w:lvlJc w:val="left"/>
+      <w:pPr>
+        <w:ind w:left="1440" w:hanging="360"/>
+      </w:pPr>
+      <w:rPr>
+        <w:rFonts w:ascii="Courier New" w:hAnsi="Courier New" w:cs="Courier New" w:hint="default"/>
+      </w:rPr>
+    </w:lvl>
+    <w:lvl w:ilvl="2" w:tplc="042A0005" w:tentative="1">
+      <w:start w:val="1"/>
+      <w:numFmt w:val="bullet"/>
+      <w:lvlText w:val=""/>
+      <w:lvlJc w:val="left"/>
+      <w:pPr>
+        <w:ind w:left="2160" w:hanging="360"/>
+      </w:pPr>
+      <w:rPr>
+        <w:rFonts w:ascii="Wingdings" w:hAnsi="Wingdings" w:hint="default"/>
+      </w:rPr>
+    </w:lvl>
+    <w:lvl w:ilvl="3" w:tplc="042A0001" w:tentative="1">
+      <w:start w:val="1"/>
+      <w:numFmt w:val="bullet"/>
+      <w:lvlText w:val=""/>
+      <w:lvlJc w:val="left"/>
+      <w:pPr>
+        <w:ind w:left="2880" w:hanging="360"/>
+      </w:pPr>
+      <w:rPr>
+        <w:rFonts w:ascii="Symbol" w:hAnsi="Symbol" w:hint="default"/>
+      </w:rPr>
+    </w:lvl>
+    <w:lvl w:ilvl="4" w:tplc="042A0003" w:tentative="1">
+      <w:start w:val="1"/>
+      <w:numFmt w:val="bullet"/>
+      <w:lvlText w:val="o"/>
+      <w:lvlJc w:val="left"/>
+      <w:pPr>
+        <w:ind w:left="3600" w:hanging="360"/>
+      </w:pPr>
+      <w:rPr>
+        <w:rFonts w:ascii="Courier New" w:hAnsi="Courier New" w:cs="Courier New" w:hint="default"/>
+      </w:rPr>
+    </w:lvl>
+    <w:lvl w:ilvl="5" w:tplc="042A0005" w:tentative="1">
+      <w:start w:val="1"/>
+      <w:numFmt w:val="bullet"/>
+      <w:lvlText w:val=""/>
+      <w:lvlJc w:val="left"/>
+      <w:pPr>
+        <w:ind w:left="4320" w:hanging="360"/>
+      </w:pPr>
+      <w:rPr>
+        <w:rFonts w:ascii="Wingdings" w:hAnsi="Wingdings" w:hint="default"/>
+      </w:rPr>
+    </w:lvl>
+    <w:lvl w:ilvl="6" w:tplc="042A0001" w:tentative="1">
+      <w:start w:val="1"/>
+      <w:numFmt w:val="bullet"/>
+      <w:lvlText w:val=""/>
+      <w:lvlJc w:val="left"/>
+      <w:pPr>
+        <w:ind w:left="5040" w:hanging="360"/>
+      </w:pPr>
+      <w:rPr>
+        <w:rFonts w:ascii="Symbol" w:hAnsi="Symbol" w:hint="default"/>
+      </w:rPr>
+    </w:lvl>
+    <w:lvl w:ilvl="7" w:tplc="042A0003" w:tentative="1">
+      <w:start w:val="1"/>
+      <w:numFmt w:val="bullet"/>
+      <w:lvlText w:val="o"/>
+      <w:lvlJc w:val="left"/>
+      <w:pPr>
+        <w:ind w:left="5760" w:hanging="360"/>
+      </w:pPr>
+      <w:rPr>
+        <w:rFonts w:ascii="Courier New" w:hAnsi="Courier New" w:cs="Courier New" w:hint="default"/>
+      </w:rPr>
+    </w:lvl>
+    <w:lvl w:ilvl="8" w:tplc="042A0005" w:tentative="1">
+      <w:start w:val="1"/>
+      <w:numFmt w:val="bullet"/>
+      <w:lvlText w:val=""/>
+      <w:lvlJc w:val="left"/>
+      <w:pPr>
+        <w:ind w:left="6480" w:hanging="360"/>
+      </w:pPr>
+      <w:rPr>
+        <w:rFonts w:ascii="Wingdings" w:hAnsi="Wingdings" w:hint="default"/>
+      </w:rPr>
+    </w:lvl>
+  </w:abstractNum>
+  <w:abstractNum w:abstractNumId="33" w15:restartNumberingAfterBreak="0">
     <w:nsid w:val="6AE80BF0"/>
     <w:multiLevelType w:val="multilevel"/>
     <w:tmpl w:val="7138ED50"/>
@@ -10628,7 +14748,7 @@
       </w:rPr>
     </w:lvl>
   </w:abstractNum>
-  <w:abstractNum w:abstractNumId="31" w15:restartNumberingAfterBreak="0">
+  <w:abstractNum w:abstractNumId="34" w15:restartNumberingAfterBreak="0">
     <w:nsid w:val="6B4B59D2"/>
     <w:multiLevelType w:val="multilevel"/>
     <w:tmpl w:val="0BB0C054"/>
@@ -10777,7 +14897,7 @@
       </w:rPr>
     </w:lvl>
   </w:abstractNum>
-  <w:abstractNum w:abstractNumId="32" w15:restartNumberingAfterBreak="0">
+  <w:abstractNum w:abstractNumId="35" w15:restartNumberingAfterBreak="0">
     <w:nsid w:val="6B672276"/>
     <w:multiLevelType w:val="multilevel"/>
     <w:tmpl w:val="98208C9A"/>
@@ -10926,7 +15046,7 @@
       </w:rPr>
     </w:lvl>
   </w:abstractNum>
-  <w:abstractNum w:abstractNumId="33" w15:restartNumberingAfterBreak="0">
+  <w:abstractNum w:abstractNumId="36" w15:restartNumberingAfterBreak="0">
     <w:nsid w:val="72C961FD"/>
     <w:multiLevelType w:val="multilevel"/>
     <w:tmpl w:val="EF00655A"/>
@@ -11072,112 +15192,121 @@
     </w:lvl>
   </w:abstractNum>
   <w:num w:numId="1" w16cid:durableId="1588222300">
-    <w:abstractNumId w:val="18"/>
+    <w:abstractNumId w:val="19"/>
   </w:num>
   <w:num w:numId="2" w16cid:durableId="2089687452">
-    <w:abstractNumId w:val="27"/>
+    <w:abstractNumId w:val="28"/>
   </w:num>
   <w:num w:numId="3" w16cid:durableId="397703464">
-    <w:abstractNumId w:val="16"/>
+    <w:abstractNumId w:val="17"/>
   </w:num>
   <w:num w:numId="4" w16cid:durableId="280382709">
-    <w:abstractNumId w:val="20"/>
+    <w:abstractNumId w:val="21"/>
   </w:num>
   <w:num w:numId="5" w16cid:durableId="1527674285">
-    <w:abstractNumId w:val="11"/>
+    <w:abstractNumId w:val="12"/>
   </w:num>
   <w:num w:numId="6" w16cid:durableId="123810299">
-    <w:abstractNumId w:val="31"/>
+    <w:abstractNumId w:val="34"/>
   </w:num>
   <w:num w:numId="7" w16cid:durableId="2090272123">
-    <w:abstractNumId w:val="14"/>
+    <w:abstractNumId w:val="15"/>
   </w:num>
   <w:num w:numId="8" w16cid:durableId="439878419">
-    <w:abstractNumId w:val="28"/>
+    <w:abstractNumId w:val="30"/>
   </w:num>
   <w:num w:numId="9" w16cid:durableId="1099985614">
-    <w:abstractNumId w:val="5"/>
+    <w:abstractNumId w:val="6"/>
   </w:num>
   <w:num w:numId="10" w16cid:durableId="1796945683">
-    <w:abstractNumId w:val="9"/>
+    <w:abstractNumId w:val="10"/>
   </w:num>
   <w:num w:numId="11" w16cid:durableId="94329195">
     <w:abstractNumId w:val="0"/>
   </w:num>
   <w:num w:numId="12" w16cid:durableId="543949881">
+    <w:abstractNumId w:val="8"/>
+  </w:num>
+  <w:num w:numId="13" w16cid:durableId="686368319">
+    <w:abstractNumId w:val="11"/>
+  </w:num>
+  <w:num w:numId="14" w16cid:durableId="1670987982">
+    <w:abstractNumId w:val="36"/>
+  </w:num>
+  <w:num w:numId="15" w16cid:durableId="1381202660">
+    <w:abstractNumId w:val="27"/>
+  </w:num>
+  <w:num w:numId="16" w16cid:durableId="2020303109">
+    <w:abstractNumId w:val="24"/>
+  </w:num>
+  <w:num w:numId="17" w16cid:durableId="1607694605">
+    <w:abstractNumId w:val="26"/>
+  </w:num>
+  <w:num w:numId="18" w16cid:durableId="655645792">
+    <w:abstractNumId w:val="16"/>
+  </w:num>
+  <w:num w:numId="19" w16cid:durableId="1130517311">
     <w:abstractNumId w:val="7"/>
   </w:num>
-  <w:num w:numId="13" w16cid:durableId="686368319">
-    <w:abstractNumId w:val="10"/>
+  <w:num w:numId="20" w16cid:durableId="1141506554">
+    <w:abstractNumId w:val="25"/>
   </w:num>
-  <w:num w:numId="14" w16cid:durableId="1670987982">
+  <w:num w:numId="21" w16cid:durableId="424542347">
+    <w:abstractNumId w:val="3"/>
+  </w:num>
+  <w:num w:numId="22" w16cid:durableId="19356756">
+    <w:abstractNumId w:val="31"/>
+  </w:num>
+  <w:num w:numId="23" w16cid:durableId="2058040637">
+    <w:abstractNumId w:val="18"/>
+  </w:num>
+  <w:num w:numId="24" w16cid:durableId="527259456">
+    <w:abstractNumId w:val="13"/>
+  </w:num>
+  <w:num w:numId="25" w16cid:durableId="1264418365">
+    <w:abstractNumId w:val="9"/>
+  </w:num>
+  <w:num w:numId="26" w16cid:durableId="771558162">
+    <w:abstractNumId w:val="20"/>
+  </w:num>
+  <w:num w:numId="27" w16cid:durableId="1715151768">
+    <w:abstractNumId w:val="2"/>
+  </w:num>
+  <w:num w:numId="28" w16cid:durableId="729614964">
+    <w:abstractNumId w:val="14"/>
+  </w:num>
+  <w:num w:numId="29" w16cid:durableId="685013139">
+    <w:abstractNumId w:val="35"/>
+  </w:num>
+  <w:num w:numId="30" w16cid:durableId="1393232898">
+    <w:abstractNumId w:val="4"/>
+  </w:num>
+  <w:num w:numId="31" w16cid:durableId="1459882097">
     <w:abstractNumId w:val="33"/>
   </w:num>
-  <w:num w:numId="15" w16cid:durableId="1381202660">
-    <w:abstractNumId w:val="26"/>
+  <w:num w:numId="32" w16cid:durableId="23755228">
+    <w:abstractNumId w:val="5"/>
   </w:num>
-  <w:num w:numId="16" w16cid:durableId="2020303109">
+  <w:num w:numId="33" w16cid:durableId="1374387751">
+    <w:abstractNumId w:val="22"/>
+  </w:num>
+  <w:num w:numId="34" w16cid:durableId="679818156">
     <w:abstractNumId w:val="23"/>
   </w:num>
-  <w:num w:numId="17" w16cid:durableId="1607694605">
-    <w:abstractNumId w:val="25"/>
-  </w:num>
-  <w:num w:numId="18" w16cid:durableId="655645792">
-    <w:abstractNumId w:val="15"/>
-  </w:num>
-  <w:num w:numId="19" w16cid:durableId="1130517311">
-    <w:abstractNumId w:val="6"/>
-  </w:num>
-  <w:num w:numId="20" w16cid:durableId="1141506554">
-    <w:abstractNumId w:val="24"/>
-  </w:num>
-  <w:num w:numId="21" w16cid:durableId="424542347">
-    <w:abstractNumId w:val="2"/>
-  </w:num>
-  <w:num w:numId="22" w16cid:durableId="19356756">
+  <w:num w:numId="35" w16cid:durableId="1972125905">
     <w:abstractNumId w:val="29"/>
   </w:num>
-  <w:num w:numId="23" w16cid:durableId="2058040637">
-    <w:abstractNumId w:val="17"/>
-  </w:num>
-  <w:num w:numId="24" w16cid:durableId="527259456">
-    <w:abstractNumId w:val="12"/>
-  </w:num>
-  <w:num w:numId="25" w16cid:durableId="1264418365">
-    <w:abstractNumId w:val="8"/>
-  </w:num>
-  <w:num w:numId="26" w16cid:durableId="771558162">
-    <w:abstractNumId w:val="19"/>
-  </w:num>
-  <w:num w:numId="27" w16cid:durableId="1715151768">
-    <w:abstractNumId w:val="1"/>
-  </w:num>
-  <w:num w:numId="28" w16cid:durableId="729614964">
-    <w:abstractNumId w:val="13"/>
-  </w:num>
-  <w:num w:numId="29" w16cid:durableId="685013139">
+  <w:num w:numId="36" w16cid:durableId="512259889">
     <w:abstractNumId w:val="32"/>
   </w:num>
-  <w:num w:numId="30" w16cid:durableId="1393232898">
-    <w:abstractNumId w:val="3"/>
-  </w:num>
-  <w:num w:numId="31" w16cid:durableId="1459882097">
-    <w:abstractNumId w:val="30"/>
-  </w:num>
-  <w:num w:numId="32" w16cid:durableId="23755228">
-    <w:abstractNumId w:val="4"/>
-  </w:num>
-  <w:num w:numId="33" w16cid:durableId="1374387751">
-    <w:abstractNumId w:val="21"/>
-  </w:num>
-  <w:num w:numId="34" w16cid:durableId="679818156">
-    <w:abstractNumId w:val="22"/>
+  <w:num w:numId="37" w16cid:durableId="2059429154">
+    <w:abstractNumId w:val="1"/>
   </w:num>
 </w:numbering>
 </file>
 
 <file path=word/styles.xml><?xml version="1.0" encoding="utf-8"?>
-<w:styles xmlns:mc="http://schemas.openxmlformats.org/markup-compatibility/2006" xmlns:r="http://schemas.openxmlformats.org/officeDocument/2006/relationships" xmlns:w="http://schemas.openxmlformats.org/wordprocessingml/2006/main" xmlns:w14="http://schemas.microsoft.com/office/word/2010/wordml" xmlns:w15="http://schemas.microsoft.com/office/word/2012/wordml" xmlns:w16cex="http://schemas.microsoft.com/office/word/2018/wordml/cex" xmlns:w16cid="http://schemas.microsoft.com/office/word/2016/wordml/cid" xmlns:w16="http://schemas.microsoft.com/office/word/2018/wordml" xmlns:w16sdtdh="http://schemas.microsoft.com/office/word/2020/wordml/sdtdatahash" xmlns:w16se="http://schemas.microsoft.com/office/word/2015/wordml/symex" mc:Ignorable="w14 w15 w16se w16cid w16 w16cex w16sdtdh">
+<w:styles xmlns:mc="http://schemas.openxmlformats.org/markup-compatibility/2006" xmlns:r="http://schemas.openxmlformats.org/officeDocument/2006/relationships" xmlns:w="http://schemas.openxmlformats.org/wordprocessingml/2006/main" xmlns:w14="http://schemas.microsoft.com/office/word/2010/wordml" xmlns:w15="http://schemas.microsoft.com/office/word/2012/wordml" xmlns:w16cex="http://schemas.microsoft.com/office/word/2018/wordml/cex" xmlns:w16cid="http://schemas.microsoft.com/office/word/2016/wordml/cid" xmlns:w16="http://schemas.microsoft.com/office/word/2018/wordml" xmlns:w16du="http://schemas.microsoft.com/office/word/2023/wordml/word16du" xmlns:w16sdtdh="http://schemas.microsoft.com/office/word/2020/wordml/sdtdatahash" xmlns:w16sdtfl="http://schemas.microsoft.com/office/word/2024/wordml/sdtformatlock" xmlns:w16se="http://schemas.microsoft.com/office/word/2015/wordml/symex" mc:Ignorable="w14 w15 w16se w16cid w16 w16cex w16sdtdh w16sdtfl w16du">
   <w:docDefaults>
     <w:rPrDefault>
       <w:rPr>
@@ -11778,7 +15907,6 @@
   <w:style w:type="character" w:default="1" w:styleId="DefaultParagraphFont">
     <w:name w:val="Default Paragraph Font"/>
     <w:uiPriority w:val="1"/>
-    <w:semiHidden/>
     <w:unhideWhenUsed/>
   </w:style>
   <w:style w:type="table" w:default="1" w:styleId="TableNormal">

</xml_diff>